<commit_message>
Docs: ZP-DOC-05 CR-005 (group rules, sample conversations), migration 0009 appendix; README and WORKLOG
Co-Authored-By: Claude Opus 5.5 (1M context) <noreply@anthropic.com>
</commit_message>
<xml_diff>
--- a/docs/05-data-design/ZP-DOC-05_Data-Design.docx
+++ b/docs/05-data-design/ZP-DOC-05_Data-Design.docx
@@ -90,7 +90,7 @@
           <w:left w:w="10" w:type="dxa"/>
           <w:right w:w="10" w:type="dxa"/>
         </w:tblCellMar>
-        <w:tblLook w:val="0000" w:firstRow="0" w:lastRow="0" w:firstColumn="0" w:lastColumn="0" w:noHBand="0" w:noVBand="0"/>
+        <w:tblLook w:val="04A0" w:firstRow="1" w:lastRow="0" w:firstColumn="1" w:lastColumn="0" w:noHBand="0" w:noVBand="1"/>
       </w:tblPr>
       <w:tblGrid>
         <w:gridCol w:w="2600"/>
@@ -494,7 +494,7 @@
           <w:left w:w="10" w:type="dxa"/>
           <w:right w:w="10" w:type="dxa"/>
         </w:tblCellMar>
-        <w:tblLook w:val="0000" w:firstRow="0" w:lastRow="0" w:firstColumn="0" w:lastColumn="0" w:noHBand="0" w:noVBand="0"/>
+        <w:tblLook w:val="04A0" w:firstRow="1" w:lastRow="0" w:firstColumn="1" w:lastColumn="0" w:noHBand="0" w:noVBand="1"/>
       </w:tblPr>
       <w:tblGrid>
         <w:gridCol w:w="2600"/>
@@ -1189,7 +1189,7 @@
           <w:left w:w="10" w:type="dxa"/>
           <w:right w:w="10" w:type="dxa"/>
         </w:tblCellMar>
-        <w:tblLook w:val="0000" w:firstRow="0" w:lastRow="0" w:firstColumn="0" w:lastColumn="0" w:noHBand="0" w:noVBand="0"/>
+        <w:tblLook w:val="04A0" w:firstRow="1" w:lastRow="0" w:firstColumn="1" w:lastColumn="0" w:noHBand="0" w:noVBand="1"/>
       </w:tblPr>
       <w:tblGrid>
         <w:gridCol w:w="964"/>
@@ -1908,6 +1908,122 @@
           </w:p>
         </w:tc>
       </w:tr>
+      <w:tr>
+        <w:tblPrEx>
+          <w:tblCellMar>
+            <w:top w:w="0" w:type="dxa"/>
+            <w:bottom w:w="0" w:type="dxa"/>
+          </w:tblCellMar>
+        </w:tblPrEx>
+        <w:trPr>
+          <w:cantSplit/>
+          <w:trHeight w:val="420"/>
+        </w:trPr>
+        <w:tc>
+          <w:tcPr>
+            <w:tcW w:w="964" w:type="dxa"/>
+            <w:tcBorders>
+              <w:top w:val="single" w:sz="4" w:space="0" w:color="C9D3D0"/>
+              <w:left w:val="single" w:sz="4" w:space="0" w:color="C9D3D0"/>
+              <w:bottom w:val="single" w:sz="4" w:space="0" w:color="C9D3D0"/>
+              <w:right w:val="single" w:sz="4" w:space="0" w:color="C9D3D0"/>
+            </w:tcBorders>
+            <w:tcMar>
+              <w:top w:w="50" w:type="dxa"/>
+              <w:left w:w="100" w:type="dxa"/>
+              <w:bottom w:w="50" w:type="dxa"/>
+              <w:right w:w="100" w:type="dxa"/>
+            </w:tcMar>
+          </w:tcPr>
+          <w:p>
+            <w:r>
+              <w:rPr>
+                <w:sz w:val="19"/>
+                <w:szCs w:val="19"/>
+              </w:rPr>
+              <w:t>0.9</w:t>
+            </w:r>
+          </w:p>
+        </w:tc>
+        <w:tc>
+          <w:tcPr>
+            <w:tcW w:w="1542" w:type="dxa"/>
+            <w:tcBorders>
+              <w:top w:val="single" w:sz="4" w:space="0" w:color="C9D3D0"/>
+              <w:left w:val="single" w:sz="4" w:space="0" w:color="C9D3D0"/>
+              <w:bottom w:val="single" w:sz="4" w:space="0" w:color="C9D3D0"/>
+              <w:right w:val="single" w:sz="4" w:space="0" w:color="C9D3D0"/>
+            </w:tcBorders>
+            <w:tcMar>
+              <w:top w:w="50" w:type="dxa"/>
+              <w:left w:w="100" w:type="dxa"/>
+              <w:bottom w:w="50" w:type="dxa"/>
+              <w:right w:w="100" w:type="dxa"/>
+            </w:tcMar>
+          </w:tcPr>
+          <w:p>
+            <w:r>
+              <w:rPr>
+                <w:sz w:val="19"/>
+                <w:szCs w:val="19"/>
+              </w:rPr>
+              <w:t>11 Oct 2026</w:t>
+            </w:r>
+          </w:p>
+        </w:tc>
+        <w:tc>
+          <w:tcPr>
+            <w:tcW w:w="1928" w:type="dxa"/>
+            <w:tcBorders>
+              <w:top w:val="single" w:sz="4" w:space="0" w:color="C9D3D0"/>
+              <w:left w:val="single" w:sz="4" w:space="0" w:color="C9D3D0"/>
+              <w:bottom w:val="single" w:sz="4" w:space="0" w:color="C9D3D0"/>
+              <w:right w:val="single" w:sz="4" w:space="0" w:color="C9D3D0"/>
+            </w:tcBorders>
+            <w:tcMar>
+              <w:top w:w="50" w:type="dxa"/>
+              <w:left w:w="100" w:type="dxa"/>
+              <w:bottom w:w="50" w:type="dxa"/>
+              <w:right w:w="100" w:type="dxa"/>
+            </w:tcMar>
+          </w:tcPr>
+          <w:p>
+            <w:r>
+              <w:rPr>
+                <w:sz w:val="19"/>
+                <w:szCs w:val="19"/>
+              </w:rPr>
+              <w:t>Team Kestrel</w:t>
+            </w:r>
+          </w:p>
+        </w:tc>
+        <w:tc>
+          <w:tcPr>
+            <w:tcW w:w="5204" w:type="dxa"/>
+            <w:tcBorders>
+              <w:top w:val="single" w:sz="4" w:space="0" w:color="C9D3D0"/>
+              <w:left w:val="single" w:sz="4" w:space="0" w:color="C9D3D0"/>
+              <w:bottom w:val="single" w:sz="4" w:space="0" w:color="C9D3D0"/>
+              <w:right w:val="single" w:sz="4" w:space="0" w:color="C9D3D0"/>
+            </w:tcBorders>
+            <w:tcMar>
+              <w:top w:w="50" w:type="dxa"/>
+              <w:left w:w="100" w:type="dxa"/>
+              <w:bottom w:w="50" w:type="dxa"/>
+              <w:right w:w="100" w:type="dxa"/>
+            </w:tcMar>
+          </w:tcPr>
+          <w:p>
+            <w:r>
+              <w:rPr>
+                <w:sz w:val="19"/>
+                <w:szCs w:val="19"/>
+              </w:rPr>
+              <w:t>Revised in review for CR-005 (group rules, product owner's request): GROUP_MEMBER.rules_version, migration 0009; labelled sample conversations as read-model data</w:t>
+            </w:r>
+          </w:p>
+        </w:tc>
+      </w:tr>
     </w:tbl>
     <w:p>
       <w:pPr>
@@ -1950,7 +2066,7 @@
           <w:left w:w="10" w:type="dxa"/>
           <w:right w:w="10" w:type="dxa"/>
         </w:tblCellMar>
-        <w:tblLook w:val="0000" w:firstRow="0" w:lastRow="0" w:firstColumn="0" w:lastColumn="0" w:noHBand="0" w:noVBand="0"/>
+        <w:tblLook w:val="04A0" w:firstRow="1" w:lastRow="0" w:firstColumn="1" w:lastColumn="0" w:noHBand="0" w:noVBand="1"/>
       </w:tblPr>
       <w:tblGrid>
         <w:gridCol w:w="2120"/>
@@ -2222,6 +2338,7 @@
                 <w:sz w:val="19"/>
                 <w:szCs w:val="19"/>
               </w:rPr>
+              <w:lastRenderedPageBreak/>
               <w:t>Approver</w:t>
             </w:r>
           </w:p>
@@ -2307,7 +2424,7 @@
     <w:sdt>
       <w:sdtPr>
         <w:alias w:val="Contents"/>
-        <w:id w:val="1429475178"/>
+        <w:id w:val="-330528852"/>
       </w:sdtPr>
       <w:sdtEndPr/>
       <w:sdtContent>
@@ -2336,7 +2453,7 @@
           <w:r>
             <w:fldChar w:fldCharType="separate"/>
           </w:r>
-          <w:hyperlink w:anchor="_Toc242599583" w:history="1">
+          <w:hyperlink w:anchor="_Toc242603038" w:history="1">
             <w:r>
               <w:rPr>
                 <w:rStyle w:val="Hyperlink"/>
@@ -2360,7 +2477,7 @@
               <w:rPr>
                 <w:noProof/>
               </w:rPr>
-              <w:instrText xml:space="preserve"> PAGEREF _Toc242599583 \h </w:instrText>
+              <w:instrText xml:space="preserve"> PAGEREF _Toc242603038 \h </w:instrText>
             </w:r>
             <w:r>
               <w:rPr>
@@ -2377,7 +2494,7 @@
               <w:rPr>
                 <w:noProof/>
               </w:rPr>
-              <w:t>5</w:t>
+              <w:t>6</w:t>
             </w:r>
             <w:r>
               <w:rPr>
@@ -2403,7 +2520,7 @@
               <w14:ligatures w14:val="standardContextual"/>
             </w:rPr>
           </w:pPr>
-          <w:hyperlink w:anchor="_Toc242599584" w:history="1">
+          <w:hyperlink w:anchor="_Toc242603039" w:history="1">
             <w:r>
               <w:rPr>
                 <w:rStyle w:val="Hyperlink"/>
@@ -2427,7 +2544,7 @@
               <w:rPr>
                 <w:noProof/>
               </w:rPr>
-              <w:instrText xml:space="preserve"> PAGEREF _Toc242599584 \h </w:instrText>
+              <w:instrText xml:space="preserve"> PAGEREF _Toc242603039 \h </w:instrText>
             </w:r>
             <w:r>
               <w:rPr>
@@ -2444,7 +2561,7 @@
               <w:rPr>
                 <w:noProof/>
               </w:rPr>
-              <w:t>5</w:t>
+              <w:t>6</w:t>
             </w:r>
             <w:r>
               <w:rPr>
@@ -2470,7 +2587,7 @@
               <w14:ligatures w14:val="standardContextual"/>
             </w:rPr>
           </w:pPr>
-          <w:hyperlink w:anchor="_Toc242599585" w:history="1">
+          <w:hyperlink w:anchor="_Toc242603040" w:history="1">
             <w:r>
               <w:rPr>
                 <w:rStyle w:val="Hyperlink"/>
@@ -2494,7 +2611,7 @@
               <w:rPr>
                 <w:noProof/>
               </w:rPr>
-              <w:instrText xml:space="preserve"> PAGEREF _Toc242599585 \h </w:instrText>
+              <w:instrText xml:space="preserve"> PAGEREF _Toc242603040 \h </w:instrText>
             </w:r>
             <w:r>
               <w:rPr>
@@ -2511,7 +2628,7 @@
               <w:rPr>
                 <w:noProof/>
               </w:rPr>
-              <w:t>5</w:t>
+              <w:t>6</w:t>
             </w:r>
             <w:r>
               <w:rPr>
@@ -2537,7 +2654,7 @@
               <w14:ligatures w14:val="standardContextual"/>
             </w:rPr>
           </w:pPr>
-          <w:hyperlink w:anchor="_Toc242599586" w:history="1">
+          <w:hyperlink w:anchor="_Toc242603041" w:history="1">
             <w:r>
               <w:rPr>
                 <w:rStyle w:val="Hyperlink"/>
@@ -2561,7 +2678,7 @@
               <w:rPr>
                 <w:noProof/>
               </w:rPr>
-              <w:instrText xml:space="preserve"> PAGEREF _Toc242599586 \h </w:instrText>
+              <w:instrText xml:space="preserve"> PAGEREF _Toc242603041 \h </w:instrText>
             </w:r>
             <w:r>
               <w:rPr>
@@ -2578,7 +2695,7 @@
               <w:rPr>
                 <w:noProof/>
               </w:rPr>
-              <w:t>5</w:t>
+              <w:t>6</w:t>
             </w:r>
             <w:r>
               <w:rPr>
@@ -2604,7 +2721,7 @@
               <w14:ligatures w14:val="standardContextual"/>
             </w:rPr>
           </w:pPr>
-          <w:hyperlink w:anchor="_Toc242599587" w:history="1">
+          <w:hyperlink w:anchor="_Toc242603042" w:history="1">
             <w:r>
               <w:rPr>
                 <w:rStyle w:val="Hyperlink"/>
@@ -2628,7 +2745,7 @@
               <w:rPr>
                 <w:noProof/>
               </w:rPr>
-              <w:instrText xml:space="preserve"> PAGEREF _Toc242599587 \h </w:instrText>
+              <w:instrText xml:space="preserve"> PAGEREF _Toc242603042 \h </w:instrText>
             </w:r>
             <w:r>
               <w:rPr>
@@ -2645,7 +2762,7 @@
               <w:rPr>
                 <w:noProof/>
               </w:rPr>
-              <w:t>5</w:t>
+              <w:t>6</w:t>
             </w:r>
             <w:r>
               <w:rPr>
@@ -2671,7 +2788,7 @@
               <w14:ligatures w14:val="standardContextual"/>
             </w:rPr>
           </w:pPr>
-          <w:hyperlink w:anchor="_Toc242599588" w:history="1">
+          <w:hyperlink w:anchor="_Toc242603043" w:history="1">
             <w:r>
               <w:rPr>
                 <w:rStyle w:val="Hyperlink"/>
@@ -2695,7 +2812,7 @@
               <w:rPr>
                 <w:noProof/>
               </w:rPr>
-              <w:instrText xml:space="preserve"> PAGEREF _Toc242599588 \h </w:instrText>
+              <w:instrText xml:space="preserve"> PAGEREF _Toc242603043 \h </w:instrText>
             </w:r>
             <w:r>
               <w:rPr>
@@ -2712,7 +2829,7 @@
               <w:rPr>
                 <w:noProof/>
               </w:rPr>
-              <w:t>5</w:t>
+              <w:t>6</w:t>
             </w:r>
             <w:r>
               <w:rPr>
@@ -2738,7 +2855,7 @@
               <w14:ligatures w14:val="standardContextual"/>
             </w:rPr>
           </w:pPr>
-          <w:hyperlink w:anchor="_Toc242599589" w:history="1">
+          <w:hyperlink w:anchor="_Toc242603044" w:history="1">
             <w:r>
               <w:rPr>
                 <w:rStyle w:val="Hyperlink"/>
@@ -2762,7 +2879,7 @@
               <w:rPr>
                 <w:noProof/>
               </w:rPr>
-              <w:instrText xml:space="preserve"> PAGEREF _Toc242599589 \h </w:instrText>
+              <w:instrText xml:space="preserve"> PAGEREF _Toc242603044 \h </w:instrText>
             </w:r>
             <w:r>
               <w:rPr>
@@ -2779,7 +2896,7 @@
               <w:rPr>
                 <w:noProof/>
               </w:rPr>
-              <w:t>6</w:t>
+              <w:t>7</w:t>
             </w:r>
             <w:r>
               <w:rPr>
@@ -2805,7 +2922,7 @@
               <w14:ligatures w14:val="standardContextual"/>
             </w:rPr>
           </w:pPr>
-          <w:hyperlink w:anchor="_Toc242599590" w:history="1">
+          <w:hyperlink w:anchor="_Toc242603045" w:history="1">
             <w:r>
               <w:rPr>
                 <w:rStyle w:val="Hyperlink"/>
@@ -2829,7 +2946,7 @@
               <w:rPr>
                 <w:noProof/>
               </w:rPr>
-              <w:instrText xml:space="preserve"> PAGEREF _Toc242599590 \h </w:instrText>
+              <w:instrText xml:space="preserve"> PAGEREF _Toc242603045 \h </w:instrText>
             </w:r>
             <w:r>
               <w:rPr>
@@ -2846,7 +2963,7 @@
               <w:rPr>
                 <w:noProof/>
               </w:rPr>
-              <w:t>6</w:t>
+              <w:t>7</w:t>
             </w:r>
             <w:r>
               <w:rPr>
@@ -2872,7 +2989,7 @@
               <w14:ligatures w14:val="standardContextual"/>
             </w:rPr>
           </w:pPr>
-          <w:hyperlink w:anchor="_Toc242599591" w:history="1">
+          <w:hyperlink w:anchor="_Toc242603046" w:history="1">
             <w:r>
               <w:rPr>
                 <w:rStyle w:val="Hyperlink"/>
@@ -2896,7 +3013,7 @@
               <w:rPr>
                 <w:noProof/>
               </w:rPr>
-              <w:instrText xml:space="preserve"> PAGEREF _Toc242599591 \h </w:instrText>
+              <w:instrText xml:space="preserve"> PAGEREF _Toc242603046 \h </w:instrText>
             </w:r>
             <w:r>
               <w:rPr>
@@ -2913,7 +3030,7 @@
               <w:rPr>
                 <w:noProof/>
               </w:rPr>
-              <w:t>7</w:t>
+              <w:t>8</w:t>
             </w:r>
             <w:r>
               <w:rPr>
@@ -2939,7 +3056,7 @@
               <w14:ligatures w14:val="standardContextual"/>
             </w:rPr>
           </w:pPr>
-          <w:hyperlink w:anchor="_Toc242599592" w:history="1">
+          <w:hyperlink w:anchor="_Toc242603047" w:history="1">
             <w:r>
               <w:rPr>
                 <w:rStyle w:val="Hyperlink"/>
@@ -2963,7 +3080,7 @@
               <w:rPr>
                 <w:noProof/>
               </w:rPr>
-              <w:instrText xml:space="preserve"> PAGEREF _Toc242599592 \h </w:instrText>
+              <w:instrText xml:space="preserve"> PAGEREF _Toc242603047 \h </w:instrText>
             </w:r>
             <w:r>
               <w:rPr>
@@ -2980,7 +3097,7 @@
               <w:rPr>
                 <w:noProof/>
               </w:rPr>
-              <w:t>8</w:t>
+              <w:t>9</w:t>
             </w:r>
             <w:r>
               <w:rPr>
@@ -3006,7 +3123,7 @@
               <w14:ligatures w14:val="standardContextual"/>
             </w:rPr>
           </w:pPr>
-          <w:hyperlink w:anchor="_Toc242599593" w:history="1">
+          <w:hyperlink w:anchor="_Toc242603048" w:history="1">
             <w:r>
               <w:rPr>
                 <w:rStyle w:val="Hyperlink"/>
@@ -3030,7 +3147,7 @@
               <w:rPr>
                 <w:noProof/>
               </w:rPr>
-              <w:instrText xml:space="preserve"> PAGEREF _Toc242599593 \h </w:instrText>
+              <w:instrText xml:space="preserve"> PAGEREF _Toc242603048 \h </w:instrText>
             </w:r>
             <w:r>
               <w:rPr>
@@ -3047,7 +3164,7 @@
               <w:rPr>
                 <w:noProof/>
               </w:rPr>
-              <w:t>9</w:t>
+              <w:t>10</w:t>
             </w:r>
             <w:r>
               <w:rPr>
@@ -3073,7 +3190,7 @@
               <w14:ligatures w14:val="standardContextual"/>
             </w:rPr>
           </w:pPr>
-          <w:hyperlink w:anchor="_Toc242599594" w:history="1">
+          <w:hyperlink w:anchor="_Toc242603049" w:history="1">
             <w:r>
               <w:rPr>
                 <w:rStyle w:val="Hyperlink"/>
@@ -3097,7 +3214,7 @@
               <w:rPr>
                 <w:noProof/>
               </w:rPr>
-              <w:instrText xml:space="preserve"> PAGEREF _Toc242599594 \h </w:instrText>
+              <w:instrText xml:space="preserve"> PAGEREF _Toc242603049 \h </w:instrText>
             </w:r>
             <w:r>
               <w:rPr>
@@ -3114,7 +3231,7 @@
               <w:rPr>
                 <w:noProof/>
               </w:rPr>
-              <w:t>10</w:t>
+              <w:t>11</w:t>
             </w:r>
             <w:r>
               <w:rPr>
@@ -3140,7 +3257,7 @@
               <w14:ligatures w14:val="standardContextual"/>
             </w:rPr>
           </w:pPr>
-          <w:hyperlink w:anchor="_Toc242599595" w:history="1">
+          <w:hyperlink w:anchor="_Toc242603050" w:history="1">
             <w:r>
               <w:rPr>
                 <w:rStyle w:val="Hyperlink"/>
@@ -3164,7 +3281,7 @@
               <w:rPr>
                 <w:noProof/>
               </w:rPr>
-              <w:instrText xml:space="preserve"> PAGEREF _Toc242599595 \h </w:instrText>
+              <w:instrText xml:space="preserve"> PAGEREF _Toc242603050 \h </w:instrText>
             </w:r>
             <w:r>
               <w:rPr>
@@ -3181,7 +3298,7 @@
               <w:rPr>
                 <w:noProof/>
               </w:rPr>
-              <w:t>10</w:t>
+              <w:t>11</w:t>
             </w:r>
             <w:r>
               <w:rPr>
@@ -3207,7 +3324,7 @@
               <w14:ligatures w14:val="standardContextual"/>
             </w:rPr>
           </w:pPr>
-          <w:hyperlink w:anchor="_Toc242599596" w:history="1">
+          <w:hyperlink w:anchor="_Toc242603051" w:history="1">
             <w:r>
               <w:rPr>
                 <w:rStyle w:val="Hyperlink"/>
@@ -3231,7 +3348,7 @@
               <w:rPr>
                 <w:noProof/>
               </w:rPr>
-              <w:instrText xml:space="preserve"> PAGEREF _Toc242599596 \h </w:instrText>
+              <w:instrText xml:space="preserve"> PAGEREF _Toc242603051 \h </w:instrText>
             </w:r>
             <w:r>
               <w:rPr>
@@ -3248,7 +3365,7 @@
               <w:rPr>
                 <w:noProof/>
               </w:rPr>
-              <w:t>11</w:t>
+              <w:t>12</w:t>
             </w:r>
             <w:r>
               <w:rPr>
@@ -3274,7 +3391,7 @@
               <w14:ligatures w14:val="standardContextual"/>
             </w:rPr>
           </w:pPr>
-          <w:hyperlink w:anchor="_Toc242599597" w:history="1">
+          <w:hyperlink w:anchor="_Toc242603052" w:history="1">
             <w:r>
               <w:rPr>
                 <w:rStyle w:val="Hyperlink"/>
@@ -3298,7 +3415,7 @@
               <w:rPr>
                 <w:noProof/>
               </w:rPr>
-              <w:instrText xml:space="preserve"> PAGEREF _Toc242599597 \h </w:instrText>
+              <w:instrText xml:space="preserve"> PAGEREF _Toc242603052 \h </w:instrText>
             </w:r>
             <w:r>
               <w:rPr>
@@ -3315,7 +3432,7 @@
               <w:rPr>
                 <w:noProof/>
               </w:rPr>
-              <w:t>12</w:t>
+              <w:t>13</w:t>
             </w:r>
             <w:r>
               <w:rPr>
@@ -3341,13 +3458,13 @@
               <w14:ligatures w14:val="standardContextual"/>
             </w:rPr>
           </w:pPr>
-          <w:hyperlink w:anchor="_Toc242599598" w:history="1">
+          <w:hyperlink w:anchor="_Toc242603053" w:history="1">
             <w:r>
               <w:rPr>
                 <w:rStyle w:val="Hyperlink"/>
                 <w:noProof/>
               </w:rPr>
-              <w:t>2.9 Entity catalogue</w:t>
+              <w:t>2.9 Group rules and sample conversations (CR-005)</w:t>
             </w:r>
             <w:r>
               <w:rPr>
@@ -3365,7 +3482,7 @@
               <w:rPr>
                 <w:noProof/>
               </w:rPr>
-              <w:instrText xml:space="preserve"> PAGEREF _Toc242599598 \h </w:instrText>
+              <w:instrText xml:space="preserve"> PAGEREF _Toc242603053 \h </w:instrText>
             </w:r>
             <w:r>
               <w:rPr>
@@ -3382,7 +3499,74 @@
               <w:rPr>
                 <w:noProof/>
               </w:rPr>
-              <w:t>12</w:t>
+              <w:t>13</w:t>
+            </w:r>
+            <w:r>
+              <w:rPr>
+                <w:noProof/>
+              </w:rPr>
+              <w:fldChar w:fldCharType="end"/>
+            </w:r>
+          </w:hyperlink>
+        </w:p>
+        <w:p>
+          <w:pPr>
+            <w:pStyle w:val="TOC2"/>
+            <w:tabs>
+              <w:tab w:val="right" w:leader="dot" w:pos="9628"/>
+            </w:tabs>
+            <w:rPr>
+              <w:rFonts w:asciiTheme="minorHAnsi" w:eastAsiaTheme="minorEastAsia" w:hAnsiTheme="minorHAnsi" w:cstheme="minorBidi"/>
+              <w:noProof/>
+              <w:color w:val="auto"/>
+              <w:kern w:val="2"/>
+              <w:sz w:val="24"/>
+              <w:szCs w:val="24"/>
+              <w14:ligatures w14:val="standardContextual"/>
+            </w:rPr>
+          </w:pPr>
+          <w:hyperlink w:anchor="_Toc242603054" w:history="1">
+            <w:r>
+              <w:rPr>
+                <w:rStyle w:val="Hyperlink"/>
+                <w:noProof/>
+              </w:rPr>
+              <w:t>2.10 Entity catalogue</w:t>
+            </w:r>
+            <w:r>
+              <w:rPr>
+                <w:noProof/>
+              </w:rPr>
+              <w:tab/>
+            </w:r>
+            <w:r>
+              <w:rPr>
+                <w:noProof/>
+              </w:rPr>
+              <w:fldChar w:fldCharType="begin"/>
+            </w:r>
+            <w:r>
+              <w:rPr>
+                <w:noProof/>
+              </w:rPr>
+              <w:instrText xml:space="preserve"> PAGEREF _Toc242603054 \h </w:instrText>
+            </w:r>
+            <w:r>
+              <w:rPr>
+                <w:noProof/>
+              </w:rPr>
+            </w:r>
+            <w:r>
+              <w:rPr>
+                <w:noProof/>
+              </w:rPr>
+              <w:fldChar w:fldCharType="separate"/>
+            </w:r>
+            <w:r>
+              <w:rPr>
+                <w:noProof/>
+              </w:rPr>
+              <w:t>13</w:t>
             </w:r>
             <w:r>
               <w:rPr>
@@ -3408,7 +3592,7 @@
               <w14:ligatures w14:val="standardContextual"/>
             </w:rPr>
           </w:pPr>
-          <w:hyperlink w:anchor="_Toc242599599" w:history="1">
+          <w:hyperlink w:anchor="_Toc242603055" w:history="1">
             <w:r>
               <w:rPr>
                 <w:rStyle w:val="Hyperlink"/>
@@ -3432,7 +3616,7 @@
               <w:rPr>
                 <w:noProof/>
               </w:rPr>
-              <w:instrText xml:space="preserve"> PAGEREF _Toc242599599 \h </w:instrText>
+              <w:instrText xml:space="preserve"> PAGEREF _Toc242603055 \h </w:instrText>
             </w:r>
             <w:r>
               <w:rPr>
@@ -3449,7 +3633,7 @@
               <w:rPr>
                 <w:noProof/>
               </w:rPr>
-              <w:t>14</w:t>
+              <w:t>15</w:t>
             </w:r>
             <w:r>
               <w:rPr>
@@ -3475,7 +3659,7 @@
               <w14:ligatures w14:val="standardContextual"/>
             </w:rPr>
           </w:pPr>
-          <w:hyperlink w:anchor="_Toc242599600" w:history="1">
+          <w:hyperlink w:anchor="_Toc242603056" w:history="1">
             <w:r>
               <w:rPr>
                 <w:rStyle w:val="Hyperlink"/>
@@ -3499,7 +3683,7 @@
               <w:rPr>
                 <w:noProof/>
               </w:rPr>
-              <w:instrText xml:space="preserve"> PAGEREF _Toc242599600 \h </w:instrText>
+              <w:instrText xml:space="preserve"> PAGEREF _Toc242603056 \h </w:instrText>
             </w:r>
             <w:r>
               <w:rPr>
@@ -3516,7 +3700,7 @@
               <w:rPr>
                 <w:noProof/>
               </w:rPr>
-              <w:t>15</w:t>
+              <w:t>16</w:t>
             </w:r>
             <w:r>
               <w:rPr>
@@ -3542,7 +3726,7 @@
               <w14:ligatures w14:val="standardContextual"/>
             </w:rPr>
           </w:pPr>
-          <w:hyperlink w:anchor="_Toc242599601" w:history="1">
+          <w:hyperlink w:anchor="_Toc242603057" w:history="1">
             <w:r>
               <w:rPr>
                 <w:rStyle w:val="Hyperlink"/>
@@ -3566,7 +3750,7 @@
               <w:rPr>
                 <w:noProof/>
               </w:rPr>
-              <w:instrText xml:space="preserve"> PAGEREF _Toc242599601 \h </w:instrText>
+              <w:instrText xml:space="preserve"> PAGEREF _Toc242603057 \h </w:instrText>
             </w:r>
             <w:r>
               <w:rPr>
@@ -3583,7 +3767,7 @@
               <w:rPr>
                 <w:noProof/>
               </w:rPr>
-              <w:t>19</w:t>
+              <w:t>20</w:t>
             </w:r>
             <w:r>
               <w:rPr>
@@ -3609,7 +3793,7 @@
               <w14:ligatures w14:val="standardContextual"/>
             </w:rPr>
           </w:pPr>
-          <w:hyperlink w:anchor="_Toc242599602" w:history="1">
+          <w:hyperlink w:anchor="_Toc242603058" w:history="1">
             <w:r>
               <w:rPr>
                 <w:rStyle w:val="Hyperlink"/>
@@ -3633,7 +3817,7 @@
               <w:rPr>
                 <w:noProof/>
               </w:rPr>
-              <w:instrText xml:space="preserve"> PAGEREF _Toc242599602 \h </w:instrText>
+              <w:instrText xml:space="preserve"> PAGEREF _Toc242603058 \h </w:instrText>
             </w:r>
             <w:r>
               <w:rPr>
@@ -3650,7 +3834,7 @@
               <w:rPr>
                 <w:noProof/>
               </w:rPr>
-              <w:t>19</w:t>
+              <w:t>20</w:t>
             </w:r>
             <w:r>
               <w:rPr>
@@ -3676,7 +3860,7 @@
               <w14:ligatures w14:val="standardContextual"/>
             </w:rPr>
           </w:pPr>
-          <w:hyperlink w:anchor="_Toc242599603" w:history="1">
+          <w:hyperlink w:anchor="_Toc242603059" w:history="1">
             <w:r>
               <w:rPr>
                 <w:rStyle w:val="Hyperlink"/>
@@ -3700,7 +3884,7 @@
               <w:rPr>
                 <w:noProof/>
               </w:rPr>
-              <w:instrText xml:space="preserve"> PAGEREF _Toc242599603 \h </w:instrText>
+              <w:instrText xml:space="preserve"> PAGEREF _Toc242603059 \h </w:instrText>
             </w:r>
             <w:r>
               <w:rPr>
@@ -3717,7 +3901,7 @@
               <w:rPr>
                 <w:noProof/>
               </w:rPr>
-              <w:t>19</w:t>
+              <w:t>20</w:t>
             </w:r>
             <w:r>
               <w:rPr>
@@ -3743,7 +3927,7 @@
               <w14:ligatures w14:val="standardContextual"/>
             </w:rPr>
           </w:pPr>
-          <w:hyperlink w:anchor="_Toc242599604" w:history="1">
+          <w:hyperlink w:anchor="_Toc242603060" w:history="1">
             <w:r>
               <w:rPr>
                 <w:rStyle w:val="Hyperlink"/>
@@ -3767,7 +3951,7 @@
               <w:rPr>
                 <w:noProof/>
               </w:rPr>
-              <w:instrText xml:space="preserve"> PAGEREF _Toc242599604 \h </w:instrText>
+              <w:instrText xml:space="preserve"> PAGEREF _Toc242603060 \h </w:instrText>
             </w:r>
             <w:r>
               <w:rPr>
@@ -3784,7 +3968,7 @@
               <w:rPr>
                 <w:noProof/>
               </w:rPr>
-              <w:t>19</w:t>
+              <w:t>20</w:t>
             </w:r>
             <w:r>
               <w:rPr>
@@ -3810,7 +3994,7 @@
               <w14:ligatures w14:val="standardContextual"/>
             </w:rPr>
           </w:pPr>
-          <w:hyperlink w:anchor="_Toc242599605" w:history="1">
+          <w:hyperlink w:anchor="_Toc242603061" w:history="1">
             <w:r>
               <w:rPr>
                 <w:rStyle w:val="Hyperlink"/>
@@ -3834,7 +4018,7 @@
               <w:rPr>
                 <w:noProof/>
               </w:rPr>
-              <w:instrText xml:space="preserve"> PAGEREF _Toc242599605 \h </w:instrText>
+              <w:instrText xml:space="preserve"> PAGEREF _Toc242603061 \h </w:instrText>
             </w:r>
             <w:r>
               <w:rPr>
@@ -3851,7 +4035,7 @@
               <w:rPr>
                 <w:noProof/>
               </w:rPr>
-              <w:t>20</w:t>
+              <w:t>21</w:t>
             </w:r>
             <w:r>
               <w:rPr>
@@ -3877,7 +4061,7 @@
               <w14:ligatures w14:val="standardContextual"/>
             </w:rPr>
           </w:pPr>
-          <w:hyperlink w:anchor="_Toc242599606" w:history="1">
+          <w:hyperlink w:anchor="_Toc242603062" w:history="1">
             <w:r>
               <w:rPr>
                 <w:rStyle w:val="Hyperlink"/>
@@ -3901,7 +4085,7 @@
               <w:rPr>
                 <w:noProof/>
               </w:rPr>
-              <w:instrText xml:space="preserve"> PAGEREF _Toc242599606 \h </w:instrText>
+              <w:instrText xml:space="preserve"> PAGEREF _Toc242603062 \h </w:instrText>
             </w:r>
             <w:r>
               <w:rPr>
@@ -3918,7 +4102,7 @@
               <w:rPr>
                 <w:noProof/>
               </w:rPr>
-              <w:t>21</w:t>
+              <w:t>22</w:t>
             </w:r>
             <w:r>
               <w:rPr>
@@ -3944,7 +4128,7 @@
               <w14:ligatures w14:val="standardContextual"/>
             </w:rPr>
           </w:pPr>
-          <w:hyperlink w:anchor="_Toc242599607" w:history="1">
+          <w:hyperlink w:anchor="_Toc242603063" w:history="1">
             <w:r>
               <w:rPr>
                 <w:rStyle w:val="Hyperlink"/>
@@ -3968,7 +4152,7 @@
               <w:rPr>
                 <w:noProof/>
               </w:rPr>
-              <w:instrText xml:space="preserve"> PAGEREF _Toc242599607 \h </w:instrText>
+              <w:instrText xml:space="preserve"> PAGEREF _Toc242603063 \h </w:instrText>
             </w:r>
             <w:r>
               <w:rPr>
@@ -3985,7 +4169,7 @@
               <w:rPr>
                 <w:noProof/>
               </w:rPr>
-              <w:t>21</w:t>
+              <w:t>22</w:t>
             </w:r>
             <w:r>
               <w:rPr>
@@ -4011,7 +4195,7 @@
               <w14:ligatures w14:val="standardContextual"/>
             </w:rPr>
           </w:pPr>
-          <w:hyperlink w:anchor="_Toc242599608" w:history="1">
+          <w:hyperlink w:anchor="_Toc242603064" w:history="1">
             <w:r>
               <w:rPr>
                 <w:rStyle w:val="Hyperlink"/>
@@ -4035,7 +4219,7 @@
               <w:rPr>
                 <w:noProof/>
               </w:rPr>
-              <w:instrText xml:space="preserve"> PAGEREF _Toc242599608 \h </w:instrText>
+              <w:instrText xml:space="preserve"> PAGEREF _Toc242603064 \h </w:instrText>
             </w:r>
             <w:r>
               <w:rPr>
@@ -4052,7 +4236,7 @@
               <w:rPr>
                 <w:noProof/>
               </w:rPr>
-              <w:t>21</w:t>
+              <w:t>22</w:t>
             </w:r>
             <w:r>
               <w:rPr>
@@ -4078,7 +4262,7 @@
               <w14:ligatures w14:val="standardContextual"/>
             </w:rPr>
           </w:pPr>
-          <w:hyperlink w:anchor="_Toc242599609" w:history="1">
+          <w:hyperlink w:anchor="_Toc242603065" w:history="1">
             <w:r>
               <w:rPr>
                 <w:rStyle w:val="Hyperlink"/>
@@ -4102,7 +4286,7 @@
               <w:rPr>
                 <w:noProof/>
               </w:rPr>
-              <w:instrText xml:space="preserve"> PAGEREF _Toc242599609 \h </w:instrText>
+              <w:instrText xml:space="preserve"> PAGEREF _Toc242603065 \h </w:instrText>
             </w:r>
             <w:r>
               <w:rPr>
@@ -4119,7 +4303,7 @@
               <w:rPr>
                 <w:noProof/>
               </w:rPr>
-              <w:t>22</w:t>
+              <w:t>23</w:t>
             </w:r>
             <w:r>
               <w:rPr>
@@ -4145,7 +4329,7 @@
               <w14:ligatures w14:val="standardContextual"/>
             </w:rPr>
           </w:pPr>
-          <w:hyperlink w:anchor="_Toc242599610" w:history="1">
+          <w:hyperlink w:anchor="_Toc242603066" w:history="1">
             <w:r>
               <w:rPr>
                 <w:rStyle w:val="Hyperlink"/>
@@ -4169,7 +4353,7 @@
               <w:rPr>
                 <w:noProof/>
               </w:rPr>
-              <w:instrText xml:space="preserve"> PAGEREF _Toc242599610 \h </w:instrText>
+              <w:instrText xml:space="preserve"> PAGEREF _Toc242603066 \h </w:instrText>
             </w:r>
             <w:r>
               <w:rPr>
@@ -4186,7 +4370,7 @@
               <w:rPr>
                 <w:noProof/>
               </w:rPr>
-              <w:t>23</w:t>
+              <w:t>24</w:t>
             </w:r>
             <w:r>
               <w:rPr>
@@ -4212,7 +4396,7 @@
               <w14:ligatures w14:val="standardContextual"/>
             </w:rPr>
           </w:pPr>
-          <w:hyperlink w:anchor="_Toc242599611" w:history="1">
+          <w:hyperlink w:anchor="_Toc242603067" w:history="1">
             <w:r>
               <w:rPr>
                 <w:rStyle w:val="Hyperlink"/>
@@ -4236,7 +4420,7 @@
               <w:rPr>
                 <w:noProof/>
               </w:rPr>
-              <w:instrText xml:space="preserve"> PAGEREF _Toc242599611 \h </w:instrText>
+              <w:instrText xml:space="preserve"> PAGEREF _Toc242603067 \h </w:instrText>
             </w:r>
             <w:r>
               <w:rPr>
@@ -4253,7 +4437,7 @@
               <w:rPr>
                 <w:noProof/>
               </w:rPr>
-              <w:t>25</w:t>
+              <w:t>26</w:t>
             </w:r>
             <w:r>
               <w:rPr>
@@ -4279,7 +4463,7 @@
               <w14:ligatures w14:val="standardContextual"/>
             </w:rPr>
           </w:pPr>
-          <w:hyperlink w:anchor="_Toc242599612" w:history="1">
+          <w:hyperlink w:anchor="_Toc242603068" w:history="1">
             <w:r>
               <w:rPr>
                 <w:rStyle w:val="Hyperlink"/>
@@ -4303,7 +4487,7 @@
               <w:rPr>
                 <w:noProof/>
               </w:rPr>
-              <w:instrText xml:space="preserve"> PAGEREF _Toc242599612 \h </w:instrText>
+              <w:instrText xml:space="preserve"> PAGEREF _Toc242603068 \h </w:instrText>
             </w:r>
             <w:r>
               <w:rPr>
@@ -4320,7 +4504,7 @@
               <w:rPr>
                 <w:noProof/>
               </w:rPr>
-              <w:t>26</w:t>
+              <w:t>27</w:t>
             </w:r>
             <w:r>
               <w:rPr>
@@ -4346,7 +4530,7 @@
               <w14:ligatures w14:val="standardContextual"/>
             </w:rPr>
           </w:pPr>
-          <w:hyperlink w:anchor="_Toc242599613" w:history="1">
+          <w:hyperlink w:anchor="_Toc242603069" w:history="1">
             <w:r>
               <w:rPr>
                 <w:rStyle w:val="Hyperlink"/>
@@ -4370,7 +4554,7 @@
               <w:rPr>
                 <w:noProof/>
               </w:rPr>
-              <w:instrText xml:space="preserve"> PAGEREF _Toc242599613 \h </w:instrText>
+              <w:instrText xml:space="preserve"> PAGEREF _Toc242603069 \h </w:instrText>
             </w:r>
             <w:r>
               <w:rPr>
@@ -4387,7 +4571,7 @@
               <w:rPr>
                 <w:noProof/>
               </w:rPr>
-              <w:t>32</w:t>
+              <w:t>33</w:t>
             </w:r>
             <w:r>
               <w:rPr>
@@ -4413,7 +4597,7 @@
               <w14:ligatures w14:val="standardContextual"/>
             </w:rPr>
           </w:pPr>
-          <w:hyperlink w:anchor="_Toc242599614" w:history="1">
+          <w:hyperlink w:anchor="_Toc242603070" w:history="1">
             <w:r>
               <w:rPr>
                 <w:rStyle w:val="Hyperlink"/>
@@ -4437,7 +4621,7 @@
               <w:rPr>
                 <w:noProof/>
               </w:rPr>
-              <w:instrText xml:space="preserve"> PAGEREF _Toc242599614 \h </w:instrText>
+              <w:instrText xml:space="preserve"> PAGEREF _Toc242603070 \h </w:instrText>
             </w:r>
             <w:r>
               <w:rPr>
@@ -4454,7 +4638,7 @@
               <w:rPr>
                 <w:noProof/>
               </w:rPr>
-              <w:t>34</w:t>
+              <w:t>35</w:t>
             </w:r>
             <w:r>
               <w:rPr>
@@ -4480,7 +4664,7 @@
               <w14:ligatures w14:val="standardContextual"/>
             </w:rPr>
           </w:pPr>
-          <w:hyperlink w:anchor="_Toc242599615" w:history="1">
+          <w:hyperlink w:anchor="_Toc242603071" w:history="1">
             <w:r>
               <w:rPr>
                 <w:rStyle w:val="Hyperlink"/>
@@ -4504,7 +4688,7 @@
               <w:rPr>
                 <w:noProof/>
               </w:rPr>
-              <w:instrText xml:space="preserve"> PAGEREF _Toc242599615 \h </w:instrText>
+              <w:instrText xml:space="preserve"> PAGEREF _Toc242603071 \h </w:instrText>
             </w:r>
             <w:r>
               <w:rPr>
@@ -4521,7 +4705,7 @@
               <w:rPr>
                 <w:noProof/>
               </w:rPr>
-              <w:t>35</w:t>
+              <w:t>36</w:t>
             </w:r>
             <w:r>
               <w:rPr>
@@ -4547,13 +4731,13 @@
               <w14:ligatures w14:val="standardContextual"/>
             </w:rPr>
           </w:pPr>
-          <w:hyperlink w:anchor="_Toc242599616" w:history="1">
+          <w:hyperlink w:anchor="_Toc242603072" w:history="1">
             <w:r>
               <w:rPr>
                 <w:rStyle w:val="Hyperlink"/>
                 <w:noProof/>
               </w:rPr>
-              <w:t>Appendix F: Groups (migration 0006)</w:t>
+              <w:t>Appendix F: Group rules (migration 0009)</w:t>
             </w:r>
             <w:r>
               <w:rPr>
@@ -4571,7 +4755,7 @@
               <w:rPr>
                 <w:noProof/>
               </w:rPr>
-              <w:instrText xml:space="preserve"> PAGEREF _Toc242599616 \h </w:instrText>
+              <w:instrText xml:space="preserve"> PAGEREF _Toc242603072 \h </w:instrText>
             </w:r>
             <w:r>
               <w:rPr>
@@ -4588,7 +4772,7 @@
               <w:rPr>
                 <w:noProof/>
               </w:rPr>
-              <w:t>36</w:t>
+              <w:t>37</w:t>
             </w:r>
             <w:r>
               <w:rPr>
@@ -4614,13 +4798,13 @@
               <w14:ligatures w14:val="standardContextual"/>
             </w:rPr>
           </w:pPr>
-          <w:hyperlink w:anchor="_Toc242599617" w:history="1">
+          <w:hyperlink w:anchor="_Toc242603073" w:history="1">
             <w:r>
               <w:rPr>
                 <w:rStyle w:val="Hyperlink"/>
                 <w:noProof/>
               </w:rPr>
-              <w:t>Appendix G: Glossary</w:t>
+              <w:t>Appendix G: Groups (migration 0006)</w:t>
             </w:r>
             <w:r>
               <w:rPr>
@@ -4638,7 +4822,7 @@
               <w:rPr>
                 <w:noProof/>
               </w:rPr>
-              <w:instrText xml:space="preserve"> PAGEREF _Toc242599617 \h </w:instrText>
+              <w:instrText xml:space="preserve"> PAGEREF _Toc242603073 \h </w:instrText>
             </w:r>
             <w:r>
               <w:rPr>
@@ -4681,13 +4865,13 @@
               <w14:ligatures w14:val="standardContextual"/>
             </w:rPr>
           </w:pPr>
-          <w:hyperlink w:anchor="_Toc242599618" w:history="1">
+          <w:hyperlink w:anchor="_Toc242603074" w:history="1">
             <w:r>
               <w:rPr>
                 <w:rStyle w:val="Hyperlink"/>
                 <w:noProof/>
               </w:rPr>
-              <w:t>Appendix H: References</w:t>
+              <w:t>Appendix H: Glossary</w:t>
             </w:r>
             <w:r>
               <w:rPr>
@@ -4705,7 +4889,7 @@
               <w:rPr>
                 <w:noProof/>
               </w:rPr>
-              <w:instrText xml:space="preserve"> PAGEREF _Toc242599618 \h </w:instrText>
+              <w:instrText xml:space="preserve"> PAGEREF _Toc242603074 \h </w:instrText>
             </w:r>
             <w:r>
               <w:rPr>
@@ -4722,7 +4906,74 @@
               <w:rPr>
                 <w:noProof/>
               </w:rPr>
-              <w:t>39</w:t>
+              <w:t>40</w:t>
+            </w:r>
+            <w:r>
+              <w:rPr>
+                <w:noProof/>
+              </w:rPr>
+              <w:fldChar w:fldCharType="end"/>
+            </w:r>
+          </w:hyperlink>
+        </w:p>
+        <w:p>
+          <w:pPr>
+            <w:pStyle w:val="TOC1"/>
+            <w:tabs>
+              <w:tab w:val="right" w:leader="dot" w:pos="9628"/>
+            </w:tabs>
+            <w:rPr>
+              <w:rFonts w:asciiTheme="minorHAnsi" w:eastAsiaTheme="minorEastAsia" w:hAnsiTheme="minorHAnsi" w:cstheme="minorBidi"/>
+              <w:noProof/>
+              <w:color w:val="auto"/>
+              <w:kern w:val="2"/>
+              <w:sz w:val="24"/>
+              <w:szCs w:val="24"/>
+              <w14:ligatures w14:val="standardContextual"/>
+            </w:rPr>
+          </w:pPr>
+          <w:hyperlink w:anchor="_Toc242603075" w:history="1">
+            <w:r>
+              <w:rPr>
+                <w:rStyle w:val="Hyperlink"/>
+                <w:noProof/>
+              </w:rPr>
+              <w:t>Appendix I: References</w:t>
+            </w:r>
+            <w:r>
+              <w:rPr>
+                <w:noProof/>
+              </w:rPr>
+              <w:tab/>
+            </w:r>
+            <w:r>
+              <w:rPr>
+                <w:noProof/>
+              </w:rPr>
+              <w:fldChar w:fldCharType="begin"/>
+            </w:r>
+            <w:r>
+              <w:rPr>
+                <w:noProof/>
+              </w:rPr>
+              <w:instrText xml:space="preserve"> PAGEREF _Toc242603075 \h </w:instrText>
+            </w:r>
+            <w:r>
+              <w:rPr>
+                <w:noProof/>
+              </w:rPr>
+            </w:r>
+            <w:r>
+              <w:rPr>
+                <w:noProof/>
+              </w:rPr>
+              <w:fldChar w:fldCharType="separate"/>
+            </w:r>
+            <w:r>
+              <w:rPr>
+                <w:noProof/>
+              </w:rPr>
+              <w:t>41</w:t>
             </w:r>
             <w:r>
               <w:rPr>
@@ -4751,7 +5002,7 @@
     <w:sdt>
       <w:sdtPr>
         <w:alias w:val="Figures"/>
-        <w:id w:val="-1913911731"/>
+        <w:id w:val="929933078"/>
       </w:sdtPr>
       <w:sdtEndPr/>
       <w:sdtContent>
@@ -4780,7 +5031,7 @@
           <w:r>
             <w:fldChar w:fldCharType="separate"/>
           </w:r>
-          <w:hyperlink w:anchor="_Toc242599619" w:history="1">
+          <w:hyperlink w:anchor="_Toc242603076" w:history="1">
             <w:r>
               <w:rPr>
                 <w:rStyle w:val="Hyperlink"/>
@@ -4804,7 +5055,7 @@
               <w:rPr>
                 <w:noProof/>
               </w:rPr>
-              <w:instrText xml:space="preserve"> PAGEREF _Toc242599619 \h </w:instrText>
+              <w:instrText xml:space="preserve"> PAGEREF _Toc242603076 \h </w:instrText>
             </w:r>
             <w:r>
               <w:rPr>
@@ -4821,7 +5072,7 @@
               <w:rPr>
                 <w:noProof/>
               </w:rPr>
-              <w:t>7</w:t>
+              <w:t>8</w:t>
             </w:r>
             <w:r>
               <w:rPr>
@@ -4847,7 +5098,7 @@
               <w14:ligatures w14:val="standardContextual"/>
             </w:rPr>
           </w:pPr>
-          <w:hyperlink w:anchor="_Toc242599620" w:history="1">
+          <w:hyperlink w:anchor="_Toc242603077" w:history="1">
             <w:r>
               <w:rPr>
                 <w:rStyle w:val="Hyperlink"/>
@@ -4871,7 +5122,7 @@
               <w:rPr>
                 <w:noProof/>
               </w:rPr>
-              <w:instrText xml:space="preserve"> PAGEREF _Toc242599620 \h </w:instrText>
+              <w:instrText xml:space="preserve"> PAGEREF _Toc242603077 \h </w:instrText>
             </w:r>
             <w:r>
               <w:rPr>
@@ -4888,7 +5139,7 @@
               <w:rPr>
                 <w:noProof/>
               </w:rPr>
-              <w:t>8</w:t>
+              <w:t>9</w:t>
             </w:r>
             <w:r>
               <w:rPr>
@@ -4914,7 +5165,7 @@
               <w14:ligatures w14:val="standardContextual"/>
             </w:rPr>
           </w:pPr>
-          <w:hyperlink w:anchor="_Toc242599621" w:history="1">
+          <w:hyperlink w:anchor="_Toc242603078" w:history="1">
             <w:r>
               <w:rPr>
                 <w:rStyle w:val="Hyperlink"/>
@@ -4938,7 +5189,7 @@
               <w:rPr>
                 <w:noProof/>
               </w:rPr>
-              <w:instrText xml:space="preserve"> PAGEREF _Toc242599621 \h </w:instrText>
+              <w:instrText xml:space="preserve"> PAGEREF _Toc242603078 \h </w:instrText>
             </w:r>
             <w:r>
               <w:rPr>
@@ -4955,7 +5206,7 @@
               <w:rPr>
                 <w:noProof/>
               </w:rPr>
-              <w:t>9</w:t>
+              <w:t>10</w:t>
             </w:r>
             <w:r>
               <w:rPr>
@@ -4981,7 +5232,7 @@
               <w14:ligatures w14:val="standardContextual"/>
             </w:rPr>
           </w:pPr>
-          <w:hyperlink w:anchor="_Toc242599622" w:history="1">
+          <w:hyperlink w:anchor="_Toc242603079" w:history="1">
             <w:r>
               <w:rPr>
                 <w:rStyle w:val="Hyperlink"/>
@@ -5005,7 +5256,7 @@
               <w:rPr>
                 <w:noProof/>
               </w:rPr>
-              <w:instrText xml:space="preserve"> PAGEREF _Toc242599622 \h </w:instrText>
+              <w:instrText xml:space="preserve"> PAGEREF _Toc242603079 \h </w:instrText>
             </w:r>
             <w:r>
               <w:rPr>
@@ -5022,7 +5273,7 @@
               <w:rPr>
                 <w:noProof/>
               </w:rPr>
-              <w:t>9</w:t>
+              <w:t>10</w:t>
             </w:r>
             <w:r>
               <w:rPr>
@@ -5048,7 +5299,7 @@
               <w14:ligatures w14:val="standardContextual"/>
             </w:rPr>
           </w:pPr>
-          <w:hyperlink w:anchor="_Toc242599623" w:history="1">
+          <w:hyperlink w:anchor="_Toc242603080" w:history="1">
             <w:r>
               <w:rPr>
                 <w:rStyle w:val="Hyperlink"/>
@@ -5072,7 +5323,7 @@
               <w:rPr>
                 <w:noProof/>
               </w:rPr>
-              <w:instrText xml:space="preserve"> PAGEREF _Toc242599623 \h </w:instrText>
+              <w:instrText xml:space="preserve"> PAGEREF _Toc242603080 \h </w:instrText>
             </w:r>
             <w:r>
               <w:rPr>
@@ -5089,7 +5340,7 @@
               <w:rPr>
                 <w:noProof/>
               </w:rPr>
-              <w:t>10</w:t>
+              <w:t>11</w:t>
             </w:r>
             <w:r>
               <w:rPr>
@@ -5115,7 +5366,7 @@
               <w14:ligatures w14:val="standardContextual"/>
             </w:rPr>
           </w:pPr>
-          <w:hyperlink w:anchor="_Toc242599624" w:history="1">
+          <w:hyperlink w:anchor="_Toc242603081" w:history="1">
             <w:r>
               <w:rPr>
                 <w:rStyle w:val="Hyperlink"/>
@@ -5139,7 +5390,7 @@
               <w:rPr>
                 <w:noProof/>
               </w:rPr>
-              <w:instrText xml:space="preserve"> PAGEREF _Toc242599624 \h </w:instrText>
+              <w:instrText xml:space="preserve"> PAGEREF _Toc242603081 \h </w:instrText>
             </w:r>
             <w:r>
               <w:rPr>
@@ -5156,7 +5407,7 @@
               <w:rPr>
                 <w:noProof/>
               </w:rPr>
-              <w:t>17</w:t>
+              <w:t>18</w:t>
             </w:r>
             <w:r>
               <w:rPr>
@@ -5182,7 +5433,7 @@
               <w14:ligatures w14:val="standardContextual"/>
             </w:rPr>
           </w:pPr>
-          <w:hyperlink w:anchor="_Toc242599625" w:history="1">
+          <w:hyperlink w:anchor="_Toc242603082" w:history="1">
             <w:r>
               <w:rPr>
                 <w:rStyle w:val="Hyperlink"/>
@@ -5206,7 +5457,7 @@
               <w:rPr>
                 <w:noProof/>
               </w:rPr>
-              <w:instrText xml:space="preserve"> PAGEREF _Toc242599625 \h </w:instrText>
+              <w:instrText xml:space="preserve"> PAGEREF _Toc242603082 \h </w:instrText>
             </w:r>
             <w:r>
               <w:rPr>
@@ -5223,7 +5474,7 @@
               <w:rPr>
                 <w:noProof/>
               </w:rPr>
-              <w:t>18</w:t>
+              <w:t>19</w:t>
             </w:r>
             <w:r>
               <w:rPr>
@@ -5249,7 +5500,7 @@
               <w14:ligatures w14:val="standardContextual"/>
             </w:rPr>
           </w:pPr>
-          <w:hyperlink w:anchor="_Toc242599626" w:history="1">
+          <w:hyperlink w:anchor="_Toc242603083" w:history="1">
             <w:r>
               <w:rPr>
                 <w:rStyle w:val="Hyperlink"/>
@@ -5273,7 +5524,7 @@
               <w:rPr>
                 <w:noProof/>
               </w:rPr>
-              <w:instrText xml:space="preserve"> PAGEREF _Toc242599626 \h </w:instrText>
+              <w:instrText xml:space="preserve"> PAGEREF _Toc242603083 \h </w:instrText>
             </w:r>
             <w:r>
               <w:rPr>
@@ -5290,7 +5541,7 @@
               <w:rPr>
                 <w:noProof/>
               </w:rPr>
-              <w:t>18</w:t>
+              <w:t>19</w:t>
             </w:r>
             <w:r>
               <w:rPr>
@@ -5319,7 +5570,7 @@
     <w:sdt>
       <w:sdtPr>
         <w:alias w:val="Tables"/>
-        <w:id w:val="-74824886"/>
+        <w:id w:val="1724405199"/>
       </w:sdtPr>
       <w:sdtEndPr/>
       <w:sdtContent>
@@ -5348,7 +5599,7 @@
           <w:r>
             <w:fldChar w:fldCharType="separate"/>
           </w:r>
-          <w:hyperlink w:anchor="_Toc242599627" w:history="1">
+          <w:hyperlink w:anchor="_Toc242603084" w:history="1">
             <w:r>
               <w:rPr>
                 <w:rStyle w:val="Hyperlink"/>
@@ -5372,7 +5623,7 @@
               <w:rPr>
                 <w:noProof/>
               </w:rPr>
-              <w:instrText xml:space="preserve"> PAGEREF _Toc242599627 \h </w:instrText>
+              <w:instrText xml:space="preserve"> PAGEREF _Toc242603084 \h </w:instrText>
             </w:r>
             <w:r>
               <w:rPr>
@@ -5389,7 +5640,7 @@
               <w:rPr>
                 <w:noProof/>
               </w:rPr>
-              <w:t>5</w:t>
+              <w:t>6</w:t>
             </w:r>
             <w:r>
               <w:rPr>
@@ -5415,7 +5666,7 @@
               <w14:ligatures w14:val="standardContextual"/>
             </w:rPr>
           </w:pPr>
-          <w:hyperlink w:anchor="_Toc242599628" w:history="1">
+          <w:hyperlink w:anchor="_Toc242603085" w:history="1">
             <w:r>
               <w:rPr>
                 <w:rStyle w:val="Hyperlink"/>
@@ -5439,7 +5690,7 @@
               <w:rPr>
                 <w:noProof/>
               </w:rPr>
-              <w:instrText xml:space="preserve"> PAGEREF _Toc242599628 \h </w:instrText>
+              <w:instrText xml:space="preserve"> PAGEREF _Toc242603085 \h </w:instrText>
             </w:r>
             <w:r>
               <w:rPr>
@@ -5456,7 +5707,7 @@
               <w:rPr>
                 <w:noProof/>
               </w:rPr>
-              <w:t>12</w:t>
+              <w:t>13</w:t>
             </w:r>
             <w:r>
               <w:rPr>
@@ -5482,7 +5733,7 @@
               <w14:ligatures w14:val="standardContextual"/>
             </w:rPr>
           </w:pPr>
-          <w:hyperlink w:anchor="_Toc242599629" w:history="1">
+          <w:hyperlink w:anchor="_Toc242603086" w:history="1">
             <w:r>
               <w:rPr>
                 <w:rStyle w:val="Hyperlink"/>
@@ -5506,7 +5757,7 @@
               <w:rPr>
                 <w:noProof/>
               </w:rPr>
-              <w:instrText xml:space="preserve"> PAGEREF _Toc242599629 \h </w:instrText>
+              <w:instrText xml:space="preserve"> PAGEREF _Toc242603086 \h </w:instrText>
             </w:r>
             <w:r>
               <w:rPr>
@@ -5523,7 +5774,7 @@
               <w:rPr>
                 <w:noProof/>
               </w:rPr>
-              <w:t>14</w:t>
+              <w:t>15</w:t>
             </w:r>
             <w:r>
               <w:rPr>
@@ -5549,7 +5800,7 @@
               <w14:ligatures w14:val="standardContextual"/>
             </w:rPr>
           </w:pPr>
-          <w:hyperlink w:anchor="_Toc242599630" w:history="1">
+          <w:hyperlink w:anchor="_Toc242603087" w:history="1">
             <w:r>
               <w:rPr>
                 <w:rStyle w:val="Hyperlink"/>
@@ -5573,7 +5824,7 @@
               <w:rPr>
                 <w:noProof/>
               </w:rPr>
-              <w:instrText xml:space="preserve"> PAGEREF _Toc242599630 \h </w:instrText>
+              <w:instrText xml:space="preserve"> PAGEREF _Toc242603087 \h </w:instrText>
             </w:r>
             <w:r>
               <w:rPr>
@@ -5590,7 +5841,7 @@
               <w:rPr>
                 <w:noProof/>
               </w:rPr>
-              <w:t>15</w:t>
+              <w:t>16</w:t>
             </w:r>
             <w:r>
               <w:rPr>
@@ -5616,7 +5867,7 @@
               <w14:ligatures w14:val="standardContextual"/>
             </w:rPr>
           </w:pPr>
-          <w:hyperlink w:anchor="_Toc242599631" w:history="1">
+          <w:hyperlink w:anchor="_Toc242603088" w:history="1">
             <w:r>
               <w:rPr>
                 <w:rStyle w:val="Hyperlink"/>
@@ -5640,7 +5891,7 @@
               <w:rPr>
                 <w:noProof/>
               </w:rPr>
-              <w:instrText xml:space="preserve"> PAGEREF _Toc242599631 \h </w:instrText>
+              <w:instrText xml:space="preserve"> PAGEREF _Toc242603088 \h </w:instrText>
             </w:r>
             <w:r>
               <w:rPr>
@@ -5657,7 +5908,7 @@
               <w:rPr>
                 <w:noProof/>
               </w:rPr>
-              <w:t>16</w:t>
+              <w:t>17</w:t>
             </w:r>
             <w:r>
               <w:rPr>
@@ -5683,7 +5934,7 @@
               <w14:ligatures w14:val="standardContextual"/>
             </w:rPr>
           </w:pPr>
-          <w:hyperlink w:anchor="_Toc242599632" w:history="1">
+          <w:hyperlink w:anchor="_Toc242603089" w:history="1">
             <w:r>
               <w:rPr>
                 <w:rStyle w:val="Hyperlink"/>
@@ -5707,7 +5958,7 @@
               <w:rPr>
                 <w:noProof/>
               </w:rPr>
-              <w:instrText xml:space="preserve"> PAGEREF _Toc242599632 \h </w:instrText>
+              <w:instrText xml:space="preserve"> PAGEREF _Toc242603089 \h </w:instrText>
             </w:r>
             <w:r>
               <w:rPr>
@@ -5724,7 +5975,7 @@
               <w:rPr>
                 <w:noProof/>
               </w:rPr>
-              <w:t>19</w:t>
+              <w:t>20</w:t>
             </w:r>
             <w:r>
               <w:rPr>
@@ -5750,7 +6001,7 @@
               <w14:ligatures w14:val="standardContextual"/>
             </w:rPr>
           </w:pPr>
-          <w:hyperlink w:anchor="_Toc242599633" w:history="1">
+          <w:hyperlink w:anchor="_Toc242603090" w:history="1">
             <w:r>
               <w:rPr>
                 <w:rStyle w:val="Hyperlink"/>
@@ -5774,7 +6025,7 @@
               <w:rPr>
                 <w:noProof/>
               </w:rPr>
-              <w:instrText xml:space="preserve"> PAGEREF _Toc242599633 \h </w:instrText>
+              <w:instrText xml:space="preserve"> PAGEREF _Toc242603090 \h </w:instrText>
             </w:r>
             <w:r>
               <w:rPr>
@@ -5791,7 +6042,7 @@
               <w:rPr>
                 <w:noProof/>
               </w:rPr>
-              <w:t>20</w:t>
+              <w:t>21</w:t>
             </w:r>
             <w:r>
               <w:rPr>
@@ -5817,7 +6068,7 @@
               <w14:ligatures w14:val="standardContextual"/>
             </w:rPr>
           </w:pPr>
-          <w:hyperlink w:anchor="_Toc242599634" w:history="1">
+          <w:hyperlink w:anchor="_Toc242603091" w:history="1">
             <w:r>
               <w:rPr>
                 <w:rStyle w:val="Hyperlink"/>
@@ -5841,7 +6092,7 @@
               <w:rPr>
                 <w:noProof/>
               </w:rPr>
-              <w:instrText xml:space="preserve"> PAGEREF _Toc242599634 \h </w:instrText>
+              <w:instrText xml:space="preserve"> PAGEREF _Toc242603091 \h </w:instrText>
             </w:r>
             <w:r>
               <w:rPr>
@@ -5858,7 +6109,7 @@
               <w:rPr>
                 <w:noProof/>
               </w:rPr>
-              <w:t>21</w:t>
+              <w:t>22</w:t>
             </w:r>
             <w:r>
               <w:rPr>
@@ -5884,7 +6135,7 @@
               <w14:ligatures w14:val="standardContextual"/>
             </w:rPr>
           </w:pPr>
-          <w:hyperlink w:anchor="_Toc242599635" w:history="1">
+          <w:hyperlink w:anchor="_Toc242603092" w:history="1">
             <w:r>
               <w:rPr>
                 <w:rStyle w:val="Hyperlink"/>
@@ -5908,7 +6159,7 @@
               <w:rPr>
                 <w:noProof/>
               </w:rPr>
-              <w:instrText xml:space="preserve"> PAGEREF _Toc242599635 \h </w:instrText>
+              <w:instrText xml:space="preserve"> PAGEREF _Toc242603092 \h </w:instrText>
             </w:r>
             <w:r>
               <w:rPr>
@@ -5925,7 +6176,7 @@
               <w:rPr>
                 <w:noProof/>
               </w:rPr>
-              <w:t>22</w:t>
+              <w:t>23</w:t>
             </w:r>
             <w:r>
               <w:rPr>
@@ -5951,7 +6202,7 @@
               <w14:ligatures w14:val="standardContextual"/>
             </w:rPr>
           </w:pPr>
-          <w:hyperlink w:anchor="_Toc242599636" w:history="1">
+          <w:hyperlink w:anchor="_Toc242603093" w:history="1">
             <w:r>
               <w:rPr>
                 <w:rStyle w:val="Hyperlink"/>
@@ -5975,7 +6226,7 @@
               <w:rPr>
                 <w:noProof/>
               </w:rPr>
-              <w:instrText xml:space="preserve"> PAGEREF _Toc242599636 \h </w:instrText>
+              <w:instrText xml:space="preserve"> PAGEREF _Toc242603093 \h </w:instrText>
             </w:r>
             <w:r>
               <w:rPr>
@@ -5992,7 +6243,7 @@
               <w:rPr>
                 <w:noProof/>
               </w:rPr>
-              <w:t>23</w:t>
+              <w:t>24</w:t>
             </w:r>
             <w:r>
               <w:rPr>
@@ -6018,7 +6269,7 @@
               <w14:ligatures w14:val="standardContextual"/>
             </w:rPr>
           </w:pPr>
-          <w:hyperlink w:anchor="_Toc242599637" w:history="1">
+          <w:hyperlink w:anchor="_Toc242603094" w:history="1">
             <w:r>
               <w:rPr>
                 <w:rStyle w:val="Hyperlink"/>
@@ -6042,7 +6293,7 @@
               <w:rPr>
                 <w:noProof/>
               </w:rPr>
-              <w:instrText xml:space="preserve"> PAGEREF _Toc242599637 \h </w:instrText>
+              <w:instrText xml:space="preserve"> PAGEREF _Toc242603094 \h </w:instrText>
             </w:r>
             <w:r>
               <w:rPr>
@@ -6059,7 +6310,7 @@
               <w:rPr>
                 <w:noProof/>
               </w:rPr>
-              <w:t>23</w:t>
+              <w:t>24</w:t>
             </w:r>
             <w:r>
               <w:rPr>
@@ -6085,7 +6336,7 @@
               <w14:ligatures w14:val="standardContextual"/>
             </w:rPr>
           </w:pPr>
-          <w:hyperlink w:anchor="_Toc242599638" w:history="1">
+          <w:hyperlink w:anchor="_Toc242603095" w:history="1">
             <w:r>
               <w:rPr>
                 <w:rStyle w:val="Hyperlink"/>
@@ -6109,7 +6360,7 @@
               <w:rPr>
                 <w:noProof/>
               </w:rPr>
-              <w:instrText xml:space="preserve"> PAGEREF _Toc242599638 \h </w:instrText>
+              <w:instrText xml:space="preserve"> PAGEREF _Toc242603095 \h </w:instrText>
             </w:r>
             <w:r>
               <w:rPr>
@@ -6126,7 +6377,7 @@
               <w:rPr>
                 <w:noProof/>
               </w:rPr>
-              <w:t>25</w:t>
+              <w:t>26</w:t>
             </w:r>
             <w:r>
               <w:rPr>
@@ -6152,7 +6403,7 @@
               <w14:ligatures w14:val="standardContextual"/>
             </w:rPr>
           </w:pPr>
-          <w:hyperlink w:anchor="_Toc242599639" w:history="1">
+          <w:hyperlink w:anchor="_Toc242603096" w:history="1">
             <w:r>
               <w:rPr>
                 <w:rStyle w:val="Hyperlink"/>
@@ -6176,7 +6427,7 @@
               <w:rPr>
                 <w:noProof/>
               </w:rPr>
-              <w:instrText xml:space="preserve"> PAGEREF _Toc242599639 \h </w:instrText>
+              <w:instrText xml:space="preserve"> PAGEREF _Toc242603096 \h </w:instrText>
             </w:r>
             <w:r>
               <w:rPr>
@@ -6193,7 +6444,7 @@
               <w:rPr>
                 <w:noProof/>
               </w:rPr>
-              <w:t>38</w:t>
+              <w:t>40</w:t>
             </w:r>
             <w:r>
               <w:rPr>
@@ -6219,7 +6470,7 @@
               <w14:ligatures w14:val="standardContextual"/>
             </w:rPr>
           </w:pPr>
-          <w:hyperlink w:anchor="_Toc242599640" w:history="1">
+          <w:hyperlink w:anchor="_Toc242603097" w:history="1">
             <w:r>
               <w:rPr>
                 <w:rStyle w:val="Hyperlink"/>
@@ -6243,7 +6494,7 @@
               <w:rPr>
                 <w:noProof/>
               </w:rPr>
-              <w:instrText xml:space="preserve"> PAGEREF _Toc242599640 \h </w:instrText>
+              <w:instrText xml:space="preserve"> PAGEREF _Toc242603097 \h </w:instrText>
             </w:r>
             <w:r>
               <w:rPr>
@@ -6260,7 +6511,7 @@
               <w:rPr>
                 <w:noProof/>
               </w:rPr>
-              <w:t>39</w:t>
+              <w:t>41</w:t>
             </w:r>
             <w:r>
               <w:rPr>
@@ -6284,7 +6535,7 @@
         <w:keepLines/>
         <w:pageBreakBefore/>
       </w:pPr>
-      <w:bookmarkStart w:id="0" w:name="_Toc242599583"/>
+      <w:bookmarkStart w:id="0" w:name="_Toc242603038"/>
       <w:r>
         <w:lastRenderedPageBreak/>
         <w:t>1 Introduction</w:t>
@@ -6297,7 +6548,7 @@
         <w:keepNext/>
         <w:keepLines/>
       </w:pPr>
-      <w:bookmarkStart w:id="1" w:name="_Toc242599584"/>
+      <w:bookmarkStart w:id="1" w:name="_Toc242603039"/>
       <w:r>
         <w:t>1.1 Purpose</w:t>
       </w:r>
@@ -6347,7 +6598,7 @@
         <w:keepNext/>
         <w:keepLines/>
       </w:pPr>
-      <w:bookmarkStart w:id="2" w:name="_Toc242599585"/>
+      <w:bookmarkStart w:id="2" w:name="_Toc242603040"/>
       <w:r>
         <w:t>1.2 Scope</w:t>
       </w:r>
@@ -6368,10 +6619,7 @@
         <w:t>optional</w:t>
       </w:r>
       <w:r>
-        <w:t xml:space="preserve"> student account: a student who chooses to create one keeps the same profile on the server, under a username only, so it follows them between </w:t>
-      </w:r>
-      <w:r>
-        <w:t>devices and can drive reminders. Section 2.5 models it. The preference list stays on the device.</w:t>
+        <w:t xml:space="preserve"> student account: a student who chooses to create one keeps the same profile on the server, under a username only, so it follows them between devices and can drive reminders. Section 2.5 models it. The preference list stays on the device.</w:t>
       </w:r>
     </w:p>
     <w:p>
@@ -6380,7 +6628,7 @@
         <w:keepNext/>
         <w:keepLines/>
       </w:pPr>
-      <w:bookmarkStart w:id="3" w:name="_Toc242599586"/>
+      <w:bookmarkStart w:id="3" w:name="_Toc242603041"/>
       <w:r>
         <w:t>1.3 Intended audience</w:t>
       </w:r>
@@ -6400,7 +6648,7 @@
         <w:keepNext/>
         <w:keepLines/>
       </w:pPr>
-      <w:bookmarkStart w:id="4" w:name="_Toc242599587"/>
+      <w:bookmarkStart w:id="4" w:name="_Toc242603042"/>
       <w:r>
         <w:t>1.4 Relationship to other documents</w:t>
       </w:r>
@@ -6411,7 +6659,7 @@
         <w:pStyle w:val="Caption"/>
         <w:keepNext/>
       </w:pPr>
-      <w:bookmarkStart w:id="5" w:name="_Toc242599627"/>
+      <w:bookmarkStart w:id="5" w:name="_Toc242603084"/>
       <w:r>
         <w:t xml:space="preserve">Table </w:t>
       </w:r>
@@ -6453,7 +6701,7 @@
           <w:left w:w="10" w:type="dxa"/>
           <w:right w:w="10" w:type="dxa"/>
         </w:tblCellMar>
-        <w:tblLook w:val="0000" w:firstRow="0" w:lastRow="0" w:firstColumn="0" w:lastColumn="0" w:noHBand="0" w:noVBand="0"/>
+        <w:tblLook w:val="04A0" w:firstRow="1" w:lastRow="0" w:firstColumn="1" w:lastColumn="0" w:noHBand="0" w:noVBand="1"/>
       </w:tblPr>
       <w:tblGrid>
         <w:gridCol w:w="4819"/>
@@ -6930,7 +7178,7 @@
         <w:keepNext/>
         <w:keepLines/>
       </w:pPr>
-      <w:bookmarkStart w:id="6" w:name="_Toc242599588"/>
+      <w:bookmarkStart w:id="6" w:name="_Toc242603043"/>
       <w:r>
         <w:t>1.5 Notation</w:t>
       </w:r>
@@ -7051,10 +7299,7 @@
         <w:t>union category</w:t>
       </w:r>
       <w:r>
-        <w:t xml:space="preserve">. Partial keys of weak entities are </w:t>
-      </w:r>
-      <w:r>
-        <w:t>named in the entity catalogue. Logical diagrams use crow's-foot (Information Engineering) notation.</w:t>
+        <w:t>. Partial keys of weak entities are named in the entity catalogue. Logical diagrams use crow's-foot (Information Engineering) notation.</w:t>
       </w:r>
     </w:p>
     <w:p>
@@ -7064,7 +7309,7 @@
         <w:keepLines/>
         <w:pageBreakBefore/>
       </w:pPr>
-      <w:bookmarkStart w:id="7" w:name="_Toc242599589"/>
+      <w:bookmarkStart w:id="7" w:name="_Toc242603044"/>
       <w:r>
         <w:lastRenderedPageBreak/>
         <w:t>2 Conceptual model (EER)</w:t>
@@ -7077,7 +7322,7 @@
         <w:keepNext/>
         <w:keepLines/>
       </w:pPr>
-      <w:bookmarkStart w:id="8" w:name="_Toc242599590"/>
+      <w:bookmarkStart w:id="8" w:name="_Toc242603045"/>
       <w:r>
         <w:t>2.1 Offerings and cut-offs</w:t>
       </w:r>
@@ -7153,7 +7398,7 @@
         </w:rPr>
         <w:lastRenderedPageBreak/>
         <w:drawing>
-          <wp:inline distT="0" distB="0" distL="0" distR="0" wp14:anchorId="2DFF62CD" wp14:editId="2DFF62CE">
+          <wp:inline distT="0" distB="0" distL="0" distR="0" wp14:anchorId="770A223C" wp14:editId="770A223D">
             <wp:extent cx="6124575" cy="7553325"/>
             <wp:effectExtent l="0" t="0" r="0" b="0"/>
             <wp:docPr id="1" name="eer-offerings.png" descr="EER model of institutions, courses, offerings, intake years, selection groups and cut-offs" title="EER model of institutions, courses, offerings, intake years, selection groups and cut-offs"/>
@@ -7196,7 +7441,7 @@
       <w:pPr>
         <w:pStyle w:val="Caption"/>
       </w:pPr>
-      <w:bookmarkStart w:id="9" w:name="_Toc242599619"/>
+      <w:bookmarkStart w:id="9" w:name="_Toc242603076"/>
       <w:r>
         <w:t xml:space="preserve">Figure </w:t>
       </w:r>
@@ -7229,7 +7474,7 @@
         <w:keepNext/>
         <w:keepLines/>
       </w:pPr>
-      <w:bookmarkStart w:id="10" w:name="_Toc242599591"/>
+      <w:bookmarkStart w:id="10" w:name="_Toc242603046"/>
       <w:r>
         <w:t>2.2 Subjects and requirement rules</w:t>
       </w:r>
@@ -7265,7 +7510,7 @@
         </w:rPr>
         <w:lastRenderedPageBreak/>
         <w:drawing>
-          <wp:inline distT="0" distB="0" distL="0" distR="0" wp14:anchorId="2DFF62CF" wp14:editId="2DFF62D0">
+          <wp:inline distT="0" distB="0" distL="0" distR="0" wp14:anchorId="770A223E" wp14:editId="770A223F">
             <wp:extent cx="6124575" cy="6067425"/>
             <wp:effectExtent l="0" t="0" r="0" b="0"/>
             <wp:docPr id="2" name="eer-rules.png" descr="EER model of streams, subjects and the recursive requirement-rule tree" title="EER model of streams, subjects and the recursive requirement-rule tree"/>
@@ -7308,7 +7553,7 @@
       <w:pPr>
         <w:pStyle w:val="Caption"/>
       </w:pPr>
-      <w:bookmarkStart w:id="11" w:name="_Toc242599620"/>
+      <w:bookmarkStart w:id="11" w:name="_Toc242603077"/>
       <w:r>
         <w:t xml:space="preserve">Figure </w:t>
       </w:r>
@@ -7341,7 +7586,7 @@
         <w:keepNext/>
         <w:keepLines/>
       </w:pPr>
-      <w:bookmarkStart w:id="12" w:name="_Toc242599592"/>
+      <w:bookmarkStart w:id="12" w:name="_Toc242603047"/>
       <w:r>
         <w:t>2.3 Provenance and trust</w:t>
       </w:r>
@@ -7377,7 +7622,7 @@
         </w:rPr>
         <w:lastRenderedPageBreak/>
         <w:drawing>
-          <wp:inline distT="0" distB="0" distL="0" distR="0" wp14:anchorId="2DFF62D1" wp14:editId="2DFF62D2">
+          <wp:inline distT="0" distB="0" distL="0" distR="0" wp14:anchorId="770A2240" wp14:editId="770A2241">
             <wp:extent cx="6124575" cy="4829175"/>
             <wp:effectExtent l="0" t="0" r="0" b="0"/>
             <wp:docPr id="3" name="eer-provenance.png" descr="EER model of cited facts, sources, revisions, AI extraction, review and mistake reports" title="EER model of cited facts, sources, revisions, AI extraction, review and mistake reports"/>
@@ -7420,7 +7665,7 @@
       <w:pPr>
         <w:pStyle w:val="Caption"/>
       </w:pPr>
-      <w:bookmarkStart w:id="13" w:name="_Toc242599621"/>
+      <w:bookmarkStart w:id="13" w:name="_Toc242603078"/>
       <w:r>
         <w:t xml:space="preserve">Figure </w:t>
       </w:r>
@@ -7453,7 +7698,7 @@
         <w:keepNext/>
         <w:keepLines/>
       </w:pPr>
-      <w:bookmarkStart w:id="14" w:name="_Toc242599593"/>
+      <w:bookmarkStart w:id="14" w:name="_Toc242603048"/>
       <w:r>
         <w:t>2.4 Journey and other routes</w:t>
       </w:r>
@@ -7470,7 +7715,7 @@
           <w:noProof/>
         </w:rPr>
         <w:drawing>
-          <wp:inline distT="0" distB="0" distL="0" distR="0" wp14:anchorId="2DFF62D3" wp14:editId="2DFF62D4">
+          <wp:inline distT="0" distB="0" distL="0" distR="0" wp14:anchorId="770A2242" wp14:editId="770A2243">
             <wp:extent cx="6124575" cy="2895600"/>
             <wp:effectExtent l="0" t="0" r="0" b="0"/>
             <wp:docPr id="4" name="eer-journey.png" descr="EER model of deadlines, push reminders and the specialisation of other routes" title="EER model of deadlines, push reminders and the specialisation of other routes"/>
@@ -7513,7 +7758,7 @@
       <w:pPr>
         <w:pStyle w:val="Caption"/>
       </w:pPr>
-      <w:bookmarkStart w:id="15" w:name="_Toc242599622"/>
+      <w:bookmarkStart w:id="15" w:name="_Toc242603079"/>
       <w:r>
         <w:t xml:space="preserve">Figure </w:t>
       </w:r>
@@ -7546,7 +7791,7 @@
         <w:keepNext/>
         <w:keepLines/>
       </w:pPr>
-      <w:bookmarkStart w:id="16" w:name="_Toc242599594"/>
+      <w:bookmarkStart w:id="16" w:name="_Toc242603049"/>
       <w:r>
         <w:lastRenderedPageBreak/>
         <w:t>2.5 Student accounts (CR-001)</w:t>
@@ -7558,10 +7803,7 @@
         <w:spacing w:after="120"/>
       </w:pPr>
       <w:r>
-        <w:t xml:space="preserve">A student account is optional. ACCOUNT, already the superclass of the staff roles, gains a fourth subclass, </w:t>
-      </w:r>
-      <w:r>
-        <w:t xml:space="preserve">STUDENT. Each way of signing in is its own weak entity of ACCOUNT, so a later identity provider (for example Google sign-in) adds an entity without touching the others. A password is never stored: PASSWORD_LOGIN holds a salt and a </w:t>
+        <w:t xml:space="preserve">A student account is optional. ACCOUNT, already the superclass of the staff roles, gains a fourth subclass, STUDENT. Each way of signing in is its own weak entity of ACCOUNT, so a later identity provider (for example Google sign-in) adds an entity without touching the others. A password is never stored: PASSWORD_LOGIN holds a salt and a </w:t>
       </w:r>
       <w:r>
         <w:rPr>
@@ -7571,10 +7813,10 @@
         <w:t>verifier</w:t>
       </w:r>
       <w:r>
-        <w:t xml:space="preserve">, a hash of a key the student's device derives from the password. A STUDENT's results are the attributes the device already keeps: a Z-score, the stream sat (SAT_IN), the district sat from (SAT_FROM), and </w:t>
-      </w:r>
-      <w:r>
-        <w:t>three subjects with grades (TOOK, whose attributes are Grade and Position). Achievements are a weak entity with partial key Position; interests are a multi-valued attribute. CR-001 stored no name, email address or telephone number; CR-003 (below) withdraws that and adds them, with consent, in a table of their own.</w:t>
+        <w:t xml:space="preserve">, a hash of a key the student's device derives from the password. A STUDENT's results are the attributes the device already keeps: a Z-score, the stream sat (SAT_IN), the district sat from (SAT_FROM), and three subjects with grades (TOOK, whose attributes are Grade and Position). Achievements are a weak entity with partial key Position; interests are a multi-valued attribute. CR-001 stored no name, email address or telephone </w:t>
+      </w:r>
+      <w:r>
+        <w:t>number; CR-003 (below) withdraws that and adds them, with consent, in a table of their own.</w:t>
       </w:r>
     </w:p>
     <w:p>
@@ -7588,7 +7830,7 @@
           <w:noProof/>
         </w:rPr>
         <w:drawing>
-          <wp:inline distT="0" distB="0" distL="0" distR="0" wp14:anchorId="2DFF62D5" wp14:editId="2DFF62D6">
+          <wp:inline distT="0" distB="0" distL="0" distR="0" wp14:anchorId="770A2244" wp14:editId="770A2245">
             <wp:extent cx="6124575" cy="2857500"/>
             <wp:effectExtent l="0" t="0" r="0" b="0"/>
             <wp:docPr id="5" name="eer-accounts.png" descr="EER model of optional student accounts: sign-in, sessions, recovery and the student's results" title="EER model of optional student accounts: sign-in, sessions, recovery and the student's results"/>
@@ -7631,7 +7873,7 @@
       <w:pPr>
         <w:pStyle w:val="Caption"/>
       </w:pPr>
-      <w:bookmarkStart w:id="17" w:name="_Toc242599623"/>
+      <w:bookmarkStart w:id="17" w:name="_Toc242603080"/>
       <w:r>
         <w:t xml:space="preserve">Figure </w:t>
       </w:r>
@@ -7664,7 +7906,7 @@
         <w:keepNext/>
         <w:keepLines/>
       </w:pPr>
-      <w:bookmarkStart w:id="18" w:name="_Toc242599595"/>
+      <w:bookmarkStart w:id="18" w:name="_Toc242603050"/>
       <w:r>
         <w:t>2.6 Journey, Alerts and Groups (CR-002)</w:t>
       </w:r>
@@ -7700,7 +7942,7 @@
           <w:left w:w="10" w:type="dxa"/>
           <w:right w:w="10" w:type="dxa"/>
         </w:tblCellMar>
-        <w:tblLook w:val="0000" w:firstRow="0" w:lastRow="0" w:firstColumn="0" w:lastColumn="0" w:noHBand="0" w:noVBand="0"/>
+        <w:tblLook w:val="04A0" w:firstRow="1" w:lastRow="0" w:firstColumn="1" w:lastColumn="0" w:noHBand="0" w:noVBand="1"/>
       </w:tblPr>
       <w:tblGrid>
         <w:gridCol w:w="2877"/>
@@ -8322,10 +8564,7 @@
         <w:t>rule</w:t>
       </w:r>
       <w:r>
-        <w:t xml:space="preserve"> (for example, </w:t>
-      </w:r>
-      <w:r>
-        <w:t>"within two weeks of the closing date", p.116) and dated items come from cited notices. No date is invented.</w:t>
+        <w:t xml:space="preserve"> (for example, "within two weeks of the closing date", p.116) and dated items come from cited notices. No date is invented.</w:t>
       </w:r>
     </w:p>
     <w:p>
@@ -8352,10 +8591,7 @@
         <w:t>account.verified_for_letter</w:t>
       </w:r>
       <w:r>
-        <w:t xml:space="preserve">), and the 0003 triggers already keep student data off non-student accounts. A SENIOR_INVITE (one-time code, stored only as its SHA-256) names the course, institution and study year </w:t>
-      </w:r>
-      <w:r>
-        <w:t>the product owner checked; redeeming it at sign-up creates the SENIOR account and marks the invite in one atomic batch. A trigger allows redemption only by a SENIOR account of the invite's institution, and only once.</w:t>
+        <w:t>), and the 0003 triggers already keep student data off non-student accounts. A SENIOR_INVITE (one-time code, stored only as its SHA-256) names the course, institution and study year the product owner checked; redeeming it at sign-up creates the SENIOR account and marks the invite in one atomic batch. A trigger allows redemption only by a SENIOR account of the invite's institution, and only once.</w:t>
       </w:r>
     </w:p>
     <w:p>
@@ -8370,7 +8606,10 @@
         <w:t>Reference rows for foreign keys.</w:t>
       </w:r>
       <w:r>
-        <w:t xml:space="preserve"> Migration 0005 loads the 121 courses and 20 institutions of 2025/26 (generated by </w:t>
+        <w:t xml:space="preserve"> Migration 0005 loads the 121 courses and 20 institutions of 2025/26 (generated </w:t>
+      </w:r>
+      <w:r>
+        <w:t xml:space="preserve">by </w:t>
       </w:r>
       <w:r>
         <w:rPr>
@@ -8400,7 +8639,7 @@
           <w:left w:w="10" w:type="dxa"/>
           <w:right w:w="10" w:type="dxa"/>
         </w:tblCellMar>
-        <w:tblLook w:val="0000" w:firstRow="0" w:lastRow="0" w:firstColumn="0" w:lastColumn="0" w:noHBand="0" w:noVBand="0"/>
+        <w:tblLook w:val="04A0" w:firstRow="1" w:lastRow="0" w:firstColumn="1" w:lastColumn="0" w:noHBand="0" w:noVBand="1"/>
       </w:tblPr>
       <w:tblGrid>
         <w:gridCol w:w="1588"/>
@@ -9230,10 +9469,7 @@
         <w:spacing w:after="120"/>
       </w:pPr>
       <w:r>
-        <w:t xml:space="preserve">Messages are outside D1's cascade, so deleting an account also tells every group it was in to delete that account's </w:t>
-      </w:r>
-      <w:r>
-        <w:t>messages (tested). All tables are in BCNF: every determinant is a candidate key; derived values (member counts, the senior badge text) are computed, never stored.</w:t>
+        <w:t>Messages are outside D1's cascade, so deleting an account also tells every group it was in to delete that account's messages (tested). All tables are in BCNF: every determinant is a candidate key; derived values (member counts, the senior badge text) are computed, never stored.</w:t>
       </w:r>
     </w:p>
     <w:p>
@@ -9242,7 +9478,7 @@
         <w:keepNext/>
         <w:keepLines/>
       </w:pPr>
-      <w:bookmarkStart w:id="19" w:name="_Toc242599596"/>
+      <w:bookmarkStart w:id="19" w:name="_Toc242603051"/>
       <w:r>
         <w:t>2.7 Contact details (CR-003)</w:t>
       </w:r>
@@ -9260,10 +9496,10 @@
         <w:t>Decision.</w:t>
       </w:r>
       <w:r>
-        <w:t xml:space="preserve"> On 11 October 2026 the product owner made an account compulsory at the start, with full name, email, mobile number and date of birth (the birthday moves here from the Alerts screen, where it stayed on the phone). This </w:t>
-      </w:r>
-      <w:r>
-        <w:t>reverses the CR-001 promise "a username only". The README, the business case and the app's privacy text now say exactly what is collected and why.</w:t>
+        <w:t xml:space="preserve"> On 11 October 2026 the product owner made an account compulsory at the start, with full name, email, </w:t>
+      </w:r>
+      <w:r>
+        <w:t>mobile number and date of birth (the birthday moves here from the Alerts screen, where it stayed on the phone). This reverses the CR-001 promise "a username only". The README, the business case and the app's privacy text now say exactly what is collected and why.</w:t>
       </w:r>
     </w:p>
     <w:p>
@@ -9314,7 +9550,10 @@
         <w:t>account</w:t>
       </w:r>
       <w:r>
-        <w:t xml:space="preserve"> is the identity table shared by every role, and personal contact data kept apart can be audited, exported or deleted on its own. It cascades with the account.</w:t>
+        <w:t xml:space="preserve"> is the identity table shared by every role, </w:t>
+      </w:r>
+      <w:r>
+        <w:t>and personal contact data kept apart can be audited, exported or deleted on its own. It cascades with the account.</w:t>
       </w:r>
     </w:p>
     <w:tbl>
@@ -9332,7 +9571,7 @@
           <w:left w:w="10" w:type="dxa"/>
           <w:right w:w="10" w:type="dxa"/>
         </w:tblCellMar>
-        <w:tblLook w:val="0000" w:firstRow="0" w:lastRow="0" w:firstColumn="0" w:lastColumn="0" w:noHBand="0" w:noVBand="0"/>
+        <w:tblLook w:val="04A0" w:firstRow="1" w:lastRow="0" w:firstColumn="1" w:lastColumn="0" w:noHBand="0" w:noVBand="1"/>
       </w:tblPr>
       <w:tblGrid>
         <w:gridCol w:w="3876"/>
@@ -9951,10 +10190,7 @@
         <w:t>PUT /api/me/contact</w:t>
       </w:r>
       <w:r>
-        <w:t xml:space="preserve">). Safe default: no existing row is invented or guessed. Students under 18 confirm that a </w:t>
-      </w:r>
-      <w:r>
-        <w:t>parent or guardian agrees (Personal Data Protection Act, No. 9 of 2022). The table is in BCNF: the only determinant is the key.</w:t>
+        <w:t>). Safe default: no existing row is invented or guessed. Students under 18 confirm that a parent or guardian agrees (Personal Data Protection Act, No. 9 of 2022). The table is in BCNF: the only determinant is the key.</w:t>
       </w:r>
     </w:p>
     <w:p>
@@ -9963,7 +10199,7 @@
         <w:keepNext/>
         <w:keepLines/>
       </w:pPr>
-      <w:bookmarkStart w:id="20" w:name="_Toc242599597"/>
+      <w:bookmarkStart w:id="20" w:name="_Toc242603052"/>
       <w:r>
         <w:t>2.8 Answer feedback (CR-004)</w:t>
       </w:r>
@@ -10010,7 +10246,10 @@
         <w:t>fact_id</w:t>
       </w:r>
       <w:r>
-        <w:t xml:space="preserve"> is required), and an AI answer is not one. A row holds the rating, the question, the answer, the handbook pages it cited (JSON, checked by </w:t>
+        <w:t xml:space="preserve"> is required), and an AI answer is not one. </w:t>
+      </w:r>
+      <w:r>
+        <w:t xml:space="preserve">A row holds the rating, the question, the answer, the handbook pages it cited (JSON, checked by </w:t>
       </w:r>
       <w:r>
         <w:rPr>
@@ -10022,10 +10261,7 @@
         <w:t>json_valid</w:t>
       </w:r>
       <w:r>
-        <w:t xml:space="preserve">), an </w:t>
-      </w:r>
-      <w:r>
-        <w:t>optional note, the app language and a review state. It holds nothing that identifies the student: no account, device or IP. The screen says the question and answer are sent before the student sends a report.</w:t>
+        <w:t>), an optional note, the app language and a review state. It holds nothing that identifies the student: no account, device or IP. The screen says the question and answer are sent before the student sends a report.</w:t>
       </w:r>
     </w:p>
     <w:p>
@@ -10034,18 +10270,131 @@
         <w:keepNext/>
         <w:keepLines/>
       </w:pPr>
-      <w:bookmarkStart w:id="21" w:name="_Toc242599598"/>
-      <w:r>
-        <w:t>2.9 Entity catalogue</w:t>
+      <w:bookmarkStart w:id="21" w:name="_Toc242603053"/>
+      <w:r>
+        <w:t>2.9 Group rules and sample conversations (CR-005)</w:t>
       </w:r>
       <w:bookmarkEnd w:id="21"/>
+    </w:p>
+    <w:p>
+      <w:pPr>
+        <w:spacing w:after="120"/>
+      </w:pPr>
+      <w:r>
+        <w:t xml:space="preserve">A member accepts the group rules before taking part. The accepted version is a fact about one membership, so it is a column on </w:t>
+      </w:r>
+      <w:r>
+        <w:rPr>
+          <w:rFonts w:ascii="Consolas" w:eastAsia="Consolas" w:hAnsi="Consolas" w:cs="Consolas"/>
+          <w:sz w:val="19"/>
+          <w:szCs w:val="19"/>
+          <w:shd w:val="clear" w:color="auto" w:fill="F2F4F3"/>
+        </w:rPr>
+        <w:t>group_member</w:t>
+      </w:r>
+      <w:r>
+        <w:t xml:space="preserve"> (</w:t>
+      </w:r>
+      <w:r>
+        <w:rPr>
+          <w:rFonts w:ascii="Consolas" w:eastAsia="Consolas" w:hAnsi="Consolas" w:cs="Consolas"/>
+          <w:sz w:val="19"/>
+          <w:szCs w:val="19"/>
+          <w:shd w:val="clear" w:color="auto" w:fill="F2F4F3"/>
+        </w:rPr>
+        <w:t>rules_version</w:t>
+      </w:r>
+      <w:r>
+        <w:t>, migration 0009) rather than a new table: one value per (group, member), fully dependent on the key, so the table stays in BCNF. A CHECK lists the versions that exist (</w:t>
+      </w:r>
+      <w:r>
+        <w:rPr>
+          <w:rFonts w:ascii="Consolas" w:eastAsia="Consolas" w:hAnsi="Consolas" w:cs="Consolas"/>
+          <w:sz w:val="19"/>
+          <w:szCs w:val="19"/>
+          <w:shd w:val="clear" w:color="auto" w:fill="F2F4F3"/>
+        </w:rPr>
+        <w:t>'2026-10-11'</w:t>
+      </w:r>
+      <w:r>
+        <w:t>); a new version of the rules adds a value and asks members again. NULL means joined before the rules existed. Server enforcement: the Worker refuses a join without the current version and keeps the live room closed for a member whose row is not on it (</w:t>
+      </w:r>
+      <w:r>
+        <w:rPr>
+          <w:rFonts w:ascii="Consolas" w:eastAsia="Consolas" w:hAnsi="Consolas" w:cs="Consolas"/>
+          <w:sz w:val="19"/>
+          <w:szCs w:val="19"/>
+          <w:shd w:val="clear" w:color="auto" w:fill="F2F4F3"/>
+        </w:rPr>
+        <w:t>worker/groups.ts</w:t>
+      </w:r>
+      <w:r>
+        <w:t>). Rule 3 (no phone numbers or email addresses) is checked on every message by the group's room.</w:t>
+      </w:r>
+    </w:p>
+    <w:p>
+      <w:pPr>
+        <w:spacing w:after="120"/>
+      </w:pPr>
+      <w:r>
+        <w:t xml:space="preserve">Sample conversations, which show a new student how a group works, are </w:t>
+      </w:r>
+      <w:r>
+        <w:rPr>
+          <w:b/>
+          <w:bCs/>
+        </w:rPr>
+        <w:t>not stored</w:t>
+      </w:r>
+      <w:r>
+        <w:t>. Like the Journey steps they are curated read-model data in code (</w:t>
+      </w:r>
+      <w:r>
+        <w:rPr>
+          <w:rFonts w:ascii="Consolas" w:eastAsia="Consolas" w:hAnsi="Consolas" w:cs="Consolas"/>
+          <w:sz w:val="19"/>
+          <w:szCs w:val="19"/>
+          <w:shd w:val="clear" w:color="auto" w:fill="F2F4F3"/>
+        </w:rPr>
+        <w:t>shared/group-samples.ts</w:t>
+      </w:r>
+      <w:r>
+        <w:t xml:space="preserve">), added by the room in front of the real messages. Every sample is marked </w:t>
+      </w:r>
+      <w:r>
+        <w:rPr>
+          <w:rFonts w:ascii="Consolas" w:eastAsia="Consolas" w:hAnsi="Consolas" w:cs="Consolas"/>
+          <w:sz w:val="19"/>
+          <w:szCs w:val="19"/>
+          <w:shd w:val="clear" w:color="auto" w:fill="F2F4F3"/>
+        </w:rPr>
+        <w:t>sample</w:t>
+      </w:r>
+      <w:r>
+        <w:t xml:space="preserve">, its author starts with "Sample", no badge says "verified", and its id is not a message id, so </w:t>
+      </w:r>
+      <w:r>
+        <w:t>it cannot be reported, blocked or mistaken for a member (trust rule: sample data is labelled as sample; pinned by tests).</w:t>
+      </w:r>
+    </w:p>
+    <w:p>
+      <w:pPr>
+        <w:pStyle w:val="Heading2"/>
+        <w:keepNext/>
+        <w:keepLines/>
+      </w:pPr>
+      <w:bookmarkStart w:id="22" w:name="_Toc242603054"/>
+      <w:r>
+        <w:t>2.10 Entity catalogue</w:t>
+      </w:r>
+      <w:bookmarkEnd w:id="22"/>
     </w:p>
     <w:p>
       <w:pPr>
         <w:pStyle w:val="Caption"/>
         <w:keepNext/>
       </w:pPr>
-      <w:bookmarkStart w:id="22" w:name="_Toc242599628"/>
+      <w:bookmarkStart w:id="23" w:name="_Toc242603085"/>
       <w:r>
         <w:t xml:space="preserve">Table </w:t>
       </w:r>
@@ -10070,7 +10419,7 @@
       <w:r>
         <w:t>: Entities, their type, identifier and the requirements that justify them</w:t>
       </w:r>
-      <w:bookmarkEnd w:id="22"/>
+      <w:bookmarkEnd w:id="23"/>
     </w:p>
     <w:tbl>
       <w:tblPr>
@@ -10087,7 +10436,7 @@
           <w:left w:w="10" w:type="dxa"/>
           <w:right w:w="10" w:type="dxa"/>
         </w:tblCellMar>
-        <w:tblLook w:val="0000" w:firstRow="0" w:lastRow="0" w:firstColumn="0" w:lastColumn="0" w:noHBand="0" w:noVBand="0"/>
+        <w:tblLook w:val="04A0" w:firstRow="1" w:lastRow="0" w:firstColumn="1" w:lastColumn="0" w:noHBand="0" w:noVBand="1"/>
       </w:tblPr>
       <w:tblGrid>
         <w:gridCol w:w="1965"/>
@@ -10545,6 +10894,7 @@
                 <w:sz w:val="19"/>
                 <w:szCs w:val="19"/>
               </w:rPr>
+              <w:lastRenderedPageBreak/>
               <w:t>INSTITUTION</w:t>
             </w:r>
           </w:p>
@@ -11609,7 +11959,6 @@
                 <w:sz w:val="19"/>
                 <w:szCs w:val="19"/>
               </w:rPr>
-              <w:lastRenderedPageBreak/>
               <w:t>CITED_FACT</w:t>
             </w:r>
           </w:p>
@@ -13314,12 +13663,12 @@
         <w:keepLines/>
         <w:pageBreakBefore/>
       </w:pPr>
-      <w:bookmarkStart w:id="23" w:name="_Toc242599599"/>
+      <w:bookmarkStart w:id="24" w:name="_Toc242603055"/>
       <w:r>
         <w:lastRenderedPageBreak/>
         <w:t>3 Rule grammar</w:t>
       </w:r>
-      <w:bookmarkEnd w:id="23"/>
+      <w:bookmarkEnd w:id="24"/>
     </w:p>
     <w:p>
       <w:pPr>
@@ -13356,7 +13705,7 @@
         <w:pStyle w:val="Caption"/>
         <w:keepNext/>
       </w:pPr>
-      <w:bookmarkStart w:id="24" w:name="_Toc242599629"/>
+      <w:bookmarkStart w:id="25" w:name="_Toc242603086"/>
       <w:r>
         <w:t xml:space="preserve">Table </w:t>
       </w:r>
@@ -13381,7 +13730,7 @@
       <w:r>
         <w:t>: Rule node kinds and their meaning</w:t>
       </w:r>
-      <w:bookmarkEnd w:id="24"/>
+      <w:bookmarkEnd w:id="25"/>
     </w:p>
     <w:tbl>
       <w:tblPr>
@@ -13398,7 +13747,7 @@
           <w:left w:w="10" w:type="dxa"/>
           <w:right w:w="10" w:type="dxa"/>
         </w:tblCellMar>
-        <w:tblLook w:val="0000" w:firstRow="0" w:lastRow="0" w:firstColumn="0" w:lastColumn="0" w:noHBand="0" w:noVBand="0"/>
+        <w:tblLook w:val="04A0" w:firstRow="1" w:lastRow="0" w:firstColumn="1" w:lastColumn="0" w:noHBand="0" w:noVBand="1"/>
       </w:tblPr>
       <w:tblGrid>
         <w:gridCol w:w="1606"/>
@@ -14727,12 +15076,12 @@
         <w:keepLines/>
         <w:pageBreakBefore/>
       </w:pPr>
-      <w:bookmarkStart w:id="25" w:name="_Toc242599600"/>
+      <w:bookmarkStart w:id="26" w:name="_Toc242603056"/>
       <w:r>
         <w:lastRenderedPageBreak/>
         <w:t>4 Mapping the EER model to relations</w:t>
       </w:r>
-      <w:bookmarkEnd w:id="25"/>
+      <w:bookmarkEnd w:id="26"/>
     </w:p>
     <w:p>
       <w:pPr>
@@ -14747,7 +15096,7 @@
         <w:pStyle w:val="Caption"/>
         <w:keepNext/>
       </w:pPr>
-      <w:bookmarkStart w:id="26" w:name="_Toc242599630"/>
+      <w:bookmarkStart w:id="27" w:name="_Toc242603087"/>
       <w:r>
         <w:t xml:space="preserve">Table </w:t>
       </w:r>
@@ -14772,7 +15121,7 @@
       <w:r>
         <w:t>: EER-to-relational mapping steps applied</w:t>
       </w:r>
-      <w:bookmarkEnd w:id="26"/>
+      <w:bookmarkEnd w:id="27"/>
     </w:p>
     <w:tbl>
       <w:tblPr>
@@ -14789,7 +15138,7 @@
           <w:left w:w="10" w:type="dxa"/>
           <w:right w:w="10" w:type="dxa"/>
         </w:tblCellMar>
-        <w:tblLook w:val="0000" w:firstRow="0" w:lastRow="0" w:firstColumn="0" w:lastColumn="0" w:noHBand="0" w:noVBand="0"/>
+        <w:tblLook w:val="04A0" w:firstRow="1" w:lastRow="0" w:firstColumn="1" w:lastColumn="0" w:noHBand="0" w:noVBand="1"/>
       </w:tblPr>
       <w:tblGrid>
         <w:gridCol w:w="649"/>
@@ -16538,7 +16887,7 @@
         <w:pStyle w:val="Caption"/>
         <w:keepNext/>
       </w:pPr>
-      <w:bookmarkStart w:id="27" w:name="_Toc242599631"/>
+      <w:bookmarkStart w:id="28" w:name="_Toc242603088"/>
       <w:r>
         <w:lastRenderedPageBreak/>
         <w:t xml:space="preserve">Table </w:t>
@@ -16564,7 +16913,7 @@
       <w:r>
         <w:t>: Mapping of the student-account model</w:t>
       </w:r>
-      <w:bookmarkEnd w:id="27"/>
+      <w:bookmarkEnd w:id="28"/>
     </w:p>
     <w:tbl>
       <w:tblPr>
@@ -16581,7 +16930,7 @@
           <w:left w:w="10" w:type="dxa"/>
           <w:right w:w="10" w:type="dxa"/>
         </w:tblCellMar>
-        <w:tblLook w:val="0000" w:firstRow="0" w:lastRow="0" w:firstColumn="0" w:lastColumn="0" w:noHBand="0" w:noVBand="0"/>
+        <w:tblLook w:val="04A0" w:firstRow="1" w:lastRow="0" w:firstColumn="1" w:lastColumn="0" w:noHBand="0" w:noVBand="1"/>
       </w:tblPr>
       <w:tblGrid>
         <w:gridCol w:w="662"/>
@@ -17650,7 +17999,7 @@
         </w:rPr>
         <w:lastRenderedPageBreak/>
         <w:drawing>
-          <wp:inline distT="0" distB="0" distL="0" distR="0" wp14:anchorId="2DFF62D7" wp14:editId="2DFF62D8">
+          <wp:inline distT="0" distB="0" distL="0" distR="0" wp14:anchorId="770A2246" wp14:editId="770A2247">
             <wp:extent cx="6124575" cy="6562725"/>
             <wp:effectExtent l="0" t="0" r="0" b="0"/>
             <wp:docPr id="6" name="relational-admission.png" descr="Logical schema, admission data (generated from the migration file)" title="Logical schema, admission data (generated from the migration file)"/>
@@ -17693,7 +18042,7 @@
       <w:pPr>
         <w:pStyle w:val="Caption"/>
       </w:pPr>
-      <w:bookmarkStart w:id="28" w:name="_Toc242599624"/>
+      <w:bookmarkStart w:id="29" w:name="_Toc242603081"/>
       <w:r>
         <w:t xml:space="preserve">Figure </w:t>
       </w:r>
@@ -17718,7 +18067,7 @@
       <w:r>
         <w:t>: Logical schema, admission data (generated from the migration file)</w:t>
       </w:r>
-      <w:bookmarkEnd w:id="28"/>
+      <w:bookmarkEnd w:id="29"/>
     </w:p>
     <w:p>
       <w:pPr>
@@ -17732,7 +18081,7 @@
         </w:rPr>
         <w:lastRenderedPageBreak/>
         <w:drawing>
-          <wp:inline distT="0" distB="0" distL="0" distR="0" wp14:anchorId="2DFF62D9" wp14:editId="2DFF62DA">
+          <wp:inline distT="0" distB="0" distL="0" distR="0" wp14:anchorId="770A2248" wp14:editId="770A2249">
             <wp:extent cx="6124575" cy="5562600"/>
             <wp:effectExtent l="0" t="0" r="0" b="0"/>
             <wp:docPr id="7" name="relational-trust-journey.png" descr="Logical schema, trust, routes and journey data (generated from the migration file)" title="Logical schema, trust, routes and journey data (generated from the migration file)"/>
@@ -17775,7 +18124,7 @@
       <w:pPr>
         <w:pStyle w:val="Caption"/>
       </w:pPr>
-      <w:bookmarkStart w:id="29" w:name="_Toc242599625"/>
+      <w:bookmarkStart w:id="30" w:name="_Toc242603082"/>
       <w:r>
         <w:t xml:space="preserve">Figure </w:t>
       </w:r>
@@ -17800,7 +18149,7 @@
       <w:r>
         <w:t>: Logical schema, trust, routes and journey data (generated from the migration file)</w:t>
       </w:r>
-      <w:bookmarkEnd w:id="29"/>
+      <w:bookmarkEnd w:id="30"/>
     </w:p>
     <w:p>
       <w:pPr>
@@ -17813,7 +18162,7 @@
           <w:noProof/>
         </w:rPr>
         <w:drawing>
-          <wp:inline distT="0" distB="0" distL="0" distR="0" wp14:anchorId="2DFF62DB" wp14:editId="2DFF62DC">
+          <wp:inline distT="0" distB="0" distL="0" distR="0" wp14:anchorId="770A224A" wp14:editId="770A224B">
             <wp:extent cx="6124575" cy="2305050"/>
             <wp:effectExtent l="0" t="0" r="0" b="0"/>
             <wp:docPr id="8" name="relational-accounts.png" descr="Logical schema, optional student accounts (generated from the migration files)" title="Logical schema, optional student accounts (generated from the migration files)"/>
@@ -17856,7 +18205,7 @@
       <w:pPr>
         <w:pStyle w:val="Caption"/>
       </w:pPr>
-      <w:bookmarkStart w:id="30" w:name="_Toc242599626"/>
+      <w:bookmarkStart w:id="31" w:name="_Toc242603083"/>
       <w:r>
         <w:t xml:space="preserve">Figure </w:t>
       </w:r>
@@ -17881,7 +18230,7 @@
       <w:r>
         <w:t>: Logical schema, optional student accounts (generated from the migration files)</w:t>
       </w:r>
-      <w:bookmarkEnd w:id="30"/>
+      <w:bookmarkEnd w:id="31"/>
     </w:p>
     <w:p>
       <w:pPr>
@@ -17890,12 +18239,12 @@
         <w:keepLines/>
         <w:pageBreakBefore/>
       </w:pPr>
-      <w:bookmarkStart w:id="31" w:name="_Toc242599601"/>
+      <w:bookmarkStart w:id="32" w:name="_Toc242603057"/>
       <w:r>
         <w:lastRenderedPageBreak/>
         <w:t>5 Normalisation</w:t>
       </w:r>
-      <w:bookmarkEnd w:id="31"/>
+      <w:bookmarkEnd w:id="32"/>
     </w:p>
     <w:p>
       <w:pPr>
@@ -17903,11 +18252,11 @@
         <w:keepNext/>
         <w:keepLines/>
       </w:pPr>
-      <w:bookmarkStart w:id="32" w:name="_Toc242599602"/>
+      <w:bookmarkStart w:id="33" w:name="_Toc242603058"/>
       <w:r>
         <w:t>5.1 From the source form to 1NF</w:t>
       </w:r>
-      <w:bookmarkEnd w:id="32"/>
+      <w:bookmarkEnd w:id="33"/>
     </w:p>
     <w:p>
       <w:pPr>
@@ -17959,18 +18308,18 @@
         <w:keepNext/>
         <w:keepLines/>
       </w:pPr>
-      <w:bookmarkStart w:id="33" w:name="_Toc242599603"/>
+      <w:bookmarkStart w:id="34" w:name="_Toc242603059"/>
       <w:r>
         <w:t>5.2 Functional and multi-valued dependencies</w:t>
       </w:r>
-      <w:bookmarkEnd w:id="33"/>
+      <w:bookmarkEnd w:id="34"/>
     </w:p>
     <w:p>
       <w:pPr>
         <w:pStyle w:val="Caption"/>
         <w:keepNext/>
       </w:pPr>
-      <w:bookmarkStart w:id="34" w:name="_Toc242599632"/>
+      <w:bookmarkStart w:id="35" w:name="_Toc242603089"/>
       <w:r>
         <w:t xml:space="preserve">Table </w:t>
       </w:r>
@@ -17995,7 +18344,7 @@
       <w:r>
         <w:t>: Dependencies identified in R1</w:t>
       </w:r>
-      <w:bookmarkEnd w:id="34"/>
+      <w:bookmarkEnd w:id="35"/>
     </w:p>
     <w:tbl>
       <w:tblPr>
@@ -18012,7 +18361,7 @@
           <w:left w:w="10" w:type="dxa"/>
           <w:right w:w="10" w:type="dxa"/>
         </w:tblCellMar>
-        <w:tblLook w:val="0000" w:firstRow="0" w:lastRow="0" w:firstColumn="0" w:lastColumn="0" w:noHBand="0" w:noVBand="0"/>
+        <w:tblLook w:val="04A0" w:firstRow="1" w:lastRow="0" w:firstColumn="1" w:lastColumn="0" w:noHBand="0" w:noVBand="1"/>
       </w:tblPr>
       <w:tblGrid>
         <w:gridCol w:w="684"/>
@@ -18869,11 +19218,11 @@
         <w:keepNext/>
         <w:keepLines/>
       </w:pPr>
-      <w:bookmarkStart w:id="35" w:name="_Toc242599604"/>
+      <w:bookmarkStart w:id="36" w:name="_Toc242603060"/>
       <w:r>
         <w:t>5.3 2NF, 3NF and BCNF</w:t>
       </w:r>
-      <w:bookmarkEnd w:id="35"/>
+      <w:bookmarkEnd w:id="36"/>
     </w:p>
     <w:p>
       <w:pPr>
@@ -19112,19 +19461,19 @@
         <w:keepNext/>
         <w:keepLines/>
       </w:pPr>
-      <w:bookmarkStart w:id="36" w:name="_Toc242599605"/>
+      <w:bookmarkStart w:id="37" w:name="_Toc242603061"/>
       <w:r>
         <w:lastRenderedPageBreak/>
         <w:t>5.4 Deliberate departures</w:t>
       </w:r>
-      <w:bookmarkEnd w:id="36"/>
+      <w:bookmarkEnd w:id="37"/>
     </w:p>
     <w:p>
       <w:pPr>
         <w:pStyle w:val="Caption"/>
         <w:keepNext/>
       </w:pPr>
-      <w:bookmarkStart w:id="37" w:name="_Toc242599633"/>
+      <w:bookmarkStart w:id="38" w:name="_Toc242603090"/>
       <w:r>
         <w:t xml:space="preserve">Table </w:t>
       </w:r>
@@ -19149,7 +19498,7 @@
       <w:r>
         <w:t>: Controlled denormalisations and why they are safe</w:t>
       </w:r>
-      <w:bookmarkEnd w:id="37"/>
+      <w:bookmarkEnd w:id="38"/>
     </w:p>
     <w:tbl>
       <w:tblPr>
@@ -19166,7 +19515,7 @@
           <w:left w:w="10" w:type="dxa"/>
           <w:right w:w="10" w:type="dxa"/>
         </w:tblCellMar>
-        <w:tblLook w:val="0000" w:firstRow="0" w:lastRow="0" w:firstColumn="0" w:lastColumn="0" w:noHBand="0" w:noVBand="0"/>
+        <w:tblLook w:val="04A0" w:firstRow="1" w:lastRow="0" w:firstColumn="1" w:lastColumn="0" w:noHBand="0" w:noVBand="1"/>
       </w:tblPr>
       <w:tblGrid>
         <w:gridCol w:w="3213"/>
@@ -19665,12 +20014,12 @@
         <w:keepLines/>
         <w:pageBreakBefore/>
       </w:pPr>
-      <w:bookmarkStart w:id="38" w:name="_Toc242599606"/>
+      <w:bookmarkStart w:id="39" w:name="_Toc242603062"/>
       <w:r>
         <w:lastRenderedPageBreak/>
         <w:t>6 Physical design for Cloudflare D1</w:t>
       </w:r>
-      <w:bookmarkEnd w:id="38"/>
+      <w:bookmarkEnd w:id="39"/>
     </w:p>
     <w:p>
       <w:pPr>
@@ -19678,11 +20027,11 @@
         <w:keepNext/>
         <w:keepLines/>
       </w:pPr>
-      <w:bookmarkStart w:id="39" w:name="_Toc242599607"/>
+      <w:bookmarkStart w:id="40" w:name="_Toc242603063"/>
       <w:r>
         <w:t>6.1 Conventions</w:t>
       </w:r>
-      <w:bookmarkEnd w:id="39"/>
+      <w:bookmarkEnd w:id="40"/>
     </w:p>
     <w:p>
       <w:pPr>
@@ -19917,18 +20266,18 @@
         <w:keepNext/>
         <w:keepLines/>
       </w:pPr>
-      <w:bookmarkStart w:id="40" w:name="_Toc242599608"/>
+      <w:bookmarkStart w:id="41" w:name="_Toc242603064"/>
       <w:r>
         <w:t>6.2 Indexes</w:t>
       </w:r>
-      <w:bookmarkEnd w:id="40"/>
+      <w:bookmarkEnd w:id="41"/>
     </w:p>
     <w:p>
       <w:pPr>
         <w:pStyle w:val="Caption"/>
         <w:keepNext/>
       </w:pPr>
-      <w:bookmarkStart w:id="41" w:name="_Toc242599634"/>
+      <w:bookmarkStart w:id="42" w:name="_Toc242603091"/>
       <w:r>
         <w:t xml:space="preserve">Table </w:t>
       </w:r>
@@ -19953,7 +20302,7 @@
       <w:r>
         <w:t>: Secondary indexes and the query each serves</w:t>
       </w:r>
-      <w:bookmarkEnd w:id="41"/>
+      <w:bookmarkEnd w:id="42"/>
     </w:p>
     <w:tbl>
       <w:tblPr>
@@ -19970,7 +20319,7 @@
           <w:left w:w="10" w:type="dxa"/>
           <w:right w:w="10" w:type="dxa"/>
         </w:tblCellMar>
-        <w:tblLook w:val="0000" w:firstRow="0" w:lastRow="0" w:firstColumn="0" w:lastColumn="0" w:noHBand="0" w:noVBand="0"/>
+        <w:tblLook w:val="04A0" w:firstRow="1" w:lastRow="0" w:firstColumn="1" w:lastColumn="0" w:noHBand="0" w:noVBand="1"/>
       </w:tblPr>
       <w:tblGrid>
         <w:gridCol w:w="4819"/>
@@ -20927,19 +21276,19 @@
         <w:keepNext/>
         <w:keepLines/>
       </w:pPr>
-      <w:bookmarkStart w:id="42" w:name="_Toc242599609"/>
+      <w:bookmarkStart w:id="43" w:name="_Toc242603065"/>
       <w:r>
         <w:lastRenderedPageBreak/>
         <w:t>6.3 Capacity against the free plan</w:t>
       </w:r>
-      <w:bookmarkEnd w:id="42"/>
+      <w:bookmarkEnd w:id="43"/>
     </w:p>
     <w:p>
       <w:pPr>
         <w:pStyle w:val="Caption"/>
         <w:keepNext/>
       </w:pPr>
-      <w:bookmarkStart w:id="43" w:name="_Toc242599635"/>
+      <w:bookmarkStart w:id="44" w:name="_Toc242603092"/>
       <w:r>
         <w:t xml:space="preserve">Table </w:t>
       </w:r>
@@ -20964,7 +21313,7 @@
       <w:r>
         <w:t>: Data volume per intake year and free-plan headroom</w:t>
       </w:r>
-      <w:bookmarkEnd w:id="43"/>
+      <w:bookmarkEnd w:id="44"/>
     </w:p>
     <w:tbl>
       <w:tblPr>
@@ -20981,7 +21330,7 @@
           <w:left w:w="10" w:type="dxa"/>
           <w:right w:w="10" w:type="dxa"/>
         </w:tblCellMar>
-        <w:tblLook w:val="0000" w:firstRow="0" w:lastRow="0" w:firstColumn="0" w:lastColumn="0" w:noHBand="0" w:noVBand="0"/>
+        <w:tblLook w:val="04A0" w:firstRow="1" w:lastRow="0" w:firstColumn="1" w:lastColumn="0" w:noHBand="0" w:noVBand="1"/>
       </w:tblPr>
       <w:tblGrid>
         <w:gridCol w:w="4211"/>
@@ -21626,12 +21975,12 @@
         <w:keepLines/>
         <w:pageBreakBefore/>
       </w:pPr>
-      <w:bookmarkStart w:id="44" w:name="_Toc242599610"/>
+      <w:bookmarkStart w:id="45" w:name="_Toc242603066"/>
       <w:r>
         <w:lastRenderedPageBreak/>
         <w:t>7 Validation against real data</w:t>
       </w:r>
-      <w:bookmarkEnd w:id="44"/>
+      <w:bookmarkEnd w:id="45"/>
     </w:p>
     <w:p>
       <w:pPr>
@@ -21661,7 +22010,7 @@
         <w:pStyle w:val="Caption"/>
         <w:keepNext/>
       </w:pPr>
-      <w:bookmarkStart w:id="45" w:name="_Toc242599636"/>
+      <w:bookmarkStart w:id="46" w:name="_Toc242603093"/>
       <w:r>
         <w:t xml:space="preserve">Table </w:t>
       </w:r>
@@ -21686,7 +22035,7 @@
       <w:r>
         <w:t>: Schema validation results (5 October 2026)</w:t>
       </w:r>
-      <w:bookmarkEnd w:id="45"/>
+      <w:bookmarkEnd w:id="46"/>
     </w:p>
     <w:tbl>
       <w:tblPr>
@@ -21703,7 +22052,7 @@
           <w:left w:w="10" w:type="dxa"/>
           <w:right w:w="10" w:type="dxa"/>
         </w:tblCellMar>
-        <w:tblLook w:val="0000" w:firstRow="0" w:lastRow="0" w:firstColumn="0" w:lastColumn="0" w:noHBand="0" w:noVBand="0"/>
+        <w:tblLook w:val="04A0" w:firstRow="1" w:lastRow="0" w:firstColumn="1" w:lastColumn="0" w:noHBand="0" w:noVBand="1"/>
       </w:tblPr>
       <w:tblGrid>
         <w:gridCol w:w="6544"/>
@@ -23111,7 +23460,7 @@
         <w:pStyle w:val="Caption"/>
         <w:keepNext/>
       </w:pPr>
-      <w:bookmarkStart w:id="46" w:name="_Toc242599637"/>
+      <w:bookmarkStart w:id="47" w:name="_Toc242603094"/>
       <w:r>
         <w:t xml:space="preserve">Table </w:t>
       </w:r>
@@ -23136,7 +23485,7 @@
       <w:r>
         <w:t>: Student-account validation results (5 October 2026)</w:t>
       </w:r>
-      <w:bookmarkEnd w:id="46"/>
+      <w:bookmarkEnd w:id="47"/>
     </w:p>
     <w:tbl>
       <w:tblPr>
@@ -23153,7 +23502,7 @@
           <w:left w:w="10" w:type="dxa"/>
           <w:right w:w="10" w:type="dxa"/>
         </w:tblCellMar>
-        <w:tblLook w:val="0000" w:firstRow="0" w:lastRow="0" w:firstColumn="0" w:lastColumn="0" w:noHBand="0" w:noVBand="0"/>
+        <w:tblLook w:val="04A0" w:firstRow="1" w:lastRow="0" w:firstColumn="1" w:lastColumn="0" w:noHBand="0" w:noVBand="1"/>
       </w:tblPr>
       <w:tblGrid>
         <w:gridCol w:w="4819"/>
@@ -23853,19 +24202,19 @@
         <w:keepLines/>
         <w:pageBreakBefore/>
       </w:pPr>
-      <w:bookmarkStart w:id="47" w:name="_Toc242599611"/>
+      <w:bookmarkStart w:id="48" w:name="_Toc242603067"/>
       <w:r>
         <w:lastRenderedPageBreak/>
         <w:t>Appendix A: Traceability: requirements to tables</w:t>
       </w:r>
-      <w:bookmarkEnd w:id="47"/>
+      <w:bookmarkEnd w:id="48"/>
     </w:p>
     <w:p>
       <w:pPr>
         <w:pStyle w:val="Caption"/>
         <w:keepNext/>
       </w:pPr>
-      <w:bookmarkStart w:id="48" w:name="_Toc242599638"/>
+      <w:bookmarkStart w:id="49" w:name="_Toc242603095"/>
       <w:r>
         <w:t xml:space="preserve">Table </w:t>
       </w:r>
@@ -23890,7 +24239,7 @@
       <w:r>
         <w:t>: Requirements and the tables that realise them</w:t>
       </w:r>
-      <w:bookmarkEnd w:id="48"/>
+      <w:bookmarkEnd w:id="49"/>
     </w:p>
     <w:tbl>
       <w:tblPr>
@@ -23907,7 +24256,7 @@
           <w:left w:w="10" w:type="dxa"/>
           <w:right w:w="10" w:type="dxa"/>
         </w:tblCellMar>
-        <w:tblLook w:val="0000" w:firstRow="0" w:lastRow="0" w:firstColumn="0" w:lastColumn="0" w:noHBand="0" w:noVBand="0"/>
+        <w:tblLook w:val="04A0" w:firstRow="1" w:lastRow="0" w:firstColumn="1" w:lastColumn="0" w:noHBand="0" w:noVBand="1"/>
       </w:tblPr>
       <w:tblGrid>
         <w:gridCol w:w="4819"/>
@@ -25422,12 +25771,12 @@
         <w:keepLines/>
         <w:pageBreakBefore/>
       </w:pPr>
-      <w:bookmarkStart w:id="49" w:name="_Toc242599612"/>
+      <w:bookmarkStart w:id="50" w:name="_Toc242603068"/>
       <w:r>
         <w:lastRenderedPageBreak/>
         <w:t>Appendix B: Physical schema (migration 0001)</w:t>
       </w:r>
-      <w:bookmarkEnd w:id="49"/>
+      <w:bookmarkEnd w:id="50"/>
     </w:p>
     <w:p>
       <w:pPr>
@@ -30635,12 +30984,12 @@
         <w:keepLines/>
         <w:pageBreakBefore/>
       </w:pPr>
-      <w:bookmarkStart w:id="50" w:name="_Toc242599613"/>
+      <w:bookmarkStart w:id="51" w:name="_Toc242603069"/>
       <w:r>
         <w:lastRenderedPageBreak/>
         <w:t>Appendix C: Student accounts (migration 0003)</w:t>
       </w:r>
-      <w:bookmarkEnd w:id="50"/>
+      <w:bookmarkEnd w:id="51"/>
     </w:p>
     <w:p>
       <w:pPr>
@@ -32368,12 +32717,12 @@
         <w:keepLines/>
         <w:pageBreakBefore/>
       </w:pPr>
-      <w:bookmarkStart w:id="51" w:name="_Toc242599614"/>
+      <w:bookmarkStart w:id="52" w:name="_Toc242603070"/>
       <w:r>
         <w:lastRenderedPageBreak/>
         <w:t>Appendix D: Contact details (migration 0007)</w:t>
       </w:r>
-      <w:bookmarkEnd w:id="51"/>
+      <w:bookmarkEnd w:id="52"/>
     </w:p>
     <w:p>
       <w:pPr>
@@ -32764,12 +33113,12 @@
         <w:keepLines/>
         <w:pageBreakBefore/>
       </w:pPr>
-      <w:bookmarkStart w:id="52" w:name="_Toc242599615"/>
+      <w:bookmarkStart w:id="53" w:name="_Toc242603071"/>
       <w:r>
         <w:lastRenderedPageBreak/>
         <w:t>Appendix E: Answer feedback (migration 0008)</w:t>
       </w:r>
-      <w:bookmarkEnd w:id="52"/>
+      <w:bookmarkEnd w:id="53"/>
     </w:p>
     <w:p>
       <w:pPr>
@@ -33075,12 +33424,12 @@
         <w:keepLines/>
         <w:pageBreakBefore/>
       </w:pPr>
-      <w:bookmarkStart w:id="53" w:name="_Toc242599616"/>
+      <w:bookmarkStart w:id="54" w:name="_Toc242603072"/>
       <w:r>
         <w:lastRenderedPageBreak/>
-        <w:t>Appendix F: Groups (migration 0006)</w:t>
-      </w:r>
-      <w:bookmarkEnd w:id="53"/>
+        <w:t>Appendix F: Group rules (migration 0009)</w:t>
+      </w:r>
+      <w:bookmarkEnd w:id="54"/>
     </w:p>
     <w:p>
       <w:pPr>
@@ -33096,10 +33445,139 @@
           <w:szCs w:val="19"/>
           <w:shd w:val="clear" w:color="auto" w:fill="F2F4F3"/>
         </w:rPr>
-        <w:t>migrations/0006_groups.sql</w:t>
-      </w:r>
-      <w:r>
-        <w:t xml:space="preserve">. Migration 0005 inserts the courses and institutions and is generated by </w:t>
+        <w:t>migrations/0009_group_rules.sql</w:t>
+      </w:r>
+      <w:r>
+        <w:t>.</w:t>
+      </w:r>
+    </w:p>
+    <w:p>
+      <w:pPr>
+        <w:keepNext/>
+        <w:keepLines/>
+        <w:pBdr>
+          <w:top w:val="single" w:sz="4" w:space="4" w:color="C9D3D0"/>
+        </w:pBdr>
+        <w:shd w:val="clear" w:color="auto" w:fill="F2F4F3"/>
+        <w:spacing w:before="120" w:line="240" w:lineRule="auto"/>
+        <w:ind w:left="113" w:right="113"/>
+      </w:pPr>
+      <w:r>
+        <w:rPr>
+          <w:rFonts w:ascii="Consolas" w:eastAsia="Consolas" w:hAnsi="Consolas" w:cs="Consolas"/>
+          <w:sz w:val="17"/>
+          <w:szCs w:val="17"/>
+        </w:rPr>
+        <w:t>-- 0009: group rules (CR-005, video 2 2026-10-11: "Groups should have rules too"). Designed in ZP-DOC-05, CR-005.</w:t>
+      </w:r>
+    </w:p>
+    <w:p>
+      <w:pPr>
+        <w:keepNext/>
+        <w:keepLines/>
+        <w:shd w:val="clear" w:color="auto" w:fill="F2F4F3"/>
+        <w:spacing w:line="240" w:lineRule="auto"/>
+        <w:ind w:left="113" w:right="113"/>
+      </w:pPr>
+      <w:r>
+        <w:rPr>
+          <w:rFonts w:ascii="Consolas" w:eastAsia="Consolas" w:hAnsi="Consolas" w:cs="Consolas"/>
+          <w:sz w:val="17"/>
+          <w:szCs w:val="17"/>
+        </w:rPr>
+        <w:t>-- A member accepts the group rules before taking part; the accepted version is recorded on the membership, so a new</w:t>
+      </w:r>
+    </w:p>
+    <w:p>
+      <w:pPr>
+        <w:keepNext/>
+        <w:keepLines/>
+        <w:shd w:val="clear" w:color="auto" w:fill="F2F4F3"/>
+        <w:spacing w:line="240" w:lineRule="auto"/>
+        <w:ind w:left="113" w:right="113"/>
+      </w:pPr>
+      <w:r>
+        <w:rPr>
+          <w:rFonts w:ascii="Consolas" w:eastAsia="Consolas" w:hAnsi="Consolas" w:cs="Consolas"/>
+          <w:sz w:val="17"/>
+          <w:szCs w:val="17"/>
+        </w:rPr>
+        <w:t>-- version of the rules can be asked for again. NULL = joined before rules existed (or not yet accepted): the Worker</w:t>
+      </w:r>
+    </w:p>
+    <w:p>
+      <w:pPr>
+        <w:keepNext/>
+        <w:keepLines/>
+        <w:shd w:val="clear" w:color="auto" w:fill="F2F4F3"/>
+        <w:spacing w:line="240" w:lineRule="auto"/>
+        <w:ind w:left="113" w:right="113"/>
+      </w:pPr>
+      <w:r>
+        <w:rPr>
+          <w:rFonts w:ascii="Consolas" w:eastAsia="Consolas" w:hAnsi="Consolas" w:cs="Consolas"/>
+          <w:sz w:val="17"/>
+          <w:szCs w:val="17"/>
+        </w:rPr>
+        <w:t>-- then keeps the live room closed until the member accepts (enforced in worker/groups.ts, not only on the phone).</w:t>
+      </w:r>
+    </w:p>
+    <w:p>
+      <w:pPr>
+        <w:keepNext/>
+        <w:keepLines/>
+        <w:shd w:val="clear" w:color="auto" w:fill="F2F4F3"/>
+        <w:spacing w:line="240" w:lineRule="auto"/>
+        <w:ind w:left="113" w:right="113"/>
+      </w:pPr>
+      <w:r>
+        <w:rPr>
+          <w:rFonts w:ascii="Consolas" w:eastAsia="Consolas" w:hAnsi="Consolas" w:cs="Consolas"/>
+          <w:sz w:val="17"/>
+          <w:szCs w:val="17"/>
+        </w:rPr>
+        <w:t>-- Reuses group_member (one row per member per group) instead of a new table: acceptance is a fact about that row.</w:t>
+      </w:r>
+    </w:p>
+    <w:p>
+      <w:pPr>
+        <w:keepLines/>
+        <w:pBdr>
+          <w:bottom w:val="single" w:sz="4" w:space="4" w:color="C9D3D0"/>
+        </w:pBdr>
+        <w:shd w:val="clear" w:color="auto" w:fill="F2F4F3"/>
+        <w:spacing w:after="160" w:line="240" w:lineRule="auto"/>
+        <w:ind w:left="113" w:right="113"/>
+      </w:pPr>
+      <w:r>
+        <w:rPr>
+          <w:rFonts w:ascii="Consolas" w:eastAsia="Consolas" w:hAnsi="Consolas" w:cs="Consolas"/>
+          <w:sz w:val="17"/>
+          <w:szCs w:val="17"/>
+        </w:rPr>
+        <w:t>ALTER TABLE group_member ADD COLUMN rules_version TEXT CHECK (rules_version IS NULL OR rules_version IN ('2026-10-11'));</w:t>
+      </w:r>
+    </w:p>
+    <w:p>
+      <w:pPr>
+        <w:pStyle w:val="Heading1"/>
+        <w:keepNext/>
+        <w:keepLines/>
+        <w:pageBreakBefore/>
+      </w:pPr>
+      <w:bookmarkStart w:id="55" w:name="_Toc242603073"/>
+      <w:r>
+        <w:lastRenderedPageBreak/>
+        <w:t>Appendix G: Groups (migration 0006)</w:t>
+      </w:r>
+      <w:bookmarkEnd w:id="55"/>
+    </w:p>
+    <w:p>
+      <w:pPr>
+        <w:spacing w:after="120"/>
+      </w:pPr>
+      <w:r>
+        <w:t xml:space="preserve">Reproduced verbatim from </w:t>
       </w:r>
       <w:r>
         <w:rPr>
@@ -33108,6 +33586,18 @@
           <w:szCs w:val="19"/>
           <w:shd w:val="clear" w:color="auto" w:fill="F2F4F3"/>
         </w:rPr>
+        <w:t>migrations/0006_groups.sql</w:t>
+      </w:r>
+      <w:r>
+        <w:t xml:space="preserve">. Migration 0005 inserts the courses and institutions and is generated by </w:t>
+      </w:r>
+      <w:r>
+        <w:rPr>
+          <w:rFonts w:ascii="Consolas" w:eastAsia="Consolas" w:hAnsi="Consolas" w:cs="Consolas"/>
+          <w:sz w:val="19"/>
+          <w:szCs w:val="19"/>
+          <w:shd w:val="clear" w:color="auto" w:fill="F2F4F3"/>
+        </w:rPr>
         <w:t>tools/seed/courses-sql.ts</w:t>
       </w:r>
       <w:r>
@@ -34328,19 +34818,19 @@
         <w:keepLines/>
         <w:pageBreakBefore/>
       </w:pPr>
-      <w:bookmarkStart w:id="54" w:name="_Toc242599617"/>
+      <w:bookmarkStart w:id="56" w:name="_Toc242603074"/>
       <w:r>
         <w:lastRenderedPageBreak/>
-        <w:t>Appendix G: Glossary</w:t>
-      </w:r>
-      <w:bookmarkEnd w:id="54"/>
+        <w:t>Appendix H: Glossary</w:t>
+      </w:r>
+      <w:bookmarkEnd w:id="56"/>
     </w:p>
     <w:p>
       <w:pPr>
         <w:pStyle w:val="Caption"/>
         <w:keepNext/>
       </w:pPr>
-      <w:bookmarkStart w:id="55" w:name="_Toc242599639"/>
+      <w:bookmarkStart w:id="57" w:name="_Toc242603096"/>
       <w:r>
         <w:t xml:space="preserve">Table </w:t>
       </w:r>
@@ -34365,7 +34855,7 @@
       <w:r>
         <w:t>: Terms used in this document</w:t>
       </w:r>
-      <w:bookmarkEnd w:id="55"/>
+      <w:bookmarkEnd w:id="57"/>
     </w:p>
     <w:tbl>
       <w:tblPr>
@@ -34382,7 +34872,7 @@
           <w:left w:w="10" w:type="dxa"/>
           <w:right w:w="10" w:type="dxa"/>
         </w:tblCellMar>
-        <w:tblLook w:val="0000" w:firstRow="0" w:lastRow="0" w:firstColumn="0" w:lastColumn="0" w:noHBand="0" w:noVBand="0"/>
+        <w:tblLook w:val="04A0" w:firstRow="1" w:lastRow="0" w:firstColumn="1" w:lastColumn="0" w:noHBand="0" w:noVBand="1"/>
       </w:tblPr>
       <w:tblGrid>
         <w:gridCol w:w="2928"/>
@@ -35057,19 +35547,19 @@
         <w:keepLines/>
         <w:pageBreakBefore/>
       </w:pPr>
-      <w:bookmarkStart w:id="56" w:name="_Toc242599618"/>
+      <w:bookmarkStart w:id="58" w:name="_Toc242603075"/>
       <w:r>
         <w:lastRenderedPageBreak/>
-        <w:t>Appendix H: References</w:t>
-      </w:r>
-      <w:bookmarkEnd w:id="56"/>
+        <w:t>Appendix I: References</w:t>
+      </w:r>
+      <w:bookmarkEnd w:id="58"/>
     </w:p>
     <w:p>
       <w:pPr>
         <w:pStyle w:val="Caption"/>
         <w:keepNext/>
       </w:pPr>
-      <w:bookmarkStart w:id="57" w:name="_Toc242599640"/>
+      <w:bookmarkStart w:id="59" w:name="_Toc242603097"/>
       <w:r>
         <w:t xml:space="preserve">Table </w:t>
       </w:r>
@@ -35094,7 +35584,7 @@
       <w:r>
         <w:t>: Sources referred to in this document</w:t>
       </w:r>
-      <w:bookmarkEnd w:id="57"/>
+      <w:bookmarkEnd w:id="59"/>
     </w:p>
     <w:tbl>
       <w:tblPr>
@@ -35111,7 +35601,7 @@
           <w:left w:w="10" w:type="dxa"/>
           <w:right w:w="10" w:type="dxa"/>
         </w:tblCellMar>
-        <w:tblLook w:val="0000" w:firstRow="0" w:lastRow="0" w:firstColumn="0" w:lastColumn="0" w:noHBand="0" w:noVBand="0"/>
+        <w:tblLook w:val="04A0" w:firstRow="1" w:lastRow="0" w:firstColumn="1" w:lastColumn="0" w:noHBand="0" w:noVBand="1"/>
       </w:tblPr>
       <w:tblGrid>
         <w:gridCol w:w="803"/>
@@ -36000,96 +36490,72 @@
 <file path=word/numbering.xml><?xml version="1.0" encoding="utf-8"?>
 <w:numbering xmlns:wpc="http://schemas.microsoft.com/office/word/2010/wordprocessingCanvas" xmlns:cx="http://schemas.microsoft.com/office/drawing/2014/chartex" xmlns:cx1="http://schemas.microsoft.com/office/drawing/2015/9/8/chartex" xmlns:cx2="http://schemas.microsoft.com/office/drawing/2015/10/21/chartex" xmlns:cx3="http://schemas.microsoft.com/office/drawing/2016/5/9/chartex" xmlns:cx4="http://schemas.microsoft.com/office/drawing/2016/5/10/chartex" xmlns:cx5="http://schemas.microsoft.com/office/drawing/2016/5/11/chartex" xmlns:cx6="http://schemas.microsoft.com/office/drawing/2016/5/12/chartex" xmlns:cx7="http://schemas.microsoft.com/office/drawing/2016/5/13/chartex" xmlns:cx8="http://schemas.microsoft.com/office/drawing/2016/5/14/chartex" xmlns:mc="http://schemas.openxmlformats.org/markup-compatibility/2006" xmlns:aink="http://schemas.microsoft.com/office/drawing/2016/ink" xmlns:am3d="http://schemas.microsoft.com/office/drawing/2017/model3d" xmlns:o="urn:schemas-microsoft-com:office:office" xmlns:oel="http://schemas.microsoft.com/office/2019/extlst" xmlns:r="http://schemas.openxmlformats.org/officeDocument/2006/relationships" xmlns:m="http://schemas.openxmlformats.org/officeDocument/2006/math" xmlns:v="urn:schemas-microsoft-com:vml" xmlns:wp14="http://schemas.microsoft.com/office/word/2010/wordprocessingDrawing" xmlns:wp="http://schemas.openxmlformats.org/drawingml/2006/wordprocessingDrawing" xmlns:w10="urn:schemas-microsoft-com:office:word" xmlns:w="http://schemas.openxmlformats.org/wordprocessingml/2006/main" xmlns:w14="http://schemas.microsoft.com/office/word/2010/wordml" xmlns:w15="http://schemas.microsoft.com/office/word/2012/wordml" xmlns:w16cex="http://schemas.microsoft.com/office/word/2018/wordml/cex" xmlns:w16cid="http://schemas.microsoft.com/office/word/2016/wordml/cid" xmlns:w16="http://schemas.microsoft.com/office/word/2018/wordml" xmlns:w16du="http://schemas.microsoft.com/office/word/2023/wordml/word16du" xmlns:w16sdtdh="http://schemas.microsoft.com/office/word/2020/wordml/sdtdatahash" xmlns:w16sdtfl="http://schemas.microsoft.com/office/word/2024/wordml/sdtformatlock" xmlns:w16se="http://schemas.microsoft.com/office/word/2015/wordml/symex" xmlns:wpg="http://schemas.microsoft.com/office/word/2010/wordprocessingGroup" xmlns:wpi="http://schemas.microsoft.com/office/word/2010/wordprocessingInk" xmlns:wne="http://schemas.microsoft.com/office/word/2006/wordml" xmlns:wps="http://schemas.microsoft.com/office/word/2010/wordprocessingShape" mc:Ignorable="w14 w15 w16se w16cid w16 w16cex w16sdtdh w16sdtfl w16du wp14">
   <w:abstractNum w:abstractNumId="0" w15:restartNumberingAfterBreak="0">
-    <w:nsid w:val="38AC5F3B"/>
+    <w:nsid w:val="2F5802CC"/>
     <w:multiLevelType w:val="hybridMultilevel"/>
-    <w:tmpl w:val="4B42A680"/>
-    <w:lvl w:ilvl="0" w:tplc="10969E20" w:tentative="1">
+    <w:tmpl w:val="0B5C4AC4"/>
+    <w:lvl w:ilvl="0" w:tplc="8FF4FF8A" w:tentative="1">
       <w:start w:val="1"/>
-      <w:numFmt w:val="bullet"/>
-      <w:lvlText w:val="●"/>
+      <w:numFmt w:val="decimal"/>
+      <w:lvlText w:val="%1."/>
       <w:lvlJc w:val="left"/>
       <w:pPr>
         <w:ind w:left="720" w:hanging="360"/>
       </w:pPr>
     </w:lvl>
-    <w:lvl w:ilvl="1" w:tplc="CF46480C" w:tentative="1">
+    <w:lvl w:ilvl="1" w:tplc="E0D84A4C" w:tentative="1">
       <w:start w:val="1"/>
-      <w:numFmt w:val="bullet"/>
-      <w:lvlText w:val="○"/>
+      <w:numFmt w:val="lowerLetter"/>
+      <w:lvlText w:val="%2."/>
       <w:lvlJc w:val="left"/>
       <w:pPr>
+        <w:ind w:left="1080" w:hanging="360"/>
+      </w:pPr>
+    </w:lvl>
+    <w:lvl w:ilvl="2" w:tplc="C038B872" w:tentative="1">
+      <w:start w:val="1"/>
+      <w:numFmt w:val="lowerRoman"/>
+      <w:lvlText w:val="%3."/>
+      <w:lvlJc w:val="left"/>
+      <w:pPr>
         <w:ind w:left="1440" w:hanging="360"/>
       </w:pPr>
     </w:lvl>
-    <w:lvl w:ilvl="2" w:tplc="7382CC68" w:tentative="1">
-      <w:start w:val="1"/>
-      <w:numFmt w:val="bullet"/>
-      <w:lvlText w:val="■"/>
+    <w:lvl w:ilvl="3" w:tplc="830CDF82">
+      <w:numFmt w:val="decimal"/>
+      <w:lvlText w:val=""/>
       <w:lvlJc w:val="left"/>
-      <w:pPr>
-        <w:ind w:left="2160" w:hanging="360"/>
-      </w:pPr>
     </w:lvl>
-    <w:lvl w:ilvl="3" w:tplc="4ADC5ACC" w:tentative="1">
-      <w:start w:val="1"/>
-      <w:numFmt w:val="bullet"/>
-      <w:lvlText w:val="●"/>
+    <w:lvl w:ilvl="4" w:tplc="19506A14">
+      <w:numFmt w:val="decimal"/>
+      <w:lvlText w:val=""/>
       <w:lvlJc w:val="left"/>
-      <w:pPr>
-        <w:ind w:left="2880" w:hanging="360"/>
-      </w:pPr>
     </w:lvl>
-    <w:lvl w:ilvl="4" w:tplc="ADB0DE8C" w:tentative="1">
-      <w:start w:val="1"/>
-      <w:numFmt w:val="bullet"/>
-      <w:lvlText w:val="○"/>
+    <w:lvl w:ilvl="5" w:tplc="0E6C83AE">
+      <w:numFmt w:val="decimal"/>
+      <w:lvlText w:val=""/>
       <w:lvlJc w:val="left"/>
-      <w:pPr>
-        <w:ind w:left="3600" w:hanging="360"/>
-      </w:pPr>
     </w:lvl>
-    <w:lvl w:ilvl="5" w:tplc="5540F2AE" w:tentative="1">
-      <w:start w:val="1"/>
-      <w:numFmt w:val="bullet"/>
-      <w:lvlText w:val="■"/>
+    <w:lvl w:ilvl="6" w:tplc="42D67DF2">
+      <w:numFmt w:val="decimal"/>
+      <w:lvlText w:val=""/>
       <w:lvlJc w:val="left"/>
-      <w:pPr>
-        <w:ind w:left="4320" w:hanging="360"/>
-      </w:pPr>
     </w:lvl>
-    <w:lvl w:ilvl="6" w:tplc="922AD23E" w:tentative="1">
-      <w:start w:val="1"/>
-      <w:numFmt w:val="bullet"/>
-      <w:lvlText w:val="●"/>
+    <w:lvl w:ilvl="7" w:tplc="3814E314">
+      <w:numFmt w:val="decimal"/>
+      <w:lvlText w:val=""/>
       <w:lvlJc w:val="left"/>
-      <w:pPr>
-        <w:ind w:left="5040" w:hanging="360"/>
-      </w:pPr>
     </w:lvl>
-    <w:lvl w:ilvl="7" w:tplc="3104DE10" w:tentative="1">
-      <w:start w:val="1"/>
-      <w:numFmt w:val="bullet"/>
-      <w:lvlText w:val="●"/>
+    <w:lvl w:ilvl="8" w:tplc="06544312">
+      <w:numFmt w:val="decimal"/>
+      <w:lvlText w:val=""/>
       <w:lvlJc w:val="left"/>
-      <w:pPr>
-        <w:ind w:left="5760" w:hanging="360"/>
-      </w:pPr>
-    </w:lvl>
-    <w:lvl w:ilvl="8" w:tplc="AAFABDD4" w:tentative="1">
-      <w:start w:val="1"/>
-      <w:numFmt w:val="bullet"/>
-      <w:lvlText w:val="●"/>
-      <w:lvlJc w:val="left"/>
-      <w:pPr>
-        <w:ind w:left="6480" w:hanging="360"/>
-      </w:pPr>
     </w:lvl>
   </w:abstractNum>
   <w:abstractNum w:abstractNumId="1" w15:restartNumberingAfterBreak="0">
-    <w:nsid w:val="7E8202E4"/>
+    <w:nsid w:val="53720CA0"/>
     <w:multiLevelType w:val="hybridMultilevel"/>
-    <w:tmpl w:val="229C332A"/>
-    <w:lvl w:ilvl="0" w:tplc="2B34EF70">
+    <w:tmpl w:val="2D86C856"/>
+    <w:lvl w:ilvl="0" w:tplc="0F1AA610">
       <w:start w:val="1"/>
       <w:numFmt w:val="bullet"/>
       <w:lvlText w:val="•"/>
@@ -36098,7 +36564,7 @@
         <w:ind w:left="720" w:hanging="280"/>
       </w:pPr>
     </w:lvl>
-    <w:lvl w:ilvl="1" w:tplc="32925756" w:tentative="1">
+    <w:lvl w:ilvl="1" w:tplc="23A48F82" w:tentative="1">
       <w:start w:val="1"/>
       <w:numFmt w:val="bullet"/>
       <w:lvlText w:val="–"/>
@@ -36107,7 +36573,7 @@
         <w:ind w:left="1080" w:hanging="280"/>
       </w:pPr>
     </w:lvl>
-    <w:lvl w:ilvl="2" w:tplc="E312AD0A" w:tentative="1">
+    <w:lvl w:ilvl="2" w:tplc="FC889B86" w:tentative="1">
       <w:start w:val="1"/>
       <w:numFmt w:val="bullet"/>
       <w:lvlText w:val="▪"/>
@@ -36116,112 +36582,136 @@
         <w:ind w:left="1440" w:hanging="280"/>
       </w:pPr>
     </w:lvl>
-    <w:lvl w:ilvl="3" w:tplc="F3E426A8">
+    <w:lvl w:ilvl="3" w:tplc="072C5BF8">
       <w:numFmt w:val="decimal"/>
       <w:lvlText w:val=""/>
       <w:lvlJc w:val="left"/>
     </w:lvl>
-    <w:lvl w:ilvl="4" w:tplc="70666470">
+    <w:lvl w:ilvl="4" w:tplc="A1F22D04">
       <w:numFmt w:val="decimal"/>
       <w:lvlText w:val=""/>
       <w:lvlJc w:val="left"/>
     </w:lvl>
-    <w:lvl w:ilvl="5" w:tplc="B6D49B7A">
+    <w:lvl w:ilvl="5" w:tplc="553E8088">
       <w:numFmt w:val="decimal"/>
       <w:lvlText w:val=""/>
       <w:lvlJc w:val="left"/>
     </w:lvl>
-    <w:lvl w:ilvl="6" w:tplc="1EC48AA8">
+    <w:lvl w:ilvl="6" w:tplc="756E867E">
       <w:numFmt w:val="decimal"/>
       <w:lvlText w:val=""/>
       <w:lvlJc w:val="left"/>
     </w:lvl>
-    <w:lvl w:ilvl="7" w:tplc="BB286BE0">
+    <w:lvl w:ilvl="7" w:tplc="F1A01196">
       <w:numFmt w:val="decimal"/>
       <w:lvlText w:val=""/>
       <w:lvlJc w:val="left"/>
     </w:lvl>
-    <w:lvl w:ilvl="8" w:tplc="F1A86494">
+    <w:lvl w:ilvl="8" w:tplc="0ECCF7D6">
       <w:numFmt w:val="decimal"/>
       <w:lvlText w:val=""/>
       <w:lvlJc w:val="left"/>
     </w:lvl>
   </w:abstractNum>
   <w:abstractNum w:abstractNumId="2" w15:restartNumberingAfterBreak="0">
-    <w:nsid w:val="7F192902"/>
+    <w:nsid w:val="59FC5150"/>
     <w:multiLevelType w:val="hybridMultilevel"/>
-    <w:tmpl w:val="F5DA6B0E"/>
-    <w:lvl w:ilvl="0" w:tplc="84B2363A" w:tentative="1">
+    <w:tmpl w:val="89A63B20"/>
+    <w:lvl w:ilvl="0" w:tplc="C31EE184" w:tentative="1">
       <w:start w:val="1"/>
-      <w:numFmt w:val="decimal"/>
-      <w:lvlText w:val="%1."/>
+      <w:numFmt w:val="bullet"/>
+      <w:lvlText w:val="●"/>
       <w:lvlJc w:val="left"/>
       <w:pPr>
         <w:ind w:left="720" w:hanging="360"/>
       </w:pPr>
     </w:lvl>
-    <w:lvl w:ilvl="1" w:tplc="AD007AE4" w:tentative="1">
+    <w:lvl w:ilvl="1" w:tplc="18748B16" w:tentative="1">
       <w:start w:val="1"/>
-      <w:numFmt w:val="lowerLetter"/>
-      <w:lvlText w:val="%2."/>
+      <w:numFmt w:val="bullet"/>
+      <w:lvlText w:val="○"/>
       <w:lvlJc w:val="left"/>
       <w:pPr>
-        <w:ind w:left="1080" w:hanging="360"/>
+        <w:ind w:left="1440" w:hanging="360"/>
       </w:pPr>
     </w:lvl>
-    <w:lvl w:ilvl="2" w:tplc="F15E27F4" w:tentative="1">
+    <w:lvl w:ilvl="2" w:tplc="323EE8CC" w:tentative="1">
       <w:start w:val="1"/>
-      <w:numFmt w:val="lowerRoman"/>
-      <w:lvlText w:val="%3."/>
+      <w:numFmt w:val="bullet"/>
+      <w:lvlText w:val="■"/>
       <w:lvlJc w:val="left"/>
       <w:pPr>
-        <w:ind w:left="1440" w:hanging="360"/>
+        <w:ind w:left="2160" w:hanging="360"/>
       </w:pPr>
     </w:lvl>
-    <w:lvl w:ilvl="3" w:tplc="0026207C">
-      <w:numFmt w:val="decimal"/>
-      <w:lvlText w:val=""/>
+    <w:lvl w:ilvl="3" w:tplc="64CE8E76" w:tentative="1">
+      <w:start w:val="1"/>
+      <w:numFmt w:val="bullet"/>
+      <w:lvlText w:val="●"/>
       <w:lvlJc w:val="left"/>
+      <w:pPr>
+        <w:ind w:left="2880" w:hanging="360"/>
+      </w:pPr>
     </w:lvl>
-    <w:lvl w:ilvl="4" w:tplc="9988A25C">
-      <w:numFmt w:val="decimal"/>
-      <w:lvlText w:val=""/>
+    <w:lvl w:ilvl="4" w:tplc="A66CE77C" w:tentative="1">
+      <w:start w:val="1"/>
+      <w:numFmt w:val="bullet"/>
+      <w:lvlText w:val="○"/>
       <w:lvlJc w:val="left"/>
+      <w:pPr>
+        <w:ind w:left="3600" w:hanging="360"/>
+      </w:pPr>
     </w:lvl>
-    <w:lvl w:ilvl="5" w:tplc="4EF69D46">
-      <w:numFmt w:val="decimal"/>
-      <w:lvlText w:val=""/>
+    <w:lvl w:ilvl="5" w:tplc="08E80764" w:tentative="1">
+      <w:start w:val="1"/>
+      <w:numFmt w:val="bullet"/>
+      <w:lvlText w:val="■"/>
       <w:lvlJc w:val="left"/>
+      <w:pPr>
+        <w:ind w:left="4320" w:hanging="360"/>
+      </w:pPr>
     </w:lvl>
-    <w:lvl w:ilvl="6" w:tplc="15967A9A">
-      <w:numFmt w:val="decimal"/>
-      <w:lvlText w:val=""/>
+    <w:lvl w:ilvl="6" w:tplc="F21E2FD2" w:tentative="1">
+      <w:start w:val="1"/>
+      <w:numFmt w:val="bullet"/>
+      <w:lvlText w:val="●"/>
       <w:lvlJc w:val="left"/>
+      <w:pPr>
+        <w:ind w:left="5040" w:hanging="360"/>
+      </w:pPr>
     </w:lvl>
-    <w:lvl w:ilvl="7" w:tplc="D15672DE">
-      <w:numFmt w:val="decimal"/>
-      <w:lvlText w:val=""/>
+    <w:lvl w:ilvl="7" w:tplc="DD96691C" w:tentative="1">
+      <w:start w:val="1"/>
+      <w:numFmt w:val="bullet"/>
+      <w:lvlText w:val="●"/>
       <w:lvlJc w:val="left"/>
+      <w:pPr>
+        <w:ind w:left="5760" w:hanging="360"/>
+      </w:pPr>
     </w:lvl>
-    <w:lvl w:ilvl="8" w:tplc="0D9A2130">
-      <w:numFmt w:val="decimal"/>
-      <w:lvlText w:val=""/>
+    <w:lvl w:ilvl="8" w:tplc="C5D28142" w:tentative="1">
+      <w:start w:val="1"/>
+      <w:numFmt w:val="bullet"/>
+      <w:lvlText w:val="●"/>
       <w:lvlJc w:val="left"/>
+      <w:pPr>
+        <w:ind w:left="6480" w:hanging="360"/>
+      </w:pPr>
     </w:lvl>
   </w:abstractNum>
-  <w:num w:numId="1" w16cid:durableId="1083837568">
-    <w:abstractNumId w:val="0"/>
+  <w:num w:numId="1" w16cid:durableId="1340306070">
+    <w:abstractNumId w:val="2"/>
     <w:lvlOverride w:ilvl="0">
       <w:startOverride w:val="1"/>
     </w:lvlOverride>
   </w:num>
-  <w:num w:numId="2" w16cid:durableId="513880060">
+  <w:num w:numId="2" w16cid:durableId="1567371134">
     <w:abstractNumId w:val="1"/>
     <w:lvlOverride w:ilvl="0">
       <w:startOverride w:val="1"/>
     </w:lvlOverride>
   </w:num>
-  <w:num w:numId="3" w16cid:durableId="895556476">
+  <w:num w:numId="3" w16cid:durableId="1917397962">
     <w:abstractNumId w:val="1"/>
     <w:lvlOverride w:ilvl="0">
       <w:startOverride w:val="1"/>
@@ -36926,7 +37416,7 @@
     <w:autoRedefine/>
     <w:uiPriority w:val="39"/>
     <w:unhideWhenUsed/>
-    <w:rsid w:val="00F62BD3"/>
+    <w:rsid w:val="00285931"/>
     <w:pPr>
       <w:spacing w:after="100"/>
     </w:pPr>
@@ -36938,7 +37428,7 @@
     <w:autoRedefine/>
     <w:uiPriority w:val="39"/>
     <w:unhideWhenUsed/>
-    <w:rsid w:val="00F62BD3"/>
+    <w:rsid w:val="00285931"/>
     <w:pPr>
       <w:spacing w:after="100"/>
       <w:ind w:left="210"/>
@@ -36950,7 +37440,7 @@
     <w:next w:val="Normal"/>
     <w:uiPriority w:val="99"/>
     <w:unhideWhenUsed/>
-    <w:rsid w:val="00F62BD3"/>
+    <w:rsid w:val="00285931"/>
   </w:style>
 </w:styles>
 </file>

</xml_diff>

<commit_message>
Migration 0010 expand-then-contract: keep group_member.rules_version (unused) so a rollback to d6323d59 stays safe; a later migration drops it. ZP-DOC-05 and test updated
Co-Authored-By: Claude Opus 5.5 (1M context) <noreply@anthropic.com>
</commit_message>
<xml_diff>
--- a/docs/05-data-design/ZP-DOC-05_Data-Design.docx
+++ b/docs/05-data-design/ZP-DOC-05_Data-Design.docx
@@ -90,7 +90,7 @@
           <w:left w:w="10" w:type="dxa"/>
           <w:right w:w="10" w:type="dxa"/>
         </w:tblCellMar>
-        <w:tblLook w:val="04A0" w:firstRow="1" w:lastRow="0" w:firstColumn="1" w:lastColumn="0" w:noHBand="0" w:noVBand="1"/>
+        <w:tblLook w:val="0000" w:firstRow="0" w:lastRow="0" w:firstColumn="0" w:lastColumn="0" w:noHBand="0" w:noVBand="0"/>
       </w:tblPr>
       <w:tblGrid>
         <w:gridCol w:w="2600"/>
@@ -494,7 +494,7 @@
           <w:left w:w="10" w:type="dxa"/>
           <w:right w:w="10" w:type="dxa"/>
         </w:tblCellMar>
-        <w:tblLook w:val="04A0" w:firstRow="1" w:lastRow="0" w:firstColumn="1" w:lastColumn="0" w:noHBand="0" w:noVBand="1"/>
+        <w:tblLook w:val="0000" w:firstRow="0" w:lastRow="0" w:firstColumn="0" w:lastColumn="0" w:noHBand="0" w:noVBand="0"/>
       </w:tblPr>
       <w:tblGrid>
         <w:gridCol w:w="2600"/>
@@ -1189,7 +1189,7 @@
           <w:left w:w="10" w:type="dxa"/>
           <w:right w:w="10" w:type="dxa"/>
         </w:tblCellMar>
-        <w:tblLook w:val="04A0" w:firstRow="1" w:lastRow="0" w:firstColumn="1" w:lastColumn="0" w:noHBand="0" w:noVBand="1"/>
+        <w:tblLook w:val="0000" w:firstRow="0" w:lastRow="0" w:firstColumn="0" w:lastColumn="0" w:noHBand="0" w:noVBand="0"/>
       </w:tblPr>
       <w:tblGrid>
         <w:gridCol w:w="964"/>
@@ -2183,7 +2183,7 @@
           <w:left w:w="10" w:type="dxa"/>
           <w:right w:w="10" w:type="dxa"/>
         </w:tblCellMar>
-        <w:tblLook w:val="04A0" w:firstRow="1" w:lastRow="0" w:firstColumn="1" w:lastColumn="0" w:noHBand="0" w:noVBand="1"/>
+        <w:tblLook w:val="0000" w:firstRow="0" w:lastRow="0" w:firstColumn="0" w:lastColumn="0" w:noHBand="0" w:noVBand="0"/>
       </w:tblPr>
       <w:tblGrid>
         <w:gridCol w:w="2120"/>
@@ -2540,7 +2540,7 @@
     <w:sdt>
       <w:sdtPr>
         <w:alias w:val="Contents"/>
-        <w:id w:val="476423049"/>
+        <w:id w:val="277991327"/>
       </w:sdtPr>
       <w:sdtEndPr/>
       <w:sdtContent>
@@ -2569,7 +2569,7 @@
           <w:r>
             <w:fldChar w:fldCharType="separate"/>
           </w:r>
-          <w:hyperlink w:anchor="_Toc242618847" w:history="1">
+          <w:hyperlink w:anchor="_Toc242620537" w:history="1">
             <w:r>
               <w:rPr>
                 <w:rStyle w:val="Hyperlink"/>
@@ -2593,7 +2593,7 @@
               <w:rPr>
                 <w:noProof/>
               </w:rPr>
-              <w:instrText xml:space="preserve"> PAGEREF _Toc242618847 \h </w:instrText>
+              <w:instrText xml:space="preserve"> PAGEREF _Toc242620537 \h </w:instrText>
             </w:r>
             <w:r>
               <w:rPr>
@@ -2636,7 +2636,7 @@
               <w14:ligatures w14:val="standardContextual"/>
             </w:rPr>
           </w:pPr>
-          <w:hyperlink w:anchor="_Toc242618848" w:history="1">
+          <w:hyperlink w:anchor="_Toc242620538" w:history="1">
             <w:r>
               <w:rPr>
                 <w:rStyle w:val="Hyperlink"/>
@@ -2660,7 +2660,7 @@
               <w:rPr>
                 <w:noProof/>
               </w:rPr>
-              <w:instrText xml:space="preserve"> PAGEREF _Toc242618848 \h </w:instrText>
+              <w:instrText xml:space="preserve"> PAGEREF _Toc242620538 \h </w:instrText>
             </w:r>
             <w:r>
               <w:rPr>
@@ -2703,7 +2703,7 @@
               <w14:ligatures w14:val="standardContextual"/>
             </w:rPr>
           </w:pPr>
-          <w:hyperlink w:anchor="_Toc242618849" w:history="1">
+          <w:hyperlink w:anchor="_Toc242620539" w:history="1">
             <w:r>
               <w:rPr>
                 <w:rStyle w:val="Hyperlink"/>
@@ -2727,7 +2727,7 @@
               <w:rPr>
                 <w:noProof/>
               </w:rPr>
-              <w:instrText xml:space="preserve"> PAGEREF _Toc242618849 \h </w:instrText>
+              <w:instrText xml:space="preserve"> PAGEREF _Toc242620539 \h </w:instrText>
             </w:r>
             <w:r>
               <w:rPr>
@@ -2770,7 +2770,7 @@
               <w14:ligatures w14:val="standardContextual"/>
             </w:rPr>
           </w:pPr>
-          <w:hyperlink w:anchor="_Toc242618850" w:history="1">
+          <w:hyperlink w:anchor="_Toc242620540" w:history="1">
             <w:r>
               <w:rPr>
                 <w:rStyle w:val="Hyperlink"/>
@@ -2794,7 +2794,7 @@
               <w:rPr>
                 <w:noProof/>
               </w:rPr>
-              <w:instrText xml:space="preserve"> PAGEREF _Toc242618850 \h </w:instrText>
+              <w:instrText xml:space="preserve"> PAGEREF _Toc242620540 \h </w:instrText>
             </w:r>
             <w:r>
               <w:rPr>
@@ -2837,7 +2837,7 @@
               <w14:ligatures w14:val="standardContextual"/>
             </w:rPr>
           </w:pPr>
-          <w:hyperlink w:anchor="_Toc242618851" w:history="1">
+          <w:hyperlink w:anchor="_Toc242620541" w:history="1">
             <w:r>
               <w:rPr>
                 <w:rStyle w:val="Hyperlink"/>
@@ -2861,7 +2861,7 @@
               <w:rPr>
                 <w:noProof/>
               </w:rPr>
-              <w:instrText xml:space="preserve"> PAGEREF _Toc242618851 \h </w:instrText>
+              <w:instrText xml:space="preserve"> PAGEREF _Toc242620541 \h </w:instrText>
             </w:r>
             <w:r>
               <w:rPr>
@@ -2904,7 +2904,7 @@
               <w14:ligatures w14:val="standardContextual"/>
             </w:rPr>
           </w:pPr>
-          <w:hyperlink w:anchor="_Toc242618852" w:history="1">
+          <w:hyperlink w:anchor="_Toc242620542" w:history="1">
             <w:r>
               <w:rPr>
                 <w:rStyle w:val="Hyperlink"/>
@@ -2928,7 +2928,7 @@
               <w:rPr>
                 <w:noProof/>
               </w:rPr>
-              <w:instrText xml:space="preserve"> PAGEREF _Toc242618852 \h </w:instrText>
+              <w:instrText xml:space="preserve"> PAGEREF _Toc242620542 \h </w:instrText>
             </w:r>
             <w:r>
               <w:rPr>
@@ -2971,7 +2971,7 @@
               <w14:ligatures w14:val="standardContextual"/>
             </w:rPr>
           </w:pPr>
-          <w:hyperlink w:anchor="_Toc242618853" w:history="1">
+          <w:hyperlink w:anchor="_Toc242620543" w:history="1">
             <w:r>
               <w:rPr>
                 <w:rStyle w:val="Hyperlink"/>
@@ -2995,7 +2995,7 @@
               <w:rPr>
                 <w:noProof/>
               </w:rPr>
-              <w:instrText xml:space="preserve"> PAGEREF _Toc242618853 \h </w:instrText>
+              <w:instrText xml:space="preserve"> PAGEREF _Toc242620543 \h </w:instrText>
             </w:r>
             <w:r>
               <w:rPr>
@@ -3038,7 +3038,7 @@
               <w14:ligatures w14:val="standardContextual"/>
             </w:rPr>
           </w:pPr>
-          <w:hyperlink w:anchor="_Toc242618854" w:history="1">
+          <w:hyperlink w:anchor="_Toc242620544" w:history="1">
             <w:r>
               <w:rPr>
                 <w:rStyle w:val="Hyperlink"/>
@@ -3062,7 +3062,7 @@
               <w:rPr>
                 <w:noProof/>
               </w:rPr>
-              <w:instrText xml:space="preserve"> PAGEREF _Toc242618854 \h </w:instrText>
+              <w:instrText xml:space="preserve"> PAGEREF _Toc242620544 \h </w:instrText>
             </w:r>
             <w:r>
               <w:rPr>
@@ -3105,7 +3105,7 @@
               <w14:ligatures w14:val="standardContextual"/>
             </w:rPr>
           </w:pPr>
-          <w:hyperlink w:anchor="_Toc242618855" w:history="1">
+          <w:hyperlink w:anchor="_Toc242620545" w:history="1">
             <w:r>
               <w:rPr>
                 <w:rStyle w:val="Hyperlink"/>
@@ -3129,7 +3129,7 @@
               <w:rPr>
                 <w:noProof/>
               </w:rPr>
-              <w:instrText xml:space="preserve"> PAGEREF _Toc242618855 \h </w:instrText>
+              <w:instrText xml:space="preserve"> PAGEREF _Toc242620545 \h </w:instrText>
             </w:r>
             <w:r>
               <w:rPr>
@@ -3172,7 +3172,7 @@
               <w14:ligatures w14:val="standardContextual"/>
             </w:rPr>
           </w:pPr>
-          <w:hyperlink w:anchor="_Toc242618856" w:history="1">
+          <w:hyperlink w:anchor="_Toc242620546" w:history="1">
             <w:r>
               <w:rPr>
                 <w:rStyle w:val="Hyperlink"/>
@@ -3196,7 +3196,7 @@
               <w:rPr>
                 <w:noProof/>
               </w:rPr>
-              <w:instrText xml:space="preserve"> PAGEREF _Toc242618856 \h </w:instrText>
+              <w:instrText xml:space="preserve"> PAGEREF _Toc242620546 \h </w:instrText>
             </w:r>
             <w:r>
               <w:rPr>
@@ -3239,7 +3239,7 @@
               <w14:ligatures w14:val="standardContextual"/>
             </w:rPr>
           </w:pPr>
-          <w:hyperlink w:anchor="_Toc242618857" w:history="1">
+          <w:hyperlink w:anchor="_Toc242620547" w:history="1">
             <w:r>
               <w:rPr>
                 <w:rStyle w:val="Hyperlink"/>
@@ -3263,7 +3263,7 @@
               <w:rPr>
                 <w:noProof/>
               </w:rPr>
-              <w:instrText xml:space="preserve"> PAGEREF _Toc242618857 \h </w:instrText>
+              <w:instrText xml:space="preserve"> PAGEREF _Toc242620547 \h </w:instrText>
             </w:r>
             <w:r>
               <w:rPr>
@@ -3306,7 +3306,7 @@
               <w14:ligatures w14:val="standardContextual"/>
             </w:rPr>
           </w:pPr>
-          <w:hyperlink w:anchor="_Toc242618858" w:history="1">
+          <w:hyperlink w:anchor="_Toc242620548" w:history="1">
             <w:r>
               <w:rPr>
                 <w:rStyle w:val="Hyperlink"/>
@@ -3330,7 +3330,7 @@
               <w:rPr>
                 <w:noProof/>
               </w:rPr>
-              <w:instrText xml:space="preserve"> PAGEREF _Toc242618858 \h </w:instrText>
+              <w:instrText xml:space="preserve"> PAGEREF _Toc242620548 \h </w:instrText>
             </w:r>
             <w:r>
               <w:rPr>
@@ -3373,7 +3373,7 @@
               <w14:ligatures w14:val="standardContextual"/>
             </w:rPr>
           </w:pPr>
-          <w:hyperlink w:anchor="_Toc242618859" w:history="1">
+          <w:hyperlink w:anchor="_Toc242620549" w:history="1">
             <w:r>
               <w:rPr>
                 <w:rStyle w:val="Hyperlink"/>
@@ -3397,7 +3397,7 @@
               <w:rPr>
                 <w:noProof/>
               </w:rPr>
-              <w:instrText xml:space="preserve"> PAGEREF _Toc242618859 \h </w:instrText>
+              <w:instrText xml:space="preserve"> PAGEREF _Toc242620549 \h </w:instrText>
             </w:r>
             <w:r>
               <w:rPr>
@@ -3440,7 +3440,7 @@
               <w14:ligatures w14:val="standardContextual"/>
             </w:rPr>
           </w:pPr>
-          <w:hyperlink w:anchor="_Toc242618860" w:history="1">
+          <w:hyperlink w:anchor="_Toc242620550" w:history="1">
             <w:r>
               <w:rPr>
                 <w:rStyle w:val="Hyperlink"/>
@@ -3464,7 +3464,7 @@
               <w:rPr>
                 <w:noProof/>
               </w:rPr>
-              <w:instrText xml:space="preserve"> PAGEREF _Toc242618860 \h </w:instrText>
+              <w:instrText xml:space="preserve"> PAGEREF _Toc242620550 \h </w:instrText>
             </w:r>
             <w:r>
               <w:rPr>
@@ -3507,7 +3507,7 @@
               <w14:ligatures w14:val="standardContextual"/>
             </w:rPr>
           </w:pPr>
-          <w:hyperlink w:anchor="_Toc242618861" w:history="1">
+          <w:hyperlink w:anchor="_Toc242620551" w:history="1">
             <w:r>
               <w:rPr>
                 <w:rStyle w:val="Hyperlink"/>
@@ -3531,7 +3531,7 @@
               <w:rPr>
                 <w:noProof/>
               </w:rPr>
-              <w:instrText xml:space="preserve"> PAGEREF _Toc242618861 \h </w:instrText>
+              <w:instrText xml:space="preserve"> PAGEREF _Toc242620551 \h </w:instrText>
             </w:r>
             <w:r>
               <w:rPr>
@@ -3574,7 +3574,7 @@
               <w14:ligatures w14:val="standardContextual"/>
             </w:rPr>
           </w:pPr>
-          <w:hyperlink w:anchor="_Toc242618862" w:history="1">
+          <w:hyperlink w:anchor="_Toc242620552" w:history="1">
             <w:r>
               <w:rPr>
                 <w:rStyle w:val="Hyperlink"/>
@@ -3598,7 +3598,7 @@
               <w:rPr>
                 <w:noProof/>
               </w:rPr>
-              <w:instrText xml:space="preserve"> PAGEREF _Toc242618862 \h </w:instrText>
+              <w:instrText xml:space="preserve"> PAGEREF _Toc242620552 \h </w:instrText>
             </w:r>
             <w:r>
               <w:rPr>
@@ -3641,7 +3641,7 @@
               <w14:ligatures w14:val="standardContextual"/>
             </w:rPr>
           </w:pPr>
-          <w:hyperlink w:anchor="_Toc242618863" w:history="1">
+          <w:hyperlink w:anchor="_Toc242620553" w:history="1">
             <w:r>
               <w:rPr>
                 <w:rStyle w:val="Hyperlink"/>
@@ -3665,7 +3665,7 @@
               <w:rPr>
                 <w:noProof/>
               </w:rPr>
-              <w:instrText xml:space="preserve"> PAGEREF _Toc242618863 \h </w:instrText>
+              <w:instrText xml:space="preserve"> PAGEREF _Toc242620553 \h </w:instrText>
             </w:r>
             <w:r>
               <w:rPr>
@@ -3708,7 +3708,7 @@
               <w14:ligatures w14:val="standardContextual"/>
             </w:rPr>
           </w:pPr>
-          <w:hyperlink w:anchor="_Toc242618864" w:history="1">
+          <w:hyperlink w:anchor="_Toc242620554" w:history="1">
             <w:r>
               <w:rPr>
                 <w:rStyle w:val="Hyperlink"/>
@@ -3732,7 +3732,7 @@
               <w:rPr>
                 <w:noProof/>
               </w:rPr>
-              <w:instrText xml:space="preserve"> PAGEREF _Toc242618864 \h </w:instrText>
+              <w:instrText xml:space="preserve"> PAGEREF _Toc242620554 \h </w:instrText>
             </w:r>
             <w:r>
               <w:rPr>
@@ -3775,7 +3775,7 @@
               <w14:ligatures w14:val="standardContextual"/>
             </w:rPr>
           </w:pPr>
-          <w:hyperlink w:anchor="_Toc242618865" w:history="1">
+          <w:hyperlink w:anchor="_Toc242620555" w:history="1">
             <w:r>
               <w:rPr>
                 <w:rStyle w:val="Hyperlink"/>
@@ -3799,7 +3799,7 @@
               <w:rPr>
                 <w:noProof/>
               </w:rPr>
-              <w:instrText xml:space="preserve"> PAGEREF _Toc242618865 \h </w:instrText>
+              <w:instrText xml:space="preserve"> PAGEREF _Toc242620555 \h </w:instrText>
             </w:r>
             <w:r>
               <w:rPr>
@@ -3842,7 +3842,7 @@
               <w14:ligatures w14:val="standardContextual"/>
             </w:rPr>
           </w:pPr>
-          <w:hyperlink w:anchor="_Toc242618866" w:history="1">
+          <w:hyperlink w:anchor="_Toc242620556" w:history="1">
             <w:r>
               <w:rPr>
                 <w:rStyle w:val="Hyperlink"/>
@@ -3866,7 +3866,7 @@
               <w:rPr>
                 <w:noProof/>
               </w:rPr>
-              <w:instrText xml:space="preserve"> PAGEREF _Toc242618866 \h </w:instrText>
+              <w:instrText xml:space="preserve"> PAGEREF _Toc242620556 \h </w:instrText>
             </w:r>
             <w:r>
               <w:rPr>
@@ -3909,7 +3909,7 @@
               <w14:ligatures w14:val="standardContextual"/>
             </w:rPr>
           </w:pPr>
-          <w:hyperlink w:anchor="_Toc242618867" w:history="1">
+          <w:hyperlink w:anchor="_Toc242620557" w:history="1">
             <w:r>
               <w:rPr>
                 <w:rStyle w:val="Hyperlink"/>
@@ -3933,7 +3933,7 @@
               <w:rPr>
                 <w:noProof/>
               </w:rPr>
-              <w:instrText xml:space="preserve"> PAGEREF _Toc242618867 \h </w:instrText>
+              <w:instrText xml:space="preserve"> PAGEREF _Toc242620557 \h </w:instrText>
             </w:r>
             <w:r>
               <w:rPr>
@@ -3976,7 +3976,7 @@
               <w14:ligatures w14:val="standardContextual"/>
             </w:rPr>
           </w:pPr>
-          <w:hyperlink w:anchor="_Toc242618868" w:history="1">
+          <w:hyperlink w:anchor="_Toc242620558" w:history="1">
             <w:r>
               <w:rPr>
                 <w:rStyle w:val="Hyperlink"/>
@@ -4000,7 +4000,7 @@
               <w:rPr>
                 <w:noProof/>
               </w:rPr>
-              <w:instrText xml:space="preserve"> PAGEREF _Toc242618868 \h </w:instrText>
+              <w:instrText xml:space="preserve"> PAGEREF _Toc242620558 \h </w:instrText>
             </w:r>
             <w:r>
               <w:rPr>
@@ -4043,7 +4043,7 @@
               <w14:ligatures w14:val="standardContextual"/>
             </w:rPr>
           </w:pPr>
-          <w:hyperlink w:anchor="_Toc242618869" w:history="1">
+          <w:hyperlink w:anchor="_Toc242620559" w:history="1">
             <w:r>
               <w:rPr>
                 <w:rStyle w:val="Hyperlink"/>
@@ -4067,7 +4067,7 @@
               <w:rPr>
                 <w:noProof/>
               </w:rPr>
-              <w:instrText xml:space="preserve"> PAGEREF _Toc242618869 \h </w:instrText>
+              <w:instrText xml:space="preserve"> PAGEREF _Toc242620559 \h </w:instrText>
             </w:r>
             <w:r>
               <w:rPr>
@@ -4110,7 +4110,7 @@
               <w14:ligatures w14:val="standardContextual"/>
             </w:rPr>
           </w:pPr>
-          <w:hyperlink w:anchor="_Toc242618870" w:history="1">
+          <w:hyperlink w:anchor="_Toc242620560" w:history="1">
             <w:r>
               <w:rPr>
                 <w:rStyle w:val="Hyperlink"/>
@@ -4134,7 +4134,7 @@
               <w:rPr>
                 <w:noProof/>
               </w:rPr>
-              <w:instrText xml:space="preserve"> PAGEREF _Toc242618870 \h </w:instrText>
+              <w:instrText xml:space="preserve"> PAGEREF _Toc242620560 \h </w:instrText>
             </w:r>
             <w:r>
               <w:rPr>
@@ -4177,7 +4177,7 @@
               <w14:ligatures w14:val="standardContextual"/>
             </w:rPr>
           </w:pPr>
-          <w:hyperlink w:anchor="_Toc242618871" w:history="1">
+          <w:hyperlink w:anchor="_Toc242620561" w:history="1">
             <w:r>
               <w:rPr>
                 <w:rStyle w:val="Hyperlink"/>
@@ -4201,7 +4201,7 @@
               <w:rPr>
                 <w:noProof/>
               </w:rPr>
-              <w:instrText xml:space="preserve"> PAGEREF _Toc242618871 \h </w:instrText>
+              <w:instrText xml:space="preserve"> PAGEREF _Toc242620561 \h </w:instrText>
             </w:r>
             <w:r>
               <w:rPr>
@@ -4244,7 +4244,7 @@
               <w14:ligatures w14:val="standardContextual"/>
             </w:rPr>
           </w:pPr>
-          <w:hyperlink w:anchor="_Toc242618872" w:history="1">
+          <w:hyperlink w:anchor="_Toc242620562" w:history="1">
             <w:r>
               <w:rPr>
                 <w:rStyle w:val="Hyperlink"/>
@@ -4268,7 +4268,7 @@
               <w:rPr>
                 <w:noProof/>
               </w:rPr>
-              <w:instrText xml:space="preserve"> PAGEREF _Toc242618872 \h </w:instrText>
+              <w:instrText xml:space="preserve"> PAGEREF _Toc242620562 \h </w:instrText>
             </w:r>
             <w:r>
               <w:rPr>
@@ -4311,7 +4311,7 @@
               <w14:ligatures w14:val="standardContextual"/>
             </w:rPr>
           </w:pPr>
-          <w:hyperlink w:anchor="_Toc242618873" w:history="1">
+          <w:hyperlink w:anchor="_Toc242620563" w:history="1">
             <w:r>
               <w:rPr>
                 <w:rStyle w:val="Hyperlink"/>
@@ -4335,7 +4335,7 @@
               <w:rPr>
                 <w:noProof/>
               </w:rPr>
-              <w:instrText xml:space="preserve"> PAGEREF _Toc242618873 \h </w:instrText>
+              <w:instrText xml:space="preserve"> PAGEREF _Toc242620563 \h </w:instrText>
             </w:r>
             <w:r>
               <w:rPr>
@@ -4378,7 +4378,7 @@
               <w14:ligatures w14:val="standardContextual"/>
             </w:rPr>
           </w:pPr>
-          <w:hyperlink w:anchor="_Toc242618874" w:history="1">
+          <w:hyperlink w:anchor="_Toc242620564" w:history="1">
             <w:r>
               <w:rPr>
                 <w:rStyle w:val="Hyperlink"/>
@@ -4402,7 +4402,7 @@
               <w:rPr>
                 <w:noProof/>
               </w:rPr>
-              <w:instrText xml:space="preserve"> PAGEREF _Toc242618874 \h </w:instrText>
+              <w:instrText xml:space="preserve"> PAGEREF _Toc242620564 \h </w:instrText>
             </w:r>
             <w:r>
               <w:rPr>
@@ -4445,7 +4445,7 @@
               <w14:ligatures w14:val="standardContextual"/>
             </w:rPr>
           </w:pPr>
-          <w:hyperlink w:anchor="_Toc242618875" w:history="1">
+          <w:hyperlink w:anchor="_Toc242620565" w:history="1">
             <w:r>
               <w:rPr>
                 <w:rStyle w:val="Hyperlink"/>
@@ -4469,7 +4469,7 @@
               <w:rPr>
                 <w:noProof/>
               </w:rPr>
-              <w:instrText xml:space="preserve"> PAGEREF _Toc242618875 \h </w:instrText>
+              <w:instrText xml:space="preserve"> PAGEREF _Toc242620565 \h </w:instrText>
             </w:r>
             <w:r>
               <w:rPr>
@@ -4512,7 +4512,7 @@
               <w14:ligatures w14:val="standardContextual"/>
             </w:rPr>
           </w:pPr>
-          <w:hyperlink w:anchor="_Toc242618876" w:history="1">
+          <w:hyperlink w:anchor="_Toc242620566" w:history="1">
             <w:r>
               <w:rPr>
                 <w:rStyle w:val="Hyperlink"/>
@@ -4536,7 +4536,7 @@
               <w:rPr>
                 <w:noProof/>
               </w:rPr>
-              <w:instrText xml:space="preserve"> PAGEREF _Toc242618876 \h </w:instrText>
+              <w:instrText xml:space="preserve"> PAGEREF _Toc242620566 \h </w:instrText>
             </w:r>
             <w:r>
               <w:rPr>
@@ -4579,7 +4579,7 @@
               <w14:ligatures w14:val="standardContextual"/>
             </w:rPr>
           </w:pPr>
-          <w:hyperlink w:anchor="_Toc242618877" w:history="1">
+          <w:hyperlink w:anchor="_Toc242620567" w:history="1">
             <w:r>
               <w:rPr>
                 <w:rStyle w:val="Hyperlink"/>
@@ -4603,7 +4603,7 @@
               <w:rPr>
                 <w:noProof/>
               </w:rPr>
-              <w:instrText xml:space="preserve"> PAGEREF _Toc242618877 \h </w:instrText>
+              <w:instrText xml:space="preserve"> PAGEREF _Toc242620567 \h </w:instrText>
             </w:r>
             <w:r>
               <w:rPr>
@@ -4646,7 +4646,7 @@
               <w14:ligatures w14:val="standardContextual"/>
             </w:rPr>
           </w:pPr>
-          <w:hyperlink w:anchor="_Toc242618878" w:history="1">
+          <w:hyperlink w:anchor="_Toc242620568" w:history="1">
             <w:r>
               <w:rPr>
                 <w:rStyle w:val="Hyperlink"/>
@@ -4670,7 +4670,7 @@
               <w:rPr>
                 <w:noProof/>
               </w:rPr>
-              <w:instrText xml:space="preserve"> PAGEREF _Toc242618878 \h </w:instrText>
+              <w:instrText xml:space="preserve"> PAGEREF _Toc242620568 \h </w:instrText>
             </w:r>
             <w:r>
               <w:rPr>
@@ -4713,7 +4713,7 @@
               <w14:ligatures w14:val="standardContextual"/>
             </w:rPr>
           </w:pPr>
-          <w:hyperlink w:anchor="_Toc242618879" w:history="1">
+          <w:hyperlink w:anchor="_Toc242620569" w:history="1">
             <w:r>
               <w:rPr>
                 <w:rStyle w:val="Hyperlink"/>
@@ -4737,7 +4737,7 @@
               <w:rPr>
                 <w:noProof/>
               </w:rPr>
-              <w:instrText xml:space="preserve"> PAGEREF _Toc242618879 \h </w:instrText>
+              <w:instrText xml:space="preserve"> PAGEREF _Toc242620569 \h </w:instrText>
             </w:r>
             <w:r>
               <w:rPr>
@@ -4780,7 +4780,7 @@
               <w14:ligatures w14:val="standardContextual"/>
             </w:rPr>
           </w:pPr>
-          <w:hyperlink w:anchor="_Toc242618880" w:history="1">
+          <w:hyperlink w:anchor="_Toc242620570" w:history="1">
             <w:r>
               <w:rPr>
                 <w:rStyle w:val="Hyperlink"/>
@@ -4804,7 +4804,7 @@
               <w:rPr>
                 <w:noProof/>
               </w:rPr>
-              <w:instrText xml:space="preserve"> PAGEREF _Toc242618880 \h </w:instrText>
+              <w:instrText xml:space="preserve"> PAGEREF _Toc242620570 \h </w:instrText>
             </w:r>
             <w:r>
               <w:rPr>
@@ -4847,7 +4847,7 @@
               <w14:ligatures w14:val="standardContextual"/>
             </w:rPr>
           </w:pPr>
-          <w:hyperlink w:anchor="_Toc242618881" w:history="1">
+          <w:hyperlink w:anchor="_Toc242620571" w:history="1">
             <w:r>
               <w:rPr>
                 <w:rStyle w:val="Hyperlink"/>
@@ -4871,7 +4871,7 @@
               <w:rPr>
                 <w:noProof/>
               </w:rPr>
-              <w:instrText xml:space="preserve"> PAGEREF _Toc242618881 \h </w:instrText>
+              <w:instrText xml:space="preserve"> PAGEREF _Toc242620571 \h </w:instrText>
             </w:r>
             <w:r>
               <w:rPr>
@@ -4914,7 +4914,7 @@
               <w14:ligatures w14:val="standardContextual"/>
             </w:rPr>
           </w:pPr>
-          <w:hyperlink w:anchor="_Toc242618882" w:history="1">
+          <w:hyperlink w:anchor="_Toc242620572" w:history="1">
             <w:r>
               <w:rPr>
                 <w:rStyle w:val="Hyperlink"/>
@@ -4938,7 +4938,7 @@
               <w:rPr>
                 <w:noProof/>
               </w:rPr>
-              <w:instrText xml:space="preserve"> PAGEREF _Toc242618882 \h </w:instrText>
+              <w:instrText xml:space="preserve"> PAGEREF _Toc242620572 \h </w:instrText>
             </w:r>
             <w:r>
               <w:rPr>
@@ -4981,7 +4981,7 @@
               <w14:ligatures w14:val="standardContextual"/>
             </w:rPr>
           </w:pPr>
-          <w:hyperlink w:anchor="_Toc242618883" w:history="1">
+          <w:hyperlink w:anchor="_Toc242620573" w:history="1">
             <w:r>
               <w:rPr>
                 <w:rStyle w:val="Hyperlink"/>
@@ -5005,7 +5005,7 @@
               <w:rPr>
                 <w:noProof/>
               </w:rPr>
-              <w:instrText xml:space="preserve"> PAGEREF _Toc242618883 \h </w:instrText>
+              <w:instrText xml:space="preserve"> PAGEREF _Toc242620573 \h </w:instrText>
             </w:r>
             <w:r>
               <w:rPr>
@@ -5048,7 +5048,7 @@
               <w14:ligatures w14:val="standardContextual"/>
             </w:rPr>
           </w:pPr>
-          <w:hyperlink w:anchor="_Toc242618884" w:history="1">
+          <w:hyperlink w:anchor="_Toc242620574" w:history="1">
             <w:r>
               <w:rPr>
                 <w:rStyle w:val="Hyperlink"/>
@@ -5072,7 +5072,7 @@
               <w:rPr>
                 <w:noProof/>
               </w:rPr>
-              <w:instrText xml:space="preserve"> PAGEREF _Toc242618884 \h </w:instrText>
+              <w:instrText xml:space="preserve"> PAGEREF _Toc242620574 \h </w:instrText>
             </w:r>
             <w:r>
               <w:rPr>
@@ -5115,7 +5115,7 @@
               <w14:ligatures w14:val="standardContextual"/>
             </w:rPr>
           </w:pPr>
-          <w:hyperlink w:anchor="_Toc242618885" w:history="1">
+          <w:hyperlink w:anchor="_Toc242620575" w:history="1">
             <w:r>
               <w:rPr>
                 <w:rStyle w:val="Hyperlink"/>
@@ -5139,7 +5139,7 @@
               <w:rPr>
                 <w:noProof/>
               </w:rPr>
-              <w:instrText xml:space="preserve"> PAGEREF _Toc242618885 \h </w:instrText>
+              <w:instrText xml:space="preserve"> PAGEREF _Toc242620575 \h </w:instrText>
             </w:r>
             <w:r>
               <w:rPr>
@@ -5182,7 +5182,7 @@
               <w14:ligatures w14:val="standardContextual"/>
             </w:rPr>
           </w:pPr>
-          <w:hyperlink w:anchor="_Toc242618886" w:history="1">
+          <w:hyperlink w:anchor="_Toc242620576" w:history="1">
             <w:r>
               <w:rPr>
                 <w:rStyle w:val="Hyperlink"/>
@@ -5206,7 +5206,7 @@
               <w:rPr>
                 <w:noProof/>
               </w:rPr>
-              <w:instrText xml:space="preserve"> PAGEREF _Toc242618886 \h </w:instrText>
+              <w:instrText xml:space="preserve"> PAGEREF _Toc242620576 \h </w:instrText>
             </w:r>
             <w:r>
               <w:rPr>
@@ -5252,7 +5252,7 @@
     <w:sdt>
       <w:sdtPr>
         <w:alias w:val="Figures"/>
-        <w:id w:val="653955943"/>
+        <w:id w:val="1987505470"/>
       </w:sdtPr>
       <w:sdtEndPr/>
       <w:sdtContent>
@@ -5281,7 +5281,7 @@
           <w:r>
             <w:fldChar w:fldCharType="separate"/>
           </w:r>
-          <w:hyperlink w:anchor="_Toc242618887" w:history="1">
+          <w:hyperlink w:anchor="_Toc242620577" w:history="1">
             <w:r>
               <w:rPr>
                 <w:rStyle w:val="Hyperlink"/>
@@ -5305,7 +5305,7 @@
               <w:rPr>
                 <w:noProof/>
               </w:rPr>
-              <w:instrText xml:space="preserve"> PAGEREF _Toc242618887 \h </w:instrText>
+              <w:instrText xml:space="preserve"> PAGEREF _Toc242620577 \h </w:instrText>
             </w:r>
             <w:r>
               <w:rPr>
@@ -5348,7 +5348,7 @@
               <w14:ligatures w14:val="standardContextual"/>
             </w:rPr>
           </w:pPr>
-          <w:hyperlink w:anchor="_Toc242618888" w:history="1">
+          <w:hyperlink w:anchor="_Toc242620578" w:history="1">
             <w:r>
               <w:rPr>
                 <w:rStyle w:val="Hyperlink"/>
@@ -5372,7 +5372,7 @@
               <w:rPr>
                 <w:noProof/>
               </w:rPr>
-              <w:instrText xml:space="preserve"> PAGEREF _Toc242618888 \h </w:instrText>
+              <w:instrText xml:space="preserve"> PAGEREF _Toc242620578 \h </w:instrText>
             </w:r>
             <w:r>
               <w:rPr>
@@ -5415,7 +5415,7 @@
               <w14:ligatures w14:val="standardContextual"/>
             </w:rPr>
           </w:pPr>
-          <w:hyperlink w:anchor="_Toc242618889" w:history="1">
+          <w:hyperlink w:anchor="_Toc242620579" w:history="1">
             <w:r>
               <w:rPr>
                 <w:rStyle w:val="Hyperlink"/>
@@ -5439,7 +5439,7 @@
               <w:rPr>
                 <w:noProof/>
               </w:rPr>
-              <w:instrText xml:space="preserve"> PAGEREF _Toc242618889 \h </w:instrText>
+              <w:instrText xml:space="preserve"> PAGEREF _Toc242620579 \h </w:instrText>
             </w:r>
             <w:r>
               <w:rPr>
@@ -5482,7 +5482,7 @@
               <w14:ligatures w14:val="standardContextual"/>
             </w:rPr>
           </w:pPr>
-          <w:hyperlink w:anchor="_Toc242618890" w:history="1">
+          <w:hyperlink w:anchor="_Toc242620580" w:history="1">
             <w:r>
               <w:rPr>
                 <w:rStyle w:val="Hyperlink"/>
@@ -5506,7 +5506,7 @@
               <w:rPr>
                 <w:noProof/>
               </w:rPr>
-              <w:instrText xml:space="preserve"> PAGEREF _Toc242618890 \h </w:instrText>
+              <w:instrText xml:space="preserve"> PAGEREF _Toc242620580 \h </w:instrText>
             </w:r>
             <w:r>
               <w:rPr>
@@ -5549,7 +5549,7 @@
               <w14:ligatures w14:val="standardContextual"/>
             </w:rPr>
           </w:pPr>
-          <w:hyperlink w:anchor="_Toc242618891" w:history="1">
+          <w:hyperlink w:anchor="_Toc242620581" w:history="1">
             <w:r>
               <w:rPr>
                 <w:rStyle w:val="Hyperlink"/>
@@ -5573,7 +5573,7 @@
               <w:rPr>
                 <w:noProof/>
               </w:rPr>
-              <w:instrText xml:space="preserve"> PAGEREF _Toc242618891 \h </w:instrText>
+              <w:instrText xml:space="preserve"> PAGEREF _Toc242620581 \h </w:instrText>
             </w:r>
             <w:r>
               <w:rPr>
@@ -5616,7 +5616,7 @@
               <w14:ligatures w14:val="standardContextual"/>
             </w:rPr>
           </w:pPr>
-          <w:hyperlink w:anchor="_Toc242618892" w:history="1">
+          <w:hyperlink w:anchor="_Toc242620582" w:history="1">
             <w:r>
               <w:rPr>
                 <w:rStyle w:val="Hyperlink"/>
@@ -5640,7 +5640,7 @@
               <w:rPr>
                 <w:noProof/>
               </w:rPr>
-              <w:instrText xml:space="preserve"> PAGEREF _Toc242618892 \h </w:instrText>
+              <w:instrText xml:space="preserve"> PAGEREF _Toc242620582 \h </w:instrText>
             </w:r>
             <w:r>
               <w:rPr>
@@ -5683,7 +5683,7 @@
               <w14:ligatures w14:val="standardContextual"/>
             </w:rPr>
           </w:pPr>
-          <w:hyperlink w:anchor="_Toc242618893" w:history="1">
+          <w:hyperlink w:anchor="_Toc242620583" w:history="1">
             <w:r>
               <w:rPr>
                 <w:rStyle w:val="Hyperlink"/>
@@ -5707,7 +5707,7 @@
               <w:rPr>
                 <w:noProof/>
               </w:rPr>
-              <w:instrText xml:space="preserve"> PAGEREF _Toc242618893 \h </w:instrText>
+              <w:instrText xml:space="preserve"> PAGEREF _Toc242620583 \h </w:instrText>
             </w:r>
             <w:r>
               <w:rPr>
@@ -5750,7 +5750,7 @@
               <w14:ligatures w14:val="standardContextual"/>
             </w:rPr>
           </w:pPr>
-          <w:hyperlink w:anchor="_Toc242618894" w:history="1">
+          <w:hyperlink w:anchor="_Toc242620584" w:history="1">
             <w:r>
               <w:rPr>
                 <w:rStyle w:val="Hyperlink"/>
@@ -5774,7 +5774,7 @@
               <w:rPr>
                 <w:noProof/>
               </w:rPr>
-              <w:instrText xml:space="preserve"> PAGEREF _Toc242618894 \h </w:instrText>
+              <w:instrText xml:space="preserve"> PAGEREF _Toc242620584 \h </w:instrText>
             </w:r>
             <w:r>
               <w:rPr>
@@ -5820,7 +5820,7 @@
     <w:sdt>
       <w:sdtPr>
         <w:alias w:val="Tables"/>
-        <w:id w:val="1035313996"/>
+        <w:id w:val="-1059389238"/>
       </w:sdtPr>
       <w:sdtEndPr/>
       <w:sdtContent>
@@ -5849,7 +5849,7 @@
           <w:r>
             <w:fldChar w:fldCharType="separate"/>
           </w:r>
-          <w:hyperlink w:anchor="_Toc242618895" w:history="1">
+          <w:hyperlink w:anchor="_Toc242620585" w:history="1">
             <w:r>
               <w:rPr>
                 <w:rStyle w:val="Hyperlink"/>
@@ -5873,7 +5873,7 @@
               <w:rPr>
                 <w:noProof/>
               </w:rPr>
-              <w:instrText xml:space="preserve"> PAGEREF _Toc242618895 \h </w:instrText>
+              <w:instrText xml:space="preserve"> PAGEREF _Toc242620585 \h </w:instrText>
             </w:r>
             <w:r>
               <w:rPr>
@@ -5916,7 +5916,7 @@
               <w14:ligatures w14:val="standardContextual"/>
             </w:rPr>
           </w:pPr>
-          <w:hyperlink w:anchor="_Toc242618896" w:history="1">
+          <w:hyperlink w:anchor="_Toc242620586" w:history="1">
             <w:r>
               <w:rPr>
                 <w:rStyle w:val="Hyperlink"/>
@@ -5940,7 +5940,7 @@
               <w:rPr>
                 <w:noProof/>
               </w:rPr>
-              <w:instrText xml:space="preserve"> PAGEREF _Toc242618896 \h </w:instrText>
+              <w:instrText xml:space="preserve"> PAGEREF _Toc242620586 \h </w:instrText>
             </w:r>
             <w:r>
               <w:rPr>
@@ -5983,7 +5983,7 @@
               <w14:ligatures w14:val="standardContextual"/>
             </w:rPr>
           </w:pPr>
-          <w:hyperlink w:anchor="_Toc242618897" w:history="1">
+          <w:hyperlink w:anchor="_Toc242620587" w:history="1">
             <w:r>
               <w:rPr>
                 <w:rStyle w:val="Hyperlink"/>
@@ -6007,7 +6007,7 @@
               <w:rPr>
                 <w:noProof/>
               </w:rPr>
-              <w:instrText xml:space="preserve"> PAGEREF _Toc242618897 \h </w:instrText>
+              <w:instrText xml:space="preserve"> PAGEREF _Toc242620587 \h </w:instrText>
             </w:r>
             <w:r>
               <w:rPr>
@@ -6050,7 +6050,7 @@
               <w14:ligatures w14:val="standardContextual"/>
             </w:rPr>
           </w:pPr>
-          <w:hyperlink w:anchor="_Toc242618898" w:history="1">
+          <w:hyperlink w:anchor="_Toc242620588" w:history="1">
             <w:r>
               <w:rPr>
                 <w:rStyle w:val="Hyperlink"/>
@@ -6074,7 +6074,7 @@
               <w:rPr>
                 <w:noProof/>
               </w:rPr>
-              <w:instrText xml:space="preserve"> PAGEREF _Toc242618898 \h </w:instrText>
+              <w:instrText xml:space="preserve"> PAGEREF _Toc242620588 \h </w:instrText>
             </w:r>
             <w:r>
               <w:rPr>
@@ -6117,7 +6117,7 @@
               <w14:ligatures w14:val="standardContextual"/>
             </w:rPr>
           </w:pPr>
-          <w:hyperlink w:anchor="_Toc242618899" w:history="1">
+          <w:hyperlink w:anchor="_Toc242620589" w:history="1">
             <w:r>
               <w:rPr>
                 <w:rStyle w:val="Hyperlink"/>
@@ -6141,7 +6141,7 @@
               <w:rPr>
                 <w:noProof/>
               </w:rPr>
-              <w:instrText xml:space="preserve"> PAGEREF _Toc242618899 \h </w:instrText>
+              <w:instrText xml:space="preserve"> PAGEREF _Toc242620589 \h </w:instrText>
             </w:r>
             <w:r>
               <w:rPr>
@@ -6184,7 +6184,7 @@
               <w14:ligatures w14:val="standardContextual"/>
             </w:rPr>
           </w:pPr>
-          <w:hyperlink w:anchor="_Toc242618900" w:history="1">
+          <w:hyperlink w:anchor="_Toc242620590" w:history="1">
             <w:r>
               <w:rPr>
                 <w:rStyle w:val="Hyperlink"/>
@@ -6208,7 +6208,7 @@
               <w:rPr>
                 <w:noProof/>
               </w:rPr>
-              <w:instrText xml:space="preserve"> PAGEREF _Toc242618900 \h </w:instrText>
+              <w:instrText xml:space="preserve"> PAGEREF _Toc242620590 \h </w:instrText>
             </w:r>
             <w:r>
               <w:rPr>
@@ -6251,7 +6251,7 @@
               <w14:ligatures w14:val="standardContextual"/>
             </w:rPr>
           </w:pPr>
-          <w:hyperlink w:anchor="_Toc242618901" w:history="1">
+          <w:hyperlink w:anchor="_Toc242620591" w:history="1">
             <w:r>
               <w:rPr>
                 <w:rStyle w:val="Hyperlink"/>
@@ -6275,7 +6275,7 @@
               <w:rPr>
                 <w:noProof/>
               </w:rPr>
-              <w:instrText xml:space="preserve"> PAGEREF _Toc242618901 \h </w:instrText>
+              <w:instrText xml:space="preserve"> PAGEREF _Toc242620591 \h </w:instrText>
             </w:r>
             <w:r>
               <w:rPr>
@@ -6318,7 +6318,7 @@
               <w14:ligatures w14:val="standardContextual"/>
             </w:rPr>
           </w:pPr>
-          <w:hyperlink w:anchor="_Toc242618902" w:history="1">
+          <w:hyperlink w:anchor="_Toc242620592" w:history="1">
             <w:r>
               <w:rPr>
                 <w:rStyle w:val="Hyperlink"/>
@@ -6342,7 +6342,7 @@
               <w:rPr>
                 <w:noProof/>
               </w:rPr>
-              <w:instrText xml:space="preserve"> PAGEREF _Toc242618902 \h </w:instrText>
+              <w:instrText xml:space="preserve"> PAGEREF _Toc242620592 \h </w:instrText>
             </w:r>
             <w:r>
               <w:rPr>
@@ -6385,7 +6385,7 @@
               <w14:ligatures w14:val="standardContextual"/>
             </w:rPr>
           </w:pPr>
-          <w:hyperlink w:anchor="_Toc242618903" w:history="1">
+          <w:hyperlink w:anchor="_Toc242620593" w:history="1">
             <w:r>
               <w:rPr>
                 <w:rStyle w:val="Hyperlink"/>
@@ -6409,7 +6409,7 @@
               <w:rPr>
                 <w:noProof/>
               </w:rPr>
-              <w:instrText xml:space="preserve"> PAGEREF _Toc242618903 \h </w:instrText>
+              <w:instrText xml:space="preserve"> PAGEREF _Toc242620593 \h </w:instrText>
             </w:r>
             <w:r>
               <w:rPr>
@@ -6452,7 +6452,7 @@
               <w14:ligatures w14:val="standardContextual"/>
             </w:rPr>
           </w:pPr>
-          <w:hyperlink w:anchor="_Toc242618904" w:history="1">
+          <w:hyperlink w:anchor="_Toc242620594" w:history="1">
             <w:r>
               <w:rPr>
                 <w:rStyle w:val="Hyperlink"/>
@@ -6476,7 +6476,7 @@
               <w:rPr>
                 <w:noProof/>
               </w:rPr>
-              <w:instrText xml:space="preserve"> PAGEREF _Toc242618904 \h </w:instrText>
+              <w:instrText xml:space="preserve"> PAGEREF _Toc242620594 \h </w:instrText>
             </w:r>
             <w:r>
               <w:rPr>
@@ -6519,7 +6519,7 @@
               <w14:ligatures w14:val="standardContextual"/>
             </w:rPr>
           </w:pPr>
-          <w:hyperlink w:anchor="_Toc242618905" w:history="1">
+          <w:hyperlink w:anchor="_Toc242620595" w:history="1">
             <w:r>
               <w:rPr>
                 <w:rStyle w:val="Hyperlink"/>
@@ -6543,7 +6543,7 @@
               <w:rPr>
                 <w:noProof/>
               </w:rPr>
-              <w:instrText xml:space="preserve"> PAGEREF _Toc242618905 \h </w:instrText>
+              <w:instrText xml:space="preserve"> PAGEREF _Toc242620595 \h </w:instrText>
             </w:r>
             <w:r>
               <w:rPr>
@@ -6586,7 +6586,7 @@
               <w14:ligatures w14:val="standardContextual"/>
             </w:rPr>
           </w:pPr>
-          <w:hyperlink w:anchor="_Toc242618906" w:history="1">
+          <w:hyperlink w:anchor="_Toc242620596" w:history="1">
             <w:r>
               <w:rPr>
                 <w:rStyle w:val="Hyperlink"/>
@@ -6610,7 +6610,7 @@
               <w:rPr>
                 <w:noProof/>
               </w:rPr>
-              <w:instrText xml:space="preserve"> PAGEREF _Toc242618906 \h </w:instrText>
+              <w:instrText xml:space="preserve"> PAGEREF _Toc242620596 \h </w:instrText>
             </w:r>
             <w:r>
               <w:rPr>
@@ -6653,7 +6653,7 @@
               <w14:ligatures w14:val="standardContextual"/>
             </w:rPr>
           </w:pPr>
-          <w:hyperlink w:anchor="_Toc242618907" w:history="1">
+          <w:hyperlink w:anchor="_Toc242620597" w:history="1">
             <w:r>
               <w:rPr>
                 <w:rStyle w:val="Hyperlink"/>
@@ -6677,7 +6677,7 @@
               <w:rPr>
                 <w:noProof/>
               </w:rPr>
-              <w:instrText xml:space="preserve"> PAGEREF _Toc242618907 \h </w:instrText>
+              <w:instrText xml:space="preserve"> PAGEREF _Toc242620597 \h </w:instrText>
             </w:r>
             <w:r>
               <w:rPr>
@@ -6720,7 +6720,7 @@
               <w14:ligatures w14:val="standardContextual"/>
             </w:rPr>
           </w:pPr>
-          <w:hyperlink w:anchor="_Toc242618908" w:history="1">
+          <w:hyperlink w:anchor="_Toc242620598" w:history="1">
             <w:r>
               <w:rPr>
                 <w:rStyle w:val="Hyperlink"/>
@@ -6744,7 +6744,7 @@
               <w:rPr>
                 <w:noProof/>
               </w:rPr>
-              <w:instrText xml:space="preserve"> PAGEREF _Toc242618908 \h </w:instrText>
+              <w:instrText xml:space="preserve"> PAGEREF _Toc242620598 \h </w:instrText>
             </w:r>
             <w:r>
               <w:rPr>
@@ -6787,7 +6787,7 @@
               <w14:ligatures w14:val="standardContextual"/>
             </w:rPr>
           </w:pPr>
-          <w:hyperlink w:anchor="_Toc242618909" w:history="1">
+          <w:hyperlink w:anchor="_Toc242620599" w:history="1">
             <w:r>
               <w:rPr>
                 <w:rStyle w:val="Hyperlink"/>
@@ -6811,7 +6811,7 @@
               <w:rPr>
                 <w:noProof/>
               </w:rPr>
-              <w:instrText xml:space="preserve"> PAGEREF _Toc242618909 \h </w:instrText>
+              <w:instrText xml:space="preserve"> PAGEREF _Toc242620599 \h </w:instrText>
             </w:r>
             <w:r>
               <w:rPr>
@@ -6852,7 +6852,7 @@
         <w:keepLines/>
         <w:pageBreakBefore/>
       </w:pPr>
-      <w:bookmarkStart w:id="0" w:name="_Toc242618847"/>
+      <w:bookmarkStart w:id="0" w:name="_Toc242620537"/>
       <w:r>
         <w:lastRenderedPageBreak/>
         <w:t>1 Introduction</w:t>
@@ -6865,7 +6865,7 @@
         <w:keepNext/>
         <w:keepLines/>
       </w:pPr>
-      <w:bookmarkStart w:id="1" w:name="_Toc242618848"/>
+      <w:bookmarkStart w:id="1" w:name="_Toc242620538"/>
       <w:r>
         <w:t>1.1 Purpose</w:t>
       </w:r>
@@ -6915,7 +6915,7 @@
         <w:keepNext/>
         <w:keepLines/>
       </w:pPr>
-      <w:bookmarkStart w:id="2" w:name="_Toc242618849"/>
+      <w:bookmarkStart w:id="2" w:name="_Toc242620539"/>
       <w:r>
         <w:t>1.2 Scope</w:t>
       </w:r>
@@ -6948,7 +6948,7 @@
         <w:keepNext/>
         <w:keepLines/>
       </w:pPr>
-      <w:bookmarkStart w:id="3" w:name="_Toc242618850"/>
+      <w:bookmarkStart w:id="3" w:name="_Toc242620540"/>
       <w:r>
         <w:t>1.3 Intended audience</w:t>
       </w:r>
@@ -6968,7 +6968,7 @@
         <w:keepNext/>
         <w:keepLines/>
       </w:pPr>
-      <w:bookmarkStart w:id="4" w:name="_Toc242618851"/>
+      <w:bookmarkStart w:id="4" w:name="_Toc242620541"/>
       <w:r>
         <w:t>1.4 Relationship to other documents</w:t>
       </w:r>
@@ -6979,7 +6979,7 @@
         <w:pStyle w:val="Caption"/>
         <w:keepNext/>
       </w:pPr>
-      <w:bookmarkStart w:id="5" w:name="_Toc242618895"/>
+      <w:bookmarkStart w:id="5" w:name="_Toc242620585"/>
       <w:r>
         <w:t xml:space="preserve">Table </w:t>
       </w:r>
@@ -7021,7 +7021,7 @@
           <w:left w:w="10" w:type="dxa"/>
           <w:right w:w="10" w:type="dxa"/>
         </w:tblCellMar>
-        <w:tblLook w:val="04A0" w:firstRow="1" w:lastRow="0" w:firstColumn="1" w:lastColumn="0" w:noHBand="0" w:noVBand="1"/>
+        <w:tblLook w:val="0000" w:firstRow="0" w:lastRow="0" w:firstColumn="0" w:lastColumn="0" w:noHBand="0" w:noVBand="0"/>
       </w:tblPr>
       <w:tblGrid>
         <w:gridCol w:w="4819"/>
@@ -7498,7 +7498,7 @@
         <w:keepNext/>
         <w:keepLines/>
       </w:pPr>
-      <w:bookmarkStart w:id="6" w:name="_Toc242618852"/>
+      <w:bookmarkStart w:id="6" w:name="_Toc242620542"/>
       <w:r>
         <w:t>1.5 Notation</w:t>
       </w:r>
@@ -7632,7 +7632,7 @@
         <w:keepLines/>
         <w:pageBreakBefore/>
       </w:pPr>
-      <w:bookmarkStart w:id="7" w:name="_Toc242618853"/>
+      <w:bookmarkStart w:id="7" w:name="_Toc242620543"/>
       <w:r>
         <w:lastRenderedPageBreak/>
         <w:t>2 Conceptual model (EER)</w:t>
@@ -7645,7 +7645,7 @@
         <w:keepNext/>
         <w:keepLines/>
       </w:pPr>
-      <w:bookmarkStart w:id="8" w:name="_Toc242618854"/>
+      <w:bookmarkStart w:id="8" w:name="_Toc242620544"/>
       <w:r>
         <w:t>2.1 Offerings and cut-offs</w:t>
       </w:r>
@@ -7721,7 +7721,7 @@
         </w:rPr>
         <w:lastRenderedPageBreak/>
         <w:drawing>
-          <wp:inline distT="0" distB="0" distL="0" distR="0" wp14:anchorId="64C2DFEA" wp14:editId="64C2DFEB">
+          <wp:inline distT="0" distB="0" distL="0" distR="0" wp14:anchorId="29D5F42C" wp14:editId="29D5F42D">
             <wp:extent cx="6124575" cy="7553325"/>
             <wp:effectExtent l="0" t="0" r="0" b="0"/>
             <wp:docPr id="1" name="eer-offerings.png" descr="EER model of institutions, courses, offerings, intake years, selection groups and cut-offs" title="EER model of institutions, courses, offerings, intake years, selection groups and cut-offs"/>
@@ -7764,7 +7764,7 @@
       <w:pPr>
         <w:pStyle w:val="Caption"/>
       </w:pPr>
-      <w:bookmarkStart w:id="9" w:name="_Toc242618887"/>
+      <w:bookmarkStart w:id="9" w:name="_Toc242620577"/>
       <w:r>
         <w:t xml:space="preserve">Figure </w:t>
       </w:r>
@@ -7797,7 +7797,7 @@
         <w:keepNext/>
         <w:keepLines/>
       </w:pPr>
-      <w:bookmarkStart w:id="10" w:name="_Toc242618855"/>
+      <w:bookmarkStart w:id="10" w:name="_Toc242620545"/>
       <w:r>
         <w:t>2.2 Subjects and requirement rules</w:t>
       </w:r>
@@ -7833,7 +7833,7 @@
         </w:rPr>
         <w:lastRenderedPageBreak/>
         <w:drawing>
-          <wp:inline distT="0" distB="0" distL="0" distR="0" wp14:anchorId="64C2DFEC" wp14:editId="64C2DFED">
+          <wp:inline distT="0" distB="0" distL="0" distR="0" wp14:anchorId="29D5F42E" wp14:editId="29D5F42F">
             <wp:extent cx="6124575" cy="6067425"/>
             <wp:effectExtent l="0" t="0" r="0" b="0"/>
             <wp:docPr id="2" name="eer-rules.png" descr="EER model of streams, subjects and the recursive requirement-rule tree" title="EER model of streams, subjects and the recursive requirement-rule tree"/>
@@ -7876,7 +7876,7 @@
       <w:pPr>
         <w:pStyle w:val="Caption"/>
       </w:pPr>
-      <w:bookmarkStart w:id="11" w:name="_Toc242618888"/>
+      <w:bookmarkStart w:id="11" w:name="_Toc242620578"/>
       <w:r>
         <w:t xml:space="preserve">Figure </w:t>
       </w:r>
@@ -7909,7 +7909,7 @@
         <w:keepNext/>
         <w:keepLines/>
       </w:pPr>
-      <w:bookmarkStart w:id="12" w:name="_Toc242618856"/>
+      <w:bookmarkStart w:id="12" w:name="_Toc242620546"/>
       <w:r>
         <w:t>2.3 Provenance and trust</w:t>
       </w:r>
@@ -7945,7 +7945,7 @@
         </w:rPr>
         <w:lastRenderedPageBreak/>
         <w:drawing>
-          <wp:inline distT="0" distB="0" distL="0" distR="0" wp14:anchorId="64C2DFEE" wp14:editId="64C2DFEF">
+          <wp:inline distT="0" distB="0" distL="0" distR="0" wp14:anchorId="29D5F430" wp14:editId="29D5F431">
             <wp:extent cx="6124575" cy="4829175"/>
             <wp:effectExtent l="0" t="0" r="0" b="0"/>
             <wp:docPr id="3" name="eer-provenance.png" descr="EER model of cited facts, sources, revisions, AI extraction, review and mistake reports" title="EER model of cited facts, sources, revisions, AI extraction, review and mistake reports"/>
@@ -7988,7 +7988,7 @@
       <w:pPr>
         <w:pStyle w:val="Caption"/>
       </w:pPr>
-      <w:bookmarkStart w:id="13" w:name="_Toc242618889"/>
+      <w:bookmarkStart w:id="13" w:name="_Toc242620579"/>
       <w:r>
         <w:t xml:space="preserve">Figure </w:t>
       </w:r>
@@ -8021,7 +8021,7 @@
         <w:keepNext/>
         <w:keepLines/>
       </w:pPr>
-      <w:bookmarkStart w:id="14" w:name="_Toc242618857"/>
+      <w:bookmarkStart w:id="14" w:name="_Toc242620547"/>
       <w:r>
         <w:t>2.4 Journey and other routes</w:t>
       </w:r>
@@ -8038,7 +8038,7 @@
           <w:noProof/>
         </w:rPr>
         <w:drawing>
-          <wp:inline distT="0" distB="0" distL="0" distR="0" wp14:anchorId="64C2DFF0" wp14:editId="64C2DFF1">
+          <wp:inline distT="0" distB="0" distL="0" distR="0" wp14:anchorId="29D5F432" wp14:editId="29D5F433">
             <wp:extent cx="6124575" cy="2895600"/>
             <wp:effectExtent l="0" t="0" r="0" b="0"/>
             <wp:docPr id="4" name="eer-journey.png" descr="EER model of deadlines, push reminders and the specialisation of other routes" title="EER model of deadlines, push reminders and the specialisation of other routes"/>
@@ -8081,7 +8081,7 @@
       <w:pPr>
         <w:pStyle w:val="Caption"/>
       </w:pPr>
-      <w:bookmarkStart w:id="15" w:name="_Toc242618890"/>
+      <w:bookmarkStart w:id="15" w:name="_Toc242620580"/>
       <w:r>
         <w:t xml:space="preserve">Figure </w:t>
       </w:r>
@@ -8114,7 +8114,7 @@
         <w:keepNext/>
         <w:keepLines/>
       </w:pPr>
-      <w:bookmarkStart w:id="16" w:name="_Toc242618858"/>
+      <w:bookmarkStart w:id="16" w:name="_Toc242620548"/>
       <w:r>
         <w:lastRenderedPageBreak/>
         <w:t>2.5 Student accounts (CR-001)</w:t>
@@ -8156,7 +8156,7 @@
           <w:noProof/>
         </w:rPr>
         <w:drawing>
-          <wp:inline distT="0" distB="0" distL="0" distR="0" wp14:anchorId="64C2DFF2" wp14:editId="64C2DFF3">
+          <wp:inline distT="0" distB="0" distL="0" distR="0" wp14:anchorId="29D5F434" wp14:editId="29D5F435">
             <wp:extent cx="6124575" cy="2857500"/>
             <wp:effectExtent l="0" t="0" r="0" b="0"/>
             <wp:docPr id="5" name="eer-accounts.png" descr="EER model of optional student accounts: sign-in, sessions, recovery and the student's results" title="EER model of optional student accounts: sign-in, sessions, recovery and the student's results"/>
@@ -8199,7 +8199,7 @@
       <w:pPr>
         <w:pStyle w:val="Caption"/>
       </w:pPr>
-      <w:bookmarkStart w:id="17" w:name="_Toc242618891"/>
+      <w:bookmarkStart w:id="17" w:name="_Toc242620581"/>
       <w:r>
         <w:t xml:space="preserve">Figure </w:t>
       </w:r>
@@ -8232,7 +8232,7 @@
         <w:keepNext/>
         <w:keepLines/>
       </w:pPr>
-      <w:bookmarkStart w:id="18" w:name="_Toc242618859"/>
+      <w:bookmarkStart w:id="18" w:name="_Toc242620549"/>
       <w:r>
         <w:t>2.6 Journey, Alerts and Groups (CR-002)</w:t>
       </w:r>
@@ -8268,7 +8268,7 @@
           <w:left w:w="10" w:type="dxa"/>
           <w:right w:w="10" w:type="dxa"/>
         </w:tblCellMar>
-        <w:tblLook w:val="04A0" w:firstRow="1" w:lastRow="0" w:firstColumn="1" w:lastColumn="0" w:noHBand="0" w:noVBand="1"/>
+        <w:tblLook w:val="0000" w:firstRow="0" w:lastRow="0" w:firstColumn="0" w:lastColumn="0" w:noHBand="0" w:noVBand="0"/>
       </w:tblPr>
       <w:tblGrid>
         <w:gridCol w:w="2877"/>
@@ -8968,7 +8968,7 @@
           <w:left w:w="10" w:type="dxa"/>
           <w:right w:w="10" w:type="dxa"/>
         </w:tblCellMar>
-        <w:tblLook w:val="04A0" w:firstRow="1" w:lastRow="0" w:firstColumn="1" w:lastColumn="0" w:noHBand="0" w:noVBand="1"/>
+        <w:tblLook w:val="0000" w:firstRow="0" w:lastRow="0" w:firstColumn="0" w:lastColumn="0" w:noHBand="0" w:noVBand="0"/>
       </w:tblPr>
       <w:tblGrid>
         <w:gridCol w:w="1588"/>
@@ -9810,7 +9810,7 @@
         <w:keepNext/>
         <w:keepLines/>
       </w:pPr>
-      <w:bookmarkStart w:id="19" w:name="_Toc242618860"/>
+      <w:bookmarkStart w:id="19" w:name="_Toc242620550"/>
       <w:r>
         <w:t>2.7 Contact details (CR-003)</w:t>
       </w:r>
@@ -9900,7 +9900,7 @@
           <w:left w:w="10" w:type="dxa"/>
           <w:right w:w="10" w:type="dxa"/>
         </w:tblCellMar>
-        <w:tblLook w:val="04A0" w:firstRow="1" w:lastRow="0" w:firstColumn="1" w:lastColumn="0" w:noHBand="0" w:noVBand="1"/>
+        <w:tblLook w:val="0000" w:firstRow="0" w:lastRow="0" w:firstColumn="0" w:lastColumn="0" w:noHBand="0" w:noVBand="0"/>
       </w:tblPr>
       <w:tblGrid>
         <w:gridCol w:w="3876"/>
@@ -10531,7 +10531,7 @@
         <w:keepNext/>
         <w:keepLines/>
       </w:pPr>
-      <w:bookmarkStart w:id="20" w:name="_Toc242618861"/>
+      <w:bookmarkStart w:id="20" w:name="_Toc242620551"/>
       <w:r>
         <w:t>2.8 Answer feedback (CR-004)</w:t>
       </w:r>
@@ -10602,7 +10602,7 @@
         <w:keepNext/>
         <w:keepLines/>
       </w:pPr>
-      <w:bookmarkStart w:id="21" w:name="_Toc242618862"/>
+      <w:bookmarkStart w:id="21" w:name="_Toc242620552"/>
       <w:r>
         <w:t>2.9 Group rules and sample conversations (CR-005)</w:t>
       </w:r>
@@ -10674,7 +10674,7 @@
         <w:t>Superseded by CR-006:</w:t>
       </w:r>
       <w:r>
-        <w:t xml:space="preserve"> acceptance moved from the membership to the account; </w:t>
+        <w:t xml:space="preserve"> acceptance moved from the membership to the account; migration 0010 carries </w:t>
       </w:r>
       <w:r>
         <w:rPr>
@@ -10686,7 +10686,7 @@
         <w:t>group_member.rules_version</w:t>
       </w:r>
       <w:r>
-        <w:t xml:space="preserve"> was carried over and dropped by migration 0010.</w:t>
+        <w:t xml:space="preserve"> over and leaves the column unused until a later migration drops it.</w:t>
       </w:r>
     </w:p>
     <w:p>
@@ -10728,10 +10728,7 @@
         <w:t>sample</w:t>
       </w:r>
       <w:r>
-        <w:t xml:space="preserve">, its author starts with "Sample", no badge says "verified", and its id is not a message id, so </w:t>
-      </w:r>
-      <w:r>
-        <w:t>it cannot be reported, blocked or mistaken for a member (trust rule: sample data is labelled as sample; pinned by tests).</w:t>
+        <w:t>, its author starts with "Sample", no badge says "verified", and its id is not a message id, so it cannot be reported, blocked or mistaken for a member (trust rule: sample data is labelled as sample; pinned by tests).</w:t>
       </w:r>
     </w:p>
     <w:p>
@@ -10740,7 +10737,7 @@
         <w:keepNext/>
         <w:keepLines/>
       </w:pPr>
-      <w:bookmarkStart w:id="22" w:name="_Toc242618863"/>
+      <w:bookmarkStart w:id="22" w:name="_Toc242620553"/>
       <w:r>
         <w:t>2.10 Journey, avatars and group rules on the account (CR-006)</w:t>
       </w:r>
@@ -10788,7 +10785,14 @@
           <w:b/>
           <w:bCs/>
         </w:rPr>
-        <w:t>only once its window is open</w:t>
+        <w:t xml:space="preserve">only once </w:t>
+      </w:r>
+      <w:r>
+        <w:rPr>
+          <w:b/>
+          <w:bCs/>
+        </w:rPr>
+        <w:t>its window is open</w:t>
       </w:r>
       <w:r>
         <w:t>, which the server checks. Migration 0010 implements the design below.</w:t>
@@ -10799,7 +10803,7 @@
         <w:pStyle w:val="Caption"/>
         <w:keepNext/>
       </w:pPr>
-      <w:bookmarkStart w:id="23" w:name="_Toc242618896"/>
+      <w:bookmarkStart w:id="23" w:name="_Toc242620586"/>
       <w:r>
         <w:lastRenderedPageBreak/>
         <w:t xml:space="preserve">Table </w:t>
@@ -10842,7 +10846,7 @@
           <w:left w:w="10" w:type="dxa"/>
           <w:right w:w="10" w:type="dxa"/>
         </w:tblCellMar>
-        <w:tblLook w:val="04A0" w:firstRow="1" w:lastRow="0" w:firstColumn="1" w:lastColumn="0" w:noHBand="0" w:noVBand="1"/>
+        <w:tblLook w:val="0000" w:firstRow="0" w:lastRow="0" w:firstColumn="0" w:lastColumn="0" w:noHBand="0" w:noVBand="0"/>
       </w:tblPr>
       <w:tblGrid>
         <w:gridCol w:w="2458"/>
@@ -12001,7 +12005,7 @@
         <w:t>group_rules_acceptance</w:t>
       </w:r>
       <w:r>
-        <w:t xml:space="preserve"> with the time of the account's first join, then </w:t>
+        <w:t xml:space="preserve"> with the time of the account's first join (tested on a copy of the database as it was before 0010). </w:t>
       </w:r>
       <w:r>
         <w:rPr>
@@ -12013,7 +12017,10 @@
         <w:t>group_member.rules_version</w:t>
       </w:r>
       <w:r>
-        <w:t xml:space="preserve"> is dropped (tested on a copy of the database as it was before 0010). No avatar means initials, as before. A new account's Journey is empty: nothing is ticked for the student. Journey items kept on a phone before CR-006 are copied to the account by the app on first use.</w:t>
+        <w:t xml:space="preserve"> is no longer read or written but is kept for now (expand, then contract): the previous release still writes it, so a </w:t>
+      </w:r>
+      <w:r>
+        <w:t>rollback stays safe; a later migration drops it once this release is stable. No avatar means initials, as before. A new account's Journey is empty: nothing is ticked for the student. Journey items kept on a phone before CR-006 are copied to the account by the app on first use.</w:t>
       </w:r>
     </w:p>
     <w:p>
@@ -12040,7 +12047,10 @@
         <w:t>student_contact</w:t>
       </w:r>
       <w:r>
-        <w:t>. Every new relation cascades on account deletion. In each group's room, a message keeps the author's avatar as it was when posted, a snapshot like the author name (a deliberate departure).</w:t>
+        <w:t xml:space="preserve">. Every new relation cascades on account deletion. In each group's room, a message </w:t>
+      </w:r>
+      <w:r>
+        <w:t>keeps the author's avatar as it was when posted, a snapshot like the author name (a deliberate departure).</w:t>
       </w:r>
     </w:p>
     <w:p>
@@ -12049,7 +12059,7 @@
         <w:keepNext/>
         <w:keepLines/>
       </w:pPr>
-      <w:bookmarkStart w:id="24" w:name="_Toc242618864"/>
+      <w:bookmarkStart w:id="24" w:name="_Toc242620554"/>
       <w:r>
         <w:t>2.11 Entity catalogue</w:t>
       </w:r>
@@ -12060,7 +12070,7 @@
         <w:pStyle w:val="Caption"/>
         <w:keepNext/>
       </w:pPr>
-      <w:bookmarkStart w:id="25" w:name="_Toc242618897"/>
+      <w:bookmarkStart w:id="25" w:name="_Toc242620587"/>
       <w:r>
         <w:t xml:space="preserve">Table </w:t>
       </w:r>
@@ -12102,7 +12112,7 @@
           <w:left w:w="10" w:type="dxa"/>
           <w:right w:w="10" w:type="dxa"/>
         </w:tblCellMar>
-        <w:tblLook w:val="04A0" w:firstRow="1" w:lastRow="0" w:firstColumn="1" w:lastColumn="0" w:noHBand="0" w:noVBand="1"/>
+        <w:tblLook w:val="0000" w:firstRow="0" w:lastRow="0" w:firstColumn="0" w:lastColumn="0" w:noHBand="0" w:noVBand="0"/>
       </w:tblPr>
       <w:tblGrid>
         <w:gridCol w:w="1965"/>
@@ -15329,7 +15339,7 @@
         <w:keepLines/>
         <w:pageBreakBefore/>
       </w:pPr>
-      <w:bookmarkStart w:id="26" w:name="_Toc242618865"/>
+      <w:bookmarkStart w:id="26" w:name="_Toc242620555"/>
       <w:r>
         <w:lastRenderedPageBreak/>
         <w:t>3 Rule grammar</w:t>
@@ -15371,7 +15381,7 @@
         <w:pStyle w:val="Caption"/>
         <w:keepNext/>
       </w:pPr>
-      <w:bookmarkStart w:id="27" w:name="_Toc242618898"/>
+      <w:bookmarkStart w:id="27" w:name="_Toc242620588"/>
       <w:r>
         <w:t xml:space="preserve">Table </w:t>
       </w:r>
@@ -15413,7 +15423,7 @@
           <w:left w:w="10" w:type="dxa"/>
           <w:right w:w="10" w:type="dxa"/>
         </w:tblCellMar>
-        <w:tblLook w:val="04A0" w:firstRow="1" w:lastRow="0" w:firstColumn="1" w:lastColumn="0" w:noHBand="0" w:noVBand="1"/>
+        <w:tblLook w:val="0000" w:firstRow="0" w:lastRow="0" w:firstColumn="0" w:lastColumn="0" w:noHBand="0" w:noVBand="0"/>
       </w:tblPr>
       <w:tblGrid>
         <w:gridCol w:w="1606"/>
@@ -16732,7 +16742,10 @@
         <w:spacing w:after="120"/>
       </w:pPr>
       <w:r>
-        <w:t>Example: Medicine (Uni-Code 001A) is ALL( SUBJECT Biology ≥ S, SUBJECT Chemistry ≥ S, SUBJECT Physics ≥ S, GRADE_COUNT 2 ≥ C of {Biology, Chemistry, Physics} ). Category splits with separate seats (pattern 14) are modelled as separate selection groups, each with its own rule tree.</w:t>
+        <w:t xml:space="preserve">Example: Medicine (Uni-Code 001A) is ALL( SUBJECT Biology ≥ S, SUBJECT Chemistry ≥ S, SUBJECT Physics ≥ S, </w:t>
+      </w:r>
+      <w:r>
+        <w:t>GRADE_COUNT 2 ≥ C of {Biology, Chemistry, Physics} ). Category splits with separate seats (pattern 14) are modelled as separate selection groups, each with its own rule tree.</w:t>
       </w:r>
     </w:p>
     <w:p>
@@ -16742,7 +16755,7 @@
         <w:keepLines/>
         <w:pageBreakBefore/>
       </w:pPr>
-      <w:bookmarkStart w:id="28" w:name="_Toc242618866"/>
+      <w:bookmarkStart w:id="28" w:name="_Toc242620556"/>
       <w:r>
         <w:lastRenderedPageBreak/>
         <w:t>4 Mapping the EER model to relations</w:t>
@@ -16762,7 +16775,7 @@
         <w:pStyle w:val="Caption"/>
         <w:keepNext/>
       </w:pPr>
-      <w:bookmarkStart w:id="29" w:name="_Toc242618899"/>
+      <w:bookmarkStart w:id="29" w:name="_Toc242620589"/>
       <w:r>
         <w:t xml:space="preserve">Table </w:t>
       </w:r>
@@ -16804,7 +16817,7 @@
           <w:left w:w="10" w:type="dxa"/>
           <w:right w:w="10" w:type="dxa"/>
         </w:tblCellMar>
-        <w:tblLook w:val="04A0" w:firstRow="1" w:lastRow="0" w:firstColumn="1" w:lastColumn="0" w:noHBand="0" w:noVBand="1"/>
+        <w:tblLook w:val="0000" w:firstRow="0" w:lastRow="0" w:firstColumn="0" w:lastColumn="0" w:noHBand="0" w:noVBand="0"/>
       </w:tblPr>
       <w:tblGrid>
         <w:gridCol w:w="649"/>
@@ -18553,7 +18566,7 @@
         <w:pStyle w:val="Caption"/>
         <w:keepNext/>
       </w:pPr>
-      <w:bookmarkStart w:id="30" w:name="_Toc242618900"/>
+      <w:bookmarkStart w:id="30" w:name="_Toc242620590"/>
       <w:r>
         <w:lastRenderedPageBreak/>
         <w:t xml:space="preserve">Table </w:t>
@@ -18596,7 +18609,7 @@
           <w:left w:w="10" w:type="dxa"/>
           <w:right w:w="10" w:type="dxa"/>
         </w:tblCellMar>
-        <w:tblLook w:val="04A0" w:firstRow="1" w:lastRow="0" w:firstColumn="1" w:lastColumn="0" w:noHBand="0" w:noVBand="1"/>
+        <w:tblLook w:val="0000" w:firstRow="0" w:lastRow="0" w:firstColumn="0" w:lastColumn="0" w:noHBand="0" w:noVBand="0"/>
       </w:tblPr>
       <w:tblGrid>
         <w:gridCol w:w="662"/>
@@ -19665,7 +19678,7 @@
         </w:rPr>
         <w:lastRenderedPageBreak/>
         <w:drawing>
-          <wp:inline distT="0" distB="0" distL="0" distR="0" wp14:anchorId="64C2DFF4" wp14:editId="64C2DFF5">
+          <wp:inline distT="0" distB="0" distL="0" distR="0" wp14:anchorId="29D5F436" wp14:editId="29D5F437">
             <wp:extent cx="6124575" cy="6562725"/>
             <wp:effectExtent l="0" t="0" r="0" b="0"/>
             <wp:docPr id="6" name="relational-admission.png" descr="Logical schema, admission data (generated from the migration file)" title="Logical schema, admission data (generated from the migration file)"/>
@@ -19708,7 +19721,7 @@
       <w:pPr>
         <w:pStyle w:val="Caption"/>
       </w:pPr>
-      <w:bookmarkStart w:id="31" w:name="_Toc242618892"/>
+      <w:bookmarkStart w:id="31" w:name="_Toc242620582"/>
       <w:r>
         <w:t xml:space="preserve">Figure </w:t>
       </w:r>
@@ -19747,7 +19760,7 @@
         </w:rPr>
         <w:lastRenderedPageBreak/>
         <w:drawing>
-          <wp:inline distT="0" distB="0" distL="0" distR="0" wp14:anchorId="64C2DFF6" wp14:editId="64C2DFF7">
+          <wp:inline distT="0" distB="0" distL="0" distR="0" wp14:anchorId="29D5F438" wp14:editId="29D5F439">
             <wp:extent cx="6124575" cy="5562600"/>
             <wp:effectExtent l="0" t="0" r="0" b="0"/>
             <wp:docPr id="7" name="relational-trust-journey.png" descr="Logical schema, trust, routes and journey data (generated from the migration file)" title="Logical schema, trust, routes and journey data (generated from the migration file)"/>
@@ -19790,7 +19803,7 @@
       <w:pPr>
         <w:pStyle w:val="Caption"/>
       </w:pPr>
-      <w:bookmarkStart w:id="32" w:name="_Toc242618893"/>
+      <w:bookmarkStart w:id="32" w:name="_Toc242620583"/>
       <w:r>
         <w:t xml:space="preserve">Figure </w:t>
       </w:r>
@@ -19828,7 +19841,7 @@
           <w:noProof/>
         </w:rPr>
         <w:drawing>
-          <wp:inline distT="0" distB="0" distL="0" distR="0" wp14:anchorId="64C2DFF8" wp14:editId="64C2DFF9">
+          <wp:inline distT="0" distB="0" distL="0" distR="0" wp14:anchorId="29D5F43A" wp14:editId="29D5F43B">
             <wp:extent cx="6124575" cy="2305050"/>
             <wp:effectExtent l="0" t="0" r="0" b="0"/>
             <wp:docPr id="8" name="relational-accounts.png" descr="Logical schema, optional student accounts (generated from the migration files)" title="Logical schema, optional student accounts (generated from the migration files)"/>
@@ -19871,7 +19884,7 @@
       <w:pPr>
         <w:pStyle w:val="Caption"/>
       </w:pPr>
-      <w:bookmarkStart w:id="33" w:name="_Toc242618894"/>
+      <w:bookmarkStart w:id="33" w:name="_Toc242620584"/>
       <w:r>
         <w:t xml:space="preserve">Figure </w:t>
       </w:r>
@@ -19905,13 +19918,10 @@
         <w:keepLines/>
         <w:pageBreakBefore/>
       </w:pPr>
-      <w:bookmarkStart w:id="34" w:name="_Toc242618867"/>
+      <w:bookmarkStart w:id="34" w:name="_Toc242620557"/>
       <w:r>
         <w:lastRenderedPageBreak/>
-        <w:t>5 </w:t>
-      </w:r>
-      <w:r>
-        <w:t>Normalisation</w:t>
+        <w:t>5 Normalisation</w:t>
       </w:r>
       <w:bookmarkEnd w:id="34"/>
     </w:p>
@@ -19921,7 +19931,7 @@
         <w:keepNext/>
         <w:keepLines/>
       </w:pPr>
-      <w:bookmarkStart w:id="35" w:name="_Toc242618868"/>
+      <w:bookmarkStart w:id="35" w:name="_Toc242620558"/>
       <w:r>
         <w:t>5.1 From the source form to 1NF</w:t>
       </w:r>
@@ -19977,7 +19987,7 @@
         <w:keepNext/>
         <w:keepLines/>
       </w:pPr>
-      <w:bookmarkStart w:id="36" w:name="_Toc242618869"/>
+      <w:bookmarkStart w:id="36" w:name="_Toc242620559"/>
       <w:r>
         <w:t>5.2 Functional and multi-valued dependencies</w:t>
       </w:r>
@@ -19988,7 +19998,7 @@
         <w:pStyle w:val="Caption"/>
         <w:keepNext/>
       </w:pPr>
-      <w:bookmarkStart w:id="37" w:name="_Toc242618901"/>
+      <w:bookmarkStart w:id="37" w:name="_Toc242620591"/>
       <w:r>
         <w:t xml:space="preserve">Table </w:t>
       </w:r>
@@ -20030,7 +20040,7 @@
           <w:left w:w="10" w:type="dxa"/>
           <w:right w:w="10" w:type="dxa"/>
         </w:tblCellMar>
-        <w:tblLook w:val="04A0" w:firstRow="1" w:lastRow="0" w:firstColumn="1" w:lastColumn="0" w:noHBand="0" w:noVBand="1"/>
+        <w:tblLook w:val="0000" w:firstRow="0" w:lastRow="0" w:firstColumn="0" w:lastColumn="0" w:noHBand="0" w:noVBand="0"/>
       </w:tblPr>
       <w:tblGrid>
         <w:gridCol w:w="684"/>
@@ -20887,7 +20897,7 @@
         <w:keepNext/>
         <w:keepLines/>
       </w:pPr>
-      <w:bookmarkStart w:id="38" w:name="_Toc242618870"/>
+      <w:bookmarkStart w:id="38" w:name="_Toc242620560"/>
       <w:r>
         <w:t>5.3 2NF, 3NF and BCNF</w:t>
       </w:r>
@@ -21130,7 +21140,7 @@
         <w:keepNext/>
         <w:keepLines/>
       </w:pPr>
-      <w:bookmarkStart w:id="39" w:name="_Toc242618871"/>
+      <w:bookmarkStart w:id="39" w:name="_Toc242620561"/>
       <w:r>
         <w:lastRenderedPageBreak/>
         <w:t>5.4 Deliberate departures</w:t>
@@ -21142,7 +21152,7 @@
         <w:pStyle w:val="Caption"/>
         <w:keepNext/>
       </w:pPr>
-      <w:bookmarkStart w:id="40" w:name="_Toc242618902"/>
+      <w:bookmarkStart w:id="40" w:name="_Toc242620592"/>
       <w:r>
         <w:t xml:space="preserve">Table </w:t>
       </w:r>
@@ -21184,7 +21194,7 @@
           <w:left w:w="10" w:type="dxa"/>
           <w:right w:w="10" w:type="dxa"/>
         </w:tblCellMar>
-        <w:tblLook w:val="04A0" w:firstRow="1" w:lastRow="0" w:firstColumn="1" w:lastColumn="0" w:noHBand="0" w:noVBand="1"/>
+        <w:tblLook w:val="0000" w:firstRow="0" w:lastRow="0" w:firstColumn="0" w:lastColumn="0" w:noHBand="0" w:noVBand="0"/>
       </w:tblPr>
       <w:tblGrid>
         <w:gridCol w:w="3213"/>
@@ -21913,7 +21923,7 @@
         <w:keepLines/>
         <w:pageBreakBefore/>
       </w:pPr>
-      <w:bookmarkStart w:id="41" w:name="_Toc242618872"/>
+      <w:bookmarkStart w:id="41" w:name="_Toc242620562"/>
       <w:r>
         <w:lastRenderedPageBreak/>
         <w:t>6 Physical design for Cloudflare D1</w:t>
@@ -21926,7 +21936,7 @@
         <w:keepNext/>
         <w:keepLines/>
       </w:pPr>
-      <w:bookmarkStart w:id="42" w:name="_Toc242618873"/>
+      <w:bookmarkStart w:id="42" w:name="_Toc242620563"/>
       <w:r>
         <w:t>6.1 Conventions</w:t>
       </w:r>
@@ -22165,7 +22175,7 @@
         <w:keepNext/>
         <w:keepLines/>
       </w:pPr>
-      <w:bookmarkStart w:id="43" w:name="_Toc242618874"/>
+      <w:bookmarkStart w:id="43" w:name="_Toc242620564"/>
       <w:r>
         <w:t>6.2 Indexes</w:t>
       </w:r>
@@ -22176,7 +22186,7 @@
         <w:pStyle w:val="Caption"/>
         <w:keepNext/>
       </w:pPr>
-      <w:bookmarkStart w:id="44" w:name="_Toc242618903"/>
+      <w:bookmarkStart w:id="44" w:name="_Toc242620593"/>
       <w:r>
         <w:t xml:space="preserve">Table </w:t>
       </w:r>
@@ -22218,7 +22228,7 @@
           <w:left w:w="10" w:type="dxa"/>
           <w:right w:w="10" w:type="dxa"/>
         </w:tblCellMar>
-        <w:tblLook w:val="04A0" w:firstRow="1" w:lastRow="0" w:firstColumn="1" w:lastColumn="0" w:noHBand="0" w:noVBand="1"/>
+        <w:tblLook w:val="0000" w:firstRow="0" w:lastRow="0" w:firstColumn="0" w:lastColumn="0" w:noHBand="0" w:noVBand="0"/>
       </w:tblPr>
       <w:tblGrid>
         <w:gridCol w:w="4819"/>
@@ -23175,7 +23185,7 @@
         <w:keepNext/>
         <w:keepLines/>
       </w:pPr>
-      <w:bookmarkStart w:id="45" w:name="_Toc242618875"/>
+      <w:bookmarkStart w:id="45" w:name="_Toc242620565"/>
       <w:r>
         <w:lastRenderedPageBreak/>
         <w:t>6.3 Capacity against the free plan</w:t>
@@ -23187,7 +23197,7 @@
         <w:pStyle w:val="Caption"/>
         <w:keepNext/>
       </w:pPr>
-      <w:bookmarkStart w:id="46" w:name="_Toc242618904"/>
+      <w:bookmarkStart w:id="46" w:name="_Toc242620594"/>
       <w:r>
         <w:t xml:space="preserve">Table </w:t>
       </w:r>
@@ -23229,7 +23239,7 @@
           <w:left w:w="10" w:type="dxa"/>
           <w:right w:w="10" w:type="dxa"/>
         </w:tblCellMar>
-        <w:tblLook w:val="04A0" w:firstRow="1" w:lastRow="0" w:firstColumn="1" w:lastColumn="0" w:noHBand="0" w:noVBand="1"/>
+        <w:tblLook w:val="0000" w:firstRow="0" w:lastRow="0" w:firstColumn="0" w:lastColumn="0" w:noHBand="0" w:noVBand="0"/>
       </w:tblPr>
       <w:tblGrid>
         <w:gridCol w:w="4211"/>
@@ -23874,7 +23884,7 @@
         <w:keepLines/>
         <w:pageBreakBefore/>
       </w:pPr>
-      <w:bookmarkStart w:id="47" w:name="_Toc242618876"/>
+      <w:bookmarkStart w:id="47" w:name="_Toc242620566"/>
       <w:r>
         <w:lastRenderedPageBreak/>
         <w:t>7 Validation against real data</w:t>
@@ -23909,7 +23919,7 @@
         <w:pStyle w:val="Caption"/>
         <w:keepNext/>
       </w:pPr>
-      <w:bookmarkStart w:id="48" w:name="_Toc242618905"/>
+      <w:bookmarkStart w:id="48" w:name="_Toc242620595"/>
       <w:r>
         <w:t xml:space="preserve">Table </w:t>
       </w:r>
@@ -23951,7 +23961,7 @@
           <w:left w:w="10" w:type="dxa"/>
           <w:right w:w="10" w:type="dxa"/>
         </w:tblCellMar>
-        <w:tblLook w:val="04A0" w:firstRow="1" w:lastRow="0" w:firstColumn="1" w:lastColumn="0" w:noHBand="0" w:noVBand="1"/>
+        <w:tblLook w:val="0000" w:firstRow="0" w:lastRow="0" w:firstColumn="0" w:lastColumn="0" w:noHBand="0" w:noVBand="0"/>
       </w:tblPr>
       <w:tblGrid>
         <w:gridCol w:w="6544"/>
@@ -25359,7 +25369,7 @@
         <w:pStyle w:val="Caption"/>
         <w:keepNext/>
       </w:pPr>
-      <w:bookmarkStart w:id="49" w:name="_Toc242618906"/>
+      <w:bookmarkStart w:id="49" w:name="_Toc242620596"/>
       <w:r>
         <w:t xml:space="preserve">Table </w:t>
       </w:r>
@@ -25401,7 +25411,7 @@
           <w:left w:w="10" w:type="dxa"/>
           <w:right w:w="10" w:type="dxa"/>
         </w:tblCellMar>
-        <w:tblLook w:val="04A0" w:firstRow="1" w:lastRow="0" w:firstColumn="1" w:lastColumn="0" w:noHBand="0" w:noVBand="1"/>
+        <w:tblLook w:val="0000" w:firstRow="0" w:lastRow="0" w:firstColumn="0" w:lastColumn="0" w:noHBand="0" w:noVBand="0"/>
       </w:tblPr>
       <w:tblGrid>
         <w:gridCol w:w="4819"/>
@@ -26101,7 +26111,7 @@
         <w:keepLines/>
         <w:pageBreakBefore/>
       </w:pPr>
-      <w:bookmarkStart w:id="50" w:name="_Toc242618877"/>
+      <w:bookmarkStart w:id="50" w:name="_Toc242620567"/>
       <w:r>
         <w:lastRenderedPageBreak/>
         <w:t>Appendix A: Traceability: requirements to tables</w:t>
@@ -26113,7 +26123,7 @@
         <w:pStyle w:val="Caption"/>
         <w:keepNext/>
       </w:pPr>
-      <w:bookmarkStart w:id="51" w:name="_Toc242618907"/>
+      <w:bookmarkStart w:id="51" w:name="_Toc242620597"/>
       <w:r>
         <w:t xml:space="preserve">Table </w:t>
       </w:r>
@@ -26155,7 +26165,7 @@
           <w:left w:w="10" w:type="dxa"/>
           <w:right w:w="10" w:type="dxa"/>
         </w:tblCellMar>
-        <w:tblLook w:val="04A0" w:firstRow="1" w:lastRow="0" w:firstColumn="1" w:lastColumn="0" w:noHBand="0" w:noVBand="1"/>
+        <w:tblLook w:val="0000" w:firstRow="0" w:lastRow="0" w:firstColumn="0" w:lastColumn="0" w:noHBand="0" w:noVBand="0"/>
       </w:tblPr>
       <w:tblGrid>
         <w:gridCol w:w="4819"/>
@@ -28170,7 +28180,7 @@
         <w:keepLines/>
         <w:pageBreakBefore/>
       </w:pPr>
-      <w:bookmarkStart w:id="52" w:name="_Toc242618878"/>
+      <w:bookmarkStart w:id="52" w:name="_Toc242620568"/>
       <w:r>
         <w:lastRenderedPageBreak/>
         <w:t>Appendix B: Physical schema (migration 0001)</w:t>
@@ -33383,7 +33393,7 @@
         <w:keepLines/>
         <w:pageBreakBefore/>
       </w:pPr>
-      <w:bookmarkStart w:id="53" w:name="_Toc242618879"/>
+      <w:bookmarkStart w:id="53" w:name="_Toc242620569"/>
       <w:r>
         <w:lastRenderedPageBreak/>
         <w:t>Appendix C: Student accounts (migration 0003)</w:t>
@@ -35116,7 +35126,7 @@
         <w:keepLines/>
         <w:pageBreakBefore/>
       </w:pPr>
-      <w:bookmarkStart w:id="54" w:name="_Toc242618880"/>
+      <w:bookmarkStart w:id="54" w:name="_Toc242620570"/>
       <w:r>
         <w:lastRenderedPageBreak/>
         <w:t>Appendix D: Contact details (migration 0007)</w:t>
@@ -35512,7 +35522,7 @@
         <w:keepLines/>
         <w:pageBreakBefore/>
       </w:pPr>
-      <w:bookmarkStart w:id="55" w:name="_Toc242618881"/>
+      <w:bookmarkStart w:id="55" w:name="_Toc242620571"/>
       <w:r>
         <w:lastRenderedPageBreak/>
         <w:t>Appendix E: Answer feedback (migration 0008)</w:t>
@@ -35823,7 +35833,7 @@
         <w:keepLines/>
         <w:pageBreakBefore/>
       </w:pPr>
-      <w:bookmarkStart w:id="56" w:name="_Toc242618882"/>
+      <w:bookmarkStart w:id="56" w:name="_Toc242620572"/>
       <w:r>
         <w:lastRenderedPageBreak/>
         <w:t>Appendix F: Journey, avatars and group rules on the account (migration 0010)</w:t>
@@ -40218,7 +40228,39 @@
           <w:szCs w:val="17"/>
         </w:rPr>
         <w:lastRenderedPageBreak/>
-        <w:t>-- Carry over what members already accepted under 0009, at the time they first joined, then drop the per-membership copy.</w:t>
+        <w:t>-- Carry over what members already accepted under 0009, at the time they first joined. group_member.rules_version is no</w:t>
+      </w:r>
+    </w:p>
+    <w:p>
+      <w:pPr>
+        <w:keepLines/>
+        <w:shd w:val="clear" w:color="auto" w:fill="F2F4F3"/>
+        <w:spacing w:line="240" w:lineRule="auto"/>
+        <w:ind w:left="113" w:right="113"/>
+      </w:pPr>
+      <w:r>
+        <w:rPr>
+          <w:rFonts w:ascii="Consolas" w:eastAsia="Consolas" w:hAnsi="Consolas" w:cs="Consolas"/>
+          <w:sz w:val="17"/>
+          <w:szCs w:val="17"/>
+        </w:rPr>
+        <w:t>-- longer read or written (expand, then contract): it stays until this release is stable, so a rollback to the previous</w:t>
+      </w:r>
+    </w:p>
+    <w:p>
+      <w:pPr>
+        <w:keepLines/>
+        <w:shd w:val="clear" w:color="auto" w:fill="F2F4F3"/>
+        <w:spacing w:line="240" w:lineRule="auto"/>
+        <w:ind w:left="113" w:right="113"/>
+      </w:pPr>
+      <w:r>
+        <w:rPr>
+          <w:rFonts w:ascii="Consolas" w:eastAsia="Consolas" w:hAnsi="Consolas" w:cs="Consolas"/>
+          <w:sz w:val="17"/>
+          <w:szCs w:val="17"/>
+        </w:rPr>
+        <w:t>-- version still works, and a later migration drops it.</w:t>
       </w:r>
     </w:p>
     <w:p>
@@ -40251,22 +40293,6 @@
           <w:szCs w:val="17"/>
         </w:rPr>
         <w:t xml:space="preserve">  SELECT account_id, rules_version, min(joined_at) FROM group_member WHERE rules_version IS NOT NULL GROUP BY account_id, rules_version;</w:t>
-      </w:r>
-    </w:p>
-    <w:p>
-      <w:pPr>
-        <w:keepLines/>
-        <w:shd w:val="clear" w:color="auto" w:fill="F2F4F3"/>
-        <w:spacing w:line="240" w:lineRule="auto"/>
-        <w:ind w:left="113" w:right="113"/>
-      </w:pPr>
-      <w:r>
-        <w:rPr>
-          <w:rFonts w:ascii="Consolas" w:eastAsia="Consolas" w:hAnsi="Consolas" w:cs="Consolas"/>
-          <w:sz w:val="17"/>
-          <w:szCs w:val="17"/>
-        </w:rPr>
-        <w:t>ALTER TABLE group_member DROP COLUMN rules_version;</w:t>
       </w:r>
     </w:p>
     <w:p>
@@ -40823,7 +40849,7 @@
         <w:keepLines/>
         <w:pageBreakBefore/>
       </w:pPr>
-      <w:bookmarkStart w:id="57" w:name="_Toc242618883"/>
+      <w:bookmarkStart w:id="57" w:name="_Toc242620573"/>
       <w:r>
         <w:lastRenderedPageBreak/>
         <w:t>Appendix G: Group rules (migration 0009)</w:t>
@@ -40964,7 +40990,7 @@
         <w:keepLines/>
         <w:pageBreakBefore/>
       </w:pPr>
-      <w:bookmarkStart w:id="58" w:name="_Toc242618884"/>
+      <w:bookmarkStart w:id="58" w:name="_Toc242620574"/>
       <w:r>
         <w:lastRenderedPageBreak/>
         <w:t>Appendix H: Groups (migration 0006)</w:t>
@@ -42217,7 +42243,7 @@
         <w:keepLines/>
         <w:pageBreakBefore/>
       </w:pPr>
-      <w:bookmarkStart w:id="59" w:name="_Toc242618885"/>
+      <w:bookmarkStart w:id="59" w:name="_Toc242620575"/>
       <w:r>
         <w:lastRenderedPageBreak/>
         <w:t>Appendix I: Glossary</w:t>
@@ -42229,7 +42255,7 @@
         <w:pStyle w:val="Caption"/>
         <w:keepNext/>
       </w:pPr>
-      <w:bookmarkStart w:id="60" w:name="_Toc242618908"/>
+      <w:bookmarkStart w:id="60" w:name="_Toc242620598"/>
       <w:r>
         <w:t xml:space="preserve">Table </w:t>
       </w:r>
@@ -42271,7 +42297,7 @@
           <w:left w:w="10" w:type="dxa"/>
           <w:right w:w="10" w:type="dxa"/>
         </w:tblCellMar>
-        <w:tblLook w:val="04A0" w:firstRow="1" w:lastRow="0" w:firstColumn="1" w:lastColumn="0" w:noHBand="0" w:noVBand="1"/>
+        <w:tblLook w:val="0000" w:firstRow="0" w:lastRow="0" w:firstColumn="0" w:lastColumn="0" w:noHBand="0" w:noVBand="0"/>
       </w:tblPr>
       <w:tblGrid>
         <w:gridCol w:w="2928"/>
@@ -42946,7 +42972,7 @@
         <w:keepLines/>
         <w:pageBreakBefore/>
       </w:pPr>
-      <w:bookmarkStart w:id="61" w:name="_Toc242618886"/>
+      <w:bookmarkStart w:id="61" w:name="_Toc242620576"/>
       <w:r>
         <w:lastRenderedPageBreak/>
         <w:t>Appendix J: References</w:t>
@@ -42958,7 +42984,7 @@
         <w:pStyle w:val="Caption"/>
         <w:keepNext/>
       </w:pPr>
-      <w:bookmarkStart w:id="62" w:name="_Toc242618909"/>
+      <w:bookmarkStart w:id="62" w:name="_Toc242620599"/>
       <w:r>
         <w:t xml:space="preserve">Table </w:t>
       </w:r>
@@ -43000,7 +43026,7 @@
           <w:left w:w="10" w:type="dxa"/>
           <w:right w:w="10" w:type="dxa"/>
         </w:tblCellMar>
-        <w:tblLook w:val="04A0" w:firstRow="1" w:lastRow="0" w:firstColumn="1" w:lastColumn="0" w:noHBand="0" w:noVBand="1"/>
+        <w:tblLook w:val="0000" w:firstRow="0" w:lastRow="0" w:firstColumn="0" w:lastColumn="0" w:noHBand="0" w:noVBand="0"/>
       </w:tblPr>
       <w:tblGrid>
         <w:gridCol w:w="803"/>
@@ -43889,10 +43915,10 @@
 <file path=word/numbering.xml><?xml version="1.0" encoding="utf-8"?>
 <w:numbering xmlns:wpc="http://schemas.microsoft.com/office/word/2010/wordprocessingCanvas" xmlns:cx="http://schemas.microsoft.com/office/drawing/2014/chartex" xmlns:cx1="http://schemas.microsoft.com/office/drawing/2015/9/8/chartex" xmlns:cx2="http://schemas.microsoft.com/office/drawing/2015/10/21/chartex" xmlns:cx3="http://schemas.microsoft.com/office/drawing/2016/5/9/chartex" xmlns:cx4="http://schemas.microsoft.com/office/drawing/2016/5/10/chartex" xmlns:cx5="http://schemas.microsoft.com/office/drawing/2016/5/11/chartex" xmlns:cx6="http://schemas.microsoft.com/office/drawing/2016/5/12/chartex" xmlns:cx7="http://schemas.microsoft.com/office/drawing/2016/5/13/chartex" xmlns:cx8="http://schemas.microsoft.com/office/drawing/2016/5/14/chartex" xmlns:mc="http://schemas.openxmlformats.org/markup-compatibility/2006" xmlns:aink="http://schemas.microsoft.com/office/drawing/2016/ink" xmlns:am3d="http://schemas.microsoft.com/office/drawing/2017/model3d" xmlns:o="urn:schemas-microsoft-com:office:office" xmlns:oel="http://schemas.microsoft.com/office/2019/extlst" xmlns:r="http://schemas.openxmlformats.org/officeDocument/2006/relationships" xmlns:m="http://schemas.openxmlformats.org/officeDocument/2006/math" xmlns:v="urn:schemas-microsoft-com:vml" xmlns:wp14="http://schemas.microsoft.com/office/word/2010/wordprocessingDrawing" xmlns:wp="http://schemas.openxmlformats.org/drawingml/2006/wordprocessingDrawing" xmlns:w10="urn:schemas-microsoft-com:office:word" xmlns:w="http://schemas.openxmlformats.org/wordprocessingml/2006/main" xmlns:w14="http://schemas.microsoft.com/office/word/2010/wordml" xmlns:w15="http://schemas.microsoft.com/office/word/2012/wordml" xmlns:w16cex="http://schemas.microsoft.com/office/word/2018/wordml/cex" xmlns:w16cid="http://schemas.microsoft.com/office/word/2016/wordml/cid" xmlns:w16="http://schemas.microsoft.com/office/word/2018/wordml" xmlns:w16du="http://schemas.microsoft.com/office/word/2023/wordml/word16du" xmlns:w16sdtdh="http://schemas.microsoft.com/office/word/2020/wordml/sdtdatahash" xmlns:w16sdtfl="http://schemas.microsoft.com/office/word/2024/wordml/sdtformatlock" xmlns:w16se="http://schemas.microsoft.com/office/word/2015/wordml/symex" xmlns:wpg="http://schemas.microsoft.com/office/word/2010/wordprocessingGroup" xmlns:wpi="http://schemas.microsoft.com/office/word/2010/wordprocessingInk" xmlns:wne="http://schemas.microsoft.com/office/word/2006/wordml" xmlns:wps="http://schemas.microsoft.com/office/word/2010/wordprocessingShape" mc:Ignorable="w14 w15 w16se w16cid w16 w16cex w16sdtdh w16sdtfl w16du wp14">
   <w:abstractNum w:abstractNumId="0" w15:restartNumberingAfterBreak="0">
-    <w:nsid w:val="22084FDF"/>
+    <w:nsid w:val="0EF800B3"/>
     <w:multiLevelType w:val="hybridMultilevel"/>
-    <w:tmpl w:val="3DE00E86"/>
-    <w:lvl w:ilvl="0" w:tplc="81484CC8" w:tentative="1">
+    <w:tmpl w:val="039CDDDA"/>
+    <w:lvl w:ilvl="0" w:tplc="B0065580" w:tentative="1">
       <w:start w:val="1"/>
       <w:numFmt w:val="bullet"/>
       <w:lvlText w:val="●"/>
@@ -43901,7 +43927,7 @@
         <w:ind w:left="720" w:hanging="360"/>
       </w:pPr>
     </w:lvl>
-    <w:lvl w:ilvl="1" w:tplc="E4BA3234" w:tentative="1">
+    <w:lvl w:ilvl="1" w:tplc="67A499DC" w:tentative="1">
       <w:start w:val="1"/>
       <w:numFmt w:val="bullet"/>
       <w:lvlText w:val="○"/>
@@ -43910,7 +43936,7 @@
         <w:ind w:left="1440" w:hanging="360"/>
       </w:pPr>
     </w:lvl>
-    <w:lvl w:ilvl="2" w:tplc="6FDCDB08" w:tentative="1">
+    <w:lvl w:ilvl="2" w:tplc="26C476C4" w:tentative="1">
       <w:start w:val="1"/>
       <w:numFmt w:val="bullet"/>
       <w:lvlText w:val="■"/>
@@ -43919,7 +43945,7 @@
         <w:ind w:left="2160" w:hanging="360"/>
       </w:pPr>
     </w:lvl>
-    <w:lvl w:ilvl="3" w:tplc="799A8298" w:tentative="1">
+    <w:lvl w:ilvl="3" w:tplc="D49018E0" w:tentative="1">
       <w:start w:val="1"/>
       <w:numFmt w:val="bullet"/>
       <w:lvlText w:val="●"/>
@@ -43928,7 +43954,7 @@
         <w:ind w:left="2880" w:hanging="360"/>
       </w:pPr>
     </w:lvl>
-    <w:lvl w:ilvl="4" w:tplc="7368F70A" w:tentative="1">
+    <w:lvl w:ilvl="4" w:tplc="B11E3E34" w:tentative="1">
       <w:start w:val="1"/>
       <w:numFmt w:val="bullet"/>
       <w:lvlText w:val="○"/>
@@ -43937,7 +43963,7 @@
         <w:ind w:left="3600" w:hanging="360"/>
       </w:pPr>
     </w:lvl>
-    <w:lvl w:ilvl="5" w:tplc="D8A8628A" w:tentative="1">
+    <w:lvl w:ilvl="5" w:tplc="B9906F0E" w:tentative="1">
       <w:start w:val="1"/>
       <w:numFmt w:val="bullet"/>
       <w:lvlText w:val="■"/>
@@ -43946,7 +43972,7 @@
         <w:ind w:left="4320" w:hanging="360"/>
       </w:pPr>
     </w:lvl>
-    <w:lvl w:ilvl="6" w:tplc="B7EE9DE0" w:tentative="1">
+    <w:lvl w:ilvl="6" w:tplc="E410B58E" w:tentative="1">
       <w:start w:val="1"/>
       <w:numFmt w:val="bullet"/>
       <w:lvlText w:val="●"/>
@@ -43955,7 +43981,7 @@
         <w:ind w:left="5040" w:hanging="360"/>
       </w:pPr>
     </w:lvl>
-    <w:lvl w:ilvl="7" w:tplc="02027FFA" w:tentative="1">
+    <w:lvl w:ilvl="7" w:tplc="A49EB4B4" w:tentative="1">
       <w:start w:val="1"/>
       <w:numFmt w:val="bullet"/>
       <w:lvlText w:val="●"/>
@@ -43964,7 +43990,7 @@
         <w:ind w:left="5760" w:hanging="360"/>
       </w:pPr>
     </w:lvl>
-    <w:lvl w:ilvl="8" w:tplc="1FDC84F4" w:tentative="1">
+    <w:lvl w:ilvl="8" w:tplc="140098C2" w:tentative="1">
       <w:start w:val="1"/>
       <w:numFmt w:val="bullet"/>
       <w:lvlText w:val="●"/>
@@ -43975,143 +44001,143 @@
     </w:lvl>
   </w:abstractNum>
   <w:abstractNum w:abstractNumId="1" w15:restartNumberingAfterBreak="0">
-    <w:nsid w:val="50977417"/>
+    <w:nsid w:val="1D5461A7"/>
     <w:multiLevelType w:val="hybridMultilevel"/>
-    <w:tmpl w:val="E9D05DE6"/>
-    <w:lvl w:ilvl="0" w:tplc="994EBE2C" w:tentative="1">
+    <w:tmpl w:val="43E03D80"/>
+    <w:lvl w:ilvl="0" w:tplc="EC88C0D0">
       <w:start w:val="1"/>
-      <w:numFmt w:val="decimal"/>
-      <w:lvlText w:val="%1."/>
+      <w:numFmt w:val="bullet"/>
+      <w:lvlText w:val="•"/>
       <w:lvlJc w:val="left"/>
       <w:pPr>
-        <w:ind w:left="720" w:hanging="360"/>
+        <w:ind w:left="720" w:hanging="280"/>
       </w:pPr>
     </w:lvl>
-    <w:lvl w:ilvl="1" w:tplc="39887326" w:tentative="1">
+    <w:lvl w:ilvl="1" w:tplc="9B3E243E" w:tentative="1">
       <w:start w:val="1"/>
-      <w:numFmt w:val="lowerLetter"/>
-      <w:lvlText w:val="%2."/>
+      <w:numFmt w:val="bullet"/>
+      <w:lvlText w:val="–"/>
       <w:lvlJc w:val="left"/>
       <w:pPr>
-        <w:ind w:left="1080" w:hanging="360"/>
+        <w:ind w:left="1080" w:hanging="280"/>
       </w:pPr>
     </w:lvl>
-    <w:lvl w:ilvl="2" w:tplc="1DB63CA2" w:tentative="1">
+    <w:lvl w:ilvl="2" w:tplc="A95A65C2" w:tentative="1">
       <w:start w:val="1"/>
-      <w:numFmt w:val="lowerRoman"/>
-      <w:lvlText w:val="%3."/>
+      <w:numFmt w:val="bullet"/>
+      <w:lvlText w:val="▪"/>
       <w:lvlJc w:val="left"/>
       <w:pPr>
-        <w:ind w:left="1440" w:hanging="360"/>
+        <w:ind w:left="1440" w:hanging="280"/>
       </w:pPr>
     </w:lvl>
-    <w:lvl w:ilvl="3" w:tplc="9B64ECB6">
+    <w:lvl w:ilvl="3" w:tplc="49A00066">
       <w:numFmt w:val="decimal"/>
       <w:lvlText w:val=""/>
       <w:lvlJc w:val="left"/>
     </w:lvl>
-    <w:lvl w:ilvl="4" w:tplc="BE3A41FC">
+    <w:lvl w:ilvl="4" w:tplc="9BD49BE2">
       <w:numFmt w:val="decimal"/>
       <w:lvlText w:val=""/>
       <w:lvlJc w:val="left"/>
     </w:lvl>
-    <w:lvl w:ilvl="5" w:tplc="CCEC21E4">
+    <w:lvl w:ilvl="5" w:tplc="B92C43C4">
       <w:numFmt w:val="decimal"/>
       <w:lvlText w:val=""/>
       <w:lvlJc w:val="left"/>
     </w:lvl>
-    <w:lvl w:ilvl="6" w:tplc="924CE726">
+    <w:lvl w:ilvl="6" w:tplc="2A1603FC">
       <w:numFmt w:val="decimal"/>
       <w:lvlText w:val=""/>
       <w:lvlJc w:val="left"/>
     </w:lvl>
-    <w:lvl w:ilvl="7" w:tplc="4F8065BA">
+    <w:lvl w:ilvl="7" w:tplc="242E70B0">
       <w:numFmt w:val="decimal"/>
       <w:lvlText w:val=""/>
       <w:lvlJc w:val="left"/>
     </w:lvl>
-    <w:lvl w:ilvl="8" w:tplc="2AFC80EC">
+    <w:lvl w:ilvl="8" w:tplc="9DB22652">
       <w:numFmt w:val="decimal"/>
       <w:lvlText w:val=""/>
       <w:lvlJc w:val="left"/>
     </w:lvl>
   </w:abstractNum>
   <w:abstractNum w:abstractNumId="2" w15:restartNumberingAfterBreak="0">
-    <w:nsid w:val="62580407"/>
+    <w:nsid w:val="64653211"/>
     <w:multiLevelType w:val="hybridMultilevel"/>
-    <w:tmpl w:val="6840E688"/>
-    <w:lvl w:ilvl="0" w:tplc="A4EECF02">
+    <w:tmpl w:val="E44262C8"/>
+    <w:lvl w:ilvl="0" w:tplc="F3408698" w:tentative="1">
       <w:start w:val="1"/>
-      <w:numFmt w:val="bullet"/>
-      <w:lvlText w:val="•"/>
+      <w:numFmt w:val="decimal"/>
+      <w:lvlText w:val="%1."/>
       <w:lvlJc w:val="left"/>
       <w:pPr>
-        <w:ind w:left="720" w:hanging="280"/>
+        <w:ind w:left="720" w:hanging="360"/>
       </w:pPr>
     </w:lvl>
-    <w:lvl w:ilvl="1" w:tplc="2692F6B2" w:tentative="1">
+    <w:lvl w:ilvl="1" w:tplc="D9AE7B8C" w:tentative="1">
       <w:start w:val="1"/>
-      <w:numFmt w:val="bullet"/>
-      <w:lvlText w:val="–"/>
+      <w:numFmt w:val="lowerLetter"/>
+      <w:lvlText w:val="%2."/>
       <w:lvlJc w:val="left"/>
       <w:pPr>
-        <w:ind w:left="1080" w:hanging="280"/>
+        <w:ind w:left="1080" w:hanging="360"/>
       </w:pPr>
     </w:lvl>
-    <w:lvl w:ilvl="2" w:tplc="8DD24C7E" w:tentative="1">
+    <w:lvl w:ilvl="2" w:tplc="4FE8E278" w:tentative="1">
       <w:start w:val="1"/>
-      <w:numFmt w:val="bullet"/>
-      <w:lvlText w:val="▪"/>
+      <w:numFmt w:val="lowerRoman"/>
+      <w:lvlText w:val="%3."/>
       <w:lvlJc w:val="left"/>
       <w:pPr>
-        <w:ind w:left="1440" w:hanging="280"/>
+        <w:ind w:left="1440" w:hanging="360"/>
       </w:pPr>
     </w:lvl>
-    <w:lvl w:ilvl="3" w:tplc="11986F4C">
+    <w:lvl w:ilvl="3" w:tplc="A28409A8">
       <w:numFmt w:val="decimal"/>
       <w:lvlText w:val=""/>
       <w:lvlJc w:val="left"/>
     </w:lvl>
-    <w:lvl w:ilvl="4" w:tplc="44A61CA4">
+    <w:lvl w:ilvl="4" w:tplc="E288344C">
       <w:numFmt w:val="decimal"/>
       <w:lvlText w:val=""/>
       <w:lvlJc w:val="left"/>
     </w:lvl>
-    <w:lvl w:ilvl="5" w:tplc="35B6D7BC">
+    <w:lvl w:ilvl="5" w:tplc="8F68FE5A">
       <w:numFmt w:val="decimal"/>
       <w:lvlText w:val=""/>
       <w:lvlJc w:val="left"/>
     </w:lvl>
-    <w:lvl w:ilvl="6" w:tplc="E78C6498">
+    <w:lvl w:ilvl="6" w:tplc="8350214E">
       <w:numFmt w:val="decimal"/>
       <w:lvlText w:val=""/>
       <w:lvlJc w:val="left"/>
     </w:lvl>
-    <w:lvl w:ilvl="7" w:tplc="B1A232E6">
+    <w:lvl w:ilvl="7" w:tplc="0A40819A">
       <w:numFmt w:val="decimal"/>
       <w:lvlText w:val=""/>
       <w:lvlJc w:val="left"/>
     </w:lvl>
-    <w:lvl w:ilvl="8" w:tplc="3250A276">
+    <w:lvl w:ilvl="8" w:tplc="8D440A4E">
       <w:numFmt w:val="decimal"/>
       <w:lvlText w:val=""/>
       <w:lvlJc w:val="left"/>
     </w:lvl>
   </w:abstractNum>
-  <w:num w:numId="1" w16cid:durableId="1585338153">
+  <w:num w:numId="1" w16cid:durableId="440105575">
     <w:abstractNumId w:val="0"/>
     <w:lvlOverride w:ilvl="0">
       <w:startOverride w:val="1"/>
     </w:lvlOverride>
   </w:num>
-  <w:num w:numId="2" w16cid:durableId="529956737">
-    <w:abstractNumId w:val="2"/>
+  <w:num w:numId="2" w16cid:durableId="462114056">
+    <w:abstractNumId w:val="1"/>
     <w:lvlOverride w:ilvl="0">
       <w:startOverride w:val="1"/>
     </w:lvlOverride>
   </w:num>
-  <w:num w:numId="3" w16cid:durableId="20202673">
-    <w:abstractNumId w:val="2"/>
+  <w:num w:numId="3" w16cid:durableId="705719556">
+    <w:abstractNumId w:val="1"/>
     <w:lvlOverride w:ilvl="0">
       <w:startOverride w:val="1"/>
     </w:lvlOverride>
@@ -44815,7 +44841,7 @@
     <w:autoRedefine/>
     <w:uiPriority w:val="39"/>
     <w:unhideWhenUsed/>
-    <w:rsid w:val="0021664F"/>
+    <w:rsid w:val="00E6688B"/>
     <w:pPr>
       <w:spacing w:after="100"/>
     </w:pPr>
@@ -44827,7 +44853,7 @@
     <w:autoRedefine/>
     <w:uiPriority w:val="39"/>
     <w:unhideWhenUsed/>
-    <w:rsid w:val="0021664F"/>
+    <w:rsid w:val="00E6688B"/>
     <w:pPr>
       <w:spacing w:after="100"/>
       <w:ind w:left="210"/>
@@ -44839,7 +44865,7 @@
     <w:next w:val="Normal"/>
     <w:uiPriority w:val="99"/>
     <w:unhideWhenUsed/>
-    <w:rsid w:val="0021664F"/>
+    <w:rsid w:val="00E6688B"/>
   </w:style>
 </w:styles>
 </file>

</xml_diff>

<commit_message>
CR-007 Try the demo: one tap on Welcome makes a private throwaway account with the sample student (ACCOUNT.demo_expires_at + partial index, migration 0011, deleted after 24 h on a later tap); demo accounts read groups but cannot create groups, report or post (server-enforced); malformed/null Origin now 403 instead of 500; ZP-DOC-05 updated; 9 tests
Co-Authored-By: Claude Opus 5.5 (1M context) <noreply@anthropic.com>
</commit_message>
<xml_diff>
--- a/docs/05-data-design/ZP-DOC-05_Data-Design.docx
+++ b/docs/05-data-design/ZP-DOC-05_Data-Design.docx
@@ -90,7 +90,7 @@
           <w:left w:w="10" w:type="dxa"/>
           <w:right w:w="10" w:type="dxa"/>
         </w:tblCellMar>
-        <w:tblLook w:val="0000" w:firstRow="0" w:lastRow="0" w:firstColumn="0" w:lastColumn="0" w:noHBand="0" w:noVBand="0"/>
+        <w:tblLook w:val="04A0" w:firstRow="1" w:lastRow="0" w:firstColumn="1" w:lastColumn="0" w:noHBand="0" w:noVBand="1"/>
       </w:tblPr>
       <w:tblGrid>
         <w:gridCol w:w="2600"/>
@@ -494,7 +494,7 @@
           <w:left w:w="10" w:type="dxa"/>
           <w:right w:w="10" w:type="dxa"/>
         </w:tblCellMar>
-        <w:tblLook w:val="0000" w:firstRow="0" w:lastRow="0" w:firstColumn="0" w:lastColumn="0" w:noHBand="0" w:noVBand="0"/>
+        <w:tblLook w:val="04A0" w:firstRow="1" w:lastRow="0" w:firstColumn="1" w:lastColumn="0" w:noHBand="0" w:noVBand="1"/>
       </w:tblPr>
       <w:tblGrid>
         <w:gridCol w:w="2600"/>
@@ -1189,7 +1189,7 @@
           <w:left w:w="10" w:type="dxa"/>
           <w:right w:w="10" w:type="dxa"/>
         </w:tblCellMar>
-        <w:tblLook w:val="0000" w:firstRow="0" w:lastRow="0" w:firstColumn="0" w:lastColumn="0" w:noHBand="0" w:noVBand="0"/>
+        <w:tblLook w:val="04A0" w:firstRow="1" w:lastRow="0" w:firstColumn="1" w:lastColumn="0" w:noHBand="0" w:noVBand="1"/>
       </w:tblPr>
       <w:tblGrid>
         <w:gridCol w:w="964"/>
@@ -2140,6 +2140,123 @@
           </w:p>
         </w:tc>
       </w:tr>
+      <w:tr>
+        <w:tblPrEx>
+          <w:tblCellMar>
+            <w:top w:w="0" w:type="dxa"/>
+            <w:bottom w:w="0" w:type="dxa"/>
+          </w:tblCellMar>
+        </w:tblPrEx>
+        <w:trPr>
+          <w:cantSplit/>
+          <w:trHeight w:val="420"/>
+        </w:trPr>
+        <w:tc>
+          <w:tcPr>
+            <w:tcW w:w="964" w:type="dxa"/>
+            <w:tcBorders>
+              <w:top w:val="single" w:sz="4" w:space="0" w:color="C9D3D0"/>
+              <w:left w:val="single" w:sz="4" w:space="0" w:color="C9D3D0"/>
+              <w:bottom w:val="single" w:sz="4" w:space="0" w:color="C9D3D0"/>
+              <w:right w:val="single" w:sz="4" w:space="0" w:color="C9D3D0"/>
+            </w:tcBorders>
+            <w:tcMar>
+              <w:top w:w="50" w:type="dxa"/>
+              <w:left w:w="100" w:type="dxa"/>
+              <w:bottom w:w="50" w:type="dxa"/>
+              <w:right w:w="100" w:type="dxa"/>
+            </w:tcMar>
+          </w:tcPr>
+          <w:p>
+            <w:r>
+              <w:rPr>
+                <w:sz w:val="19"/>
+                <w:szCs w:val="19"/>
+              </w:rPr>
+              <w:lastRenderedPageBreak/>
+              <w:t>0.9</w:t>
+            </w:r>
+          </w:p>
+        </w:tc>
+        <w:tc>
+          <w:tcPr>
+            <w:tcW w:w="1542" w:type="dxa"/>
+            <w:tcBorders>
+              <w:top w:val="single" w:sz="4" w:space="0" w:color="C9D3D0"/>
+              <w:left w:val="single" w:sz="4" w:space="0" w:color="C9D3D0"/>
+              <w:bottom w:val="single" w:sz="4" w:space="0" w:color="C9D3D0"/>
+              <w:right w:val="single" w:sz="4" w:space="0" w:color="C9D3D0"/>
+            </w:tcBorders>
+            <w:tcMar>
+              <w:top w:w="50" w:type="dxa"/>
+              <w:left w:w="100" w:type="dxa"/>
+              <w:bottom w:w="50" w:type="dxa"/>
+              <w:right w:w="100" w:type="dxa"/>
+            </w:tcMar>
+          </w:tcPr>
+          <w:p>
+            <w:r>
+              <w:rPr>
+                <w:sz w:val="19"/>
+                <w:szCs w:val="19"/>
+              </w:rPr>
+              <w:t>15 Oct 2026</w:t>
+            </w:r>
+          </w:p>
+        </w:tc>
+        <w:tc>
+          <w:tcPr>
+            <w:tcW w:w="1928" w:type="dxa"/>
+            <w:tcBorders>
+              <w:top w:val="single" w:sz="4" w:space="0" w:color="C9D3D0"/>
+              <w:left w:val="single" w:sz="4" w:space="0" w:color="C9D3D0"/>
+              <w:bottom w:val="single" w:sz="4" w:space="0" w:color="C9D3D0"/>
+              <w:right w:val="single" w:sz="4" w:space="0" w:color="C9D3D0"/>
+            </w:tcBorders>
+            <w:tcMar>
+              <w:top w:w="50" w:type="dxa"/>
+              <w:left w:w="100" w:type="dxa"/>
+              <w:bottom w:w="50" w:type="dxa"/>
+              <w:right w:w="100" w:type="dxa"/>
+            </w:tcMar>
+          </w:tcPr>
+          <w:p>
+            <w:r>
+              <w:rPr>
+                <w:sz w:val="19"/>
+                <w:szCs w:val="19"/>
+              </w:rPr>
+              <w:t>Team Kestrel</w:t>
+            </w:r>
+          </w:p>
+        </w:tc>
+        <w:tc>
+          <w:tcPr>
+            <w:tcW w:w="5204" w:type="dxa"/>
+            <w:tcBorders>
+              <w:top w:val="single" w:sz="4" w:space="0" w:color="C9D3D0"/>
+              <w:left w:val="single" w:sz="4" w:space="0" w:color="C9D3D0"/>
+              <w:bottom w:val="single" w:sz="4" w:space="0" w:color="C9D3D0"/>
+              <w:right w:val="single" w:sz="4" w:space="0" w:color="C9D3D0"/>
+            </w:tcBorders>
+            <w:tcMar>
+              <w:top w:w="50" w:type="dxa"/>
+              <w:left w:w="100" w:type="dxa"/>
+              <w:bottom w:w="50" w:type="dxa"/>
+              <w:right w:w="100" w:type="dxa"/>
+            </w:tcMar>
+          </w:tcPr>
+          <w:p>
+            <w:r>
+              <w:rPr>
+                <w:sz w:val="19"/>
+                <w:szCs w:val="19"/>
+              </w:rPr>
+              <w:t>Revised in review for CR-007 (product owner's decision of 15 Oct): demo accounts as ACCOUNT.demo_expires_at with a partial index; migration 0011</w:t>
+            </w:r>
+          </w:p>
+        </w:tc>
+      </w:tr>
     </w:tbl>
     <w:p>
       <w:pPr>
@@ -2151,7 +2268,6 @@
         <w:pStyle w:val="FrontSubheading"/>
       </w:pPr>
       <w:r>
-        <w:lastRenderedPageBreak/>
         <w:t>Review and approval</w:t>
       </w:r>
     </w:p>
@@ -2183,7 +2299,7 @@
           <w:left w:w="10" w:type="dxa"/>
           <w:right w:w="10" w:type="dxa"/>
         </w:tblCellMar>
-        <w:tblLook w:val="0000" w:firstRow="0" w:lastRow="0" w:firstColumn="0" w:lastColumn="0" w:noHBand="0" w:noVBand="0"/>
+        <w:tblLook w:val="04A0" w:firstRow="1" w:lastRow="0" w:firstColumn="1" w:lastColumn="0" w:noHBand="0" w:noVBand="1"/>
       </w:tblPr>
       <w:tblGrid>
         <w:gridCol w:w="2120"/>
@@ -2540,7 +2656,7 @@
     <w:sdt>
       <w:sdtPr>
         <w:alias w:val="Contents"/>
-        <w:id w:val="277991327"/>
+        <w:id w:val="1245385182"/>
       </w:sdtPr>
       <w:sdtEndPr/>
       <w:sdtContent>
@@ -2569,7 +2685,7 @@
           <w:r>
             <w:fldChar w:fldCharType="separate"/>
           </w:r>
-          <w:hyperlink w:anchor="_Toc242620537" w:history="1">
+          <w:hyperlink w:anchor="_Toc242916196" w:history="1">
             <w:r>
               <w:rPr>
                 <w:rStyle w:val="Hyperlink"/>
@@ -2593,7 +2709,7 @@
               <w:rPr>
                 <w:noProof/>
               </w:rPr>
-              <w:instrText xml:space="preserve"> PAGEREF _Toc242620537 \h </w:instrText>
+              <w:instrText xml:space="preserve"> PAGEREF _Toc242916196 \h </w:instrText>
             </w:r>
             <w:r>
               <w:rPr>
@@ -2636,7 +2752,7 @@
               <w14:ligatures w14:val="standardContextual"/>
             </w:rPr>
           </w:pPr>
-          <w:hyperlink w:anchor="_Toc242620538" w:history="1">
+          <w:hyperlink w:anchor="_Toc242916197" w:history="1">
             <w:r>
               <w:rPr>
                 <w:rStyle w:val="Hyperlink"/>
@@ -2660,7 +2776,7 @@
               <w:rPr>
                 <w:noProof/>
               </w:rPr>
-              <w:instrText xml:space="preserve"> PAGEREF _Toc242620538 \h </w:instrText>
+              <w:instrText xml:space="preserve"> PAGEREF _Toc242916197 \h </w:instrText>
             </w:r>
             <w:r>
               <w:rPr>
@@ -2703,7 +2819,7 @@
               <w14:ligatures w14:val="standardContextual"/>
             </w:rPr>
           </w:pPr>
-          <w:hyperlink w:anchor="_Toc242620539" w:history="1">
+          <w:hyperlink w:anchor="_Toc242916198" w:history="1">
             <w:r>
               <w:rPr>
                 <w:rStyle w:val="Hyperlink"/>
@@ -2727,7 +2843,7 @@
               <w:rPr>
                 <w:noProof/>
               </w:rPr>
-              <w:instrText xml:space="preserve"> PAGEREF _Toc242620539 \h </w:instrText>
+              <w:instrText xml:space="preserve"> PAGEREF _Toc242916198 \h </w:instrText>
             </w:r>
             <w:r>
               <w:rPr>
@@ -2770,7 +2886,7 @@
               <w14:ligatures w14:val="standardContextual"/>
             </w:rPr>
           </w:pPr>
-          <w:hyperlink w:anchor="_Toc242620540" w:history="1">
+          <w:hyperlink w:anchor="_Toc242916199" w:history="1">
             <w:r>
               <w:rPr>
                 <w:rStyle w:val="Hyperlink"/>
@@ -2794,7 +2910,7 @@
               <w:rPr>
                 <w:noProof/>
               </w:rPr>
-              <w:instrText xml:space="preserve"> PAGEREF _Toc242620540 \h </w:instrText>
+              <w:instrText xml:space="preserve"> PAGEREF _Toc242916199 \h </w:instrText>
             </w:r>
             <w:r>
               <w:rPr>
@@ -2837,7 +2953,7 @@
               <w14:ligatures w14:val="standardContextual"/>
             </w:rPr>
           </w:pPr>
-          <w:hyperlink w:anchor="_Toc242620541" w:history="1">
+          <w:hyperlink w:anchor="_Toc242916200" w:history="1">
             <w:r>
               <w:rPr>
                 <w:rStyle w:val="Hyperlink"/>
@@ -2861,7 +2977,7 @@
               <w:rPr>
                 <w:noProof/>
               </w:rPr>
-              <w:instrText xml:space="preserve"> PAGEREF _Toc242620541 \h </w:instrText>
+              <w:instrText xml:space="preserve"> PAGEREF _Toc242916200 \h </w:instrText>
             </w:r>
             <w:r>
               <w:rPr>
@@ -2904,7 +3020,7 @@
               <w14:ligatures w14:val="standardContextual"/>
             </w:rPr>
           </w:pPr>
-          <w:hyperlink w:anchor="_Toc242620542" w:history="1">
+          <w:hyperlink w:anchor="_Toc242916201" w:history="1">
             <w:r>
               <w:rPr>
                 <w:rStyle w:val="Hyperlink"/>
@@ -2928,7 +3044,7 @@
               <w:rPr>
                 <w:noProof/>
               </w:rPr>
-              <w:instrText xml:space="preserve"> PAGEREF _Toc242620542 \h </w:instrText>
+              <w:instrText xml:space="preserve"> PAGEREF _Toc242916201 \h </w:instrText>
             </w:r>
             <w:r>
               <w:rPr>
@@ -2971,7 +3087,7 @@
               <w14:ligatures w14:val="standardContextual"/>
             </w:rPr>
           </w:pPr>
-          <w:hyperlink w:anchor="_Toc242620543" w:history="1">
+          <w:hyperlink w:anchor="_Toc242916202" w:history="1">
             <w:r>
               <w:rPr>
                 <w:rStyle w:val="Hyperlink"/>
@@ -2995,7 +3111,7 @@
               <w:rPr>
                 <w:noProof/>
               </w:rPr>
-              <w:instrText xml:space="preserve"> PAGEREF _Toc242620543 \h </w:instrText>
+              <w:instrText xml:space="preserve"> PAGEREF _Toc242916202 \h </w:instrText>
             </w:r>
             <w:r>
               <w:rPr>
@@ -3038,7 +3154,7 @@
               <w14:ligatures w14:val="standardContextual"/>
             </w:rPr>
           </w:pPr>
-          <w:hyperlink w:anchor="_Toc242620544" w:history="1">
+          <w:hyperlink w:anchor="_Toc242916203" w:history="1">
             <w:r>
               <w:rPr>
                 <w:rStyle w:val="Hyperlink"/>
@@ -3062,7 +3178,7 @@
               <w:rPr>
                 <w:noProof/>
               </w:rPr>
-              <w:instrText xml:space="preserve"> PAGEREF _Toc242620544 \h </w:instrText>
+              <w:instrText xml:space="preserve"> PAGEREF _Toc242916203 \h </w:instrText>
             </w:r>
             <w:r>
               <w:rPr>
@@ -3105,7 +3221,7 @@
               <w14:ligatures w14:val="standardContextual"/>
             </w:rPr>
           </w:pPr>
-          <w:hyperlink w:anchor="_Toc242620545" w:history="1">
+          <w:hyperlink w:anchor="_Toc242916204" w:history="1">
             <w:r>
               <w:rPr>
                 <w:rStyle w:val="Hyperlink"/>
@@ -3129,7 +3245,7 @@
               <w:rPr>
                 <w:noProof/>
               </w:rPr>
-              <w:instrText xml:space="preserve"> PAGEREF _Toc242620545 \h </w:instrText>
+              <w:instrText xml:space="preserve"> PAGEREF _Toc242916204 \h </w:instrText>
             </w:r>
             <w:r>
               <w:rPr>
@@ -3172,7 +3288,7 @@
               <w14:ligatures w14:val="standardContextual"/>
             </w:rPr>
           </w:pPr>
-          <w:hyperlink w:anchor="_Toc242620546" w:history="1">
+          <w:hyperlink w:anchor="_Toc242916205" w:history="1">
             <w:r>
               <w:rPr>
                 <w:rStyle w:val="Hyperlink"/>
@@ -3196,7 +3312,7 @@
               <w:rPr>
                 <w:noProof/>
               </w:rPr>
-              <w:instrText xml:space="preserve"> PAGEREF _Toc242620546 \h </w:instrText>
+              <w:instrText xml:space="preserve"> PAGEREF _Toc242916205 \h </w:instrText>
             </w:r>
             <w:r>
               <w:rPr>
@@ -3239,7 +3355,7 @@
               <w14:ligatures w14:val="standardContextual"/>
             </w:rPr>
           </w:pPr>
-          <w:hyperlink w:anchor="_Toc242620547" w:history="1">
+          <w:hyperlink w:anchor="_Toc242916206" w:history="1">
             <w:r>
               <w:rPr>
                 <w:rStyle w:val="Hyperlink"/>
@@ -3263,7 +3379,7 @@
               <w:rPr>
                 <w:noProof/>
               </w:rPr>
-              <w:instrText xml:space="preserve"> PAGEREF _Toc242620547 \h </w:instrText>
+              <w:instrText xml:space="preserve"> PAGEREF _Toc242916206 \h </w:instrText>
             </w:r>
             <w:r>
               <w:rPr>
@@ -3306,7 +3422,7 @@
               <w14:ligatures w14:val="standardContextual"/>
             </w:rPr>
           </w:pPr>
-          <w:hyperlink w:anchor="_Toc242620548" w:history="1">
+          <w:hyperlink w:anchor="_Toc242916207" w:history="1">
             <w:r>
               <w:rPr>
                 <w:rStyle w:val="Hyperlink"/>
@@ -3330,7 +3446,7 @@
               <w:rPr>
                 <w:noProof/>
               </w:rPr>
-              <w:instrText xml:space="preserve"> PAGEREF _Toc242620548 \h </w:instrText>
+              <w:instrText xml:space="preserve"> PAGEREF _Toc242916207 \h </w:instrText>
             </w:r>
             <w:r>
               <w:rPr>
@@ -3373,7 +3489,7 @@
               <w14:ligatures w14:val="standardContextual"/>
             </w:rPr>
           </w:pPr>
-          <w:hyperlink w:anchor="_Toc242620549" w:history="1">
+          <w:hyperlink w:anchor="_Toc242916208" w:history="1">
             <w:r>
               <w:rPr>
                 <w:rStyle w:val="Hyperlink"/>
@@ -3397,7 +3513,7 @@
               <w:rPr>
                 <w:noProof/>
               </w:rPr>
-              <w:instrText xml:space="preserve"> PAGEREF _Toc242620549 \h </w:instrText>
+              <w:instrText xml:space="preserve"> PAGEREF _Toc242916208 \h </w:instrText>
             </w:r>
             <w:r>
               <w:rPr>
@@ -3440,7 +3556,7 @@
               <w14:ligatures w14:val="standardContextual"/>
             </w:rPr>
           </w:pPr>
-          <w:hyperlink w:anchor="_Toc242620550" w:history="1">
+          <w:hyperlink w:anchor="_Toc242916209" w:history="1">
             <w:r>
               <w:rPr>
                 <w:rStyle w:val="Hyperlink"/>
@@ -3464,7 +3580,7 @@
               <w:rPr>
                 <w:noProof/>
               </w:rPr>
-              <w:instrText xml:space="preserve"> PAGEREF _Toc242620550 \h </w:instrText>
+              <w:instrText xml:space="preserve"> PAGEREF _Toc242916209 \h </w:instrText>
             </w:r>
             <w:r>
               <w:rPr>
@@ -3507,7 +3623,7 @@
               <w14:ligatures w14:val="standardContextual"/>
             </w:rPr>
           </w:pPr>
-          <w:hyperlink w:anchor="_Toc242620551" w:history="1">
+          <w:hyperlink w:anchor="_Toc242916210" w:history="1">
             <w:r>
               <w:rPr>
                 <w:rStyle w:val="Hyperlink"/>
@@ -3531,7 +3647,7 @@
               <w:rPr>
                 <w:noProof/>
               </w:rPr>
-              <w:instrText xml:space="preserve"> PAGEREF _Toc242620551 \h </w:instrText>
+              <w:instrText xml:space="preserve"> PAGEREF _Toc242916210 \h </w:instrText>
             </w:r>
             <w:r>
               <w:rPr>
@@ -3574,7 +3690,7 @@
               <w14:ligatures w14:val="standardContextual"/>
             </w:rPr>
           </w:pPr>
-          <w:hyperlink w:anchor="_Toc242620552" w:history="1">
+          <w:hyperlink w:anchor="_Toc242916211" w:history="1">
             <w:r>
               <w:rPr>
                 <w:rStyle w:val="Hyperlink"/>
@@ -3598,7 +3714,7 @@
               <w:rPr>
                 <w:noProof/>
               </w:rPr>
-              <w:instrText xml:space="preserve"> PAGEREF _Toc242620552 \h </w:instrText>
+              <w:instrText xml:space="preserve"> PAGEREF _Toc242916211 \h </w:instrText>
             </w:r>
             <w:r>
               <w:rPr>
@@ -3641,7 +3757,7 @@
               <w14:ligatures w14:val="standardContextual"/>
             </w:rPr>
           </w:pPr>
-          <w:hyperlink w:anchor="_Toc242620553" w:history="1">
+          <w:hyperlink w:anchor="_Toc242916212" w:history="1">
             <w:r>
               <w:rPr>
                 <w:rStyle w:val="Hyperlink"/>
@@ -3665,7 +3781,7 @@
               <w:rPr>
                 <w:noProof/>
               </w:rPr>
-              <w:instrText xml:space="preserve"> PAGEREF _Toc242620553 \h </w:instrText>
+              <w:instrText xml:space="preserve"> PAGEREF _Toc242916212 \h </w:instrText>
             </w:r>
             <w:r>
               <w:rPr>
@@ -3708,13 +3824,13 @@
               <w14:ligatures w14:val="standardContextual"/>
             </w:rPr>
           </w:pPr>
-          <w:hyperlink w:anchor="_Toc242620554" w:history="1">
+          <w:hyperlink w:anchor="_Toc242916213" w:history="1">
             <w:r>
               <w:rPr>
                 <w:rStyle w:val="Hyperlink"/>
                 <w:noProof/>
               </w:rPr>
-              <w:t>2.11 Entity catalogue</w:t>
+              <w:t>2.11 Demo accounts (CR-007)</w:t>
             </w:r>
             <w:r>
               <w:rPr>
@@ -3732,7 +3848,74 @@
               <w:rPr>
                 <w:noProof/>
               </w:rPr>
-              <w:instrText xml:space="preserve"> PAGEREF _Toc242620554 \h </w:instrText>
+              <w:instrText xml:space="preserve"> PAGEREF _Toc242916213 \h </w:instrText>
+            </w:r>
+            <w:r>
+              <w:rPr>
+                <w:noProof/>
+              </w:rPr>
+            </w:r>
+            <w:r>
+              <w:rPr>
+                <w:noProof/>
+              </w:rPr>
+              <w:fldChar w:fldCharType="separate"/>
+            </w:r>
+            <w:r>
+              <w:rPr>
+                <w:noProof/>
+              </w:rPr>
+              <w:t>15</w:t>
+            </w:r>
+            <w:r>
+              <w:rPr>
+                <w:noProof/>
+              </w:rPr>
+              <w:fldChar w:fldCharType="end"/>
+            </w:r>
+          </w:hyperlink>
+        </w:p>
+        <w:p>
+          <w:pPr>
+            <w:pStyle w:val="TOC2"/>
+            <w:tabs>
+              <w:tab w:val="right" w:leader="dot" w:pos="9628"/>
+            </w:tabs>
+            <w:rPr>
+              <w:rFonts w:asciiTheme="minorHAnsi" w:eastAsiaTheme="minorEastAsia" w:hAnsiTheme="minorHAnsi" w:cstheme="minorBidi"/>
+              <w:noProof/>
+              <w:color w:val="auto"/>
+              <w:kern w:val="2"/>
+              <w:sz w:val="24"/>
+              <w:szCs w:val="24"/>
+              <w14:ligatures w14:val="standardContextual"/>
+            </w:rPr>
+          </w:pPr>
+          <w:hyperlink w:anchor="_Toc242916214" w:history="1">
+            <w:r>
+              <w:rPr>
+                <w:rStyle w:val="Hyperlink"/>
+                <w:noProof/>
+              </w:rPr>
+              <w:t>2.12 Entity catalogue</w:t>
+            </w:r>
+            <w:r>
+              <w:rPr>
+                <w:noProof/>
+              </w:rPr>
+              <w:tab/>
+            </w:r>
+            <w:r>
+              <w:rPr>
+                <w:noProof/>
+              </w:rPr>
+              <w:fldChar w:fldCharType="begin"/>
+            </w:r>
+            <w:r>
+              <w:rPr>
+                <w:noProof/>
+              </w:rPr>
+              <w:instrText xml:space="preserve"> PAGEREF _Toc242916214 \h </w:instrText>
             </w:r>
             <w:r>
               <w:rPr>
@@ -3775,7 +3958,7 @@
               <w14:ligatures w14:val="standardContextual"/>
             </w:rPr>
           </w:pPr>
-          <w:hyperlink w:anchor="_Toc242620555" w:history="1">
+          <w:hyperlink w:anchor="_Toc242916215" w:history="1">
             <w:r>
               <w:rPr>
                 <w:rStyle w:val="Hyperlink"/>
@@ -3799,7 +3982,7 @@
               <w:rPr>
                 <w:noProof/>
               </w:rPr>
-              <w:instrText xml:space="preserve"> PAGEREF _Toc242620555 \h </w:instrText>
+              <w:instrText xml:space="preserve"> PAGEREF _Toc242916215 \h </w:instrText>
             </w:r>
             <w:r>
               <w:rPr>
@@ -3842,7 +4025,7 @@
               <w14:ligatures w14:val="standardContextual"/>
             </w:rPr>
           </w:pPr>
-          <w:hyperlink w:anchor="_Toc242620556" w:history="1">
+          <w:hyperlink w:anchor="_Toc242916216" w:history="1">
             <w:r>
               <w:rPr>
                 <w:rStyle w:val="Hyperlink"/>
@@ -3866,7 +4049,7 @@
               <w:rPr>
                 <w:noProof/>
               </w:rPr>
-              <w:instrText xml:space="preserve"> PAGEREF _Toc242620556 \h </w:instrText>
+              <w:instrText xml:space="preserve"> PAGEREF _Toc242916216 \h </w:instrText>
             </w:r>
             <w:r>
               <w:rPr>
@@ -3909,7 +4092,7 @@
               <w14:ligatures w14:val="standardContextual"/>
             </w:rPr>
           </w:pPr>
-          <w:hyperlink w:anchor="_Toc242620557" w:history="1">
+          <w:hyperlink w:anchor="_Toc242916217" w:history="1">
             <w:r>
               <w:rPr>
                 <w:rStyle w:val="Hyperlink"/>
@@ -3933,7 +4116,7 @@
               <w:rPr>
                 <w:noProof/>
               </w:rPr>
-              <w:instrText xml:space="preserve"> PAGEREF _Toc242620557 \h </w:instrText>
+              <w:instrText xml:space="preserve"> PAGEREF _Toc242916217 \h </w:instrText>
             </w:r>
             <w:r>
               <w:rPr>
@@ -3976,7 +4159,7 @@
               <w14:ligatures w14:val="standardContextual"/>
             </w:rPr>
           </w:pPr>
-          <w:hyperlink w:anchor="_Toc242620558" w:history="1">
+          <w:hyperlink w:anchor="_Toc242916218" w:history="1">
             <w:r>
               <w:rPr>
                 <w:rStyle w:val="Hyperlink"/>
@@ -4000,7 +4183,7 @@
               <w:rPr>
                 <w:noProof/>
               </w:rPr>
-              <w:instrText xml:space="preserve"> PAGEREF _Toc242620558 \h </w:instrText>
+              <w:instrText xml:space="preserve"> PAGEREF _Toc242916218 \h </w:instrText>
             </w:r>
             <w:r>
               <w:rPr>
@@ -4043,7 +4226,7 @@
               <w14:ligatures w14:val="standardContextual"/>
             </w:rPr>
           </w:pPr>
-          <w:hyperlink w:anchor="_Toc242620559" w:history="1">
+          <w:hyperlink w:anchor="_Toc242916219" w:history="1">
             <w:r>
               <w:rPr>
                 <w:rStyle w:val="Hyperlink"/>
@@ -4067,7 +4250,7 @@
               <w:rPr>
                 <w:noProof/>
               </w:rPr>
-              <w:instrText xml:space="preserve"> PAGEREF _Toc242620559 \h </w:instrText>
+              <w:instrText xml:space="preserve"> PAGEREF _Toc242916219 \h </w:instrText>
             </w:r>
             <w:r>
               <w:rPr>
@@ -4110,7 +4293,7 @@
               <w14:ligatures w14:val="standardContextual"/>
             </w:rPr>
           </w:pPr>
-          <w:hyperlink w:anchor="_Toc242620560" w:history="1">
+          <w:hyperlink w:anchor="_Toc242916220" w:history="1">
             <w:r>
               <w:rPr>
                 <w:rStyle w:val="Hyperlink"/>
@@ -4134,7 +4317,7 @@
               <w:rPr>
                 <w:noProof/>
               </w:rPr>
-              <w:instrText xml:space="preserve"> PAGEREF _Toc242620560 \h </w:instrText>
+              <w:instrText xml:space="preserve"> PAGEREF _Toc242916220 \h </w:instrText>
             </w:r>
             <w:r>
               <w:rPr>
@@ -4177,7 +4360,7 @@
               <w14:ligatures w14:val="standardContextual"/>
             </w:rPr>
           </w:pPr>
-          <w:hyperlink w:anchor="_Toc242620561" w:history="1">
+          <w:hyperlink w:anchor="_Toc242916221" w:history="1">
             <w:r>
               <w:rPr>
                 <w:rStyle w:val="Hyperlink"/>
@@ -4201,7 +4384,7 @@
               <w:rPr>
                 <w:noProof/>
               </w:rPr>
-              <w:instrText xml:space="preserve"> PAGEREF _Toc242620561 \h </w:instrText>
+              <w:instrText xml:space="preserve"> PAGEREF _Toc242916221 \h </w:instrText>
             </w:r>
             <w:r>
               <w:rPr>
@@ -4244,7 +4427,7 @@
               <w14:ligatures w14:val="standardContextual"/>
             </w:rPr>
           </w:pPr>
-          <w:hyperlink w:anchor="_Toc242620562" w:history="1">
+          <w:hyperlink w:anchor="_Toc242916222" w:history="1">
             <w:r>
               <w:rPr>
                 <w:rStyle w:val="Hyperlink"/>
@@ -4268,7 +4451,7 @@
               <w:rPr>
                 <w:noProof/>
               </w:rPr>
-              <w:instrText xml:space="preserve"> PAGEREF _Toc242620562 \h </w:instrText>
+              <w:instrText xml:space="preserve"> PAGEREF _Toc242916222 \h </w:instrText>
             </w:r>
             <w:r>
               <w:rPr>
@@ -4311,7 +4494,7 @@
               <w14:ligatures w14:val="standardContextual"/>
             </w:rPr>
           </w:pPr>
-          <w:hyperlink w:anchor="_Toc242620563" w:history="1">
+          <w:hyperlink w:anchor="_Toc242916223" w:history="1">
             <w:r>
               <w:rPr>
                 <w:rStyle w:val="Hyperlink"/>
@@ -4335,7 +4518,7 @@
               <w:rPr>
                 <w:noProof/>
               </w:rPr>
-              <w:instrText xml:space="preserve"> PAGEREF _Toc242620563 \h </w:instrText>
+              <w:instrText xml:space="preserve"> PAGEREF _Toc242916223 \h </w:instrText>
             </w:r>
             <w:r>
               <w:rPr>
@@ -4378,7 +4561,7 @@
               <w14:ligatures w14:val="standardContextual"/>
             </w:rPr>
           </w:pPr>
-          <w:hyperlink w:anchor="_Toc242620564" w:history="1">
+          <w:hyperlink w:anchor="_Toc242916224" w:history="1">
             <w:r>
               <w:rPr>
                 <w:rStyle w:val="Hyperlink"/>
@@ -4402,7 +4585,7 @@
               <w:rPr>
                 <w:noProof/>
               </w:rPr>
-              <w:instrText xml:space="preserve"> PAGEREF _Toc242620564 \h </w:instrText>
+              <w:instrText xml:space="preserve"> PAGEREF _Toc242916224 \h </w:instrText>
             </w:r>
             <w:r>
               <w:rPr>
@@ -4445,7 +4628,7 @@
               <w14:ligatures w14:val="standardContextual"/>
             </w:rPr>
           </w:pPr>
-          <w:hyperlink w:anchor="_Toc242620565" w:history="1">
+          <w:hyperlink w:anchor="_Toc242916225" w:history="1">
             <w:r>
               <w:rPr>
                 <w:rStyle w:val="Hyperlink"/>
@@ -4469,7 +4652,7 @@
               <w:rPr>
                 <w:noProof/>
               </w:rPr>
-              <w:instrText xml:space="preserve"> PAGEREF _Toc242620565 \h </w:instrText>
+              <w:instrText xml:space="preserve"> PAGEREF _Toc242916225 \h </w:instrText>
             </w:r>
             <w:r>
               <w:rPr>
@@ -4512,7 +4695,7 @@
               <w14:ligatures w14:val="standardContextual"/>
             </w:rPr>
           </w:pPr>
-          <w:hyperlink w:anchor="_Toc242620566" w:history="1">
+          <w:hyperlink w:anchor="_Toc242916226" w:history="1">
             <w:r>
               <w:rPr>
                 <w:rStyle w:val="Hyperlink"/>
@@ -4536,7 +4719,7 @@
               <w:rPr>
                 <w:noProof/>
               </w:rPr>
-              <w:instrText xml:space="preserve"> PAGEREF _Toc242620566 \h </w:instrText>
+              <w:instrText xml:space="preserve"> PAGEREF _Toc242916226 \h </w:instrText>
             </w:r>
             <w:r>
               <w:rPr>
@@ -4579,7 +4762,7 @@
               <w14:ligatures w14:val="standardContextual"/>
             </w:rPr>
           </w:pPr>
-          <w:hyperlink w:anchor="_Toc242620567" w:history="1">
+          <w:hyperlink w:anchor="_Toc242916227" w:history="1">
             <w:r>
               <w:rPr>
                 <w:rStyle w:val="Hyperlink"/>
@@ -4603,7 +4786,7 @@
               <w:rPr>
                 <w:noProof/>
               </w:rPr>
-              <w:instrText xml:space="preserve"> PAGEREF _Toc242620567 \h </w:instrText>
+              <w:instrText xml:space="preserve"> PAGEREF _Toc242916227 \h </w:instrText>
             </w:r>
             <w:r>
               <w:rPr>
@@ -4646,7 +4829,7 @@
               <w14:ligatures w14:val="standardContextual"/>
             </w:rPr>
           </w:pPr>
-          <w:hyperlink w:anchor="_Toc242620568" w:history="1">
+          <w:hyperlink w:anchor="_Toc242916228" w:history="1">
             <w:r>
               <w:rPr>
                 <w:rStyle w:val="Hyperlink"/>
@@ -4670,7 +4853,7 @@
               <w:rPr>
                 <w:noProof/>
               </w:rPr>
-              <w:instrText xml:space="preserve"> PAGEREF _Toc242620568 \h </w:instrText>
+              <w:instrText xml:space="preserve"> PAGEREF _Toc242916228 \h </w:instrText>
             </w:r>
             <w:r>
               <w:rPr>
@@ -4713,7 +4896,7 @@
               <w14:ligatures w14:val="standardContextual"/>
             </w:rPr>
           </w:pPr>
-          <w:hyperlink w:anchor="_Toc242620569" w:history="1">
+          <w:hyperlink w:anchor="_Toc242916229" w:history="1">
             <w:r>
               <w:rPr>
                 <w:rStyle w:val="Hyperlink"/>
@@ -4737,7 +4920,7 @@
               <w:rPr>
                 <w:noProof/>
               </w:rPr>
-              <w:instrText xml:space="preserve"> PAGEREF _Toc242620569 \h </w:instrText>
+              <w:instrText xml:space="preserve"> PAGEREF _Toc242916229 \h </w:instrText>
             </w:r>
             <w:r>
               <w:rPr>
@@ -4780,7 +4963,7 @@
               <w14:ligatures w14:val="standardContextual"/>
             </w:rPr>
           </w:pPr>
-          <w:hyperlink w:anchor="_Toc242620570" w:history="1">
+          <w:hyperlink w:anchor="_Toc242916230" w:history="1">
             <w:r>
               <w:rPr>
                 <w:rStyle w:val="Hyperlink"/>
@@ -4804,7 +4987,7 @@
               <w:rPr>
                 <w:noProof/>
               </w:rPr>
-              <w:instrText xml:space="preserve"> PAGEREF _Toc242620570 \h </w:instrText>
+              <w:instrText xml:space="preserve"> PAGEREF _Toc242916230 \h </w:instrText>
             </w:r>
             <w:r>
               <w:rPr>
@@ -4847,7 +5030,7 @@
               <w14:ligatures w14:val="standardContextual"/>
             </w:rPr>
           </w:pPr>
-          <w:hyperlink w:anchor="_Toc242620571" w:history="1">
+          <w:hyperlink w:anchor="_Toc242916231" w:history="1">
             <w:r>
               <w:rPr>
                 <w:rStyle w:val="Hyperlink"/>
@@ -4871,7 +5054,7 @@
               <w:rPr>
                 <w:noProof/>
               </w:rPr>
-              <w:instrText xml:space="preserve"> PAGEREF _Toc242620571 \h </w:instrText>
+              <w:instrText xml:space="preserve"> PAGEREF _Toc242916231 \h </w:instrText>
             </w:r>
             <w:r>
               <w:rPr>
@@ -4914,7 +5097,7 @@
               <w14:ligatures w14:val="standardContextual"/>
             </w:rPr>
           </w:pPr>
-          <w:hyperlink w:anchor="_Toc242620572" w:history="1">
+          <w:hyperlink w:anchor="_Toc242916232" w:history="1">
             <w:r>
               <w:rPr>
                 <w:rStyle w:val="Hyperlink"/>
@@ -4938,7 +5121,7 @@
               <w:rPr>
                 <w:noProof/>
               </w:rPr>
-              <w:instrText xml:space="preserve"> PAGEREF _Toc242620572 \h </w:instrText>
+              <w:instrText xml:space="preserve"> PAGEREF _Toc242916232 \h </w:instrText>
             </w:r>
             <w:r>
               <w:rPr>
@@ -4981,13 +5164,13 @@
               <w14:ligatures w14:val="standardContextual"/>
             </w:rPr>
           </w:pPr>
-          <w:hyperlink w:anchor="_Toc242620573" w:history="1">
+          <w:hyperlink w:anchor="_Toc242916233" w:history="1">
             <w:r>
               <w:rPr>
                 <w:rStyle w:val="Hyperlink"/>
                 <w:noProof/>
               </w:rPr>
-              <w:t>Appendix G: Group rules (migration 0009)</w:t>
+              <w:t>Appendix G: Demo accounts (migration 0011)</w:t>
             </w:r>
             <w:r>
               <w:rPr>
@@ -5005,7 +5188,7 @@
               <w:rPr>
                 <w:noProof/>
               </w:rPr>
-              <w:instrText xml:space="preserve"> PAGEREF _Toc242620573 \h </w:instrText>
+              <w:instrText xml:space="preserve"> PAGEREF _Toc242916233 \h </w:instrText>
             </w:r>
             <w:r>
               <w:rPr>
@@ -5048,13 +5231,13 @@
               <w14:ligatures w14:val="standardContextual"/>
             </w:rPr>
           </w:pPr>
-          <w:hyperlink w:anchor="_Toc242620574" w:history="1">
+          <w:hyperlink w:anchor="_Toc242916234" w:history="1">
             <w:r>
               <w:rPr>
                 <w:rStyle w:val="Hyperlink"/>
                 <w:noProof/>
               </w:rPr>
-              <w:t>Appendix H: Groups (migration 0006)</w:t>
+              <w:t>Appendix H: Group rules (migration 0009)</w:t>
             </w:r>
             <w:r>
               <w:rPr>
@@ -5072,7 +5255,7 @@
               <w:rPr>
                 <w:noProof/>
               </w:rPr>
-              <w:instrText xml:space="preserve"> PAGEREF _Toc242620574 \h </w:instrText>
+              <w:instrText xml:space="preserve"> PAGEREF _Toc242916234 \h </w:instrText>
             </w:r>
             <w:r>
               <w:rPr>
@@ -5115,13 +5298,13 @@
               <w14:ligatures w14:val="standardContextual"/>
             </w:rPr>
           </w:pPr>
-          <w:hyperlink w:anchor="_Toc242620575" w:history="1">
+          <w:hyperlink w:anchor="_Toc242916235" w:history="1">
             <w:r>
               <w:rPr>
                 <w:rStyle w:val="Hyperlink"/>
                 <w:noProof/>
               </w:rPr>
-              <w:t>Appendix I: Glossary</w:t>
+              <w:t>Appendix I: Groups (migration 0006)</w:t>
             </w:r>
             <w:r>
               <w:rPr>
@@ -5139,7 +5322,7 @@
               <w:rPr>
                 <w:noProof/>
               </w:rPr>
-              <w:instrText xml:space="preserve"> PAGEREF _Toc242620575 \h </w:instrText>
+              <w:instrText xml:space="preserve"> PAGEREF _Toc242916235 \h </w:instrText>
             </w:r>
             <w:r>
               <w:rPr>
@@ -5156,7 +5339,7 @@
               <w:rPr>
                 <w:noProof/>
               </w:rPr>
-              <w:t>47</w:t>
+              <w:t>46</w:t>
             </w:r>
             <w:r>
               <w:rPr>
@@ -5182,13 +5365,13 @@
               <w14:ligatures w14:val="standardContextual"/>
             </w:rPr>
           </w:pPr>
-          <w:hyperlink w:anchor="_Toc242620576" w:history="1">
+          <w:hyperlink w:anchor="_Toc242916236" w:history="1">
             <w:r>
               <w:rPr>
                 <w:rStyle w:val="Hyperlink"/>
                 <w:noProof/>
               </w:rPr>
-              <w:t>Appendix J: References</w:t>
+              <w:t>Appendix J: Glossary</w:t>
             </w:r>
             <w:r>
               <w:rPr>
@@ -5206,7 +5389,7 @@
               <w:rPr>
                 <w:noProof/>
               </w:rPr>
-              <w:instrText xml:space="preserve"> PAGEREF _Toc242620576 \h </w:instrText>
+              <w:instrText xml:space="preserve"> PAGEREF _Toc242916236 \h </w:instrText>
             </w:r>
             <w:r>
               <w:rPr>
@@ -5224,6 +5407,73 @@
                 <w:noProof/>
               </w:rPr>
               <w:t>48</w:t>
+            </w:r>
+            <w:r>
+              <w:rPr>
+                <w:noProof/>
+              </w:rPr>
+              <w:fldChar w:fldCharType="end"/>
+            </w:r>
+          </w:hyperlink>
+        </w:p>
+        <w:p>
+          <w:pPr>
+            <w:pStyle w:val="TOC1"/>
+            <w:tabs>
+              <w:tab w:val="right" w:leader="dot" w:pos="9628"/>
+            </w:tabs>
+            <w:rPr>
+              <w:rFonts w:asciiTheme="minorHAnsi" w:eastAsiaTheme="minorEastAsia" w:hAnsiTheme="minorHAnsi" w:cstheme="minorBidi"/>
+              <w:noProof/>
+              <w:color w:val="auto"/>
+              <w:kern w:val="2"/>
+              <w:sz w:val="24"/>
+              <w:szCs w:val="24"/>
+              <w14:ligatures w14:val="standardContextual"/>
+            </w:rPr>
+          </w:pPr>
+          <w:hyperlink w:anchor="_Toc242916237" w:history="1">
+            <w:r>
+              <w:rPr>
+                <w:rStyle w:val="Hyperlink"/>
+                <w:noProof/>
+              </w:rPr>
+              <w:t>Appendix K: References</w:t>
+            </w:r>
+            <w:r>
+              <w:rPr>
+                <w:noProof/>
+              </w:rPr>
+              <w:tab/>
+            </w:r>
+            <w:r>
+              <w:rPr>
+                <w:noProof/>
+              </w:rPr>
+              <w:fldChar w:fldCharType="begin"/>
+            </w:r>
+            <w:r>
+              <w:rPr>
+                <w:noProof/>
+              </w:rPr>
+              <w:instrText xml:space="preserve"> PAGEREF _Toc242916237 \h </w:instrText>
+            </w:r>
+            <w:r>
+              <w:rPr>
+                <w:noProof/>
+              </w:rPr>
+            </w:r>
+            <w:r>
+              <w:rPr>
+                <w:noProof/>
+              </w:rPr>
+              <w:fldChar w:fldCharType="separate"/>
+            </w:r>
+            <w:r>
+              <w:rPr>
+                <w:noProof/>
+              </w:rPr>
+              <w:t>49</w:t>
             </w:r>
             <w:r>
               <w:rPr>
@@ -5252,7 +5502,7 @@
     <w:sdt>
       <w:sdtPr>
         <w:alias w:val="Figures"/>
-        <w:id w:val="1987505470"/>
+        <w:id w:val="-980532499"/>
       </w:sdtPr>
       <w:sdtEndPr/>
       <w:sdtContent>
@@ -5281,7 +5531,7 @@
           <w:r>
             <w:fldChar w:fldCharType="separate"/>
           </w:r>
-          <w:hyperlink w:anchor="_Toc242620577" w:history="1">
+          <w:hyperlink w:anchor="_Toc242916238" w:history="1">
             <w:r>
               <w:rPr>
                 <w:rStyle w:val="Hyperlink"/>
@@ -5305,7 +5555,7 @@
               <w:rPr>
                 <w:noProof/>
               </w:rPr>
-              <w:instrText xml:space="preserve"> PAGEREF _Toc242620577 \h </w:instrText>
+              <w:instrText xml:space="preserve"> PAGEREF _Toc242916238 \h </w:instrText>
             </w:r>
             <w:r>
               <w:rPr>
@@ -5348,7 +5598,7 @@
               <w14:ligatures w14:val="standardContextual"/>
             </w:rPr>
           </w:pPr>
-          <w:hyperlink w:anchor="_Toc242620578" w:history="1">
+          <w:hyperlink w:anchor="_Toc242916239" w:history="1">
             <w:r>
               <w:rPr>
                 <w:rStyle w:val="Hyperlink"/>
@@ -5372,7 +5622,7 @@
               <w:rPr>
                 <w:noProof/>
               </w:rPr>
-              <w:instrText xml:space="preserve"> PAGEREF _Toc242620578 \h </w:instrText>
+              <w:instrText xml:space="preserve"> PAGEREF _Toc242916239 \h </w:instrText>
             </w:r>
             <w:r>
               <w:rPr>
@@ -5415,7 +5665,7 @@
               <w14:ligatures w14:val="standardContextual"/>
             </w:rPr>
           </w:pPr>
-          <w:hyperlink w:anchor="_Toc242620579" w:history="1">
+          <w:hyperlink w:anchor="_Toc242916240" w:history="1">
             <w:r>
               <w:rPr>
                 <w:rStyle w:val="Hyperlink"/>
@@ -5439,7 +5689,7 @@
               <w:rPr>
                 <w:noProof/>
               </w:rPr>
-              <w:instrText xml:space="preserve"> PAGEREF _Toc242620579 \h </w:instrText>
+              <w:instrText xml:space="preserve"> PAGEREF _Toc242916240 \h </w:instrText>
             </w:r>
             <w:r>
               <w:rPr>
@@ -5482,7 +5732,7 @@
               <w14:ligatures w14:val="standardContextual"/>
             </w:rPr>
           </w:pPr>
-          <w:hyperlink w:anchor="_Toc242620580" w:history="1">
+          <w:hyperlink w:anchor="_Toc242916241" w:history="1">
             <w:r>
               <w:rPr>
                 <w:rStyle w:val="Hyperlink"/>
@@ -5506,7 +5756,7 @@
               <w:rPr>
                 <w:noProof/>
               </w:rPr>
-              <w:instrText xml:space="preserve"> PAGEREF _Toc242620580 \h </w:instrText>
+              <w:instrText xml:space="preserve"> PAGEREF _Toc242916241 \h </w:instrText>
             </w:r>
             <w:r>
               <w:rPr>
@@ -5549,7 +5799,7 @@
               <w14:ligatures w14:val="standardContextual"/>
             </w:rPr>
           </w:pPr>
-          <w:hyperlink w:anchor="_Toc242620581" w:history="1">
+          <w:hyperlink w:anchor="_Toc242916242" w:history="1">
             <w:r>
               <w:rPr>
                 <w:rStyle w:val="Hyperlink"/>
@@ -5573,7 +5823,7 @@
               <w:rPr>
                 <w:noProof/>
               </w:rPr>
-              <w:instrText xml:space="preserve"> PAGEREF _Toc242620581 \h </w:instrText>
+              <w:instrText xml:space="preserve"> PAGEREF _Toc242916242 \h </w:instrText>
             </w:r>
             <w:r>
               <w:rPr>
@@ -5616,7 +5866,7 @@
               <w14:ligatures w14:val="standardContextual"/>
             </w:rPr>
           </w:pPr>
-          <w:hyperlink w:anchor="_Toc242620582" w:history="1">
+          <w:hyperlink w:anchor="_Toc242916243" w:history="1">
             <w:r>
               <w:rPr>
                 <w:rStyle w:val="Hyperlink"/>
@@ -5640,7 +5890,7 @@
               <w:rPr>
                 <w:noProof/>
               </w:rPr>
-              <w:instrText xml:space="preserve"> PAGEREF _Toc242620582 \h </w:instrText>
+              <w:instrText xml:space="preserve"> PAGEREF _Toc242916243 \h </w:instrText>
             </w:r>
             <w:r>
               <w:rPr>
@@ -5683,7 +5933,7 @@
               <w14:ligatures w14:val="standardContextual"/>
             </w:rPr>
           </w:pPr>
-          <w:hyperlink w:anchor="_Toc242620583" w:history="1">
+          <w:hyperlink w:anchor="_Toc242916244" w:history="1">
             <w:r>
               <w:rPr>
                 <w:rStyle w:val="Hyperlink"/>
@@ -5707,7 +5957,7 @@
               <w:rPr>
                 <w:noProof/>
               </w:rPr>
-              <w:instrText xml:space="preserve"> PAGEREF _Toc242620583 \h </w:instrText>
+              <w:instrText xml:space="preserve"> PAGEREF _Toc242916244 \h </w:instrText>
             </w:r>
             <w:r>
               <w:rPr>
@@ -5750,7 +6000,7 @@
               <w14:ligatures w14:val="standardContextual"/>
             </w:rPr>
           </w:pPr>
-          <w:hyperlink w:anchor="_Toc242620584" w:history="1">
+          <w:hyperlink w:anchor="_Toc242916245" w:history="1">
             <w:r>
               <w:rPr>
                 <w:rStyle w:val="Hyperlink"/>
@@ -5774,7 +6024,7 @@
               <w:rPr>
                 <w:noProof/>
               </w:rPr>
-              <w:instrText xml:space="preserve"> PAGEREF _Toc242620584 \h </w:instrText>
+              <w:instrText xml:space="preserve"> PAGEREF _Toc242916245 \h </w:instrText>
             </w:r>
             <w:r>
               <w:rPr>
@@ -5820,7 +6070,7 @@
     <w:sdt>
       <w:sdtPr>
         <w:alias w:val="Tables"/>
-        <w:id w:val="-1059389238"/>
+        <w:id w:val="-608124189"/>
       </w:sdtPr>
       <w:sdtEndPr/>
       <w:sdtContent>
@@ -5849,7 +6099,7 @@
           <w:r>
             <w:fldChar w:fldCharType="separate"/>
           </w:r>
-          <w:hyperlink w:anchor="_Toc242620585" w:history="1">
+          <w:hyperlink w:anchor="_Toc242916246" w:history="1">
             <w:r>
               <w:rPr>
                 <w:rStyle w:val="Hyperlink"/>
@@ -5873,7 +6123,7 @@
               <w:rPr>
                 <w:noProof/>
               </w:rPr>
-              <w:instrText xml:space="preserve"> PAGEREF _Toc242620585 \h </w:instrText>
+              <w:instrText xml:space="preserve"> PAGEREF _Toc242916246 \h </w:instrText>
             </w:r>
             <w:r>
               <w:rPr>
@@ -5916,7 +6166,7 @@
               <w14:ligatures w14:val="standardContextual"/>
             </w:rPr>
           </w:pPr>
-          <w:hyperlink w:anchor="_Toc242620586" w:history="1">
+          <w:hyperlink w:anchor="_Toc242916247" w:history="1">
             <w:r>
               <w:rPr>
                 <w:rStyle w:val="Hyperlink"/>
@@ -5940,7 +6190,7 @@
               <w:rPr>
                 <w:noProof/>
               </w:rPr>
-              <w:instrText xml:space="preserve"> PAGEREF _Toc242620586 \h </w:instrText>
+              <w:instrText xml:space="preserve"> PAGEREF _Toc242916247 \h </w:instrText>
             </w:r>
             <w:r>
               <w:rPr>
@@ -5983,13 +6233,13 @@
               <w14:ligatures w14:val="standardContextual"/>
             </w:rPr>
           </w:pPr>
-          <w:hyperlink w:anchor="_Toc242620587" w:history="1">
+          <w:hyperlink w:anchor="_Toc242916248" w:history="1">
             <w:r>
               <w:rPr>
                 <w:rStyle w:val="Hyperlink"/>
                 <w:noProof/>
               </w:rPr>
-              <w:t>Table 3: Entities, their type, identifier and the requirements that justify them</w:t>
+              <w:t>Table 3: CR-007 changes</w:t>
             </w:r>
             <w:r>
               <w:rPr>
@@ -6007,7 +6257,7 @@
               <w:rPr>
                 <w:noProof/>
               </w:rPr>
-              <w:instrText xml:space="preserve"> PAGEREF _Toc242620587 \h </w:instrText>
+              <w:instrText xml:space="preserve"> PAGEREF _Toc242916248 \h </w:instrText>
             </w:r>
             <w:r>
               <w:rPr>
@@ -6050,13 +6300,13 @@
               <w14:ligatures w14:val="standardContextual"/>
             </w:rPr>
           </w:pPr>
-          <w:hyperlink w:anchor="_Toc242620588" w:history="1">
+          <w:hyperlink w:anchor="_Toc242916249" w:history="1">
             <w:r>
               <w:rPr>
                 <w:rStyle w:val="Hyperlink"/>
                 <w:noProof/>
               </w:rPr>
-              <w:t>Table 4: Rule node kinds and their meaning</w:t>
+              <w:t>Table 4: Entities, their type, identifier and the requirements that justify them</w:t>
             </w:r>
             <w:r>
               <w:rPr>
@@ -6074,7 +6324,7 @@
               <w:rPr>
                 <w:noProof/>
               </w:rPr>
-              <w:instrText xml:space="preserve"> PAGEREF _Toc242620588 \h </w:instrText>
+              <w:instrText xml:space="preserve"> PAGEREF _Toc242916249 \h </w:instrText>
             </w:r>
             <w:r>
               <w:rPr>
@@ -6091,7 +6341,7 @@
               <w:rPr>
                 <w:noProof/>
               </w:rPr>
-              <w:t>17</w:t>
+              <w:t>15</w:t>
             </w:r>
             <w:r>
               <w:rPr>
@@ -6117,13 +6367,13 @@
               <w14:ligatures w14:val="standardContextual"/>
             </w:rPr>
           </w:pPr>
-          <w:hyperlink w:anchor="_Toc242620589" w:history="1">
+          <w:hyperlink w:anchor="_Toc242916250" w:history="1">
             <w:r>
               <w:rPr>
                 <w:rStyle w:val="Hyperlink"/>
                 <w:noProof/>
               </w:rPr>
-              <w:t>Table 5: EER-to-relational mapping steps applied</w:t>
+              <w:t>Table 5: Rule node kinds and their meaning</w:t>
             </w:r>
             <w:r>
               <w:rPr>
@@ -6141,7 +6391,7 @@
               <w:rPr>
                 <w:noProof/>
               </w:rPr>
-              <w:instrText xml:space="preserve"> PAGEREF _Toc242620589 \h </w:instrText>
+              <w:instrText xml:space="preserve"> PAGEREF _Toc242916250 \h </w:instrText>
             </w:r>
             <w:r>
               <w:rPr>
@@ -6158,7 +6408,7 @@
               <w:rPr>
                 <w:noProof/>
               </w:rPr>
-              <w:t>18</w:t>
+              <w:t>17</w:t>
             </w:r>
             <w:r>
               <w:rPr>
@@ -6184,13 +6434,13 @@
               <w14:ligatures w14:val="standardContextual"/>
             </w:rPr>
           </w:pPr>
-          <w:hyperlink w:anchor="_Toc242620590" w:history="1">
+          <w:hyperlink w:anchor="_Toc242916251" w:history="1">
             <w:r>
               <w:rPr>
                 <w:rStyle w:val="Hyperlink"/>
                 <w:noProof/>
               </w:rPr>
-              <w:t>Table 6: Mapping of the student-account model</w:t>
+              <w:t>Table 6: EER-to-relational mapping steps applied</w:t>
             </w:r>
             <w:r>
               <w:rPr>
@@ -6208,7 +6458,7 @@
               <w:rPr>
                 <w:noProof/>
               </w:rPr>
-              <w:instrText xml:space="preserve"> PAGEREF _Toc242620590 \h </w:instrText>
+              <w:instrText xml:space="preserve"> PAGEREF _Toc242916251 \h </w:instrText>
             </w:r>
             <w:r>
               <w:rPr>
@@ -6225,7 +6475,7 @@
               <w:rPr>
                 <w:noProof/>
               </w:rPr>
-              <w:t>19</w:t>
+              <w:t>18</w:t>
             </w:r>
             <w:r>
               <w:rPr>
@@ -6251,13 +6501,13 @@
               <w14:ligatures w14:val="standardContextual"/>
             </w:rPr>
           </w:pPr>
-          <w:hyperlink w:anchor="_Toc242620591" w:history="1">
+          <w:hyperlink w:anchor="_Toc242916252" w:history="1">
             <w:r>
               <w:rPr>
                 <w:rStyle w:val="Hyperlink"/>
                 <w:noProof/>
               </w:rPr>
-              <w:t>Table 7: Dependencies identified in R1</w:t>
+              <w:t>Table 7: Mapping of the student-account model</w:t>
             </w:r>
             <w:r>
               <w:rPr>
@@ -6275,7 +6525,7 @@
               <w:rPr>
                 <w:noProof/>
               </w:rPr>
-              <w:instrText xml:space="preserve"> PAGEREF _Toc242620591 \h </w:instrText>
+              <w:instrText xml:space="preserve"> PAGEREF _Toc242916252 \h </w:instrText>
             </w:r>
             <w:r>
               <w:rPr>
@@ -6292,7 +6542,7 @@
               <w:rPr>
                 <w:noProof/>
               </w:rPr>
-              <w:t>22</w:t>
+              <w:t>19</w:t>
             </w:r>
             <w:r>
               <w:rPr>
@@ -6318,13 +6568,13 @@
               <w14:ligatures w14:val="standardContextual"/>
             </w:rPr>
           </w:pPr>
-          <w:hyperlink w:anchor="_Toc242620592" w:history="1">
+          <w:hyperlink w:anchor="_Toc242916253" w:history="1">
             <w:r>
               <w:rPr>
                 <w:rStyle w:val="Hyperlink"/>
                 <w:noProof/>
               </w:rPr>
-              <w:t>Table 8: Controlled denormalisations and why they are safe</w:t>
+              <w:t>Table 8: Dependencies identified in R1</w:t>
             </w:r>
             <w:r>
               <w:rPr>
@@ -6342,7 +6592,7 @@
               <w:rPr>
                 <w:noProof/>
               </w:rPr>
-              <w:instrText xml:space="preserve"> PAGEREF _Toc242620592 \h </w:instrText>
+              <w:instrText xml:space="preserve"> PAGEREF _Toc242916253 \h </w:instrText>
             </w:r>
             <w:r>
               <w:rPr>
@@ -6359,7 +6609,7 @@
               <w:rPr>
                 <w:noProof/>
               </w:rPr>
-              <w:t>23</w:t>
+              <w:t>22</w:t>
             </w:r>
             <w:r>
               <w:rPr>
@@ -6385,13 +6635,13 @@
               <w14:ligatures w14:val="standardContextual"/>
             </w:rPr>
           </w:pPr>
-          <w:hyperlink w:anchor="_Toc242620593" w:history="1">
+          <w:hyperlink w:anchor="_Toc242916254" w:history="1">
             <w:r>
               <w:rPr>
                 <w:rStyle w:val="Hyperlink"/>
                 <w:noProof/>
               </w:rPr>
-              <w:t>Table 9: Secondary indexes and the query each serves</w:t>
+              <w:t>Table 9: Controlled denormalisations and why they are safe</w:t>
             </w:r>
             <w:r>
               <w:rPr>
@@ -6409,7 +6659,7 @@
               <w:rPr>
                 <w:noProof/>
               </w:rPr>
-              <w:instrText xml:space="preserve"> PAGEREF _Toc242620593 \h </w:instrText>
+              <w:instrText xml:space="preserve"> PAGEREF _Toc242916254 \h </w:instrText>
             </w:r>
             <w:r>
               <w:rPr>
@@ -6426,7 +6676,7 @@
               <w:rPr>
                 <w:noProof/>
               </w:rPr>
-              <w:t>24</w:t>
+              <w:t>23</w:t>
             </w:r>
             <w:r>
               <w:rPr>
@@ -6452,13 +6702,13 @@
               <w14:ligatures w14:val="standardContextual"/>
             </w:rPr>
           </w:pPr>
-          <w:hyperlink w:anchor="_Toc242620594" w:history="1">
+          <w:hyperlink w:anchor="_Toc242916255" w:history="1">
             <w:r>
               <w:rPr>
                 <w:rStyle w:val="Hyperlink"/>
                 <w:noProof/>
               </w:rPr>
-              <w:t>Table 10: Data volume per intake year and free-plan headroom</w:t>
+              <w:t>Table 10: Secondary indexes and the query each serves</w:t>
             </w:r>
             <w:r>
               <w:rPr>
@@ -6476,7 +6726,7 @@
               <w:rPr>
                 <w:noProof/>
               </w:rPr>
-              <w:instrText xml:space="preserve"> PAGEREF _Toc242620594 \h </w:instrText>
+              <w:instrText xml:space="preserve"> PAGEREF _Toc242916255 \h </w:instrText>
             </w:r>
             <w:r>
               <w:rPr>
@@ -6493,7 +6743,7 @@
               <w:rPr>
                 <w:noProof/>
               </w:rPr>
-              <w:t>25</w:t>
+              <w:t>24</w:t>
             </w:r>
             <w:r>
               <w:rPr>
@@ -6519,13 +6769,13 @@
               <w14:ligatures w14:val="standardContextual"/>
             </w:rPr>
           </w:pPr>
-          <w:hyperlink w:anchor="_Toc242620595" w:history="1">
+          <w:hyperlink w:anchor="_Toc242916256" w:history="1">
             <w:r>
               <w:rPr>
                 <w:rStyle w:val="Hyperlink"/>
                 <w:noProof/>
               </w:rPr>
-              <w:t>Table 11: Schema validation results (5 October 2026)</w:t>
+              <w:t>Table 11: Data volume per intake year and free-plan headroom</w:t>
             </w:r>
             <w:r>
               <w:rPr>
@@ -6543,7 +6793,7 @@
               <w:rPr>
                 <w:noProof/>
               </w:rPr>
-              <w:instrText xml:space="preserve"> PAGEREF _Toc242620595 \h </w:instrText>
+              <w:instrText xml:space="preserve"> PAGEREF _Toc242916256 \h </w:instrText>
             </w:r>
             <w:r>
               <w:rPr>
@@ -6560,7 +6810,7 @@
               <w:rPr>
                 <w:noProof/>
               </w:rPr>
-              <w:t>26</w:t>
+              <w:t>25</w:t>
             </w:r>
             <w:r>
               <w:rPr>
@@ -6586,13 +6836,13 @@
               <w14:ligatures w14:val="standardContextual"/>
             </w:rPr>
           </w:pPr>
-          <w:hyperlink w:anchor="_Toc242620596" w:history="1">
+          <w:hyperlink w:anchor="_Toc242916257" w:history="1">
             <w:r>
               <w:rPr>
                 <w:rStyle w:val="Hyperlink"/>
                 <w:noProof/>
               </w:rPr>
-              <w:t>Table 12: Student-account validation results (5 October 2026)</w:t>
+              <w:t>Table 12: Schema validation results (5 October 2026)</w:t>
             </w:r>
             <w:r>
               <w:rPr>
@@ -6610,7 +6860,7 @@
               <w:rPr>
                 <w:noProof/>
               </w:rPr>
-              <w:instrText xml:space="preserve"> PAGEREF _Toc242620596 \h </w:instrText>
+              <w:instrText xml:space="preserve"> PAGEREF _Toc242916257 \h </w:instrText>
             </w:r>
             <w:r>
               <w:rPr>
@@ -6653,13 +6903,13 @@
               <w14:ligatures w14:val="standardContextual"/>
             </w:rPr>
           </w:pPr>
-          <w:hyperlink w:anchor="_Toc242620597" w:history="1">
+          <w:hyperlink w:anchor="_Toc242916258" w:history="1">
             <w:r>
               <w:rPr>
                 <w:rStyle w:val="Hyperlink"/>
                 <w:noProof/>
               </w:rPr>
-              <w:t>Table 13: Requirements and the tables that realise them</w:t>
+              <w:t>Table 13: Student-account validation results (5 October 2026)</w:t>
             </w:r>
             <w:r>
               <w:rPr>
@@ -6677,7 +6927,7 @@
               <w:rPr>
                 <w:noProof/>
               </w:rPr>
-              <w:instrText xml:space="preserve"> PAGEREF _Toc242620597 \h </w:instrText>
+              <w:instrText xml:space="preserve"> PAGEREF _Toc242916258 \h </w:instrText>
             </w:r>
             <w:r>
               <w:rPr>
@@ -6694,7 +6944,7 @@
               <w:rPr>
                 <w:noProof/>
               </w:rPr>
-              <w:t>28</w:t>
+              <w:t>26</w:t>
             </w:r>
             <w:r>
               <w:rPr>
@@ -6720,13 +6970,13 @@
               <w14:ligatures w14:val="standardContextual"/>
             </w:rPr>
           </w:pPr>
-          <w:hyperlink w:anchor="_Toc242620598" w:history="1">
+          <w:hyperlink w:anchor="_Toc242916259" w:history="1">
             <w:r>
               <w:rPr>
                 <w:rStyle w:val="Hyperlink"/>
                 <w:noProof/>
               </w:rPr>
-              <w:t>Table 14: Terms used in this document</w:t>
+              <w:t>Table 14: Requirements and the tables that realise them</w:t>
             </w:r>
             <w:r>
               <w:rPr>
@@ -6744,7 +6994,7 @@
               <w:rPr>
                 <w:noProof/>
               </w:rPr>
-              <w:instrText xml:space="preserve"> PAGEREF _Toc242620598 \h </w:instrText>
+              <w:instrText xml:space="preserve"> PAGEREF _Toc242916259 \h </w:instrText>
             </w:r>
             <w:r>
               <w:rPr>
@@ -6761,7 +7011,7 @@
               <w:rPr>
                 <w:noProof/>
               </w:rPr>
-              <w:t>47</w:t>
+              <w:t>28</w:t>
             </w:r>
             <w:r>
               <w:rPr>
@@ -6787,13 +7037,13 @@
               <w14:ligatures w14:val="standardContextual"/>
             </w:rPr>
           </w:pPr>
-          <w:hyperlink w:anchor="_Toc242620599" w:history="1">
+          <w:hyperlink w:anchor="_Toc242916260" w:history="1">
             <w:r>
               <w:rPr>
                 <w:rStyle w:val="Hyperlink"/>
                 <w:noProof/>
               </w:rPr>
-              <w:t>Table 15: Sources referred to in this document</w:t>
+              <w:t>Table 15: Terms used in this document</w:t>
             </w:r>
             <w:r>
               <w:rPr>
@@ -6811,7 +7061,7 @@
               <w:rPr>
                 <w:noProof/>
               </w:rPr>
-              <w:instrText xml:space="preserve"> PAGEREF _Toc242620599 \h </w:instrText>
+              <w:instrText xml:space="preserve"> PAGEREF _Toc242916260 \h </w:instrText>
             </w:r>
             <w:r>
               <w:rPr>
@@ -6829,6 +7079,73 @@
                 <w:noProof/>
               </w:rPr>
               <w:t>48</w:t>
+            </w:r>
+            <w:r>
+              <w:rPr>
+                <w:noProof/>
+              </w:rPr>
+              <w:fldChar w:fldCharType="end"/>
+            </w:r>
+          </w:hyperlink>
+        </w:p>
+        <w:p>
+          <w:pPr>
+            <w:pStyle w:val="TableofFigures"/>
+            <w:tabs>
+              <w:tab w:val="right" w:leader="dot" w:pos="9628"/>
+            </w:tabs>
+            <w:rPr>
+              <w:rFonts w:asciiTheme="minorHAnsi" w:eastAsiaTheme="minorEastAsia" w:hAnsiTheme="minorHAnsi" w:cstheme="minorBidi"/>
+              <w:noProof/>
+              <w:color w:val="auto"/>
+              <w:kern w:val="2"/>
+              <w:sz w:val="24"/>
+              <w:szCs w:val="24"/>
+              <w14:ligatures w14:val="standardContextual"/>
+            </w:rPr>
+          </w:pPr>
+          <w:hyperlink w:anchor="_Toc242916261" w:history="1">
+            <w:r>
+              <w:rPr>
+                <w:rStyle w:val="Hyperlink"/>
+                <w:noProof/>
+              </w:rPr>
+              <w:t>Table 16: Sources referred to in this document</w:t>
+            </w:r>
+            <w:r>
+              <w:rPr>
+                <w:noProof/>
+              </w:rPr>
+              <w:tab/>
+            </w:r>
+            <w:r>
+              <w:rPr>
+                <w:noProof/>
+              </w:rPr>
+              <w:fldChar w:fldCharType="begin"/>
+            </w:r>
+            <w:r>
+              <w:rPr>
+                <w:noProof/>
+              </w:rPr>
+              <w:instrText xml:space="preserve"> PAGEREF _Toc242916261 \h </w:instrText>
+            </w:r>
+            <w:r>
+              <w:rPr>
+                <w:noProof/>
+              </w:rPr>
+            </w:r>
+            <w:r>
+              <w:rPr>
+                <w:noProof/>
+              </w:rPr>
+              <w:fldChar w:fldCharType="separate"/>
+            </w:r>
+            <w:r>
+              <w:rPr>
+                <w:noProof/>
+              </w:rPr>
+              <w:t>49</w:t>
             </w:r>
             <w:r>
               <w:rPr>
@@ -6852,7 +7169,7 @@
         <w:keepLines/>
         <w:pageBreakBefore/>
       </w:pPr>
-      <w:bookmarkStart w:id="0" w:name="_Toc242620537"/>
+      <w:bookmarkStart w:id="0" w:name="_Toc242916196"/>
       <w:r>
         <w:lastRenderedPageBreak/>
         <w:t>1 Introduction</w:t>
@@ -6865,7 +7182,7 @@
         <w:keepNext/>
         <w:keepLines/>
       </w:pPr>
-      <w:bookmarkStart w:id="1" w:name="_Toc242620538"/>
+      <w:bookmarkStart w:id="1" w:name="_Toc242916197"/>
       <w:r>
         <w:t>1.1 Purpose</w:t>
       </w:r>
@@ -6915,7 +7232,7 @@
         <w:keepNext/>
         <w:keepLines/>
       </w:pPr>
-      <w:bookmarkStart w:id="2" w:name="_Toc242620539"/>
+      <w:bookmarkStart w:id="2" w:name="_Toc242916198"/>
       <w:r>
         <w:t>1.2 Scope</w:t>
       </w:r>
@@ -6936,10 +7253,7 @@
         <w:t>optional</w:t>
       </w:r>
       <w:r>
-        <w:t xml:space="preserve"> student account: a student who chooses to create one keeps the same profile on the server, under a username only, so it follows them between </w:t>
-      </w:r>
-      <w:r>
-        <w:t>devices and can drive reminders. Section 2.5 models it. The preference list stays on the device.</w:t>
+        <w:t xml:space="preserve"> student account: a student who chooses to create one keeps the same profile on the server, under a username only, so it follows them between devices and can drive reminders. Section 2.5 models it. The preference list stays on the device.</w:t>
       </w:r>
     </w:p>
     <w:p>
@@ -6948,7 +7262,7 @@
         <w:keepNext/>
         <w:keepLines/>
       </w:pPr>
-      <w:bookmarkStart w:id="3" w:name="_Toc242620540"/>
+      <w:bookmarkStart w:id="3" w:name="_Toc242916199"/>
       <w:r>
         <w:t>1.3 Intended audience</w:t>
       </w:r>
@@ -6968,7 +7282,7 @@
         <w:keepNext/>
         <w:keepLines/>
       </w:pPr>
-      <w:bookmarkStart w:id="4" w:name="_Toc242620541"/>
+      <w:bookmarkStart w:id="4" w:name="_Toc242916200"/>
       <w:r>
         <w:t>1.4 Relationship to other documents</w:t>
       </w:r>
@@ -6979,7 +7293,7 @@
         <w:pStyle w:val="Caption"/>
         <w:keepNext/>
       </w:pPr>
-      <w:bookmarkStart w:id="5" w:name="_Toc242620585"/>
+      <w:bookmarkStart w:id="5" w:name="_Toc242916246"/>
       <w:r>
         <w:t xml:space="preserve">Table </w:t>
       </w:r>
@@ -7021,7 +7335,7 @@
           <w:left w:w="10" w:type="dxa"/>
           <w:right w:w="10" w:type="dxa"/>
         </w:tblCellMar>
-        <w:tblLook w:val="0000" w:firstRow="0" w:lastRow="0" w:firstColumn="0" w:lastColumn="0" w:noHBand="0" w:noVBand="0"/>
+        <w:tblLook w:val="04A0" w:firstRow="1" w:lastRow="0" w:firstColumn="1" w:lastColumn="0" w:noHBand="0" w:noVBand="1"/>
       </w:tblPr>
       <w:tblGrid>
         <w:gridCol w:w="4819"/>
@@ -7498,7 +7812,7 @@
         <w:keepNext/>
         <w:keepLines/>
       </w:pPr>
-      <w:bookmarkStart w:id="6" w:name="_Toc242620542"/>
+      <w:bookmarkStart w:id="6" w:name="_Toc242916201"/>
       <w:r>
         <w:t>1.5 Notation</w:t>
       </w:r>
@@ -7619,10 +7933,7 @@
         <w:t>union category</w:t>
       </w:r>
       <w:r>
-        <w:t xml:space="preserve">. Partial keys of weak entities are </w:t>
-      </w:r>
-      <w:r>
-        <w:t>named in the entity catalogue. Logical diagrams use crow's-foot (Information Engineering) notation.</w:t>
+        <w:t>. Partial keys of weak entities are named in the entity catalogue. Logical diagrams use crow's-foot (Information Engineering) notation.</w:t>
       </w:r>
     </w:p>
     <w:p>
@@ -7632,7 +7943,7 @@
         <w:keepLines/>
         <w:pageBreakBefore/>
       </w:pPr>
-      <w:bookmarkStart w:id="7" w:name="_Toc242620543"/>
+      <w:bookmarkStart w:id="7" w:name="_Toc242916202"/>
       <w:r>
         <w:lastRenderedPageBreak/>
         <w:t>2 Conceptual model (EER)</w:t>
@@ -7645,7 +7956,7 @@
         <w:keepNext/>
         <w:keepLines/>
       </w:pPr>
-      <w:bookmarkStart w:id="8" w:name="_Toc242620544"/>
+      <w:bookmarkStart w:id="8" w:name="_Toc242916203"/>
       <w:r>
         <w:t>2.1 Offerings and cut-offs</w:t>
       </w:r>
@@ -7721,7 +8032,7 @@
         </w:rPr>
         <w:lastRenderedPageBreak/>
         <w:drawing>
-          <wp:inline distT="0" distB="0" distL="0" distR="0" wp14:anchorId="29D5F42C" wp14:editId="29D5F42D">
+          <wp:inline distT="0" distB="0" distL="0" distR="0" wp14:anchorId="5B7C7464" wp14:editId="5B7C7465">
             <wp:extent cx="6124575" cy="7553325"/>
             <wp:effectExtent l="0" t="0" r="0" b="0"/>
             <wp:docPr id="1" name="eer-offerings.png" descr="EER model of institutions, courses, offerings, intake years, selection groups and cut-offs" title="EER model of institutions, courses, offerings, intake years, selection groups and cut-offs"/>
@@ -7764,7 +8075,7 @@
       <w:pPr>
         <w:pStyle w:val="Caption"/>
       </w:pPr>
-      <w:bookmarkStart w:id="9" w:name="_Toc242620577"/>
+      <w:bookmarkStart w:id="9" w:name="_Toc242916238"/>
       <w:r>
         <w:t xml:space="preserve">Figure </w:t>
       </w:r>
@@ -7797,7 +8108,7 @@
         <w:keepNext/>
         <w:keepLines/>
       </w:pPr>
-      <w:bookmarkStart w:id="10" w:name="_Toc242620545"/>
+      <w:bookmarkStart w:id="10" w:name="_Toc242916204"/>
       <w:r>
         <w:t>2.2 Subjects and requirement rules</w:t>
       </w:r>
@@ -7833,7 +8144,7 @@
         </w:rPr>
         <w:lastRenderedPageBreak/>
         <w:drawing>
-          <wp:inline distT="0" distB="0" distL="0" distR="0" wp14:anchorId="29D5F42E" wp14:editId="29D5F42F">
+          <wp:inline distT="0" distB="0" distL="0" distR="0" wp14:anchorId="5B7C7466" wp14:editId="5B7C7467">
             <wp:extent cx="6124575" cy="6067425"/>
             <wp:effectExtent l="0" t="0" r="0" b="0"/>
             <wp:docPr id="2" name="eer-rules.png" descr="EER model of streams, subjects and the recursive requirement-rule tree" title="EER model of streams, subjects and the recursive requirement-rule tree"/>
@@ -7876,7 +8187,7 @@
       <w:pPr>
         <w:pStyle w:val="Caption"/>
       </w:pPr>
-      <w:bookmarkStart w:id="11" w:name="_Toc242620578"/>
+      <w:bookmarkStart w:id="11" w:name="_Toc242916239"/>
       <w:r>
         <w:t xml:space="preserve">Figure </w:t>
       </w:r>
@@ -7909,7 +8220,7 @@
         <w:keepNext/>
         <w:keepLines/>
       </w:pPr>
-      <w:bookmarkStart w:id="12" w:name="_Toc242620546"/>
+      <w:bookmarkStart w:id="12" w:name="_Toc242916205"/>
       <w:r>
         <w:t>2.3 Provenance and trust</w:t>
       </w:r>
@@ -7945,7 +8256,7 @@
         </w:rPr>
         <w:lastRenderedPageBreak/>
         <w:drawing>
-          <wp:inline distT="0" distB="0" distL="0" distR="0" wp14:anchorId="29D5F430" wp14:editId="29D5F431">
+          <wp:inline distT="0" distB="0" distL="0" distR="0" wp14:anchorId="5B7C7468" wp14:editId="5B7C7469">
             <wp:extent cx="6124575" cy="4829175"/>
             <wp:effectExtent l="0" t="0" r="0" b="0"/>
             <wp:docPr id="3" name="eer-provenance.png" descr="EER model of cited facts, sources, revisions, AI extraction, review and mistake reports" title="EER model of cited facts, sources, revisions, AI extraction, review and mistake reports"/>
@@ -7988,7 +8299,7 @@
       <w:pPr>
         <w:pStyle w:val="Caption"/>
       </w:pPr>
-      <w:bookmarkStart w:id="13" w:name="_Toc242620579"/>
+      <w:bookmarkStart w:id="13" w:name="_Toc242916240"/>
       <w:r>
         <w:t xml:space="preserve">Figure </w:t>
       </w:r>
@@ -8021,7 +8332,7 @@
         <w:keepNext/>
         <w:keepLines/>
       </w:pPr>
-      <w:bookmarkStart w:id="14" w:name="_Toc242620547"/>
+      <w:bookmarkStart w:id="14" w:name="_Toc242916206"/>
       <w:r>
         <w:t>2.4 Journey and other routes</w:t>
       </w:r>
@@ -8038,7 +8349,7 @@
           <w:noProof/>
         </w:rPr>
         <w:drawing>
-          <wp:inline distT="0" distB="0" distL="0" distR="0" wp14:anchorId="29D5F432" wp14:editId="29D5F433">
+          <wp:inline distT="0" distB="0" distL="0" distR="0" wp14:anchorId="5B7C746A" wp14:editId="5B7C746B">
             <wp:extent cx="6124575" cy="2895600"/>
             <wp:effectExtent l="0" t="0" r="0" b="0"/>
             <wp:docPr id="4" name="eer-journey.png" descr="EER model of deadlines, push reminders and the specialisation of other routes" title="EER model of deadlines, push reminders and the specialisation of other routes"/>
@@ -8081,7 +8392,7 @@
       <w:pPr>
         <w:pStyle w:val="Caption"/>
       </w:pPr>
-      <w:bookmarkStart w:id="15" w:name="_Toc242620580"/>
+      <w:bookmarkStart w:id="15" w:name="_Toc242916241"/>
       <w:r>
         <w:t xml:space="preserve">Figure </w:t>
       </w:r>
@@ -8114,7 +8425,7 @@
         <w:keepNext/>
         <w:keepLines/>
       </w:pPr>
-      <w:bookmarkStart w:id="16" w:name="_Toc242620548"/>
+      <w:bookmarkStart w:id="16" w:name="_Toc242916207"/>
       <w:r>
         <w:lastRenderedPageBreak/>
         <w:t>2.5 Student accounts (CR-001)</w:t>
@@ -8126,10 +8437,7 @@
         <w:spacing w:after="120"/>
       </w:pPr>
       <w:r>
-        <w:t xml:space="preserve">A student account is optional. ACCOUNT, already the superclass of the staff roles, gains a fourth subclass, </w:t>
-      </w:r>
-      <w:r>
-        <w:t xml:space="preserve">STUDENT. Each way of signing in is its own weak entity of ACCOUNT, so a later identity provider (for example Google sign-in) adds an entity without touching the others. A password is never stored: PASSWORD_LOGIN holds a salt and a </w:t>
+        <w:t xml:space="preserve">A student account is optional. ACCOUNT, already the superclass of the staff roles, gains a fourth subclass, STUDENT. Each way of signing in is its own weak entity of ACCOUNT, so a later identity provider (for example Google sign-in) adds an entity without touching the others. A password is never stored: PASSWORD_LOGIN holds a salt and a </w:t>
       </w:r>
       <w:r>
         <w:rPr>
@@ -8139,10 +8447,10 @@
         <w:t>verifier</w:t>
       </w:r>
       <w:r>
-        <w:t xml:space="preserve">, a hash of a key the student's device derives from the password. A STUDENT's results are the attributes the device already keeps: a Z-score, the stream sat (SAT_IN), the district sat from (SAT_FROM), and </w:t>
-      </w:r>
-      <w:r>
-        <w:t>three subjects with grades (TOOK, whose attributes are Grade and Position). Achievements are a weak entity with partial key Position; interests are a multi-valued attribute. CR-001 stored no name, email address or telephone number; CR-003 (below) withdraws that and adds them, with consent, in a table of their own.</w:t>
+        <w:t xml:space="preserve">, a hash of a key the student's device derives from the password. A STUDENT's results are the attributes the device already keeps: a Z-score, the stream sat (SAT_IN), the district sat from (SAT_FROM), and three subjects with grades (TOOK, whose attributes are Grade and Position). Achievements are a weak entity with partial key Position; interests are a multi-valued attribute. CR-001 stored no name, email address or telephone </w:t>
+      </w:r>
+      <w:r>
+        <w:t>number; CR-003 (below) withdraws that and adds them, with consent, in a table of their own.</w:t>
       </w:r>
     </w:p>
     <w:p>
@@ -8156,7 +8464,7 @@
           <w:noProof/>
         </w:rPr>
         <w:drawing>
-          <wp:inline distT="0" distB="0" distL="0" distR="0" wp14:anchorId="29D5F434" wp14:editId="29D5F435">
+          <wp:inline distT="0" distB="0" distL="0" distR="0" wp14:anchorId="5B7C746C" wp14:editId="5B7C746D">
             <wp:extent cx="6124575" cy="2857500"/>
             <wp:effectExtent l="0" t="0" r="0" b="0"/>
             <wp:docPr id="5" name="eer-accounts.png" descr="EER model of optional student accounts: sign-in, sessions, recovery and the student's results" title="EER model of optional student accounts: sign-in, sessions, recovery and the student's results"/>
@@ -8199,7 +8507,7 @@
       <w:pPr>
         <w:pStyle w:val="Caption"/>
       </w:pPr>
-      <w:bookmarkStart w:id="17" w:name="_Toc242620581"/>
+      <w:bookmarkStart w:id="17" w:name="_Toc242916242"/>
       <w:r>
         <w:t xml:space="preserve">Figure </w:t>
       </w:r>
@@ -8232,7 +8540,7 @@
         <w:keepNext/>
         <w:keepLines/>
       </w:pPr>
-      <w:bookmarkStart w:id="18" w:name="_Toc242620549"/>
+      <w:bookmarkStart w:id="18" w:name="_Toc242916208"/>
       <w:r>
         <w:t>2.6 Journey, Alerts and Groups (CR-002)</w:t>
       </w:r>
@@ -8268,7 +8576,7 @@
           <w:left w:w="10" w:type="dxa"/>
           <w:right w:w="10" w:type="dxa"/>
         </w:tblCellMar>
-        <w:tblLook w:val="0000" w:firstRow="0" w:lastRow="0" w:firstColumn="0" w:lastColumn="0" w:noHBand="0" w:noVBand="0"/>
+        <w:tblLook w:val="04A0" w:firstRow="1" w:lastRow="0" w:firstColumn="1" w:lastColumn="0" w:noHBand="0" w:noVBand="1"/>
       </w:tblPr>
       <w:tblGrid>
         <w:gridCol w:w="2877"/>
@@ -8890,10 +9198,7 @@
         <w:t>rule</w:t>
       </w:r>
       <w:r>
-        <w:t xml:space="preserve"> (for example, </w:t>
-      </w:r>
-      <w:r>
-        <w:t>"within two weeks of the closing date", p.116) and dated items come from cited notices. No date is invented.</w:t>
+        <w:t xml:space="preserve"> (for example, "within two weeks of the closing date", p.116) and dated items come from cited notices. No date is invented.</w:t>
       </w:r>
     </w:p>
     <w:p>
@@ -8920,10 +9225,7 @@
         <w:t>account.verified_for_letter</w:t>
       </w:r>
       <w:r>
-        <w:t xml:space="preserve">), and the 0003 triggers already keep student data off non-student accounts. A SENIOR_INVITE (one-time code, stored only as its SHA-256) names the course, institution and study year </w:t>
-      </w:r>
-      <w:r>
-        <w:t>the product owner checked; redeeming it at sign-up creates the SENIOR account and marks the invite in one atomic batch. A trigger allows redemption only by a SENIOR account of the invite's institution, and only once.</w:t>
+        <w:t>), and the 0003 triggers already keep student data off non-student accounts. A SENIOR_INVITE (one-time code, stored only as its SHA-256) names the course, institution and study year the product owner checked; redeeming it at sign-up creates the SENIOR account and marks the invite in one atomic batch. A trigger allows redemption only by a SENIOR account of the invite's institution, and only once.</w:t>
       </w:r>
     </w:p>
     <w:p>
@@ -8938,7 +9240,10 @@
         <w:t>Reference rows for foreign keys.</w:t>
       </w:r>
       <w:r>
-        <w:t xml:space="preserve"> Migration 0005 loads the 121 courses and 20 institutions of 2025/26 (generated by </w:t>
+        <w:t xml:space="preserve"> Migration 0005 loads the 121 courses and 20 institutions of 2025/26 (generated </w:t>
+      </w:r>
+      <w:r>
+        <w:t xml:space="preserve">by </w:t>
       </w:r>
       <w:r>
         <w:rPr>
@@ -8968,7 +9273,7 @@
           <w:left w:w="10" w:type="dxa"/>
           <w:right w:w="10" w:type="dxa"/>
         </w:tblCellMar>
-        <w:tblLook w:val="0000" w:firstRow="0" w:lastRow="0" w:firstColumn="0" w:lastColumn="0" w:noHBand="0" w:noVBand="0"/>
+        <w:tblLook w:val="04A0" w:firstRow="1" w:lastRow="0" w:firstColumn="1" w:lastColumn="0" w:noHBand="0" w:noVBand="1"/>
       </w:tblPr>
       <w:tblGrid>
         <w:gridCol w:w="1588"/>
@@ -9798,10 +10103,7 @@
         <w:spacing w:after="120"/>
       </w:pPr>
       <w:r>
-        <w:t xml:space="preserve">Messages are outside D1's cascade, so deleting an account also tells every group it was in to delete that account's </w:t>
-      </w:r>
-      <w:r>
-        <w:t>messages (tested). All tables are in BCNF: every determinant is a candidate key; derived values (member counts, the senior badge text) are computed, never stored.</w:t>
+        <w:t>Messages are outside D1's cascade, so deleting an account also tells every group it was in to delete that account's messages (tested). All tables are in BCNF: every determinant is a candidate key; derived values (member counts, the senior badge text) are computed, never stored.</w:t>
       </w:r>
     </w:p>
     <w:p>
@@ -9810,7 +10112,7 @@
         <w:keepNext/>
         <w:keepLines/>
       </w:pPr>
-      <w:bookmarkStart w:id="19" w:name="_Toc242620550"/>
+      <w:bookmarkStart w:id="19" w:name="_Toc242916209"/>
       <w:r>
         <w:t>2.7 Contact details (CR-003)</w:t>
       </w:r>
@@ -9828,10 +10130,10 @@
         <w:t>Decision.</w:t>
       </w:r>
       <w:r>
-        <w:t xml:space="preserve"> On 11 October 2026 the product owner made an account compulsory at the start, with full name, email, mobile number and date of birth (the birthday moves here from the Alerts screen, where it stayed on the phone). This </w:t>
-      </w:r>
-      <w:r>
-        <w:t>reverses the CR-001 promise "a username only". The README, the business case and the app's privacy text now say exactly what is collected and why.</w:t>
+        <w:t xml:space="preserve"> On 11 October 2026 the product owner made an account compulsory at the start, with full name, email, </w:t>
+      </w:r>
+      <w:r>
+        <w:t>mobile number and date of birth (the birthday moves here from the Alerts screen, where it stayed on the phone). This reverses the CR-001 promise "a username only". The README, the business case and the app's privacy text now say exactly what is collected and why.</w:t>
       </w:r>
     </w:p>
     <w:p>
@@ -9882,7 +10184,10 @@
         <w:t>account</w:t>
       </w:r>
       <w:r>
-        <w:t xml:space="preserve"> is the identity table shared by every role, and personal contact data kept apart can be audited, exported or deleted on its own. It cascades with the account.</w:t>
+        <w:t xml:space="preserve"> is the identity table shared by every role, </w:t>
+      </w:r>
+      <w:r>
+        <w:t>and personal contact data kept apart can be audited, exported or deleted on its own. It cascades with the account.</w:t>
       </w:r>
     </w:p>
     <w:tbl>
@@ -9900,7 +10205,7 @@
           <w:left w:w="10" w:type="dxa"/>
           <w:right w:w="10" w:type="dxa"/>
         </w:tblCellMar>
-        <w:tblLook w:val="0000" w:firstRow="0" w:lastRow="0" w:firstColumn="0" w:lastColumn="0" w:noHBand="0" w:noVBand="0"/>
+        <w:tblLook w:val="04A0" w:firstRow="1" w:lastRow="0" w:firstColumn="1" w:lastColumn="0" w:noHBand="0" w:noVBand="1"/>
       </w:tblPr>
       <w:tblGrid>
         <w:gridCol w:w="3876"/>
@@ -10519,10 +10824,7 @@
         <w:t>PUT /api/me/contact</w:t>
       </w:r>
       <w:r>
-        <w:t xml:space="preserve">). Safe default: no existing row is invented or guessed. Students under 18 confirm that a </w:t>
-      </w:r>
-      <w:r>
-        <w:t>parent or guardian agrees (Personal Data Protection Act, No. 9 of 2022). The table is in BCNF: the only determinant is the key.</w:t>
+        <w:t>). Safe default: no existing row is invented or guessed. Students under 18 confirm that a parent or guardian agrees (Personal Data Protection Act, No. 9 of 2022). The table is in BCNF: the only determinant is the key.</w:t>
       </w:r>
     </w:p>
     <w:p>
@@ -10531,7 +10833,7 @@
         <w:keepNext/>
         <w:keepLines/>
       </w:pPr>
-      <w:bookmarkStart w:id="20" w:name="_Toc242620551"/>
+      <w:bookmarkStart w:id="20" w:name="_Toc242916210"/>
       <w:r>
         <w:t>2.8 Answer feedback (CR-004)</w:t>
       </w:r>
@@ -10578,7 +10880,10 @@
         <w:t>fact_id</w:t>
       </w:r>
       <w:r>
-        <w:t xml:space="preserve"> is required), and an AI answer is not one. A row holds the rating, the question, the answer, the handbook pages it cited (JSON, checked by </w:t>
+        <w:t xml:space="preserve"> is required), and an AI answer is not one. </w:t>
+      </w:r>
+      <w:r>
+        <w:t xml:space="preserve">A row holds the rating, the question, the answer, the handbook pages it cited (JSON, checked by </w:t>
       </w:r>
       <w:r>
         <w:rPr>
@@ -10590,10 +10895,7 @@
         <w:t>json_valid</w:t>
       </w:r>
       <w:r>
-        <w:t xml:space="preserve">), an </w:t>
-      </w:r>
-      <w:r>
-        <w:t>optional note, the app language and a review state. It holds nothing that identifies the student: no account, device or IP. The screen says the question and answer are sent before the student sends a report.</w:t>
+        <w:t>), an optional note, the app language and a review state. It holds nothing that identifies the student: no account, device or IP. The screen says the question and answer are sent before the student sends a report.</w:t>
       </w:r>
     </w:p>
     <w:p>
@@ -10602,7 +10904,7 @@
         <w:keepNext/>
         <w:keepLines/>
       </w:pPr>
-      <w:bookmarkStart w:id="21" w:name="_Toc242620552"/>
+      <w:bookmarkStart w:id="21" w:name="_Toc242916211"/>
       <w:r>
         <w:t>2.9 Group rules and sample conversations (CR-005)</w:t>
       </w:r>
@@ -10637,10 +10939,7 @@
         <w:t>rules_version</w:t>
       </w:r>
       <w:r>
-        <w:t xml:space="preserve">, migration 0009) rather than a new table: one value per (group, member), fully </w:t>
-      </w:r>
-      <w:r>
-        <w:t>dependent on the key, so the table stays in BCNF. A CHECK lists the versions that exist (</w:t>
+        <w:t>, migration 0009) rather than a new table: one value per (group, member), fully dependent on the key, so the table stays in BCNF. A CHECK lists the versions that exist (</w:t>
       </w:r>
       <w:r>
         <w:rPr>
@@ -10737,7 +11036,7 @@
         <w:keepNext/>
         <w:keepLines/>
       </w:pPr>
-      <w:bookmarkStart w:id="22" w:name="_Toc242620553"/>
+      <w:bookmarkStart w:id="22" w:name="_Toc242916212"/>
       <w:r>
         <w:t>2.10 Journey, avatars and group rules on the account (CR-006)</w:t>
       </w:r>
@@ -10785,14 +11084,7 @@
           <w:b/>
           <w:bCs/>
         </w:rPr>
-        <w:t xml:space="preserve">only once </w:t>
-      </w:r>
-      <w:r>
-        <w:rPr>
-          <w:b/>
-          <w:bCs/>
-        </w:rPr>
-        <w:t>its window is open</w:t>
+        <w:t>only once its window is open</w:t>
       </w:r>
       <w:r>
         <w:t>, which the server checks. Migration 0010 implements the design below.</w:t>
@@ -10803,7 +11095,7 @@
         <w:pStyle w:val="Caption"/>
         <w:keepNext/>
       </w:pPr>
-      <w:bookmarkStart w:id="23" w:name="_Toc242620586"/>
+      <w:bookmarkStart w:id="23" w:name="_Toc242916247"/>
       <w:r>
         <w:lastRenderedPageBreak/>
         <w:t xml:space="preserve">Table </w:t>
@@ -10846,7 +11138,7 @@
           <w:left w:w="10" w:type="dxa"/>
           <w:right w:w="10" w:type="dxa"/>
         </w:tblCellMar>
-        <w:tblLook w:val="0000" w:firstRow="0" w:lastRow="0" w:firstColumn="0" w:lastColumn="0" w:noHBand="0" w:noVBand="0"/>
+        <w:tblLook w:val="04A0" w:firstRow="1" w:lastRow="0" w:firstColumn="1" w:lastColumn="0" w:noHBand="0" w:noVBand="1"/>
       </w:tblPr>
       <w:tblGrid>
         <w:gridCol w:w="2458"/>
@@ -11761,10 +12053,7 @@
         <w:t>Mapping.</w:t>
       </w:r>
       <w:r>
-        <w:t xml:space="preserve"> Every new relationship is many-to-many with its own attributes, so each maps to its own relation whose key </w:t>
-      </w:r>
-      <w:r>
-        <w:t>is the pair of participating keys (mapping step 5). The avatar is a single-valued attribute of ACCOUNT and stays on it (step 1). The acceptance is no longer a column of GROUP_MEMBER because it does not depend on the group: under CR-005 the same fact was repeated once per group the student joined, a partial-dependency redundancy that CR-006 removes.</w:t>
+        <w:t xml:space="preserve"> Every new relationship is many-to-many with its own attributes, so each maps to its own relation whose key is the pair of participating keys (mapping step 5). The avatar is a single-valued attribute of ACCOUNT and stays on it (step 1). The acceptance is no longer a column of GROUP_MEMBER because it does not depend on the group: under CR-005 the same fact was repeated once per group the student joined, a partial-dependency redundancy that CR-006 removes.</w:t>
       </w:r>
     </w:p>
     <w:p>
@@ -11878,7 +12167,10 @@
         <w:t>offering</w:t>
       </w:r>
       <w:r>
-        <w:t xml:space="preserve"> was defined in 0001 but left empty because the read model serves the course data. 0010 fills it with the 255 Uni-Codes of 2025/26 (handbook pages 142 to 148, generated by </w:t>
+        <w:t xml:space="preserve"> was defined in 0001 but left empty because the read model serves the </w:t>
+      </w:r>
+      <w:r>
+        <w:t xml:space="preserve">course data. 0010 fills it with the 255 Uni-Codes of 2025/26 (handbook pages 142 to 148, generated by </w:t>
       </w:r>
       <w:r>
         <w:rPr>
@@ -11965,7 +12257,10 @@
         <w:t>opensOn</w:t>
       </w:r>
       <w:r>
-        <w:t xml:space="preserve"> in the journey read model); while no date is announced it cannot be ticked, because ZedPath never invents a date. "I applied" on a followed notice can be set only once the notice has opened. The Worker checks both against the read model, using the Sri Lanka date (UTC+05:30), before writing (</w:t>
+        <w:t xml:space="preserve"> in the journey read model); while no date is announced it cannot be ticked, because ZedPath never invents a date. "I applied" on a followed </w:t>
+      </w:r>
+      <w:r>
+        <w:t>notice can be set only once the notice has opened. The Worker checks both against the read model, using the Sri Lanka date (UTC+05:30), before writing (</w:t>
       </w:r>
       <w:r>
         <w:rPr>
@@ -12017,10 +12312,10 @@
         <w:t>group_member.rules_version</w:t>
       </w:r>
       <w:r>
-        <w:t xml:space="preserve"> is no longer read or written but is kept for now (expand, then contract): the previous release still writes it, so a </w:t>
-      </w:r>
-      <w:r>
-        <w:t>rollback stays safe; a later migration drops it once this release is stable. No avatar means initials, as before. A new account's Journey is empty: nothing is ticked for the student. Journey items kept on a phone before CR-006 are copied to the account by the app on first use.</w:t>
+        <w:t xml:space="preserve"> is </w:t>
+      </w:r>
+      <w:r>
+        <w:t>no longer read or written but is kept for now (expand, then contract): the previous release still writes it, so a rollback stays safe; a later migration drops it once this release is stable. No avatar means initials, as before. A new account's Journey is empty: nothing is ticked for the student. Journey items kept on a phone before CR-006 are copied to the account by the app on first use.</w:t>
       </w:r>
     </w:p>
     <w:p>
@@ -12035,7 +12330,10 @@
         <w:t>Privacy.</w:t>
       </w:r>
       <w:r>
-        <w:t xml:space="preserve"> The members list of a group (members only) returns usernames, avatars and senior badges, never the name, email or mobile in </w:t>
+        <w:t xml:space="preserve"> The members list of a group (members only) returns usernames, avatars and senior badges, never the name, </w:t>
+      </w:r>
+      <w:r>
+        <w:t xml:space="preserve">email or mobile in </w:t>
       </w:r>
       <w:r>
         <w:rPr>
@@ -12047,10 +12345,7 @@
         <w:t>student_contact</w:t>
       </w:r>
       <w:r>
-        <w:t xml:space="preserve">. Every new relation cascades on account deletion. In each group's room, a message </w:t>
-      </w:r>
-      <w:r>
-        <w:t>keeps the author's avatar as it was when posted, a snapshot like the author name (a deliberate departure).</w:t>
+        <w:t>. Every new relation cascades on account deletion. In each group's room, a message keeps the author's avatar as it was when posted, a snapshot like the author name (a deliberate departure).</w:t>
       </w:r>
     </w:p>
     <w:p>
@@ -12059,18 +12354,66 @@
         <w:keepNext/>
         <w:keepLines/>
       </w:pPr>
-      <w:bookmarkStart w:id="24" w:name="_Toc242620554"/>
-      <w:r>
-        <w:t>2.11 Entity catalogue</w:t>
+      <w:bookmarkStart w:id="24" w:name="_Toc242916213"/>
+      <w:r>
+        <w:t>2.11 Demo accounts (CR-007)</w:t>
       </w:r>
       <w:bookmarkEnd w:id="24"/>
+    </w:p>
+    <w:p>
+      <w:pPr>
+        <w:spacing w:after="120"/>
+      </w:pPr>
+      <w:r>
+        <w:t xml:space="preserve">The product owner asked for a one-tap demo on the Welcome screen (15 October 2026), choosing a </w:t>
+      </w:r>
+      <w:r>
+        <w:rPr>
+          <w:b/>
+          <w:bCs/>
+        </w:rPr>
+        <w:t>private copy per visitor</w:t>
+      </w:r>
+      <w:r>
+        <w:t xml:space="preserve"> over one shared account. Each tap creates a throwaway account holding the sample student; it expires 24 hours </w:t>
+      </w:r>
+      <w:r>
+        <w:t>later and is deleted on a later demo tap (the free plan has no scheduled job).</w:t>
+      </w:r>
+    </w:p>
+    <w:p>
+      <w:pPr>
+        <w:spacing w:after="120"/>
+      </w:pPr>
+      <w:r>
+        <w:rPr>
+          <w:b/>
+          <w:bCs/>
+        </w:rPr>
+        <w:t>Where the fact lives.</w:t>
+      </w:r>
+      <w:r>
+        <w:t xml:space="preserve"> "This account is a demo, until T" is a single-valued fact about the account, so it is an attribute of ACCOUNT (</w:t>
+      </w:r>
+      <w:r>
+        <w:rPr>
+          <w:rFonts w:ascii="Consolas" w:eastAsia="Consolas" w:hAnsi="Consolas" w:cs="Consolas"/>
+          <w:sz w:val="19"/>
+          <w:szCs w:val="19"/>
+          <w:shd w:val="clear" w:color="auto" w:fill="F2F4F3"/>
+        </w:rPr>
+        <w:t>demo_expires_at</w:t>
+      </w:r>
+      <w:r>
+        <w:t>, NULL for every real account), not a new entity. Reusing ACCOUNT means every row a demo creates (profile, contact, list, Journey, sessions, memberships, rules acceptance) is already removed by the existing ON DELETE CASCADE foreign keys: no second deletion path to keep in step.</w:t>
+      </w:r>
     </w:p>
     <w:p>
       <w:pPr>
         <w:pStyle w:val="Caption"/>
         <w:keepNext/>
       </w:pPr>
-      <w:bookmarkStart w:id="25" w:name="_Toc242620587"/>
+      <w:bookmarkStart w:id="25" w:name="_Toc242916248"/>
       <w:r>
         <w:t xml:space="preserve">Table </w:t>
       </w:r>
@@ -12093,7 +12436,7 @@
         <w:fldChar w:fldCharType="end"/>
       </w:r>
       <w:r>
-        <w:t>: Entities, their type, identifier and the requirements that justify them</w:t>
+        <w:t>: CR-007 changes</w:t>
       </w:r>
       <w:bookmarkEnd w:id="25"/>
     </w:p>
@@ -12112,7 +12455,473 @@
           <w:left w:w="10" w:type="dxa"/>
           <w:right w:w="10" w:type="dxa"/>
         </w:tblCellMar>
-        <w:tblLook w:val="0000" w:firstRow="0" w:lastRow="0" w:firstColumn="0" w:lastColumn="0" w:noHBand="0" w:noVBand="0"/>
+        <w:tblLook w:val="04A0" w:firstRow="1" w:lastRow="0" w:firstColumn="1" w:lastColumn="0" w:noHBand="0" w:noVBand="1"/>
+      </w:tblPr>
+      <w:tblGrid>
+        <w:gridCol w:w="2547"/>
+        <w:gridCol w:w="3412"/>
+        <w:gridCol w:w="3679"/>
+      </w:tblGrid>
+      <w:tr>
+        <w:tblPrEx>
+          <w:tblCellMar>
+            <w:top w:w="0" w:type="dxa"/>
+            <w:bottom w:w="0" w:type="dxa"/>
+          </w:tblCellMar>
+        </w:tblPrEx>
+        <w:trPr>
+          <w:cantSplit/>
+          <w:tblHeader/>
+        </w:trPr>
+        <w:tc>
+          <w:tcPr>
+            <w:tcW w:w="2547" w:type="dxa"/>
+            <w:tcBorders>
+              <w:top w:val="single" w:sz="4" w:space="0" w:color="C9D3D0"/>
+              <w:left w:val="single" w:sz="4" w:space="0" w:color="C9D3D0"/>
+              <w:bottom w:val="single" w:sz="4" w:space="0" w:color="C9D3D0"/>
+              <w:right w:val="single" w:sz="4" w:space="0" w:color="C9D3D0"/>
+            </w:tcBorders>
+            <w:shd w:val="clear" w:color="auto" w:fill="006B5F"/>
+            <w:tcMar>
+              <w:top w:w="50" w:type="dxa"/>
+              <w:left w:w="100" w:type="dxa"/>
+              <w:bottom w:w="50" w:type="dxa"/>
+              <w:right w:w="100" w:type="dxa"/>
+            </w:tcMar>
+            <w:vAlign w:val="center"/>
+          </w:tcPr>
+          <w:p>
+            <w:pPr>
+              <w:spacing w:line="252" w:lineRule="auto"/>
+            </w:pPr>
+            <w:r>
+              <w:rPr>
+                <w:b/>
+                <w:bCs/>
+                <w:color w:val="FFFFFF"/>
+                <w:sz w:val="19"/>
+                <w:szCs w:val="19"/>
+              </w:rPr>
+              <w:t>Change</w:t>
+            </w:r>
+          </w:p>
+        </w:tc>
+        <w:tc>
+          <w:tcPr>
+            <w:tcW w:w="3412" w:type="dxa"/>
+            <w:tcBorders>
+              <w:top w:val="single" w:sz="4" w:space="0" w:color="C9D3D0"/>
+              <w:left w:val="single" w:sz="4" w:space="0" w:color="C9D3D0"/>
+              <w:bottom w:val="single" w:sz="4" w:space="0" w:color="C9D3D0"/>
+              <w:right w:val="single" w:sz="4" w:space="0" w:color="C9D3D0"/>
+            </w:tcBorders>
+            <w:shd w:val="clear" w:color="auto" w:fill="006B5F"/>
+            <w:tcMar>
+              <w:top w:w="50" w:type="dxa"/>
+              <w:left w:w="100" w:type="dxa"/>
+              <w:bottom w:w="50" w:type="dxa"/>
+              <w:right w:w="100" w:type="dxa"/>
+            </w:tcMar>
+            <w:vAlign w:val="center"/>
+          </w:tcPr>
+          <w:p>
+            <w:pPr>
+              <w:spacing w:line="252" w:lineRule="auto"/>
+            </w:pPr>
+            <w:r>
+              <w:rPr>
+                <w:b/>
+                <w:bCs/>
+                <w:color w:val="FFFFFF"/>
+                <w:sz w:val="19"/>
+                <w:szCs w:val="19"/>
+              </w:rPr>
+              <w:t>Kind</w:t>
+            </w:r>
+          </w:p>
+        </w:tc>
+        <w:tc>
+          <w:tcPr>
+            <w:tcW w:w="3679" w:type="dxa"/>
+            <w:tcBorders>
+              <w:top w:val="single" w:sz="4" w:space="0" w:color="C9D3D0"/>
+              <w:left w:val="single" w:sz="4" w:space="0" w:color="C9D3D0"/>
+              <w:bottom w:val="single" w:sz="4" w:space="0" w:color="C9D3D0"/>
+              <w:right w:val="single" w:sz="4" w:space="0" w:color="C9D3D0"/>
+            </w:tcBorders>
+            <w:shd w:val="clear" w:color="auto" w:fill="006B5F"/>
+            <w:tcMar>
+              <w:top w:w="50" w:type="dxa"/>
+              <w:left w:w="100" w:type="dxa"/>
+              <w:bottom w:w="50" w:type="dxa"/>
+              <w:right w:w="100" w:type="dxa"/>
+            </w:tcMar>
+            <w:vAlign w:val="center"/>
+          </w:tcPr>
+          <w:p>
+            <w:pPr>
+              <w:spacing w:line="252" w:lineRule="auto"/>
+            </w:pPr>
+            <w:r>
+              <w:rPr>
+                <w:b/>
+                <w:bCs/>
+                <w:color w:val="FFFFFF"/>
+                <w:sz w:val="19"/>
+                <w:szCs w:val="19"/>
+              </w:rPr>
+              <w:t>Rule</w:t>
+            </w:r>
+          </w:p>
+        </w:tc>
+      </w:tr>
+      <w:tr>
+        <w:tblPrEx>
+          <w:tblCellMar>
+            <w:top w:w="0" w:type="dxa"/>
+            <w:bottom w:w="0" w:type="dxa"/>
+          </w:tblCellMar>
+        </w:tblPrEx>
+        <w:trPr>
+          <w:cantSplit/>
+        </w:trPr>
+        <w:tc>
+          <w:tcPr>
+            <w:tcW w:w="2547" w:type="dxa"/>
+            <w:tcBorders>
+              <w:top w:val="single" w:sz="4" w:space="0" w:color="C9D3D0"/>
+              <w:left w:val="single" w:sz="4" w:space="0" w:color="C9D3D0"/>
+              <w:bottom w:val="single" w:sz="4" w:space="0" w:color="C9D3D0"/>
+              <w:right w:val="single" w:sz="4" w:space="0" w:color="C9D3D0"/>
+            </w:tcBorders>
+            <w:tcMar>
+              <w:top w:w="50" w:type="dxa"/>
+              <w:left w:w="100" w:type="dxa"/>
+              <w:bottom w:w="50" w:type="dxa"/>
+              <w:right w:w="100" w:type="dxa"/>
+            </w:tcMar>
+            <w:vAlign w:val="center"/>
+          </w:tcPr>
+          <w:p>
+            <w:pPr>
+              <w:spacing w:line="252" w:lineRule="auto"/>
+            </w:pPr>
+            <w:r>
+              <w:rPr>
+                <w:rFonts w:ascii="Consolas" w:eastAsia="Consolas" w:hAnsi="Consolas" w:cs="Consolas"/>
+                <w:sz w:val="17"/>
+                <w:szCs w:val="17"/>
+                <w:shd w:val="clear" w:color="auto" w:fill="F2F4F3"/>
+              </w:rPr>
+              <w:t>account.demo_expires_at</w:t>
+            </w:r>
+          </w:p>
+        </w:tc>
+        <w:tc>
+          <w:tcPr>
+            <w:tcW w:w="3412" w:type="dxa"/>
+            <w:tcBorders>
+              <w:top w:val="single" w:sz="4" w:space="0" w:color="C9D3D0"/>
+              <w:left w:val="single" w:sz="4" w:space="0" w:color="C9D3D0"/>
+              <w:bottom w:val="single" w:sz="4" w:space="0" w:color="C9D3D0"/>
+              <w:right w:val="single" w:sz="4" w:space="0" w:color="C9D3D0"/>
+            </w:tcBorders>
+            <w:tcMar>
+              <w:top w:w="50" w:type="dxa"/>
+              <w:left w:w="100" w:type="dxa"/>
+              <w:bottom w:w="50" w:type="dxa"/>
+              <w:right w:w="100" w:type="dxa"/>
+            </w:tcMar>
+            <w:vAlign w:val="center"/>
+          </w:tcPr>
+          <w:p>
+            <w:pPr>
+              <w:spacing w:line="252" w:lineRule="auto"/>
+            </w:pPr>
+            <w:r>
+              <w:rPr>
+                <w:sz w:val="19"/>
+                <w:szCs w:val="19"/>
+              </w:rPr>
+              <w:t>Attribute (nullable)</w:t>
+            </w:r>
+          </w:p>
+        </w:tc>
+        <w:tc>
+          <w:tcPr>
+            <w:tcW w:w="3679" w:type="dxa"/>
+            <w:tcBorders>
+              <w:top w:val="single" w:sz="4" w:space="0" w:color="C9D3D0"/>
+              <w:left w:val="single" w:sz="4" w:space="0" w:color="C9D3D0"/>
+              <w:bottom w:val="single" w:sz="4" w:space="0" w:color="C9D3D0"/>
+              <w:right w:val="single" w:sz="4" w:space="0" w:color="C9D3D0"/>
+            </w:tcBorders>
+            <w:tcMar>
+              <w:top w:w="50" w:type="dxa"/>
+              <w:left w:w="100" w:type="dxa"/>
+              <w:bottom w:w="50" w:type="dxa"/>
+              <w:right w:w="100" w:type="dxa"/>
+            </w:tcMar>
+            <w:vAlign w:val="center"/>
+          </w:tcPr>
+          <w:p>
+            <w:pPr>
+              <w:spacing w:line="252" w:lineRule="auto"/>
+            </w:pPr>
+            <w:r>
+              <w:rPr>
+                <w:sz w:val="19"/>
+                <w:szCs w:val="19"/>
+              </w:rPr>
+              <w:t xml:space="preserve">CHECK: NULL or later than </w:t>
+            </w:r>
+            <w:r>
+              <w:rPr>
+                <w:rFonts w:ascii="Consolas" w:eastAsia="Consolas" w:hAnsi="Consolas" w:cs="Consolas"/>
+                <w:sz w:val="17"/>
+                <w:szCs w:val="17"/>
+                <w:shd w:val="clear" w:color="auto" w:fill="F2F4F3"/>
+              </w:rPr>
+              <w:t>created_at</w:t>
+            </w:r>
+          </w:p>
+        </w:tc>
+      </w:tr>
+      <w:tr>
+        <w:tblPrEx>
+          <w:tblCellMar>
+            <w:top w:w="0" w:type="dxa"/>
+            <w:bottom w:w="0" w:type="dxa"/>
+          </w:tblCellMar>
+        </w:tblPrEx>
+        <w:trPr>
+          <w:cantSplit/>
+        </w:trPr>
+        <w:tc>
+          <w:tcPr>
+            <w:tcW w:w="2547" w:type="dxa"/>
+            <w:tcBorders>
+              <w:top w:val="single" w:sz="4" w:space="0" w:color="C9D3D0"/>
+              <w:left w:val="single" w:sz="4" w:space="0" w:color="C9D3D0"/>
+              <w:bottom w:val="single" w:sz="4" w:space="0" w:color="C9D3D0"/>
+              <w:right w:val="single" w:sz="4" w:space="0" w:color="C9D3D0"/>
+            </w:tcBorders>
+            <w:shd w:val="clear" w:color="auto" w:fill="F3F8F6"/>
+            <w:tcMar>
+              <w:top w:w="50" w:type="dxa"/>
+              <w:left w:w="100" w:type="dxa"/>
+              <w:bottom w:w="50" w:type="dxa"/>
+              <w:right w:w="100" w:type="dxa"/>
+            </w:tcMar>
+            <w:vAlign w:val="center"/>
+          </w:tcPr>
+          <w:p>
+            <w:pPr>
+              <w:spacing w:line="252" w:lineRule="auto"/>
+            </w:pPr>
+            <w:r>
+              <w:rPr>
+                <w:rFonts w:ascii="Consolas" w:eastAsia="Consolas" w:hAnsi="Consolas" w:cs="Consolas"/>
+                <w:sz w:val="17"/>
+                <w:szCs w:val="17"/>
+                <w:shd w:val="clear" w:color="auto" w:fill="F2F4F3"/>
+              </w:rPr>
+              <w:t>idx_account_demo_expires</w:t>
+            </w:r>
+          </w:p>
+        </w:tc>
+        <w:tc>
+          <w:tcPr>
+            <w:tcW w:w="3412" w:type="dxa"/>
+            <w:tcBorders>
+              <w:top w:val="single" w:sz="4" w:space="0" w:color="C9D3D0"/>
+              <w:left w:val="single" w:sz="4" w:space="0" w:color="C9D3D0"/>
+              <w:bottom w:val="single" w:sz="4" w:space="0" w:color="C9D3D0"/>
+              <w:right w:val="single" w:sz="4" w:space="0" w:color="C9D3D0"/>
+            </w:tcBorders>
+            <w:shd w:val="clear" w:color="auto" w:fill="F3F8F6"/>
+            <w:tcMar>
+              <w:top w:w="50" w:type="dxa"/>
+              <w:left w:w="100" w:type="dxa"/>
+              <w:bottom w:w="50" w:type="dxa"/>
+              <w:right w:w="100" w:type="dxa"/>
+            </w:tcMar>
+            <w:vAlign w:val="center"/>
+          </w:tcPr>
+          <w:p>
+            <w:pPr>
+              <w:spacing w:line="252" w:lineRule="auto"/>
+            </w:pPr>
+            <w:r>
+              <w:rPr>
+                <w:sz w:val="19"/>
+                <w:szCs w:val="19"/>
+              </w:rPr>
+              <w:t>Partial index (</w:t>
+            </w:r>
+            <w:r>
+              <w:rPr>
+                <w:rFonts w:ascii="Consolas" w:eastAsia="Consolas" w:hAnsi="Consolas" w:cs="Consolas"/>
+                <w:sz w:val="17"/>
+                <w:szCs w:val="17"/>
+                <w:shd w:val="clear" w:color="auto" w:fill="F2F4F3"/>
+              </w:rPr>
+              <w:t>WHERE demo_expires_at IS NOT NULL</w:t>
+            </w:r>
+            <w:r>
+              <w:rPr>
+                <w:sz w:val="19"/>
+                <w:szCs w:val="19"/>
+              </w:rPr>
+              <w:t>)</w:t>
+            </w:r>
+          </w:p>
+        </w:tc>
+        <w:tc>
+          <w:tcPr>
+            <w:tcW w:w="3679" w:type="dxa"/>
+            <w:tcBorders>
+              <w:top w:val="single" w:sz="4" w:space="0" w:color="C9D3D0"/>
+              <w:left w:val="single" w:sz="4" w:space="0" w:color="C9D3D0"/>
+              <w:bottom w:val="single" w:sz="4" w:space="0" w:color="C9D3D0"/>
+              <w:right w:val="single" w:sz="4" w:space="0" w:color="C9D3D0"/>
+            </w:tcBorders>
+            <w:shd w:val="clear" w:color="auto" w:fill="F3F8F6"/>
+            <w:tcMar>
+              <w:top w:w="50" w:type="dxa"/>
+              <w:left w:w="100" w:type="dxa"/>
+              <w:bottom w:w="50" w:type="dxa"/>
+              <w:right w:w="100" w:type="dxa"/>
+            </w:tcMar>
+            <w:vAlign w:val="center"/>
+          </w:tcPr>
+          <w:p>
+            <w:pPr>
+              <w:spacing w:line="252" w:lineRule="auto"/>
+            </w:pPr>
+            <w:r>
+              <w:rPr>
+                <w:sz w:val="19"/>
+                <w:szCs w:val="19"/>
+              </w:rPr>
+              <w:t xml:space="preserve">Serves the clean-up </w:t>
+            </w:r>
+            <w:r>
+              <w:rPr>
+                <w:rFonts w:ascii="Consolas" w:eastAsia="Consolas" w:hAnsi="Consolas" w:cs="Consolas"/>
+                <w:sz w:val="17"/>
+                <w:szCs w:val="17"/>
+                <w:shd w:val="clear" w:color="auto" w:fill="F2F4F3"/>
+              </w:rPr>
+              <w:t>DELETE ... WHERE demo_expires_at &lt; now</w:t>
+            </w:r>
+            <w:r>
+              <w:rPr>
+                <w:sz w:val="19"/>
+                <w:szCs w:val="19"/>
+              </w:rPr>
+              <w:t xml:space="preserve"> without scanning real accounts</w:t>
+            </w:r>
+          </w:p>
+        </w:tc>
+      </w:tr>
+    </w:tbl>
+    <w:p>
+      <w:pPr>
+        <w:spacing w:after="100"/>
+      </w:pPr>
+    </w:p>
+    <w:p>
+      <w:pPr>
+        <w:spacing w:after="120"/>
+      </w:pPr>
+      <w:r>
+        <w:rPr>
+          <w:b/>
+          <w:bCs/>
+        </w:rPr>
+        <w:t>Enforced on the server</w:t>
+      </w:r>
+      <w:r>
+        <w:t xml:space="preserve"> (tested in </w:t>
+      </w:r>
+      <w:r>
+        <w:rPr>
+          <w:rFonts w:ascii="Consolas" w:eastAsia="Consolas" w:hAnsi="Consolas" w:cs="Consolas"/>
+          <w:sz w:val="19"/>
+          <w:szCs w:val="19"/>
+          <w:shd w:val="clear" w:color="auto" w:fill="F2F4F3"/>
+        </w:rPr>
+        <w:t>worker/demo-login.test.ts</w:t>
+      </w:r>
+      <w:r>
+        <w:t xml:space="preserve">): a demo account has a random username and an </w:t>
+      </w:r>
+      <w:r>
+        <w:t>unusable random verifier (no password log-in); it reads groups but cannot create a group, report a message or post (the group room refuses its posts); visitors never see each other's data. Real accounts are unchanged (safe default).</w:t>
+      </w:r>
+    </w:p>
+    <w:p>
+      <w:pPr>
+        <w:pStyle w:val="Heading2"/>
+        <w:keepNext/>
+        <w:keepLines/>
+      </w:pPr>
+      <w:bookmarkStart w:id="26" w:name="_Toc242916214"/>
+      <w:r>
+        <w:t>2.12 Entity catalogue</w:t>
+      </w:r>
+      <w:bookmarkEnd w:id="26"/>
+    </w:p>
+    <w:p>
+      <w:pPr>
+        <w:pStyle w:val="Caption"/>
+        <w:keepNext/>
+      </w:pPr>
+      <w:bookmarkStart w:id="27" w:name="_Toc242916249"/>
+      <w:r>
+        <w:t xml:space="preserve">Table </w:t>
+      </w:r>
+      <w:r>
+        <w:fldChar w:fldCharType="begin"/>
+      </w:r>
+      <w:r>
+        <w:instrText>SEQ Table</w:instrText>
+      </w:r>
+      <w:r>
+        <w:fldChar w:fldCharType="separate"/>
+      </w:r>
+      <w:r>
+        <w:rPr>
+          <w:noProof/>
+        </w:rPr>
+        <w:t>4</w:t>
+      </w:r>
+      <w:r>
+        <w:fldChar w:fldCharType="end"/>
+      </w:r>
+      <w:r>
+        <w:t>: Entities, their type, identifier and the requirements that justify them</w:t>
+      </w:r>
+      <w:bookmarkEnd w:id="27"/>
+    </w:p>
+    <w:tbl>
+      <w:tblPr>
+        <w:tblW w:w="9638" w:type="dxa"/>
+        <w:tblBorders>
+          <w:top w:val="single" w:sz="4" w:space="0" w:color="auto"/>
+          <w:left w:val="single" w:sz="4" w:space="0" w:color="auto"/>
+          <w:bottom w:val="single" w:sz="4" w:space="0" w:color="auto"/>
+          <w:right w:val="single" w:sz="4" w:space="0" w:color="auto"/>
+          <w:insideH w:val="single" w:sz="4" w:space="0" w:color="auto"/>
+          <w:insideV w:val="single" w:sz="4" w:space="0" w:color="auto"/>
+        </w:tblBorders>
+        <w:tblCellMar>
+          <w:left w:w="10" w:type="dxa"/>
+          <w:right w:w="10" w:type="dxa"/>
+        </w:tblCellMar>
+        <w:tblLook w:val="04A0" w:firstRow="1" w:lastRow="0" w:firstColumn="1" w:lastColumn="0" w:noHBand="0" w:noVBand="1"/>
       </w:tblPr>
       <w:tblGrid>
         <w:gridCol w:w="1965"/>
@@ -13102,6 +13911,7 @@
                 <w:sz w:val="19"/>
                 <w:szCs w:val="19"/>
               </w:rPr>
+              <w:lastRenderedPageBreak/>
               <w:t>OFFERING_YEAR</w:t>
             </w:r>
           </w:p>
@@ -14698,7 +15508,6 @@
                 <w:sz w:val="19"/>
                 <w:szCs w:val="19"/>
               </w:rPr>
-              <w:lastRenderedPageBreak/>
               <w:t>ACHIEVEMENT</w:t>
             </w:r>
           </w:p>
@@ -15339,12 +16148,12 @@
         <w:keepLines/>
         <w:pageBreakBefore/>
       </w:pPr>
-      <w:bookmarkStart w:id="26" w:name="_Toc242620555"/>
+      <w:bookmarkStart w:id="28" w:name="_Toc242916215"/>
       <w:r>
         <w:lastRenderedPageBreak/>
         <w:t>3 Rule grammar</w:t>
       </w:r>
-      <w:bookmarkEnd w:id="26"/>
+      <w:bookmarkEnd w:id="28"/>
     </w:p>
     <w:p>
       <w:pPr>
@@ -15381,7 +16190,7 @@
         <w:pStyle w:val="Caption"/>
         <w:keepNext/>
       </w:pPr>
-      <w:bookmarkStart w:id="27" w:name="_Toc242620588"/>
+      <w:bookmarkStart w:id="29" w:name="_Toc242916250"/>
       <w:r>
         <w:t xml:space="preserve">Table </w:t>
       </w:r>
@@ -15398,7 +16207,7 @@
         <w:rPr>
           <w:noProof/>
         </w:rPr>
-        <w:t>4</w:t>
+        <w:t>5</w:t>
       </w:r>
       <w:r>
         <w:fldChar w:fldCharType="end"/>
@@ -15406,7 +16215,7 @@
       <w:r>
         <w:t>: Rule node kinds and their meaning</w:t>
       </w:r>
-      <w:bookmarkEnd w:id="27"/>
+      <w:bookmarkEnd w:id="29"/>
     </w:p>
     <w:tbl>
       <w:tblPr>
@@ -15423,7 +16232,7 @@
           <w:left w:w="10" w:type="dxa"/>
           <w:right w:w="10" w:type="dxa"/>
         </w:tblCellMar>
-        <w:tblLook w:val="0000" w:firstRow="0" w:lastRow="0" w:firstColumn="0" w:lastColumn="0" w:noHBand="0" w:noVBand="0"/>
+        <w:tblLook w:val="04A0" w:firstRow="1" w:lastRow="0" w:firstColumn="1" w:lastColumn="0" w:noHBand="0" w:noVBand="1"/>
       </w:tblPr>
       <w:tblGrid>
         <w:gridCol w:w="1606"/>
@@ -16742,10 +17551,7 @@
         <w:spacing w:after="120"/>
       </w:pPr>
       <w:r>
-        <w:t xml:space="preserve">Example: Medicine (Uni-Code 001A) is ALL( SUBJECT Biology ≥ S, SUBJECT Chemistry ≥ S, SUBJECT Physics ≥ S, </w:t>
-      </w:r>
-      <w:r>
-        <w:t>GRADE_COUNT 2 ≥ C of {Biology, Chemistry, Physics} ). Category splits with separate seats (pattern 14) are modelled as separate selection groups, each with its own rule tree.</w:t>
+        <w:t>Example: Medicine (Uni-Code 001A) is ALL( SUBJECT Biology ≥ S, SUBJECT Chemistry ≥ S, SUBJECT Physics ≥ S, GRADE_COUNT 2 ≥ C of {Biology, Chemistry, Physics} ). Category splits with separate seats (pattern 14) are modelled as separate selection groups, each with its own rule tree.</w:t>
       </w:r>
     </w:p>
     <w:p>
@@ -16755,12 +17561,12 @@
         <w:keepLines/>
         <w:pageBreakBefore/>
       </w:pPr>
-      <w:bookmarkStart w:id="28" w:name="_Toc242620556"/>
+      <w:bookmarkStart w:id="30" w:name="_Toc242916216"/>
       <w:r>
         <w:lastRenderedPageBreak/>
         <w:t>4 Mapping the EER model to relations</w:t>
       </w:r>
-      <w:bookmarkEnd w:id="28"/>
+      <w:bookmarkEnd w:id="30"/>
     </w:p>
     <w:p>
       <w:pPr>
@@ -16775,7 +17581,7 @@
         <w:pStyle w:val="Caption"/>
         <w:keepNext/>
       </w:pPr>
-      <w:bookmarkStart w:id="29" w:name="_Toc242620589"/>
+      <w:bookmarkStart w:id="31" w:name="_Toc242916251"/>
       <w:r>
         <w:t xml:space="preserve">Table </w:t>
       </w:r>
@@ -16792,7 +17598,7 @@
         <w:rPr>
           <w:noProof/>
         </w:rPr>
-        <w:t>5</w:t>
+        <w:t>6</w:t>
       </w:r>
       <w:r>
         <w:fldChar w:fldCharType="end"/>
@@ -16800,7 +17606,7 @@
       <w:r>
         <w:t>: EER-to-relational mapping steps applied</w:t>
       </w:r>
-      <w:bookmarkEnd w:id="29"/>
+      <w:bookmarkEnd w:id="31"/>
     </w:p>
     <w:tbl>
       <w:tblPr>
@@ -16817,7 +17623,7 @@
           <w:left w:w="10" w:type="dxa"/>
           <w:right w:w="10" w:type="dxa"/>
         </w:tblCellMar>
-        <w:tblLook w:val="0000" w:firstRow="0" w:lastRow="0" w:firstColumn="0" w:lastColumn="0" w:noHBand="0" w:noVBand="0"/>
+        <w:tblLook w:val="04A0" w:firstRow="1" w:lastRow="0" w:firstColumn="1" w:lastColumn="0" w:noHBand="0" w:noVBand="1"/>
       </w:tblPr>
       <w:tblGrid>
         <w:gridCol w:w="649"/>
@@ -18566,7 +19372,7 @@
         <w:pStyle w:val="Caption"/>
         <w:keepNext/>
       </w:pPr>
-      <w:bookmarkStart w:id="30" w:name="_Toc242620590"/>
+      <w:bookmarkStart w:id="32" w:name="_Toc242916252"/>
       <w:r>
         <w:lastRenderedPageBreak/>
         <w:t xml:space="preserve">Table </w:t>
@@ -18584,7 +19390,7 @@
         <w:rPr>
           <w:noProof/>
         </w:rPr>
-        <w:t>6</w:t>
+        <w:t>7</w:t>
       </w:r>
       <w:r>
         <w:fldChar w:fldCharType="end"/>
@@ -18592,7 +19398,7 @@
       <w:r>
         <w:t>: Mapping of the student-account model</w:t>
       </w:r>
-      <w:bookmarkEnd w:id="30"/>
+      <w:bookmarkEnd w:id="32"/>
     </w:p>
     <w:tbl>
       <w:tblPr>
@@ -18609,7 +19415,7 @@
           <w:left w:w="10" w:type="dxa"/>
           <w:right w:w="10" w:type="dxa"/>
         </w:tblCellMar>
-        <w:tblLook w:val="0000" w:firstRow="0" w:lastRow="0" w:firstColumn="0" w:lastColumn="0" w:noHBand="0" w:noVBand="0"/>
+        <w:tblLook w:val="04A0" w:firstRow="1" w:lastRow="0" w:firstColumn="1" w:lastColumn="0" w:noHBand="0" w:noVBand="1"/>
       </w:tblPr>
       <w:tblGrid>
         <w:gridCol w:w="662"/>
@@ -19678,7 +20484,7 @@
         </w:rPr>
         <w:lastRenderedPageBreak/>
         <w:drawing>
-          <wp:inline distT="0" distB="0" distL="0" distR="0" wp14:anchorId="29D5F436" wp14:editId="29D5F437">
+          <wp:inline distT="0" distB="0" distL="0" distR="0" wp14:anchorId="5B7C746E" wp14:editId="5B7C746F">
             <wp:extent cx="6124575" cy="6562725"/>
             <wp:effectExtent l="0" t="0" r="0" b="0"/>
             <wp:docPr id="6" name="relational-admission.png" descr="Logical schema, admission data (generated from the migration file)" title="Logical schema, admission data (generated from the migration file)"/>
@@ -19721,7 +20527,7 @@
       <w:pPr>
         <w:pStyle w:val="Caption"/>
       </w:pPr>
-      <w:bookmarkStart w:id="31" w:name="_Toc242620582"/>
+      <w:bookmarkStart w:id="33" w:name="_Toc242916243"/>
       <w:r>
         <w:t xml:space="preserve">Figure </w:t>
       </w:r>
@@ -19746,7 +20552,7 @@
       <w:r>
         <w:t>: Logical schema, admission data (generated from the migration file)</w:t>
       </w:r>
-      <w:bookmarkEnd w:id="31"/>
+      <w:bookmarkEnd w:id="33"/>
     </w:p>
     <w:p>
       <w:pPr>
@@ -19760,7 +20566,7 @@
         </w:rPr>
         <w:lastRenderedPageBreak/>
         <w:drawing>
-          <wp:inline distT="0" distB="0" distL="0" distR="0" wp14:anchorId="29D5F438" wp14:editId="29D5F439">
+          <wp:inline distT="0" distB="0" distL="0" distR="0" wp14:anchorId="5B7C7470" wp14:editId="5B7C7471">
             <wp:extent cx="6124575" cy="5562600"/>
             <wp:effectExtent l="0" t="0" r="0" b="0"/>
             <wp:docPr id="7" name="relational-trust-journey.png" descr="Logical schema, trust, routes and journey data (generated from the migration file)" title="Logical schema, trust, routes and journey data (generated from the migration file)"/>
@@ -19803,7 +20609,7 @@
       <w:pPr>
         <w:pStyle w:val="Caption"/>
       </w:pPr>
-      <w:bookmarkStart w:id="32" w:name="_Toc242620583"/>
+      <w:bookmarkStart w:id="34" w:name="_Toc242916244"/>
       <w:r>
         <w:t xml:space="preserve">Figure </w:t>
       </w:r>
@@ -19828,7 +20634,7 @@
       <w:r>
         <w:t>: Logical schema, trust, routes and journey data (generated from the migration file)</w:t>
       </w:r>
-      <w:bookmarkEnd w:id="32"/>
+      <w:bookmarkEnd w:id="34"/>
     </w:p>
     <w:p>
       <w:pPr>
@@ -19841,7 +20647,7 @@
           <w:noProof/>
         </w:rPr>
         <w:drawing>
-          <wp:inline distT="0" distB="0" distL="0" distR="0" wp14:anchorId="29D5F43A" wp14:editId="29D5F43B">
+          <wp:inline distT="0" distB="0" distL="0" distR="0" wp14:anchorId="5B7C7472" wp14:editId="5B7C7473">
             <wp:extent cx="6124575" cy="2305050"/>
             <wp:effectExtent l="0" t="0" r="0" b="0"/>
             <wp:docPr id="8" name="relational-accounts.png" descr="Logical schema, optional student accounts (generated from the migration files)" title="Logical schema, optional student accounts (generated from the migration files)"/>
@@ -19884,7 +20690,7 @@
       <w:pPr>
         <w:pStyle w:val="Caption"/>
       </w:pPr>
-      <w:bookmarkStart w:id="33" w:name="_Toc242620584"/>
+      <w:bookmarkStart w:id="35" w:name="_Toc242916245"/>
       <w:r>
         <w:t xml:space="preserve">Figure </w:t>
       </w:r>
@@ -19909,7 +20715,7 @@
       <w:r>
         <w:t>: Logical schema, optional student accounts (generated from the migration files)</w:t>
       </w:r>
-      <w:bookmarkEnd w:id="33"/>
+      <w:bookmarkEnd w:id="35"/>
     </w:p>
     <w:p>
       <w:pPr>
@@ -19918,12 +20724,12 @@
         <w:keepLines/>
         <w:pageBreakBefore/>
       </w:pPr>
-      <w:bookmarkStart w:id="34" w:name="_Toc242620557"/>
+      <w:bookmarkStart w:id="36" w:name="_Toc242916217"/>
       <w:r>
         <w:lastRenderedPageBreak/>
         <w:t>5 Normalisation</w:t>
       </w:r>
-      <w:bookmarkEnd w:id="34"/>
+      <w:bookmarkEnd w:id="36"/>
     </w:p>
     <w:p>
       <w:pPr>
@@ -19931,11 +20737,11 @@
         <w:keepNext/>
         <w:keepLines/>
       </w:pPr>
-      <w:bookmarkStart w:id="35" w:name="_Toc242620558"/>
+      <w:bookmarkStart w:id="37" w:name="_Toc242916218"/>
       <w:r>
         <w:t>5.1 From the source form to 1NF</w:t>
       </w:r>
-      <w:bookmarkEnd w:id="35"/>
+      <w:bookmarkEnd w:id="37"/>
     </w:p>
     <w:p>
       <w:pPr>
@@ -19987,18 +20793,18 @@
         <w:keepNext/>
         <w:keepLines/>
       </w:pPr>
-      <w:bookmarkStart w:id="36" w:name="_Toc242620559"/>
+      <w:bookmarkStart w:id="38" w:name="_Toc242916219"/>
       <w:r>
         <w:t>5.2 Functional and multi-valued dependencies</w:t>
       </w:r>
-      <w:bookmarkEnd w:id="36"/>
+      <w:bookmarkEnd w:id="38"/>
     </w:p>
     <w:p>
       <w:pPr>
         <w:pStyle w:val="Caption"/>
         <w:keepNext/>
       </w:pPr>
-      <w:bookmarkStart w:id="37" w:name="_Toc242620591"/>
+      <w:bookmarkStart w:id="39" w:name="_Toc242916253"/>
       <w:r>
         <w:t xml:space="preserve">Table </w:t>
       </w:r>
@@ -20015,7 +20821,7 @@
         <w:rPr>
           <w:noProof/>
         </w:rPr>
-        <w:t>7</w:t>
+        <w:t>8</w:t>
       </w:r>
       <w:r>
         <w:fldChar w:fldCharType="end"/>
@@ -20023,7 +20829,7 @@
       <w:r>
         <w:t>: Dependencies identified in R1</w:t>
       </w:r>
-      <w:bookmarkEnd w:id="37"/>
+      <w:bookmarkEnd w:id="39"/>
     </w:p>
     <w:tbl>
       <w:tblPr>
@@ -20040,7 +20846,7 @@
           <w:left w:w="10" w:type="dxa"/>
           <w:right w:w="10" w:type="dxa"/>
         </w:tblCellMar>
-        <w:tblLook w:val="0000" w:firstRow="0" w:lastRow="0" w:firstColumn="0" w:lastColumn="0" w:noHBand="0" w:noVBand="0"/>
+        <w:tblLook w:val="04A0" w:firstRow="1" w:lastRow="0" w:firstColumn="1" w:lastColumn="0" w:noHBand="0" w:noVBand="1"/>
       </w:tblPr>
       <w:tblGrid>
         <w:gridCol w:w="684"/>
@@ -20897,11 +21703,11 @@
         <w:keepNext/>
         <w:keepLines/>
       </w:pPr>
-      <w:bookmarkStart w:id="38" w:name="_Toc242620560"/>
+      <w:bookmarkStart w:id="40" w:name="_Toc242916220"/>
       <w:r>
         <w:t>5.3 2NF, 3NF and BCNF</w:t>
       </w:r>
-      <w:bookmarkEnd w:id="38"/>
+      <w:bookmarkEnd w:id="40"/>
     </w:p>
     <w:p>
       <w:pPr>
@@ -21140,19 +21946,19 @@
         <w:keepNext/>
         <w:keepLines/>
       </w:pPr>
-      <w:bookmarkStart w:id="39" w:name="_Toc242620561"/>
+      <w:bookmarkStart w:id="41" w:name="_Toc242916221"/>
       <w:r>
         <w:lastRenderedPageBreak/>
         <w:t>5.4 Deliberate departures</w:t>
       </w:r>
-      <w:bookmarkEnd w:id="39"/>
+      <w:bookmarkEnd w:id="41"/>
     </w:p>
     <w:p>
       <w:pPr>
         <w:pStyle w:val="Caption"/>
         <w:keepNext/>
       </w:pPr>
-      <w:bookmarkStart w:id="40" w:name="_Toc242620592"/>
+      <w:bookmarkStart w:id="42" w:name="_Toc242916254"/>
       <w:r>
         <w:t xml:space="preserve">Table </w:t>
       </w:r>
@@ -21169,7 +21975,7 @@
         <w:rPr>
           <w:noProof/>
         </w:rPr>
-        <w:t>8</w:t>
+        <w:t>9</w:t>
       </w:r>
       <w:r>
         <w:fldChar w:fldCharType="end"/>
@@ -21177,7 +21983,7 @@
       <w:r>
         <w:t>: Controlled denormalisations and why they are safe</w:t>
       </w:r>
-      <w:bookmarkEnd w:id="40"/>
+      <w:bookmarkEnd w:id="42"/>
     </w:p>
     <w:tbl>
       <w:tblPr>
@@ -21194,7 +22000,7 @@
           <w:left w:w="10" w:type="dxa"/>
           <w:right w:w="10" w:type="dxa"/>
         </w:tblCellMar>
-        <w:tblLook w:val="0000" w:firstRow="0" w:lastRow="0" w:firstColumn="0" w:lastColumn="0" w:noHBand="0" w:noVBand="0"/>
+        <w:tblLook w:val="04A0" w:firstRow="1" w:lastRow="0" w:firstColumn="1" w:lastColumn="0" w:noHBand="0" w:noVBand="1"/>
       </w:tblPr>
       <w:tblGrid>
         <w:gridCol w:w="3213"/>
@@ -21923,12 +22729,12 @@
         <w:keepLines/>
         <w:pageBreakBefore/>
       </w:pPr>
-      <w:bookmarkStart w:id="41" w:name="_Toc242620562"/>
+      <w:bookmarkStart w:id="43" w:name="_Toc242916222"/>
       <w:r>
         <w:lastRenderedPageBreak/>
         <w:t>6 Physical design for Cloudflare D1</w:t>
       </w:r>
-      <w:bookmarkEnd w:id="41"/>
+      <w:bookmarkEnd w:id="43"/>
     </w:p>
     <w:p>
       <w:pPr>
@@ -21936,11 +22742,11 @@
         <w:keepNext/>
         <w:keepLines/>
       </w:pPr>
-      <w:bookmarkStart w:id="42" w:name="_Toc242620563"/>
+      <w:bookmarkStart w:id="44" w:name="_Toc242916223"/>
       <w:r>
         <w:t>6.1 Conventions</w:t>
       </w:r>
-      <w:bookmarkEnd w:id="42"/>
+      <w:bookmarkEnd w:id="44"/>
     </w:p>
     <w:p>
       <w:pPr>
@@ -22175,18 +22981,18 @@
         <w:keepNext/>
         <w:keepLines/>
       </w:pPr>
-      <w:bookmarkStart w:id="43" w:name="_Toc242620564"/>
+      <w:bookmarkStart w:id="45" w:name="_Toc242916224"/>
       <w:r>
         <w:t>6.2 Indexes</w:t>
       </w:r>
-      <w:bookmarkEnd w:id="43"/>
+      <w:bookmarkEnd w:id="45"/>
     </w:p>
     <w:p>
       <w:pPr>
         <w:pStyle w:val="Caption"/>
         <w:keepNext/>
       </w:pPr>
-      <w:bookmarkStart w:id="44" w:name="_Toc242620593"/>
+      <w:bookmarkStart w:id="46" w:name="_Toc242916255"/>
       <w:r>
         <w:t xml:space="preserve">Table </w:t>
       </w:r>
@@ -22203,7 +23009,7 @@
         <w:rPr>
           <w:noProof/>
         </w:rPr>
-        <w:t>9</w:t>
+        <w:t>10</w:t>
       </w:r>
       <w:r>
         <w:fldChar w:fldCharType="end"/>
@@ -22211,7 +23017,7 @@
       <w:r>
         <w:t>: Secondary indexes and the query each serves</w:t>
       </w:r>
-      <w:bookmarkEnd w:id="44"/>
+      <w:bookmarkEnd w:id="46"/>
     </w:p>
     <w:tbl>
       <w:tblPr>
@@ -22228,7 +23034,7 @@
           <w:left w:w="10" w:type="dxa"/>
           <w:right w:w="10" w:type="dxa"/>
         </w:tblCellMar>
-        <w:tblLook w:val="0000" w:firstRow="0" w:lastRow="0" w:firstColumn="0" w:lastColumn="0" w:noHBand="0" w:noVBand="0"/>
+        <w:tblLook w:val="04A0" w:firstRow="1" w:lastRow="0" w:firstColumn="1" w:lastColumn="0" w:noHBand="0" w:noVBand="1"/>
       </w:tblPr>
       <w:tblGrid>
         <w:gridCol w:w="4819"/>
@@ -22352,14 +23158,14 @@
                 <w:szCs w:val="17"/>
                 <w:shd w:val="clear" w:color="auto" w:fill="F2F4F3"/>
               </w:rPr>
-              <w:t>idx_offering_uni_code</w:t>
-            </w:r>
-            <w:r>
-              <w:rPr>
-                <w:sz w:val="19"/>
-                <w:szCs w:val="19"/>
-              </w:rPr>
-              <w:t xml:space="preserve"> (unique)</w:t>
+              <w:t>idx_account_demo_expires</w:t>
+            </w:r>
+            <w:r>
+              <w:rPr>
+                <w:sz w:val="19"/>
+                <w:szCs w:val="19"/>
+              </w:rPr>
+              <w:t xml:space="preserve"> (partial, CR-007)</w:t>
             </w:r>
           </w:p>
         </w:tc>
@@ -22389,7 +23195,7 @@
                 <w:sz w:val="19"/>
                 <w:szCs w:val="19"/>
               </w:rPr>
-              <w:t>Look up an offering by Uni-Code</w:t>
+              <w:t>Deleting expired demo accounts on each demo tap</w:t>
             </w:r>
           </w:p>
         </w:tc>
@@ -22433,7 +23239,14 @@
                 <w:szCs w:val="17"/>
                 <w:shd w:val="clear" w:color="auto" w:fill="F2F4F3"/>
               </w:rPr>
-              <w:t>idx_cutoff_district</w:t>
+              <w:t>idx_offering_uni_code</w:t>
+            </w:r>
+            <w:r>
+              <w:rPr>
+                <w:sz w:val="19"/>
+                <w:szCs w:val="19"/>
+              </w:rPr>
+              <w:t xml:space="preserve"> (unique)</w:t>
             </w:r>
           </w:p>
         </w:tc>
@@ -22464,7 +23277,7 @@
                 <w:sz w:val="19"/>
                 <w:szCs w:val="19"/>
               </w:rPr>
-              <w:t>All cut-offs for one district: the core of eligibility and banding</w:t>
+              <w:t>Look up an offering by Uni-Code</w:t>
             </w:r>
           </w:p>
         </w:tc>
@@ -22507,7 +23320,7 @@
                 <w:szCs w:val="17"/>
                 <w:shd w:val="clear" w:color="auto" w:fill="F2F4F3"/>
               </w:rPr>
-              <w:t>idx_offering_year_year</w:t>
+              <w:t>idx_cutoff_district</w:t>
             </w:r>
           </w:p>
         </w:tc>
@@ -22537,7 +23350,7 @@
                 <w:sz w:val="19"/>
                 <w:szCs w:val="19"/>
               </w:rPr>
-              <w:t>All offerings of an intake year</w:t>
+              <w:t>All cut-offs for one district: the core of eligibility and banding</w:t>
             </w:r>
           </w:p>
         </w:tc>
@@ -22581,7 +23394,7 @@
                 <w:szCs w:val="17"/>
                 <w:shd w:val="clear" w:color="auto" w:fill="F2F4F3"/>
               </w:rPr>
-              <w:t>idx_rule_node_parent</w:t>
+              <w:t>idx_offering_year_year</w:t>
             </w:r>
           </w:p>
         </w:tc>
@@ -22612,7 +23425,7 @@
                 <w:sz w:val="19"/>
                 <w:szCs w:val="19"/>
               </w:rPr>
-              <w:t>Loading rule trees in order</w:t>
+              <w:t>All offerings of an intake year</w:t>
             </w:r>
           </w:p>
         </w:tc>
@@ -22655,7 +23468,7 @@
                 <w:szCs w:val="17"/>
                 <w:shd w:val="clear" w:color="auto" w:fill="F2F4F3"/>
               </w:rPr>
-              <w:t>idx_deadline_year_due</w:t>
+              <w:t>idx_rule_node_parent</w:t>
             </w:r>
           </w:p>
         </w:tc>
@@ -22685,7 +23498,7 @@
                 <w:sz w:val="19"/>
                 <w:szCs w:val="19"/>
               </w:rPr>
-              <w:t>Journey timeline by date</w:t>
+              <w:t>Loading rule trees in order</w:t>
             </w:r>
           </w:p>
         </w:tc>
@@ -22729,7 +23542,7 @@
                 <w:szCs w:val="17"/>
                 <w:shd w:val="clear" w:color="auto" w:fill="F2F4F3"/>
               </w:rPr>
-              <w:t>idx_citation_source</w:t>
+              <w:t>idx_deadline_year_due</w:t>
             </w:r>
           </w:p>
         </w:tc>
@@ -22760,7 +23573,7 @@
                 <w:sz w:val="19"/>
                 <w:szCs w:val="19"/>
               </w:rPr>
-              <w:t>All facts citing a source (re-extraction, audits)</w:t>
+              <w:t>Journey timeline by date</w:t>
             </w:r>
           </w:p>
         </w:tc>
@@ -22803,14 +23616,7 @@
                 <w:szCs w:val="17"/>
                 <w:shd w:val="clear" w:color="auto" w:fill="F2F4F3"/>
               </w:rPr>
-              <w:t>idx_candidate_queue</w:t>
-            </w:r>
-            <w:r>
-              <w:rPr>
-                <w:sz w:val="19"/>
-                <w:szCs w:val="19"/>
-              </w:rPr>
-              <w:t xml:space="preserve"> (partial, QUEUED only)</w:t>
+              <w:t>idx_citation_source</w:t>
             </w:r>
           </w:p>
         </w:tc>
@@ -22840,7 +23646,7 @@
                 <w:sz w:val="19"/>
                 <w:szCs w:val="19"/>
               </w:rPr>
-              <w:t>Curator review queue</w:t>
+              <w:t>All facts citing a source (re-extraction, audits)</w:t>
             </w:r>
           </w:p>
         </w:tc>
@@ -22884,14 +23690,14 @@
                 <w:szCs w:val="17"/>
                 <w:shd w:val="clear" w:color="auto" w:fill="F2F4F3"/>
               </w:rPr>
-              <w:t>idx_report_open</w:t>
-            </w:r>
-            <w:r>
-              <w:rPr>
-                <w:sz w:val="19"/>
-                <w:szCs w:val="19"/>
-              </w:rPr>
-              <w:t xml:space="preserve"> (partial, OPEN only)</w:t>
+              <w:t>idx_candidate_queue</w:t>
+            </w:r>
+            <w:r>
+              <w:rPr>
+                <w:sz w:val="19"/>
+                <w:szCs w:val="19"/>
+              </w:rPr>
+              <w:t xml:space="preserve"> (partial, QUEUED only)</w:t>
             </w:r>
           </w:p>
         </w:tc>
@@ -22922,7 +23728,7 @@
                 <w:sz w:val="19"/>
                 <w:szCs w:val="19"/>
               </w:rPr>
-              <w:t>Open mistake reports</w:t>
+              <w:t>Curator review queue</w:t>
             </w:r>
           </w:p>
         </w:tc>
@@ -22965,7 +23771,14 @@
                 <w:szCs w:val="17"/>
                 <w:shd w:val="clear" w:color="auto" w:fill="F2F4F3"/>
               </w:rPr>
-              <w:t>idx_session_account</w:t>
+              <w:t>idx_report_open</w:t>
+            </w:r>
+            <w:r>
+              <w:rPr>
+                <w:sz w:val="19"/>
+                <w:szCs w:val="19"/>
+              </w:rPr>
+              <w:t xml:space="preserve"> (partial, OPEN only)</w:t>
             </w:r>
           </w:p>
         </w:tc>
@@ -22995,7 +23808,7 @@
                 <w:sz w:val="19"/>
                 <w:szCs w:val="19"/>
               </w:rPr>
-              <w:t>Log out on every device; clearing expired sessions at log-in</w:t>
+              <w:t>Open mistake reports</w:t>
             </w:r>
           </w:p>
         </w:tc>
@@ -23039,23 +23852,7 @@
                 <w:szCs w:val="17"/>
                 <w:shd w:val="clear" w:color="auto" w:fill="F2F4F3"/>
               </w:rPr>
-              <w:t>idx_student_profile_stream</w:t>
-            </w:r>
-            <w:r>
-              <w:rPr>
-                <w:sz w:val="19"/>
-                <w:szCs w:val="19"/>
-              </w:rPr>
-              <w:t xml:space="preserve">, </w:t>
-            </w:r>
-            <w:r>
-              <w:rPr>
-                <w:rFonts w:ascii="Consolas" w:eastAsia="Consolas" w:hAnsi="Consolas" w:cs="Consolas"/>
-                <w:sz w:val="17"/>
-                <w:szCs w:val="17"/>
-                <w:shd w:val="clear" w:color="auto" w:fill="F2F4F3"/>
-              </w:rPr>
-              <w:t>idx_student_profile_district</w:t>
+              <w:t>idx_session_account</w:t>
             </w:r>
           </w:p>
         </w:tc>
@@ -23086,7 +23883,7 @@
                 <w:sz w:val="19"/>
                 <w:szCs w:val="19"/>
               </w:rPr>
-              <w:t>Foreign-key checks when a stream or district row changes; counts for reminders by district</w:t>
+              <w:t>Log out on every device; clearing expired sessions at log-in</w:t>
             </w:r>
           </w:p>
         </w:tc>
@@ -23129,37 +23926,14 @@
                 <w:szCs w:val="17"/>
                 <w:shd w:val="clear" w:color="auto" w:fill="F2F4F3"/>
               </w:rPr>
-              <w:t>idx_student_subject_subject</w:t>
-            </w:r>
-          </w:p>
-        </w:tc>
-        <w:tc>
-          <w:tcPr>
-            <w:tcW w:w="4819" w:type="dxa"/>
-            <w:tcBorders>
-              <w:top w:val="single" w:sz="4" w:space="0" w:color="C9D3D0"/>
-              <w:left w:val="single" w:sz="4" w:space="0" w:color="C9D3D0"/>
-              <w:bottom w:val="single" w:sz="4" w:space="0" w:color="C9D3D0"/>
-              <w:right w:val="single" w:sz="4" w:space="0" w:color="C9D3D0"/>
-            </w:tcBorders>
-            <w:tcMar>
-              <w:top w:w="50" w:type="dxa"/>
-              <w:left w:w="100" w:type="dxa"/>
-              <w:bottom w:w="50" w:type="dxa"/>
-              <w:right w:w="100" w:type="dxa"/>
-            </w:tcMar>
-            <w:vAlign w:val="center"/>
-          </w:tcPr>
-          <w:p>
-            <w:pPr>
-              <w:spacing w:line="252" w:lineRule="auto"/>
-            </w:pPr>
-            <w:r>
-              <w:rPr>
-                <w:sz w:val="19"/>
-                <w:szCs w:val="19"/>
-              </w:rPr>
-              <w:t xml:space="preserve">Foreign-key checks on </w:t>
+              <w:t>idx_student_profile_stream</w:t>
+            </w:r>
+            <w:r>
+              <w:rPr>
+                <w:sz w:val="19"/>
+                <w:szCs w:val="19"/>
+              </w:rPr>
+              <w:t xml:space="preserve">, </w:t>
             </w:r>
             <w:r>
               <w:rPr>
@@ -23168,6 +23942,120 @@
                 <w:szCs w:val="17"/>
                 <w:shd w:val="clear" w:color="auto" w:fill="F2F4F3"/>
               </w:rPr>
+              <w:t>idx_student_profile_district</w:t>
+            </w:r>
+          </w:p>
+        </w:tc>
+        <w:tc>
+          <w:tcPr>
+            <w:tcW w:w="4819" w:type="dxa"/>
+            <w:tcBorders>
+              <w:top w:val="single" w:sz="4" w:space="0" w:color="C9D3D0"/>
+              <w:left w:val="single" w:sz="4" w:space="0" w:color="C9D3D0"/>
+              <w:bottom w:val="single" w:sz="4" w:space="0" w:color="C9D3D0"/>
+              <w:right w:val="single" w:sz="4" w:space="0" w:color="C9D3D0"/>
+            </w:tcBorders>
+            <w:tcMar>
+              <w:top w:w="50" w:type="dxa"/>
+              <w:left w:w="100" w:type="dxa"/>
+              <w:bottom w:w="50" w:type="dxa"/>
+              <w:right w:w="100" w:type="dxa"/>
+            </w:tcMar>
+            <w:vAlign w:val="center"/>
+          </w:tcPr>
+          <w:p>
+            <w:pPr>
+              <w:spacing w:line="252" w:lineRule="auto"/>
+            </w:pPr>
+            <w:r>
+              <w:rPr>
+                <w:sz w:val="19"/>
+                <w:szCs w:val="19"/>
+              </w:rPr>
+              <w:t>Foreign-key checks when a stream or district row changes; counts for reminders by district</w:t>
+            </w:r>
+          </w:p>
+        </w:tc>
+      </w:tr>
+      <w:tr>
+        <w:tblPrEx>
+          <w:tblCellMar>
+            <w:top w:w="0" w:type="dxa"/>
+            <w:bottom w:w="0" w:type="dxa"/>
+          </w:tblCellMar>
+        </w:tblPrEx>
+        <w:trPr>
+          <w:cantSplit/>
+        </w:trPr>
+        <w:tc>
+          <w:tcPr>
+            <w:tcW w:w="4819" w:type="dxa"/>
+            <w:tcBorders>
+              <w:top w:val="single" w:sz="4" w:space="0" w:color="C9D3D0"/>
+              <w:left w:val="single" w:sz="4" w:space="0" w:color="C9D3D0"/>
+              <w:bottom w:val="single" w:sz="4" w:space="0" w:color="C9D3D0"/>
+              <w:right w:val="single" w:sz="4" w:space="0" w:color="C9D3D0"/>
+            </w:tcBorders>
+            <w:shd w:val="clear" w:color="auto" w:fill="F3F8F6"/>
+            <w:tcMar>
+              <w:top w:w="50" w:type="dxa"/>
+              <w:left w:w="100" w:type="dxa"/>
+              <w:bottom w:w="50" w:type="dxa"/>
+              <w:right w:w="100" w:type="dxa"/>
+            </w:tcMar>
+            <w:vAlign w:val="center"/>
+          </w:tcPr>
+          <w:p>
+            <w:pPr>
+              <w:spacing w:line="252" w:lineRule="auto"/>
+            </w:pPr>
+            <w:r>
+              <w:rPr>
+                <w:rFonts w:ascii="Consolas" w:eastAsia="Consolas" w:hAnsi="Consolas" w:cs="Consolas"/>
+                <w:sz w:val="17"/>
+                <w:szCs w:val="17"/>
+                <w:shd w:val="clear" w:color="auto" w:fill="F2F4F3"/>
+              </w:rPr>
+              <w:t>idx_student_subject_subject</w:t>
+            </w:r>
+          </w:p>
+        </w:tc>
+        <w:tc>
+          <w:tcPr>
+            <w:tcW w:w="4819" w:type="dxa"/>
+            <w:tcBorders>
+              <w:top w:val="single" w:sz="4" w:space="0" w:color="C9D3D0"/>
+              <w:left w:val="single" w:sz="4" w:space="0" w:color="C9D3D0"/>
+              <w:bottom w:val="single" w:sz="4" w:space="0" w:color="C9D3D0"/>
+              <w:right w:val="single" w:sz="4" w:space="0" w:color="C9D3D0"/>
+            </w:tcBorders>
+            <w:shd w:val="clear" w:color="auto" w:fill="F3F8F6"/>
+            <w:tcMar>
+              <w:top w:w="50" w:type="dxa"/>
+              <w:left w:w="100" w:type="dxa"/>
+              <w:bottom w:w="50" w:type="dxa"/>
+              <w:right w:w="100" w:type="dxa"/>
+            </w:tcMar>
+            <w:vAlign w:val="center"/>
+          </w:tcPr>
+          <w:p>
+            <w:pPr>
+              <w:spacing w:line="252" w:lineRule="auto"/>
+            </w:pPr>
+            <w:r>
+              <w:rPr>
+                <w:sz w:val="19"/>
+                <w:szCs w:val="19"/>
+              </w:rPr>
+              <w:t xml:space="preserve">Foreign-key checks on </w:t>
+            </w:r>
+            <w:r>
+              <w:rPr>
+                <w:rFonts w:ascii="Consolas" w:eastAsia="Consolas" w:hAnsi="Consolas" w:cs="Consolas"/>
+                <w:sz w:val="17"/>
+                <w:szCs w:val="17"/>
+                <w:shd w:val="clear" w:color="auto" w:fill="F2F4F3"/>
+              </w:rPr>
               <w:t>subject</w:t>
             </w:r>
           </w:p>
@@ -23185,19 +24073,19 @@
         <w:keepNext/>
         <w:keepLines/>
       </w:pPr>
-      <w:bookmarkStart w:id="45" w:name="_Toc242620565"/>
+      <w:bookmarkStart w:id="47" w:name="_Toc242916225"/>
       <w:r>
         <w:lastRenderedPageBreak/>
         <w:t>6.3 Capacity against the free plan</w:t>
       </w:r>
-      <w:bookmarkEnd w:id="45"/>
+      <w:bookmarkEnd w:id="47"/>
     </w:p>
     <w:p>
       <w:pPr>
         <w:pStyle w:val="Caption"/>
         <w:keepNext/>
       </w:pPr>
-      <w:bookmarkStart w:id="46" w:name="_Toc242620594"/>
+      <w:bookmarkStart w:id="48" w:name="_Toc242916256"/>
       <w:r>
         <w:t xml:space="preserve">Table </w:t>
       </w:r>
@@ -23214,7 +24102,7 @@
         <w:rPr>
           <w:noProof/>
         </w:rPr>
-        <w:t>10</w:t>
+        <w:t>11</w:t>
       </w:r>
       <w:r>
         <w:fldChar w:fldCharType="end"/>
@@ -23222,7 +24110,7 @@
       <w:r>
         <w:t>: Data volume per intake year and free-plan headroom</w:t>
       </w:r>
-      <w:bookmarkEnd w:id="46"/>
+      <w:bookmarkEnd w:id="48"/>
     </w:p>
     <w:tbl>
       <w:tblPr>
@@ -23239,7 +24127,7 @@
           <w:left w:w="10" w:type="dxa"/>
           <w:right w:w="10" w:type="dxa"/>
         </w:tblCellMar>
-        <w:tblLook w:val="0000" w:firstRow="0" w:lastRow="0" w:firstColumn="0" w:lastColumn="0" w:noHBand="0" w:noVBand="0"/>
+        <w:tblLook w:val="04A0" w:firstRow="1" w:lastRow="0" w:firstColumn="1" w:lastColumn="0" w:noHBand="0" w:noVBand="1"/>
       </w:tblPr>
       <w:tblGrid>
         <w:gridCol w:w="4211"/>
@@ -23884,12 +24772,12 @@
         <w:keepLines/>
         <w:pageBreakBefore/>
       </w:pPr>
-      <w:bookmarkStart w:id="47" w:name="_Toc242620566"/>
+      <w:bookmarkStart w:id="49" w:name="_Toc242916226"/>
       <w:r>
         <w:lastRenderedPageBreak/>
         <w:t>7 Validation against real data</w:t>
       </w:r>
-      <w:bookmarkEnd w:id="47"/>
+      <w:bookmarkEnd w:id="49"/>
     </w:p>
     <w:p>
       <w:pPr>
@@ -23908,10 +24796,7 @@
         <w:t>tools/seed/validate-schema.ts</w:t>
       </w:r>
       <w:r>
-        <w:t xml:space="preserve"> applies the </w:t>
-      </w:r>
-      <w:r>
-        <w:t>migration to an in-memory SQLite database (the engine D1 is built on), loads the UGC 2025/26 data and the 2024/25 cut-offs printed in the handbook, runs integrity checks, and then attempts 24 deliberately invalid inserts.</w:t>
+        <w:t xml:space="preserve"> applies the migration to an in-memory SQLite database (the engine D1 is built on), loads the UGC 2025/26 data and the 2024/25 cut-offs printed in the handbook, runs integrity checks, and then attempts 24 deliberately invalid inserts.</w:t>
       </w:r>
     </w:p>
     <w:p>
@@ -23919,7 +24804,7 @@
         <w:pStyle w:val="Caption"/>
         <w:keepNext/>
       </w:pPr>
-      <w:bookmarkStart w:id="48" w:name="_Toc242620595"/>
+      <w:bookmarkStart w:id="50" w:name="_Toc242916257"/>
       <w:r>
         <w:t xml:space="preserve">Table </w:t>
       </w:r>
@@ -23936,7 +24821,7 @@
         <w:rPr>
           <w:noProof/>
         </w:rPr>
-        <w:t>11</w:t>
+        <w:t>12</w:t>
       </w:r>
       <w:r>
         <w:fldChar w:fldCharType="end"/>
@@ -23944,7 +24829,7 @@
       <w:r>
         <w:t>: Schema validation results (5 October 2026)</w:t>
       </w:r>
-      <w:bookmarkEnd w:id="48"/>
+      <w:bookmarkEnd w:id="50"/>
     </w:p>
     <w:tbl>
       <w:tblPr>
@@ -23961,7 +24846,7 @@
           <w:left w:w="10" w:type="dxa"/>
           <w:right w:w="10" w:type="dxa"/>
         </w:tblCellMar>
-        <w:tblLook w:val="0000" w:firstRow="0" w:lastRow="0" w:firstColumn="0" w:lastColumn="0" w:noHBand="0" w:noVBand="0"/>
+        <w:tblLook w:val="04A0" w:firstRow="1" w:lastRow="0" w:firstColumn="1" w:lastColumn="0" w:noHBand="0" w:noVBand="1"/>
       </w:tblPr>
       <w:tblGrid>
         <w:gridCol w:w="6544"/>
@@ -25369,7 +26254,7 @@
         <w:pStyle w:val="Caption"/>
         <w:keepNext/>
       </w:pPr>
-      <w:bookmarkStart w:id="49" w:name="_Toc242620596"/>
+      <w:bookmarkStart w:id="51" w:name="_Toc242916258"/>
       <w:r>
         <w:t xml:space="preserve">Table </w:t>
       </w:r>
@@ -25386,7 +26271,7 @@
         <w:rPr>
           <w:noProof/>
         </w:rPr>
-        <w:t>12</w:t>
+        <w:t>13</w:t>
       </w:r>
       <w:r>
         <w:fldChar w:fldCharType="end"/>
@@ -25394,7 +26279,7 @@
       <w:r>
         <w:t>: Student-account validation results (5 October 2026)</w:t>
       </w:r>
-      <w:bookmarkEnd w:id="49"/>
+      <w:bookmarkEnd w:id="51"/>
     </w:p>
     <w:tbl>
       <w:tblPr>
@@ -25411,7 +26296,7 @@
           <w:left w:w="10" w:type="dxa"/>
           <w:right w:w="10" w:type="dxa"/>
         </w:tblCellMar>
-        <w:tblLook w:val="0000" w:firstRow="0" w:lastRow="0" w:firstColumn="0" w:lastColumn="0" w:noHBand="0" w:noVBand="0"/>
+        <w:tblLook w:val="04A0" w:firstRow="1" w:lastRow="0" w:firstColumn="1" w:lastColumn="0" w:noHBand="0" w:noVBand="1"/>
       </w:tblPr>
       <w:tblGrid>
         <w:gridCol w:w="4819"/>
@@ -26111,19 +26996,19 @@
         <w:keepLines/>
         <w:pageBreakBefore/>
       </w:pPr>
-      <w:bookmarkStart w:id="50" w:name="_Toc242620567"/>
+      <w:bookmarkStart w:id="52" w:name="_Toc242916227"/>
       <w:r>
         <w:lastRenderedPageBreak/>
         <w:t>Appendix A: Traceability: requirements to tables</w:t>
       </w:r>
-      <w:bookmarkEnd w:id="50"/>
+      <w:bookmarkEnd w:id="52"/>
     </w:p>
     <w:p>
       <w:pPr>
         <w:pStyle w:val="Caption"/>
         <w:keepNext/>
       </w:pPr>
-      <w:bookmarkStart w:id="51" w:name="_Toc242620597"/>
+      <w:bookmarkStart w:id="53" w:name="_Toc242916259"/>
       <w:r>
         <w:t xml:space="preserve">Table </w:t>
       </w:r>
@@ -26140,7 +27025,7 @@
         <w:rPr>
           <w:noProof/>
         </w:rPr>
-        <w:t>13</w:t>
+        <w:t>14</w:t>
       </w:r>
       <w:r>
         <w:fldChar w:fldCharType="end"/>
@@ -26148,7 +27033,7 @@
       <w:r>
         <w:t>: Requirements and the tables that realise them</w:t>
       </w:r>
-      <w:bookmarkEnd w:id="51"/>
+      <w:bookmarkEnd w:id="53"/>
     </w:p>
     <w:tbl>
       <w:tblPr>
@@ -26165,7 +27050,7 @@
           <w:left w:w="10" w:type="dxa"/>
           <w:right w:w="10" w:type="dxa"/>
         </w:tblCellMar>
-        <w:tblLook w:val="0000" w:firstRow="0" w:lastRow="0" w:firstColumn="0" w:lastColumn="0" w:noHBand="0" w:noVBand="0"/>
+        <w:tblLook w:val="04A0" w:firstRow="1" w:lastRow="0" w:firstColumn="1" w:lastColumn="0" w:noHBand="0" w:noVBand="1"/>
       </w:tblPr>
       <w:tblGrid>
         <w:gridCol w:w="4819"/>
@@ -28167,6 +29052,104 @@
           </w:p>
         </w:tc>
       </w:tr>
+      <w:tr>
+        <w:tblPrEx>
+          <w:tblCellMar>
+            <w:top w:w="0" w:type="dxa"/>
+            <w:bottom w:w="0" w:type="dxa"/>
+          </w:tblCellMar>
+        </w:tblPrEx>
+        <w:trPr>
+          <w:cantSplit/>
+        </w:trPr>
+        <w:tc>
+          <w:tcPr>
+            <w:tcW w:w="4819" w:type="dxa"/>
+            <w:tcBorders>
+              <w:top w:val="single" w:sz="4" w:space="0" w:color="C9D3D0"/>
+              <w:left w:val="single" w:sz="4" w:space="0" w:color="C9D3D0"/>
+              <w:bottom w:val="single" w:sz="4" w:space="0" w:color="C9D3D0"/>
+              <w:right w:val="single" w:sz="4" w:space="0" w:color="C9D3D0"/>
+            </w:tcBorders>
+            <w:shd w:val="clear" w:color="auto" w:fill="F3F8F6"/>
+            <w:tcMar>
+              <w:top w:w="50" w:type="dxa"/>
+              <w:left w:w="100" w:type="dxa"/>
+              <w:bottom w:w="50" w:type="dxa"/>
+              <w:right w:w="100" w:type="dxa"/>
+            </w:tcMar>
+            <w:vAlign w:val="center"/>
+          </w:tcPr>
+          <w:p>
+            <w:pPr>
+              <w:spacing w:line="252" w:lineRule="auto"/>
+            </w:pPr>
+            <w:r>
+              <w:rPr>
+                <w:sz w:val="19"/>
+                <w:szCs w:val="19"/>
+              </w:rPr>
+              <w:t>CR-007 (one-tap demo, a private copy per visitor)</w:t>
+            </w:r>
+          </w:p>
+        </w:tc>
+        <w:tc>
+          <w:tcPr>
+            <w:tcW w:w="4819" w:type="dxa"/>
+            <w:tcBorders>
+              <w:top w:val="single" w:sz="4" w:space="0" w:color="C9D3D0"/>
+              <w:left w:val="single" w:sz="4" w:space="0" w:color="C9D3D0"/>
+              <w:bottom w:val="single" w:sz="4" w:space="0" w:color="C9D3D0"/>
+              <w:right w:val="single" w:sz="4" w:space="0" w:color="C9D3D0"/>
+            </w:tcBorders>
+            <w:shd w:val="clear" w:color="auto" w:fill="F3F8F6"/>
+            <w:tcMar>
+              <w:top w:w="50" w:type="dxa"/>
+              <w:left w:w="100" w:type="dxa"/>
+              <w:bottom w:w="50" w:type="dxa"/>
+              <w:right w:w="100" w:type="dxa"/>
+            </w:tcMar>
+            <w:vAlign w:val="center"/>
+          </w:tcPr>
+          <w:p>
+            <w:pPr>
+              <w:spacing w:line="252" w:lineRule="auto"/>
+            </w:pPr>
+            <w:r>
+              <w:rPr>
+                <w:rFonts w:ascii="Consolas" w:eastAsia="Consolas" w:hAnsi="Consolas" w:cs="Consolas"/>
+                <w:sz w:val="17"/>
+                <w:szCs w:val="17"/>
+                <w:shd w:val="clear" w:color="auto" w:fill="F2F4F3"/>
+              </w:rPr>
+              <w:t>account.demo_expires_at</w:t>
+            </w:r>
+            <w:r>
+              <w:rPr>
+                <w:sz w:val="19"/>
+                <w:szCs w:val="19"/>
+              </w:rPr>
+              <w:t xml:space="preserve">, </w:t>
+            </w:r>
+            <w:r>
+              <w:rPr>
+                <w:rFonts w:ascii="Consolas" w:eastAsia="Consolas" w:hAnsi="Consolas" w:cs="Consolas"/>
+                <w:sz w:val="17"/>
+                <w:szCs w:val="17"/>
+                <w:shd w:val="clear" w:color="auto" w:fill="F2F4F3"/>
+              </w:rPr>
+              <w:t>idx_account_demo_expires</w:t>
+            </w:r>
+            <w:r>
+              <w:rPr>
+                <w:sz w:val="19"/>
+                <w:szCs w:val="19"/>
+              </w:rPr>
+              <w:t xml:space="preserve"> (0011)</w:t>
+            </w:r>
+          </w:p>
+        </w:tc>
+      </w:tr>
     </w:tbl>
     <w:p>
       <w:pPr>
@@ -28180,12 +29163,12 @@
         <w:keepLines/>
         <w:pageBreakBefore/>
       </w:pPr>
-      <w:bookmarkStart w:id="52" w:name="_Toc242620568"/>
+      <w:bookmarkStart w:id="54" w:name="_Toc242916228"/>
       <w:r>
         <w:lastRenderedPageBreak/>
         <w:t>Appendix B: Physical schema (migration 0001)</w:t>
       </w:r>
-      <w:bookmarkEnd w:id="52"/>
+      <w:bookmarkEnd w:id="54"/>
     </w:p>
     <w:p>
       <w:pPr>
@@ -33393,12 +34376,12 @@
         <w:keepLines/>
         <w:pageBreakBefore/>
       </w:pPr>
-      <w:bookmarkStart w:id="53" w:name="_Toc242620569"/>
+      <w:bookmarkStart w:id="55" w:name="_Toc242916229"/>
       <w:r>
         <w:lastRenderedPageBreak/>
         <w:t>Appendix C: Student accounts (migration 0003)</w:t>
       </w:r>
-      <w:bookmarkEnd w:id="53"/>
+      <w:bookmarkEnd w:id="55"/>
     </w:p>
     <w:p>
       <w:pPr>
@@ -35126,12 +36109,12 @@
         <w:keepLines/>
         <w:pageBreakBefore/>
       </w:pPr>
-      <w:bookmarkStart w:id="54" w:name="_Toc242620570"/>
+      <w:bookmarkStart w:id="56" w:name="_Toc242916230"/>
       <w:r>
         <w:lastRenderedPageBreak/>
         <w:t>Appendix D: Contact details (migration 0007)</w:t>
       </w:r>
-      <w:bookmarkEnd w:id="54"/>
+      <w:bookmarkEnd w:id="56"/>
     </w:p>
     <w:p>
       <w:pPr>
@@ -35522,12 +36505,12 @@
         <w:keepLines/>
         <w:pageBreakBefore/>
       </w:pPr>
-      <w:bookmarkStart w:id="55" w:name="_Toc242620571"/>
+      <w:bookmarkStart w:id="57" w:name="_Toc242916231"/>
       <w:r>
         <w:lastRenderedPageBreak/>
         <w:t>Appendix E: Answer feedback (migration 0008)</w:t>
       </w:r>
-      <w:bookmarkEnd w:id="55"/>
+      <w:bookmarkEnd w:id="57"/>
     </w:p>
     <w:p>
       <w:pPr>
@@ -35833,12 +36816,12 @@
         <w:keepLines/>
         <w:pageBreakBefore/>
       </w:pPr>
-      <w:bookmarkStart w:id="56" w:name="_Toc242620572"/>
+      <w:bookmarkStart w:id="58" w:name="_Toc242916232"/>
       <w:r>
         <w:lastRenderedPageBreak/>
         <w:t>Appendix F: Journey, avatars and group rules on the account (migration 0010)</w:t>
       </w:r>
-      <w:bookmarkEnd w:id="56"/>
+      <w:bookmarkEnd w:id="58"/>
     </w:p>
     <w:p>
       <w:pPr>
@@ -40849,12 +41832,12 @@
         <w:keepLines/>
         <w:pageBreakBefore/>
       </w:pPr>
-      <w:bookmarkStart w:id="57" w:name="_Toc242620573"/>
+      <w:bookmarkStart w:id="59" w:name="_Toc242916233"/>
       <w:r>
         <w:lastRenderedPageBreak/>
-        <w:t>Appendix G: Group rules (migration 0009)</w:t>
-      </w:r>
-      <w:bookmarkEnd w:id="57"/>
+        <w:t>Appendix G: Demo accounts (migration 0011)</w:t>
+      </w:r>
+      <w:bookmarkEnd w:id="59"/>
     </w:p>
     <w:p>
       <w:pPr>
@@ -40870,7 +41853,7 @@
           <w:szCs w:val="19"/>
           <w:shd w:val="clear" w:color="auto" w:fill="F2F4F3"/>
         </w:rPr>
-        <w:t>migrations/0009_group_rules.sql</w:t>
+        <w:t>migrations/0011_demo_accounts.sql</w:t>
       </w:r>
       <w:r>
         <w:t>.</w:t>
@@ -40893,7 +41876,7 @@
           <w:sz w:val="17"/>
           <w:szCs w:val="17"/>
         </w:rPr>
-        <w:t>-- 0009: group rules (CR-005, video 2 2026-10-11: "Groups should have rules too"). Designed in ZP-DOC-05, CR-005.</w:t>
+        <w:t>-- 0011: CR-007 (Praveen 2026-10-15): "Try the demo" on the Welcome screen. Each tap makes a private throwaway account</w:t>
       </w:r>
     </w:p>
     <w:p>
@@ -40910,7 +41893,7 @@
           <w:sz w:val="17"/>
           <w:szCs w:val="17"/>
         </w:rPr>
-        <w:t>-- A member accepts the group rules before taking part; the accepted version is recorded on the membership, so a new</w:t>
+        <w:t>-- with the sample student, deleted 24 hours later. Designed in ZP-DOC-05, CR-007.</w:t>
       </w:r>
     </w:p>
     <w:p>
@@ -40927,7 +41910,7 @@
           <w:sz w:val="17"/>
           <w:szCs w:val="17"/>
         </w:rPr>
-        <w:t>-- version of the rules can be asked for again. NULL = joined before rules existed (or not yet accepted): the Worker</w:t>
+        <w:t>--</w:t>
       </w:r>
     </w:p>
     <w:p>
@@ -40944,7 +41927,7 @@
           <w:sz w:val="17"/>
           <w:szCs w:val="17"/>
         </w:rPr>
-        <w:t>-- then keeps the live room closed until the member accepts (enforced in worker/groups.ts, not only on the phone).</w:t>
+        <w:t>-- A demo account is an ordinary ACCOUNT with an expiry: no new table, so every child row (profile, list, journey,</w:t>
       </w:r>
     </w:p>
     <w:p>
@@ -40961,7 +41944,58 @@
           <w:sz w:val="17"/>
           <w:szCs w:val="17"/>
         </w:rPr>
-        <w:t>-- Reuses group_member (one row per member per group) instead of a new table: acceptance is a fact about that row.</w:t>
+        <w:t>-- sessions, memberships) already cascades when it is deleted. NULL = a real account, the behaviour before CR-007.</w:t>
+      </w:r>
+    </w:p>
+    <w:p>
+      <w:pPr>
+        <w:keepNext/>
+        <w:keepLines/>
+        <w:shd w:val="clear" w:color="auto" w:fill="F2F4F3"/>
+        <w:spacing w:line="240" w:lineRule="auto"/>
+        <w:ind w:left="113" w:right="113"/>
+      </w:pPr>
+      <w:r>
+        <w:rPr>
+          <w:rFonts w:ascii="Consolas" w:eastAsia="Consolas" w:hAnsi="Consolas" w:cs="Consolas"/>
+          <w:sz w:val="17"/>
+          <w:szCs w:val="17"/>
+        </w:rPr>
+        <w:t>ALTER TABLE account ADD COLUMN demo_expires_at TEXT CHECK (demo_expires_at IS NULL OR demo_expires_at &gt; created_at);</w:t>
+      </w:r>
+    </w:p>
+    <w:p>
+      <w:pPr>
+        <w:keepNext/>
+        <w:keepLines/>
+        <w:shd w:val="clear" w:color="auto" w:fill="F2F4F3"/>
+        <w:spacing w:line="240" w:lineRule="auto"/>
+        <w:ind w:left="113" w:right="113"/>
+      </w:pPr>
+      <w:r>
+        <w:rPr>
+          <w:rFonts w:ascii="Consolas" w:eastAsia="Consolas" w:hAnsi="Consolas" w:cs="Consolas"/>
+          <w:sz w:val="17"/>
+          <w:szCs w:val="17"/>
+        </w:rPr>
+        <w:t xml:space="preserve"> </w:t>
+      </w:r>
+    </w:p>
+    <w:p>
+      <w:pPr>
+        <w:keepNext/>
+        <w:keepLines/>
+        <w:shd w:val="clear" w:color="auto" w:fill="F2F4F3"/>
+        <w:spacing w:line="240" w:lineRule="auto"/>
+        <w:ind w:left="113" w:right="113"/>
+      </w:pPr>
+      <w:r>
+        <w:rPr>
+          <w:rFonts w:ascii="Consolas" w:eastAsia="Consolas" w:hAnsi="Consolas" w:cs="Consolas"/>
+          <w:sz w:val="17"/>
+          <w:szCs w:val="17"/>
+        </w:rPr>
+        <w:t>-- Cleanup finds expired demo accounts without scanning real ones (partial index: real accounts are not in it).</w:t>
       </w:r>
     </w:p>
     <w:p>
@@ -40980,7 +42014,7 @@
           <w:sz w:val="17"/>
           <w:szCs w:val="17"/>
         </w:rPr>
-        <w:t>ALTER TABLE group_member ADD COLUMN rules_version TEXT CHECK (rules_version IS NULL OR rules_version IN ('2026-10-11'));</w:t>
+        <w:t>CREATE INDEX idx_account_demo_expires ON account(demo_expires_at) WHERE demo_expires_at IS NOT NULL;</w:t>
       </w:r>
     </w:p>
     <w:p>
@@ -40990,12 +42024,12 @@
         <w:keepLines/>
         <w:pageBreakBefore/>
       </w:pPr>
-      <w:bookmarkStart w:id="58" w:name="_Toc242620574"/>
+      <w:bookmarkStart w:id="60" w:name="_Toc242916234"/>
       <w:r>
         <w:lastRenderedPageBreak/>
-        <w:t>Appendix H: Groups (migration 0006)</w:t>
-      </w:r>
-      <w:bookmarkEnd w:id="58"/>
+        <w:t>Appendix H: Group rules (migration 0009)</w:t>
+      </w:r>
+      <w:bookmarkEnd w:id="60"/>
     </w:p>
     <w:p>
       <w:pPr>
@@ -41011,10 +42045,139 @@
           <w:szCs w:val="19"/>
           <w:shd w:val="clear" w:color="auto" w:fill="F2F4F3"/>
         </w:rPr>
-        <w:t>migrations/0006_groups.sql</w:t>
-      </w:r>
-      <w:r>
-        <w:t xml:space="preserve">. Migration 0005 inserts the courses and institutions and is generated by </w:t>
+        <w:t>migrations/0009_group_rules.sql</w:t>
+      </w:r>
+      <w:r>
+        <w:t>.</w:t>
+      </w:r>
+    </w:p>
+    <w:p>
+      <w:pPr>
+        <w:keepNext/>
+        <w:keepLines/>
+        <w:pBdr>
+          <w:top w:val="single" w:sz="4" w:space="4" w:color="C9D3D0"/>
+        </w:pBdr>
+        <w:shd w:val="clear" w:color="auto" w:fill="F2F4F3"/>
+        <w:spacing w:before="120" w:line="240" w:lineRule="auto"/>
+        <w:ind w:left="113" w:right="113"/>
+      </w:pPr>
+      <w:r>
+        <w:rPr>
+          <w:rFonts w:ascii="Consolas" w:eastAsia="Consolas" w:hAnsi="Consolas" w:cs="Consolas"/>
+          <w:sz w:val="17"/>
+          <w:szCs w:val="17"/>
+        </w:rPr>
+        <w:t>-- 0009: group rules (CR-005, video 2 2026-10-11: "Groups should have rules too"). Designed in ZP-DOC-05, CR-005.</w:t>
+      </w:r>
+    </w:p>
+    <w:p>
+      <w:pPr>
+        <w:keepNext/>
+        <w:keepLines/>
+        <w:shd w:val="clear" w:color="auto" w:fill="F2F4F3"/>
+        <w:spacing w:line="240" w:lineRule="auto"/>
+        <w:ind w:left="113" w:right="113"/>
+      </w:pPr>
+      <w:r>
+        <w:rPr>
+          <w:rFonts w:ascii="Consolas" w:eastAsia="Consolas" w:hAnsi="Consolas" w:cs="Consolas"/>
+          <w:sz w:val="17"/>
+          <w:szCs w:val="17"/>
+        </w:rPr>
+        <w:t>-- A member accepts the group rules before taking part; the accepted version is recorded on the membership, so a new</w:t>
+      </w:r>
+    </w:p>
+    <w:p>
+      <w:pPr>
+        <w:keepNext/>
+        <w:keepLines/>
+        <w:shd w:val="clear" w:color="auto" w:fill="F2F4F3"/>
+        <w:spacing w:line="240" w:lineRule="auto"/>
+        <w:ind w:left="113" w:right="113"/>
+      </w:pPr>
+      <w:r>
+        <w:rPr>
+          <w:rFonts w:ascii="Consolas" w:eastAsia="Consolas" w:hAnsi="Consolas" w:cs="Consolas"/>
+          <w:sz w:val="17"/>
+          <w:szCs w:val="17"/>
+        </w:rPr>
+        <w:t>-- version of the rules can be asked for again. NULL = joined before rules existed (or not yet accepted): the Worker</w:t>
+      </w:r>
+    </w:p>
+    <w:p>
+      <w:pPr>
+        <w:keepNext/>
+        <w:keepLines/>
+        <w:shd w:val="clear" w:color="auto" w:fill="F2F4F3"/>
+        <w:spacing w:line="240" w:lineRule="auto"/>
+        <w:ind w:left="113" w:right="113"/>
+      </w:pPr>
+      <w:r>
+        <w:rPr>
+          <w:rFonts w:ascii="Consolas" w:eastAsia="Consolas" w:hAnsi="Consolas" w:cs="Consolas"/>
+          <w:sz w:val="17"/>
+          <w:szCs w:val="17"/>
+        </w:rPr>
+        <w:t>-- then keeps the live room closed until the member accepts (enforced in worker/groups.ts, not only on the phone).</w:t>
+      </w:r>
+    </w:p>
+    <w:p>
+      <w:pPr>
+        <w:keepNext/>
+        <w:keepLines/>
+        <w:shd w:val="clear" w:color="auto" w:fill="F2F4F3"/>
+        <w:spacing w:line="240" w:lineRule="auto"/>
+        <w:ind w:left="113" w:right="113"/>
+      </w:pPr>
+      <w:r>
+        <w:rPr>
+          <w:rFonts w:ascii="Consolas" w:eastAsia="Consolas" w:hAnsi="Consolas" w:cs="Consolas"/>
+          <w:sz w:val="17"/>
+          <w:szCs w:val="17"/>
+        </w:rPr>
+        <w:t>-- Reuses group_member (one row per member per group) instead of a new table: acceptance is a fact about that row.</w:t>
+      </w:r>
+    </w:p>
+    <w:p>
+      <w:pPr>
+        <w:keepLines/>
+        <w:pBdr>
+          <w:bottom w:val="single" w:sz="4" w:space="4" w:color="C9D3D0"/>
+        </w:pBdr>
+        <w:shd w:val="clear" w:color="auto" w:fill="F2F4F3"/>
+        <w:spacing w:after="160" w:line="240" w:lineRule="auto"/>
+        <w:ind w:left="113" w:right="113"/>
+      </w:pPr>
+      <w:r>
+        <w:rPr>
+          <w:rFonts w:ascii="Consolas" w:eastAsia="Consolas" w:hAnsi="Consolas" w:cs="Consolas"/>
+          <w:sz w:val="17"/>
+          <w:szCs w:val="17"/>
+        </w:rPr>
+        <w:t>ALTER TABLE group_member ADD COLUMN rules_version TEXT CHECK (rules_version IS NULL OR rules_version IN ('2026-10-11'));</w:t>
+      </w:r>
+    </w:p>
+    <w:p>
+      <w:pPr>
+        <w:pStyle w:val="Heading1"/>
+        <w:keepNext/>
+        <w:keepLines/>
+        <w:pageBreakBefore/>
+      </w:pPr>
+      <w:bookmarkStart w:id="61" w:name="_Toc242916235"/>
+      <w:r>
+        <w:lastRenderedPageBreak/>
+        <w:t>Appendix I: Groups (migration 0006)</w:t>
+      </w:r>
+      <w:bookmarkEnd w:id="61"/>
+    </w:p>
+    <w:p>
+      <w:pPr>
+        <w:spacing w:after="120"/>
+      </w:pPr>
+      <w:r>
+        <w:t xml:space="preserve">Reproduced verbatim from </w:t>
       </w:r>
       <w:r>
         <w:rPr>
@@ -41023,6 +42186,18 @@
           <w:szCs w:val="19"/>
           <w:shd w:val="clear" w:color="auto" w:fill="F2F4F3"/>
         </w:rPr>
+        <w:t>migrations/0006_groups.sql</w:t>
+      </w:r>
+      <w:r>
+        <w:t xml:space="preserve">. Migration 0005 inserts the courses and institutions and is generated by </w:t>
+      </w:r>
+      <w:r>
+        <w:rPr>
+          <w:rFonts w:ascii="Consolas" w:eastAsia="Consolas" w:hAnsi="Consolas" w:cs="Consolas"/>
+          <w:sz w:val="19"/>
+          <w:szCs w:val="19"/>
+          <w:shd w:val="clear" w:color="auto" w:fill="F2F4F3"/>
+        </w:rPr>
         <w:t>tools/seed/courses-sql.ts</w:t>
       </w:r>
       <w:r>
@@ -42243,19 +43418,19 @@
         <w:keepLines/>
         <w:pageBreakBefore/>
       </w:pPr>
-      <w:bookmarkStart w:id="59" w:name="_Toc242620575"/>
+      <w:bookmarkStart w:id="62" w:name="_Toc242916236"/>
       <w:r>
         <w:lastRenderedPageBreak/>
-        <w:t>Appendix I: Glossary</w:t>
-      </w:r>
-      <w:bookmarkEnd w:id="59"/>
+        <w:t>Appendix J: Glossary</w:t>
+      </w:r>
+      <w:bookmarkEnd w:id="62"/>
     </w:p>
     <w:p>
       <w:pPr>
         <w:pStyle w:val="Caption"/>
         <w:keepNext/>
       </w:pPr>
-      <w:bookmarkStart w:id="60" w:name="_Toc242620598"/>
+      <w:bookmarkStart w:id="63" w:name="_Toc242916260"/>
       <w:r>
         <w:t xml:space="preserve">Table </w:t>
       </w:r>
@@ -42272,7 +43447,7 @@
         <w:rPr>
           <w:noProof/>
         </w:rPr>
-        <w:t>14</w:t>
+        <w:t>15</w:t>
       </w:r>
       <w:r>
         <w:fldChar w:fldCharType="end"/>
@@ -42280,7 +43455,7 @@
       <w:r>
         <w:t>: Terms used in this document</w:t>
       </w:r>
-      <w:bookmarkEnd w:id="60"/>
+      <w:bookmarkEnd w:id="63"/>
     </w:p>
     <w:tbl>
       <w:tblPr>
@@ -42297,7 +43472,7 @@
           <w:left w:w="10" w:type="dxa"/>
           <w:right w:w="10" w:type="dxa"/>
         </w:tblCellMar>
-        <w:tblLook w:val="0000" w:firstRow="0" w:lastRow="0" w:firstColumn="0" w:lastColumn="0" w:noHBand="0" w:noVBand="0"/>
+        <w:tblLook w:val="04A0" w:firstRow="1" w:lastRow="0" w:firstColumn="1" w:lastColumn="0" w:noHBand="0" w:noVBand="1"/>
       </w:tblPr>
       <w:tblGrid>
         <w:gridCol w:w="2928"/>
@@ -42972,19 +44147,19 @@
         <w:keepLines/>
         <w:pageBreakBefore/>
       </w:pPr>
-      <w:bookmarkStart w:id="61" w:name="_Toc242620576"/>
+      <w:bookmarkStart w:id="64" w:name="_Toc242916237"/>
       <w:r>
         <w:lastRenderedPageBreak/>
-        <w:t>Appendix J: References</w:t>
-      </w:r>
-      <w:bookmarkEnd w:id="61"/>
+        <w:t>Appendix K: References</w:t>
+      </w:r>
+      <w:bookmarkEnd w:id="64"/>
     </w:p>
     <w:p>
       <w:pPr>
         <w:pStyle w:val="Caption"/>
         <w:keepNext/>
       </w:pPr>
-      <w:bookmarkStart w:id="62" w:name="_Toc242620599"/>
+      <w:bookmarkStart w:id="65" w:name="_Toc242916261"/>
       <w:r>
         <w:t xml:space="preserve">Table </w:t>
       </w:r>
@@ -43001,7 +44176,7 @@
         <w:rPr>
           <w:noProof/>
         </w:rPr>
-        <w:t>15</w:t>
+        <w:t>16</w:t>
       </w:r>
       <w:r>
         <w:fldChar w:fldCharType="end"/>
@@ -43009,7 +44184,7 @@
       <w:r>
         <w:t>: Sources referred to in this document</w:t>
       </w:r>
-      <w:bookmarkEnd w:id="62"/>
+      <w:bookmarkEnd w:id="65"/>
     </w:p>
     <w:tbl>
       <w:tblPr>
@@ -43026,7 +44201,7 @@
           <w:left w:w="10" w:type="dxa"/>
           <w:right w:w="10" w:type="dxa"/>
         </w:tblCellMar>
-        <w:tblLook w:val="0000" w:firstRow="0" w:lastRow="0" w:firstColumn="0" w:lastColumn="0" w:noHBand="0" w:noVBand="0"/>
+        <w:tblLook w:val="04A0" w:firstRow="1" w:lastRow="0" w:firstColumn="1" w:lastColumn="0" w:noHBand="0" w:noVBand="1"/>
       </w:tblPr>
       <w:tblGrid>
         <w:gridCol w:w="803"/>
@@ -43915,96 +45090,10 @@
 <file path=word/numbering.xml><?xml version="1.0" encoding="utf-8"?>
 <w:numbering xmlns:wpc="http://schemas.microsoft.com/office/word/2010/wordprocessingCanvas" xmlns:cx="http://schemas.microsoft.com/office/drawing/2014/chartex" xmlns:cx1="http://schemas.microsoft.com/office/drawing/2015/9/8/chartex" xmlns:cx2="http://schemas.microsoft.com/office/drawing/2015/10/21/chartex" xmlns:cx3="http://schemas.microsoft.com/office/drawing/2016/5/9/chartex" xmlns:cx4="http://schemas.microsoft.com/office/drawing/2016/5/10/chartex" xmlns:cx5="http://schemas.microsoft.com/office/drawing/2016/5/11/chartex" xmlns:cx6="http://schemas.microsoft.com/office/drawing/2016/5/12/chartex" xmlns:cx7="http://schemas.microsoft.com/office/drawing/2016/5/13/chartex" xmlns:cx8="http://schemas.microsoft.com/office/drawing/2016/5/14/chartex" xmlns:mc="http://schemas.openxmlformats.org/markup-compatibility/2006" xmlns:aink="http://schemas.microsoft.com/office/drawing/2016/ink" xmlns:am3d="http://schemas.microsoft.com/office/drawing/2017/model3d" xmlns:o="urn:schemas-microsoft-com:office:office" xmlns:oel="http://schemas.microsoft.com/office/2019/extlst" xmlns:r="http://schemas.openxmlformats.org/officeDocument/2006/relationships" xmlns:m="http://schemas.openxmlformats.org/officeDocument/2006/math" xmlns:v="urn:schemas-microsoft-com:vml" xmlns:wp14="http://schemas.microsoft.com/office/word/2010/wordprocessingDrawing" xmlns:wp="http://schemas.openxmlformats.org/drawingml/2006/wordprocessingDrawing" xmlns:w10="urn:schemas-microsoft-com:office:word" xmlns:w="http://schemas.openxmlformats.org/wordprocessingml/2006/main" xmlns:w14="http://schemas.microsoft.com/office/word/2010/wordml" xmlns:w15="http://schemas.microsoft.com/office/word/2012/wordml" xmlns:w16cex="http://schemas.microsoft.com/office/word/2018/wordml/cex" xmlns:w16cid="http://schemas.microsoft.com/office/word/2016/wordml/cid" xmlns:w16="http://schemas.microsoft.com/office/word/2018/wordml" xmlns:w16du="http://schemas.microsoft.com/office/word/2023/wordml/word16du" xmlns:w16sdtdh="http://schemas.microsoft.com/office/word/2020/wordml/sdtdatahash" xmlns:w16sdtfl="http://schemas.microsoft.com/office/word/2024/wordml/sdtformatlock" xmlns:w16se="http://schemas.microsoft.com/office/word/2015/wordml/symex" xmlns:wpg="http://schemas.microsoft.com/office/word/2010/wordprocessingGroup" xmlns:wpi="http://schemas.microsoft.com/office/word/2010/wordprocessingInk" xmlns:wne="http://schemas.microsoft.com/office/word/2006/wordml" xmlns:wps="http://schemas.microsoft.com/office/word/2010/wordprocessingShape" mc:Ignorable="w14 w15 w16se w16cid w16 w16cex w16sdtdh w16sdtfl w16du wp14">
   <w:abstractNum w:abstractNumId="0" w15:restartNumberingAfterBreak="0">
-    <w:nsid w:val="0EF800B3"/>
+    <w:nsid w:val="1D493F9E"/>
     <w:multiLevelType w:val="hybridMultilevel"/>
-    <w:tmpl w:val="039CDDDA"/>
-    <w:lvl w:ilvl="0" w:tplc="B0065580" w:tentative="1">
-      <w:start w:val="1"/>
-      <w:numFmt w:val="bullet"/>
-      <w:lvlText w:val="●"/>
-      <w:lvlJc w:val="left"/>
-      <w:pPr>
-        <w:ind w:left="720" w:hanging="360"/>
-      </w:pPr>
-    </w:lvl>
-    <w:lvl w:ilvl="1" w:tplc="67A499DC" w:tentative="1">
-      <w:start w:val="1"/>
-      <w:numFmt w:val="bullet"/>
-      <w:lvlText w:val="○"/>
-      <w:lvlJc w:val="left"/>
-      <w:pPr>
-        <w:ind w:left="1440" w:hanging="360"/>
-      </w:pPr>
-    </w:lvl>
-    <w:lvl w:ilvl="2" w:tplc="26C476C4" w:tentative="1">
-      <w:start w:val="1"/>
-      <w:numFmt w:val="bullet"/>
-      <w:lvlText w:val="■"/>
-      <w:lvlJc w:val="left"/>
-      <w:pPr>
-        <w:ind w:left="2160" w:hanging="360"/>
-      </w:pPr>
-    </w:lvl>
-    <w:lvl w:ilvl="3" w:tplc="D49018E0" w:tentative="1">
-      <w:start w:val="1"/>
-      <w:numFmt w:val="bullet"/>
-      <w:lvlText w:val="●"/>
-      <w:lvlJc w:val="left"/>
-      <w:pPr>
-        <w:ind w:left="2880" w:hanging="360"/>
-      </w:pPr>
-    </w:lvl>
-    <w:lvl w:ilvl="4" w:tplc="B11E3E34" w:tentative="1">
-      <w:start w:val="1"/>
-      <w:numFmt w:val="bullet"/>
-      <w:lvlText w:val="○"/>
-      <w:lvlJc w:val="left"/>
-      <w:pPr>
-        <w:ind w:left="3600" w:hanging="360"/>
-      </w:pPr>
-    </w:lvl>
-    <w:lvl w:ilvl="5" w:tplc="B9906F0E" w:tentative="1">
-      <w:start w:val="1"/>
-      <w:numFmt w:val="bullet"/>
-      <w:lvlText w:val="■"/>
-      <w:lvlJc w:val="left"/>
-      <w:pPr>
-        <w:ind w:left="4320" w:hanging="360"/>
-      </w:pPr>
-    </w:lvl>
-    <w:lvl w:ilvl="6" w:tplc="E410B58E" w:tentative="1">
-      <w:start w:val="1"/>
-      <w:numFmt w:val="bullet"/>
-      <w:lvlText w:val="●"/>
-      <w:lvlJc w:val="left"/>
-      <w:pPr>
-        <w:ind w:left="5040" w:hanging="360"/>
-      </w:pPr>
-    </w:lvl>
-    <w:lvl w:ilvl="7" w:tplc="A49EB4B4" w:tentative="1">
-      <w:start w:val="1"/>
-      <w:numFmt w:val="bullet"/>
-      <w:lvlText w:val="●"/>
-      <w:lvlJc w:val="left"/>
-      <w:pPr>
-        <w:ind w:left="5760" w:hanging="360"/>
-      </w:pPr>
-    </w:lvl>
-    <w:lvl w:ilvl="8" w:tplc="140098C2" w:tentative="1">
-      <w:start w:val="1"/>
-      <w:numFmt w:val="bullet"/>
-      <w:lvlText w:val="●"/>
-      <w:lvlJc w:val="left"/>
-      <w:pPr>
-        <w:ind w:left="6480" w:hanging="360"/>
-      </w:pPr>
-    </w:lvl>
-  </w:abstractNum>
-  <w:abstractNum w:abstractNumId="1" w15:restartNumberingAfterBreak="0">
-    <w:nsid w:val="1D5461A7"/>
-    <w:multiLevelType w:val="hybridMultilevel"/>
-    <w:tmpl w:val="43E03D80"/>
-    <w:lvl w:ilvl="0" w:tplc="EC88C0D0">
+    <w:tmpl w:val="996E78C2"/>
+    <w:lvl w:ilvl="0" w:tplc="0A4C57F4">
       <w:start w:val="1"/>
       <w:numFmt w:val="bullet"/>
       <w:lvlText w:val="•"/>
@@ -44013,7 +45102,7 @@
         <w:ind w:left="720" w:hanging="280"/>
       </w:pPr>
     </w:lvl>
-    <w:lvl w:ilvl="1" w:tplc="9B3E243E" w:tentative="1">
+    <w:lvl w:ilvl="1" w:tplc="8AFA058E" w:tentative="1">
       <w:start w:val="1"/>
       <w:numFmt w:val="bullet"/>
       <w:lvlText w:val="–"/>
@@ -44022,7 +45111,7 @@
         <w:ind w:left="1080" w:hanging="280"/>
       </w:pPr>
     </w:lvl>
-    <w:lvl w:ilvl="2" w:tplc="A95A65C2" w:tentative="1">
+    <w:lvl w:ilvl="2" w:tplc="84D08FF6" w:tentative="1">
       <w:start w:val="1"/>
       <w:numFmt w:val="bullet"/>
       <w:lvlText w:val="▪"/>
@@ -44031,42 +45120,128 @@
         <w:ind w:left="1440" w:hanging="280"/>
       </w:pPr>
     </w:lvl>
-    <w:lvl w:ilvl="3" w:tplc="49A00066">
+    <w:lvl w:ilvl="3" w:tplc="7812BBB8">
       <w:numFmt w:val="decimal"/>
       <w:lvlText w:val=""/>
       <w:lvlJc w:val="left"/>
     </w:lvl>
-    <w:lvl w:ilvl="4" w:tplc="9BD49BE2">
+    <w:lvl w:ilvl="4" w:tplc="F81252A0">
       <w:numFmt w:val="decimal"/>
       <w:lvlText w:val=""/>
       <w:lvlJc w:val="left"/>
     </w:lvl>
-    <w:lvl w:ilvl="5" w:tplc="B92C43C4">
+    <w:lvl w:ilvl="5" w:tplc="37865A16">
       <w:numFmt w:val="decimal"/>
       <w:lvlText w:val=""/>
       <w:lvlJc w:val="left"/>
     </w:lvl>
-    <w:lvl w:ilvl="6" w:tplc="2A1603FC">
+    <w:lvl w:ilvl="6" w:tplc="5A340124">
       <w:numFmt w:val="decimal"/>
       <w:lvlText w:val=""/>
       <w:lvlJc w:val="left"/>
     </w:lvl>
-    <w:lvl w:ilvl="7" w:tplc="242E70B0">
+    <w:lvl w:ilvl="7" w:tplc="2DDA9276">
       <w:numFmt w:val="decimal"/>
       <w:lvlText w:val=""/>
       <w:lvlJc w:val="left"/>
     </w:lvl>
-    <w:lvl w:ilvl="8" w:tplc="9DB22652">
+    <w:lvl w:ilvl="8" w:tplc="3EE2CA5E">
       <w:numFmt w:val="decimal"/>
       <w:lvlText w:val=""/>
       <w:lvlJc w:val="left"/>
     </w:lvl>
   </w:abstractNum>
+  <w:abstractNum w:abstractNumId="1" w15:restartNumberingAfterBreak="0">
+    <w:nsid w:val="4F774567"/>
+    <w:multiLevelType w:val="hybridMultilevel"/>
+    <w:tmpl w:val="BE66E6A2"/>
+    <w:lvl w:ilvl="0" w:tplc="9202B968" w:tentative="1">
+      <w:start w:val="1"/>
+      <w:numFmt w:val="bullet"/>
+      <w:lvlText w:val="●"/>
+      <w:lvlJc w:val="left"/>
+      <w:pPr>
+        <w:ind w:left="720" w:hanging="360"/>
+      </w:pPr>
+    </w:lvl>
+    <w:lvl w:ilvl="1" w:tplc="5D3E96CA" w:tentative="1">
+      <w:start w:val="1"/>
+      <w:numFmt w:val="bullet"/>
+      <w:lvlText w:val="○"/>
+      <w:lvlJc w:val="left"/>
+      <w:pPr>
+        <w:ind w:left="1440" w:hanging="360"/>
+      </w:pPr>
+    </w:lvl>
+    <w:lvl w:ilvl="2" w:tplc="35BCBE60" w:tentative="1">
+      <w:start w:val="1"/>
+      <w:numFmt w:val="bullet"/>
+      <w:lvlText w:val="■"/>
+      <w:lvlJc w:val="left"/>
+      <w:pPr>
+        <w:ind w:left="2160" w:hanging="360"/>
+      </w:pPr>
+    </w:lvl>
+    <w:lvl w:ilvl="3" w:tplc="1270BAEE" w:tentative="1">
+      <w:start w:val="1"/>
+      <w:numFmt w:val="bullet"/>
+      <w:lvlText w:val="●"/>
+      <w:lvlJc w:val="left"/>
+      <w:pPr>
+        <w:ind w:left="2880" w:hanging="360"/>
+      </w:pPr>
+    </w:lvl>
+    <w:lvl w:ilvl="4" w:tplc="C8DE948C" w:tentative="1">
+      <w:start w:val="1"/>
+      <w:numFmt w:val="bullet"/>
+      <w:lvlText w:val="○"/>
+      <w:lvlJc w:val="left"/>
+      <w:pPr>
+        <w:ind w:left="3600" w:hanging="360"/>
+      </w:pPr>
+    </w:lvl>
+    <w:lvl w:ilvl="5" w:tplc="36C2FC6E" w:tentative="1">
+      <w:start w:val="1"/>
+      <w:numFmt w:val="bullet"/>
+      <w:lvlText w:val="■"/>
+      <w:lvlJc w:val="left"/>
+      <w:pPr>
+        <w:ind w:left="4320" w:hanging="360"/>
+      </w:pPr>
+    </w:lvl>
+    <w:lvl w:ilvl="6" w:tplc="AA82D828" w:tentative="1">
+      <w:start w:val="1"/>
+      <w:numFmt w:val="bullet"/>
+      <w:lvlText w:val="●"/>
+      <w:lvlJc w:val="left"/>
+      <w:pPr>
+        <w:ind w:left="5040" w:hanging="360"/>
+      </w:pPr>
+    </w:lvl>
+    <w:lvl w:ilvl="7" w:tplc="070EF794" w:tentative="1">
+      <w:start w:val="1"/>
+      <w:numFmt w:val="bullet"/>
+      <w:lvlText w:val="●"/>
+      <w:lvlJc w:val="left"/>
+      <w:pPr>
+        <w:ind w:left="5760" w:hanging="360"/>
+      </w:pPr>
+    </w:lvl>
+    <w:lvl w:ilvl="8" w:tplc="8AD6B5C2" w:tentative="1">
+      <w:start w:val="1"/>
+      <w:numFmt w:val="bullet"/>
+      <w:lvlText w:val="●"/>
+      <w:lvlJc w:val="left"/>
+      <w:pPr>
+        <w:ind w:left="6480" w:hanging="360"/>
+      </w:pPr>
+    </w:lvl>
+  </w:abstractNum>
   <w:abstractNum w:abstractNumId="2" w15:restartNumberingAfterBreak="0">
-    <w:nsid w:val="64653211"/>
+    <w:nsid w:val="6CEA2C23"/>
     <w:multiLevelType w:val="hybridMultilevel"/>
-    <w:tmpl w:val="E44262C8"/>
-    <w:lvl w:ilvl="0" w:tplc="F3408698" w:tentative="1">
+    <w:tmpl w:val="01CE871C"/>
+    <w:lvl w:ilvl="0" w:tplc="AA867054" w:tentative="1">
       <w:start w:val="1"/>
       <w:numFmt w:val="decimal"/>
       <w:lvlText w:val="%1."/>
@@ -44075,7 +45250,7 @@
         <w:ind w:left="720" w:hanging="360"/>
       </w:pPr>
     </w:lvl>
-    <w:lvl w:ilvl="1" w:tplc="D9AE7B8C" w:tentative="1">
+    <w:lvl w:ilvl="1" w:tplc="B0BC9064" w:tentative="1">
       <w:start w:val="1"/>
       <w:numFmt w:val="lowerLetter"/>
       <w:lvlText w:val="%2."/>
@@ -44084,7 +45259,7 @@
         <w:ind w:left="1080" w:hanging="360"/>
       </w:pPr>
     </w:lvl>
-    <w:lvl w:ilvl="2" w:tplc="4FE8E278" w:tentative="1">
+    <w:lvl w:ilvl="2" w:tplc="BA502B6A" w:tentative="1">
       <w:start w:val="1"/>
       <w:numFmt w:val="lowerRoman"/>
       <w:lvlText w:val="%3."/>
@@ -44093,51 +45268,51 @@
         <w:ind w:left="1440" w:hanging="360"/>
       </w:pPr>
     </w:lvl>
-    <w:lvl w:ilvl="3" w:tplc="A28409A8">
+    <w:lvl w:ilvl="3" w:tplc="E8F21C40">
       <w:numFmt w:val="decimal"/>
       <w:lvlText w:val=""/>
       <w:lvlJc w:val="left"/>
     </w:lvl>
-    <w:lvl w:ilvl="4" w:tplc="E288344C">
+    <w:lvl w:ilvl="4" w:tplc="49B63F52">
       <w:numFmt w:val="decimal"/>
       <w:lvlText w:val=""/>
       <w:lvlJc w:val="left"/>
     </w:lvl>
-    <w:lvl w:ilvl="5" w:tplc="8F68FE5A">
+    <w:lvl w:ilvl="5" w:tplc="7FE2A282">
       <w:numFmt w:val="decimal"/>
       <w:lvlText w:val=""/>
       <w:lvlJc w:val="left"/>
     </w:lvl>
-    <w:lvl w:ilvl="6" w:tplc="8350214E">
+    <w:lvl w:ilvl="6" w:tplc="00BA3FF6">
       <w:numFmt w:val="decimal"/>
       <w:lvlText w:val=""/>
       <w:lvlJc w:val="left"/>
     </w:lvl>
-    <w:lvl w:ilvl="7" w:tplc="0A40819A">
+    <w:lvl w:ilvl="7" w:tplc="139CCBFE">
       <w:numFmt w:val="decimal"/>
       <w:lvlText w:val=""/>
       <w:lvlJc w:val="left"/>
     </w:lvl>
-    <w:lvl w:ilvl="8" w:tplc="8D440A4E">
+    <w:lvl w:ilvl="8" w:tplc="4E046D90">
       <w:numFmt w:val="decimal"/>
       <w:lvlText w:val=""/>
       <w:lvlJc w:val="left"/>
     </w:lvl>
   </w:abstractNum>
-  <w:num w:numId="1" w16cid:durableId="440105575">
+  <w:num w:numId="1" w16cid:durableId="1461655733">
+    <w:abstractNumId w:val="1"/>
+    <w:lvlOverride w:ilvl="0">
+      <w:startOverride w:val="1"/>
+    </w:lvlOverride>
+  </w:num>
+  <w:num w:numId="2" w16cid:durableId="1763722626">
     <w:abstractNumId w:val="0"/>
     <w:lvlOverride w:ilvl="0">
       <w:startOverride w:val="1"/>
     </w:lvlOverride>
   </w:num>
-  <w:num w:numId="2" w16cid:durableId="462114056">
-    <w:abstractNumId w:val="1"/>
-    <w:lvlOverride w:ilvl="0">
-      <w:startOverride w:val="1"/>
-    </w:lvlOverride>
-  </w:num>
-  <w:num w:numId="3" w16cid:durableId="705719556">
-    <w:abstractNumId w:val="1"/>
+  <w:num w:numId="3" w16cid:durableId="1140852244">
+    <w:abstractNumId w:val="0"/>
     <w:lvlOverride w:ilvl="0">
       <w:startOverride w:val="1"/>
     </w:lvlOverride>
@@ -44841,7 +46016,7 @@
     <w:autoRedefine/>
     <w:uiPriority w:val="39"/>
     <w:unhideWhenUsed/>
-    <w:rsid w:val="00E6688B"/>
+    <w:rsid w:val="002E2BC7"/>
     <w:pPr>
       <w:spacing w:after="100"/>
     </w:pPr>
@@ -44853,7 +46028,7 @@
     <w:autoRedefine/>
     <w:uiPriority w:val="39"/>
     <w:unhideWhenUsed/>
-    <w:rsid w:val="00E6688B"/>
+    <w:rsid w:val="002E2BC7"/>
     <w:pPr>
       <w:spacing w:after="100"/>
       <w:ind w:left="210"/>
@@ -44865,7 +46040,7 @@
     <w:next w:val="Normal"/>
     <w:uiPriority w:val="99"/>
     <w:unhideWhenUsed/>
-    <w:rsid w:val="00E6688B"/>
+    <w:rsid w:val="002E2BC7"/>
   </w:style>
 </w:styles>
 </file>

</xml_diff>

<commit_message>
University facts on course pages from UGC 'Sri Lanka University Statistics 2024' (admitted 2023/24, undergraduates, hostel places, Mahapola/Bursary, graduates), each citing table and page, report caveats as flags; extracts double-checked and hand spot-checked; weak ETag now answers 304 (D-05); 5 tests
Co-Authored-By: Claude Opus 5.5 (1M context) <noreply@anthropic.com>
</commit_message>
<xml_diff>
--- a/docs/05-data-design/ZP-DOC-05_Data-Design.docx
+++ b/docs/05-data-design/ZP-DOC-05_Data-Design.docx
@@ -2257,6 +2257,122 @@
           </w:p>
         </w:tc>
       </w:tr>
+      <w:tr>
+        <w:tblPrEx>
+          <w:tblCellMar>
+            <w:top w:w="0" w:type="dxa"/>
+            <w:bottom w:w="0" w:type="dxa"/>
+          </w:tblCellMar>
+        </w:tblPrEx>
+        <w:trPr>
+          <w:cantSplit/>
+          <w:trHeight w:val="420"/>
+        </w:trPr>
+        <w:tc>
+          <w:tcPr>
+            <w:tcW w:w="964" w:type="dxa"/>
+            <w:tcBorders>
+              <w:top w:val="single" w:sz="4" w:space="0" w:color="C9D3D0"/>
+              <w:left w:val="single" w:sz="4" w:space="0" w:color="C9D3D0"/>
+              <w:bottom w:val="single" w:sz="4" w:space="0" w:color="C9D3D0"/>
+              <w:right w:val="single" w:sz="4" w:space="0" w:color="C9D3D0"/>
+            </w:tcBorders>
+            <w:tcMar>
+              <w:top w:w="50" w:type="dxa"/>
+              <w:left w:w="100" w:type="dxa"/>
+              <w:bottom w:w="50" w:type="dxa"/>
+              <w:right w:w="100" w:type="dxa"/>
+            </w:tcMar>
+          </w:tcPr>
+          <w:p>
+            <w:r>
+              <w:rPr>
+                <w:sz w:val="19"/>
+                <w:szCs w:val="19"/>
+              </w:rPr>
+              <w:t>0.9</w:t>
+            </w:r>
+          </w:p>
+        </w:tc>
+        <w:tc>
+          <w:tcPr>
+            <w:tcW w:w="1542" w:type="dxa"/>
+            <w:tcBorders>
+              <w:top w:val="single" w:sz="4" w:space="0" w:color="C9D3D0"/>
+              <w:left w:val="single" w:sz="4" w:space="0" w:color="C9D3D0"/>
+              <w:bottom w:val="single" w:sz="4" w:space="0" w:color="C9D3D0"/>
+              <w:right w:val="single" w:sz="4" w:space="0" w:color="C9D3D0"/>
+            </w:tcBorders>
+            <w:tcMar>
+              <w:top w:w="50" w:type="dxa"/>
+              <w:left w:w="100" w:type="dxa"/>
+              <w:bottom w:w="50" w:type="dxa"/>
+              <w:right w:w="100" w:type="dxa"/>
+            </w:tcMar>
+          </w:tcPr>
+          <w:p>
+            <w:r>
+              <w:rPr>
+                <w:sz w:val="19"/>
+                <w:szCs w:val="19"/>
+              </w:rPr>
+              <w:t>15 Oct 2026</w:t>
+            </w:r>
+          </w:p>
+        </w:tc>
+        <w:tc>
+          <w:tcPr>
+            <w:tcW w:w="1928" w:type="dxa"/>
+            <w:tcBorders>
+              <w:top w:val="single" w:sz="4" w:space="0" w:color="C9D3D0"/>
+              <w:left w:val="single" w:sz="4" w:space="0" w:color="C9D3D0"/>
+              <w:bottom w:val="single" w:sz="4" w:space="0" w:color="C9D3D0"/>
+              <w:right w:val="single" w:sz="4" w:space="0" w:color="C9D3D0"/>
+            </w:tcBorders>
+            <w:tcMar>
+              <w:top w:w="50" w:type="dxa"/>
+              <w:left w:w="100" w:type="dxa"/>
+              <w:bottom w:w="50" w:type="dxa"/>
+              <w:right w:w="100" w:type="dxa"/>
+            </w:tcMar>
+          </w:tcPr>
+          <w:p>
+            <w:r>
+              <w:rPr>
+                <w:sz w:val="19"/>
+                <w:szCs w:val="19"/>
+              </w:rPr>
+              <w:t>Team Kestrel</w:t>
+            </w:r>
+          </w:p>
+        </w:tc>
+        <w:tc>
+          <w:tcPr>
+            <w:tcW w:w="5204" w:type="dxa"/>
+            <w:tcBorders>
+              <w:top w:val="single" w:sz="4" w:space="0" w:color="C9D3D0"/>
+              <w:left w:val="single" w:sz="4" w:space="0" w:color="C9D3D0"/>
+              <w:bottom w:val="single" w:sz="4" w:space="0" w:color="C9D3D0"/>
+              <w:right w:val="single" w:sz="4" w:space="0" w:color="C9D3D0"/>
+            </w:tcBorders>
+            <w:tcMar>
+              <w:top w:w="50" w:type="dxa"/>
+              <w:left w:w="100" w:type="dxa"/>
+              <w:bottom w:w="50" w:type="dxa"/>
+              <w:right w:w="100" w:type="dxa"/>
+            </w:tcMar>
+          </w:tcPr>
+          <w:p>
+            <w:r>
+              <w:rPr>
+                <w:sz w:val="19"/>
+                <w:szCs w:val="19"/>
+              </w:rPr>
+              <w:t>University facts from the UGC 'Sri Lanka University Statistics 2024' added as read-model data (no D1 change)</w:t>
+            </w:r>
+          </w:p>
+        </w:tc>
+      </w:tr>
     </w:tbl>
     <w:p>
       <w:pPr>
@@ -2656,7 +2772,7 @@
     <w:sdt>
       <w:sdtPr>
         <w:alias w:val="Contents"/>
-        <w:id w:val="1245385182"/>
+        <w:id w:val="1139996147"/>
       </w:sdtPr>
       <w:sdtEndPr/>
       <w:sdtContent>
@@ -2685,7 +2801,7 @@
           <w:r>
             <w:fldChar w:fldCharType="separate"/>
           </w:r>
-          <w:hyperlink w:anchor="_Toc242916196" w:history="1">
+          <w:hyperlink w:anchor="_Toc242917771" w:history="1">
             <w:r>
               <w:rPr>
                 <w:rStyle w:val="Hyperlink"/>
@@ -2709,7 +2825,7 @@
               <w:rPr>
                 <w:noProof/>
               </w:rPr>
-              <w:instrText xml:space="preserve"> PAGEREF _Toc242916196 \h </w:instrText>
+              <w:instrText xml:space="preserve"> PAGEREF _Toc242917771 \h </w:instrText>
             </w:r>
             <w:r>
               <w:rPr>
@@ -2752,7 +2868,7 @@
               <w14:ligatures w14:val="standardContextual"/>
             </w:rPr>
           </w:pPr>
-          <w:hyperlink w:anchor="_Toc242916197" w:history="1">
+          <w:hyperlink w:anchor="_Toc242917772" w:history="1">
             <w:r>
               <w:rPr>
                 <w:rStyle w:val="Hyperlink"/>
@@ -2776,7 +2892,7 @@
               <w:rPr>
                 <w:noProof/>
               </w:rPr>
-              <w:instrText xml:space="preserve"> PAGEREF _Toc242916197 \h </w:instrText>
+              <w:instrText xml:space="preserve"> PAGEREF _Toc242917772 \h </w:instrText>
             </w:r>
             <w:r>
               <w:rPr>
@@ -2819,7 +2935,7 @@
               <w14:ligatures w14:val="standardContextual"/>
             </w:rPr>
           </w:pPr>
-          <w:hyperlink w:anchor="_Toc242916198" w:history="1">
+          <w:hyperlink w:anchor="_Toc242917773" w:history="1">
             <w:r>
               <w:rPr>
                 <w:rStyle w:val="Hyperlink"/>
@@ -2843,7 +2959,7 @@
               <w:rPr>
                 <w:noProof/>
               </w:rPr>
-              <w:instrText xml:space="preserve"> PAGEREF _Toc242916198 \h </w:instrText>
+              <w:instrText xml:space="preserve"> PAGEREF _Toc242917773 \h </w:instrText>
             </w:r>
             <w:r>
               <w:rPr>
@@ -2886,7 +3002,7 @@
               <w14:ligatures w14:val="standardContextual"/>
             </w:rPr>
           </w:pPr>
-          <w:hyperlink w:anchor="_Toc242916199" w:history="1">
+          <w:hyperlink w:anchor="_Toc242917774" w:history="1">
             <w:r>
               <w:rPr>
                 <w:rStyle w:val="Hyperlink"/>
@@ -2910,7 +3026,7 @@
               <w:rPr>
                 <w:noProof/>
               </w:rPr>
-              <w:instrText xml:space="preserve"> PAGEREF _Toc242916199 \h </w:instrText>
+              <w:instrText xml:space="preserve"> PAGEREF _Toc242917774 \h </w:instrText>
             </w:r>
             <w:r>
               <w:rPr>
@@ -2953,7 +3069,7 @@
               <w14:ligatures w14:val="standardContextual"/>
             </w:rPr>
           </w:pPr>
-          <w:hyperlink w:anchor="_Toc242916200" w:history="1">
+          <w:hyperlink w:anchor="_Toc242917775" w:history="1">
             <w:r>
               <w:rPr>
                 <w:rStyle w:val="Hyperlink"/>
@@ -2977,7 +3093,7 @@
               <w:rPr>
                 <w:noProof/>
               </w:rPr>
-              <w:instrText xml:space="preserve"> PAGEREF _Toc242916200 \h </w:instrText>
+              <w:instrText xml:space="preserve"> PAGEREF _Toc242917775 \h </w:instrText>
             </w:r>
             <w:r>
               <w:rPr>
@@ -3020,7 +3136,7 @@
               <w14:ligatures w14:val="standardContextual"/>
             </w:rPr>
           </w:pPr>
-          <w:hyperlink w:anchor="_Toc242916201" w:history="1">
+          <w:hyperlink w:anchor="_Toc242917776" w:history="1">
             <w:r>
               <w:rPr>
                 <w:rStyle w:val="Hyperlink"/>
@@ -3044,7 +3160,7 @@
               <w:rPr>
                 <w:noProof/>
               </w:rPr>
-              <w:instrText xml:space="preserve"> PAGEREF _Toc242916201 \h </w:instrText>
+              <w:instrText xml:space="preserve"> PAGEREF _Toc242917776 \h </w:instrText>
             </w:r>
             <w:r>
               <w:rPr>
@@ -3087,7 +3203,7 @@
               <w14:ligatures w14:val="standardContextual"/>
             </w:rPr>
           </w:pPr>
-          <w:hyperlink w:anchor="_Toc242916202" w:history="1">
+          <w:hyperlink w:anchor="_Toc242917777" w:history="1">
             <w:r>
               <w:rPr>
                 <w:rStyle w:val="Hyperlink"/>
@@ -3111,7 +3227,7 @@
               <w:rPr>
                 <w:noProof/>
               </w:rPr>
-              <w:instrText xml:space="preserve"> PAGEREF _Toc242916202 \h </w:instrText>
+              <w:instrText xml:space="preserve"> PAGEREF _Toc242917777 \h </w:instrText>
             </w:r>
             <w:r>
               <w:rPr>
@@ -3154,7 +3270,7 @@
               <w14:ligatures w14:val="standardContextual"/>
             </w:rPr>
           </w:pPr>
-          <w:hyperlink w:anchor="_Toc242916203" w:history="1">
+          <w:hyperlink w:anchor="_Toc242917778" w:history="1">
             <w:r>
               <w:rPr>
                 <w:rStyle w:val="Hyperlink"/>
@@ -3178,7 +3294,7 @@
               <w:rPr>
                 <w:noProof/>
               </w:rPr>
-              <w:instrText xml:space="preserve"> PAGEREF _Toc242916203 \h </w:instrText>
+              <w:instrText xml:space="preserve"> PAGEREF _Toc242917778 \h </w:instrText>
             </w:r>
             <w:r>
               <w:rPr>
@@ -3221,7 +3337,7 @@
               <w14:ligatures w14:val="standardContextual"/>
             </w:rPr>
           </w:pPr>
-          <w:hyperlink w:anchor="_Toc242916204" w:history="1">
+          <w:hyperlink w:anchor="_Toc242917779" w:history="1">
             <w:r>
               <w:rPr>
                 <w:rStyle w:val="Hyperlink"/>
@@ -3245,7 +3361,7 @@
               <w:rPr>
                 <w:noProof/>
               </w:rPr>
-              <w:instrText xml:space="preserve"> PAGEREF _Toc242916204 \h </w:instrText>
+              <w:instrText xml:space="preserve"> PAGEREF _Toc242917779 \h </w:instrText>
             </w:r>
             <w:r>
               <w:rPr>
@@ -3288,7 +3404,7 @@
               <w14:ligatures w14:val="standardContextual"/>
             </w:rPr>
           </w:pPr>
-          <w:hyperlink w:anchor="_Toc242916205" w:history="1">
+          <w:hyperlink w:anchor="_Toc242917780" w:history="1">
             <w:r>
               <w:rPr>
                 <w:rStyle w:val="Hyperlink"/>
@@ -3312,7 +3428,7 @@
               <w:rPr>
                 <w:noProof/>
               </w:rPr>
-              <w:instrText xml:space="preserve"> PAGEREF _Toc242916205 \h </w:instrText>
+              <w:instrText xml:space="preserve"> PAGEREF _Toc242917780 \h </w:instrText>
             </w:r>
             <w:r>
               <w:rPr>
@@ -3355,7 +3471,7 @@
               <w14:ligatures w14:val="standardContextual"/>
             </w:rPr>
           </w:pPr>
-          <w:hyperlink w:anchor="_Toc242916206" w:history="1">
+          <w:hyperlink w:anchor="_Toc242917781" w:history="1">
             <w:r>
               <w:rPr>
                 <w:rStyle w:val="Hyperlink"/>
@@ -3379,7 +3495,7 @@
               <w:rPr>
                 <w:noProof/>
               </w:rPr>
-              <w:instrText xml:space="preserve"> PAGEREF _Toc242916206 \h </w:instrText>
+              <w:instrText xml:space="preserve"> PAGEREF _Toc242917781 \h </w:instrText>
             </w:r>
             <w:r>
               <w:rPr>
@@ -3422,7 +3538,7 @@
               <w14:ligatures w14:val="standardContextual"/>
             </w:rPr>
           </w:pPr>
-          <w:hyperlink w:anchor="_Toc242916207" w:history="1">
+          <w:hyperlink w:anchor="_Toc242917782" w:history="1">
             <w:r>
               <w:rPr>
                 <w:rStyle w:val="Hyperlink"/>
@@ -3446,7 +3562,7 @@
               <w:rPr>
                 <w:noProof/>
               </w:rPr>
-              <w:instrText xml:space="preserve"> PAGEREF _Toc242916207 \h </w:instrText>
+              <w:instrText xml:space="preserve"> PAGEREF _Toc242917782 \h </w:instrText>
             </w:r>
             <w:r>
               <w:rPr>
@@ -3489,7 +3605,7 @@
               <w14:ligatures w14:val="standardContextual"/>
             </w:rPr>
           </w:pPr>
-          <w:hyperlink w:anchor="_Toc242916208" w:history="1">
+          <w:hyperlink w:anchor="_Toc242917783" w:history="1">
             <w:r>
               <w:rPr>
                 <w:rStyle w:val="Hyperlink"/>
@@ -3513,7 +3629,7 @@
               <w:rPr>
                 <w:noProof/>
               </w:rPr>
-              <w:instrText xml:space="preserve"> PAGEREF _Toc242916208 \h </w:instrText>
+              <w:instrText xml:space="preserve"> PAGEREF _Toc242917783 \h </w:instrText>
             </w:r>
             <w:r>
               <w:rPr>
@@ -3556,7 +3672,7 @@
               <w14:ligatures w14:val="standardContextual"/>
             </w:rPr>
           </w:pPr>
-          <w:hyperlink w:anchor="_Toc242916209" w:history="1">
+          <w:hyperlink w:anchor="_Toc242917784" w:history="1">
             <w:r>
               <w:rPr>
                 <w:rStyle w:val="Hyperlink"/>
@@ -3580,7 +3696,7 @@
               <w:rPr>
                 <w:noProof/>
               </w:rPr>
-              <w:instrText xml:space="preserve"> PAGEREF _Toc242916209 \h </w:instrText>
+              <w:instrText xml:space="preserve"> PAGEREF _Toc242917784 \h </w:instrText>
             </w:r>
             <w:r>
               <w:rPr>
@@ -3623,7 +3739,7 @@
               <w14:ligatures w14:val="standardContextual"/>
             </w:rPr>
           </w:pPr>
-          <w:hyperlink w:anchor="_Toc242916210" w:history="1">
+          <w:hyperlink w:anchor="_Toc242917785" w:history="1">
             <w:r>
               <w:rPr>
                 <w:rStyle w:val="Hyperlink"/>
@@ -3647,7 +3763,7 @@
               <w:rPr>
                 <w:noProof/>
               </w:rPr>
-              <w:instrText xml:space="preserve"> PAGEREF _Toc242916210 \h </w:instrText>
+              <w:instrText xml:space="preserve"> PAGEREF _Toc242917785 \h </w:instrText>
             </w:r>
             <w:r>
               <w:rPr>
@@ -3690,7 +3806,7 @@
               <w14:ligatures w14:val="standardContextual"/>
             </w:rPr>
           </w:pPr>
-          <w:hyperlink w:anchor="_Toc242916211" w:history="1">
+          <w:hyperlink w:anchor="_Toc242917786" w:history="1">
             <w:r>
               <w:rPr>
                 <w:rStyle w:val="Hyperlink"/>
@@ -3714,7 +3830,7 @@
               <w:rPr>
                 <w:noProof/>
               </w:rPr>
-              <w:instrText xml:space="preserve"> PAGEREF _Toc242916211 \h </w:instrText>
+              <w:instrText xml:space="preserve"> PAGEREF _Toc242917786 \h </w:instrText>
             </w:r>
             <w:r>
               <w:rPr>
@@ -3757,7 +3873,7 @@
               <w14:ligatures w14:val="standardContextual"/>
             </w:rPr>
           </w:pPr>
-          <w:hyperlink w:anchor="_Toc242916212" w:history="1">
+          <w:hyperlink w:anchor="_Toc242917787" w:history="1">
             <w:r>
               <w:rPr>
                 <w:rStyle w:val="Hyperlink"/>
@@ -3781,7 +3897,7 @@
               <w:rPr>
                 <w:noProof/>
               </w:rPr>
-              <w:instrText xml:space="preserve"> PAGEREF _Toc242916212 \h </w:instrText>
+              <w:instrText xml:space="preserve"> PAGEREF _Toc242917787 \h </w:instrText>
             </w:r>
             <w:r>
               <w:rPr>
@@ -3824,7 +3940,7 @@
               <w14:ligatures w14:val="standardContextual"/>
             </w:rPr>
           </w:pPr>
-          <w:hyperlink w:anchor="_Toc242916213" w:history="1">
+          <w:hyperlink w:anchor="_Toc242917788" w:history="1">
             <w:r>
               <w:rPr>
                 <w:rStyle w:val="Hyperlink"/>
@@ -3848,7 +3964,7 @@
               <w:rPr>
                 <w:noProof/>
               </w:rPr>
-              <w:instrText xml:space="preserve"> PAGEREF _Toc242916213 \h </w:instrText>
+              <w:instrText xml:space="preserve"> PAGEREF _Toc242917788 \h </w:instrText>
             </w:r>
             <w:r>
               <w:rPr>
@@ -3891,13 +4007,13 @@
               <w14:ligatures w14:val="standardContextual"/>
             </w:rPr>
           </w:pPr>
-          <w:hyperlink w:anchor="_Toc242916214" w:history="1">
+          <w:hyperlink w:anchor="_Toc242917789" w:history="1">
             <w:r>
               <w:rPr>
                 <w:rStyle w:val="Hyperlink"/>
                 <w:noProof/>
               </w:rPr>
-              <w:t>2.12 Entity catalogue</w:t>
+              <w:t>2.12 University facts from UGC statistics (read model)</w:t>
             </w:r>
             <w:r>
               <w:rPr>
@@ -3915,7 +4031,7 @@
               <w:rPr>
                 <w:noProof/>
               </w:rPr>
-              <w:instrText xml:space="preserve"> PAGEREF _Toc242916214 \h </w:instrText>
+              <w:instrText xml:space="preserve"> PAGEREF _Toc242917789 \h </w:instrText>
             </w:r>
             <w:r>
               <w:rPr>
@@ -3933,6 +4049,73 @@
                 <w:noProof/>
               </w:rPr>
               <w:t>15</w:t>
+            </w:r>
+            <w:r>
+              <w:rPr>
+                <w:noProof/>
+              </w:rPr>
+              <w:fldChar w:fldCharType="end"/>
+            </w:r>
+          </w:hyperlink>
+        </w:p>
+        <w:p>
+          <w:pPr>
+            <w:pStyle w:val="TOC2"/>
+            <w:tabs>
+              <w:tab w:val="right" w:leader="dot" w:pos="9628"/>
+            </w:tabs>
+            <w:rPr>
+              <w:rFonts w:asciiTheme="minorHAnsi" w:eastAsiaTheme="minorEastAsia" w:hAnsiTheme="minorHAnsi" w:cstheme="minorBidi"/>
+              <w:noProof/>
+              <w:color w:val="auto"/>
+              <w:kern w:val="2"/>
+              <w:sz w:val="24"/>
+              <w:szCs w:val="24"/>
+              <w14:ligatures w14:val="standardContextual"/>
+            </w:rPr>
+          </w:pPr>
+          <w:hyperlink w:anchor="_Toc242917790" w:history="1">
+            <w:r>
+              <w:rPr>
+                <w:rStyle w:val="Hyperlink"/>
+                <w:noProof/>
+              </w:rPr>
+              <w:t>2.13 Entity catalogue</w:t>
+            </w:r>
+            <w:r>
+              <w:rPr>
+                <w:noProof/>
+              </w:rPr>
+              <w:tab/>
+            </w:r>
+            <w:r>
+              <w:rPr>
+                <w:noProof/>
+              </w:rPr>
+              <w:fldChar w:fldCharType="begin"/>
+            </w:r>
+            <w:r>
+              <w:rPr>
+                <w:noProof/>
+              </w:rPr>
+              <w:instrText xml:space="preserve"> PAGEREF _Toc242917790 \h </w:instrText>
+            </w:r>
+            <w:r>
+              <w:rPr>
+                <w:noProof/>
+              </w:rPr>
+            </w:r>
+            <w:r>
+              <w:rPr>
+                <w:noProof/>
+              </w:rPr>
+              <w:fldChar w:fldCharType="separate"/>
+            </w:r>
+            <w:r>
+              <w:rPr>
+                <w:noProof/>
+              </w:rPr>
+              <w:t>16</w:t>
             </w:r>
             <w:r>
               <w:rPr>
@@ -3958,7 +4141,7 @@
               <w14:ligatures w14:val="standardContextual"/>
             </w:rPr>
           </w:pPr>
-          <w:hyperlink w:anchor="_Toc242916215" w:history="1">
+          <w:hyperlink w:anchor="_Toc242917791" w:history="1">
             <w:r>
               <w:rPr>
                 <w:rStyle w:val="Hyperlink"/>
@@ -3982,7 +4165,7 @@
               <w:rPr>
                 <w:noProof/>
               </w:rPr>
-              <w:instrText xml:space="preserve"> PAGEREF _Toc242916215 \h </w:instrText>
+              <w:instrText xml:space="preserve"> PAGEREF _Toc242917791 \h </w:instrText>
             </w:r>
             <w:r>
               <w:rPr>
@@ -4025,7 +4208,7 @@
               <w14:ligatures w14:val="standardContextual"/>
             </w:rPr>
           </w:pPr>
-          <w:hyperlink w:anchor="_Toc242916216" w:history="1">
+          <w:hyperlink w:anchor="_Toc242917792" w:history="1">
             <w:r>
               <w:rPr>
                 <w:rStyle w:val="Hyperlink"/>
@@ -4049,7 +4232,7 @@
               <w:rPr>
                 <w:noProof/>
               </w:rPr>
-              <w:instrText xml:space="preserve"> PAGEREF _Toc242916216 \h </w:instrText>
+              <w:instrText xml:space="preserve"> PAGEREF _Toc242917792 \h </w:instrText>
             </w:r>
             <w:r>
               <w:rPr>
@@ -4092,7 +4275,7 @@
               <w14:ligatures w14:val="standardContextual"/>
             </w:rPr>
           </w:pPr>
-          <w:hyperlink w:anchor="_Toc242916217" w:history="1">
+          <w:hyperlink w:anchor="_Toc242917793" w:history="1">
             <w:r>
               <w:rPr>
                 <w:rStyle w:val="Hyperlink"/>
@@ -4116,7 +4299,7 @@
               <w:rPr>
                 <w:noProof/>
               </w:rPr>
-              <w:instrText xml:space="preserve"> PAGEREF _Toc242916217 \h </w:instrText>
+              <w:instrText xml:space="preserve"> PAGEREF _Toc242917793 \h </w:instrText>
             </w:r>
             <w:r>
               <w:rPr>
@@ -4159,7 +4342,7 @@
               <w14:ligatures w14:val="standardContextual"/>
             </w:rPr>
           </w:pPr>
-          <w:hyperlink w:anchor="_Toc242916218" w:history="1">
+          <w:hyperlink w:anchor="_Toc242917794" w:history="1">
             <w:r>
               <w:rPr>
                 <w:rStyle w:val="Hyperlink"/>
@@ -4183,7 +4366,7 @@
               <w:rPr>
                 <w:noProof/>
               </w:rPr>
-              <w:instrText xml:space="preserve"> PAGEREF _Toc242916218 \h </w:instrText>
+              <w:instrText xml:space="preserve"> PAGEREF _Toc242917794 \h </w:instrText>
             </w:r>
             <w:r>
               <w:rPr>
@@ -4226,7 +4409,7 @@
               <w14:ligatures w14:val="standardContextual"/>
             </w:rPr>
           </w:pPr>
-          <w:hyperlink w:anchor="_Toc242916219" w:history="1">
+          <w:hyperlink w:anchor="_Toc242917795" w:history="1">
             <w:r>
               <w:rPr>
                 <w:rStyle w:val="Hyperlink"/>
@@ -4250,7 +4433,7 @@
               <w:rPr>
                 <w:noProof/>
               </w:rPr>
-              <w:instrText xml:space="preserve"> PAGEREF _Toc242916219 \h </w:instrText>
+              <w:instrText xml:space="preserve"> PAGEREF _Toc242917795 \h </w:instrText>
             </w:r>
             <w:r>
               <w:rPr>
@@ -4293,7 +4476,7 @@
               <w14:ligatures w14:val="standardContextual"/>
             </w:rPr>
           </w:pPr>
-          <w:hyperlink w:anchor="_Toc242916220" w:history="1">
+          <w:hyperlink w:anchor="_Toc242917796" w:history="1">
             <w:r>
               <w:rPr>
                 <w:rStyle w:val="Hyperlink"/>
@@ -4317,7 +4500,7 @@
               <w:rPr>
                 <w:noProof/>
               </w:rPr>
-              <w:instrText xml:space="preserve"> PAGEREF _Toc242916220 \h </w:instrText>
+              <w:instrText xml:space="preserve"> PAGEREF _Toc242917796 \h </w:instrText>
             </w:r>
             <w:r>
               <w:rPr>
@@ -4360,7 +4543,7 @@
               <w14:ligatures w14:val="standardContextual"/>
             </w:rPr>
           </w:pPr>
-          <w:hyperlink w:anchor="_Toc242916221" w:history="1">
+          <w:hyperlink w:anchor="_Toc242917797" w:history="1">
             <w:r>
               <w:rPr>
                 <w:rStyle w:val="Hyperlink"/>
@@ -4384,7 +4567,7 @@
               <w:rPr>
                 <w:noProof/>
               </w:rPr>
-              <w:instrText xml:space="preserve"> PAGEREF _Toc242916221 \h </w:instrText>
+              <w:instrText xml:space="preserve"> PAGEREF _Toc242917797 \h </w:instrText>
             </w:r>
             <w:r>
               <w:rPr>
@@ -4427,7 +4610,7 @@
               <w14:ligatures w14:val="standardContextual"/>
             </w:rPr>
           </w:pPr>
-          <w:hyperlink w:anchor="_Toc242916222" w:history="1">
+          <w:hyperlink w:anchor="_Toc242917798" w:history="1">
             <w:r>
               <w:rPr>
                 <w:rStyle w:val="Hyperlink"/>
@@ -4451,7 +4634,7 @@
               <w:rPr>
                 <w:noProof/>
               </w:rPr>
-              <w:instrText xml:space="preserve"> PAGEREF _Toc242916222 \h </w:instrText>
+              <w:instrText xml:space="preserve"> PAGEREF _Toc242917798 \h </w:instrText>
             </w:r>
             <w:r>
               <w:rPr>
@@ -4494,7 +4677,7 @@
               <w14:ligatures w14:val="standardContextual"/>
             </w:rPr>
           </w:pPr>
-          <w:hyperlink w:anchor="_Toc242916223" w:history="1">
+          <w:hyperlink w:anchor="_Toc242917799" w:history="1">
             <w:r>
               <w:rPr>
                 <w:rStyle w:val="Hyperlink"/>
@@ -4518,7 +4701,7 @@
               <w:rPr>
                 <w:noProof/>
               </w:rPr>
-              <w:instrText xml:space="preserve"> PAGEREF _Toc242916223 \h </w:instrText>
+              <w:instrText xml:space="preserve"> PAGEREF _Toc242917799 \h </w:instrText>
             </w:r>
             <w:r>
               <w:rPr>
@@ -4561,7 +4744,7 @@
               <w14:ligatures w14:val="standardContextual"/>
             </w:rPr>
           </w:pPr>
-          <w:hyperlink w:anchor="_Toc242916224" w:history="1">
+          <w:hyperlink w:anchor="_Toc242917800" w:history="1">
             <w:r>
               <w:rPr>
                 <w:rStyle w:val="Hyperlink"/>
@@ -4585,7 +4768,7 @@
               <w:rPr>
                 <w:noProof/>
               </w:rPr>
-              <w:instrText xml:space="preserve"> PAGEREF _Toc242916224 \h </w:instrText>
+              <w:instrText xml:space="preserve"> PAGEREF _Toc242917800 \h </w:instrText>
             </w:r>
             <w:r>
               <w:rPr>
@@ -4628,7 +4811,7 @@
               <w14:ligatures w14:val="standardContextual"/>
             </w:rPr>
           </w:pPr>
-          <w:hyperlink w:anchor="_Toc242916225" w:history="1">
+          <w:hyperlink w:anchor="_Toc242917801" w:history="1">
             <w:r>
               <w:rPr>
                 <w:rStyle w:val="Hyperlink"/>
@@ -4652,7 +4835,7 @@
               <w:rPr>
                 <w:noProof/>
               </w:rPr>
-              <w:instrText xml:space="preserve"> PAGEREF _Toc242916225 \h </w:instrText>
+              <w:instrText xml:space="preserve"> PAGEREF _Toc242917801 \h </w:instrText>
             </w:r>
             <w:r>
               <w:rPr>
@@ -4695,7 +4878,7 @@
               <w14:ligatures w14:val="standardContextual"/>
             </w:rPr>
           </w:pPr>
-          <w:hyperlink w:anchor="_Toc242916226" w:history="1">
+          <w:hyperlink w:anchor="_Toc242917802" w:history="1">
             <w:r>
               <w:rPr>
                 <w:rStyle w:val="Hyperlink"/>
@@ -4719,7 +4902,7 @@
               <w:rPr>
                 <w:noProof/>
               </w:rPr>
-              <w:instrText xml:space="preserve"> PAGEREF _Toc242916226 \h </w:instrText>
+              <w:instrText xml:space="preserve"> PAGEREF _Toc242917802 \h </w:instrText>
             </w:r>
             <w:r>
               <w:rPr>
@@ -4762,7 +4945,7 @@
               <w14:ligatures w14:val="standardContextual"/>
             </w:rPr>
           </w:pPr>
-          <w:hyperlink w:anchor="_Toc242916227" w:history="1">
+          <w:hyperlink w:anchor="_Toc242917803" w:history="1">
             <w:r>
               <w:rPr>
                 <w:rStyle w:val="Hyperlink"/>
@@ -4786,7 +4969,7 @@
               <w:rPr>
                 <w:noProof/>
               </w:rPr>
-              <w:instrText xml:space="preserve"> PAGEREF _Toc242916227 \h </w:instrText>
+              <w:instrText xml:space="preserve"> PAGEREF _Toc242917803 \h </w:instrText>
             </w:r>
             <w:r>
               <w:rPr>
@@ -4829,7 +5012,7 @@
               <w14:ligatures w14:val="standardContextual"/>
             </w:rPr>
           </w:pPr>
-          <w:hyperlink w:anchor="_Toc242916228" w:history="1">
+          <w:hyperlink w:anchor="_Toc242917804" w:history="1">
             <w:r>
               <w:rPr>
                 <w:rStyle w:val="Hyperlink"/>
@@ -4853,7 +5036,7 @@
               <w:rPr>
                 <w:noProof/>
               </w:rPr>
-              <w:instrText xml:space="preserve"> PAGEREF _Toc242916228 \h </w:instrText>
+              <w:instrText xml:space="preserve"> PAGEREF _Toc242917804 \h </w:instrText>
             </w:r>
             <w:r>
               <w:rPr>
@@ -4896,7 +5079,7 @@
               <w14:ligatures w14:val="standardContextual"/>
             </w:rPr>
           </w:pPr>
-          <w:hyperlink w:anchor="_Toc242916229" w:history="1">
+          <w:hyperlink w:anchor="_Toc242917805" w:history="1">
             <w:r>
               <w:rPr>
                 <w:rStyle w:val="Hyperlink"/>
@@ -4920,7 +5103,7 @@
               <w:rPr>
                 <w:noProof/>
               </w:rPr>
-              <w:instrText xml:space="preserve"> PAGEREF _Toc242916229 \h </w:instrText>
+              <w:instrText xml:space="preserve"> PAGEREF _Toc242917805 \h </w:instrText>
             </w:r>
             <w:r>
               <w:rPr>
@@ -4963,7 +5146,7 @@
               <w14:ligatures w14:val="standardContextual"/>
             </w:rPr>
           </w:pPr>
-          <w:hyperlink w:anchor="_Toc242916230" w:history="1">
+          <w:hyperlink w:anchor="_Toc242917806" w:history="1">
             <w:r>
               <w:rPr>
                 <w:rStyle w:val="Hyperlink"/>
@@ -4987,7 +5170,7 @@
               <w:rPr>
                 <w:noProof/>
               </w:rPr>
-              <w:instrText xml:space="preserve"> PAGEREF _Toc242916230 \h </w:instrText>
+              <w:instrText xml:space="preserve"> PAGEREF _Toc242917806 \h </w:instrText>
             </w:r>
             <w:r>
               <w:rPr>
@@ -5030,7 +5213,7 @@
               <w14:ligatures w14:val="standardContextual"/>
             </w:rPr>
           </w:pPr>
-          <w:hyperlink w:anchor="_Toc242916231" w:history="1">
+          <w:hyperlink w:anchor="_Toc242917807" w:history="1">
             <w:r>
               <w:rPr>
                 <w:rStyle w:val="Hyperlink"/>
@@ -5054,7 +5237,7 @@
               <w:rPr>
                 <w:noProof/>
               </w:rPr>
-              <w:instrText xml:space="preserve"> PAGEREF _Toc242916231 \h </w:instrText>
+              <w:instrText xml:space="preserve"> PAGEREF _Toc242917807 \h </w:instrText>
             </w:r>
             <w:r>
               <w:rPr>
@@ -5097,7 +5280,7 @@
               <w14:ligatures w14:val="standardContextual"/>
             </w:rPr>
           </w:pPr>
-          <w:hyperlink w:anchor="_Toc242916232" w:history="1">
+          <w:hyperlink w:anchor="_Toc242917808" w:history="1">
             <w:r>
               <w:rPr>
                 <w:rStyle w:val="Hyperlink"/>
@@ -5121,7 +5304,7 @@
               <w:rPr>
                 <w:noProof/>
               </w:rPr>
-              <w:instrText xml:space="preserve"> PAGEREF _Toc242916232 \h </w:instrText>
+              <w:instrText xml:space="preserve"> PAGEREF _Toc242917808 \h </w:instrText>
             </w:r>
             <w:r>
               <w:rPr>
@@ -5164,7 +5347,7 @@
               <w14:ligatures w14:val="standardContextual"/>
             </w:rPr>
           </w:pPr>
-          <w:hyperlink w:anchor="_Toc242916233" w:history="1">
+          <w:hyperlink w:anchor="_Toc242917809" w:history="1">
             <w:r>
               <w:rPr>
                 <w:rStyle w:val="Hyperlink"/>
@@ -5188,7 +5371,7 @@
               <w:rPr>
                 <w:noProof/>
               </w:rPr>
-              <w:instrText xml:space="preserve"> PAGEREF _Toc242916233 \h </w:instrText>
+              <w:instrText xml:space="preserve"> PAGEREF _Toc242917809 \h </w:instrText>
             </w:r>
             <w:r>
               <w:rPr>
@@ -5231,7 +5414,7 @@
               <w14:ligatures w14:val="standardContextual"/>
             </w:rPr>
           </w:pPr>
-          <w:hyperlink w:anchor="_Toc242916234" w:history="1">
+          <w:hyperlink w:anchor="_Toc242917810" w:history="1">
             <w:r>
               <w:rPr>
                 <w:rStyle w:val="Hyperlink"/>
@@ -5255,7 +5438,7 @@
               <w:rPr>
                 <w:noProof/>
               </w:rPr>
-              <w:instrText xml:space="preserve"> PAGEREF _Toc242916234 \h </w:instrText>
+              <w:instrText xml:space="preserve"> PAGEREF _Toc242917810 \h </w:instrText>
             </w:r>
             <w:r>
               <w:rPr>
@@ -5298,7 +5481,7 @@
               <w14:ligatures w14:val="standardContextual"/>
             </w:rPr>
           </w:pPr>
-          <w:hyperlink w:anchor="_Toc242916235" w:history="1">
+          <w:hyperlink w:anchor="_Toc242917811" w:history="1">
             <w:r>
               <w:rPr>
                 <w:rStyle w:val="Hyperlink"/>
@@ -5322,7 +5505,7 @@
               <w:rPr>
                 <w:noProof/>
               </w:rPr>
-              <w:instrText xml:space="preserve"> PAGEREF _Toc242916235 \h </w:instrText>
+              <w:instrText xml:space="preserve"> PAGEREF _Toc242917811 \h </w:instrText>
             </w:r>
             <w:r>
               <w:rPr>
@@ -5365,7 +5548,7 @@
               <w14:ligatures w14:val="standardContextual"/>
             </w:rPr>
           </w:pPr>
-          <w:hyperlink w:anchor="_Toc242916236" w:history="1">
+          <w:hyperlink w:anchor="_Toc242917812" w:history="1">
             <w:r>
               <w:rPr>
                 <w:rStyle w:val="Hyperlink"/>
@@ -5389,7 +5572,7 @@
               <w:rPr>
                 <w:noProof/>
               </w:rPr>
-              <w:instrText xml:space="preserve"> PAGEREF _Toc242916236 \h </w:instrText>
+              <w:instrText xml:space="preserve"> PAGEREF _Toc242917812 \h </w:instrText>
             </w:r>
             <w:r>
               <w:rPr>
@@ -5432,7 +5615,7 @@
               <w14:ligatures w14:val="standardContextual"/>
             </w:rPr>
           </w:pPr>
-          <w:hyperlink w:anchor="_Toc242916237" w:history="1">
+          <w:hyperlink w:anchor="_Toc242917813" w:history="1">
             <w:r>
               <w:rPr>
                 <w:rStyle w:val="Hyperlink"/>
@@ -5456,7 +5639,7 @@
               <w:rPr>
                 <w:noProof/>
               </w:rPr>
-              <w:instrText xml:space="preserve"> PAGEREF _Toc242916237 \h </w:instrText>
+              <w:instrText xml:space="preserve"> PAGEREF _Toc242917813 \h </w:instrText>
             </w:r>
             <w:r>
               <w:rPr>
@@ -5502,7 +5685,7 @@
     <w:sdt>
       <w:sdtPr>
         <w:alias w:val="Figures"/>
-        <w:id w:val="-980532499"/>
+        <w:id w:val="-436297297"/>
       </w:sdtPr>
       <w:sdtEndPr/>
       <w:sdtContent>
@@ -5531,7 +5714,7 @@
           <w:r>
             <w:fldChar w:fldCharType="separate"/>
           </w:r>
-          <w:hyperlink w:anchor="_Toc242916238" w:history="1">
+          <w:hyperlink w:anchor="_Toc242917814" w:history="1">
             <w:r>
               <w:rPr>
                 <w:rStyle w:val="Hyperlink"/>
@@ -5555,7 +5738,7 @@
               <w:rPr>
                 <w:noProof/>
               </w:rPr>
-              <w:instrText xml:space="preserve"> PAGEREF _Toc242916238 \h </w:instrText>
+              <w:instrText xml:space="preserve"> PAGEREF _Toc242917814 \h </w:instrText>
             </w:r>
             <w:r>
               <w:rPr>
@@ -5598,7 +5781,7 @@
               <w14:ligatures w14:val="standardContextual"/>
             </w:rPr>
           </w:pPr>
-          <w:hyperlink w:anchor="_Toc242916239" w:history="1">
+          <w:hyperlink w:anchor="_Toc242917815" w:history="1">
             <w:r>
               <w:rPr>
                 <w:rStyle w:val="Hyperlink"/>
@@ -5622,7 +5805,7 @@
               <w:rPr>
                 <w:noProof/>
               </w:rPr>
-              <w:instrText xml:space="preserve"> PAGEREF _Toc242916239 \h </w:instrText>
+              <w:instrText xml:space="preserve"> PAGEREF _Toc242917815 \h </w:instrText>
             </w:r>
             <w:r>
               <w:rPr>
@@ -5665,7 +5848,7 @@
               <w14:ligatures w14:val="standardContextual"/>
             </w:rPr>
           </w:pPr>
-          <w:hyperlink w:anchor="_Toc242916240" w:history="1">
+          <w:hyperlink w:anchor="_Toc242917816" w:history="1">
             <w:r>
               <w:rPr>
                 <w:rStyle w:val="Hyperlink"/>
@@ -5689,7 +5872,7 @@
               <w:rPr>
                 <w:noProof/>
               </w:rPr>
-              <w:instrText xml:space="preserve"> PAGEREF _Toc242916240 \h </w:instrText>
+              <w:instrText xml:space="preserve"> PAGEREF _Toc242917816 \h </w:instrText>
             </w:r>
             <w:r>
               <w:rPr>
@@ -5732,7 +5915,7 @@
               <w14:ligatures w14:val="standardContextual"/>
             </w:rPr>
           </w:pPr>
-          <w:hyperlink w:anchor="_Toc242916241" w:history="1">
+          <w:hyperlink w:anchor="_Toc242917817" w:history="1">
             <w:r>
               <w:rPr>
                 <w:rStyle w:val="Hyperlink"/>
@@ -5756,7 +5939,7 @@
               <w:rPr>
                 <w:noProof/>
               </w:rPr>
-              <w:instrText xml:space="preserve"> PAGEREF _Toc242916241 \h </w:instrText>
+              <w:instrText xml:space="preserve"> PAGEREF _Toc242917817 \h </w:instrText>
             </w:r>
             <w:r>
               <w:rPr>
@@ -5799,7 +5982,7 @@
               <w14:ligatures w14:val="standardContextual"/>
             </w:rPr>
           </w:pPr>
-          <w:hyperlink w:anchor="_Toc242916242" w:history="1">
+          <w:hyperlink w:anchor="_Toc242917818" w:history="1">
             <w:r>
               <w:rPr>
                 <w:rStyle w:val="Hyperlink"/>
@@ -5823,7 +6006,7 @@
               <w:rPr>
                 <w:noProof/>
               </w:rPr>
-              <w:instrText xml:space="preserve"> PAGEREF _Toc242916242 \h </w:instrText>
+              <w:instrText xml:space="preserve"> PAGEREF _Toc242917818 \h </w:instrText>
             </w:r>
             <w:r>
               <w:rPr>
@@ -5866,7 +6049,7 @@
               <w14:ligatures w14:val="standardContextual"/>
             </w:rPr>
           </w:pPr>
-          <w:hyperlink w:anchor="_Toc242916243" w:history="1">
+          <w:hyperlink w:anchor="_Toc242917819" w:history="1">
             <w:r>
               <w:rPr>
                 <w:rStyle w:val="Hyperlink"/>
@@ -5890,7 +6073,7 @@
               <w:rPr>
                 <w:noProof/>
               </w:rPr>
-              <w:instrText xml:space="preserve"> PAGEREF _Toc242916243 \h </w:instrText>
+              <w:instrText xml:space="preserve"> PAGEREF _Toc242917819 \h </w:instrText>
             </w:r>
             <w:r>
               <w:rPr>
@@ -5933,7 +6116,7 @@
               <w14:ligatures w14:val="standardContextual"/>
             </w:rPr>
           </w:pPr>
-          <w:hyperlink w:anchor="_Toc242916244" w:history="1">
+          <w:hyperlink w:anchor="_Toc242917820" w:history="1">
             <w:r>
               <w:rPr>
                 <w:rStyle w:val="Hyperlink"/>
@@ -5957,7 +6140,7 @@
               <w:rPr>
                 <w:noProof/>
               </w:rPr>
-              <w:instrText xml:space="preserve"> PAGEREF _Toc242916244 \h </w:instrText>
+              <w:instrText xml:space="preserve"> PAGEREF _Toc242917820 \h </w:instrText>
             </w:r>
             <w:r>
               <w:rPr>
@@ -6000,7 +6183,7 @@
               <w14:ligatures w14:val="standardContextual"/>
             </w:rPr>
           </w:pPr>
-          <w:hyperlink w:anchor="_Toc242916245" w:history="1">
+          <w:hyperlink w:anchor="_Toc242917821" w:history="1">
             <w:r>
               <w:rPr>
                 <w:rStyle w:val="Hyperlink"/>
@@ -6024,7 +6207,7 @@
               <w:rPr>
                 <w:noProof/>
               </w:rPr>
-              <w:instrText xml:space="preserve"> PAGEREF _Toc242916245 \h </w:instrText>
+              <w:instrText xml:space="preserve"> PAGEREF _Toc242917821 \h </w:instrText>
             </w:r>
             <w:r>
               <w:rPr>
@@ -6070,7 +6253,7 @@
     <w:sdt>
       <w:sdtPr>
         <w:alias w:val="Tables"/>
-        <w:id w:val="-608124189"/>
+        <w:id w:val="136000256"/>
       </w:sdtPr>
       <w:sdtEndPr/>
       <w:sdtContent>
@@ -6099,7 +6282,7 @@
           <w:r>
             <w:fldChar w:fldCharType="separate"/>
           </w:r>
-          <w:hyperlink w:anchor="_Toc242916246" w:history="1">
+          <w:hyperlink w:anchor="_Toc242917822" w:history="1">
             <w:r>
               <w:rPr>
                 <w:rStyle w:val="Hyperlink"/>
@@ -6123,7 +6306,7 @@
               <w:rPr>
                 <w:noProof/>
               </w:rPr>
-              <w:instrText xml:space="preserve"> PAGEREF _Toc242916246 \h </w:instrText>
+              <w:instrText xml:space="preserve"> PAGEREF _Toc242917822 \h </w:instrText>
             </w:r>
             <w:r>
               <w:rPr>
@@ -6166,7 +6349,7 @@
               <w14:ligatures w14:val="standardContextual"/>
             </w:rPr>
           </w:pPr>
-          <w:hyperlink w:anchor="_Toc242916247" w:history="1">
+          <w:hyperlink w:anchor="_Toc242917823" w:history="1">
             <w:r>
               <w:rPr>
                 <w:rStyle w:val="Hyperlink"/>
@@ -6190,7 +6373,7 @@
               <w:rPr>
                 <w:noProof/>
               </w:rPr>
-              <w:instrText xml:space="preserve"> PAGEREF _Toc242916247 \h </w:instrText>
+              <w:instrText xml:space="preserve"> PAGEREF _Toc242917823 \h </w:instrText>
             </w:r>
             <w:r>
               <w:rPr>
@@ -6233,7 +6416,7 @@
               <w14:ligatures w14:val="standardContextual"/>
             </w:rPr>
           </w:pPr>
-          <w:hyperlink w:anchor="_Toc242916248" w:history="1">
+          <w:hyperlink w:anchor="_Toc242917824" w:history="1">
             <w:r>
               <w:rPr>
                 <w:rStyle w:val="Hyperlink"/>
@@ -6257,7 +6440,7 @@
               <w:rPr>
                 <w:noProof/>
               </w:rPr>
-              <w:instrText xml:space="preserve"> PAGEREF _Toc242916248 \h </w:instrText>
+              <w:instrText xml:space="preserve"> PAGEREF _Toc242917824 \h </w:instrText>
             </w:r>
             <w:r>
               <w:rPr>
@@ -6300,7 +6483,7 @@
               <w14:ligatures w14:val="standardContextual"/>
             </w:rPr>
           </w:pPr>
-          <w:hyperlink w:anchor="_Toc242916249" w:history="1">
+          <w:hyperlink w:anchor="_Toc242917825" w:history="1">
             <w:r>
               <w:rPr>
                 <w:rStyle w:val="Hyperlink"/>
@@ -6324,7 +6507,7 @@
               <w:rPr>
                 <w:noProof/>
               </w:rPr>
-              <w:instrText xml:space="preserve"> PAGEREF _Toc242916249 \h </w:instrText>
+              <w:instrText xml:space="preserve"> PAGEREF _Toc242917825 \h </w:instrText>
             </w:r>
             <w:r>
               <w:rPr>
@@ -6341,7 +6524,7 @@
               <w:rPr>
                 <w:noProof/>
               </w:rPr>
-              <w:t>15</w:t>
+              <w:t>16</w:t>
             </w:r>
             <w:r>
               <w:rPr>
@@ -6367,7 +6550,7 @@
               <w14:ligatures w14:val="standardContextual"/>
             </w:rPr>
           </w:pPr>
-          <w:hyperlink w:anchor="_Toc242916250" w:history="1">
+          <w:hyperlink w:anchor="_Toc242917826" w:history="1">
             <w:r>
               <w:rPr>
                 <w:rStyle w:val="Hyperlink"/>
@@ -6391,7 +6574,7 @@
               <w:rPr>
                 <w:noProof/>
               </w:rPr>
-              <w:instrText xml:space="preserve"> PAGEREF _Toc242916250 \h </w:instrText>
+              <w:instrText xml:space="preserve"> PAGEREF _Toc242917826 \h </w:instrText>
             </w:r>
             <w:r>
               <w:rPr>
@@ -6434,7 +6617,7 @@
               <w14:ligatures w14:val="standardContextual"/>
             </w:rPr>
           </w:pPr>
-          <w:hyperlink w:anchor="_Toc242916251" w:history="1">
+          <w:hyperlink w:anchor="_Toc242917827" w:history="1">
             <w:r>
               <w:rPr>
                 <w:rStyle w:val="Hyperlink"/>
@@ -6458,7 +6641,7 @@
               <w:rPr>
                 <w:noProof/>
               </w:rPr>
-              <w:instrText xml:space="preserve"> PAGEREF _Toc242916251 \h </w:instrText>
+              <w:instrText xml:space="preserve"> PAGEREF _Toc242917827 \h </w:instrText>
             </w:r>
             <w:r>
               <w:rPr>
@@ -6501,7 +6684,7 @@
               <w14:ligatures w14:val="standardContextual"/>
             </w:rPr>
           </w:pPr>
-          <w:hyperlink w:anchor="_Toc242916252" w:history="1">
+          <w:hyperlink w:anchor="_Toc242917828" w:history="1">
             <w:r>
               <w:rPr>
                 <w:rStyle w:val="Hyperlink"/>
@@ -6525,7 +6708,7 @@
               <w:rPr>
                 <w:noProof/>
               </w:rPr>
-              <w:instrText xml:space="preserve"> PAGEREF _Toc242916252 \h </w:instrText>
+              <w:instrText xml:space="preserve"> PAGEREF _Toc242917828 \h </w:instrText>
             </w:r>
             <w:r>
               <w:rPr>
@@ -6568,7 +6751,7 @@
               <w14:ligatures w14:val="standardContextual"/>
             </w:rPr>
           </w:pPr>
-          <w:hyperlink w:anchor="_Toc242916253" w:history="1">
+          <w:hyperlink w:anchor="_Toc242917829" w:history="1">
             <w:r>
               <w:rPr>
                 <w:rStyle w:val="Hyperlink"/>
@@ -6592,7 +6775,7 @@
               <w:rPr>
                 <w:noProof/>
               </w:rPr>
-              <w:instrText xml:space="preserve"> PAGEREF _Toc242916253 \h </w:instrText>
+              <w:instrText xml:space="preserve"> PAGEREF _Toc242917829 \h </w:instrText>
             </w:r>
             <w:r>
               <w:rPr>
@@ -6635,7 +6818,7 @@
               <w14:ligatures w14:val="standardContextual"/>
             </w:rPr>
           </w:pPr>
-          <w:hyperlink w:anchor="_Toc242916254" w:history="1">
+          <w:hyperlink w:anchor="_Toc242917830" w:history="1">
             <w:r>
               <w:rPr>
                 <w:rStyle w:val="Hyperlink"/>
@@ -6659,7 +6842,7 @@
               <w:rPr>
                 <w:noProof/>
               </w:rPr>
-              <w:instrText xml:space="preserve"> PAGEREF _Toc242916254 \h </w:instrText>
+              <w:instrText xml:space="preserve"> PAGEREF _Toc242917830 \h </w:instrText>
             </w:r>
             <w:r>
               <w:rPr>
@@ -6702,7 +6885,7 @@
               <w14:ligatures w14:val="standardContextual"/>
             </w:rPr>
           </w:pPr>
-          <w:hyperlink w:anchor="_Toc242916255" w:history="1">
+          <w:hyperlink w:anchor="_Toc242917831" w:history="1">
             <w:r>
               <w:rPr>
                 <w:rStyle w:val="Hyperlink"/>
@@ -6726,7 +6909,7 @@
               <w:rPr>
                 <w:noProof/>
               </w:rPr>
-              <w:instrText xml:space="preserve"> PAGEREF _Toc242916255 \h </w:instrText>
+              <w:instrText xml:space="preserve"> PAGEREF _Toc242917831 \h </w:instrText>
             </w:r>
             <w:r>
               <w:rPr>
@@ -6769,7 +6952,7 @@
               <w14:ligatures w14:val="standardContextual"/>
             </w:rPr>
           </w:pPr>
-          <w:hyperlink w:anchor="_Toc242916256" w:history="1">
+          <w:hyperlink w:anchor="_Toc242917832" w:history="1">
             <w:r>
               <w:rPr>
                 <w:rStyle w:val="Hyperlink"/>
@@ -6793,7 +6976,7 @@
               <w:rPr>
                 <w:noProof/>
               </w:rPr>
-              <w:instrText xml:space="preserve"> PAGEREF _Toc242916256 \h </w:instrText>
+              <w:instrText xml:space="preserve"> PAGEREF _Toc242917832 \h </w:instrText>
             </w:r>
             <w:r>
               <w:rPr>
@@ -6836,7 +7019,7 @@
               <w14:ligatures w14:val="standardContextual"/>
             </w:rPr>
           </w:pPr>
-          <w:hyperlink w:anchor="_Toc242916257" w:history="1">
+          <w:hyperlink w:anchor="_Toc242917833" w:history="1">
             <w:r>
               <w:rPr>
                 <w:rStyle w:val="Hyperlink"/>
@@ -6860,7 +7043,7 @@
               <w:rPr>
                 <w:noProof/>
               </w:rPr>
-              <w:instrText xml:space="preserve"> PAGEREF _Toc242916257 \h </w:instrText>
+              <w:instrText xml:space="preserve"> PAGEREF _Toc242917833 \h </w:instrText>
             </w:r>
             <w:r>
               <w:rPr>
@@ -6903,7 +7086,7 @@
               <w14:ligatures w14:val="standardContextual"/>
             </w:rPr>
           </w:pPr>
-          <w:hyperlink w:anchor="_Toc242916258" w:history="1">
+          <w:hyperlink w:anchor="_Toc242917834" w:history="1">
             <w:r>
               <w:rPr>
                 <w:rStyle w:val="Hyperlink"/>
@@ -6927,7 +7110,7 @@
               <w:rPr>
                 <w:noProof/>
               </w:rPr>
-              <w:instrText xml:space="preserve"> PAGEREF _Toc242916258 \h </w:instrText>
+              <w:instrText xml:space="preserve"> PAGEREF _Toc242917834 \h </w:instrText>
             </w:r>
             <w:r>
               <w:rPr>
@@ -6970,7 +7153,7 @@
               <w14:ligatures w14:val="standardContextual"/>
             </w:rPr>
           </w:pPr>
-          <w:hyperlink w:anchor="_Toc242916259" w:history="1">
+          <w:hyperlink w:anchor="_Toc242917835" w:history="1">
             <w:r>
               <w:rPr>
                 <w:rStyle w:val="Hyperlink"/>
@@ -6994,7 +7177,7 @@
               <w:rPr>
                 <w:noProof/>
               </w:rPr>
-              <w:instrText xml:space="preserve"> PAGEREF _Toc242916259 \h </w:instrText>
+              <w:instrText xml:space="preserve"> PAGEREF _Toc242917835 \h </w:instrText>
             </w:r>
             <w:r>
               <w:rPr>
@@ -7037,7 +7220,7 @@
               <w14:ligatures w14:val="standardContextual"/>
             </w:rPr>
           </w:pPr>
-          <w:hyperlink w:anchor="_Toc242916260" w:history="1">
+          <w:hyperlink w:anchor="_Toc242917836" w:history="1">
             <w:r>
               <w:rPr>
                 <w:rStyle w:val="Hyperlink"/>
@@ -7061,7 +7244,7 @@
               <w:rPr>
                 <w:noProof/>
               </w:rPr>
-              <w:instrText xml:space="preserve"> PAGEREF _Toc242916260 \h </w:instrText>
+              <w:instrText xml:space="preserve"> PAGEREF _Toc242917836 \h </w:instrText>
             </w:r>
             <w:r>
               <w:rPr>
@@ -7104,7 +7287,7 @@
               <w14:ligatures w14:val="standardContextual"/>
             </w:rPr>
           </w:pPr>
-          <w:hyperlink w:anchor="_Toc242916261" w:history="1">
+          <w:hyperlink w:anchor="_Toc242917837" w:history="1">
             <w:r>
               <w:rPr>
                 <w:rStyle w:val="Hyperlink"/>
@@ -7128,7 +7311,7 @@
               <w:rPr>
                 <w:noProof/>
               </w:rPr>
-              <w:instrText xml:space="preserve"> PAGEREF _Toc242916261 \h </w:instrText>
+              <w:instrText xml:space="preserve"> PAGEREF _Toc242917837 \h </w:instrText>
             </w:r>
             <w:r>
               <w:rPr>
@@ -7169,7 +7352,7 @@
         <w:keepLines/>
         <w:pageBreakBefore/>
       </w:pPr>
-      <w:bookmarkStart w:id="0" w:name="_Toc242916196"/>
+      <w:bookmarkStart w:id="0" w:name="_Toc242917771"/>
       <w:r>
         <w:lastRenderedPageBreak/>
         <w:t>1 Introduction</w:t>
@@ -7182,7 +7365,7 @@
         <w:keepNext/>
         <w:keepLines/>
       </w:pPr>
-      <w:bookmarkStart w:id="1" w:name="_Toc242916197"/>
+      <w:bookmarkStart w:id="1" w:name="_Toc242917772"/>
       <w:r>
         <w:t>1.1 Purpose</w:t>
       </w:r>
@@ -7232,7 +7415,7 @@
         <w:keepNext/>
         <w:keepLines/>
       </w:pPr>
-      <w:bookmarkStart w:id="2" w:name="_Toc242916198"/>
+      <w:bookmarkStart w:id="2" w:name="_Toc242917773"/>
       <w:r>
         <w:t>1.2 Scope</w:t>
       </w:r>
@@ -7262,7 +7445,7 @@
         <w:keepNext/>
         <w:keepLines/>
       </w:pPr>
-      <w:bookmarkStart w:id="3" w:name="_Toc242916199"/>
+      <w:bookmarkStart w:id="3" w:name="_Toc242917774"/>
       <w:r>
         <w:t>1.3 Intended audience</w:t>
       </w:r>
@@ -7282,9 +7465,12 @@
         <w:keepNext/>
         <w:keepLines/>
       </w:pPr>
-      <w:bookmarkStart w:id="4" w:name="_Toc242916200"/>
-      <w:r>
-        <w:t>1.4 Relationship to other documents</w:t>
+      <w:bookmarkStart w:id="4" w:name="_Toc242917775"/>
+      <w:r>
+        <w:t>1.4 </w:t>
+      </w:r>
+      <w:r>
+        <w:t>Relationship to other documents</w:t>
       </w:r>
       <w:bookmarkEnd w:id="4"/>
     </w:p>
@@ -7293,7 +7479,7 @@
         <w:pStyle w:val="Caption"/>
         <w:keepNext/>
       </w:pPr>
-      <w:bookmarkStart w:id="5" w:name="_Toc242916246"/>
+      <w:bookmarkStart w:id="5" w:name="_Toc242917822"/>
       <w:r>
         <w:t xml:space="preserve">Table </w:t>
       </w:r>
@@ -7812,7 +7998,7 @@
         <w:keepNext/>
         <w:keepLines/>
       </w:pPr>
-      <w:bookmarkStart w:id="6" w:name="_Toc242916201"/>
+      <w:bookmarkStart w:id="6" w:name="_Toc242917776"/>
       <w:r>
         <w:t>1.5 Notation</w:t>
       </w:r>
@@ -7943,7 +8129,7 @@
         <w:keepLines/>
         <w:pageBreakBefore/>
       </w:pPr>
-      <w:bookmarkStart w:id="7" w:name="_Toc242916202"/>
+      <w:bookmarkStart w:id="7" w:name="_Toc242917777"/>
       <w:r>
         <w:lastRenderedPageBreak/>
         <w:t>2 Conceptual model (EER)</w:t>
@@ -7956,7 +8142,7 @@
         <w:keepNext/>
         <w:keepLines/>
       </w:pPr>
-      <w:bookmarkStart w:id="8" w:name="_Toc242916203"/>
+      <w:bookmarkStart w:id="8" w:name="_Toc242917778"/>
       <w:r>
         <w:t>2.1 Offerings and cut-offs</w:t>
       </w:r>
@@ -8032,7 +8218,7 @@
         </w:rPr>
         <w:lastRenderedPageBreak/>
         <w:drawing>
-          <wp:inline distT="0" distB="0" distL="0" distR="0" wp14:anchorId="5B7C7464" wp14:editId="5B7C7465">
+          <wp:inline distT="0" distB="0" distL="0" distR="0" wp14:anchorId="340B2674" wp14:editId="340B2675">
             <wp:extent cx="6124575" cy="7553325"/>
             <wp:effectExtent l="0" t="0" r="0" b="0"/>
             <wp:docPr id="1" name="eer-offerings.png" descr="EER model of institutions, courses, offerings, intake years, selection groups and cut-offs" title="EER model of institutions, courses, offerings, intake years, selection groups and cut-offs"/>
@@ -8075,7 +8261,7 @@
       <w:pPr>
         <w:pStyle w:val="Caption"/>
       </w:pPr>
-      <w:bookmarkStart w:id="9" w:name="_Toc242916238"/>
+      <w:bookmarkStart w:id="9" w:name="_Toc242917814"/>
       <w:r>
         <w:t xml:space="preserve">Figure </w:t>
       </w:r>
@@ -8108,9 +8294,12 @@
         <w:keepNext/>
         <w:keepLines/>
       </w:pPr>
-      <w:bookmarkStart w:id="10" w:name="_Toc242916204"/>
-      <w:r>
-        <w:t>2.2 Subjects and requirement rules</w:t>
+      <w:bookmarkStart w:id="10" w:name="_Toc242917779"/>
+      <w:r>
+        <w:t>2.2 </w:t>
+      </w:r>
+      <w:r>
+        <w:t>Subjects and requirement rules</w:t>
       </w:r>
       <w:bookmarkEnd w:id="10"/>
     </w:p>
@@ -8144,7 +8333,7 @@
         </w:rPr>
         <w:lastRenderedPageBreak/>
         <w:drawing>
-          <wp:inline distT="0" distB="0" distL="0" distR="0" wp14:anchorId="5B7C7466" wp14:editId="5B7C7467">
+          <wp:inline distT="0" distB="0" distL="0" distR="0" wp14:anchorId="340B2676" wp14:editId="340B2677">
             <wp:extent cx="6124575" cy="6067425"/>
             <wp:effectExtent l="0" t="0" r="0" b="0"/>
             <wp:docPr id="2" name="eer-rules.png" descr="EER model of streams, subjects and the recursive requirement-rule tree" title="EER model of streams, subjects and the recursive requirement-rule tree"/>
@@ -8187,7 +8376,7 @@
       <w:pPr>
         <w:pStyle w:val="Caption"/>
       </w:pPr>
-      <w:bookmarkStart w:id="11" w:name="_Toc242916239"/>
+      <w:bookmarkStart w:id="11" w:name="_Toc242917815"/>
       <w:r>
         <w:t xml:space="preserve">Figure </w:t>
       </w:r>
@@ -8220,7 +8409,7 @@
         <w:keepNext/>
         <w:keepLines/>
       </w:pPr>
-      <w:bookmarkStart w:id="12" w:name="_Toc242916205"/>
+      <w:bookmarkStart w:id="12" w:name="_Toc242917780"/>
       <w:r>
         <w:t>2.3 Provenance and trust</w:t>
       </w:r>
@@ -8256,7 +8445,7 @@
         </w:rPr>
         <w:lastRenderedPageBreak/>
         <w:drawing>
-          <wp:inline distT="0" distB="0" distL="0" distR="0" wp14:anchorId="5B7C7468" wp14:editId="5B7C7469">
+          <wp:inline distT="0" distB="0" distL="0" distR="0" wp14:anchorId="340B2678" wp14:editId="340B2679">
             <wp:extent cx="6124575" cy="4829175"/>
             <wp:effectExtent l="0" t="0" r="0" b="0"/>
             <wp:docPr id="3" name="eer-provenance.png" descr="EER model of cited facts, sources, revisions, AI extraction, review and mistake reports" title="EER model of cited facts, sources, revisions, AI extraction, review and mistake reports"/>
@@ -8299,7 +8488,7 @@
       <w:pPr>
         <w:pStyle w:val="Caption"/>
       </w:pPr>
-      <w:bookmarkStart w:id="13" w:name="_Toc242916240"/>
+      <w:bookmarkStart w:id="13" w:name="_Toc242917816"/>
       <w:r>
         <w:t xml:space="preserve">Figure </w:t>
       </w:r>
@@ -8332,7 +8521,7 @@
         <w:keepNext/>
         <w:keepLines/>
       </w:pPr>
-      <w:bookmarkStart w:id="14" w:name="_Toc242916206"/>
+      <w:bookmarkStart w:id="14" w:name="_Toc242917781"/>
       <w:r>
         <w:t>2.4 Journey and other routes</w:t>
       </w:r>
@@ -8349,7 +8538,7 @@
           <w:noProof/>
         </w:rPr>
         <w:drawing>
-          <wp:inline distT="0" distB="0" distL="0" distR="0" wp14:anchorId="5B7C746A" wp14:editId="5B7C746B">
+          <wp:inline distT="0" distB="0" distL="0" distR="0" wp14:anchorId="340B267A" wp14:editId="340B267B">
             <wp:extent cx="6124575" cy="2895600"/>
             <wp:effectExtent l="0" t="0" r="0" b="0"/>
             <wp:docPr id="4" name="eer-journey.png" descr="EER model of deadlines, push reminders and the specialisation of other routes" title="EER model of deadlines, push reminders and the specialisation of other routes"/>
@@ -8392,7 +8581,7 @@
       <w:pPr>
         <w:pStyle w:val="Caption"/>
       </w:pPr>
-      <w:bookmarkStart w:id="15" w:name="_Toc242916241"/>
+      <w:bookmarkStart w:id="15" w:name="_Toc242917817"/>
       <w:r>
         <w:t xml:space="preserve">Figure </w:t>
       </w:r>
@@ -8425,7 +8614,7 @@
         <w:keepNext/>
         <w:keepLines/>
       </w:pPr>
-      <w:bookmarkStart w:id="16" w:name="_Toc242916207"/>
+      <w:bookmarkStart w:id="16" w:name="_Toc242917782"/>
       <w:r>
         <w:lastRenderedPageBreak/>
         <w:t>2.5 Student accounts (CR-001)</w:t>
@@ -8464,7 +8653,7 @@
           <w:noProof/>
         </w:rPr>
         <w:drawing>
-          <wp:inline distT="0" distB="0" distL="0" distR="0" wp14:anchorId="5B7C746C" wp14:editId="5B7C746D">
+          <wp:inline distT="0" distB="0" distL="0" distR="0" wp14:anchorId="340B267C" wp14:editId="340B267D">
             <wp:extent cx="6124575" cy="2857500"/>
             <wp:effectExtent l="0" t="0" r="0" b="0"/>
             <wp:docPr id="5" name="eer-accounts.png" descr="EER model of optional student accounts: sign-in, sessions, recovery and the student's results" title="EER model of optional student accounts: sign-in, sessions, recovery and the student's results"/>
@@ -8507,7 +8696,7 @@
       <w:pPr>
         <w:pStyle w:val="Caption"/>
       </w:pPr>
-      <w:bookmarkStart w:id="17" w:name="_Toc242916242"/>
+      <w:bookmarkStart w:id="17" w:name="_Toc242917818"/>
       <w:r>
         <w:t xml:space="preserve">Figure </w:t>
       </w:r>
@@ -8540,7 +8729,7 @@
         <w:keepNext/>
         <w:keepLines/>
       </w:pPr>
-      <w:bookmarkStart w:id="18" w:name="_Toc242916208"/>
+      <w:bookmarkStart w:id="18" w:name="_Toc242917783"/>
       <w:r>
         <w:t>2.6 Journey, Alerts and Groups (CR-002)</w:t>
       </w:r>
@@ -10112,7 +10301,7 @@
         <w:keepNext/>
         <w:keepLines/>
       </w:pPr>
-      <w:bookmarkStart w:id="19" w:name="_Toc242916209"/>
+      <w:bookmarkStart w:id="19" w:name="_Toc242917784"/>
       <w:r>
         <w:t>2.7 Contact details (CR-003)</w:t>
       </w:r>
@@ -10833,7 +11022,7 @@
         <w:keepNext/>
         <w:keepLines/>
       </w:pPr>
-      <w:bookmarkStart w:id="20" w:name="_Toc242916210"/>
+      <w:bookmarkStart w:id="20" w:name="_Toc242917785"/>
       <w:r>
         <w:t>2.8 Answer feedback (CR-004)</w:t>
       </w:r>
@@ -10904,7 +11093,7 @@
         <w:keepNext/>
         <w:keepLines/>
       </w:pPr>
-      <w:bookmarkStart w:id="21" w:name="_Toc242916211"/>
+      <w:bookmarkStart w:id="21" w:name="_Toc242917786"/>
       <w:r>
         <w:t>2.9 Group rules and sample conversations (CR-005)</w:t>
       </w:r>
@@ -11036,7 +11225,7 @@
         <w:keepNext/>
         <w:keepLines/>
       </w:pPr>
-      <w:bookmarkStart w:id="22" w:name="_Toc242916212"/>
+      <w:bookmarkStart w:id="22" w:name="_Toc242917787"/>
       <w:r>
         <w:t>2.10 Journey, avatars and group rules on the account (CR-006)</w:t>
       </w:r>
@@ -11095,7 +11284,7 @@
         <w:pStyle w:val="Caption"/>
         <w:keepNext/>
       </w:pPr>
-      <w:bookmarkStart w:id="23" w:name="_Toc242916247"/>
+      <w:bookmarkStart w:id="23" w:name="_Toc242917823"/>
       <w:r>
         <w:lastRenderedPageBreak/>
         <w:t xml:space="preserve">Table </w:t>
@@ -12354,7 +12543,7 @@
         <w:keepNext/>
         <w:keepLines/>
       </w:pPr>
-      <w:bookmarkStart w:id="24" w:name="_Toc242916213"/>
+      <w:bookmarkStart w:id="24" w:name="_Toc242917788"/>
       <w:r>
         <w:t>2.11 Demo accounts (CR-007)</w:t>
       </w:r>
@@ -12413,7 +12602,7 @@
         <w:pStyle w:val="Caption"/>
         <w:keepNext/>
       </w:pPr>
-      <w:bookmarkStart w:id="25" w:name="_Toc242916248"/>
+      <w:bookmarkStart w:id="25" w:name="_Toc242917824"/>
       <w:r>
         <w:t xml:space="preserve">Table </w:t>
       </w:r>
@@ -12868,18 +13057,88 @@
         <w:keepNext/>
         <w:keepLines/>
       </w:pPr>
-      <w:bookmarkStart w:id="26" w:name="_Toc242916214"/>
-      <w:r>
-        <w:t>2.12 Entity catalogue</w:t>
+      <w:bookmarkStart w:id="26" w:name="_Toc242917789"/>
+      <w:r>
+        <w:t>2.12 University facts from UGC statistics (read model)</w:t>
       </w:r>
       <w:bookmarkEnd w:id="26"/>
+    </w:p>
+    <w:p>
+      <w:pPr>
+        <w:spacing w:after="120"/>
+      </w:pPr>
+      <w:r>
+        <w:t xml:space="preserve">Five facts per institution (students admitted 2023/24, undergraduates 2024, permanent hostel places, Mahapola and Bursary recipients, graduates 2024) come from the UGC report </w:t>
+      </w:r>
+      <w:r>
+        <w:rPr>
+          <w:i/>
+          <w:iCs/>
+        </w:rPr>
+        <w:t>Sri Lanka University Statistics 2024</w:t>
+      </w:r>
+      <w:r>
+        <w:t>, Chapters 2, 3, 4 and 7. They follow the read-model decision used for routes and dates: the extracts (</w:t>
+      </w:r>
+      <w:r>
+        <w:rPr>
+          <w:rFonts w:ascii="Consolas" w:eastAsia="Consolas" w:hAnsi="Consolas" w:cs="Consolas"/>
+          <w:sz w:val="19"/>
+          <w:szCs w:val="19"/>
+          <w:shd w:val="clear" w:color="auto" w:fill="F2F4F3"/>
+        </w:rPr>
+        <w:t>data/ugc/statistics-2024/*.json</w:t>
+      </w:r>
+      <w:r>
+        <w:t xml:space="preserve">, each number checked twice against the printed table and its totals, and spot-checked by hand) are compiled by </w:t>
+      </w:r>
+      <w:r>
+        <w:rPr>
+          <w:rFonts w:ascii="Consolas" w:eastAsia="Consolas" w:hAnsi="Consolas" w:cs="Consolas"/>
+          <w:sz w:val="19"/>
+          <w:szCs w:val="19"/>
+          <w:shd w:val="clear" w:color="auto" w:fill="F2F4F3"/>
+        </w:rPr>
+        <w:t>tools/statistics/build-statistics.ts</w:t>
+      </w:r>
+      <w:r>
+        <w:t xml:space="preserve"> into </w:t>
+      </w:r>
+      <w:r>
+        <w:rPr>
+          <w:rFonts w:ascii="Consolas" w:eastAsia="Consolas" w:hAnsi="Consolas" w:cs="Consolas"/>
+          <w:sz w:val="19"/>
+          <w:szCs w:val="19"/>
+          <w:shd w:val="clear" w:color="auto" w:fill="F2F4F3"/>
+        </w:rPr>
+        <w:t>worker/generated/statistics-2024.json</w:t>
+      </w:r>
+      <w:r>
+        <w:t xml:space="preserve">, keyed by institution letter. They are published, versioned reference data that students only read, so they are not stored in D1. Each fact keeps its </w:t>
+      </w:r>
+      <w:r>
+        <w:t>table, PDF page and URL, and the report's own caveats as flags (2024 provisional; "Information not submitted" shown as no number, never as zero; university totals that include campuses).</w:t>
+      </w:r>
+    </w:p>
+    <w:p>
+      <w:pPr>
+        <w:pStyle w:val="Heading2"/>
+        <w:keepNext/>
+        <w:keepLines/>
+      </w:pPr>
+      <w:bookmarkStart w:id="27" w:name="_Toc242917790"/>
+      <w:r>
+        <w:lastRenderedPageBreak/>
+        <w:t>2.13 Entity catalogue</w:t>
+      </w:r>
+      <w:bookmarkEnd w:id="27"/>
     </w:p>
     <w:p>
       <w:pPr>
         <w:pStyle w:val="Caption"/>
         <w:keepNext/>
       </w:pPr>
-      <w:bookmarkStart w:id="27" w:name="_Toc242916249"/>
+      <w:bookmarkStart w:id="28" w:name="_Toc242917825"/>
       <w:r>
         <w:t xml:space="preserve">Table </w:t>
       </w:r>
@@ -12904,7 +13163,7 @@
       <w:r>
         <w:t>: Entities, their type, identifier and the requirements that justify them</w:t>
       </w:r>
-      <w:bookmarkEnd w:id="27"/>
+      <w:bookmarkEnd w:id="28"/>
     </w:p>
     <w:tbl>
       <w:tblPr>
@@ -13911,7 +14170,6 @@
                 <w:sz w:val="19"/>
                 <w:szCs w:val="19"/>
               </w:rPr>
-              <w:lastRenderedPageBreak/>
               <w:t>OFFERING_YEAR</w:t>
             </w:r>
           </w:p>
@@ -16148,12 +16406,12 @@
         <w:keepLines/>
         <w:pageBreakBefore/>
       </w:pPr>
-      <w:bookmarkStart w:id="28" w:name="_Toc242916215"/>
+      <w:bookmarkStart w:id="29" w:name="_Toc242917791"/>
       <w:r>
         <w:lastRenderedPageBreak/>
         <w:t>3 Rule grammar</w:t>
       </w:r>
-      <w:bookmarkEnd w:id="28"/>
+      <w:bookmarkEnd w:id="29"/>
     </w:p>
     <w:p>
       <w:pPr>
@@ -16190,7 +16448,7 @@
         <w:pStyle w:val="Caption"/>
         <w:keepNext/>
       </w:pPr>
-      <w:bookmarkStart w:id="29" w:name="_Toc242916250"/>
+      <w:bookmarkStart w:id="30" w:name="_Toc242917826"/>
       <w:r>
         <w:t xml:space="preserve">Table </w:t>
       </w:r>
@@ -16215,7 +16473,7 @@
       <w:r>
         <w:t>: Rule node kinds and their meaning</w:t>
       </w:r>
-      <w:bookmarkEnd w:id="29"/>
+      <w:bookmarkEnd w:id="30"/>
     </w:p>
     <w:tbl>
       <w:tblPr>
@@ -17561,12 +17819,12 @@
         <w:keepLines/>
         <w:pageBreakBefore/>
       </w:pPr>
-      <w:bookmarkStart w:id="30" w:name="_Toc242916216"/>
+      <w:bookmarkStart w:id="31" w:name="_Toc242917792"/>
       <w:r>
         <w:lastRenderedPageBreak/>
         <w:t>4 Mapping the EER model to relations</w:t>
       </w:r>
-      <w:bookmarkEnd w:id="30"/>
+      <w:bookmarkEnd w:id="31"/>
     </w:p>
     <w:p>
       <w:pPr>
@@ -17581,7 +17839,7 @@
         <w:pStyle w:val="Caption"/>
         <w:keepNext/>
       </w:pPr>
-      <w:bookmarkStart w:id="31" w:name="_Toc242916251"/>
+      <w:bookmarkStart w:id="32" w:name="_Toc242917827"/>
       <w:r>
         <w:t xml:space="preserve">Table </w:t>
       </w:r>
@@ -17606,7 +17864,7 @@
       <w:r>
         <w:t>: EER-to-relational mapping steps applied</w:t>
       </w:r>
-      <w:bookmarkEnd w:id="31"/>
+      <w:bookmarkEnd w:id="32"/>
     </w:p>
     <w:tbl>
       <w:tblPr>
@@ -19372,7 +19630,7 @@
         <w:pStyle w:val="Caption"/>
         <w:keepNext/>
       </w:pPr>
-      <w:bookmarkStart w:id="32" w:name="_Toc242916252"/>
+      <w:bookmarkStart w:id="33" w:name="_Toc242917828"/>
       <w:r>
         <w:lastRenderedPageBreak/>
         <w:t xml:space="preserve">Table </w:t>
@@ -19398,7 +19656,7 @@
       <w:r>
         <w:t>: Mapping of the student-account model</w:t>
       </w:r>
-      <w:bookmarkEnd w:id="32"/>
+      <w:bookmarkEnd w:id="33"/>
     </w:p>
     <w:tbl>
       <w:tblPr>
@@ -20484,7 +20742,7 @@
         </w:rPr>
         <w:lastRenderedPageBreak/>
         <w:drawing>
-          <wp:inline distT="0" distB="0" distL="0" distR="0" wp14:anchorId="5B7C746E" wp14:editId="5B7C746F">
+          <wp:inline distT="0" distB="0" distL="0" distR="0" wp14:anchorId="340B267E" wp14:editId="340B267F">
             <wp:extent cx="6124575" cy="6562725"/>
             <wp:effectExtent l="0" t="0" r="0" b="0"/>
             <wp:docPr id="6" name="relational-admission.png" descr="Logical schema, admission data (generated from the migration file)" title="Logical schema, admission data (generated from the migration file)"/>
@@ -20527,7 +20785,7 @@
       <w:pPr>
         <w:pStyle w:val="Caption"/>
       </w:pPr>
-      <w:bookmarkStart w:id="33" w:name="_Toc242916243"/>
+      <w:bookmarkStart w:id="34" w:name="_Toc242917819"/>
       <w:r>
         <w:t xml:space="preserve">Figure </w:t>
       </w:r>
@@ -20552,7 +20810,7 @@
       <w:r>
         <w:t>: Logical schema, admission data (generated from the migration file)</w:t>
       </w:r>
-      <w:bookmarkEnd w:id="33"/>
+      <w:bookmarkEnd w:id="34"/>
     </w:p>
     <w:p>
       <w:pPr>
@@ -20566,7 +20824,7 @@
         </w:rPr>
         <w:lastRenderedPageBreak/>
         <w:drawing>
-          <wp:inline distT="0" distB="0" distL="0" distR="0" wp14:anchorId="5B7C7470" wp14:editId="5B7C7471">
+          <wp:inline distT="0" distB="0" distL="0" distR="0" wp14:anchorId="340B2680" wp14:editId="340B2681">
             <wp:extent cx="6124575" cy="5562600"/>
             <wp:effectExtent l="0" t="0" r="0" b="0"/>
             <wp:docPr id="7" name="relational-trust-journey.png" descr="Logical schema, trust, routes and journey data (generated from the migration file)" title="Logical schema, trust, routes and journey data (generated from the migration file)"/>
@@ -20609,7 +20867,7 @@
       <w:pPr>
         <w:pStyle w:val="Caption"/>
       </w:pPr>
-      <w:bookmarkStart w:id="34" w:name="_Toc242916244"/>
+      <w:bookmarkStart w:id="35" w:name="_Toc242917820"/>
       <w:r>
         <w:t xml:space="preserve">Figure </w:t>
       </w:r>
@@ -20634,7 +20892,7 @@
       <w:r>
         <w:t>: Logical schema, trust, routes and journey data (generated from the migration file)</w:t>
       </w:r>
-      <w:bookmarkEnd w:id="34"/>
+      <w:bookmarkEnd w:id="35"/>
     </w:p>
     <w:p>
       <w:pPr>
@@ -20647,7 +20905,7 @@
           <w:noProof/>
         </w:rPr>
         <w:drawing>
-          <wp:inline distT="0" distB="0" distL="0" distR="0" wp14:anchorId="5B7C7472" wp14:editId="5B7C7473">
+          <wp:inline distT="0" distB="0" distL="0" distR="0" wp14:anchorId="340B2682" wp14:editId="340B2683">
             <wp:extent cx="6124575" cy="2305050"/>
             <wp:effectExtent l="0" t="0" r="0" b="0"/>
             <wp:docPr id="8" name="relational-accounts.png" descr="Logical schema, optional student accounts (generated from the migration files)" title="Logical schema, optional student accounts (generated from the migration files)"/>
@@ -20690,7 +20948,7 @@
       <w:pPr>
         <w:pStyle w:val="Caption"/>
       </w:pPr>
-      <w:bookmarkStart w:id="35" w:name="_Toc242916245"/>
+      <w:bookmarkStart w:id="36" w:name="_Toc242917821"/>
       <w:r>
         <w:t xml:space="preserve">Figure </w:t>
       </w:r>
@@ -20715,7 +20973,7 @@
       <w:r>
         <w:t>: Logical schema, optional student accounts (generated from the migration files)</w:t>
       </w:r>
-      <w:bookmarkEnd w:id="35"/>
+      <w:bookmarkEnd w:id="36"/>
     </w:p>
     <w:p>
       <w:pPr>
@@ -20724,12 +20982,12 @@
         <w:keepLines/>
         <w:pageBreakBefore/>
       </w:pPr>
-      <w:bookmarkStart w:id="36" w:name="_Toc242916217"/>
+      <w:bookmarkStart w:id="37" w:name="_Toc242917793"/>
       <w:r>
         <w:lastRenderedPageBreak/>
         <w:t>5 Normalisation</w:t>
       </w:r>
-      <w:bookmarkEnd w:id="36"/>
+      <w:bookmarkEnd w:id="37"/>
     </w:p>
     <w:p>
       <w:pPr>
@@ -20737,11 +20995,11 @@
         <w:keepNext/>
         <w:keepLines/>
       </w:pPr>
-      <w:bookmarkStart w:id="37" w:name="_Toc242916218"/>
+      <w:bookmarkStart w:id="38" w:name="_Toc242917794"/>
       <w:r>
         <w:t>5.1 From the source form to 1NF</w:t>
       </w:r>
-      <w:bookmarkEnd w:id="37"/>
+      <w:bookmarkEnd w:id="38"/>
     </w:p>
     <w:p>
       <w:pPr>
@@ -20793,18 +21051,18 @@
         <w:keepNext/>
         <w:keepLines/>
       </w:pPr>
-      <w:bookmarkStart w:id="38" w:name="_Toc242916219"/>
+      <w:bookmarkStart w:id="39" w:name="_Toc242917795"/>
       <w:r>
         <w:t>5.2 Functional and multi-valued dependencies</w:t>
       </w:r>
-      <w:bookmarkEnd w:id="38"/>
+      <w:bookmarkEnd w:id="39"/>
     </w:p>
     <w:p>
       <w:pPr>
         <w:pStyle w:val="Caption"/>
         <w:keepNext/>
       </w:pPr>
-      <w:bookmarkStart w:id="39" w:name="_Toc242916253"/>
+      <w:bookmarkStart w:id="40" w:name="_Toc242917829"/>
       <w:r>
         <w:t xml:space="preserve">Table </w:t>
       </w:r>
@@ -20829,7 +21087,7 @@
       <w:r>
         <w:t>: Dependencies identified in R1</w:t>
       </w:r>
-      <w:bookmarkEnd w:id="39"/>
+      <w:bookmarkEnd w:id="40"/>
     </w:p>
     <w:tbl>
       <w:tblPr>
@@ -21703,11 +21961,11 @@
         <w:keepNext/>
         <w:keepLines/>
       </w:pPr>
-      <w:bookmarkStart w:id="40" w:name="_Toc242916220"/>
+      <w:bookmarkStart w:id="41" w:name="_Toc242917796"/>
       <w:r>
         <w:t>5.3 2NF, 3NF and BCNF</w:t>
       </w:r>
-      <w:bookmarkEnd w:id="40"/>
+      <w:bookmarkEnd w:id="41"/>
     </w:p>
     <w:p>
       <w:pPr>
@@ -21946,19 +22204,19 @@
         <w:keepNext/>
         <w:keepLines/>
       </w:pPr>
-      <w:bookmarkStart w:id="41" w:name="_Toc242916221"/>
+      <w:bookmarkStart w:id="42" w:name="_Toc242917797"/>
       <w:r>
         <w:lastRenderedPageBreak/>
         <w:t>5.4 Deliberate departures</w:t>
       </w:r>
-      <w:bookmarkEnd w:id="41"/>
+      <w:bookmarkEnd w:id="42"/>
     </w:p>
     <w:p>
       <w:pPr>
         <w:pStyle w:val="Caption"/>
         <w:keepNext/>
       </w:pPr>
-      <w:bookmarkStart w:id="42" w:name="_Toc242916254"/>
+      <w:bookmarkStart w:id="43" w:name="_Toc242917830"/>
       <w:r>
         <w:t xml:space="preserve">Table </w:t>
       </w:r>
@@ -21983,7 +22241,7 @@
       <w:r>
         <w:t>: Controlled denormalisations and why they are safe</w:t>
       </w:r>
-      <w:bookmarkEnd w:id="42"/>
+      <w:bookmarkEnd w:id="43"/>
     </w:p>
     <w:tbl>
       <w:tblPr>
@@ -22729,12 +22987,12 @@
         <w:keepLines/>
         <w:pageBreakBefore/>
       </w:pPr>
-      <w:bookmarkStart w:id="43" w:name="_Toc242916222"/>
+      <w:bookmarkStart w:id="44" w:name="_Toc242917798"/>
       <w:r>
         <w:lastRenderedPageBreak/>
         <w:t>6 Physical design for Cloudflare D1</w:t>
       </w:r>
-      <w:bookmarkEnd w:id="43"/>
+      <w:bookmarkEnd w:id="44"/>
     </w:p>
     <w:p>
       <w:pPr>
@@ -22742,11 +23000,11 @@
         <w:keepNext/>
         <w:keepLines/>
       </w:pPr>
-      <w:bookmarkStart w:id="44" w:name="_Toc242916223"/>
+      <w:bookmarkStart w:id="45" w:name="_Toc242917799"/>
       <w:r>
         <w:t>6.1 Conventions</w:t>
       </w:r>
-      <w:bookmarkEnd w:id="44"/>
+      <w:bookmarkEnd w:id="45"/>
     </w:p>
     <w:p>
       <w:pPr>
@@ -22981,18 +23239,18 @@
         <w:keepNext/>
         <w:keepLines/>
       </w:pPr>
-      <w:bookmarkStart w:id="45" w:name="_Toc242916224"/>
+      <w:bookmarkStart w:id="46" w:name="_Toc242917800"/>
       <w:r>
         <w:t>6.2 Indexes</w:t>
       </w:r>
-      <w:bookmarkEnd w:id="45"/>
+      <w:bookmarkEnd w:id="46"/>
     </w:p>
     <w:p>
       <w:pPr>
         <w:pStyle w:val="Caption"/>
         <w:keepNext/>
       </w:pPr>
-      <w:bookmarkStart w:id="46" w:name="_Toc242916255"/>
+      <w:bookmarkStart w:id="47" w:name="_Toc242917831"/>
       <w:r>
         <w:t xml:space="preserve">Table </w:t>
       </w:r>
@@ -23017,7 +23275,7 @@
       <w:r>
         <w:t>: Secondary indexes and the query each serves</w:t>
       </w:r>
-      <w:bookmarkEnd w:id="46"/>
+      <w:bookmarkEnd w:id="47"/>
     </w:p>
     <w:tbl>
       <w:tblPr>
@@ -24073,19 +24331,19 @@
         <w:keepNext/>
         <w:keepLines/>
       </w:pPr>
-      <w:bookmarkStart w:id="47" w:name="_Toc242916225"/>
+      <w:bookmarkStart w:id="48" w:name="_Toc242917801"/>
       <w:r>
         <w:lastRenderedPageBreak/>
         <w:t>6.3 Capacity against the free plan</w:t>
       </w:r>
-      <w:bookmarkEnd w:id="47"/>
+      <w:bookmarkEnd w:id="48"/>
     </w:p>
     <w:p>
       <w:pPr>
         <w:pStyle w:val="Caption"/>
         <w:keepNext/>
       </w:pPr>
-      <w:bookmarkStart w:id="48" w:name="_Toc242916256"/>
+      <w:bookmarkStart w:id="49" w:name="_Toc242917832"/>
       <w:r>
         <w:t xml:space="preserve">Table </w:t>
       </w:r>
@@ -24110,7 +24368,7 @@
       <w:r>
         <w:t>: Data volume per intake year and free-plan headroom</w:t>
       </w:r>
-      <w:bookmarkEnd w:id="48"/>
+      <w:bookmarkEnd w:id="49"/>
     </w:p>
     <w:tbl>
       <w:tblPr>
@@ -24772,12 +25030,12 @@
         <w:keepLines/>
         <w:pageBreakBefore/>
       </w:pPr>
-      <w:bookmarkStart w:id="49" w:name="_Toc242916226"/>
+      <w:bookmarkStart w:id="50" w:name="_Toc242917802"/>
       <w:r>
         <w:lastRenderedPageBreak/>
         <w:t>7 Validation against real data</w:t>
       </w:r>
-      <w:bookmarkEnd w:id="49"/>
+      <w:bookmarkEnd w:id="50"/>
     </w:p>
     <w:p>
       <w:pPr>
@@ -24804,7 +25062,7 @@
         <w:pStyle w:val="Caption"/>
         <w:keepNext/>
       </w:pPr>
-      <w:bookmarkStart w:id="50" w:name="_Toc242916257"/>
+      <w:bookmarkStart w:id="51" w:name="_Toc242917833"/>
       <w:r>
         <w:t xml:space="preserve">Table </w:t>
       </w:r>
@@ -24829,7 +25087,7 @@
       <w:r>
         <w:t>: Schema validation results (5 October 2026)</w:t>
       </w:r>
-      <w:bookmarkEnd w:id="50"/>
+      <w:bookmarkEnd w:id="51"/>
     </w:p>
     <w:tbl>
       <w:tblPr>
@@ -26254,7 +26512,7 @@
         <w:pStyle w:val="Caption"/>
         <w:keepNext/>
       </w:pPr>
-      <w:bookmarkStart w:id="51" w:name="_Toc242916258"/>
+      <w:bookmarkStart w:id="52" w:name="_Toc242917834"/>
       <w:r>
         <w:t xml:space="preserve">Table </w:t>
       </w:r>
@@ -26279,7 +26537,7 @@
       <w:r>
         <w:t>: Student-account validation results (5 October 2026)</w:t>
       </w:r>
-      <w:bookmarkEnd w:id="51"/>
+      <w:bookmarkEnd w:id="52"/>
     </w:p>
     <w:tbl>
       <w:tblPr>
@@ -26996,19 +27254,19 @@
         <w:keepLines/>
         <w:pageBreakBefore/>
       </w:pPr>
-      <w:bookmarkStart w:id="52" w:name="_Toc242916227"/>
+      <w:bookmarkStart w:id="53" w:name="_Toc242917803"/>
       <w:r>
         <w:lastRenderedPageBreak/>
         <w:t>Appendix A: Traceability: requirements to tables</w:t>
       </w:r>
-      <w:bookmarkEnd w:id="52"/>
+      <w:bookmarkEnd w:id="53"/>
     </w:p>
     <w:p>
       <w:pPr>
         <w:pStyle w:val="Caption"/>
         <w:keepNext/>
       </w:pPr>
-      <w:bookmarkStart w:id="53" w:name="_Toc242916259"/>
+      <w:bookmarkStart w:id="54" w:name="_Toc242917835"/>
       <w:r>
         <w:t xml:space="preserve">Table </w:t>
       </w:r>
@@ -27033,7 +27291,7 @@
       <w:r>
         <w:t>: Requirements and the tables that realise them</w:t>
       </w:r>
-      <w:bookmarkEnd w:id="53"/>
+      <w:bookmarkEnd w:id="54"/>
     </w:p>
     <w:tbl>
       <w:tblPr>
@@ -29163,12 +29421,12 @@
         <w:keepLines/>
         <w:pageBreakBefore/>
       </w:pPr>
-      <w:bookmarkStart w:id="54" w:name="_Toc242916228"/>
+      <w:bookmarkStart w:id="55" w:name="_Toc242917804"/>
       <w:r>
         <w:lastRenderedPageBreak/>
         <w:t>Appendix B: Physical schema (migration 0001)</w:t>
       </w:r>
-      <w:bookmarkEnd w:id="54"/>
+      <w:bookmarkEnd w:id="55"/>
     </w:p>
     <w:p>
       <w:pPr>
@@ -34376,12 +34634,12 @@
         <w:keepLines/>
         <w:pageBreakBefore/>
       </w:pPr>
-      <w:bookmarkStart w:id="55" w:name="_Toc242916229"/>
+      <w:bookmarkStart w:id="56" w:name="_Toc242917805"/>
       <w:r>
         <w:lastRenderedPageBreak/>
         <w:t>Appendix C: Student accounts (migration 0003)</w:t>
       </w:r>
-      <w:bookmarkEnd w:id="55"/>
+      <w:bookmarkEnd w:id="56"/>
     </w:p>
     <w:p>
       <w:pPr>
@@ -36109,12 +36367,12 @@
         <w:keepLines/>
         <w:pageBreakBefore/>
       </w:pPr>
-      <w:bookmarkStart w:id="56" w:name="_Toc242916230"/>
+      <w:bookmarkStart w:id="57" w:name="_Toc242917806"/>
       <w:r>
         <w:lastRenderedPageBreak/>
         <w:t>Appendix D: Contact details (migration 0007)</w:t>
       </w:r>
-      <w:bookmarkEnd w:id="56"/>
+      <w:bookmarkEnd w:id="57"/>
     </w:p>
     <w:p>
       <w:pPr>
@@ -36505,12 +36763,12 @@
         <w:keepLines/>
         <w:pageBreakBefore/>
       </w:pPr>
-      <w:bookmarkStart w:id="57" w:name="_Toc242916231"/>
+      <w:bookmarkStart w:id="58" w:name="_Toc242917807"/>
       <w:r>
         <w:lastRenderedPageBreak/>
         <w:t>Appendix E: Answer feedback (migration 0008)</w:t>
       </w:r>
-      <w:bookmarkEnd w:id="57"/>
+      <w:bookmarkEnd w:id="58"/>
     </w:p>
     <w:p>
       <w:pPr>
@@ -36816,12 +37074,12 @@
         <w:keepLines/>
         <w:pageBreakBefore/>
       </w:pPr>
-      <w:bookmarkStart w:id="58" w:name="_Toc242916232"/>
+      <w:bookmarkStart w:id="59" w:name="_Toc242917808"/>
       <w:r>
         <w:lastRenderedPageBreak/>
         <w:t>Appendix F: Journey, avatars and group rules on the account (migration 0010)</w:t>
       </w:r>
-      <w:bookmarkEnd w:id="58"/>
+      <w:bookmarkEnd w:id="59"/>
     </w:p>
     <w:p>
       <w:pPr>
@@ -41832,12 +42090,12 @@
         <w:keepLines/>
         <w:pageBreakBefore/>
       </w:pPr>
-      <w:bookmarkStart w:id="59" w:name="_Toc242916233"/>
+      <w:bookmarkStart w:id="60" w:name="_Toc242917809"/>
       <w:r>
         <w:lastRenderedPageBreak/>
         <w:t>Appendix G: Demo accounts (migration 0011)</w:t>
       </w:r>
-      <w:bookmarkEnd w:id="59"/>
+      <w:bookmarkEnd w:id="60"/>
     </w:p>
     <w:p>
       <w:pPr>
@@ -42024,12 +42282,12 @@
         <w:keepLines/>
         <w:pageBreakBefore/>
       </w:pPr>
-      <w:bookmarkStart w:id="60" w:name="_Toc242916234"/>
+      <w:bookmarkStart w:id="61" w:name="_Toc242917810"/>
       <w:r>
         <w:lastRenderedPageBreak/>
         <w:t>Appendix H: Group rules (migration 0009)</w:t>
       </w:r>
-      <w:bookmarkEnd w:id="60"/>
+      <w:bookmarkEnd w:id="61"/>
     </w:p>
     <w:p>
       <w:pPr>
@@ -42165,12 +42423,12 @@
         <w:keepLines/>
         <w:pageBreakBefore/>
       </w:pPr>
-      <w:bookmarkStart w:id="61" w:name="_Toc242916235"/>
+      <w:bookmarkStart w:id="62" w:name="_Toc242917811"/>
       <w:r>
         <w:lastRenderedPageBreak/>
         <w:t>Appendix I: Groups (migration 0006)</w:t>
       </w:r>
-      <w:bookmarkEnd w:id="61"/>
+      <w:bookmarkEnd w:id="62"/>
     </w:p>
     <w:p>
       <w:pPr>
@@ -43418,19 +43676,19 @@
         <w:keepLines/>
         <w:pageBreakBefore/>
       </w:pPr>
-      <w:bookmarkStart w:id="62" w:name="_Toc242916236"/>
+      <w:bookmarkStart w:id="63" w:name="_Toc242917812"/>
       <w:r>
         <w:lastRenderedPageBreak/>
         <w:t>Appendix J: Glossary</w:t>
       </w:r>
-      <w:bookmarkEnd w:id="62"/>
+      <w:bookmarkEnd w:id="63"/>
     </w:p>
     <w:p>
       <w:pPr>
         <w:pStyle w:val="Caption"/>
         <w:keepNext/>
       </w:pPr>
-      <w:bookmarkStart w:id="63" w:name="_Toc242916260"/>
+      <w:bookmarkStart w:id="64" w:name="_Toc242917836"/>
       <w:r>
         <w:t xml:space="preserve">Table </w:t>
       </w:r>
@@ -43455,7 +43713,7 @@
       <w:r>
         <w:t>: Terms used in this document</w:t>
       </w:r>
-      <w:bookmarkEnd w:id="63"/>
+      <w:bookmarkEnd w:id="64"/>
     </w:p>
     <w:tbl>
       <w:tblPr>
@@ -44147,19 +44405,19 @@
         <w:keepLines/>
         <w:pageBreakBefore/>
       </w:pPr>
-      <w:bookmarkStart w:id="64" w:name="_Toc242916237"/>
+      <w:bookmarkStart w:id="65" w:name="_Toc242917813"/>
       <w:r>
         <w:lastRenderedPageBreak/>
         <w:t>Appendix K: References</w:t>
       </w:r>
-      <w:bookmarkEnd w:id="64"/>
+      <w:bookmarkEnd w:id="65"/>
     </w:p>
     <w:p>
       <w:pPr>
         <w:pStyle w:val="Caption"/>
         <w:keepNext/>
       </w:pPr>
-      <w:bookmarkStart w:id="65" w:name="_Toc242916261"/>
+      <w:bookmarkStart w:id="66" w:name="_Toc242917837"/>
       <w:r>
         <w:t xml:space="preserve">Table </w:t>
       </w:r>
@@ -44184,7 +44442,7 @@
       <w:r>
         <w:t>: Sources referred to in this document</w:t>
       </w:r>
-      <w:bookmarkEnd w:id="65"/>
+      <w:bookmarkEnd w:id="66"/>
     </w:p>
     <w:tbl>
       <w:tblPr>
@@ -45090,72 +45348,72 @@
 <file path=word/numbering.xml><?xml version="1.0" encoding="utf-8"?>
 <w:numbering xmlns:wpc="http://schemas.microsoft.com/office/word/2010/wordprocessingCanvas" xmlns:cx="http://schemas.microsoft.com/office/drawing/2014/chartex" xmlns:cx1="http://schemas.microsoft.com/office/drawing/2015/9/8/chartex" xmlns:cx2="http://schemas.microsoft.com/office/drawing/2015/10/21/chartex" xmlns:cx3="http://schemas.microsoft.com/office/drawing/2016/5/9/chartex" xmlns:cx4="http://schemas.microsoft.com/office/drawing/2016/5/10/chartex" xmlns:cx5="http://schemas.microsoft.com/office/drawing/2016/5/11/chartex" xmlns:cx6="http://schemas.microsoft.com/office/drawing/2016/5/12/chartex" xmlns:cx7="http://schemas.microsoft.com/office/drawing/2016/5/13/chartex" xmlns:cx8="http://schemas.microsoft.com/office/drawing/2016/5/14/chartex" xmlns:mc="http://schemas.openxmlformats.org/markup-compatibility/2006" xmlns:aink="http://schemas.microsoft.com/office/drawing/2016/ink" xmlns:am3d="http://schemas.microsoft.com/office/drawing/2017/model3d" xmlns:o="urn:schemas-microsoft-com:office:office" xmlns:oel="http://schemas.microsoft.com/office/2019/extlst" xmlns:r="http://schemas.openxmlformats.org/officeDocument/2006/relationships" xmlns:m="http://schemas.openxmlformats.org/officeDocument/2006/math" xmlns:v="urn:schemas-microsoft-com:vml" xmlns:wp14="http://schemas.microsoft.com/office/word/2010/wordprocessingDrawing" xmlns:wp="http://schemas.openxmlformats.org/drawingml/2006/wordprocessingDrawing" xmlns:w10="urn:schemas-microsoft-com:office:word" xmlns:w="http://schemas.openxmlformats.org/wordprocessingml/2006/main" xmlns:w14="http://schemas.microsoft.com/office/word/2010/wordml" xmlns:w15="http://schemas.microsoft.com/office/word/2012/wordml" xmlns:w16cex="http://schemas.microsoft.com/office/word/2018/wordml/cex" xmlns:w16cid="http://schemas.microsoft.com/office/word/2016/wordml/cid" xmlns:w16="http://schemas.microsoft.com/office/word/2018/wordml" xmlns:w16du="http://schemas.microsoft.com/office/word/2023/wordml/word16du" xmlns:w16sdtdh="http://schemas.microsoft.com/office/word/2020/wordml/sdtdatahash" xmlns:w16sdtfl="http://schemas.microsoft.com/office/word/2024/wordml/sdtformatlock" xmlns:w16se="http://schemas.microsoft.com/office/word/2015/wordml/symex" xmlns:wpg="http://schemas.microsoft.com/office/word/2010/wordprocessingGroup" xmlns:wpi="http://schemas.microsoft.com/office/word/2010/wordprocessingInk" xmlns:wne="http://schemas.microsoft.com/office/word/2006/wordml" xmlns:wps="http://schemas.microsoft.com/office/word/2010/wordprocessingShape" mc:Ignorable="w14 w15 w16se w16cid w16 w16cex w16sdtdh w16sdtfl w16du wp14">
   <w:abstractNum w:abstractNumId="0" w15:restartNumberingAfterBreak="0">
-    <w:nsid w:val="1D493F9E"/>
+    <w:nsid w:val="020F21CC"/>
     <w:multiLevelType w:val="hybridMultilevel"/>
-    <w:tmpl w:val="996E78C2"/>
-    <w:lvl w:ilvl="0" w:tplc="0A4C57F4">
+    <w:tmpl w:val="B4DAC41E"/>
+    <w:lvl w:ilvl="0" w:tplc="61F4384A" w:tentative="1">
       <w:start w:val="1"/>
-      <w:numFmt w:val="bullet"/>
-      <w:lvlText w:val="•"/>
+      <w:numFmt w:val="decimal"/>
+      <w:lvlText w:val="%1."/>
       <w:lvlJc w:val="left"/>
       <w:pPr>
-        <w:ind w:left="720" w:hanging="280"/>
+        <w:ind w:left="720" w:hanging="360"/>
       </w:pPr>
     </w:lvl>
-    <w:lvl w:ilvl="1" w:tplc="8AFA058E" w:tentative="1">
+    <w:lvl w:ilvl="1" w:tplc="D0CE0194" w:tentative="1">
       <w:start w:val="1"/>
-      <w:numFmt w:val="bullet"/>
-      <w:lvlText w:val="–"/>
+      <w:numFmt w:val="lowerLetter"/>
+      <w:lvlText w:val="%2."/>
       <w:lvlJc w:val="left"/>
       <w:pPr>
-        <w:ind w:left="1080" w:hanging="280"/>
+        <w:ind w:left="1080" w:hanging="360"/>
       </w:pPr>
     </w:lvl>
-    <w:lvl w:ilvl="2" w:tplc="84D08FF6" w:tentative="1">
+    <w:lvl w:ilvl="2" w:tplc="CDFEFFD0" w:tentative="1">
       <w:start w:val="1"/>
-      <w:numFmt w:val="bullet"/>
-      <w:lvlText w:val="▪"/>
+      <w:numFmt w:val="lowerRoman"/>
+      <w:lvlText w:val="%3."/>
       <w:lvlJc w:val="left"/>
       <w:pPr>
-        <w:ind w:left="1440" w:hanging="280"/>
+        <w:ind w:left="1440" w:hanging="360"/>
       </w:pPr>
     </w:lvl>
-    <w:lvl w:ilvl="3" w:tplc="7812BBB8">
+    <w:lvl w:ilvl="3" w:tplc="9D683B78">
       <w:numFmt w:val="decimal"/>
       <w:lvlText w:val=""/>
       <w:lvlJc w:val="left"/>
     </w:lvl>
-    <w:lvl w:ilvl="4" w:tplc="F81252A0">
+    <w:lvl w:ilvl="4" w:tplc="C6C2B9EA">
       <w:numFmt w:val="decimal"/>
       <w:lvlText w:val=""/>
       <w:lvlJc w:val="left"/>
     </w:lvl>
-    <w:lvl w:ilvl="5" w:tplc="37865A16">
+    <w:lvl w:ilvl="5" w:tplc="DAC8D5CE">
       <w:numFmt w:val="decimal"/>
       <w:lvlText w:val=""/>
       <w:lvlJc w:val="left"/>
     </w:lvl>
-    <w:lvl w:ilvl="6" w:tplc="5A340124">
+    <w:lvl w:ilvl="6" w:tplc="FBB0245C">
       <w:numFmt w:val="decimal"/>
       <w:lvlText w:val=""/>
       <w:lvlJc w:val="left"/>
     </w:lvl>
-    <w:lvl w:ilvl="7" w:tplc="2DDA9276">
+    <w:lvl w:ilvl="7" w:tplc="34700972">
       <w:numFmt w:val="decimal"/>
       <w:lvlText w:val=""/>
       <w:lvlJc w:val="left"/>
     </w:lvl>
-    <w:lvl w:ilvl="8" w:tplc="3EE2CA5E">
+    <w:lvl w:ilvl="8" w:tplc="9A1A4AB6">
       <w:numFmt w:val="decimal"/>
       <w:lvlText w:val=""/>
       <w:lvlJc w:val="left"/>
     </w:lvl>
   </w:abstractNum>
   <w:abstractNum w:abstractNumId="1" w15:restartNumberingAfterBreak="0">
-    <w:nsid w:val="4F774567"/>
+    <w:nsid w:val="29BB2693"/>
     <w:multiLevelType w:val="hybridMultilevel"/>
-    <w:tmpl w:val="BE66E6A2"/>
-    <w:lvl w:ilvl="0" w:tplc="9202B968" w:tentative="1">
+    <w:tmpl w:val="2D8480CC"/>
+    <w:lvl w:ilvl="0" w:tplc="700ACD36" w:tentative="1">
       <w:start w:val="1"/>
       <w:numFmt w:val="bullet"/>
       <w:lvlText w:val="●"/>
@@ -45164,7 +45422,7 @@
         <w:ind w:left="720" w:hanging="360"/>
       </w:pPr>
     </w:lvl>
-    <w:lvl w:ilvl="1" w:tplc="5D3E96CA" w:tentative="1">
+    <w:lvl w:ilvl="1" w:tplc="0C9AD4AC" w:tentative="1">
       <w:start w:val="1"/>
       <w:numFmt w:val="bullet"/>
       <w:lvlText w:val="○"/>
@@ -45173,7 +45431,7 @@
         <w:ind w:left="1440" w:hanging="360"/>
       </w:pPr>
     </w:lvl>
-    <w:lvl w:ilvl="2" w:tplc="35BCBE60" w:tentative="1">
+    <w:lvl w:ilvl="2" w:tplc="500C6F4E" w:tentative="1">
       <w:start w:val="1"/>
       <w:numFmt w:val="bullet"/>
       <w:lvlText w:val="■"/>
@@ -45182,7 +45440,7 @@
         <w:ind w:left="2160" w:hanging="360"/>
       </w:pPr>
     </w:lvl>
-    <w:lvl w:ilvl="3" w:tplc="1270BAEE" w:tentative="1">
+    <w:lvl w:ilvl="3" w:tplc="6D4A137C" w:tentative="1">
       <w:start w:val="1"/>
       <w:numFmt w:val="bullet"/>
       <w:lvlText w:val="●"/>
@@ -45191,7 +45449,7 @@
         <w:ind w:left="2880" w:hanging="360"/>
       </w:pPr>
     </w:lvl>
-    <w:lvl w:ilvl="4" w:tplc="C8DE948C" w:tentative="1">
+    <w:lvl w:ilvl="4" w:tplc="BE4CDA9C" w:tentative="1">
       <w:start w:val="1"/>
       <w:numFmt w:val="bullet"/>
       <w:lvlText w:val="○"/>
@@ -45200,7 +45458,7 @@
         <w:ind w:left="3600" w:hanging="360"/>
       </w:pPr>
     </w:lvl>
-    <w:lvl w:ilvl="5" w:tplc="36C2FC6E" w:tentative="1">
+    <w:lvl w:ilvl="5" w:tplc="1E52A216" w:tentative="1">
       <w:start w:val="1"/>
       <w:numFmt w:val="bullet"/>
       <w:lvlText w:val="■"/>
@@ -45209,7 +45467,7 @@
         <w:ind w:left="4320" w:hanging="360"/>
       </w:pPr>
     </w:lvl>
-    <w:lvl w:ilvl="6" w:tplc="AA82D828" w:tentative="1">
+    <w:lvl w:ilvl="6" w:tplc="B144F910" w:tentative="1">
       <w:start w:val="1"/>
       <w:numFmt w:val="bullet"/>
       <w:lvlText w:val="●"/>
@@ -45218,7 +45476,7 @@
         <w:ind w:left="5040" w:hanging="360"/>
       </w:pPr>
     </w:lvl>
-    <w:lvl w:ilvl="7" w:tplc="070EF794" w:tentative="1">
+    <w:lvl w:ilvl="7" w:tplc="A10CD95E" w:tentative="1">
       <w:start w:val="1"/>
       <w:numFmt w:val="bullet"/>
       <w:lvlText w:val="●"/>
@@ -45227,7 +45485,7 @@
         <w:ind w:left="5760" w:hanging="360"/>
       </w:pPr>
     </w:lvl>
-    <w:lvl w:ilvl="8" w:tplc="8AD6B5C2" w:tentative="1">
+    <w:lvl w:ilvl="8" w:tplc="73EECDD2" w:tentative="1">
       <w:start w:val="1"/>
       <w:numFmt w:val="bullet"/>
       <w:lvlText w:val="●"/>
@@ -45238,81 +45496,81 @@
     </w:lvl>
   </w:abstractNum>
   <w:abstractNum w:abstractNumId="2" w15:restartNumberingAfterBreak="0">
-    <w:nsid w:val="6CEA2C23"/>
+    <w:nsid w:val="3DA937CF"/>
     <w:multiLevelType w:val="hybridMultilevel"/>
-    <w:tmpl w:val="01CE871C"/>
-    <w:lvl w:ilvl="0" w:tplc="AA867054" w:tentative="1">
+    <w:tmpl w:val="72B290D8"/>
+    <w:lvl w:ilvl="0" w:tplc="50ECF862">
       <w:start w:val="1"/>
-      <w:numFmt w:val="decimal"/>
-      <w:lvlText w:val="%1."/>
+      <w:numFmt w:val="bullet"/>
+      <w:lvlText w:val="•"/>
       <w:lvlJc w:val="left"/>
       <w:pPr>
-        <w:ind w:left="720" w:hanging="360"/>
+        <w:ind w:left="720" w:hanging="280"/>
       </w:pPr>
     </w:lvl>
-    <w:lvl w:ilvl="1" w:tplc="B0BC9064" w:tentative="1">
+    <w:lvl w:ilvl="1" w:tplc="847AB45E" w:tentative="1">
       <w:start w:val="1"/>
-      <w:numFmt w:val="lowerLetter"/>
-      <w:lvlText w:val="%2."/>
+      <w:numFmt w:val="bullet"/>
+      <w:lvlText w:val="–"/>
       <w:lvlJc w:val="left"/>
       <w:pPr>
-        <w:ind w:left="1080" w:hanging="360"/>
+        <w:ind w:left="1080" w:hanging="280"/>
       </w:pPr>
     </w:lvl>
-    <w:lvl w:ilvl="2" w:tplc="BA502B6A" w:tentative="1">
+    <w:lvl w:ilvl="2" w:tplc="2BBE5E1C" w:tentative="1">
       <w:start w:val="1"/>
-      <w:numFmt w:val="lowerRoman"/>
-      <w:lvlText w:val="%3."/>
+      <w:numFmt w:val="bullet"/>
+      <w:lvlText w:val="▪"/>
       <w:lvlJc w:val="left"/>
       <w:pPr>
-        <w:ind w:left="1440" w:hanging="360"/>
+        <w:ind w:left="1440" w:hanging="280"/>
       </w:pPr>
     </w:lvl>
-    <w:lvl w:ilvl="3" w:tplc="E8F21C40">
+    <w:lvl w:ilvl="3" w:tplc="BA04D40A">
       <w:numFmt w:val="decimal"/>
       <w:lvlText w:val=""/>
       <w:lvlJc w:val="left"/>
     </w:lvl>
-    <w:lvl w:ilvl="4" w:tplc="49B63F52">
+    <w:lvl w:ilvl="4" w:tplc="0B681AAE">
       <w:numFmt w:val="decimal"/>
       <w:lvlText w:val=""/>
       <w:lvlJc w:val="left"/>
     </w:lvl>
-    <w:lvl w:ilvl="5" w:tplc="7FE2A282">
+    <w:lvl w:ilvl="5" w:tplc="FF68E316">
       <w:numFmt w:val="decimal"/>
       <w:lvlText w:val=""/>
       <w:lvlJc w:val="left"/>
     </w:lvl>
-    <w:lvl w:ilvl="6" w:tplc="00BA3FF6">
+    <w:lvl w:ilvl="6" w:tplc="73BA21B8">
       <w:numFmt w:val="decimal"/>
       <w:lvlText w:val=""/>
       <w:lvlJc w:val="left"/>
     </w:lvl>
-    <w:lvl w:ilvl="7" w:tplc="139CCBFE">
+    <w:lvl w:ilvl="7" w:tplc="1B341112">
       <w:numFmt w:val="decimal"/>
       <w:lvlText w:val=""/>
       <w:lvlJc w:val="left"/>
     </w:lvl>
-    <w:lvl w:ilvl="8" w:tplc="4E046D90">
+    <w:lvl w:ilvl="8" w:tplc="3B00CA08">
       <w:numFmt w:val="decimal"/>
       <w:lvlText w:val=""/>
       <w:lvlJc w:val="left"/>
     </w:lvl>
   </w:abstractNum>
-  <w:num w:numId="1" w16cid:durableId="1461655733">
+  <w:num w:numId="1" w16cid:durableId="815072780">
     <w:abstractNumId w:val="1"/>
     <w:lvlOverride w:ilvl="0">
       <w:startOverride w:val="1"/>
     </w:lvlOverride>
   </w:num>
-  <w:num w:numId="2" w16cid:durableId="1763722626">
-    <w:abstractNumId w:val="0"/>
+  <w:num w:numId="2" w16cid:durableId="629282626">
+    <w:abstractNumId w:val="2"/>
     <w:lvlOverride w:ilvl="0">
       <w:startOverride w:val="1"/>
     </w:lvlOverride>
   </w:num>
-  <w:num w:numId="3" w16cid:durableId="1140852244">
-    <w:abstractNumId w:val="0"/>
+  <w:num w:numId="3" w16cid:durableId="1872567732">
+    <w:abstractNumId w:val="2"/>
     <w:lvlOverride w:ilvl="0">
       <w:startOverride w:val="1"/>
     </w:lvlOverride>
@@ -46016,7 +46274,7 @@
     <w:autoRedefine/>
     <w:uiPriority w:val="39"/>
     <w:unhideWhenUsed/>
-    <w:rsid w:val="002E2BC7"/>
+    <w:rsid w:val="000A20AF"/>
     <w:pPr>
       <w:spacing w:after="100"/>
     </w:pPr>
@@ -46028,7 +46286,7 @@
     <w:autoRedefine/>
     <w:uiPriority w:val="39"/>
     <w:unhideWhenUsed/>
-    <w:rsid w:val="002E2BC7"/>
+    <w:rsid w:val="000A20AF"/>
     <w:pPr>
       <w:spacing w:after="100"/>
       <w:ind w:left="210"/>
@@ -46040,7 +46298,7 @@
     <w:next w:val="Normal"/>
     <w:uiPriority w:val="99"/>
     <w:unhideWhenUsed/>
-    <w:rsid w:val="002E2BC7"/>
+    <w:rsid w:val="000A20AF"/>
   </w:style>
 </w:styles>
 </file>

</xml_diff>

<commit_message>
Hardening (audit run-1): account deletion purges every room the account opened, via GROUP_ROOM_SEEN (migration 0012, lead 3); local data tagged with its owner so the next student on a phone never inherits it (7); a failed log-out is shown instead of ignored (6); D-12 list storage reads wrong-shaped data as empty; ZP-DOC-05 updated; no expected-fail tests remain (532 pass)
Co-Authored-By: Claude Opus 5.5 (1M context) <noreply@anthropic.com>
</commit_message>
<xml_diff>
--- a/docs/05-data-design/ZP-DOC-05_Data-Design.docx
+++ b/docs/05-data-design/ZP-DOC-05_Data-Design.docx
@@ -2373,6 +2373,122 @@
           </w:p>
         </w:tc>
       </w:tr>
+      <w:tr>
+        <w:tblPrEx>
+          <w:tblCellMar>
+            <w:top w:w="0" w:type="dxa"/>
+            <w:bottom w:w="0" w:type="dxa"/>
+          </w:tblCellMar>
+        </w:tblPrEx>
+        <w:trPr>
+          <w:cantSplit/>
+          <w:trHeight w:val="420"/>
+        </w:trPr>
+        <w:tc>
+          <w:tcPr>
+            <w:tcW w:w="964" w:type="dxa"/>
+            <w:tcBorders>
+              <w:top w:val="single" w:sz="4" w:space="0" w:color="C9D3D0"/>
+              <w:left w:val="single" w:sz="4" w:space="0" w:color="C9D3D0"/>
+              <w:bottom w:val="single" w:sz="4" w:space="0" w:color="C9D3D0"/>
+              <w:right w:val="single" w:sz="4" w:space="0" w:color="C9D3D0"/>
+            </w:tcBorders>
+            <w:tcMar>
+              <w:top w:w="50" w:type="dxa"/>
+              <w:left w:w="100" w:type="dxa"/>
+              <w:bottom w:w="50" w:type="dxa"/>
+              <w:right w:w="100" w:type="dxa"/>
+            </w:tcMar>
+          </w:tcPr>
+          <w:p>
+            <w:r>
+              <w:rPr>
+                <w:sz w:val="19"/>
+                <w:szCs w:val="19"/>
+              </w:rPr>
+              <w:t>0.9</w:t>
+            </w:r>
+          </w:p>
+        </w:tc>
+        <w:tc>
+          <w:tcPr>
+            <w:tcW w:w="1542" w:type="dxa"/>
+            <w:tcBorders>
+              <w:top w:val="single" w:sz="4" w:space="0" w:color="C9D3D0"/>
+              <w:left w:val="single" w:sz="4" w:space="0" w:color="C9D3D0"/>
+              <w:bottom w:val="single" w:sz="4" w:space="0" w:color="C9D3D0"/>
+              <w:right w:val="single" w:sz="4" w:space="0" w:color="C9D3D0"/>
+            </w:tcBorders>
+            <w:tcMar>
+              <w:top w:w="50" w:type="dxa"/>
+              <w:left w:w="100" w:type="dxa"/>
+              <w:bottom w:w="50" w:type="dxa"/>
+              <w:right w:w="100" w:type="dxa"/>
+            </w:tcMar>
+          </w:tcPr>
+          <w:p>
+            <w:r>
+              <w:rPr>
+                <w:sz w:val="19"/>
+                <w:szCs w:val="19"/>
+              </w:rPr>
+              <w:t>15 Oct 2026</w:t>
+            </w:r>
+          </w:p>
+        </w:tc>
+        <w:tc>
+          <w:tcPr>
+            <w:tcW w:w="1928" w:type="dxa"/>
+            <w:tcBorders>
+              <w:top w:val="single" w:sz="4" w:space="0" w:color="C9D3D0"/>
+              <w:left w:val="single" w:sz="4" w:space="0" w:color="C9D3D0"/>
+              <w:bottom w:val="single" w:sz="4" w:space="0" w:color="C9D3D0"/>
+              <w:right w:val="single" w:sz="4" w:space="0" w:color="C9D3D0"/>
+            </w:tcBorders>
+            <w:tcMar>
+              <w:top w:w="50" w:type="dxa"/>
+              <w:left w:w="100" w:type="dxa"/>
+              <w:bottom w:w="50" w:type="dxa"/>
+              <w:right w:w="100" w:type="dxa"/>
+            </w:tcMar>
+          </w:tcPr>
+          <w:p>
+            <w:r>
+              <w:rPr>
+                <w:sz w:val="19"/>
+                <w:szCs w:val="19"/>
+              </w:rPr>
+              <w:t>Team Kestrel</w:t>
+            </w:r>
+          </w:p>
+        </w:tc>
+        <w:tc>
+          <w:tcPr>
+            <w:tcW w:w="5204" w:type="dxa"/>
+            <w:tcBorders>
+              <w:top w:val="single" w:sz="4" w:space="0" w:color="C9D3D0"/>
+              <w:left w:val="single" w:sz="4" w:space="0" w:color="C9D3D0"/>
+              <w:bottom w:val="single" w:sz="4" w:space="0" w:color="C9D3D0"/>
+              <w:right w:val="single" w:sz="4" w:space="0" w:color="C9D3D0"/>
+            </w:tcBorders>
+            <w:tcMar>
+              <w:top w:w="50" w:type="dxa"/>
+              <w:left w:w="100" w:type="dxa"/>
+              <w:bottom w:w="50" w:type="dxa"/>
+              <w:right w:w="100" w:type="dxa"/>
+            </w:tcMar>
+          </w:tcPr>
+          <w:p>
+            <w:r>
+              <w:rPr>
+                <w:sz w:val="19"/>
+                <w:szCs w:val="19"/>
+              </w:rPr>
+              <w:t>Security audit run-1 lead 3: GROUP_ROOM_SEEN (rooms an account opened) so account deletion purges every room; migration 0012</w:t>
+            </w:r>
+          </w:p>
+        </w:tc>
+      </w:tr>
     </w:tbl>
     <w:p>
       <w:pPr>
@@ -2772,7 +2888,7 @@
     <w:sdt>
       <w:sdtPr>
         <w:alias w:val="Contents"/>
-        <w:id w:val="1139996147"/>
+        <w:id w:val="-519778592"/>
       </w:sdtPr>
       <w:sdtEndPr/>
       <w:sdtContent>
@@ -2801,7 +2917,7 @@
           <w:r>
             <w:fldChar w:fldCharType="separate"/>
           </w:r>
-          <w:hyperlink w:anchor="_Toc242917771" w:history="1">
+          <w:hyperlink w:anchor="_Toc242919515" w:history="1">
             <w:r>
               <w:rPr>
                 <w:rStyle w:val="Hyperlink"/>
@@ -2825,7 +2941,7 @@
               <w:rPr>
                 <w:noProof/>
               </w:rPr>
-              <w:instrText xml:space="preserve"> PAGEREF _Toc242917771 \h </w:instrText>
+              <w:instrText xml:space="preserve"> PAGEREF _Toc242919515 \h </w:instrText>
             </w:r>
             <w:r>
               <w:rPr>
@@ -2868,7 +2984,7 @@
               <w14:ligatures w14:val="standardContextual"/>
             </w:rPr>
           </w:pPr>
-          <w:hyperlink w:anchor="_Toc242917772" w:history="1">
+          <w:hyperlink w:anchor="_Toc242919516" w:history="1">
             <w:r>
               <w:rPr>
                 <w:rStyle w:val="Hyperlink"/>
@@ -2892,7 +3008,7 @@
               <w:rPr>
                 <w:noProof/>
               </w:rPr>
-              <w:instrText xml:space="preserve"> PAGEREF _Toc242917772 \h </w:instrText>
+              <w:instrText xml:space="preserve"> PAGEREF _Toc242919516 \h </w:instrText>
             </w:r>
             <w:r>
               <w:rPr>
@@ -2935,7 +3051,7 @@
               <w14:ligatures w14:val="standardContextual"/>
             </w:rPr>
           </w:pPr>
-          <w:hyperlink w:anchor="_Toc242917773" w:history="1">
+          <w:hyperlink w:anchor="_Toc242919517" w:history="1">
             <w:r>
               <w:rPr>
                 <w:rStyle w:val="Hyperlink"/>
@@ -2959,7 +3075,7 @@
               <w:rPr>
                 <w:noProof/>
               </w:rPr>
-              <w:instrText xml:space="preserve"> PAGEREF _Toc242917773 \h </w:instrText>
+              <w:instrText xml:space="preserve"> PAGEREF _Toc242919517 \h </w:instrText>
             </w:r>
             <w:r>
               <w:rPr>
@@ -3002,7 +3118,7 @@
               <w14:ligatures w14:val="standardContextual"/>
             </w:rPr>
           </w:pPr>
-          <w:hyperlink w:anchor="_Toc242917774" w:history="1">
+          <w:hyperlink w:anchor="_Toc242919518" w:history="1">
             <w:r>
               <w:rPr>
                 <w:rStyle w:val="Hyperlink"/>
@@ -3026,7 +3142,7 @@
               <w:rPr>
                 <w:noProof/>
               </w:rPr>
-              <w:instrText xml:space="preserve"> PAGEREF _Toc242917774 \h </w:instrText>
+              <w:instrText xml:space="preserve"> PAGEREF _Toc242919518 \h </w:instrText>
             </w:r>
             <w:r>
               <w:rPr>
@@ -3069,7 +3185,7 @@
               <w14:ligatures w14:val="standardContextual"/>
             </w:rPr>
           </w:pPr>
-          <w:hyperlink w:anchor="_Toc242917775" w:history="1">
+          <w:hyperlink w:anchor="_Toc242919519" w:history="1">
             <w:r>
               <w:rPr>
                 <w:rStyle w:val="Hyperlink"/>
@@ -3093,7 +3209,7 @@
               <w:rPr>
                 <w:noProof/>
               </w:rPr>
-              <w:instrText xml:space="preserve"> PAGEREF _Toc242917775 \h </w:instrText>
+              <w:instrText xml:space="preserve"> PAGEREF _Toc242919519 \h </w:instrText>
             </w:r>
             <w:r>
               <w:rPr>
@@ -3136,7 +3252,7 @@
               <w14:ligatures w14:val="standardContextual"/>
             </w:rPr>
           </w:pPr>
-          <w:hyperlink w:anchor="_Toc242917776" w:history="1">
+          <w:hyperlink w:anchor="_Toc242919520" w:history="1">
             <w:r>
               <w:rPr>
                 <w:rStyle w:val="Hyperlink"/>
@@ -3160,7 +3276,7 @@
               <w:rPr>
                 <w:noProof/>
               </w:rPr>
-              <w:instrText xml:space="preserve"> PAGEREF _Toc242917776 \h </w:instrText>
+              <w:instrText xml:space="preserve"> PAGEREF _Toc242919520 \h </w:instrText>
             </w:r>
             <w:r>
               <w:rPr>
@@ -3203,7 +3319,7 @@
               <w14:ligatures w14:val="standardContextual"/>
             </w:rPr>
           </w:pPr>
-          <w:hyperlink w:anchor="_Toc242917777" w:history="1">
+          <w:hyperlink w:anchor="_Toc242919521" w:history="1">
             <w:r>
               <w:rPr>
                 <w:rStyle w:val="Hyperlink"/>
@@ -3227,7 +3343,7 @@
               <w:rPr>
                 <w:noProof/>
               </w:rPr>
-              <w:instrText xml:space="preserve"> PAGEREF _Toc242917777 \h </w:instrText>
+              <w:instrText xml:space="preserve"> PAGEREF _Toc242919521 \h </w:instrText>
             </w:r>
             <w:r>
               <w:rPr>
@@ -3270,7 +3386,7 @@
               <w14:ligatures w14:val="standardContextual"/>
             </w:rPr>
           </w:pPr>
-          <w:hyperlink w:anchor="_Toc242917778" w:history="1">
+          <w:hyperlink w:anchor="_Toc242919522" w:history="1">
             <w:r>
               <w:rPr>
                 <w:rStyle w:val="Hyperlink"/>
@@ -3294,7 +3410,7 @@
               <w:rPr>
                 <w:noProof/>
               </w:rPr>
-              <w:instrText xml:space="preserve"> PAGEREF _Toc242917778 \h </w:instrText>
+              <w:instrText xml:space="preserve"> PAGEREF _Toc242919522 \h </w:instrText>
             </w:r>
             <w:r>
               <w:rPr>
@@ -3337,7 +3453,7 @@
               <w14:ligatures w14:val="standardContextual"/>
             </w:rPr>
           </w:pPr>
-          <w:hyperlink w:anchor="_Toc242917779" w:history="1">
+          <w:hyperlink w:anchor="_Toc242919523" w:history="1">
             <w:r>
               <w:rPr>
                 <w:rStyle w:val="Hyperlink"/>
@@ -3361,7 +3477,7 @@
               <w:rPr>
                 <w:noProof/>
               </w:rPr>
-              <w:instrText xml:space="preserve"> PAGEREF _Toc242917779 \h </w:instrText>
+              <w:instrText xml:space="preserve"> PAGEREF _Toc242919523 \h </w:instrText>
             </w:r>
             <w:r>
               <w:rPr>
@@ -3404,7 +3520,7 @@
               <w14:ligatures w14:val="standardContextual"/>
             </w:rPr>
           </w:pPr>
-          <w:hyperlink w:anchor="_Toc242917780" w:history="1">
+          <w:hyperlink w:anchor="_Toc242919524" w:history="1">
             <w:r>
               <w:rPr>
                 <w:rStyle w:val="Hyperlink"/>
@@ -3428,7 +3544,7 @@
               <w:rPr>
                 <w:noProof/>
               </w:rPr>
-              <w:instrText xml:space="preserve"> PAGEREF _Toc242917780 \h </w:instrText>
+              <w:instrText xml:space="preserve"> PAGEREF _Toc242919524 \h </w:instrText>
             </w:r>
             <w:r>
               <w:rPr>
@@ -3471,7 +3587,7 @@
               <w14:ligatures w14:val="standardContextual"/>
             </w:rPr>
           </w:pPr>
-          <w:hyperlink w:anchor="_Toc242917781" w:history="1">
+          <w:hyperlink w:anchor="_Toc242919525" w:history="1">
             <w:r>
               <w:rPr>
                 <w:rStyle w:val="Hyperlink"/>
@@ -3495,7 +3611,7 @@
               <w:rPr>
                 <w:noProof/>
               </w:rPr>
-              <w:instrText xml:space="preserve"> PAGEREF _Toc242917781 \h </w:instrText>
+              <w:instrText xml:space="preserve"> PAGEREF _Toc242919525 \h </w:instrText>
             </w:r>
             <w:r>
               <w:rPr>
@@ -3538,7 +3654,7 @@
               <w14:ligatures w14:val="standardContextual"/>
             </w:rPr>
           </w:pPr>
-          <w:hyperlink w:anchor="_Toc242917782" w:history="1">
+          <w:hyperlink w:anchor="_Toc242919526" w:history="1">
             <w:r>
               <w:rPr>
                 <w:rStyle w:val="Hyperlink"/>
@@ -3562,7 +3678,7 @@
               <w:rPr>
                 <w:noProof/>
               </w:rPr>
-              <w:instrText xml:space="preserve"> PAGEREF _Toc242917782 \h </w:instrText>
+              <w:instrText xml:space="preserve"> PAGEREF _Toc242919526 \h </w:instrText>
             </w:r>
             <w:r>
               <w:rPr>
@@ -3605,7 +3721,7 @@
               <w14:ligatures w14:val="standardContextual"/>
             </w:rPr>
           </w:pPr>
-          <w:hyperlink w:anchor="_Toc242917783" w:history="1">
+          <w:hyperlink w:anchor="_Toc242919527" w:history="1">
             <w:r>
               <w:rPr>
                 <w:rStyle w:val="Hyperlink"/>
@@ -3629,7 +3745,7 @@
               <w:rPr>
                 <w:noProof/>
               </w:rPr>
-              <w:instrText xml:space="preserve"> PAGEREF _Toc242917783 \h </w:instrText>
+              <w:instrText xml:space="preserve"> PAGEREF _Toc242919527 \h </w:instrText>
             </w:r>
             <w:r>
               <w:rPr>
@@ -3672,7 +3788,7 @@
               <w14:ligatures w14:val="standardContextual"/>
             </w:rPr>
           </w:pPr>
-          <w:hyperlink w:anchor="_Toc242917784" w:history="1">
+          <w:hyperlink w:anchor="_Toc242919528" w:history="1">
             <w:r>
               <w:rPr>
                 <w:rStyle w:val="Hyperlink"/>
@@ -3696,7 +3812,7 @@
               <w:rPr>
                 <w:noProof/>
               </w:rPr>
-              <w:instrText xml:space="preserve"> PAGEREF _Toc242917784 \h </w:instrText>
+              <w:instrText xml:space="preserve"> PAGEREF _Toc242919528 \h </w:instrText>
             </w:r>
             <w:r>
               <w:rPr>
@@ -3739,7 +3855,7 @@
               <w14:ligatures w14:val="standardContextual"/>
             </w:rPr>
           </w:pPr>
-          <w:hyperlink w:anchor="_Toc242917785" w:history="1">
+          <w:hyperlink w:anchor="_Toc242919529" w:history="1">
             <w:r>
               <w:rPr>
                 <w:rStyle w:val="Hyperlink"/>
@@ -3763,7 +3879,7 @@
               <w:rPr>
                 <w:noProof/>
               </w:rPr>
-              <w:instrText xml:space="preserve"> PAGEREF _Toc242917785 \h </w:instrText>
+              <w:instrText xml:space="preserve"> PAGEREF _Toc242919529 \h </w:instrText>
             </w:r>
             <w:r>
               <w:rPr>
@@ -3806,7 +3922,7 @@
               <w14:ligatures w14:val="standardContextual"/>
             </w:rPr>
           </w:pPr>
-          <w:hyperlink w:anchor="_Toc242917786" w:history="1">
+          <w:hyperlink w:anchor="_Toc242919530" w:history="1">
             <w:r>
               <w:rPr>
                 <w:rStyle w:val="Hyperlink"/>
@@ -3830,7 +3946,7 @@
               <w:rPr>
                 <w:noProof/>
               </w:rPr>
-              <w:instrText xml:space="preserve"> PAGEREF _Toc242917786 \h </w:instrText>
+              <w:instrText xml:space="preserve"> PAGEREF _Toc242919530 \h </w:instrText>
             </w:r>
             <w:r>
               <w:rPr>
@@ -3873,7 +3989,7 @@
               <w14:ligatures w14:val="standardContextual"/>
             </w:rPr>
           </w:pPr>
-          <w:hyperlink w:anchor="_Toc242917787" w:history="1">
+          <w:hyperlink w:anchor="_Toc242919531" w:history="1">
             <w:r>
               <w:rPr>
                 <w:rStyle w:val="Hyperlink"/>
@@ -3897,7 +4013,7 @@
               <w:rPr>
                 <w:noProof/>
               </w:rPr>
-              <w:instrText xml:space="preserve"> PAGEREF _Toc242917787 \h </w:instrText>
+              <w:instrText xml:space="preserve"> PAGEREF _Toc242919531 \h </w:instrText>
             </w:r>
             <w:r>
               <w:rPr>
@@ -3940,7 +4056,7 @@
               <w14:ligatures w14:val="standardContextual"/>
             </w:rPr>
           </w:pPr>
-          <w:hyperlink w:anchor="_Toc242917788" w:history="1">
+          <w:hyperlink w:anchor="_Toc242919532" w:history="1">
             <w:r>
               <w:rPr>
                 <w:rStyle w:val="Hyperlink"/>
@@ -3964,7 +4080,7 @@
               <w:rPr>
                 <w:noProof/>
               </w:rPr>
-              <w:instrText xml:space="preserve"> PAGEREF _Toc242917788 \h </w:instrText>
+              <w:instrText xml:space="preserve"> PAGEREF _Toc242919532 \h </w:instrText>
             </w:r>
             <w:r>
               <w:rPr>
@@ -4007,7 +4123,7 @@
               <w14:ligatures w14:val="standardContextual"/>
             </w:rPr>
           </w:pPr>
-          <w:hyperlink w:anchor="_Toc242917789" w:history="1">
+          <w:hyperlink w:anchor="_Toc242919533" w:history="1">
             <w:r>
               <w:rPr>
                 <w:rStyle w:val="Hyperlink"/>
@@ -4031,7 +4147,7 @@
               <w:rPr>
                 <w:noProof/>
               </w:rPr>
-              <w:instrText xml:space="preserve"> PAGEREF _Toc242917789 \h </w:instrText>
+              <w:instrText xml:space="preserve"> PAGEREF _Toc242919533 \h </w:instrText>
             </w:r>
             <w:r>
               <w:rPr>
@@ -4074,13 +4190,13 @@
               <w14:ligatures w14:val="standardContextual"/>
             </w:rPr>
           </w:pPr>
-          <w:hyperlink w:anchor="_Toc242917790" w:history="1">
+          <w:hyperlink w:anchor="_Toc242919534" w:history="1">
             <w:r>
               <w:rPr>
                 <w:rStyle w:val="Hyperlink"/>
                 <w:noProof/>
               </w:rPr>
-              <w:t>2.13 Entity catalogue</w:t>
+              <w:t>2.13 Rooms an account opened (security audit, lead 3)</w:t>
             </w:r>
             <w:r>
               <w:rPr>
@@ -4098,7 +4214,74 @@
               <w:rPr>
                 <w:noProof/>
               </w:rPr>
-              <w:instrText xml:space="preserve"> PAGEREF _Toc242917790 \h </w:instrText>
+              <w:instrText xml:space="preserve"> PAGEREF _Toc242919534 \h </w:instrText>
+            </w:r>
+            <w:r>
+              <w:rPr>
+                <w:noProof/>
+              </w:rPr>
+            </w:r>
+            <w:r>
+              <w:rPr>
+                <w:noProof/>
+              </w:rPr>
+              <w:fldChar w:fldCharType="separate"/>
+            </w:r>
+            <w:r>
+              <w:rPr>
+                <w:noProof/>
+              </w:rPr>
+              <w:t>15</w:t>
+            </w:r>
+            <w:r>
+              <w:rPr>
+                <w:noProof/>
+              </w:rPr>
+              <w:fldChar w:fldCharType="end"/>
+            </w:r>
+          </w:hyperlink>
+        </w:p>
+        <w:p>
+          <w:pPr>
+            <w:pStyle w:val="TOC2"/>
+            <w:tabs>
+              <w:tab w:val="right" w:leader="dot" w:pos="9628"/>
+            </w:tabs>
+            <w:rPr>
+              <w:rFonts w:asciiTheme="minorHAnsi" w:eastAsiaTheme="minorEastAsia" w:hAnsiTheme="minorHAnsi" w:cstheme="minorBidi"/>
+              <w:noProof/>
+              <w:color w:val="auto"/>
+              <w:kern w:val="2"/>
+              <w:sz w:val="24"/>
+              <w:szCs w:val="24"/>
+              <w14:ligatures w14:val="standardContextual"/>
+            </w:rPr>
+          </w:pPr>
+          <w:hyperlink w:anchor="_Toc242919535" w:history="1">
+            <w:r>
+              <w:rPr>
+                <w:rStyle w:val="Hyperlink"/>
+                <w:noProof/>
+              </w:rPr>
+              <w:t>2.14 Entity catalogue</w:t>
+            </w:r>
+            <w:r>
+              <w:rPr>
+                <w:noProof/>
+              </w:rPr>
+              <w:tab/>
+            </w:r>
+            <w:r>
+              <w:rPr>
+                <w:noProof/>
+              </w:rPr>
+              <w:fldChar w:fldCharType="begin"/>
+            </w:r>
+            <w:r>
+              <w:rPr>
+                <w:noProof/>
+              </w:rPr>
+              <w:instrText xml:space="preserve"> PAGEREF _Toc242919535 \h </w:instrText>
             </w:r>
             <w:r>
               <w:rPr>
@@ -4141,7 +4324,7 @@
               <w14:ligatures w14:val="standardContextual"/>
             </w:rPr>
           </w:pPr>
-          <w:hyperlink w:anchor="_Toc242917791" w:history="1">
+          <w:hyperlink w:anchor="_Toc242919536" w:history="1">
             <w:r>
               <w:rPr>
                 <w:rStyle w:val="Hyperlink"/>
@@ -4165,7 +4348,7 @@
               <w:rPr>
                 <w:noProof/>
               </w:rPr>
-              <w:instrText xml:space="preserve"> PAGEREF _Toc242917791 \h </w:instrText>
+              <w:instrText xml:space="preserve"> PAGEREF _Toc242919536 \h </w:instrText>
             </w:r>
             <w:r>
               <w:rPr>
@@ -4182,7 +4365,7 @@
               <w:rPr>
                 <w:noProof/>
               </w:rPr>
-              <w:t>17</w:t>
+              <w:t>18</w:t>
             </w:r>
             <w:r>
               <w:rPr>
@@ -4208,7 +4391,7 @@
               <w14:ligatures w14:val="standardContextual"/>
             </w:rPr>
           </w:pPr>
-          <w:hyperlink w:anchor="_Toc242917792" w:history="1">
+          <w:hyperlink w:anchor="_Toc242919537" w:history="1">
             <w:r>
               <w:rPr>
                 <w:rStyle w:val="Hyperlink"/>
@@ -4232,7 +4415,7 @@
               <w:rPr>
                 <w:noProof/>
               </w:rPr>
-              <w:instrText xml:space="preserve"> PAGEREF _Toc242917792 \h </w:instrText>
+              <w:instrText xml:space="preserve"> PAGEREF _Toc242919537 \h </w:instrText>
             </w:r>
             <w:r>
               <w:rPr>
@@ -4249,7 +4432,7 @@
               <w:rPr>
                 <w:noProof/>
               </w:rPr>
-              <w:t>18</w:t>
+              <w:t>19</w:t>
             </w:r>
             <w:r>
               <w:rPr>
@@ -4275,7 +4458,7 @@
               <w14:ligatures w14:val="standardContextual"/>
             </w:rPr>
           </w:pPr>
-          <w:hyperlink w:anchor="_Toc242917793" w:history="1">
+          <w:hyperlink w:anchor="_Toc242919538" w:history="1">
             <w:r>
               <w:rPr>
                 <w:rStyle w:val="Hyperlink"/>
@@ -4299,7 +4482,7 @@
               <w:rPr>
                 <w:noProof/>
               </w:rPr>
-              <w:instrText xml:space="preserve"> PAGEREF _Toc242917793 \h </w:instrText>
+              <w:instrText xml:space="preserve"> PAGEREF _Toc242919538 \h </w:instrText>
             </w:r>
             <w:r>
               <w:rPr>
@@ -4316,7 +4499,7 @@
               <w:rPr>
                 <w:noProof/>
               </w:rPr>
-              <w:t>22</w:t>
+              <w:t>23</w:t>
             </w:r>
             <w:r>
               <w:rPr>
@@ -4342,7 +4525,7 @@
               <w14:ligatures w14:val="standardContextual"/>
             </w:rPr>
           </w:pPr>
-          <w:hyperlink w:anchor="_Toc242917794" w:history="1">
+          <w:hyperlink w:anchor="_Toc242919539" w:history="1">
             <w:r>
               <w:rPr>
                 <w:rStyle w:val="Hyperlink"/>
@@ -4366,7 +4549,7 @@
               <w:rPr>
                 <w:noProof/>
               </w:rPr>
-              <w:instrText xml:space="preserve"> PAGEREF _Toc242917794 \h </w:instrText>
+              <w:instrText xml:space="preserve"> PAGEREF _Toc242919539 \h </w:instrText>
             </w:r>
             <w:r>
               <w:rPr>
@@ -4383,7 +4566,7 @@
               <w:rPr>
                 <w:noProof/>
               </w:rPr>
-              <w:t>22</w:t>
+              <w:t>23</w:t>
             </w:r>
             <w:r>
               <w:rPr>
@@ -4409,7 +4592,7 @@
               <w14:ligatures w14:val="standardContextual"/>
             </w:rPr>
           </w:pPr>
-          <w:hyperlink w:anchor="_Toc242917795" w:history="1">
+          <w:hyperlink w:anchor="_Toc242919540" w:history="1">
             <w:r>
               <w:rPr>
                 <w:rStyle w:val="Hyperlink"/>
@@ -4433,7 +4616,7 @@
               <w:rPr>
                 <w:noProof/>
               </w:rPr>
-              <w:instrText xml:space="preserve"> PAGEREF _Toc242917795 \h </w:instrText>
+              <w:instrText xml:space="preserve"> PAGEREF _Toc242919540 \h </w:instrText>
             </w:r>
             <w:r>
               <w:rPr>
@@ -4450,7 +4633,7 @@
               <w:rPr>
                 <w:noProof/>
               </w:rPr>
-              <w:t>22</w:t>
+              <w:t>23</w:t>
             </w:r>
             <w:r>
               <w:rPr>
@@ -4476,7 +4659,7 @@
               <w14:ligatures w14:val="standardContextual"/>
             </w:rPr>
           </w:pPr>
-          <w:hyperlink w:anchor="_Toc242917796" w:history="1">
+          <w:hyperlink w:anchor="_Toc242919541" w:history="1">
             <w:r>
               <w:rPr>
                 <w:rStyle w:val="Hyperlink"/>
@@ -4500,7 +4683,7 @@
               <w:rPr>
                 <w:noProof/>
               </w:rPr>
-              <w:instrText xml:space="preserve"> PAGEREF _Toc242917796 \h </w:instrText>
+              <w:instrText xml:space="preserve"> PAGEREF _Toc242919541 \h </w:instrText>
             </w:r>
             <w:r>
               <w:rPr>
@@ -4517,7 +4700,7 @@
               <w:rPr>
                 <w:noProof/>
               </w:rPr>
-              <w:t>22</w:t>
+              <w:t>23</w:t>
             </w:r>
             <w:r>
               <w:rPr>
@@ -4543,7 +4726,7 @@
               <w14:ligatures w14:val="standardContextual"/>
             </w:rPr>
           </w:pPr>
-          <w:hyperlink w:anchor="_Toc242917797" w:history="1">
+          <w:hyperlink w:anchor="_Toc242919542" w:history="1">
             <w:r>
               <w:rPr>
                 <w:rStyle w:val="Hyperlink"/>
@@ -4567,7 +4750,7 @@
               <w:rPr>
                 <w:noProof/>
               </w:rPr>
-              <w:instrText xml:space="preserve"> PAGEREF _Toc242917797 \h </w:instrText>
+              <w:instrText xml:space="preserve"> PAGEREF _Toc242919542 \h </w:instrText>
             </w:r>
             <w:r>
               <w:rPr>
@@ -4584,7 +4767,7 @@
               <w:rPr>
                 <w:noProof/>
               </w:rPr>
-              <w:t>23</w:t>
+              <w:t>24</w:t>
             </w:r>
             <w:r>
               <w:rPr>
@@ -4610,7 +4793,7 @@
               <w14:ligatures w14:val="standardContextual"/>
             </w:rPr>
           </w:pPr>
-          <w:hyperlink w:anchor="_Toc242917798" w:history="1">
+          <w:hyperlink w:anchor="_Toc242919543" w:history="1">
             <w:r>
               <w:rPr>
                 <w:rStyle w:val="Hyperlink"/>
@@ -4634,7 +4817,7 @@
               <w:rPr>
                 <w:noProof/>
               </w:rPr>
-              <w:instrText xml:space="preserve"> PAGEREF _Toc242917798 \h </w:instrText>
+              <w:instrText xml:space="preserve"> PAGEREF _Toc242919543 \h </w:instrText>
             </w:r>
             <w:r>
               <w:rPr>
@@ -4651,7 +4834,7 @@
               <w:rPr>
                 <w:noProof/>
               </w:rPr>
-              <w:t>24</w:t>
+              <w:t>25</w:t>
             </w:r>
             <w:r>
               <w:rPr>
@@ -4677,7 +4860,7 @@
               <w14:ligatures w14:val="standardContextual"/>
             </w:rPr>
           </w:pPr>
-          <w:hyperlink w:anchor="_Toc242917799" w:history="1">
+          <w:hyperlink w:anchor="_Toc242919544" w:history="1">
             <w:r>
               <w:rPr>
                 <w:rStyle w:val="Hyperlink"/>
@@ -4701,7 +4884,7 @@
               <w:rPr>
                 <w:noProof/>
               </w:rPr>
-              <w:instrText xml:space="preserve"> PAGEREF _Toc242917799 \h </w:instrText>
+              <w:instrText xml:space="preserve"> PAGEREF _Toc242919544 \h </w:instrText>
             </w:r>
             <w:r>
               <w:rPr>
@@ -4718,7 +4901,7 @@
               <w:rPr>
                 <w:noProof/>
               </w:rPr>
-              <w:t>24</w:t>
+              <w:t>25</w:t>
             </w:r>
             <w:r>
               <w:rPr>
@@ -4744,7 +4927,7 @@
               <w14:ligatures w14:val="standardContextual"/>
             </w:rPr>
           </w:pPr>
-          <w:hyperlink w:anchor="_Toc242917800" w:history="1">
+          <w:hyperlink w:anchor="_Toc242919545" w:history="1">
             <w:r>
               <w:rPr>
                 <w:rStyle w:val="Hyperlink"/>
@@ -4768,7 +4951,7 @@
               <w:rPr>
                 <w:noProof/>
               </w:rPr>
-              <w:instrText xml:space="preserve"> PAGEREF _Toc242917800 \h </w:instrText>
+              <w:instrText xml:space="preserve"> PAGEREF _Toc242919545 \h </w:instrText>
             </w:r>
             <w:r>
               <w:rPr>
@@ -4785,7 +4968,7 @@
               <w:rPr>
                 <w:noProof/>
               </w:rPr>
-              <w:t>24</w:t>
+              <w:t>25</w:t>
             </w:r>
             <w:r>
               <w:rPr>
@@ -4811,7 +4994,7 @@
               <w14:ligatures w14:val="standardContextual"/>
             </w:rPr>
           </w:pPr>
-          <w:hyperlink w:anchor="_Toc242917801" w:history="1">
+          <w:hyperlink w:anchor="_Toc242919546" w:history="1">
             <w:r>
               <w:rPr>
                 <w:rStyle w:val="Hyperlink"/>
@@ -4835,7 +5018,7 @@
               <w:rPr>
                 <w:noProof/>
               </w:rPr>
-              <w:instrText xml:space="preserve"> PAGEREF _Toc242917801 \h </w:instrText>
+              <w:instrText xml:space="preserve"> PAGEREF _Toc242919546 \h </w:instrText>
             </w:r>
             <w:r>
               <w:rPr>
@@ -4852,7 +5035,7 @@
               <w:rPr>
                 <w:noProof/>
               </w:rPr>
-              <w:t>25</w:t>
+              <w:t>26</w:t>
             </w:r>
             <w:r>
               <w:rPr>
@@ -4878,7 +5061,7 @@
               <w14:ligatures w14:val="standardContextual"/>
             </w:rPr>
           </w:pPr>
-          <w:hyperlink w:anchor="_Toc242917802" w:history="1">
+          <w:hyperlink w:anchor="_Toc242919547" w:history="1">
             <w:r>
               <w:rPr>
                 <w:rStyle w:val="Hyperlink"/>
@@ -4902,7 +5085,7 @@
               <w:rPr>
                 <w:noProof/>
               </w:rPr>
-              <w:instrText xml:space="preserve"> PAGEREF _Toc242917802 \h </w:instrText>
+              <w:instrText xml:space="preserve"> PAGEREF _Toc242919547 \h </w:instrText>
             </w:r>
             <w:r>
               <w:rPr>
@@ -4919,7 +5102,7 @@
               <w:rPr>
                 <w:noProof/>
               </w:rPr>
-              <w:t>26</w:t>
+              <w:t>27</w:t>
             </w:r>
             <w:r>
               <w:rPr>
@@ -4945,7 +5128,7 @@
               <w14:ligatures w14:val="standardContextual"/>
             </w:rPr>
           </w:pPr>
-          <w:hyperlink w:anchor="_Toc242917803" w:history="1">
+          <w:hyperlink w:anchor="_Toc242919548" w:history="1">
             <w:r>
               <w:rPr>
                 <w:rStyle w:val="Hyperlink"/>
@@ -4969,7 +5152,7 @@
               <w:rPr>
                 <w:noProof/>
               </w:rPr>
-              <w:instrText xml:space="preserve"> PAGEREF _Toc242917803 \h </w:instrText>
+              <w:instrText xml:space="preserve"> PAGEREF _Toc242919548 \h </w:instrText>
             </w:r>
             <w:r>
               <w:rPr>
@@ -4986,7 +5169,7 @@
               <w:rPr>
                 <w:noProof/>
               </w:rPr>
-              <w:t>28</w:t>
+              <w:t>29</w:t>
             </w:r>
             <w:r>
               <w:rPr>
@@ -5012,7 +5195,7 @@
               <w14:ligatures w14:val="standardContextual"/>
             </w:rPr>
           </w:pPr>
-          <w:hyperlink w:anchor="_Toc242917804" w:history="1">
+          <w:hyperlink w:anchor="_Toc242919549" w:history="1">
             <w:r>
               <w:rPr>
                 <w:rStyle w:val="Hyperlink"/>
@@ -5036,7 +5219,7 @@
               <w:rPr>
                 <w:noProof/>
               </w:rPr>
-              <w:instrText xml:space="preserve"> PAGEREF _Toc242917804 \h </w:instrText>
+              <w:instrText xml:space="preserve"> PAGEREF _Toc242919549 \h </w:instrText>
             </w:r>
             <w:r>
               <w:rPr>
@@ -5053,7 +5236,7 @@
               <w:rPr>
                 <w:noProof/>
               </w:rPr>
-              <w:t>29</w:t>
+              <w:t>30</w:t>
             </w:r>
             <w:r>
               <w:rPr>
@@ -5079,7 +5262,7 @@
               <w14:ligatures w14:val="standardContextual"/>
             </w:rPr>
           </w:pPr>
-          <w:hyperlink w:anchor="_Toc242917805" w:history="1">
+          <w:hyperlink w:anchor="_Toc242919550" w:history="1">
             <w:r>
               <w:rPr>
                 <w:rStyle w:val="Hyperlink"/>
@@ -5103,7 +5286,7 @@
               <w:rPr>
                 <w:noProof/>
               </w:rPr>
-              <w:instrText xml:space="preserve"> PAGEREF _Toc242917805 \h </w:instrText>
+              <w:instrText xml:space="preserve"> PAGEREF _Toc242919550 \h </w:instrText>
             </w:r>
             <w:r>
               <w:rPr>
@@ -5120,7 +5303,7 @@
               <w:rPr>
                 <w:noProof/>
               </w:rPr>
-              <w:t>35</w:t>
+              <w:t>36</w:t>
             </w:r>
             <w:r>
               <w:rPr>
@@ -5146,7 +5329,7 @@
               <w14:ligatures w14:val="standardContextual"/>
             </w:rPr>
           </w:pPr>
-          <w:hyperlink w:anchor="_Toc242917806" w:history="1">
+          <w:hyperlink w:anchor="_Toc242919551" w:history="1">
             <w:r>
               <w:rPr>
                 <w:rStyle w:val="Hyperlink"/>
@@ -5170,7 +5353,7 @@
               <w:rPr>
                 <w:noProof/>
               </w:rPr>
-              <w:instrText xml:space="preserve"> PAGEREF _Toc242917806 \h </w:instrText>
+              <w:instrText xml:space="preserve"> PAGEREF _Toc242919551 \h </w:instrText>
             </w:r>
             <w:r>
               <w:rPr>
@@ -5187,7 +5370,7 @@
               <w:rPr>
                 <w:noProof/>
               </w:rPr>
-              <w:t>37</w:t>
+              <w:t>38</w:t>
             </w:r>
             <w:r>
               <w:rPr>
@@ -5213,7 +5396,7 @@
               <w14:ligatures w14:val="standardContextual"/>
             </w:rPr>
           </w:pPr>
-          <w:hyperlink w:anchor="_Toc242917807" w:history="1">
+          <w:hyperlink w:anchor="_Toc242919552" w:history="1">
             <w:r>
               <w:rPr>
                 <w:rStyle w:val="Hyperlink"/>
@@ -5237,7 +5420,7 @@
               <w:rPr>
                 <w:noProof/>
               </w:rPr>
-              <w:instrText xml:space="preserve"> PAGEREF _Toc242917807 \h </w:instrText>
+              <w:instrText xml:space="preserve"> PAGEREF _Toc242919552 \h </w:instrText>
             </w:r>
             <w:r>
               <w:rPr>
@@ -5254,7 +5437,7 @@
               <w:rPr>
                 <w:noProof/>
               </w:rPr>
-              <w:t>38</w:t>
+              <w:t>39</w:t>
             </w:r>
             <w:r>
               <w:rPr>
@@ -5280,7 +5463,7 @@
               <w14:ligatures w14:val="standardContextual"/>
             </w:rPr>
           </w:pPr>
-          <w:hyperlink w:anchor="_Toc242917808" w:history="1">
+          <w:hyperlink w:anchor="_Toc242919553" w:history="1">
             <w:r>
               <w:rPr>
                 <w:rStyle w:val="Hyperlink"/>
@@ -5304,7 +5487,7 @@
               <w:rPr>
                 <w:noProof/>
               </w:rPr>
-              <w:instrText xml:space="preserve"> PAGEREF _Toc242917808 \h </w:instrText>
+              <w:instrText xml:space="preserve"> PAGEREF _Toc242919553 \h </w:instrText>
             </w:r>
             <w:r>
               <w:rPr>
@@ -5321,7 +5504,7 @@
               <w:rPr>
                 <w:noProof/>
               </w:rPr>
-              <w:t>39</w:t>
+              <w:t>40</w:t>
             </w:r>
             <w:r>
               <w:rPr>
@@ -5347,13 +5530,13 @@
               <w14:ligatures w14:val="standardContextual"/>
             </w:rPr>
           </w:pPr>
-          <w:hyperlink w:anchor="_Toc242917809" w:history="1">
+          <w:hyperlink w:anchor="_Toc242919554" w:history="1">
             <w:r>
               <w:rPr>
                 <w:rStyle w:val="Hyperlink"/>
                 <w:noProof/>
               </w:rPr>
-              <w:t>Appendix G: Demo accounts (migration 0011)</w:t>
+              <w:t>Appendix G: Rooms an account opened (migration 0012)</w:t>
             </w:r>
             <w:r>
               <w:rPr>
@@ -5371,7 +5554,7 @@
               <w:rPr>
                 <w:noProof/>
               </w:rPr>
-              <w:instrText xml:space="preserve"> PAGEREF _Toc242917809 \h </w:instrText>
+              <w:instrText xml:space="preserve"> PAGEREF _Toc242919554 \h </w:instrText>
             </w:r>
             <w:r>
               <w:rPr>
@@ -5388,7 +5571,7 @@
               <w:rPr>
                 <w:noProof/>
               </w:rPr>
-              <w:t>44</w:t>
+              <w:t>45</w:t>
             </w:r>
             <w:r>
               <w:rPr>
@@ -5414,13 +5597,13 @@
               <w14:ligatures w14:val="standardContextual"/>
             </w:rPr>
           </w:pPr>
-          <w:hyperlink w:anchor="_Toc242917810" w:history="1">
+          <w:hyperlink w:anchor="_Toc242919555" w:history="1">
             <w:r>
               <w:rPr>
                 <w:rStyle w:val="Hyperlink"/>
                 <w:noProof/>
               </w:rPr>
-              <w:t>Appendix H: Group rules (migration 0009)</w:t>
+              <w:t>Appendix H: Demo accounts (migration 0011)</w:t>
             </w:r>
             <w:r>
               <w:rPr>
@@ -5438,7 +5621,7 @@
               <w:rPr>
                 <w:noProof/>
               </w:rPr>
-              <w:instrText xml:space="preserve"> PAGEREF _Toc242917810 \h </w:instrText>
+              <w:instrText xml:space="preserve"> PAGEREF _Toc242919555 \h </w:instrText>
             </w:r>
             <w:r>
               <w:rPr>
@@ -5455,7 +5638,7 @@
               <w:rPr>
                 <w:noProof/>
               </w:rPr>
-              <w:t>45</w:t>
+              <w:t>46</w:t>
             </w:r>
             <w:r>
               <w:rPr>
@@ -5481,13 +5664,13 @@
               <w14:ligatures w14:val="standardContextual"/>
             </w:rPr>
           </w:pPr>
-          <w:hyperlink w:anchor="_Toc242917811" w:history="1">
+          <w:hyperlink w:anchor="_Toc242919556" w:history="1">
             <w:r>
               <w:rPr>
                 <w:rStyle w:val="Hyperlink"/>
                 <w:noProof/>
               </w:rPr>
-              <w:t>Appendix I: Groups (migration 0006)</w:t>
+              <w:t>Appendix I: Group rules (migration 0009)</w:t>
             </w:r>
             <w:r>
               <w:rPr>
@@ -5505,7 +5688,7 @@
               <w:rPr>
                 <w:noProof/>
               </w:rPr>
-              <w:instrText xml:space="preserve"> PAGEREF _Toc242917811 \h </w:instrText>
+              <w:instrText xml:space="preserve"> PAGEREF _Toc242919556 \h </w:instrText>
             </w:r>
             <w:r>
               <w:rPr>
@@ -5522,7 +5705,7 @@
               <w:rPr>
                 <w:noProof/>
               </w:rPr>
-              <w:t>46</w:t>
+              <w:t>47</w:t>
             </w:r>
             <w:r>
               <w:rPr>
@@ -5548,13 +5731,13 @@
               <w14:ligatures w14:val="standardContextual"/>
             </w:rPr>
           </w:pPr>
-          <w:hyperlink w:anchor="_Toc242917812" w:history="1">
+          <w:hyperlink w:anchor="_Toc242919557" w:history="1">
             <w:r>
               <w:rPr>
                 <w:rStyle w:val="Hyperlink"/>
                 <w:noProof/>
               </w:rPr>
-              <w:t>Appendix J: Glossary</w:t>
+              <w:t>Appendix J: Groups (migration 0006)</w:t>
             </w:r>
             <w:r>
               <w:rPr>
@@ -5572,7 +5755,7 @@
               <w:rPr>
                 <w:noProof/>
               </w:rPr>
-              <w:instrText xml:space="preserve"> PAGEREF _Toc242917812 \h </w:instrText>
+              <w:instrText xml:space="preserve"> PAGEREF _Toc242919557 \h </w:instrText>
             </w:r>
             <w:r>
               <w:rPr>
@@ -5615,13 +5798,13 @@
               <w14:ligatures w14:val="standardContextual"/>
             </w:rPr>
           </w:pPr>
-          <w:hyperlink w:anchor="_Toc242917813" w:history="1">
+          <w:hyperlink w:anchor="_Toc242919558" w:history="1">
             <w:r>
               <w:rPr>
                 <w:rStyle w:val="Hyperlink"/>
                 <w:noProof/>
               </w:rPr>
-              <w:t>Appendix K: References</w:t>
+              <w:t>Appendix K: Glossary</w:t>
             </w:r>
             <w:r>
               <w:rPr>
@@ -5639,7 +5822,7 @@
               <w:rPr>
                 <w:noProof/>
               </w:rPr>
-              <w:instrText xml:space="preserve"> PAGEREF _Toc242917813 \h </w:instrText>
+              <w:instrText xml:space="preserve"> PAGEREF _Toc242919558 \h </w:instrText>
             </w:r>
             <w:r>
               <w:rPr>
@@ -5656,7 +5839,74 @@
               <w:rPr>
                 <w:noProof/>
               </w:rPr>
-              <w:t>49</w:t>
+              <w:t>50</w:t>
+            </w:r>
+            <w:r>
+              <w:rPr>
+                <w:noProof/>
+              </w:rPr>
+              <w:fldChar w:fldCharType="end"/>
+            </w:r>
+          </w:hyperlink>
+        </w:p>
+        <w:p>
+          <w:pPr>
+            <w:pStyle w:val="TOC1"/>
+            <w:tabs>
+              <w:tab w:val="right" w:leader="dot" w:pos="9628"/>
+            </w:tabs>
+            <w:rPr>
+              <w:rFonts w:asciiTheme="minorHAnsi" w:eastAsiaTheme="minorEastAsia" w:hAnsiTheme="minorHAnsi" w:cstheme="minorBidi"/>
+              <w:noProof/>
+              <w:color w:val="auto"/>
+              <w:kern w:val="2"/>
+              <w:sz w:val="24"/>
+              <w:szCs w:val="24"/>
+              <w14:ligatures w14:val="standardContextual"/>
+            </w:rPr>
+          </w:pPr>
+          <w:hyperlink w:anchor="_Toc242919559" w:history="1">
+            <w:r>
+              <w:rPr>
+                <w:rStyle w:val="Hyperlink"/>
+                <w:noProof/>
+              </w:rPr>
+              <w:t>Appendix L: References</w:t>
+            </w:r>
+            <w:r>
+              <w:rPr>
+                <w:noProof/>
+              </w:rPr>
+              <w:tab/>
+            </w:r>
+            <w:r>
+              <w:rPr>
+                <w:noProof/>
+              </w:rPr>
+              <w:fldChar w:fldCharType="begin"/>
+            </w:r>
+            <w:r>
+              <w:rPr>
+                <w:noProof/>
+              </w:rPr>
+              <w:instrText xml:space="preserve"> PAGEREF _Toc242919559 \h </w:instrText>
+            </w:r>
+            <w:r>
+              <w:rPr>
+                <w:noProof/>
+              </w:rPr>
+            </w:r>
+            <w:r>
+              <w:rPr>
+                <w:noProof/>
+              </w:rPr>
+              <w:fldChar w:fldCharType="separate"/>
+            </w:r>
+            <w:r>
+              <w:rPr>
+                <w:noProof/>
+              </w:rPr>
+              <w:t>51</w:t>
             </w:r>
             <w:r>
               <w:rPr>
@@ -5685,7 +5935,7 @@
     <w:sdt>
       <w:sdtPr>
         <w:alias w:val="Figures"/>
-        <w:id w:val="-436297297"/>
+        <w:id w:val="-1016469309"/>
       </w:sdtPr>
       <w:sdtEndPr/>
       <w:sdtContent>
@@ -5714,7 +5964,7 @@
           <w:r>
             <w:fldChar w:fldCharType="separate"/>
           </w:r>
-          <w:hyperlink w:anchor="_Toc242917814" w:history="1">
+          <w:hyperlink w:anchor="_Toc242919560" w:history="1">
             <w:r>
               <w:rPr>
                 <w:rStyle w:val="Hyperlink"/>
@@ -5738,7 +5988,7 @@
               <w:rPr>
                 <w:noProof/>
               </w:rPr>
-              <w:instrText xml:space="preserve"> PAGEREF _Toc242917814 \h </w:instrText>
+              <w:instrText xml:space="preserve"> PAGEREF _Toc242919560 \h </w:instrText>
             </w:r>
             <w:r>
               <w:rPr>
@@ -5781,7 +6031,7 @@
               <w14:ligatures w14:val="standardContextual"/>
             </w:rPr>
           </w:pPr>
-          <w:hyperlink w:anchor="_Toc242917815" w:history="1">
+          <w:hyperlink w:anchor="_Toc242919561" w:history="1">
             <w:r>
               <w:rPr>
                 <w:rStyle w:val="Hyperlink"/>
@@ -5805,7 +6055,7 @@
               <w:rPr>
                 <w:noProof/>
               </w:rPr>
-              <w:instrText xml:space="preserve"> PAGEREF _Toc242917815 \h </w:instrText>
+              <w:instrText xml:space="preserve"> PAGEREF _Toc242919561 \h </w:instrText>
             </w:r>
             <w:r>
               <w:rPr>
@@ -5848,7 +6098,7 @@
               <w14:ligatures w14:val="standardContextual"/>
             </w:rPr>
           </w:pPr>
-          <w:hyperlink w:anchor="_Toc242917816" w:history="1">
+          <w:hyperlink w:anchor="_Toc242919562" w:history="1">
             <w:r>
               <w:rPr>
                 <w:rStyle w:val="Hyperlink"/>
@@ -5872,7 +6122,7 @@
               <w:rPr>
                 <w:noProof/>
               </w:rPr>
-              <w:instrText xml:space="preserve"> PAGEREF _Toc242917816 \h </w:instrText>
+              <w:instrText xml:space="preserve"> PAGEREF _Toc242919562 \h </w:instrText>
             </w:r>
             <w:r>
               <w:rPr>
@@ -5915,7 +6165,7 @@
               <w14:ligatures w14:val="standardContextual"/>
             </w:rPr>
           </w:pPr>
-          <w:hyperlink w:anchor="_Toc242917817" w:history="1">
+          <w:hyperlink w:anchor="_Toc242919563" w:history="1">
             <w:r>
               <w:rPr>
                 <w:rStyle w:val="Hyperlink"/>
@@ -5939,7 +6189,7 @@
               <w:rPr>
                 <w:noProof/>
               </w:rPr>
-              <w:instrText xml:space="preserve"> PAGEREF _Toc242917817 \h </w:instrText>
+              <w:instrText xml:space="preserve"> PAGEREF _Toc242919563 \h </w:instrText>
             </w:r>
             <w:r>
               <w:rPr>
@@ -5982,7 +6232,7 @@
               <w14:ligatures w14:val="standardContextual"/>
             </w:rPr>
           </w:pPr>
-          <w:hyperlink w:anchor="_Toc242917818" w:history="1">
+          <w:hyperlink w:anchor="_Toc242919564" w:history="1">
             <w:r>
               <w:rPr>
                 <w:rStyle w:val="Hyperlink"/>
@@ -6006,7 +6256,7 @@
               <w:rPr>
                 <w:noProof/>
               </w:rPr>
-              <w:instrText xml:space="preserve"> PAGEREF _Toc242917818 \h </w:instrText>
+              <w:instrText xml:space="preserve"> PAGEREF _Toc242919564 \h </w:instrText>
             </w:r>
             <w:r>
               <w:rPr>
@@ -6049,7 +6299,7 @@
               <w14:ligatures w14:val="standardContextual"/>
             </w:rPr>
           </w:pPr>
-          <w:hyperlink w:anchor="_Toc242917819" w:history="1">
+          <w:hyperlink w:anchor="_Toc242919565" w:history="1">
             <w:r>
               <w:rPr>
                 <w:rStyle w:val="Hyperlink"/>
@@ -6073,7 +6323,7 @@
               <w:rPr>
                 <w:noProof/>
               </w:rPr>
-              <w:instrText xml:space="preserve"> PAGEREF _Toc242917819 \h </w:instrText>
+              <w:instrText xml:space="preserve"> PAGEREF _Toc242919565 \h </w:instrText>
             </w:r>
             <w:r>
               <w:rPr>
@@ -6090,7 +6340,7 @@
               <w:rPr>
                 <w:noProof/>
               </w:rPr>
-              <w:t>20</w:t>
+              <w:t>21</w:t>
             </w:r>
             <w:r>
               <w:rPr>
@@ -6116,7 +6366,7 @@
               <w14:ligatures w14:val="standardContextual"/>
             </w:rPr>
           </w:pPr>
-          <w:hyperlink w:anchor="_Toc242917820" w:history="1">
+          <w:hyperlink w:anchor="_Toc242919566" w:history="1">
             <w:r>
               <w:rPr>
                 <w:rStyle w:val="Hyperlink"/>
@@ -6140,7 +6390,7 @@
               <w:rPr>
                 <w:noProof/>
               </w:rPr>
-              <w:instrText xml:space="preserve"> PAGEREF _Toc242917820 \h </w:instrText>
+              <w:instrText xml:space="preserve"> PAGEREF _Toc242919566 \h </w:instrText>
             </w:r>
             <w:r>
               <w:rPr>
@@ -6157,7 +6407,7 @@
               <w:rPr>
                 <w:noProof/>
               </w:rPr>
-              <w:t>21</w:t>
+              <w:t>22</w:t>
             </w:r>
             <w:r>
               <w:rPr>
@@ -6183,7 +6433,7 @@
               <w14:ligatures w14:val="standardContextual"/>
             </w:rPr>
           </w:pPr>
-          <w:hyperlink w:anchor="_Toc242917821" w:history="1">
+          <w:hyperlink w:anchor="_Toc242919567" w:history="1">
             <w:r>
               <w:rPr>
                 <w:rStyle w:val="Hyperlink"/>
@@ -6207,7 +6457,7 @@
               <w:rPr>
                 <w:noProof/>
               </w:rPr>
-              <w:instrText xml:space="preserve"> PAGEREF _Toc242917821 \h </w:instrText>
+              <w:instrText xml:space="preserve"> PAGEREF _Toc242919567 \h </w:instrText>
             </w:r>
             <w:r>
               <w:rPr>
@@ -6224,7 +6474,7 @@
               <w:rPr>
                 <w:noProof/>
               </w:rPr>
-              <w:t>21</w:t>
+              <w:t>22</w:t>
             </w:r>
             <w:r>
               <w:rPr>
@@ -6253,7 +6503,7 @@
     <w:sdt>
       <w:sdtPr>
         <w:alias w:val="Tables"/>
-        <w:id w:val="136000256"/>
+        <w:id w:val="-152768620"/>
       </w:sdtPr>
       <w:sdtEndPr/>
       <w:sdtContent>
@@ -6282,7 +6532,7 @@
           <w:r>
             <w:fldChar w:fldCharType="separate"/>
           </w:r>
-          <w:hyperlink w:anchor="_Toc242917822" w:history="1">
+          <w:hyperlink w:anchor="_Toc242919568" w:history="1">
             <w:r>
               <w:rPr>
                 <w:rStyle w:val="Hyperlink"/>
@@ -6306,7 +6556,7 @@
               <w:rPr>
                 <w:noProof/>
               </w:rPr>
-              <w:instrText xml:space="preserve"> PAGEREF _Toc242917822 \h </w:instrText>
+              <w:instrText xml:space="preserve"> PAGEREF _Toc242919568 \h </w:instrText>
             </w:r>
             <w:r>
               <w:rPr>
@@ -6349,7 +6599,7 @@
               <w14:ligatures w14:val="standardContextual"/>
             </w:rPr>
           </w:pPr>
-          <w:hyperlink w:anchor="_Toc242917823" w:history="1">
+          <w:hyperlink w:anchor="_Toc242919569" w:history="1">
             <w:r>
               <w:rPr>
                 <w:rStyle w:val="Hyperlink"/>
@@ -6373,7 +6623,7 @@
               <w:rPr>
                 <w:noProof/>
               </w:rPr>
-              <w:instrText xml:space="preserve"> PAGEREF _Toc242917823 \h </w:instrText>
+              <w:instrText xml:space="preserve"> PAGEREF _Toc242919569 \h </w:instrText>
             </w:r>
             <w:r>
               <w:rPr>
@@ -6416,7 +6666,7 @@
               <w14:ligatures w14:val="standardContextual"/>
             </w:rPr>
           </w:pPr>
-          <w:hyperlink w:anchor="_Toc242917824" w:history="1">
+          <w:hyperlink w:anchor="_Toc242919570" w:history="1">
             <w:r>
               <w:rPr>
                 <w:rStyle w:val="Hyperlink"/>
@@ -6440,7 +6690,7 @@
               <w:rPr>
                 <w:noProof/>
               </w:rPr>
-              <w:instrText xml:space="preserve"> PAGEREF _Toc242917824 \h </w:instrText>
+              <w:instrText xml:space="preserve"> PAGEREF _Toc242919570 \h </w:instrText>
             </w:r>
             <w:r>
               <w:rPr>
@@ -6483,7 +6733,7 @@
               <w14:ligatures w14:val="standardContextual"/>
             </w:rPr>
           </w:pPr>
-          <w:hyperlink w:anchor="_Toc242917825" w:history="1">
+          <w:hyperlink w:anchor="_Toc242919571" w:history="1">
             <w:r>
               <w:rPr>
                 <w:rStyle w:val="Hyperlink"/>
@@ -6507,7 +6757,7 @@
               <w:rPr>
                 <w:noProof/>
               </w:rPr>
-              <w:instrText xml:space="preserve"> PAGEREF _Toc242917825 \h </w:instrText>
+              <w:instrText xml:space="preserve"> PAGEREF _Toc242919571 \h </w:instrText>
             </w:r>
             <w:r>
               <w:rPr>
@@ -6550,7 +6800,7 @@
               <w14:ligatures w14:val="standardContextual"/>
             </w:rPr>
           </w:pPr>
-          <w:hyperlink w:anchor="_Toc242917826" w:history="1">
+          <w:hyperlink w:anchor="_Toc242919572" w:history="1">
             <w:r>
               <w:rPr>
                 <w:rStyle w:val="Hyperlink"/>
@@ -6574,7 +6824,7 @@
               <w:rPr>
                 <w:noProof/>
               </w:rPr>
-              <w:instrText xml:space="preserve"> PAGEREF _Toc242917826 \h </w:instrText>
+              <w:instrText xml:space="preserve"> PAGEREF _Toc242919572 \h </w:instrText>
             </w:r>
             <w:r>
               <w:rPr>
@@ -6591,7 +6841,7 @@
               <w:rPr>
                 <w:noProof/>
               </w:rPr>
-              <w:t>17</w:t>
+              <w:t>18</w:t>
             </w:r>
             <w:r>
               <w:rPr>
@@ -6617,7 +6867,7 @@
               <w14:ligatures w14:val="standardContextual"/>
             </w:rPr>
           </w:pPr>
-          <w:hyperlink w:anchor="_Toc242917827" w:history="1">
+          <w:hyperlink w:anchor="_Toc242919573" w:history="1">
             <w:r>
               <w:rPr>
                 <w:rStyle w:val="Hyperlink"/>
@@ -6641,7 +6891,7 @@
               <w:rPr>
                 <w:noProof/>
               </w:rPr>
-              <w:instrText xml:space="preserve"> PAGEREF _Toc242917827 \h </w:instrText>
+              <w:instrText xml:space="preserve"> PAGEREF _Toc242919573 \h </w:instrText>
             </w:r>
             <w:r>
               <w:rPr>
@@ -6658,7 +6908,7 @@
               <w:rPr>
                 <w:noProof/>
               </w:rPr>
-              <w:t>18</w:t>
+              <w:t>19</w:t>
             </w:r>
             <w:r>
               <w:rPr>
@@ -6684,7 +6934,7 @@
               <w14:ligatures w14:val="standardContextual"/>
             </w:rPr>
           </w:pPr>
-          <w:hyperlink w:anchor="_Toc242917828" w:history="1">
+          <w:hyperlink w:anchor="_Toc242919574" w:history="1">
             <w:r>
               <w:rPr>
                 <w:rStyle w:val="Hyperlink"/>
@@ -6708,7 +6958,7 @@
               <w:rPr>
                 <w:noProof/>
               </w:rPr>
-              <w:instrText xml:space="preserve"> PAGEREF _Toc242917828 \h </w:instrText>
+              <w:instrText xml:space="preserve"> PAGEREF _Toc242919574 \h </w:instrText>
             </w:r>
             <w:r>
               <w:rPr>
@@ -6725,7 +6975,7 @@
               <w:rPr>
                 <w:noProof/>
               </w:rPr>
-              <w:t>19</w:t>
+              <w:t>20</w:t>
             </w:r>
             <w:r>
               <w:rPr>
@@ -6751,7 +7001,7 @@
               <w14:ligatures w14:val="standardContextual"/>
             </w:rPr>
           </w:pPr>
-          <w:hyperlink w:anchor="_Toc242917829" w:history="1">
+          <w:hyperlink w:anchor="_Toc242919575" w:history="1">
             <w:r>
               <w:rPr>
                 <w:rStyle w:val="Hyperlink"/>
@@ -6775,7 +7025,7 @@
               <w:rPr>
                 <w:noProof/>
               </w:rPr>
-              <w:instrText xml:space="preserve"> PAGEREF _Toc242917829 \h </w:instrText>
+              <w:instrText xml:space="preserve"> PAGEREF _Toc242919575 \h </w:instrText>
             </w:r>
             <w:r>
               <w:rPr>
@@ -6792,7 +7042,7 @@
               <w:rPr>
                 <w:noProof/>
               </w:rPr>
-              <w:t>22</w:t>
+              <w:t>23</w:t>
             </w:r>
             <w:r>
               <w:rPr>
@@ -6818,7 +7068,7 @@
               <w14:ligatures w14:val="standardContextual"/>
             </w:rPr>
           </w:pPr>
-          <w:hyperlink w:anchor="_Toc242917830" w:history="1">
+          <w:hyperlink w:anchor="_Toc242919576" w:history="1">
             <w:r>
               <w:rPr>
                 <w:rStyle w:val="Hyperlink"/>
@@ -6842,7 +7092,7 @@
               <w:rPr>
                 <w:noProof/>
               </w:rPr>
-              <w:instrText xml:space="preserve"> PAGEREF _Toc242917830 \h </w:instrText>
+              <w:instrText xml:space="preserve"> PAGEREF _Toc242919576 \h </w:instrText>
             </w:r>
             <w:r>
               <w:rPr>
@@ -6859,7 +7109,7 @@
               <w:rPr>
                 <w:noProof/>
               </w:rPr>
-              <w:t>23</w:t>
+              <w:t>24</w:t>
             </w:r>
             <w:r>
               <w:rPr>
@@ -6885,7 +7135,7 @@
               <w14:ligatures w14:val="standardContextual"/>
             </w:rPr>
           </w:pPr>
-          <w:hyperlink w:anchor="_Toc242917831" w:history="1">
+          <w:hyperlink w:anchor="_Toc242919577" w:history="1">
             <w:r>
               <w:rPr>
                 <w:rStyle w:val="Hyperlink"/>
@@ -6909,7 +7159,7 @@
               <w:rPr>
                 <w:noProof/>
               </w:rPr>
-              <w:instrText xml:space="preserve"> PAGEREF _Toc242917831 \h </w:instrText>
+              <w:instrText xml:space="preserve"> PAGEREF _Toc242919577 \h </w:instrText>
             </w:r>
             <w:r>
               <w:rPr>
@@ -6926,7 +7176,7 @@
               <w:rPr>
                 <w:noProof/>
               </w:rPr>
-              <w:t>24</w:t>
+              <w:t>25</w:t>
             </w:r>
             <w:r>
               <w:rPr>
@@ -6952,7 +7202,7 @@
               <w14:ligatures w14:val="standardContextual"/>
             </w:rPr>
           </w:pPr>
-          <w:hyperlink w:anchor="_Toc242917832" w:history="1">
+          <w:hyperlink w:anchor="_Toc242919578" w:history="1">
             <w:r>
               <w:rPr>
                 <w:rStyle w:val="Hyperlink"/>
@@ -6976,7 +7226,7 @@
               <w:rPr>
                 <w:noProof/>
               </w:rPr>
-              <w:instrText xml:space="preserve"> PAGEREF _Toc242917832 \h </w:instrText>
+              <w:instrText xml:space="preserve"> PAGEREF _Toc242919578 \h </w:instrText>
             </w:r>
             <w:r>
               <w:rPr>
@@ -6993,7 +7243,7 @@
               <w:rPr>
                 <w:noProof/>
               </w:rPr>
-              <w:t>25</w:t>
+              <w:t>26</w:t>
             </w:r>
             <w:r>
               <w:rPr>
@@ -7019,7 +7269,7 @@
               <w14:ligatures w14:val="standardContextual"/>
             </w:rPr>
           </w:pPr>
-          <w:hyperlink w:anchor="_Toc242917833" w:history="1">
+          <w:hyperlink w:anchor="_Toc242919579" w:history="1">
             <w:r>
               <w:rPr>
                 <w:rStyle w:val="Hyperlink"/>
@@ -7043,7 +7293,7 @@
               <w:rPr>
                 <w:noProof/>
               </w:rPr>
-              <w:instrText xml:space="preserve"> PAGEREF _Toc242917833 \h </w:instrText>
+              <w:instrText xml:space="preserve"> PAGEREF _Toc242919579 \h </w:instrText>
             </w:r>
             <w:r>
               <w:rPr>
@@ -7060,7 +7310,7 @@
               <w:rPr>
                 <w:noProof/>
               </w:rPr>
-              <w:t>26</w:t>
+              <w:t>27</w:t>
             </w:r>
             <w:r>
               <w:rPr>
@@ -7086,7 +7336,7 @@
               <w14:ligatures w14:val="standardContextual"/>
             </w:rPr>
           </w:pPr>
-          <w:hyperlink w:anchor="_Toc242917834" w:history="1">
+          <w:hyperlink w:anchor="_Toc242919580" w:history="1">
             <w:r>
               <w:rPr>
                 <w:rStyle w:val="Hyperlink"/>
@@ -7110,7 +7360,7 @@
               <w:rPr>
                 <w:noProof/>
               </w:rPr>
-              <w:instrText xml:space="preserve"> PAGEREF _Toc242917834 \h </w:instrText>
+              <w:instrText xml:space="preserve"> PAGEREF _Toc242919580 \h </w:instrText>
             </w:r>
             <w:r>
               <w:rPr>
@@ -7127,7 +7377,7 @@
               <w:rPr>
                 <w:noProof/>
               </w:rPr>
-              <w:t>26</w:t>
+              <w:t>27</w:t>
             </w:r>
             <w:r>
               <w:rPr>
@@ -7153,7 +7403,7 @@
               <w14:ligatures w14:val="standardContextual"/>
             </w:rPr>
           </w:pPr>
-          <w:hyperlink w:anchor="_Toc242917835" w:history="1">
+          <w:hyperlink w:anchor="_Toc242919581" w:history="1">
             <w:r>
               <w:rPr>
                 <w:rStyle w:val="Hyperlink"/>
@@ -7177,7 +7427,7 @@
               <w:rPr>
                 <w:noProof/>
               </w:rPr>
-              <w:instrText xml:space="preserve"> PAGEREF _Toc242917835 \h </w:instrText>
+              <w:instrText xml:space="preserve"> PAGEREF _Toc242919581 \h </w:instrText>
             </w:r>
             <w:r>
               <w:rPr>
@@ -7194,7 +7444,7 @@
               <w:rPr>
                 <w:noProof/>
               </w:rPr>
-              <w:t>28</w:t>
+              <w:t>29</w:t>
             </w:r>
             <w:r>
               <w:rPr>
@@ -7220,7 +7470,7 @@
               <w14:ligatures w14:val="standardContextual"/>
             </w:rPr>
           </w:pPr>
-          <w:hyperlink w:anchor="_Toc242917836" w:history="1">
+          <w:hyperlink w:anchor="_Toc242919582" w:history="1">
             <w:r>
               <w:rPr>
                 <w:rStyle w:val="Hyperlink"/>
@@ -7244,7 +7494,7 @@
               <w:rPr>
                 <w:noProof/>
               </w:rPr>
-              <w:instrText xml:space="preserve"> PAGEREF _Toc242917836 \h </w:instrText>
+              <w:instrText xml:space="preserve"> PAGEREF _Toc242919582 \h </w:instrText>
             </w:r>
             <w:r>
               <w:rPr>
@@ -7261,7 +7511,7 @@
               <w:rPr>
                 <w:noProof/>
               </w:rPr>
-              <w:t>48</w:t>
+              <w:t>50</w:t>
             </w:r>
             <w:r>
               <w:rPr>
@@ -7287,7 +7537,7 @@
               <w14:ligatures w14:val="standardContextual"/>
             </w:rPr>
           </w:pPr>
-          <w:hyperlink w:anchor="_Toc242917837" w:history="1">
+          <w:hyperlink w:anchor="_Toc242919583" w:history="1">
             <w:r>
               <w:rPr>
                 <w:rStyle w:val="Hyperlink"/>
@@ -7311,7 +7561,7 @@
               <w:rPr>
                 <w:noProof/>
               </w:rPr>
-              <w:instrText xml:space="preserve"> PAGEREF _Toc242917837 \h </w:instrText>
+              <w:instrText xml:space="preserve"> PAGEREF _Toc242919583 \h </w:instrText>
             </w:r>
             <w:r>
               <w:rPr>
@@ -7328,7 +7578,7 @@
               <w:rPr>
                 <w:noProof/>
               </w:rPr>
-              <w:t>49</w:t>
+              <w:t>51</w:t>
             </w:r>
             <w:r>
               <w:rPr>
@@ -7352,7 +7602,7 @@
         <w:keepLines/>
         <w:pageBreakBefore/>
       </w:pPr>
-      <w:bookmarkStart w:id="0" w:name="_Toc242917771"/>
+      <w:bookmarkStart w:id="0" w:name="_Toc242919515"/>
       <w:r>
         <w:lastRenderedPageBreak/>
         <w:t>1 Introduction</w:t>
@@ -7365,7 +7615,7 @@
         <w:keepNext/>
         <w:keepLines/>
       </w:pPr>
-      <w:bookmarkStart w:id="1" w:name="_Toc242917772"/>
+      <w:bookmarkStart w:id="1" w:name="_Toc242919516"/>
       <w:r>
         <w:t>1.1 Purpose</w:t>
       </w:r>
@@ -7415,7 +7665,7 @@
         <w:keepNext/>
         <w:keepLines/>
       </w:pPr>
-      <w:bookmarkStart w:id="2" w:name="_Toc242917773"/>
+      <w:bookmarkStart w:id="2" w:name="_Toc242919517"/>
       <w:r>
         <w:t>1.2 Scope</w:t>
       </w:r>
@@ -7436,7 +7686,10 @@
         <w:t>optional</w:t>
       </w:r>
       <w:r>
-        <w:t xml:space="preserve"> student account: a student who chooses to create one keeps the same profile on the server, under a username only, so it follows them between devices and can drive reminders. Section 2.5 models it. The preference list stays on the device.</w:t>
+        <w:t xml:space="preserve"> student account: a student who chooses to create one keeps the same profile on the server, under a username only, so it follows them between </w:t>
+      </w:r>
+      <w:r>
+        <w:t>devices and can drive reminders. Section 2.5 models it. The preference list stays on the device.</w:t>
       </w:r>
     </w:p>
     <w:p>
@@ -7445,7 +7698,7 @@
         <w:keepNext/>
         <w:keepLines/>
       </w:pPr>
-      <w:bookmarkStart w:id="3" w:name="_Toc242917774"/>
+      <w:bookmarkStart w:id="3" w:name="_Toc242919518"/>
       <w:r>
         <w:t>1.3 Intended audience</w:t>
       </w:r>
@@ -7465,12 +7718,9 @@
         <w:keepNext/>
         <w:keepLines/>
       </w:pPr>
-      <w:bookmarkStart w:id="4" w:name="_Toc242917775"/>
-      <w:r>
-        <w:t>1.4 </w:t>
-      </w:r>
-      <w:r>
-        <w:t>Relationship to other documents</w:t>
+      <w:bookmarkStart w:id="4" w:name="_Toc242919519"/>
+      <w:r>
+        <w:t>1.4 Relationship to other documents</w:t>
       </w:r>
       <w:bookmarkEnd w:id="4"/>
     </w:p>
@@ -7479,7 +7729,7 @@
         <w:pStyle w:val="Caption"/>
         <w:keepNext/>
       </w:pPr>
-      <w:bookmarkStart w:id="5" w:name="_Toc242917822"/>
+      <w:bookmarkStart w:id="5" w:name="_Toc242919568"/>
       <w:r>
         <w:t xml:space="preserve">Table </w:t>
       </w:r>
@@ -7998,7 +8248,7 @@
         <w:keepNext/>
         <w:keepLines/>
       </w:pPr>
-      <w:bookmarkStart w:id="6" w:name="_Toc242917776"/>
+      <w:bookmarkStart w:id="6" w:name="_Toc242919520"/>
       <w:r>
         <w:t>1.5 Notation</w:t>
       </w:r>
@@ -8119,7 +8369,10 @@
         <w:t>union category</w:t>
       </w:r>
       <w:r>
-        <w:t>. Partial keys of weak entities are named in the entity catalogue. Logical diagrams use crow's-foot (Information Engineering) notation.</w:t>
+        <w:t xml:space="preserve">. Partial keys of weak entities are </w:t>
+      </w:r>
+      <w:r>
+        <w:t>named in the entity catalogue. Logical diagrams use crow's-foot (Information Engineering) notation.</w:t>
       </w:r>
     </w:p>
     <w:p>
@@ -8129,7 +8382,7 @@
         <w:keepLines/>
         <w:pageBreakBefore/>
       </w:pPr>
-      <w:bookmarkStart w:id="7" w:name="_Toc242917777"/>
+      <w:bookmarkStart w:id="7" w:name="_Toc242919521"/>
       <w:r>
         <w:lastRenderedPageBreak/>
         <w:t>2 Conceptual model (EER)</w:t>
@@ -8142,7 +8395,7 @@
         <w:keepNext/>
         <w:keepLines/>
       </w:pPr>
-      <w:bookmarkStart w:id="8" w:name="_Toc242917778"/>
+      <w:bookmarkStart w:id="8" w:name="_Toc242919522"/>
       <w:r>
         <w:t>2.1 Offerings and cut-offs</w:t>
       </w:r>
@@ -8218,7 +8471,7 @@
         </w:rPr>
         <w:lastRenderedPageBreak/>
         <w:drawing>
-          <wp:inline distT="0" distB="0" distL="0" distR="0" wp14:anchorId="340B2674" wp14:editId="340B2675">
+          <wp:inline distT="0" distB="0" distL="0" distR="0" wp14:anchorId="4B72F3D6" wp14:editId="4B72F3D7">
             <wp:extent cx="6124575" cy="7553325"/>
             <wp:effectExtent l="0" t="0" r="0" b="0"/>
             <wp:docPr id="1" name="eer-offerings.png" descr="EER model of institutions, courses, offerings, intake years, selection groups and cut-offs" title="EER model of institutions, courses, offerings, intake years, selection groups and cut-offs"/>
@@ -8261,7 +8514,7 @@
       <w:pPr>
         <w:pStyle w:val="Caption"/>
       </w:pPr>
-      <w:bookmarkStart w:id="9" w:name="_Toc242917814"/>
+      <w:bookmarkStart w:id="9" w:name="_Toc242919560"/>
       <w:r>
         <w:t xml:space="preserve">Figure </w:t>
       </w:r>
@@ -8294,12 +8547,9 @@
         <w:keepNext/>
         <w:keepLines/>
       </w:pPr>
-      <w:bookmarkStart w:id="10" w:name="_Toc242917779"/>
-      <w:r>
-        <w:t>2.2 </w:t>
-      </w:r>
-      <w:r>
-        <w:t>Subjects and requirement rules</w:t>
+      <w:bookmarkStart w:id="10" w:name="_Toc242919523"/>
+      <w:r>
+        <w:t>2.2 Subjects and requirement rules</w:t>
       </w:r>
       <w:bookmarkEnd w:id="10"/>
     </w:p>
@@ -8333,7 +8583,7 @@
         </w:rPr>
         <w:lastRenderedPageBreak/>
         <w:drawing>
-          <wp:inline distT="0" distB="0" distL="0" distR="0" wp14:anchorId="340B2676" wp14:editId="340B2677">
+          <wp:inline distT="0" distB="0" distL="0" distR="0" wp14:anchorId="4B72F3D8" wp14:editId="4B72F3D9">
             <wp:extent cx="6124575" cy="6067425"/>
             <wp:effectExtent l="0" t="0" r="0" b="0"/>
             <wp:docPr id="2" name="eer-rules.png" descr="EER model of streams, subjects and the recursive requirement-rule tree" title="EER model of streams, subjects and the recursive requirement-rule tree"/>
@@ -8376,7 +8626,7 @@
       <w:pPr>
         <w:pStyle w:val="Caption"/>
       </w:pPr>
-      <w:bookmarkStart w:id="11" w:name="_Toc242917815"/>
+      <w:bookmarkStart w:id="11" w:name="_Toc242919561"/>
       <w:r>
         <w:t xml:space="preserve">Figure </w:t>
       </w:r>
@@ -8409,7 +8659,7 @@
         <w:keepNext/>
         <w:keepLines/>
       </w:pPr>
-      <w:bookmarkStart w:id="12" w:name="_Toc242917780"/>
+      <w:bookmarkStart w:id="12" w:name="_Toc242919524"/>
       <w:r>
         <w:t>2.3 Provenance and trust</w:t>
       </w:r>
@@ -8445,7 +8695,7 @@
         </w:rPr>
         <w:lastRenderedPageBreak/>
         <w:drawing>
-          <wp:inline distT="0" distB="0" distL="0" distR="0" wp14:anchorId="340B2678" wp14:editId="340B2679">
+          <wp:inline distT="0" distB="0" distL="0" distR="0" wp14:anchorId="4B72F3DA" wp14:editId="4B72F3DB">
             <wp:extent cx="6124575" cy="4829175"/>
             <wp:effectExtent l="0" t="0" r="0" b="0"/>
             <wp:docPr id="3" name="eer-provenance.png" descr="EER model of cited facts, sources, revisions, AI extraction, review and mistake reports" title="EER model of cited facts, sources, revisions, AI extraction, review and mistake reports"/>
@@ -8488,7 +8738,7 @@
       <w:pPr>
         <w:pStyle w:val="Caption"/>
       </w:pPr>
-      <w:bookmarkStart w:id="13" w:name="_Toc242917816"/>
+      <w:bookmarkStart w:id="13" w:name="_Toc242919562"/>
       <w:r>
         <w:t xml:space="preserve">Figure </w:t>
       </w:r>
@@ -8521,7 +8771,7 @@
         <w:keepNext/>
         <w:keepLines/>
       </w:pPr>
-      <w:bookmarkStart w:id="14" w:name="_Toc242917781"/>
+      <w:bookmarkStart w:id="14" w:name="_Toc242919525"/>
       <w:r>
         <w:t>2.4 Journey and other routes</w:t>
       </w:r>
@@ -8538,7 +8788,7 @@
           <w:noProof/>
         </w:rPr>
         <w:drawing>
-          <wp:inline distT="0" distB="0" distL="0" distR="0" wp14:anchorId="340B267A" wp14:editId="340B267B">
+          <wp:inline distT="0" distB="0" distL="0" distR="0" wp14:anchorId="4B72F3DC" wp14:editId="4B72F3DD">
             <wp:extent cx="6124575" cy="2895600"/>
             <wp:effectExtent l="0" t="0" r="0" b="0"/>
             <wp:docPr id="4" name="eer-journey.png" descr="EER model of deadlines, push reminders and the specialisation of other routes" title="EER model of deadlines, push reminders and the specialisation of other routes"/>
@@ -8581,7 +8831,7 @@
       <w:pPr>
         <w:pStyle w:val="Caption"/>
       </w:pPr>
-      <w:bookmarkStart w:id="15" w:name="_Toc242917817"/>
+      <w:bookmarkStart w:id="15" w:name="_Toc242919563"/>
       <w:r>
         <w:t xml:space="preserve">Figure </w:t>
       </w:r>
@@ -8614,7 +8864,7 @@
         <w:keepNext/>
         <w:keepLines/>
       </w:pPr>
-      <w:bookmarkStart w:id="16" w:name="_Toc242917782"/>
+      <w:bookmarkStart w:id="16" w:name="_Toc242919526"/>
       <w:r>
         <w:lastRenderedPageBreak/>
         <w:t>2.5 Student accounts (CR-001)</w:t>
@@ -8626,7 +8876,10 @@
         <w:spacing w:after="120"/>
       </w:pPr>
       <w:r>
-        <w:t xml:space="preserve">A student account is optional. ACCOUNT, already the superclass of the staff roles, gains a fourth subclass, STUDENT. Each way of signing in is its own weak entity of ACCOUNT, so a later identity provider (for example Google sign-in) adds an entity without touching the others. A password is never stored: PASSWORD_LOGIN holds a salt and a </w:t>
+        <w:t xml:space="preserve">A student account is optional. ACCOUNT, already the superclass of the staff roles, gains a fourth subclass, </w:t>
+      </w:r>
+      <w:r>
+        <w:t xml:space="preserve">STUDENT. Each way of signing in is its own weak entity of ACCOUNT, so a later identity provider (for example Google sign-in) adds an entity without touching the others. A password is never stored: PASSWORD_LOGIN holds a salt and a </w:t>
       </w:r>
       <w:r>
         <w:rPr>
@@ -8636,10 +8889,10 @@
         <w:t>verifier</w:t>
       </w:r>
       <w:r>
-        <w:t xml:space="preserve">, a hash of a key the student's device derives from the password. A STUDENT's results are the attributes the device already keeps: a Z-score, the stream sat (SAT_IN), the district sat from (SAT_FROM), and three subjects with grades (TOOK, whose attributes are Grade and Position). Achievements are a weak entity with partial key Position; interests are a multi-valued attribute. CR-001 stored no name, email address or telephone </w:t>
-      </w:r>
-      <w:r>
-        <w:t>number; CR-003 (below) withdraws that and adds them, with consent, in a table of their own.</w:t>
+        <w:t xml:space="preserve">, a hash of a key the student's device derives from the password. A STUDENT's results are the attributes the device already keeps: a Z-score, the stream sat (SAT_IN), the district sat from (SAT_FROM), and </w:t>
+      </w:r>
+      <w:r>
+        <w:t>three subjects with grades (TOOK, whose attributes are Grade and Position). Achievements are a weak entity with partial key Position; interests are a multi-valued attribute. CR-001 stored no name, email address or telephone number; CR-003 (below) withdraws that and adds them, with consent, in a table of their own.</w:t>
       </w:r>
     </w:p>
     <w:p>
@@ -8653,7 +8906,7 @@
           <w:noProof/>
         </w:rPr>
         <w:drawing>
-          <wp:inline distT="0" distB="0" distL="0" distR="0" wp14:anchorId="340B267C" wp14:editId="340B267D">
+          <wp:inline distT="0" distB="0" distL="0" distR="0" wp14:anchorId="4B72F3DE" wp14:editId="4B72F3DF">
             <wp:extent cx="6124575" cy="2857500"/>
             <wp:effectExtent l="0" t="0" r="0" b="0"/>
             <wp:docPr id="5" name="eer-accounts.png" descr="EER model of optional student accounts: sign-in, sessions, recovery and the student's results" title="EER model of optional student accounts: sign-in, sessions, recovery and the student's results"/>
@@ -8696,7 +8949,7 @@
       <w:pPr>
         <w:pStyle w:val="Caption"/>
       </w:pPr>
-      <w:bookmarkStart w:id="17" w:name="_Toc242917818"/>
+      <w:bookmarkStart w:id="17" w:name="_Toc242919564"/>
       <w:r>
         <w:t xml:space="preserve">Figure </w:t>
       </w:r>
@@ -8729,7 +8982,7 @@
         <w:keepNext/>
         <w:keepLines/>
       </w:pPr>
-      <w:bookmarkStart w:id="18" w:name="_Toc242917783"/>
+      <w:bookmarkStart w:id="18" w:name="_Toc242919527"/>
       <w:r>
         <w:t>2.6 Journey, Alerts and Groups (CR-002)</w:t>
       </w:r>
@@ -9387,7 +9640,10 @@
         <w:t>rule</w:t>
       </w:r>
       <w:r>
-        <w:t xml:space="preserve"> (for example, "within two weeks of the closing date", p.116) and dated items come from cited notices. No date is invented.</w:t>
+        <w:t xml:space="preserve"> (for example, </w:t>
+      </w:r>
+      <w:r>
+        <w:t>"within two weeks of the closing date", p.116) and dated items come from cited notices. No date is invented.</w:t>
       </w:r>
     </w:p>
     <w:p>
@@ -9414,7 +9670,10 @@
         <w:t>account.verified_for_letter</w:t>
       </w:r>
       <w:r>
-        <w:t>), and the 0003 triggers already keep student data off non-student accounts. A SENIOR_INVITE (one-time code, stored only as its SHA-256) names the course, institution and study year the product owner checked; redeeming it at sign-up creates the SENIOR account and marks the invite in one atomic batch. A trigger allows redemption only by a SENIOR account of the invite's institution, and only once.</w:t>
+        <w:t xml:space="preserve">), and the 0003 triggers already keep student data off non-student accounts. A SENIOR_INVITE (one-time code, stored only as its SHA-256) names the course, institution and study year </w:t>
+      </w:r>
+      <w:r>
+        <w:t>the product owner checked; redeeming it at sign-up creates the SENIOR account and marks the invite in one atomic batch. A trigger allows redemption only by a SENIOR account of the invite's institution, and only once.</w:t>
       </w:r>
     </w:p>
     <w:p>
@@ -9429,10 +9688,7 @@
         <w:t>Reference rows for foreign keys.</w:t>
       </w:r>
       <w:r>
-        <w:t xml:space="preserve"> Migration 0005 loads the 121 courses and 20 institutions of 2025/26 (generated </w:t>
-      </w:r>
-      <w:r>
-        <w:t xml:space="preserve">by </w:t>
+        <w:t xml:space="preserve"> Migration 0005 loads the 121 courses and 20 institutions of 2025/26 (generated by </w:t>
       </w:r>
       <w:r>
         <w:rPr>
@@ -10292,7 +10548,10 @@
         <w:spacing w:after="120"/>
       </w:pPr>
       <w:r>
-        <w:t>Messages are outside D1's cascade, so deleting an account also tells every group it was in to delete that account's messages (tested). All tables are in BCNF: every determinant is a candidate key; derived values (member counts, the senior badge text) are computed, never stored.</w:t>
+        <w:t xml:space="preserve">Messages are outside D1's cascade, so deleting an account also tells every group it was in to delete that account's </w:t>
+      </w:r>
+      <w:r>
+        <w:t>messages (tested). All tables are in BCNF: every determinant is a candidate key; derived values (member counts, the senior badge text) are computed, never stored.</w:t>
       </w:r>
     </w:p>
     <w:p>
@@ -10301,7 +10560,7 @@
         <w:keepNext/>
         <w:keepLines/>
       </w:pPr>
-      <w:bookmarkStart w:id="19" w:name="_Toc242917784"/>
+      <w:bookmarkStart w:id="19" w:name="_Toc242919528"/>
       <w:r>
         <w:t>2.7 Contact details (CR-003)</w:t>
       </w:r>
@@ -10319,10 +10578,10 @@
         <w:t>Decision.</w:t>
       </w:r>
       <w:r>
-        <w:t xml:space="preserve"> On 11 October 2026 the product owner made an account compulsory at the start, with full name, email, </w:t>
-      </w:r>
-      <w:r>
-        <w:t>mobile number and date of birth (the birthday moves here from the Alerts screen, where it stayed on the phone). This reverses the CR-001 promise "a username only". The README, the business case and the app's privacy text now say exactly what is collected and why.</w:t>
+        <w:t xml:space="preserve"> On 11 October 2026 the product owner made an account compulsory at the start, with full name, email, mobile number and date of birth (the birthday moves here from the Alerts screen, where it stayed on the phone). This </w:t>
+      </w:r>
+      <w:r>
+        <w:t>reverses the CR-001 promise "a username only". The README, the business case and the app's privacy text now say exactly what is collected and why.</w:t>
       </w:r>
     </w:p>
     <w:p>
@@ -10373,10 +10632,7 @@
         <w:t>account</w:t>
       </w:r>
       <w:r>
-        <w:t xml:space="preserve"> is the identity table shared by every role, </w:t>
-      </w:r>
-      <w:r>
-        <w:t>and personal contact data kept apart can be audited, exported or deleted on its own. It cascades with the account.</w:t>
+        <w:t xml:space="preserve"> is the identity table shared by every role, and personal contact data kept apart can be audited, exported or deleted on its own. It cascades with the account.</w:t>
       </w:r>
     </w:p>
     <w:tbl>
@@ -11013,7 +11269,10 @@
         <w:t>PUT /api/me/contact</w:t>
       </w:r>
       <w:r>
-        <w:t>). Safe default: no existing row is invented or guessed. Students under 18 confirm that a parent or guardian agrees (Personal Data Protection Act, No. 9 of 2022). The table is in BCNF: the only determinant is the key.</w:t>
+        <w:t xml:space="preserve">). Safe default: no existing row is invented or guessed. Students under 18 confirm that a </w:t>
+      </w:r>
+      <w:r>
+        <w:t>parent or guardian agrees (Personal Data Protection Act, No. 9 of 2022). The table is in BCNF: the only determinant is the key.</w:t>
       </w:r>
     </w:p>
     <w:p>
@@ -11022,7 +11281,7 @@
         <w:keepNext/>
         <w:keepLines/>
       </w:pPr>
-      <w:bookmarkStart w:id="20" w:name="_Toc242917785"/>
+      <w:bookmarkStart w:id="20" w:name="_Toc242919529"/>
       <w:r>
         <w:t>2.8 Answer feedback (CR-004)</w:t>
       </w:r>
@@ -11069,10 +11328,7 @@
         <w:t>fact_id</w:t>
       </w:r>
       <w:r>
-        <w:t xml:space="preserve"> is required), and an AI answer is not one. </w:t>
-      </w:r>
-      <w:r>
-        <w:t xml:space="preserve">A row holds the rating, the question, the answer, the handbook pages it cited (JSON, checked by </w:t>
+        <w:t xml:space="preserve"> is required), and an AI answer is not one. A row holds the rating, the question, the answer, the handbook pages it cited (JSON, checked by </w:t>
       </w:r>
       <w:r>
         <w:rPr>
@@ -11084,7 +11340,10 @@
         <w:t>json_valid</w:t>
       </w:r>
       <w:r>
-        <w:t>), an optional note, the app language and a review state. It holds nothing that identifies the student: no account, device or IP. The screen says the question and answer are sent before the student sends a report.</w:t>
+        <w:t xml:space="preserve">), an </w:t>
+      </w:r>
+      <w:r>
+        <w:t>optional note, the app language and a review state. It holds nothing that identifies the student: no account, device or IP. The screen says the question and answer are sent before the student sends a report.</w:t>
       </w:r>
     </w:p>
     <w:p>
@@ -11093,7 +11352,7 @@
         <w:keepNext/>
         <w:keepLines/>
       </w:pPr>
-      <w:bookmarkStart w:id="21" w:name="_Toc242917786"/>
+      <w:bookmarkStart w:id="21" w:name="_Toc242919530"/>
       <w:r>
         <w:t>2.9 Group rules and sample conversations (CR-005)</w:t>
       </w:r>
@@ -11128,7 +11387,10 @@
         <w:t>rules_version</w:t>
       </w:r>
       <w:r>
-        <w:t>, migration 0009) rather than a new table: one value per (group, member), fully dependent on the key, so the table stays in BCNF. A CHECK lists the versions that exist (</w:t>
+        <w:t xml:space="preserve">, migration 0009) rather than a new table: one value per (group, member), fully </w:t>
+      </w:r>
+      <w:r>
+        <w:t>dependent on the key, so the table stays in BCNF. A CHECK lists the versions that exist (</w:t>
       </w:r>
       <w:r>
         <w:rPr>
@@ -11225,7 +11487,7 @@
         <w:keepNext/>
         <w:keepLines/>
       </w:pPr>
-      <w:bookmarkStart w:id="22" w:name="_Toc242917787"/>
+      <w:bookmarkStart w:id="22" w:name="_Toc242919531"/>
       <w:r>
         <w:t>2.10 Journey, avatars and group rules on the account (CR-006)</w:t>
       </w:r>
@@ -11273,7 +11535,14 @@
           <w:b/>
           <w:bCs/>
         </w:rPr>
-        <w:t>only once its window is open</w:t>
+        <w:t xml:space="preserve">only once </w:t>
+      </w:r>
+      <w:r>
+        <w:rPr>
+          <w:b/>
+          <w:bCs/>
+        </w:rPr>
+        <w:t>its window is open</w:t>
       </w:r>
       <w:r>
         <w:t>, which the server checks. Migration 0010 implements the design below.</w:t>
@@ -11284,7 +11553,7 @@
         <w:pStyle w:val="Caption"/>
         <w:keepNext/>
       </w:pPr>
-      <w:bookmarkStart w:id="23" w:name="_Toc242917823"/>
+      <w:bookmarkStart w:id="23" w:name="_Toc242919569"/>
       <w:r>
         <w:lastRenderedPageBreak/>
         <w:t xml:space="preserve">Table </w:t>
@@ -12242,7 +12511,10 @@
         <w:t>Mapping.</w:t>
       </w:r>
       <w:r>
-        <w:t xml:space="preserve"> Every new relationship is many-to-many with its own attributes, so each maps to its own relation whose key is the pair of participating keys (mapping step 5). The avatar is a single-valued attribute of ACCOUNT and stays on it (step 1). The acceptance is no longer a column of GROUP_MEMBER because it does not depend on the group: under CR-005 the same fact was repeated once per group the student joined, a partial-dependency redundancy that CR-006 removes.</w:t>
+        <w:t xml:space="preserve"> Every new relationship is many-to-many with its own attributes, so each maps to its own relation whose key </w:t>
+      </w:r>
+      <w:r>
+        <w:t>is the pair of participating keys (mapping step 5). The avatar is a single-valued attribute of ACCOUNT and stays on it (step 1). The acceptance is no longer a column of GROUP_MEMBER because it does not depend on the group: under CR-005 the same fact was repeated once per group the student joined, a partial-dependency redundancy that CR-006 removes.</w:t>
       </w:r>
     </w:p>
     <w:p>
@@ -12356,10 +12628,7 @@
         <w:t>offering</w:t>
       </w:r>
       <w:r>
-        <w:t xml:space="preserve"> was defined in 0001 but left empty because the read model serves the </w:t>
-      </w:r>
-      <w:r>
-        <w:t xml:space="preserve">course data. 0010 fills it with the 255 Uni-Codes of 2025/26 (handbook pages 142 to 148, generated by </w:t>
+        <w:t xml:space="preserve"> was defined in 0001 but left empty because the read model serves the course data. 0010 fills it with the 255 Uni-Codes of 2025/26 (handbook pages 142 to 148, generated by </w:t>
       </w:r>
       <w:r>
         <w:rPr>
@@ -12446,10 +12715,7 @@
         <w:t>opensOn</w:t>
       </w:r>
       <w:r>
-        <w:t xml:space="preserve"> in the journey read model); while no date is announced it cannot be ticked, because ZedPath never invents a date. "I applied" on a followed </w:t>
-      </w:r>
-      <w:r>
-        <w:t>notice can be set only once the notice has opened. The Worker checks both against the read model, using the Sri Lanka date (UTC+05:30), before writing (</w:t>
+        <w:t xml:space="preserve"> in the journey read model); while no date is announced it cannot be ticked, because ZedPath never invents a date. "I applied" on a followed notice can be set only once the notice has opened. The Worker checks both against the read model, using the Sri Lanka date (UTC+05:30), before writing (</w:t>
       </w:r>
       <w:r>
         <w:rPr>
@@ -12501,10 +12767,10 @@
         <w:t>group_member.rules_version</w:t>
       </w:r>
       <w:r>
-        <w:t xml:space="preserve"> is </w:t>
-      </w:r>
-      <w:r>
-        <w:t>no longer read or written but is kept for now (expand, then contract): the previous release still writes it, so a rollback stays safe; a later migration drops it once this release is stable. No avatar means initials, as before. A new account's Journey is empty: nothing is ticked for the student. Journey items kept on a phone before CR-006 are copied to the account by the app on first use.</w:t>
+        <w:t xml:space="preserve"> is no longer read or written but is kept for now (expand, then contract): the previous release still writes it, so a </w:t>
+      </w:r>
+      <w:r>
+        <w:t>rollback stays safe; a later migration drops it once this release is stable. No avatar means initials, as before. A new account's Journey is empty: nothing is ticked for the student. Journey items kept on a phone before CR-006 are copied to the account by the app on first use.</w:t>
       </w:r>
     </w:p>
     <w:p>
@@ -12519,10 +12785,7 @@
         <w:t>Privacy.</w:t>
       </w:r>
       <w:r>
-        <w:t xml:space="preserve"> The members list of a group (members only) returns usernames, avatars and senior badges, never the name, </w:t>
-      </w:r>
-      <w:r>
-        <w:t xml:space="preserve">email or mobile in </w:t>
+        <w:t xml:space="preserve"> The members list of a group (members only) returns usernames, avatars and senior badges, never the name, email or mobile in </w:t>
       </w:r>
       <w:r>
         <w:rPr>
@@ -12534,7 +12797,10 @@
         <w:t>student_contact</w:t>
       </w:r>
       <w:r>
-        <w:t>. Every new relation cascades on account deletion. In each group's room, a message keeps the author's avatar as it was when posted, a snapshot like the author name (a deliberate departure).</w:t>
+        <w:t xml:space="preserve">. Every new relation cascades on account deletion. In each group's room, a message </w:t>
+      </w:r>
+      <w:r>
+        <w:t>keeps the author's avatar as it was when posted, a snapshot like the author name (a deliberate departure).</w:t>
       </w:r>
     </w:p>
     <w:p>
@@ -12543,7 +12809,7 @@
         <w:keepNext/>
         <w:keepLines/>
       </w:pPr>
-      <w:bookmarkStart w:id="24" w:name="_Toc242917788"/>
+      <w:bookmarkStart w:id="24" w:name="_Toc242919532"/>
       <w:r>
         <w:t>2.11 Demo accounts (CR-007)</w:t>
       </w:r>
@@ -12564,10 +12830,7 @@
         <w:t>private copy per visitor</w:t>
       </w:r>
       <w:r>
-        <w:t xml:space="preserve"> over one shared account. Each tap creates a throwaway account holding the sample student; it expires 24 hours </w:t>
-      </w:r>
-      <w:r>
-        <w:t>later and is deleted on a later demo tap (the free plan has no scheduled job).</w:t>
+        <w:t xml:space="preserve"> over one shared account. Each tap creates a throwaway account holding the sample student; it expires 24 hours later and is deleted on a later demo tap (the free plan has no scheduled job).</w:t>
       </w:r>
     </w:p>
     <w:p>
@@ -12602,7 +12865,7 @@
         <w:pStyle w:val="Caption"/>
         <w:keepNext/>
       </w:pPr>
-      <w:bookmarkStart w:id="25" w:name="_Toc242917824"/>
+      <w:bookmarkStart w:id="25" w:name="_Toc242919570"/>
       <w:r>
         <w:t xml:space="preserve">Table </w:t>
       </w:r>
@@ -13045,10 +13308,10 @@
         <w:t>worker/demo-login.test.ts</w:t>
       </w:r>
       <w:r>
-        <w:t xml:space="preserve">): a demo account has a random username and an </w:t>
-      </w:r>
-      <w:r>
-        <w:t>unusable random verifier (no password log-in); it reads groups but cannot create a group, report a message or post (the group room refuses its posts); visitors never see each other's data. Real accounts are unchanged (safe default).</w:t>
+        <w:t xml:space="preserve">): a demo account has a random username and an unusable random verifier (no password log-in); it reads groups but cannot create a group, report a message or post </w:t>
+      </w:r>
+      <w:r>
+        <w:t>(the group room refuses its posts); visitors never see each other's data. Real accounts are unchanged (safe default).</w:t>
       </w:r>
     </w:p>
     <w:p>
@@ -13057,7 +13320,7 @@
         <w:keepNext/>
         <w:keepLines/>
       </w:pPr>
-      <w:bookmarkStart w:id="26" w:name="_Toc242917789"/>
+      <w:bookmarkStart w:id="26" w:name="_Toc242919533"/>
       <w:r>
         <w:t>2.12 University facts from UGC statistics (read model)</w:t>
       </w:r>
@@ -13114,10 +13377,10 @@
         <w:t>worker/generated/statistics-2024.json</w:t>
       </w:r>
       <w:r>
-        <w:t xml:space="preserve">, keyed by institution letter. They are published, versioned reference data that students only read, so they are not stored in D1. Each fact keeps its </w:t>
-      </w:r>
-      <w:r>
-        <w:t>table, PDF page and URL, and the report's own caveats as flags (2024 provisional; "Information not submitted" shown as no number, never as zero; university totals that include campuses).</w:t>
+        <w:t xml:space="preserve">, keyed by institution letter. They are published, versioned reference data that students only read, so they are not stored in D1. Each fact keeps its table, PDF page and URL, and the report's own caveats as flags (2024 provisional; "Information not submitted" shown as </w:t>
+      </w:r>
+      <w:r>
+        <w:t>no number, never as zero; university totals that include campuses).</w:t>
       </w:r>
     </w:p>
     <w:p>
@@ -13126,19 +13389,77 @@
         <w:keepNext/>
         <w:keepLines/>
       </w:pPr>
-      <w:bookmarkStart w:id="27" w:name="_Toc242917790"/>
-      <w:r>
+      <w:bookmarkStart w:id="27" w:name="_Toc242919534"/>
+      <w:r>
+        <w:t>2.13 Rooms an account opened (security audit, lead 3)</w:t>
+      </w:r>
+      <w:bookmarkEnd w:id="27"/>
+    </w:p>
+    <w:p>
+      <w:pPr>
+        <w:spacing w:after="120"/>
+      </w:pPr>
+      <w:r>
+        <w:t xml:space="preserve">Group messages live in each room's Durable Object, outside D1's ON DELETE CASCADE. Deleting an account therefore has to tell each room to purge that account's messages, and before 0012 the Worker only knew the groups the account was </w:t>
+      </w:r>
+      <w:r>
+        <w:rPr>
+          <w:i/>
+          <w:iCs/>
+        </w:rPr>
+        <w:t>still</w:t>
+      </w:r>
+      <w:r>
+        <w:t xml:space="preserve"> in, so messages in groups it had left survived the deletion.</w:t>
+      </w:r>
+    </w:p>
+    <w:p>
+      <w:pPr>
+        <w:spacing w:after="120"/>
+      </w:pPr>
+      <w:r>
+        <w:rPr>
+          <w:b/>
+          <w:bCs/>
+        </w:rPr>
         <w:lastRenderedPageBreak/>
-        <w:t>2.13 Entity catalogue</w:t>
-      </w:r>
-      <w:bookmarkEnd w:id="27"/>
+        <w:t>Where the fact lives.</w:t>
+      </w:r>
+      <w:r>
+        <w:t xml:space="preserve"> "Account A opened room G" is a fact about the pair, with no other attributes than when it was first seen, so it is its own relation GROUP_ROOM_SEEN (account_id, group_id, first_at), primary key (account_id, group_id), both foreign keys ON DELETE CASCADE. It is written when the live chat connects (posting is only possible over that socket). Account deletion reads it, unioned with current memberships, </w:t>
+      </w:r>
+      <w:r>
+        <w:rPr>
+          <w:b/>
+          <w:bCs/>
+        </w:rPr>
+        <w:t>before</w:t>
+      </w:r>
+      <w:r>
+        <w:t xml:space="preserve"> deleting the account, then purges each </w:t>
+      </w:r>
+      <w:r>
+        <w:t>room (at most 45 rooms per request, the free-plan subrequest limit). Migration 0012 seeds it from current memberships so nothing is missed for existing accounts.</w:t>
+      </w:r>
+    </w:p>
+    <w:p>
+      <w:pPr>
+        <w:pStyle w:val="Heading2"/>
+        <w:keepNext/>
+        <w:keepLines/>
+      </w:pPr>
+      <w:bookmarkStart w:id="28" w:name="_Toc242919535"/>
+      <w:r>
+        <w:t>2.14 Entity catalogue</w:t>
+      </w:r>
+      <w:bookmarkEnd w:id="28"/>
     </w:p>
     <w:p>
       <w:pPr>
         <w:pStyle w:val="Caption"/>
         <w:keepNext/>
       </w:pPr>
-      <w:bookmarkStart w:id="28" w:name="_Toc242917825"/>
+      <w:bookmarkStart w:id="29" w:name="_Toc242919571"/>
       <w:r>
         <w:t xml:space="preserve">Table </w:t>
       </w:r>
@@ -13163,7 +13484,7 @@
       <w:r>
         <w:t>: Entities, their type, identifier and the requirements that justify them</w:t>
       </w:r>
-      <w:bookmarkEnd w:id="28"/>
+      <w:bookmarkEnd w:id="29"/>
     </w:p>
     <w:tbl>
       <w:tblPr>
@@ -16164,6 +16485,7 @@
                 <w:sz w:val="19"/>
                 <w:szCs w:val="19"/>
               </w:rPr>
+              <w:lastRenderedPageBreak/>
               <w:t>ROUTE</w:t>
             </w:r>
           </w:p>
@@ -16406,12 +16728,12 @@
         <w:keepLines/>
         <w:pageBreakBefore/>
       </w:pPr>
-      <w:bookmarkStart w:id="29" w:name="_Toc242917791"/>
+      <w:bookmarkStart w:id="30" w:name="_Toc242919536"/>
       <w:r>
         <w:lastRenderedPageBreak/>
         <w:t>3 Rule grammar</w:t>
       </w:r>
-      <w:bookmarkEnd w:id="29"/>
+      <w:bookmarkEnd w:id="30"/>
     </w:p>
     <w:p>
       <w:pPr>
@@ -16448,7 +16770,7 @@
         <w:pStyle w:val="Caption"/>
         <w:keepNext/>
       </w:pPr>
-      <w:bookmarkStart w:id="30" w:name="_Toc242917826"/>
+      <w:bookmarkStart w:id="31" w:name="_Toc242919572"/>
       <w:r>
         <w:t xml:space="preserve">Table </w:t>
       </w:r>
@@ -16473,7 +16795,7 @@
       <w:r>
         <w:t>: Rule node kinds and their meaning</w:t>
       </w:r>
-      <w:bookmarkEnd w:id="30"/>
+      <w:bookmarkEnd w:id="31"/>
     </w:p>
     <w:tbl>
       <w:tblPr>
@@ -17819,12 +18141,12 @@
         <w:keepLines/>
         <w:pageBreakBefore/>
       </w:pPr>
-      <w:bookmarkStart w:id="31" w:name="_Toc242917792"/>
+      <w:bookmarkStart w:id="32" w:name="_Toc242919537"/>
       <w:r>
         <w:lastRenderedPageBreak/>
         <w:t>4 Mapping the EER model to relations</w:t>
       </w:r>
-      <w:bookmarkEnd w:id="31"/>
+      <w:bookmarkEnd w:id="32"/>
     </w:p>
     <w:p>
       <w:pPr>
@@ -17839,7 +18161,7 @@
         <w:pStyle w:val="Caption"/>
         <w:keepNext/>
       </w:pPr>
-      <w:bookmarkStart w:id="32" w:name="_Toc242917827"/>
+      <w:bookmarkStart w:id="33" w:name="_Toc242919573"/>
       <w:r>
         <w:t xml:space="preserve">Table </w:t>
       </w:r>
@@ -17864,7 +18186,7 @@
       <w:r>
         <w:t>: EER-to-relational mapping steps applied</w:t>
       </w:r>
-      <w:bookmarkEnd w:id="32"/>
+      <w:bookmarkEnd w:id="33"/>
     </w:p>
     <w:tbl>
       <w:tblPr>
@@ -19630,7 +19952,7 @@
         <w:pStyle w:val="Caption"/>
         <w:keepNext/>
       </w:pPr>
-      <w:bookmarkStart w:id="33" w:name="_Toc242917828"/>
+      <w:bookmarkStart w:id="34" w:name="_Toc242919574"/>
       <w:r>
         <w:lastRenderedPageBreak/>
         <w:t xml:space="preserve">Table </w:t>
@@ -19656,7 +19978,7 @@
       <w:r>
         <w:t>: Mapping of the student-account model</w:t>
       </w:r>
-      <w:bookmarkEnd w:id="33"/>
+      <w:bookmarkEnd w:id="34"/>
     </w:p>
     <w:tbl>
       <w:tblPr>
@@ -20742,7 +21064,7 @@
         </w:rPr>
         <w:lastRenderedPageBreak/>
         <w:drawing>
-          <wp:inline distT="0" distB="0" distL="0" distR="0" wp14:anchorId="340B267E" wp14:editId="340B267F">
+          <wp:inline distT="0" distB="0" distL="0" distR="0" wp14:anchorId="4B72F3E0" wp14:editId="4B72F3E1">
             <wp:extent cx="6124575" cy="6562725"/>
             <wp:effectExtent l="0" t="0" r="0" b="0"/>
             <wp:docPr id="6" name="relational-admission.png" descr="Logical schema, admission data (generated from the migration file)" title="Logical schema, admission data (generated from the migration file)"/>
@@ -20785,7 +21107,7 @@
       <w:pPr>
         <w:pStyle w:val="Caption"/>
       </w:pPr>
-      <w:bookmarkStart w:id="34" w:name="_Toc242917819"/>
+      <w:bookmarkStart w:id="35" w:name="_Toc242919565"/>
       <w:r>
         <w:t xml:space="preserve">Figure </w:t>
       </w:r>
@@ -20810,7 +21132,7 @@
       <w:r>
         <w:t>: Logical schema, admission data (generated from the migration file)</w:t>
       </w:r>
-      <w:bookmarkEnd w:id="34"/>
+      <w:bookmarkEnd w:id="35"/>
     </w:p>
     <w:p>
       <w:pPr>
@@ -20824,7 +21146,7 @@
         </w:rPr>
         <w:lastRenderedPageBreak/>
         <w:drawing>
-          <wp:inline distT="0" distB="0" distL="0" distR="0" wp14:anchorId="340B2680" wp14:editId="340B2681">
+          <wp:inline distT="0" distB="0" distL="0" distR="0" wp14:anchorId="4B72F3E2" wp14:editId="4B72F3E3">
             <wp:extent cx="6124575" cy="5562600"/>
             <wp:effectExtent l="0" t="0" r="0" b="0"/>
             <wp:docPr id="7" name="relational-trust-journey.png" descr="Logical schema, trust, routes and journey data (generated from the migration file)" title="Logical schema, trust, routes and journey data (generated from the migration file)"/>
@@ -20867,7 +21189,7 @@
       <w:pPr>
         <w:pStyle w:val="Caption"/>
       </w:pPr>
-      <w:bookmarkStart w:id="35" w:name="_Toc242917820"/>
+      <w:bookmarkStart w:id="36" w:name="_Toc242919566"/>
       <w:r>
         <w:t xml:space="preserve">Figure </w:t>
       </w:r>
@@ -20892,7 +21214,7 @@
       <w:r>
         <w:t>: Logical schema, trust, routes and journey data (generated from the migration file)</w:t>
       </w:r>
-      <w:bookmarkEnd w:id="35"/>
+      <w:bookmarkEnd w:id="36"/>
     </w:p>
     <w:p>
       <w:pPr>
@@ -20905,7 +21227,7 @@
           <w:noProof/>
         </w:rPr>
         <w:drawing>
-          <wp:inline distT="0" distB="0" distL="0" distR="0" wp14:anchorId="340B2682" wp14:editId="340B2683">
+          <wp:inline distT="0" distB="0" distL="0" distR="0" wp14:anchorId="4B72F3E4" wp14:editId="4B72F3E5">
             <wp:extent cx="6124575" cy="2305050"/>
             <wp:effectExtent l="0" t="0" r="0" b="0"/>
             <wp:docPr id="8" name="relational-accounts.png" descr="Logical schema, optional student accounts (generated from the migration files)" title="Logical schema, optional student accounts (generated from the migration files)"/>
@@ -20948,7 +21270,7 @@
       <w:pPr>
         <w:pStyle w:val="Caption"/>
       </w:pPr>
-      <w:bookmarkStart w:id="36" w:name="_Toc242917821"/>
+      <w:bookmarkStart w:id="37" w:name="_Toc242919567"/>
       <w:r>
         <w:t xml:space="preserve">Figure </w:t>
       </w:r>
@@ -20973,7 +21295,7 @@
       <w:r>
         <w:t>: Logical schema, optional student accounts (generated from the migration files)</w:t>
       </w:r>
-      <w:bookmarkEnd w:id="36"/>
+      <w:bookmarkEnd w:id="37"/>
     </w:p>
     <w:p>
       <w:pPr>
@@ -20982,12 +21304,12 @@
         <w:keepLines/>
         <w:pageBreakBefore/>
       </w:pPr>
-      <w:bookmarkStart w:id="37" w:name="_Toc242917793"/>
+      <w:bookmarkStart w:id="38" w:name="_Toc242919538"/>
       <w:r>
         <w:lastRenderedPageBreak/>
         <w:t>5 Normalisation</w:t>
       </w:r>
-      <w:bookmarkEnd w:id="37"/>
+      <w:bookmarkEnd w:id="38"/>
     </w:p>
     <w:p>
       <w:pPr>
@@ -20995,11 +21317,11 @@
         <w:keepNext/>
         <w:keepLines/>
       </w:pPr>
-      <w:bookmarkStart w:id="38" w:name="_Toc242917794"/>
+      <w:bookmarkStart w:id="39" w:name="_Toc242919539"/>
       <w:r>
         <w:t>5.1 From the source form to 1NF</w:t>
       </w:r>
-      <w:bookmarkEnd w:id="38"/>
+      <w:bookmarkEnd w:id="39"/>
     </w:p>
     <w:p>
       <w:pPr>
@@ -21051,18 +21373,18 @@
         <w:keepNext/>
         <w:keepLines/>
       </w:pPr>
-      <w:bookmarkStart w:id="39" w:name="_Toc242917795"/>
+      <w:bookmarkStart w:id="40" w:name="_Toc242919540"/>
       <w:r>
         <w:t>5.2 Functional and multi-valued dependencies</w:t>
       </w:r>
-      <w:bookmarkEnd w:id="39"/>
+      <w:bookmarkEnd w:id="40"/>
     </w:p>
     <w:p>
       <w:pPr>
         <w:pStyle w:val="Caption"/>
         <w:keepNext/>
       </w:pPr>
-      <w:bookmarkStart w:id="40" w:name="_Toc242917829"/>
+      <w:bookmarkStart w:id="41" w:name="_Toc242919575"/>
       <w:r>
         <w:t xml:space="preserve">Table </w:t>
       </w:r>
@@ -21087,7 +21409,7 @@
       <w:r>
         <w:t>: Dependencies identified in R1</w:t>
       </w:r>
-      <w:bookmarkEnd w:id="40"/>
+      <w:bookmarkEnd w:id="41"/>
     </w:p>
     <w:tbl>
       <w:tblPr>
@@ -21961,11 +22283,11 @@
         <w:keepNext/>
         <w:keepLines/>
       </w:pPr>
-      <w:bookmarkStart w:id="41" w:name="_Toc242917796"/>
+      <w:bookmarkStart w:id="42" w:name="_Toc242919541"/>
       <w:r>
         <w:t>5.3 2NF, 3NF and BCNF</w:t>
       </w:r>
-      <w:bookmarkEnd w:id="41"/>
+      <w:bookmarkEnd w:id="42"/>
     </w:p>
     <w:p>
       <w:pPr>
@@ -22204,19 +22526,19 @@
         <w:keepNext/>
         <w:keepLines/>
       </w:pPr>
-      <w:bookmarkStart w:id="42" w:name="_Toc242917797"/>
+      <w:bookmarkStart w:id="43" w:name="_Toc242919542"/>
       <w:r>
         <w:lastRenderedPageBreak/>
         <w:t>5.4 Deliberate departures</w:t>
       </w:r>
-      <w:bookmarkEnd w:id="42"/>
+      <w:bookmarkEnd w:id="43"/>
     </w:p>
     <w:p>
       <w:pPr>
         <w:pStyle w:val="Caption"/>
         <w:keepNext/>
       </w:pPr>
-      <w:bookmarkStart w:id="43" w:name="_Toc242917830"/>
+      <w:bookmarkStart w:id="44" w:name="_Toc242919576"/>
       <w:r>
         <w:t xml:space="preserve">Table </w:t>
       </w:r>
@@ -22241,7 +22563,7 @@
       <w:r>
         <w:t>: Controlled denormalisations and why they are safe</w:t>
       </w:r>
-      <w:bookmarkEnd w:id="43"/>
+      <w:bookmarkEnd w:id="44"/>
     </w:p>
     <w:tbl>
       <w:tblPr>
@@ -22987,12 +23309,12 @@
         <w:keepLines/>
         <w:pageBreakBefore/>
       </w:pPr>
-      <w:bookmarkStart w:id="44" w:name="_Toc242917798"/>
+      <w:bookmarkStart w:id="45" w:name="_Toc242919543"/>
       <w:r>
         <w:lastRenderedPageBreak/>
         <w:t>6 Physical design for Cloudflare D1</w:t>
       </w:r>
-      <w:bookmarkEnd w:id="44"/>
+      <w:bookmarkEnd w:id="45"/>
     </w:p>
     <w:p>
       <w:pPr>
@@ -23000,11 +23322,11 @@
         <w:keepNext/>
         <w:keepLines/>
       </w:pPr>
-      <w:bookmarkStart w:id="45" w:name="_Toc242917799"/>
+      <w:bookmarkStart w:id="46" w:name="_Toc242919544"/>
       <w:r>
         <w:t>6.1 Conventions</w:t>
       </w:r>
-      <w:bookmarkEnd w:id="45"/>
+      <w:bookmarkEnd w:id="46"/>
     </w:p>
     <w:p>
       <w:pPr>
@@ -23239,18 +23561,18 @@
         <w:keepNext/>
         <w:keepLines/>
       </w:pPr>
-      <w:bookmarkStart w:id="46" w:name="_Toc242917800"/>
+      <w:bookmarkStart w:id="47" w:name="_Toc242919545"/>
       <w:r>
         <w:t>6.2 Indexes</w:t>
       </w:r>
-      <w:bookmarkEnd w:id="46"/>
+      <w:bookmarkEnd w:id="47"/>
     </w:p>
     <w:p>
       <w:pPr>
         <w:pStyle w:val="Caption"/>
         <w:keepNext/>
       </w:pPr>
-      <w:bookmarkStart w:id="47" w:name="_Toc242917831"/>
+      <w:bookmarkStart w:id="48" w:name="_Toc242919577"/>
       <w:r>
         <w:t xml:space="preserve">Table </w:t>
       </w:r>
@@ -23275,7 +23597,7 @@
       <w:r>
         <w:t>: Secondary indexes and the query each serves</w:t>
       </w:r>
-      <w:bookmarkEnd w:id="47"/>
+      <w:bookmarkEnd w:id="48"/>
     </w:p>
     <w:tbl>
       <w:tblPr>
@@ -24331,19 +24653,19 @@
         <w:keepNext/>
         <w:keepLines/>
       </w:pPr>
-      <w:bookmarkStart w:id="48" w:name="_Toc242917801"/>
+      <w:bookmarkStart w:id="49" w:name="_Toc242919546"/>
       <w:r>
         <w:lastRenderedPageBreak/>
         <w:t>6.3 Capacity against the free plan</w:t>
       </w:r>
-      <w:bookmarkEnd w:id="48"/>
+      <w:bookmarkEnd w:id="49"/>
     </w:p>
     <w:p>
       <w:pPr>
         <w:pStyle w:val="Caption"/>
         <w:keepNext/>
       </w:pPr>
-      <w:bookmarkStart w:id="49" w:name="_Toc242917832"/>
+      <w:bookmarkStart w:id="50" w:name="_Toc242919578"/>
       <w:r>
         <w:t xml:space="preserve">Table </w:t>
       </w:r>
@@ -24368,7 +24690,7 @@
       <w:r>
         <w:t>: Data volume per intake year and free-plan headroom</w:t>
       </w:r>
-      <w:bookmarkEnd w:id="49"/>
+      <w:bookmarkEnd w:id="50"/>
     </w:p>
     <w:tbl>
       <w:tblPr>
@@ -25030,12 +25352,12 @@
         <w:keepLines/>
         <w:pageBreakBefore/>
       </w:pPr>
-      <w:bookmarkStart w:id="50" w:name="_Toc242917802"/>
+      <w:bookmarkStart w:id="51" w:name="_Toc242919547"/>
       <w:r>
         <w:lastRenderedPageBreak/>
         <w:t>7 Validation against real data</w:t>
       </w:r>
-      <w:bookmarkEnd w:id="50"/>
+      <w:bookmarkEnd w:id="51"/>
     </w:p>
     <w:p>
       <w:pPr>
@@ -25062,7 +25384,7 @@
         <w:pStyle w:val="Caption"/>
         <w:keepNext/>
       </w:pPr>
-      <w:bookmarkStart w:id="51" w:name="_Toc242917833"/>
+      <w:bookmarkStart w:id="52" w:name="_Toc242919579"/>
       <w:r>
         <w:t xml:space="preserve">Table </w:t>
       </w:r>
@@ -25087,7 +25409,7 @@
       <w:r>
         <w:t>: Schema validation results (5 October 2026)</w:t>
       </w:r>
-      <w:bookmarkEnd w:id="51"/>
+      <w:bookmarkEnd w:id="52"/>
     </w:p>
     <w:tbl>
       <w:tblPr>
@@ -26512,7 +26834,7 @@
         <w:pStyle w:val="Caption"/>
         <w:keepNext/>
       </w:pPr>
-      <w:bookmarkStart w:id="52" w:name="_Toc242917834"/>
+      <w:bookmarkStart w:id="53" w:name="_Toc242919580"/>
       <w:r>
         <w:t xml:space="preserve">Table </w:t>
       </w:r>
@@ -26537,7 +26859,7 @@
       <w:r>
         <w:t>: Student-account validation results (5 October 2026)</w:t>
       </w:r>
-      <w:bookmarkEnd w:id="52"/>
+      <w:bookmarkEnd w:id="53"/>
     </w:p>
     <w:tbl>
       <w:tblPr>
@@ -27254,19 +27576,19 @@
         <w:keepLines/>
         <w:pageBreakBefore/>
       </w:pPr>
-      <w:bookmarkStart w:id="53" w:name="_Toc242917803"/>
+      <w:bookmarkStart w:id="54" w:name="_Toc242919548"/>
       <w:r>
         <w:lastRenderedPageBreak/>
         <w:t>Appendix A: Traceability: requirements to tables</w:t>
       </w:r>
-      <w:bookmarkEnd w:id="53"/>
+      <w:bookmarkEnd w:id="54"/>
     </w:p>
     <w:p>
       <w:pPr>
         <w:pStyle w:val="Caption"/>
         <w:keepNext/>
       </w:pPr>
-      <w:bookmarkStart w:id="54" w:name="_Toc242917835"/>
+      <w:bookmarkStart w:id="55" w:name="_Toc242919581"/>
       <w:r>
         <w:t xml:space="preserve">Table </w:t>
       </w:r>
@@ -27291,7 +27613,7 @@
       <w:r>
         <w:t>: Requirements and the tables that realise them</w:t>
       </w:r>
-      <w:bookmarkEnd w:id="54"/>
+      <w:bookmarkEnd w:id="55"/>
     </w:p>
     <w:tbl>
       <w:tblPr>
@@ -29408,6 +29730,86 @@
           </w:p>
         </w:tc>
       </w:tr>
+      <w:tr>
+        <w:tblPrEx>
+          <w:tblCellMar>
+            <w:top w:w="0" w:type="dxa"/>
+            <w:bottom w:w="0" w:type="dxa"/>
+          </w:tblCellMar>
+        </w:tblPrEx>
+        <w:trPr>
+          <w:cantSplit/>
+        </w:trPr>
+        <w:tc>
+          <w:tcPr>
+            <w:tcW w:w="4819" w:type="dxa"/>
+            <w:tcBorders>
+              <w:top w:val="single" w:sz="4" w:space="0" w:color="C9D3D0"/>
+              <w:left w:val="single" w:sz="4" w:space="0" w:color="C9D3D0"/>
+              <w:bottom w:val="single" w:sz="4" w:space="0" w:color="C9D3D0"/>
+              <w:right w:val="single" w:sz="4" w:space="0" w:color="C9D3D0"/>
+            </w:tcBorders>
+            <w:tcMar>
+              <w:top w:w="50" w:type="dxa"/>
+              <w:left w:w="100" w:type="dxa"/>
+              <w:bottom w:w="50" w:type="dxa"/>
+              <w:right w:w="100" w:type="dxa"/>
+            </w:tcMar>
+            <w:vAlign w:val="center"/>
+          </w:tcPr>
+          <w:p>
+            <w:pPr>
+              <w:spacing w:line="252" w:lineRule="auto"/>
+            </w:pPr>
+            <w:r>
+              <w:rPr>
+                <w:sz w:val="19"/>
+                <w:szCs w:val="19"/>
+              </w:rPr>
+              <w:t>Security audit run-1, lead 3 (deletion purges every room)</w:t>
+            </w:r>
+          </w:p>
+        </w:tc>
+        <w:tc>
+          <w:tcPr>
+            <w:tcW w:w="4819" w:type="dxa"/>
+            <w:tcBorders>
+              <w:top w:val="single" w:sz="4" w:space="0" w:color="C9D3D0"/>
+              <w:left w:val="single" w:sz="4" w:space="0" w:color="C9D3D0"/>
+              <w:bottom w:val="single" w:sz="4" w:space="0" w:color="C9D3D0"/>
+              <w:right w:val="single" w:sz="4" w:space="0" w:color="C9D3D0"/>
+            </w:tcBorders>
+            <w:tcMar>
+              <w:top w:w="50" w:type="dxa"/>
+              <w:left w:w="100" w:type="dxa"/>
+              <w:bottom w:w="50" w:type="dxa"/>
+              <w:right w:w="100" w:type="dxa"/>
+            </w:tcMar>
+            <w:vAlign w:val="center"/>
+          </w:tcPr>
+          <w:p>
+            <w:pPr>
+              <w:spacing w:line="252" w:lineRule="auto"/>
+            </w:pPr>
+            <w:r>
+              <w:rPr>
+                <w:rFonts w:ascii="Consolas" w:eastAsia="Consolas" w:hAnsi="Consolas" w:cs="Consolas"/>
+                <w:sz w:val="17"/>
+                <w:szCs w:val="17"/>
+                <w:shd w:val="clear" w:color="auto" w:fill="F2F4F3"/>
+              </w:rPr>
+              <w:t>group_room_seen</w:t>
+            </w:r>
+            <w:r>
+              <w:rPr>
+                <w:sz w:val="19"/>
+                <w:szCs w:val="19"/>
+              </w:rPr>
+              <w:t xml:space="preserve"> (0012)</w:t>
+            </w:r>
+          </w:p>
+        </w:tc>
+      </w:tr>
     </w:tbl>
     <w:p>
       <w:pPr>
@@ -29421,12 +29823,12 @@
         <w:keepLines/>
         <w:pageBreakBefore/>
       </w:pPr>
-      <w:bookmarkStart w:id="55" w:name="_Toc242917804"/>
+      <w:bookmarkStart w:id="56" w:name="_Toc242919549"/>
       <w:r>
         <w:lastRenderedPageBreak/>
         <w:t>Appendix B: Physical schema (migration 0001)</w:t>
       </w:r>
-      <w:bookmarkEnd w:id="55"/>
+      <w:bookmarkEnd w:id="56"/>
     </w:p>
     <w:p>
       <w:pPr>
@@ -34634,12 +35036,12 @@
         <w:keepLines/>
         <w:pageBreakBefore/>
       </w:pPr>
-      <w:bookmarkStart w:id="56" w:name="_Toc242917805"/>
+      <w:bookmarkStart w:id="57" w:name="_Toc242919550"/>
       <w:r>
         <w:lastRenderedPageBreak/>
         <w:t>Appendix C: Student accounts (migration 0003)</w:t>
       </w:r>
-      <w:bookmarkEnd w:id="56"/>
+      <w:bookmarkEnd w:id="57"/>
     </w:p>
     <w:p>
       <w:pPr>
@@ -36367,12 +36769,12 @@
         <w:keepLines/>
         <w:pageBreakBefore/>
       </w:pPr>
-      <w:bookmarkStart w:id="57" w:name="_Toc242917806"/>
+      <w:bookmarkStart w:id="58" w:name="_Toc242919551"/>
       <w:r>
         <w:lastRenderedPageBreak/>
         <w:t>Appendix D: Contact details (migration 0007)</w:t>
       </w:r>
-      <w:bookmarkEnd w:id="57"/>
+      <w:bookmarkEnd w:id="58"/>
     </w:p>
     <w:p>
       <w:pPr>
@@ -36763,12 +37165,12 @@
         <w:keepLines/>
         <w:pageBreakBefore/>
       </w:pPr>
-      <w:bookmarkStart w:id="58" w:name="_Toc242917807"/>
+      <w:bookmarkStart w:id="59" w:name="_Toc242919552"/>
       <w:r>
         <w:lastRenderedPageBreak/>
         <w:t>Appendix E: Answer feedback (migration 0008)</w:t>
       </w:r>
-      <w:bookmarkEnd w:id="58"/>
+      <w:bookmarkEnd w:id="59"/>
     </w:p>
     <w:p>
       <w:pPr>
@@ -37074,12 +37476,12 @@
         <w:keepLines/>
         <w:pageBreakBefore/>
       </w:pPr>
-      <w:bookmarkStart w:id="59" w:name="_Toc242917808"/>
+      <w:bookmarkStart w:id="60" w:name="_Toc242919553"/>
       <w:r>
         <w:lastRenderedPageBreak/>
         <w:t>Appendix F: Journey, avatars and group rules on the account (migration 0010)</w:t>
       </w:r>
-      <w:bookmarkEnd w:id="59"/>
+      <w:bookmarkEnd w:id="60"/>
     </w:p>
     <w:p>
       <w:pPr>
@@ -42090,12 +42492,12 @@
         <w:keepLines/>
         <w:pageBreakBefore/>
       </w:pPr>
-      <w:bookmarkStart w:id="60" w:name="_Toc242917809"/>
+      <w:bookmarkStart w:id="61" w:name="_Toc242919554"/>
       <w:r>
         <w:lastRenderedPageBreak/>
-        <w:t>Appendix G: Demo accounts (migration 0011)</w:t>
-      </w:r>
-      <w:bookmarkEnd w:id="60"/>
+        <w:t>Appendix G: Rooms an account opened (migration 0012)</w:t>
+      </w:r>
+      <w:bookmarkEnd w:id="61"/>
     </w:p>
     <w:p>
       <w:pPr>
@@ -42111,7 +42513,7 @@
           <w:szCs w:val="19"/>
           <w:shd w:val="clear" w:color="auto" w:fill="F2F4F3"/>
         </w:rPr>
-        <w:t>migrations/0011_demo_accounts.sql</w:t>
+        <w:t>migrations/0012_group_room_seen.sql</w:t>
       </w:r>
       <w:r>
         <w:t>.</w:t>
@@ -42134,7 +42536,7 @@
           <w:sz w:val="17"/>
           <w:szCs w:val="17"/>
         </w:rPr>
-        <w:t>-- 0011: CR-007 (Praveen 2026-10-15): "Try the demo" on the Welcome screen. Each tap makes a private throwaway account</w:t>
+        <w:t>-- 0012: security audit run-1, lead 3 (Praveen 2026-10-15: "do all hardening"). Deleting an account must remove its</w:t>
       </w:r>
     </w:p>
     <w:p>
@@ -42151,7 +42553,7 @@
           <w:sz w:val="17"/>
           <w:szCs w:val="17"/>
         </w:rPr>
-        <w:t>-- with the sample student, deleted 24 hours later. Designed in ZP-DOC-05, CR-007.</w:t>
+        <w:t>-- messages from every group room it used, including rooms it later left. Messages live in each room's Durable Object,</w:t>
       </w:r>
     </w:p>
     <w:p>
@@ -42168,6 +42570,23 @@
           <w:sz w:val="17"/>
           <w:szCs w:val="17"/>
         </w:rPr>
+        <w:t>-- outside D1's cascade, so the Worker needs to know which rooms to purge. Designed in ZP-DOC-05 (lead 3).</w:t>
+      </w:r>
+    </w:p>
+    <w:p>
+      <w:pPr>
+        <w:keepNext/>
+        <w:keepLines/>
+        <w:shd w:val="clear" w:color="auto" w:fill="F2F4F3"/>
+        <w:spacing w:line="240" w:lineRule="auto"/>
+        <w:ind w:left="113" w:right="113"/>
+      </w:pPr>
+      <w:r>
+        <w:rPr>
+          <w:rFonts w:ascii="Consolas" w:eastAsia="Consolas" w:hAnsi="Consolas" w:cs="Consolas"/>
+          <w:sz w:val="17"/>
+          <w:szCs w:val="17"/>
+        </w:rPr>
         <w:t>--</w:t>
       </w:r>
     </w:p>
@@ -42185,7 +42604,7 @@
           <w:sz w:val="17"/>
           <w:szCs w:val="17"/>
         </w:rPr>
-        <w:t>-- A demo account is an ordinary ACCOUNT with an expiry: no new table, so every child row (profile, list, journey,</w:t>
+        <w:t>-- One row per account per room it opened (written when the live chat connects). It is deleted with the account or the</w:t>
       </w:r>
     </w:p>
     <w:p>
@@ -42202,7 +42621,7 @@
           <w:sz w:val="17"/>
           <w:szCs w:val="17"/>
         </w:rPr>
-        <w:t>-- sessions, memberships) already cascades when it is deleted. NULL = a real account, the behaviour before CR-007.</w:t>
+        <w:t>-- group (CASCADE); the Worker reads it, with current memberships, BEFORE deleting the account.</w:t>
       </w:r>
     </w:p>
     <w:p>
@@ -42219,7 +42638,7 @@
           <w:sz w:val="17"/>
           <w:szCs w:val="17"/>
         </w:rPr>
-        <w:t>ALTER TABLE account ADD COLUMN demo_expires_at TEXT CHECK (demo_expires_at IS NULL OR demo_expires_at &gt; created_at);</w:t>
+        <w:t>CREATE TABLE group_room_seen (</w:t>
       </w:r>
     </w:p>
     <w:p>
@@ -42236,7 +42655,7 @@
           <w:sz w:val="17"/>
           <w:szCs w:val="17"/>
         </w:rPr>
-        <w:t xml:space="preserve"> </w:t>
+        <w:t xml:space="preserve">  account_id  INTEGER NOT NULL REFERENCES account(account_id) ON DELETE CASCADE,</w:t>
       </w:r>
     </w:p>
     <w:p>
@@ -42253,7 +42672,75 @@
           <w:sz w:val="17"/>
           <w:szCs w:val="17"/>
         </w:rPr>
-        <w:t>-- Cleanup finds expired demo accounts without scanning real ones (partial index: real accounts are not in it).</w:t>
+        <w:t xml:space="preserve">  group_id    INTEGER NOT NULL REFERENCES course_group(group_id) ON DELETE CASCADE,</w:t>
+      </w:r>
+    </w:p>
+    <w:p>
+      <w:pPr>
+        <w:keepNext/>
+        <w:keepLines/>
+        <w:shd w:val="clear" w:color="auto" w:fill="F2F4F3"/>
+        <w:spacing w:line="240" w:lineRule="auto"/>
+        <w:ind w:left="113" w:right="113"/>
+      </w:pPr>
+      <w:r>
+        <w:rPr>
+          <w:rFonts w:ascii="Consolas" w:eastAsia="Consolas" w:hAnsi="Consolas" w:cs="Consolas"/>
+          <w:sz w:val="17"/>
+          <w:szCs w:val="17"/>
+        </w:rPr>
+        <w:t xml:space="preserve">  first_at    TEXT    NOT NULL,</w:t>
+      </w:r>
+    </w:p>
+    <w:p>
+      <w:pPr>
+        <w:keepNext/>
+        <w:keepLines/>
+        <w:shd w:val="clear" w:color="auto" w:fill="F2F4F3"/>
+        <w:spacing w:line="240" w:lineRule="auto"/>
+        <w:ind w:left="113" w:right="113"/>
+      </w:pPr>
+      <w:r>
+        <w:rPr>
+          <w:rFonts w:ascii="Consolas" w:eastAsia="Consolas" w:hAnsi="Consolas" w:cs="Consolas"/>
+          <w:sz w:val="17"/>
+          <w:szCs w:val="17"/>
+        </w:rPr>
+        <w:t xml:space="preserve">  PRIMARY KEY (account_id, group_id)</w:t>
+      </w:r>
+    </w:p>
+    <w:p>
+      <w:pPr>
+        <w:keepNext/>
+        <w:keepLines/>
+        <w:shd w:val="clear" w:color="auto" w:fill="F2F4F3"/>
+        <w:spacing w:line="240" w:lineRule="auto"/>
+        <w:ind w:left="113" w:right="113"/>
+      </w:pPr>
+      <w:r>
+        <w:rPr>
+          <w:rFonts w:ascii="Consolas" w:eastAsia="Consolas" w:hAnsi="Consolas" w:cs="Consolas"/>
+          <w:sz w:val="17"/>
+          <w:szCs w:val="17"/>
+        </w:rPr>
+        <w:t>) STRICT, WITHOUT ROWID;</w:t>
+      </w:r>
+    </w:p>
+    <w:p>
+      <w:pPr>
+        <w:keepNext/>
+        <w:keepLines/>
+        <w:shd w:val="clear" w:color="auto" w:fill="F2F4F3"/>
+        <w:spacing w:line="240" w:lineRule="auto"/>
+        <w:ind w:left="113" w:right="113"/>
+      </w:pPr>
+      <w:r>
+        <w:rPr>
+          <w:rFonts w:ascii="Consolas" w:eastAsia="Consolas" w:hAnsi="Consolas" w:cs="Consolas"/>
+          <w:sz w:val="17"/>
+          <w:szCs w:val="17"/>
+        </w:rPr>
+        <w:t>-- Rooms a member is in today were opened by them or not; seed with current memberships so nothing is missed.</w:t>
       </w:r>
     </w:p>
     <w:p>
@@ -42272,7 +42759,7 @@
           <w:sz w:val="17"/>
           <w:szCs w:val="17"/>
         </w:rPr>
-        <w:t>CREATE INDEX idx_account_demo_expires ON account(demo_expires_at) WHERE demo_expires_at IS NOT NULL;</w:t>
+        <w:t>INSERT OR IGNORE INTO group_room_seen (account_id, group_id, first_at) SELECT account_id, group_id, joined_at FROM group_member;</w:t>
       </w:r>
     </w:p>
     <w:p>
@@ -42282,12 +42769,12 @@
         <w:keepLines/>
         <w:pageBreakBefore/>
       </w:pPr>
-      <w:bookmarkStart w:id="61" w:name="_Toc242917810"/>
+      <w:bookmarkStart w:id="62" w:name="_Toc242919555"/>
       <w:r>
         <w:lastRenderedPageBreak/>
-        <w:t>Appendix H: Group rules (migration 0009)</w:t>
-      </w:r>
-      <w:bookmarkEnd w:id="61"/>
+        <w:t>Appendix H: Demo accounts (migration 0011)</w:t>
+      </w:r>
+      <w:bookmarkEnd w:id="62"/>
     </w:p>
     <w:p>
       <w:pPr>
@@ -42303,7 +42790,7 @@
           <w:szCs w:val="19"/>
           <w:shd w:val="clear" w:color="auto" w:fill="F2F4F3"/>
         </w:rPr>
-        <w:t>migrations/0009_group_rules.sql</w:t>
+        <w:t>migrations/0011_demo_accounts.sql</w:t>
       </w:r>
       <w:r>
         <w:t>.</w:t>
@@ -42326,7 +42813,7 @@
           <w:sz w:val="17"/>
           <w:szCs w:val="17"/>
         </w:rPr>
-        <w:t>-- 0009: group rules (CR-005, video 2 2026-10-11: "Groups should have rules too"). Designed in ZP-DOC-05, CR-005.</w:t>
+        <w:t>-- 0011: CR-007 (Praveen 2026-10-15): "Try the demo" on the Welcome screen. Each tap makes a private throwaway account</w:t>
       </w:r>
     </w:p>
     <w:p>
@@ -42343,7 +42830,7 @@
           <w:sz w:val="17"/>
           <w:szCs w:val="17"/>
         </w:rPr>
-        <w:t>-- A member accepts the group rules before taking part; the accepted version is recorded on the membership, so a new</w:t>
+        <w:t>-- with the sample student, deleted 24 hours later. Designed in ZP-DOC-05, CR-007.</w:t>
       </w:r>
     </w:p>
     <w:p>
@@ -42360,7 +42847,7 @@
           <w:sz w:val="17"/>
           <w:szCs w:val="17"/>
         </w:rPr>
-        <w:t>-- version of the rules can be asked for again. NULL = joined before rules existed (or not yet accepted): the Worker</w:t>
+        <w:t>--</w:t>
       </w:r>
     </w:p>
     <w:p>
@@ -42377,7 +42864,7 @@
           <w:sz w:val="17"/>
           <w:szCs w:val="17"/>
         </w:rPr>
-        <w:t>-- then keeps the live room closed until the member accepts (enforced in worker/groups.ts, not only on the phone).</w:t>
+        <w:t>-- A demo account is an ordinary ACCOUNT with an expiry: no new table, so every child row (profile, list, journey,</w:t>
       </w:r>
     </w:p>
     <w:p>
@@ -42394,7 +42881,58 @@
           <w:sz w:val="17"/>
           <w:szCs w:val="17"/>
         </w:rPr>
-        <w:t>-- Reuses group_member (one row per member per group) instead of a new table: acceptance is a fact about that row.</w:t>
+        <w:t>-- sessions, memberships) already cascades when it is deleted. NULL = a real account, the behaviour before CR-007.</w:t>
+      </w:r>
+    </w:p>
+    <w:p>
+      <w:pPr>
+        <w:keepNext/>
+        <w:keepLines/>
+        <w:shd w:val="clear" w:color="auto" w:fill="F2F4F3"/>
+        <w:spacing w:line="240" w:lineRule="auto"/>
+        <w:ind w:left="113" w:right="113"/>
+      </w:pPr>
+      <w:r>
+        <w:rPr>
+          <w:rFonts w:ascii="Consolas" w:eastAsia="Consolas" w:hAnsi="Consolas" w:cs="Consolas"/>
+          <w:sz w:val="17"/>
+          <w:szCs w:val="17"/>
+        </w:rPr>
+        <w:t>ALTER TABLE account ADD COLUMN demo_expires_at TEXT CHECK (demo_expires_at IS NULL OR demo_expires_at &gt; created_at);</w:t>
+      </w:r>
+    </w:p>
+    <w:p>
+      <w:pPr>
+        <w:keepNext/>
+        <w:keepLines/>
+        <w:shd w:val="clear" w:color="auto" w:fill="F2F4F3"/>
+        <w:spacing w:line="240" w:lineRule="auto"/>
+        <w:ind w:left="113" w:right="113"/>
+      </w:pPr>
+      <w:r>
+        <w:rPr>
+          <w:rFonts w:ascii="Consolas" w:eastAsia="Consolas" w:hAnsi="Consolas" w:cs="Consolas"/>
+          <w:sz w:val="17"/>
+          <w:szCs w:val="17"/>
+        </w:rPr>
+        <w:t xml:space="preserve"> </w:t>
+      </w:r>
+    </w:p>
+    <w:p>
+      <w:pPr>
+        <w:keepNext/>
+        <w:keepLines/>
+        <w:shd w:val="clear" w:color="auto" w:fill="F2F4F3"/>
+        <w:spacing w:line="240" w:lineRule="auto"/>
+        <w:ind w:left="113" w:right="113"/>
+      </w:pPr>
+      <w:r>
+        <w:rPr>
+          <w:rFonts w:ascii="Consolas" w:eastAsia="Consolas" w:hAnsi="Consolas" w:cs="Consolas"/>
+          <w:sz w:val="17"/>
+          <w:szCs w:val="17"/>
+        </w:rPr>
+        <w:t>-- Cleanup finds expired demo accounts without scanning real ones (partial index: real accounts are not in it).</w:t>
       </w:r>
     </w:p>
     <w:p>
@@ -42413,7 +42951,7 @@
           <w:sz w:val="17"/>
           <w:szCs w:val="17"/>
         </w:rPr>
-        <w:t>ALTER TABLE group_member ADD COLUMN rules_version TEXT CHECK (rules_version IS NULL OR rules_version IN ('2026-10-11'));</w:t>
+        <w:t>CREATE INDEX idx_account_demo_expires ON account(demo_expires_at) WHERE demo_expires_at IS NOT NULL;</w:t>
       </w:r>
     </w:p>
     <w:p>
@@ -42423,12 +42961,12 @@
         <w:keepLines/>
         <w:pageBreakBefore/>
       </w:pPr>
-      <w:bookmarkStart w:id="62" w:name="_Toc242917811"/>
+      <w:bookmarkStart w:id="63" w:name="_Toc242919556"/>
       <w:r>
         <w:lastRenderedPageBreak/>
-        <w:t>Appendix I: Groups (migration 0006)</w:t>
-      </w:r>
-      <w:bookmarkEnd w:id="62"/>
+        <w:t>Appendix I: Group rules (migration 0009)</w:t>
+      </w:r>
+      <w:bookmarkEnd w:id="63"/>
     </w:p>
     <w:p>
       <w:pPr>
@@ -42444,10 +42982,139 @@
           <w:szCs w:val="19"/>
           <w:shd w:val="clear" w:color="auto" w:fill="F2F4F3"/>
         </w:rPr>
-        <w:t>migrations/0006_groups.sql</w:t>
-      </w:r>
-      <w:r>
-        <w:t xml:space="preserve">. Migration 0005 inserts the courses and institutions and is generated by </w:t>
+        <w:t>migrations/0009_group_rules.sql</w:t>
+      </w:r>
+      <w:r>
+        <w:t>.</w:t>
+      </w:r>
+    </w:p>
+    <w:p>
+      <w:pPr>
+        <w:keepNext/>
+        <w:keepLines/>
+        <w:pBdr>
+          <w:top w:val="single" w:sz="4" w:space="4" w:color="C9D3D0"/>
+        </w:pBdr>
+        <w:shd w:val="clear" w:color="auto" w:fill="F2F4F3"/>
+        <w:spacing w:before="120" w:line="240" w:lineRule="auto"/>
+        <w:ind w:left="113" w:right="113"/>
+      </w:pPr>
+      <w:r>
+        <w:rPr>
+          <w:rFonts w:ascii="Consolas" w:eastAsia="Consolas" w:hAnsi="Consolas" w:cs="Consolas"/>
+          <w:sz w:val="17"/>
+          <w:szCs w:val="17"/>
+        </w:rPr>
+        <w:t>-- 0009: group rules (CR-005, video 2 2026-10-11: "Groups should have rules too"). Designed in ZP-DOC-05, CR-005.</w:t>
+      </w:r>
+    </w:p>
+    <w:p>
+      <w:pPr>
+        <w:keepNext/>
+        <w:keepLines/>
+        <w:shd w:val="clear" w:color="auto" w:fill="F2F4F3"/>
+        <w:spacing w:line="240" w:lineRule="auto"/>
+        <w:ind w:left="113" w:right="113"/>
+      </w:pPr>
+      <w:r>
+        <w:rPr>
+          <w:rFonts w:ascii="Consolas" w:eastAsia="Consolas" w:hAnsi="Consolas" w:cs="Consolas"/>
+          <w:sz w:val="17"/>
+          <w:szCs w:val="17"/>
+        </w:rPr>
+        <w:t>-- A member accepts the group rules before taking part; the accepted version is recorded on the membership, so a new</w:t>
+      </w:r>
+    </w:p>
+    <w:p>
+      <w:pPr>
+        <w:keepNext/>
+        <w:keepLines/>
+        <w:shd w:val="clear" w:color="auto" w:fill="F2F4F3"/>
+        <w:spacing w:line="240" w:lineRule="auto"/>
+        <w:ind w:left="113" w:right="113"/>
+      </w:pPr>
+      <w:r>
+        <w:rPr>
+          <w:rFonts w:ascii="Consolas" w:eastAsia="Consolas" w:hAnsi="Consolas" w:cs="Consolas"/>
+          <w:sz w:val="17"/>
+          <w:szCs w:val="17"/>
+        </w:rPr>
+        <w:t>-- version of the rules can be asked for again. NULL = joined before rules existed (or not yet accepted): the Worker</w:t>
+      </w:r>
+    </w:p>
+    <w:p>
+      <w:pPr>
+        <w:keepNext/>
+        <w:keepLines/>
+        <w:shd w:val="clear" w:color="auto" w:fill="F2F4F3"/>
+        <w:spacing w:line="240" w:lineRule="auto"/>
+        <w:ind w:left="113" w:right="113"/>
+      </w:pPr>
+      <w:r>
+        <w:rPr>
+          <w:rFonts w:ascii="Consolas" w:eastAsia="Consolas" w:hAnsi="Consolas" w:cs="Consolas"/>
+          <w:sz w:val="17"/>
+          <w:szCs w:val="17"/>
+        </w:rPr>
+        <w:t>-- then keeps the live room closed until the member accepts (enforced in worker/groups.ts, not only on the phone).</w:t>
+      </w:r>
+    </w:p>
+    <w:p>
+      <w:pPr>
+        <w:keepNext/>
+        <w:keepLines/>
+        <w:shd w:val="clear" w:color="auto" w:fill="F2F4F3"/>
+        <w:spacing w:line="240" w:lineRule="auto"/>
+        <w:ind w:left="113" w:right="113"/>
+      </w:pPr>
+      <w:r>
+        <w:rPr>
+          <w:rFonts w:ascii="Consolas" w:eastAsia="Consolas" w:hAnsi="Consolas" w:cs="Consolas"/>
+          <w:sz w:val="17"/>
+          <w:szCs w:val="17"/>
+        </w:rPr>
+        <w:t>-- Reuses group_member (one row per member per group) instead of a new table: acceptance is a fact about that row.</w:t>
+      </w:r>
+    </w:p>
+    <w:p>
+      <w:pPr>
+        <w:keepLines/>
+        <w:pBdr>
+          <w:bottom w:val="single" w:sz="4" w:space="4" w:color="C9D3D0"/>
+        </w:pBdr>
+        <w:shd w:val="clear" w:color="auto" w:fill="F2F4F3"/>
+        <w:spacing w:after="160" w:line="240" w:lineRule="auto"/>
+        <w:ind w:left="113" w:right="113"/>
+      </w:pPr>
+      <w:r>
+        <w:rPr>
+          <w:rFonts w:ascii="Consolas" w:eastAsia="Consolas" w:hAnsi="Consolas" w:cs="Consolas"/>
+          <w:sz w:val="17"/>
+          <w:szCs w:val="17"/>
+        </w:rPr>
+        <w:t>ALTER TABLE group_member ADD COLUMN rules_version TEXT CHECK (rules_version IS NULL OR rules_version IN ('2026-10-11'));</w:t>
+      </w:r>
+    </w:p>
+    <w:p>
+      <w:pPr>
+        <w:pStyle w:val="Heading1"/>
+        <w:keepNext/>
+        <w:keepLines/>
+        <w:pageBreakBefore/>
+      </w:pPr>
+      <w:bookmarkStart w:id="64" w:name="_Toc242919557"/>
+      <w:r>
+        <w:lastRenderedPageBreak/>
+        <w:t>Appendix J: Groups (migration 0006)</w:t>
+      </w:r>
+      <w:bookmarkEnd w:id="64"/>
+    </w:p>
+    <w:p>
+      <w:pPr>
+        <w:spacing w:after="120"/>
+      </w:pPr>
+      <w:r>
+        <w:t xml:space="preserve">Reproduced verbatim from </w:t>
       </w:r>
       <w:r>
         <w:rPr>
@@ -42456,6 +43123,18 @@
           <w:szCs w:val="19"/>
           <w:shd w:val="clear" w:color="auto" w:fill="F2F4F3"/>
         </w:rPr>
+        <w:t>migrations/0006_groups.sql</w:t>
+      </w:r>
+      <w:r>
+        <w:t xml:space="preserve">. Migration 0005 inserts the courses and institutions and is generated by </w:t>
+      </w:r>
+      <w:r>
+        <w:rPr>
+          <w:rFonts w:ascii="Consolas" w:eastAsia="Consolas" w:hAnsi="Consolas" w:cs="Consolas"/>
+          <w:sz w:val="19"/>
+          <w:szCs w:val="19"/>
+          <w:shd w:val="clear" w:color="auto" w:fill="F2F4F3"/>
+        </w:rPr>
         <w:t>tools/seed/courses-sql.ts</w:t>
       </w:r>
       <w:r>
@@ -43676,19 +44355,19 @@
         <w:keepLines/>
         <w:pageBreakBefore/>
       </w:pPr>
-      <w:bookmarkStart w:id="63" w:name="_Toc242917812"/>
+      <w:bookmarkStart w:id="65" w:name="_Toc242919558"/>
       <w:r>
         <w:lastRenderedPageBreak/>
-        <w:t>Appendix J: Glossary</w:t>
-      </w:r>
-      <w:bookmarkEnd w:id="63"/>
+        <w:t>Appendix K: Glossary</w:t>
+      </w:r>
+      <w:bookmarkEnd w:id="65"/>
     </w:p>
     <w:p>
       <w:pPr>
         <w:pStyle w:val="Caption"/>
         <w:keepNext/>
       </w:pPr>
-      <w:bookmarkStart w:id="64" w:name="_Toc242917836"/>
+      <w:bookmarkStart w:id="66" w:name="_Toc242919582"/>
       <w:r>
         <w:t xml:space="preserve">Table </w:t>
       </w:r>
@@ -43713,7 +44392,7 @@
       <w:r>
         <w:t>: Terms used in this document</w:t>
       </w:r>
-      <w:bookmarkEnd w:id="64"/>
+      <w:bookmarkEnd w:id="66"/>
     </w:p>
     <w:tbl>
       <w:tblPr>
@@ -44405,19 +45084,19 @@
         <w:keepLines/>
         <w:pageBreakBefore/>
       </w:pPr>
-      <w:bookmarkStart w:id="65" w:name="_Toc242917813"/>
+      <w:bookmarkStart w:id="67" w:name="_Toc242919559"/>
       <w:r>
         <w:lastRenderedPageBreak/>
-        <w:t>Appendix K: References</w:t>
-      </w:r>
-      <w:bookmarkEnd w:id="65"/>
+        <w:t>Appendix L: References</w:t>
+      </w:r>
+      <w:bookmarkEnd w:id="67"/>
     </w:p>
     <w:p>
       <w:pPr>
         <w:pStyle w:val="Caption"/>
         <w:keepNext/>
       </w:pPr>
-      <w:bookmarkStart w:id="66" w:name="_Toc242917837"/>
+      <w:bookmarkStart w:id="68" w:name="_Toc242919583"/>
       <w:r>
         <w:t xml:space="preserve">Table </w:t>
       </w:r>
@@ -44442,7 +45121,7 @@
       <w:r>
         <w:t>: Sources referred to in this document</w:t>
       </w:r>
-      <w:bookmarkEnd w:id="66"/>
+      <w:bookmarkEnd w:id="68"/>
     </w:p>
     <w:tbl>
       <w:tblPr>
@@ -45348,229 +46027,229 @@
 <file path=word/numbering.xml><?xml version="1.0" encoding="utf-8"?>
 <w:numbering xmlns:wpc="http://schemas.microsoft.com/office/word/2010/wordprocessingCanvas" xmlns:cx="http://schemas.microsoft.com/office/drawing/2014/chartex" xmlns:cx1="http://schemas.microsoft.com/office/drawing/2015/9/8/chartex" xmlns:cx2="http://schemas.microsoft.com/office/drawing/2015/10/21/chartex" xmlns:cx3="http://schemas.microsoft.com/office/drawing/2016/5/9/chartex" xmlns:cx4="http://schemas.microsoft.com/office/drawing/2016/5/10/chartex" xmlns:cx5="http://schemas.microsoft.com/office/drawing/2016/5/11/chartex" xmlns:cx6="http://schemas.microsoft.com/office/drawing/2016/5/12/chartex" xmlns:cx7="http://schemas.microsoft.com/office/drawing/2016/5/13/chartex" xmlns:cx8="http://schemas.microsoft.com/office/drawing/2016/5/14/chartex" xmlns:mc="http://schemas.openxmlformats.org/markup-compatibility/2006" xmlns:aink="http://schemas.microsoft.com/office/drawing/2016/ink" xmlns:am3d="http://schemas.microsoft.com/office/drawing/2017/model3d" xmlns:o="urn:schemas-microsoft-com:office:office" xmlns:oel="http://schemas.microsoft.com/office/2019/extlst" xmlns:r="http://schemas.openxmlformats.org/officeDocument/2006/relationships" xmlns:m="http://schemas.openxmlformats.org/officeDocument/2006/math" xmlns:v="urn:schemas-microsoft-com:vml" xmlns:wp14="http://schemas.microsoft.com/office/word/2010/wordprocessingDrawing" xmlns:wp="http://schemas.openxmlformats.org/drawingml/2006/wordprocessingDrawing" xmlns:w10="urn:schemas-microsoft-com:office:word" xmlns:w="http://schemas.openxmlformats.org/wordprocessingml/2006/main" xmlns:w14="http://schemas.microsoft.com/office/word/2010/wordml" xmlns:w15="http://schemas.microsoft.com/office/word/2012/wordml" xmlns:w16cex="http://schemas.microsoft.com/office/word/2018/wordml/cex" xmlns:w16cid="http://schemas.microsoft.com/office/word/2016/wordml/cid" xmlns:w16="http://schemas.microsoft.com/office/word/2018/wordml" xmlns:w16du="http://schemas.microsoft.com/office/word/2023/wordml/word16du" xmlns:w16sdtdh="http://schemas.microsoft.com/office/word/2020/wordml/sdtdatahash" xmlns:w16sdtfl="http://schemas.microsoft.com/office/word/2024/wordml/sdtformatlock" xmlns:w16se="http://schemas.microsoft.com/office/word/2015/wordml/symex" xmlns:wpg="http://schemas.microsoft.com/office/word/2010/wordprocessingGroup" xmlns:wpi="http://schemas.microsoft.com/office/word/2010/wordprocessingInk" xmlns:wne="http://schemas.microsoft.com/office/word/2006/wordml" xmlns:wps="http://schemas.microsoft.com/office/word/2010/wordprocessingShape" mc:Ignorable="w14 w15 w16se w16cid w16 w16cex w16sdtdh w16sdtfl w16du wp14">
   <w:abstractNum w:abstractNumId="0" w15:restartNumberingAfterBreak="0">
-    <w:nsid w:val="020F21CC"/>
+    <w:nsid w:val="12E93460"/>
     <w:multiLevelType w:val="hybridMultilevel"/>
-    <w:tmpl w:val="B4DAC41E"/>
-    <w:lvl w:ilvl="0" w:tplc="61F4384A" w:tentative="1">
+    <w:tmpl w:val="DEF8721C"/>
+    <w:lvl w:ilvl="0" w:tplc="0A20A82E" w:tentative="1">
       <w:start w:val="1"/>
-      <w:numFmt w:val="decimal"/>
-      <w:lvlText w:val="%1."/>
+      <w:numFmt w:val="bullet"/>
+      <w:lvlText w:val="●"/>
       <w:lvlJc w:val="left"/>
       <w:pPr>
         <w:ind w:left="720" w:hanging="360"/>
       </w:pPr>
     </w:lvl>
-    <w:lvl w:ilvl="1" w:tplc="D0CE0194" w:tentative="1">
+    <w:lvl w:ilvl="1" w:tplc="8C121566" w:tentative="1">
       <w:start w:val="1"/>
-      <w:numFmt w:val="lowerLetter"/>
-      <w:lvlText w:val="%2."/>
+      <w:numFmt w:val="bullet"/>
+      <w:lvlText w:val="○"/>
       <w:lvlJc w:val="left"/>
       <w:pPr>
-        <w:ind w:left="1080" w:hanging="360"/>
+        <w:ind w:left="1440" w:hanging="360"/>
       </w:pPr>
     </w:lvl>
-    <w:lvl w:ilvl="2" w:tplc="CDFEFFD0" w:tentative="1">
+    <w:lvl w:ilvl="2" w:tplc="305CBCFA" w:tentative="1">
       <w:start w:val="1"/>
-      <w:numFmt w:val="lowerRoman"/>
-      <w:lvlText w:val="%3."/>
+      <w:numFmt w:val="bullet"/>
+      <w:lvlText w:val="■"/>
       <w:lvlJc w:val="left"/>
       <w:pPr>
-        <w:ind w:left="1440" w:hanging="360"/>
+        <w:ind w:left="2160" w:hanging="360"/>
       </w:pPr>
     </w:lvl>
-    <w:lvl w:ilvl="3" w:tplc="9D683B78">
+    <w:lvl w:ilvl="3" w:tplc="77F803B4" w:tentative="1">
+      <w:start w:val="1"/>
+      <w:numFmt w:val="bullet"/>
+      <w:lvlText w:val="●"/>
+      <w:lvlJc w:val="left"/>
+      <w:pPr>
+        <w:ind w:left="2880" w:hanging="360"/>
+      </w:pPr>
+    </w:lvl>
+    <w:lvl w:ilvl="4" w:tplc="63566C5E" w:tentative="1">
+      <w:start w:val="1"/>
+      <w:numFmt w:val="bullet"/>
+      <w:lvlText w:val="○"/>
+      <w:lvlJc w:val="left"/>
+      <w:pPr>
+        <w:ind w:left="3600" w:hanging="360"/>
+      </w:pPr>
+    </w:lvl>
+    <w:lvl w:ilvl="5" w:tplc="E1D8DCAE" w:tentative="1">
+      <w:start w:val="1"/>
+      <w:numFmt w:val="bullet"/>
+      <w:lvlText w:val="■"/>
+      <w:lvlJc w:val="left"/>
+      <w:pPr>
+        <w:ind w:left="4320" w:hanging="360"/>
+      </w:pPr>
+    </w:lvl>
+    <w:lvl w:ilvl="6" w:tplc="8D160CE0" w:tentative="1">
+      <w:start w:val="1"/>
+      <w:numFmt w:val="bullet"/>
+      <w:lvlText w:val="●"/>
+      <w:lvlJc w:val="left"/>
+      <w:pPr>
+        <w:ind w:left="5040" w:hanging="360"/>
+      </w:pPr>
+    </w:lvl>
+    <w:lvl w:ilvl="7" w:tplc="340C34CA" w:tentative="1">
+      <w:start w:val="1"/>
+      <w:numFmt w:val="bullet"/>
+      <w:lvlText w:val="●"/>
+      <w:lvlJc w:val="left"/>
+      <w:pPr>
+        <w:ind w:left="5760" w:hanging="360"/>
+      </w:pPr>
+    </w:lvl>
+    <w:lvl w:ilvl="8" w:tplc="B6EAB6F6" w:tentative="1">
+      <w:start w:val="1"/>
+      <w:numFmt w:val="bullet"/>
+      <w:lvlText w:val="●"/>
+      <w:lvlJc w:val="left"/>
+      <w:pPr>
+        <w:ind w:left="6480" w:hanging="360"/>
+      </w:pPr>
+    </w:lvl>
+  </w:abstractNum>
+  <w:abstractNum w:abstractNumId="1" w15:restartNumberingAfterBreak="0">
+    <w:nsid w:val="2EBB78D5"/>
+    <w:multiLevelType w:val="hybridMultilevel"/>
+    <w:tmpl w:val="C2141834"/>
+    <w:lvl w:ilvl="0" w:tplc="EF4CCD5E">
+      <w:start w:val="1"/>
+      <w:numFmt w:val="bullet"/>
+      <w:lvlText w:val="•"/>
+      <w:lvlJc w:val="left"/>
+      <w:pPr>
+        <w:ind w:left="720" w:hanging="280"/>
+      </w:pPr>
+    </w:lvl>
+    <w:lvl w:ilvl="1" w:tplc="455E8112" w:tentative="1">
+      <w:start w:val="1"/>
+      <w:numFmt w:val="bullet"/>
+      <w:lvlText w:val="–"/>
+      <w:lvlJc w:val="left"/>
+      <w:pPr>
+        <w:ind w:left="1080" w:hanging="280"/>
+      </w:pPr>
+    </w:lvl>
+    <w:lvl w:ilvl="2" w:tplc="35A2D36E" w:tentative="1">
+      <w:start w:val="1"/>
+      <w:numFmt w:val="bullet"/>
+      <w:lvlText w:val="▪"/>
+      <w:lvlJc w:val="left"/>
+      <w:pPr>
+        <w:ind w:left="1440" w:hanging="280"/>
+      </w:pPr>
+    </w:lvl>
+    <w:lvl w:ilvl="3" w:tplc="A4C464A8">
       <w:numFmt w:val="decimal"/>
       <w:lvlText w:val=""/>
       <w:lvlJc w:val="left"/>
     </w:lvl>
-    <w:lvl w:ilvl="4" w:tplc="C6C2B9EA">
+    <w:lvl w:ilvl="4" w:tplc="0E0E96BE">
       <w:numFmt w:val="decimal"/>
       <w:lvlText w:val=""/>
       <w:lvlJc w:val="left"/>
     </w:lvl>
-    <w:lvl w:ilvl="5" w:tplc="DAC8D5CE">
+    <w:lvl w:ilvl="5" w:tplc="A5E25474">
       <w:numFmt w:val="decimal"/>
       <w:lvlText w:val=""/>
       <w:lvlJc w:val="left"/>
     </w:lvl>
-    <w:lvl w:ilvl="6" w:tplc="FBB0245C">
+    <w:lvl w:ilvl="6" w:tplc="38AA22DC">
       <w:numFmt w:val="decimal"/>
       <w:lvlText w:val=""/>
       <w:lvlJc w:val="left"/>
     </w:lvl>
-    <w:lvl w:ilvl="7" w:tplc="34700972">
+    <w:lvl w:ilvl="7" w:tplc="C80897E0">
       <w:numFmt w:val="decimal"/>
       <w:lvlText w:val=""/>
       <w:lvlJc w:val="left"/>
     </w:lvl>
-    <w:lvl w:ilvl="8" w:tplc="9A1A4AB6">
+    <w:lvl w:ilvl="8" w:tplc="025037F2">
       <w:numFmt w:val="decimal"/>
       <w:lvlText w:val=""/>
       <w:lvlJc w:val="left"/>
     </w:lvl>
   </w:abstractNum>
-  <w:abstractNum w:abstractNumId="1" w15:restartNumberingAfterBreak="0">
-    <w:nsid w:val="29BB2693"/>
+  <w:abstractNum w:abstractNumId="2" w15:restartNumberingAfterBreak="0">
+    <w:nsid w:val="4F2B5A92"/>
     <w:multiLevelType w:val="hybridMultilevel"/>
-    <w:tmpl w:val="2D8480CC"/>
-    <w:lvl w:ilvl="0" w:tplc="700ACD36" w:tentative="1">
+    <w:tmpl w:val="D7EC185A"/>
+    <w:lvl w:ilvl="0" w:tplc="96DCEBA0" w:tentative="1">
       <w:start w:val="1"/>
-      <w:numFmt w:val="bullet"/>
-      <w:lvlText w:val="●"/>
+      <w:numFmt w:val="decimal"/>
+      <w:lvlText w:val="%1."/>
       <w:lvlJc w:val="left"/>
       <w:pPr>
         <w:ind w:left="720" w:hanging="360"/>
       </w:pPr>
     </w:lvl>
-    <w:lvl w:ilvl="1" w:tplc="0C9AD4AC" w:tentative="1">
+    <w:lvl w:ilvl="1" w:tplc="078E1846" w:tentative="1">
       <w:start w:val="1"/>
-      <w:numFmt w:val="bullet"/>
-      <w:lvlText w:val="○"/>
+      <w:numFmt w:val="lowerLetter"/>
+      <w:lvlText w:val="%2."/>
       <w:lvlJc w:val="left"/>
       <w:pPr>
+        <w:ind w:left="1080" w:hanging="360"/>
+      </w:pPr>
+    </w:lvl>
+    <w:lvl w:ilvl="2" w:tplc="7D60566C" w:tentative="1">
+      <w:start w:val="1"/>
+      <w:numFmt w:val="lowerRoman"/>
+      <w:lvlText w:val="%3."/>
+      <w:lvlJc w:val="left"/>
+      <w:pPr>
         <w:ind w:left="1440" w:hanging="360"/>
       </w:pPr>
     </w:lvl>
-    <w:lvl w:ilvl="2" w:tplc="500C6F4E" w:tentative="1">
-      <w:start w:val="1"/>
-      <w:numFmt w:val="bullet"/>
-      <w:lvlText w:val="■"/>
-      <w:lvlJc w:val="left"/>
-      <w:pPr>
-        <w:ind w:left="2160" w:hanging="360"/>
-      </w:pPr>
-    </w:lvl>
-    <w:lvl w:ilvl="3" w:tplc="6D4A137C" w:tentative="1">
-      <w:start w:val="1"/>
-      <w:numFmt w:val="bullet"/>
-      <w:lvlText w:val="●"/>
-      <w:lvlJc w:val="left"/>
-      <w:pPr>
-        <w:ind w:left="2880" w:hanging="360"/>
-      </w:pPr>
-    </w:lvl>
-    <w:lvl w:ilvl="4" w:tplc="BE4CDA9C" w:tentative="1">
-      <w:start w:val="1"/>
-      <w:numFmt w:val="bullet"/>
-      <w:lvlText w:val="○"/>
-      <w:lvlJc w:val="left"/>
-      <w:pPr>
-        <w:ind w:left="3600" w:hanging="360"/>
-      </w:pPr>
-    </w:lvl>
-    <w:lvl w:ilvl="5" w:tplc="1E52A216" w:tentative="1">
-      <w:start w:val="1"/>
-      <w:numFmt w:val="bullet"/>
-      <w:lvlText w:val="■"/>
-      <w:lvlJc w:val="left"/>
-      <w:pPr>
-        <w:ind w:left="4320" w:hanging="360"/>
-      </w:pPr>
-    </w:lvl>
-    <w:lvl w:ilvl="6" w:tplc="B144F910" w:tentative="1">
-      <w:start w:val="1"/>
-      <w:numFmt w:val="bullet"/>
-      <w:lvlText w:val="●"/>
-      <w:lvlJc w:val="left"/>
-      <w:pPr>
-        <w:ind w:left="5040" w:hanging="360"/>
-      </w:pPr>
-    </w:lvl>
-    <w:lvl w:ilvl="7" w:tplc="A10CD95E" w:tentative="1">
-      <w:start w:val="1"/>
-      <w:numFmt w:val="bullet"/>
-      <w:lvlText w:val="●"/>
-      <w:lvlJc w:val="left"/>
-      <w:pPr>
-        <w:ind w:left="5760" w:hanging="360"/>
-      </w:pPr>
-    </w:lvl>
-    <w:lvl w:ilvl="8" w:tplc="73EECDD2" w:tentative="1">
-      <w:start w:val="1"/>
-      <w:numFmt w:val="bullet"/>
-      <w:lvlText w:val="●"/>
-      <w:lvlJc w:val="left"/>
-      <w:pPr>
-        <w:ind w:left="6480" w:hanging="360"/>
-      </w:pPr>
-    </w:lvl>
-  </w:abstractNum>
-  <w:abstractNum w:abstractNumId="2" w15:restartNumberingAfterBreak="0">
-    <w:nsid w:val="3DA937CF"/>
-    <w:multiLevelType w:val="hybridMultilevel"/>
-    <w:tmpl w:val="72B290D8"/>
-    <w:lvl w:ilvl="0" w:tplc="50ECF862">
-      <w:start w:val="1"/>
-      <w:numFmt w:val="bullet"/>
-      <w:lvlText w:val="•"/>
-      <w:lvlJc w:val="left"/>
-      <w:pPr>
-        <w:ind w:left="720" w:hanging="280"/>
-      </w:pPr>
-    </w:lvl>
-    <w:lvl w:ilvl="1" w:tplc="847AB45E" w:tentative="1">
-      <w:start w:val="1"/>
-      <w:numFmt w:val="bullet"/>
-      <w:lvlText w:val="–"/>
-      <w:lvlJc w:val="left"/>
-      <w:pPr>
-        <w:ind w:left="1080" w:hanging="280"/>
-      </w:pPr>
-    </w:lvl>
-    <w:lvl w:ilvl="2" w:tplc="2BBE5E1C" w:tentative="1">
-      <w:start w:val="1"/>
-      <w:numFmt w:val="bullet"/>
-      <w:lvlText w:val="▪"/>
-      <w:lvlJc w:val="left"/>
-      <w:pPr>
-        <w:ind w:left="1440" w:hanging="280"/>
-      </w:pPr>
-    </w:lvl>
-    <w:lvl w:ilvl="3" w:tplc="BA04D40A">
+    <w:lvl w:ilvl="3" w:tplc="C328876A">
       <w:numFmt w:val="decimal"/>
       <w:lvlText w:val=""/>
       <w:lvlJc w:val="left"/>
     </w:lvl>
-    <w:lvl w:ilvl="4" w:tplc="0B681AAE">
+    <w:lvl w:ilvl="4" w:tplc="94B69858">
       <w:numFmt w:val="decimal"/>
       <w:lvlText w:val=""/>
       <w:lvlJc w:val="left"/>
     </w:lvl>
-    <w:lvl w:ilvl="5" w:tplc="FF68E316">
+    <w:lvl w:ilvl="5" w:tplc="D93A3374">
       <w:numFmt w:val="decimal"/>
       <w:lvlText w:val=""/>
       <w:lvlJc w:val="left"/>
     </w:lvl>
-    <w:lvl w:ilvl="6" w:tplc="73BA21B8">
+    <w:lvl w:ilvl="6" w:tplc="5DFE58A4">
       <w:numFmt w:val="decimal"/>
       <w:lvlText w:val=""/>
       <w:lvlJc w:val="left"/>
     </w:lvl>
-    <w:lvl w:ilvl="7" w:tplc="1B341112">
+    <w:lvl w:ilvl="7" w:tplc="E996D876">
       <w:numFmt w:val="decimal"/>
       <w:lvlText w:val=""/>
       <w:lvlJc w:val="left"/>
     </w:lvl>
-    <w:lvl w:ilvl="8" w:tplc="3B00CA08">
+    <w:lvl w:ilvl="8" w:tplc="E5E2B91C">
       <w:numFmt w:val="decimal"/>
       <w:lvlText w:val=""/>
       <w:lvlJc w:val="left"/>
     </w:lvl>
   </w:abstractNum>
-  <w:num w:numId="1" w16cid:durableId="815072780">
+  <w:num w:numId="1" w16cid:durableId="1981618349">
+    <w:abstractNumId w:val="0"/>
+    <w:lvlOverride w:ilvl="0">
+      <w:startOverride w:val="1"/>
+    </w:lvlOverride>
+  </w:num>
+  <w:num w:numId="2" w16cid:durableId="1905527972">
     <w:abstractNumId w:val="1"/>
     <w:lvlOverride w:ilvl="0">
       <w:startOverride w:val="1"/>
     </w:lvlOverride>
   </w:num>
-  <w:num w:numId="2" w16cid:durableId="629282626">
-    <w:abstractNumId w:val="2"/>
-    <w:lvlOverride w:ilvl="0">
-      <w:startOverride w:val="1"/>
-    </w:lvlOverride>
-  </w:num>
-  <w:num w:numId="3" w16cid:durableId="1872567732">
-    <w:abstractNumId w:val="2"/>
+  <w:num w:numId="3" w16cid:durableId="1563446225">
+    <w:abstractNumId w:val="1"/>
     <w:lvlOverride w:ilvl="0">
       <w:startOverride w:val="1"/>
     </w:lvlOverride>
@@ -46274,7 +46953,7 @@
     <w:autoRedefine/>
     <w:uiPriority w:val="39"/>
     <w:unhideWhenUsed/>
-    <w:rsid w:val="000A20AF"/>
+    <w:rsid w:val="00BA4C24"/>
     <w:pPr>
       <w:spacing w:after="100"/>
     </w:pPr>
@@ -46286,7 +46965,7 @@
     <w:autoRedefine/>
     <w:uiPriority w:val="39"/>
     <w:unhideWhenUsed/>
-    <w:rsid w:val="000A20AF"/>
+    <w:rsid w:val="00BA4C24"/>
     <w:pPr>
       <w:spacing w:after="100"/>
       <w:ind w:left="210"/>
@@ -46298,7 +46977,7 @@
     <w:next w:val="Normal"/>
     <w:uiPriority w:val="99"/>
     <w:unhideWhenUsed/>
-    <w:rsid w:val="000A20AF"/>
+    <w:rsid w:val="00BA4C24"/>
   </w:style>
 </w:styles>
 </file>

</xml_diff>

<commit_message>
CR-012 revised (Praveen): no typing the UGC form twice. The fields ZedPath knows stay copyable; NIC, index numbers, address, parents, earlier attempts and school become guides (what to write, format, common mistake, handbook page). Only the two answers and the ticks are kept on the phone; details typed under the first version are deleted on the next load. Button and screen renamed "Guide to applying to the UGC" (en/si/ta). Docs 02/03/05/07/08 updated and rebuilt; 549 tests
Co-Authored-By: Claude Opus 5.5 (1M context) <noreply@anthropic.com>
</commit_message>
<xml_diff>
--- a/docs/05-data-design/ZP-DOC-05_Data-Design.docx
+++ b/docs/05-data-design/ZP-DOC-05_Data-Design.docx
@@ -3004,7 +3004,7 @@
     <w:sdt>
       <w:sdtPr>
         <w:alias w:val="Contents"/>
-        <w:id w:val="-132798027"/>
+        <w:id w:val="-1676876437"/>
       </w:sdtPr>
       <w:sdtEndPr/>
       <w:sdtContent>
@@ -3033,7 +3033,7 @@
           <w:r>
             <w:fldChar w:fldCharType="separate"/>
           </w:r>
-          <w:hyperlink w:anchor="_Toc243650910" w:history="1">
+          <w:hyperlink w:anchor="_Toc243654214" w:history="1">
             <w:r>
               <w:rPr>
                 <w:rStyle w:val="Hyperlink"/>
@@ -3057,7 +3057,7 @@
               <w:rPr>
                 <w:noProof/>
               </w:rPr>
-              <w:instrText xml:space="preserve"> PAGEREF _Toc243650910 \h </w:instrText>
+              <w:instrText xml:space="preserve"> PAGEREF _Toc243654214 \h </w:instrText>
             </w:r>
             <w:r>
               <w:rPr>
@@ -3100,7 +3100,7 @@
               <w14:ligatures w14:val="standardContextual"/>
             </w:rPr>
           </w:pPr>
-          <w:hyperlink w:anchor="_Toc243650911" w:history="1">
+          <w:hyperlink w:anchor="_Toc243654215" w:history="1">
             <w:r>
               <w:rPr>
                 <w:rStyle w:val="Hyperlink"/>
@@ -3124,7 +3124,7 @@
               <w:rPr>
                 <w:noProof/>
               </w:rPr>
-              <w:instrText xml:space="preserve"> PAGEREF _Toc243650911 \h </w:instrText>
+              <w:instrText xml:space="preserve"> PAGEREF _Toc243654215 \h </w:instrText>
             </w:r>
             <w:r>
               <w:rPr>
@@ -3167,7 +3167,7 @@
               <w14:ligatures w14:val="standardContextual"/>
             </w:rPr>
           </w:pPr>
-          <w:hyperlink w:anchor="_Toc243650912" w:history="1">
+          <w:hyperlink w:anchor="_Toc243654216" w:history="1">
             <w:r>
               <w:rPr>
                 <w:rStyle w:val="Hyperlink"/>
@@ -3191,7 +3191,7 @@
               <w:rPr>
                 <w:noProof/>
               </w:rPr>
-              <w:instrText xml:space="preserve"> PAGEREF _Toc243650912 \h </w:instrText>
+              <w:instrText xml:space="preserve"> PAGEREF _Toc243654216 \h </w:instrText>
             </w:r>
             <w:r>
               <w:rPr>
@@ -3234,7 +3234,7 @@
               <w14:ligatures w14:val="standardContextual"/>
             </w:rPr>
           </w:pPr>
-          <w:hyperlink w:anchor="_Toc243650913" w:history="1">
+          <w:hyperlink w:anchor="_Toc243654217" w:history="1">
             <w:r>
               <w:rPr>
                 <w:rStyle w:val="Hyperlink"/>
@@ -3258,7 +3258,7 @@
               <w:rPr>
                 <w:noProof/>
               </w:rPr>
-              <w:instrText xml:space="preserve"> PAGEREF _Toc243650913 \h </w:instrText>
+              <w:instrText xml:space="preserve"> PAGEREF _Toc243654217 \h </w:instrText>
             </w:r>
             <w:r>
               <w:rPr>
@@ -3301,7 +3301,7 @@
               <w14:ligatures w14:val="standardContextual"/>
             </w:rPr>
           </w:pPr>
-          <w:hyperlink w:anchor="_Toc243650914" w:history="1">
+          <w:hyperlink w:anchor="_Toc243654218" w:history="1">
             <w:r>
               <w:rPr>
                 <w:rStyle w:val="Hyperlink"/>
@@ -3325,7 +3325,7 @@
               <w:rPr>
                 <w:noProof/>
               </w:rPr>
-              <w:instrText xml:space="preserve"> PAGEREF _Toc243650914 \h </w:instrText>
+              <w:instrText xml:space="preserve"> PAGEREF _Toc243654218 \h </w:instrText>
             </w:r>
             <w:r>
               <w:rPr>
@@ -3368,7 +3368,7 @@
               <w14:ligatures w14:val="standardContextual"/>
             </w:rPr>
           </w:pPr>
-          <w:hyperlink w:anchor="_Toc243650915" w:history="1">
+          <w:hyperlink w:anchor="_Toc243654219" w:history="1">
             <w:r>
               <w:rPr>
                 <w:rStyle w:val="Hyperlink"/>
@@ -3392,7 +3392,7 @@
               <w:rPr>
                 <w:noProof/>
               </w:rPr>
-              <w:instrText xml:space="preserve"> PAGEREF _Toc243650915 \h </w:instrText>
+              <w:instrText xml:space="preserve"> PAGEREF _Toc243654219 \h </w:instrText>
             </w:r>
             <w:r>
               <w:rPr>
@@ -3435,7 +3435,7 @@
               <w14:ligatures w14:val="standardContextual"/>
             </w:rPr>
           </w:pPr>
-          <w:hyperlink w:anchor="_Toc243650916" w:history="1">
+          <w:hyperlink w:anchor="_Toc243654220" w:history="1">
             <w:r>
               <w:rPr>
                 <w:rStyle w:val="Hyperlink"/>
@@ -3459,7 +3459,7 @@
               <w:rPr>
                 <w:noProof/>
               </w:rPr>
-              <w:instrText xml:space="preserve"> PAGEREF _Toc243650916 \h </w:instrText>
+              <w:instrText xml:space="preserve"> PAGEREF _Toc243654220 \h </w:instrText>
             </w:r>
             <w:r>
               <w:rPr>
@@ -3502,7 +3502,7 @@
               <w14:ligatures w14:val="standardContextual"/>
             </w:rPr>
           </w:pPr>
-          <w:hyperlink w:anchor="_Toc243650917" w:history="1">
+          <w:hyperlink w:anchor="_Toc243654221" w:history="1">
             <w:r>
               <w:rPr>
                 <w:rStyle w:val="Hyperlink"/>
@@ -3526,7 +3526,7 @@
               <w:rPr>
                 <w:noProof/>
               </w:rPr>
-              <w:instrText xml:space="preserve"> PAGEREF _Toc243650917 \h </w:instrText>
+              <w:instrText xml:space="preserve"> PAGEREF _Toc243654221 \h </w:instrText>
             </w:r>
             <w:r>
               <w:rPr>
@@ -3569,7 +3569,7 @@
               <w14:ligatures w14:val="standardContextual"/>
             </w:rPr>
           </w:pPr>
-          <w:hyperlink w:anchor="_Toc243650918" w:history="1">
+          <w:hyperlink w:anchor="_Toc243654222" w:history="1">
             <w:r>
               <w:rPr>
                 <w:rStyle w:val="Hyperlink"/>
@@ -3593,7 +3593,7 @@
               <w:rPr>
                 <w:noProof/>
               </w:rPr>
-              <w:instrText xml:space="preserve"> PAGEREF _Toc243650918 \h </w:instrText>
+              <w:instrText xml:space="preserve"> PAGEREF _Toc243654222 \h </w:instrText>
             </w:r>
             <w:r>
               <w:rPr>
@@ -3636,7 +3636,7 @@
               <w14:ligatures w14:val="standardContextual"/>
             </w:rPr>
           </w:pPr>
-          <w:hyperlink w:anchor="_Toc243650919" w:history="1">
+          <w:hyperlink w:anchor="_Toc243654223" w:history="1">
             <w:r>
               <w:rPr>
                 <w:rStyle w:val="Hyperlink"/>
@@ -3660,7 +3660,7 @@
               <w:rPr>
                 <w:noProof/>
               </w:rPr>
-              <w:instrText xml:space="preserve"> PAGEREF _Toc243650919 \h </w:instrText>
+              <w:instrText xml:space="preserve"> PAGEREF _Toc243654223 \h </w:instrText>
             </w:r>
             <w:r>
               <w:rPr>
@@ -3703,7 +3703,7 @@
               <w14:ligatures w14:val="standardContextual"/>
             </w:rPr>
           </w:pPr>
-          <w:hyperlink w:anchor="_Toc243650920" w:history="1">
+          <w:hyperlink w:anchor="_Toc243654224" w:history="1">
             <w:r>
               <w:rPr>
                 <w:rStyle w:val="Hyperlink"/>
@@ -3727,7 +3727,7 @@
               <w:rPr>
                 <w:noProof/>
               </w:rPr>
-              <w:instrText xml:space="preserve"> PAGEREF _Toc243650920 \h </w:instrText>
+              <w:instrText xml:space="preserve"> PAGEREF _Toc243654224 \h </w:instrText>
             </w:r>
             <w:r>
               <w:rPr>
@@ -3770,7 +3770,7 @@
               <w14:ligatures w14:val="standardContextual"/>
             </w:rPr>
           </w:pPr>
-          <w:hyperlink w:anchor="_Toc243650921" w:history="1">
+          <w:hyperlink w:anchor="_Toc243654225" w:history="1">
             <w:r>
               <w:rPr>
                 <w:rStyle w:val="Hyperlink"/>
@@ -3794,7 +3794,7 @@
               <w:rPr>
                 <w:noProof/>
               </w:rPr>
-              <w:instrText xml:space="preserve"> PAGEREF _Toc243650921 \h </w:instrText>
+              <w:instrText xml:space="preserve"> PAGEREF _Toc243654225 \h </w:instrText>
             </w:r>
             <w:r>
               <w:rPr>
@@ -3837,7 +3837,7 @@
               <w14:ligatures w14:val="standardContextual"/>
             </w:rPr>
           </w:pPr>
-          <w:hyperlink w:anchor="_Toc243650922" w:history="1">
+          <w:hyperlink w:anchor="_Toc243654226" w:history="1">
             <w:r>
               <w:rPr>
                 <w:rStyle w:val="Hyperlink"/>
@@ -3861,7 +3861,7 @@
               <w:rPr>
                 <w:noProof/>
               </w:rPr>
-              <w:instrText xml:space="preserve"> PAGEREF _Toc243650922 \h </w:instrText>
+              <w:instrText xml:space="preserve"> PAGEREF _Toc243654226 \h </w:instrText>
             </w:r>
             <w:r>
               <w:rPr>
@@ -3904,7 +3904,7 @@
               <w14:ligatures w14:val="standardContextual"/>
             </w:rPr>
           </w:pPr>
-          <w:hyperlink w:anchor="_Toc243650923" w:history="1">
+          <w:hyperlink w:anchor="_Toc243654227" w:history="1">
             <w:r>
               <w:rPr>
                 <w:rStyle w:val="Hyperlink"/>
@@ -3928,7 +3928,7 @@
               <w:rPr>
                 <w:noProof/>
               </w:rPr>
-              <w:instrText xml:space="preserve"> PAGEREF _Toc243650923 \h </w:instrText>
+              <w:instrText xml:space="preserve"> PAGEREF _Toc243654227 \h </w:instrText>
             </w:r>
             <w:r>
               <w:rPr>
@@ -3971,7 +3971,7 @@
               <w14:ligatures w14:val="standardContextual"/>
             </w:rPr>
           </w:pPr>
-          <w:hyperlink w:anchor="_Toc243650924" w:history="1">
+          <w:hyperlink w:anchor="_Toc243654228" w:history="1">
             <w:r>
               <w:rPr>
                 <w:rStyle w:val="Hyperlink"/>
@@ -3995,7 +3995,7 @@
               <w:rPr>
                 <w:noProof/>
               </w:rPr>
-              <w:instrText xml:space="preserve"> PAGEREF _Toc243650924 \h </w:instrText>
+              <w:instrText xml:space="preserve"> PAGEREF _Toc243654228 \h </w:instrText>
             </w:r>
             <w:r>
               <w:rPr>
@@ -4038,7 +4038,7 @@
               <w14:ligatures w14:val="standardContextual"/>
             </w:rPr>
           </w:pPr>
-          <w:hyperlink w:anchor="_Toc243650925" w:history="1">
+          <w:hyperlink w:anchor="_Toc243654229" w:history="1">
             <w:r>
               <w:rPr>
                 <w:rStyle w:val="Hyperlink"/>
@@ -4062,7 +4062,7 @@
               <w:rPr>
                 <w:noProof/>
               </w:rPr>
-              <w:instrText xml:space="preserve"> PAGEREF _Toc243650925 \h </w:instrText>
+              <w:instrText xml:space="preserve"> PAGEREF _Toc243654229 \h </w:instrText>
             </w:r>
             <w:r>
               <w:rPr>
@@ -4105,7 +4105,7 @@
               <w14:ligatures w14:val="standardContextual"/>
             </w:rPr>
           </w:pPr>
-          <w:hyperlink w:anchor="_Toc243650926" w:history="1">
+          <w:hyperlink w:anchor="_Toc243654230" w:history="1">
             <w:r>
               <w:rPr>
                 <w:rStyle w:val="Hyperlink"/>
@@ -4129,7 +4129,7 @@
               <w:rPr>
                 <w:noProof/>
               </w:rPr>
-              <w:instrText xml:space="preserve"> PAGEREF _Toc243650926 \h </w:instrText>
+              <w:instrText xml:space="preserve"> PAGEREF _Toc243654230 \h </w:instrText>
             </w:r>
             <w:r>
               <w:rPr>
@@ -4172,7 +4172,7 @@
               <w14:ligatures w14:val="standardContextual"/>
             </w:rPr>
           </w:pPr>
-          <w:hyperlink w:anchor="_Toc243650927" w:history="1">
+          <w:hyperlink w:anchor="_Toc243654231" w:history="1">
             <w:r>
               <w:rPr>
                 <w:rStyle w:val="Hyperlink"/>
@@ -4196,7 +4196,7 @@
               <w:rPr>
                 <w:noProof/>
               </w:rPr>
-              <w:instrText xml:space="preserve"> PAGEREF _Toc243650927 \h </w:instrText>
+              <w:instrText xml:space="preserve"> PAGEREF _Toc243654231 \h </w:instrText>
             </w:r>
             <w:r>
               <w:rPr>
@@ -4239,7 +4239,7 @@
               <w14:ligatures w14:val="standardContextual"/>
             </w:rPr>
           </w:pPr>
-          <w:hyperlink w:anchor="_Toc243650928" w:history="1">
+          <w:hyperlink w:anchor="_Toc243654232" w:history="1">
             <w:r>
               <w:rPr>
                 <w:rStyle w:val="Hyperlink"/>
@@ -4263,7 +4263,7 @@
               <w:rPr>
                 <w:noProof/>
               </w:rPr>
-              <w:instrText xml:space="preserve"> PAGEREF _Toc243650928 \h </w:instrText>
+              <w:instrText xml:space="preserve"> PAGEREF _Toc243654232 \h </w:instrText>
             </w:r>
             <w:r>
               <w:rPr>
@@ -4306,7 +4306,7 @@
               <w14:ligatures w14:val="standardContextual"/>
             </w:rPr>
           </w:pPr>
-          <w:hyperlink w:anchor="_Toc243650929" w:history="1">
+          <w:hyperlink w:anchor="_Toc243654233" w:history="1">
             <w:r>
               <w:rPr>
                 <w:rStyle w:val="Hyperlink"/>
@@ -4330,7 +4330,7 @@
               <w:rPr>
                 <w:noProof/>
               </w:rPr>
-              <w:instrText xml:space="preserve"> PAGEREF _Toc243650929 \h </w:instrText>
+              <w:instrText xml:space="preserve"> PAGEREF _Toc243654233 \h </w:instrText>
             </w:r>
             <w:r>
               <w:rPr>
@@ -4373,7 +4373,7 @@
               <w14:ligatures w14:val="standardContextual"/>
             </w:rPr>
           </w:pPr>
-          <w:hyperlink w:anchor="_Toc243650930" w:history="1">
+          <w:hyperlink w:anchor="_Toc243654234" w:history="1">
             <w:r>
               <w:rPr>
                 <w:rStyle w:val="Hyperlink"/>
@@ -4397,7 +4397,7 @@
               <w:rPr>
                 <w:noProof/>
               </w:rPr>
-              <w:instrText xml:space="preserve"> PAGEREF _Toc243650930 \h </w:instrText>
+              <w:instrText xml:space="preserve"> PAGEREF _Toc243654234 \h </w:instrText>
             </w:r>
             <w:r>
               <w:rPr>
@@ -4440,7 +4440,7 @@
               <w14:ligatures w14:val="standardContextual"/>
             </w:rPr>
           </w:pPr>
-          <w:hyperlink w:anchor="_Toc243650931" w:history="1">
+          <w:hyperlink w:anchor="_Toc243654235" w:history="1">
             <w:r>
               <w:rPr>
                 <w:rStyle w:val="Hyperlink"/>
@@ -4464,7 +4464,7 @@
               <w:rPr>
                 <w:noProof/>
               </w:rPr>
-              <w:instrText xml:space="preserve"> PAGEREF _Toc243650931 \h </w:instrText>
+              <w:instrText xml:space="preserve"> PAGEREF _Toc243654235 \h </w:instrText>
             </w:r>
             <w:r>
               <w:rPr>
@@ -4507,7 +4507,7 @@
               <w14:ligatures w14:val="standardContextual"/>
             </w:rPr>
           </w:pPr>
-          <w:hyperlink w:anchor="_Toc243650932" w:history="1">
+          <w:hyperlink w:anchor="_Toc243654236" w:history="1">
             <w:r>
               <w:rPr>
                 <w:rStyle w:val="Hyperlink"/>
@@ -4531,7 +4531,7 @@
               <w:rPr>
                 <w:noProof/>
               </w:rPr>
-              <w:instrText xml:space="preserve"> PAGEREF _Toc243650932 \h </w:instrText>
+              <w:instrText xml:space="preserve"> PAGEREF _Toc243654236 \h </w:instrText>
             </w:r>
             <w:r>
               <w:rPr>
@@ -4574,7 +4574,7 @@
               <w14:ligatures w14:val="standardContextual"/>
             </w:rPr>
           </w:pPr>
-          <w:hyperlink w:anchor="_Toc243650933" w:history="1">
+          <w:hyperlink w:anchor="_Toc243654237" w:history="1">
             <w:r>
               <w:rPr>
                 <w:rStyle w:val="Hyperlink"/>
@@ -4598,7 +4598,7 @@
               <w:rPr>
                 <w:noProof/>
               </w:rPr>
-              <w:instrText xml:space="preserve"> PAGEREF _Toc243650933 \h </w:instrText>
+              <w:instrText xml:space="preserve"> PAGEREF _Toc243654237 \h </w:instrText>
             </w:r>
             <w:r>
               <w:rPr>
@@ -4641,7 +4641,7 @@
               <w14:ligatures w14:val="standardContextual"/>
             </w:rPr>
           </w:pPr>
-          <w:hyperlink w:anchor="_Toc243650934" w:history="1">
+          <w:hyperlink w:anchor="_Toc243654238" w:history="1">
             <w:r>
               <w:rPr>
                 <w:rStyle w:val="Hyperlink"/>
@@ -4665,7 +4665,7 @@
               <w:rPr>
                 <w:noProof/>
               </w:rPr>
-              <w:instrText xml:space="preserve"> PAGEREF _Toc243650934 \h </w:instrText>
+              <w:instrText xml:space="preserve"> PAGEREF _Toc243654238 \h </w:instrText>
             </w:r>
             <w:r>
               <w:rPr>
@@ -4708,7 +4708,7 @@
               <w14:ligatures w14:val="standardContextual"/>
             </w:rPr>
           </w:pPr>
-          <w:hyperlink w:anchor="_Toc243650935" w:history="1">
+          <w:hyperlink w:anchor="_Toc243654239" w:history="1">
             <w:r>
               <w:rPr>
                 <w:rStyle w:val="Hyperlink"/>
@@ -4732,7 +4732,7 @@
               <w:rPr>
                 <w:noProof/>
               </w:rPr>
-              <w:instrText xml:space="preserve"> PAGEREF _Toc243650935 \h </w:instrText>
+              <w:instrText xml:space="preserve"> PAGEREF _Toc243654239 \h </w:instrText>
             </w:r>
             <w:r>
               <w:rPr>
@@ -4775,7 +4775,7 @@
               <w14:ligatures w14:val="standardContextual"/>
             </w:rPr>
           </w:pPr>
-          <w:hyperlink w:anchor="_Toc243650936" w:history="1">
+          <w:hyperlink w:anchor="_Toc243654240" w:history="1">
             <w:r>
               <w:rPr>
                 <w:rStyle w:val="Hyperlink"/>
@@ -4799,7 +4799,7 @@
               <w:rPr>
                 <w:noProof/>
               </w:rPr>
-              <w:instrText xml:space="preserve"> PAGEREF _Toc243650936 \h </w:instrText>
+              <w:instrText xml:space="preserve"> PAGEREF _Toc243654240 \h </w:instrText>
             </w:r>
             <w:r>
               <w:rPr>
@@ -4842,7 +4842,7 @@
               <w14:ligatures w14:val="standardContextual"/>
             </w:rPr>
           </w:pPr>
-          <w:hyperlink w:anchor="_Toc243650937" w:history="1">
+          <w:hyperlink w:anchor="_Toc243654241" w:history="1">
             <w:r>
               <w:rPr>
                 <w:rStyle w:val="Hyperlink"/>
@@ -4866,7 +4866,7 @@
               <w:rPr>
                 <w:noProof/>
               </w:rPr>
-              <w:instrText xml:space="preserve"> PAGEREF _Toc243650937 \h </w:instrText>
+              <w:instrText xml:space="preserve"> PAGEREF _Toc243654241 \h </w:instrText>
             </w:r>
             <w:r>
               <w:rPr>
@@ -4909,7 +4909,7 @@
               <w14:ligatures w14:val="standardContextual"/>
             </w:rPr>
           </w:pPr>
-          <w:hyperlink w:anchor="_Toc243650938" w:history="1">
+          <w:hyperlink w:anchor="_Toc243654242" w:history="1">
             <w:r>
               <w:rPr>
                 <w:rStyle w:val="Hyperlink"/>
@@ -4933,7 +4933,7 @@
               <w:rPr>
                 <w:noProof/>
               </w:rPr>
-              <w:instrText xml:space="preserve"> PAGEREF _Toc243650938 \h </w:instrText>
+              <w:instrText xml:space="preserve"> PAGEREF _Toc243654242 \h </w:instrText>
             </w:r>
             <w:r>
               <w:rPr>
@@ -4976,7 +4976,7 @@
               <w14:ligatures w14:val="standardContextual"/>
             </w:rPr>
           </w:pPr>
-          <w:hyperlink w:anchor="_Toc243650939" w:history="1">
+          <w:hyperlink w:anchor="_Toc243654243" w:history="1">
             <w:r>
               <w:rPr>
                 <w:rStyle w:val="Hyperlink"/>
@@ -5000,7 +5000,7 @@
               <w:rPr>
                 <w:noProof/>
               </w:rPr>
-              <w:instrText xml:space="preserve"> PAGEREF _Toc243650939 \h </w:instrText>
+              <w:instrText xml:space="preserve"> PAGEREF _Toc243654243 \h </w:instrText>
             </w:r>
             <w:r>
               <w:rPr>
@@ -5043,7 +5043,7 @@
               <w14:ligatures w14:val="standardContextual"/>
             </w:rPr>
           </w:pPr>
-          <w:hyperlink w:anchor="_Toc243650940" w:history="1">
+          <w:hyperlink w:anchor="_Toc243654244" w:history="1">
             <w:r>
               <w:rPr>
                 <w:rStyle w:val="Hyperlink"/>
@@ -5067,7 +5067,7 @@
               <w:rPr>
                 <w:noProof/>
               </w:rPr>
-              <w:instrText xml:space="preserve"> PAGEREF _Toc243650940 \h </w:instrText>
+              <w:instrText xml:space="preserve"> PAGEREF _Toc243654244 \h </w:instrText>
             </w:r>
             <w:r>
               <w:rPr>
@@ -5110,7 +5110,7 @@
               <w14:ligatures w14:val="standardContextual"/>
             </w:rPr>
           </w:pPr>
-          <w:hyperlink w:anchor="_Toc243650941" w:history="1">
+          <w:hyperlink w:anchor="_Toc243654245" w:history="1">
             <w:r>
               <w:rPr>
                 <w:rStyle w:val="Hyperlink"/>
@@ -5134,7 +5134,7 @@
               <w:rPr>
                 <w:noProof/>
               </w:rPr>
-              <w:instrText xml:space="preserve"> PAGEREF _Toc243650941 \h </w:instrText>
+              <w:instrText xml:space="preserve"> PAGEREF _Toc243654245 \h </w:instrText>
             </w:r>
             <w:r>
               <w:rPr>
@@ -5177,7 +5177,7 @@
               <w14:ligatures w14:val="standardContextual"/>
             </w:rPr>
           </w:pPr>
-          <w:hyperlink w:anchor="_Toc243650942" w:history="1">
+          <w:hyperlink w:anchor="_Toc243654246" w:history="1">
             <w:r>
               <w:rPr>
                 <w:rStyle w:val="Hyperlink"/>
@@ -5201,7 +5201,7 @@
               <w:rPr>
                 <w:noProof/>
               </w:rPr>
-              <w:instrText xml:space="preserve"> PAGEREF _Toc243650942 \h </w:instrText>
+              <w:instrText xml:space="preserve"> PAGEREF _Toc243654246 \h </w:instrText>
             </w:r>
             <w:r>
               <w:rPr>
@@ -5244,7 +5244,7 @@
               <w14:ligatures w14:val="standardContextual"/>
             </w:rPr>
           </w:pPr>
-          <w:hyperlink w:anchor="_Toc243650943" w:history="1">
+          <w:hyperlink w:anchor="_Toc243654247" w:history="1">
             <w:r>
               <w:rPr>
                 <w:rStyle w:val="Hyperlink"/>
@@ -5268,7 +5268,7 @@
               <w:rPr>
                 <w:noProof/>
               </w:rPr>
-              <w:instrText xml:space="preserve"> PAGEREF _Toc243650943 \h </w:instrText>
+              <w:instrText xml:space="preserve"> PAGEREF _Toc243654247 \h </w:instrText>
             </w:r>
             <w:r>
               <w:rPr>
@@ -5311,7 +5311,7 @@
               <w14:ligatures w14:val="standardContextual"/>
             </w:rPr>
           </w:pPr>
-          <w:hyperlink w:anchor="_Toc243650944" w:history="1">
+          <w:hyperlink w:anchor="_Toc243654248" w:history="1">
             <w:r>
               <w:rPr>
                 <w:rStyle w:val="Hyperlink"/>
@@ -5335,7 +5335,7 @@
               <w:rPr>
                 <w:noProof/>
               </w:rPr>
-              <w:instrText xml:space="preserve"> PAGEREF _Toc243650944 \h </w:instrText>
+              <w:instrText xml:space="preserve"> PAGEREF _Toc243654248 \h </w:instrText>
             </w:r>
             <w:r>
               <w:rPr>
@@ -5378,7 +5378,7 @@
               <w14:ligatures w14:val="standardContextual"/>
             </w:rPr>
           </w:pPr>
-          <w:hyperlink w:anchor="_Toc243650945" w:history="1">
+          <w:hyperlink w:anchor="_Toc243654249" w:history="1">
             <w:r>
               <w:rPr>
                 <w:rStyle w:val="Hyperlink"/>
@@ -5402,7 +5402,7 @@
               <w:rPr>
                 <w:noProof/>
               </w:rPr>
-              <w:instrText xml:space="preserve"> PAGEREF _Toc243650945 \h </w:instrText>
+              <w:instrText xml:space="preserve"> PAGEREF _Toc243654249 \h </w:instrText>
             </w:r>
             <w:r>
               <w:rPr>
@@ -5445,7 +5445,7 @@
               <w14:ligatures w14:val="standardContextual"/>
             </w:rPr>
           </w:pPr>
-          <w:hyperlink w:anchor="_Toc243650946" w:history="1">
+          <w:hyperlink w:anchor="_Toc243654250" w:history="1">
             <w:r>
               <w:rPr>
                 <w:rStyle w:val="Hyperlink"/>
@@ -5469,7 +5469,7 @@
               <w:rPr>
                 <w:noProof/>
               </w:rPr>
-              <w:instrText xml:space="preserve"> PAGEREF _Toc243650946 \h </w:instrText>
+              <w:instrText xml:space="preserve"> PAGEREF _Toc243654250 \h </w:instrText>
             </w:r>
             <w:r>
               <w:rPr>
@@ -5512,7 +5512,7 @@
               <w14:ligatures w14:val="standardContextual"/>
             </w:rPr>
           </w:pPr>
-          <w:hyperlink w:anchor="_Toc243650947" w:history="1">
+          <w:hyperlink w:anchor="_Toc243654251" w:history="1">
             <w:r>
               <w:rPr>
                 <w:rStyle w:val="Hyperlink"/>
@@ -5536,7 +5536,7 @@
               <w:rPr>
                 <w:noProof/>
               </w:rPr>
-              <w:instrText xml:space="preserve"> PAGEREF _Toc243650947 \h </w:instrText>
+              <w:instrText xml:space="preserve"> PAGEREF _Toc243654251 \h </w:instrText>
             </w:r>
             <w:r>
               <w:rPr>
@@ -5579,7 +5579,7 @@
               <w14:ligatures w14:val="standardContextual"/>
             </w:rPr>
           </w:pPr>
-          <w:hyperlink w:anchor="_Toc243650948" w:history="1">
+          <w:hyperlink w:anchor="_Toc243654252" w:history="1">
             <w:r>
               <w:rPr>
                 <w:rStyle w:val="Hyperlink"/>
@@ -5603,7 +5603,7 @@
               <w:rPr>
                 <w:noProof/>
               </w:rPr>
-              <w:instrText xml:space="preserve"> PAGEREF _Toc243650948 \h </w:instrText>
+              <w:instrText xml:space="preserve"> PAGEREF _Toc243654252 \h </w:instrText>
             </w:r>
             <w:r>
               <w:rPr>
@@ -5646,7 +5646,7 @@
               <w14:ligatures w14:val="standardContextual"/>
             </w:rPr>
           </w:pPr>
-          <w:hyperlink w:anchor="_Toc243650949" w:history="1">
+          <w:hyperlink w:anchor="_Toc243654253" w:history="1">
             <w:r>
               <w:rPr>
                 <w:rStyle w:val="Hyperlink"/>
@@ -5670,7 +5670,7 @@
               <w:rPr>
                 <w:noProof/>
               </w:rPr>
-              <w:instrText xml:space="preserve"> PAGEREF _Toc243650949 \h </w:instrText>
+              <w:instrText xml:space="preserve"> PAGEREF _Toc243654253 \h </w:instrText>
             </w:r>
             <w:r>
               <w:rPr>
@@ -5713,7 +5713,7 @@
               <w14:ligatures w14:val="standardContextual"/>
             </w:rPr>
           </w:pPr>
-          <w:hyperlink w:anchor="_Toc243650950" w:history="1">
+          <w:hyperlink w:anchor="_Toc243654254" w:history="1">
             <w:r>
               <w:rPr>
                 <w:rStyle w:val="Hyperlink"/>
@@ -5737,7 +5737,7 @@
               <w:rPr>
                 <w:noProof/>
               </w:rPr>
-              <w:instrText xml:space="preserve"> PAGEREF _Toc243650950 \h </w:instrText>
+              <w:instrText xml:space="preserve"> PAGEREF _Toc243654254 \h </w:instrText>
             </w:r>
             <w:r>
               <w:rPr>
@@ -5780,7 +5780,7 @@
               <w14:ligatures w14:val="standardContextual"/>
             </w:rPr>
           </w:pPr>
-          <w:hyperlink w:anchor="_Toc243650951" w:history="1">
+          <w:hyperlink w:anchor="_Toc243654255" w:history="1">
             <w:r>
               <w:rPr>
                 <w:rStyle w:val="Hyperlink"/>
@@ -5804,7 +5804,7 @@
               <w:rPr>
                 <w:noProof/>
               </w:rPr>
-              <w:instrText xml:space="preserve"> PAGEREF _Toc243650951 \h </w:instrText>
+              <w:instrText xml:space="preserve"> PAGEREF _Toc243654255 \h </w:instrText>
             </w:r>
             <w:r>
               <w:rPr>
@@ -5847,7 +5847,7 @@
               <w14:ligatures w14:val="standardContextual"/>
             </w:rPr>
           </w:pPr>
-          <w:hyperlink w:anchor="_Toc243650952" w:history="1">
+          <w:hyperlink w:anchor="_Toc243654256" w:history="1">
             <w:r>
               <w:rPr>
                 <w:rStyle w:val="Hyperlink"/>
@@ -5871,7 +5871,7 @@
               <w:rPr>
                 <w:noProof/>
               </w:rPr>
-              <w:instrText xml:space="preserve"> PAGEREF _Toc243650952 \h </w:instrText>
+              <w:instrText xml:space="preserve"> PAGEREF _Toc243654256 \h </w:instrText>
             </w:r>
             <w:r>
               <w:rPr>
@@ -5914,7 +5914,7 @@
               <w14:ligatures w14:val="standardContextual"/>
             </w:rPr>
           </w:pPr>
-          <w:hyperlink w:anchor="_Toc243650953" w:history="1">
+          <w:hyperlink w:anchor="_Toc243654257" w:history="1">
             <w:r>
               <w:rPr>
                 <w:rStyle w:val="Hyperlink"/>
@@ -5938,7 +5938,7 @@
               <w:rPr>
                 <w:noProof/>
               </w:rPr>
-              <w:instrText xml:space="preserve"> PAGEREF _Toc243650953 \h </w:instrText>
+              <w:instrText xml:space="preserve"> PAGEREF _Toc243654257 \h </w:instrText>
             </w:r>
             <w:r>
               <w:rPr>
@@ -5981,7 +5981,7 @@
               <w14:ligatures w14:val="standardContextual"/>
             </w:rPr>
           </w:pPr>
-          <w:hyperlink w:anchor="_Toc243650954" w:history="1">
+          <w:hyperlink w:anchor="_Toc243654258" w:history="1">
             <w:r>
               <w:rPr>
                 <w:rStyle w:val="Hyperlink"/>
@@ -6005,7 +6005,7 @@
               <w:rPr>
                 <w:noProof/>
               </w:rPr>
-              <w:instrText xml:space="preserve"> PAGEREF _Toc243650954 \h </w:instrText>
+              <w:instrText xml:space="preserve"> PAGEREF _Toc243654258 \h </w:instrText>
             </w:r>
             <w:r>
               <w:rPr>
@@ -6051,7 +6051,7 @@
     <w:sdt>
       <w:sdtPr>
         <w:alias w:val="Figures"/>
-        <w:id w:val="-636420452"/>
+        <w:id w:val="-1307777784"/>
       </w:sdtPr>
       <w:sdtEndPr/>
       <w:sdtContent>
@@ -6080,7 +6080,7 @@
           <w:r>
             <w:fldChar w:fldCharType="separate"/>
           </w:r>
-          <w:hyperlink w:anchor="_Toc243650955" w:history="1">
+          <w:hyperlink w:anchor="_Toc243654259" w:history="1">
             <w:r>
               <w:rPr>
                 <w:rStyle w:val="Hyperlink"/>
@@ -6104,7 +6104,7 @@
               <w:rPr>
                 <w:noProof/>
               </w:rPr>
-              <w:instrText xml:space="preserve"> PAGEREF _Toc243650955 \h </w:instrText>
+              <w:instrText xml:space="preserve"> PAGEREF _Toc243654259 \h </w:instrText>
             </w:r>
             <w:r>
               <w:rPr>
@@ -6147,7 +6147,7 @@
               <w14:ligatures w14:val="standardContextual"/>
             </w:rPr>
           </w:pPr>
-          <w:hyperlink w:anchor="_Toc243650956" w:history="1">
+          <w:hyperlink w:anchor="_Toc243654260" w:history="1">
             <w:r>
               <w:rPr>
                 <w:rStyle w:val="Hyperlink"/>
@@ -6171,7 +6171,7 @@
               <w:rPr>
                 <w:noProof/>
               </w:rPr>
-              <w:instrText xml:space="preserve"> PAGEREF _Toc243650956 \h </w:instrText>
+              <w:instrText xml:space="preserve"> PAGEREF _Toc243654260 \h </w:instrText>
             </w:r>
             <w:r>
               <w:rPr>
@@ -6214,7 +6214,7 @@
               <w14:ligatures w14:val="standardContextual"/>
             </w:rPr>
           </w:pPr>
-          <w:hyperlink w:anchor="_Toc243650957" w:history="1">
+          <w:hyperlink w:anchor="_Toc243654261" w:history="1">
             <w:r>
               <w:rPr>
                 <w:rStyle w:val="Hyperlink"/>
@@ -6238,7 +6238,7 @@
               <w:rPr>
                 <w:noProof/>
               </w:rPr>
-              <w:instrText xml:space="preserve"> PAGEREF _Toc243650957 \h </w:instrText>
+              <w:instrText xml:space="preserve"> PAGEREF _Toc243654261 \h </w:instrText>
             </w:r>
             <w:r>
               <w:rPr>
@@ -6281,7 +6281,7 @@
               <w14:ligatures w14:val="standardContextual"/>
             </w:rPr>
           </w:pPr>
-          <w:hyperlink w:anchor="_Toc243650958" w:history="1">
+          <w:hyperlink w:anchor="_Toc243654262" w:history="1">
             <w:r>
               <w:rPr>
                 <w:rStyle w:val="Hyperlink"/>
@@ -6305,7 +6305,7 @@
               <w:rPr>
                 <w:noProof/>
               </w:rPr>
-              <w:instrText xml:space="preserve"> PAGEREF _Toc243650958 \h </w:instrText>
+              <w:instrText xml:space="preserve"> PAGEREF _Toc243654262 \h </w:instrText>
             </w:r>
             <w:r>
               <w:rPr>
@@ -6348,7 +6348,7 @@
               <w14:ligatures w14:val="standardContextual"/>
             </w:rPr>
           </w:pPr>
-          <w:hyperlink w:anchor="_Toc243650959" w:history="1">
+          <w:hyperlink w:anchor="_Toc243654263" w:history="1">
             <w:r>
               <w:rPr>
                 <w:rStyle w:val="Hyperlink"/>
@@ -6372,7 +6372,7 @@
               <w:rPr>
                 <w:noProof/>
               </w:rPr>
-              <w:instrText xml:space="preserve"> PAGEREF _Toc243650959 \h </w:instrText>
+              <w:instrText xml:space="preserve"> PAGEREF _Toc243654263 \h </w:instrText>
             </w:r>
             <w:r>
               <w:rPr>
@@ -6415,7 +6415,7 @@
               <w14:ligatures w14:val="standardContextual"/>
             </w:rPr>
           </w:pPr>
-          <w:hyperlink w:anchor="_Toc243650960" w:history="1">
+          <w:hyperlink w:anchor="_Toc243654264" w:history="1">
             <w:r>
               <w:rPr>
                 <w:rStyle w:val="Hyperlink"/>
@@ -6439,7 +6439,7 @@
               <w:rPr>
                 <w:noProof/>
               </w:rPr>
-              <w:instrText xml:space="preserve"> PAGEREF _Toc243650960 \h </w:instrText>
+              <w:instrText xml:space="preserve"> PAGEREF _Toc243654264 \h </w:instrText>
             </w:r>
             <w:r>
               <w:rPr>
@@ -6482,7 +6482,7 @@
               <w14:ligatures w14:val="standardContextual"/>
             </w:rPr>
           </w:pPr>
-          <w:hyperlink w:anchor="_Toc243650961" w:history="1">
+          <w:hyperlink w:anchor="_Toc243654265" w:history="1">
             <w:r>
               <w:rPr>
                 <w:rStyle w:val="Hyperlink"/>
@@ -6506,7 +6506,7 @@
               <w:rPr>
                 <w:noProof/>
               </w:rPr>
-              <w:instrText xml:space="preserve"> PAGEREF _Toc243650961 \h </w:instrText>
+              <w:instrText xml:space="preserve"> PAGEREF _Toc243654265 \h </w:instrText>
             </w:r>
             <w:r>
               <w:rPr>
@@ -6549,7 +6549,7 @@
               <w14:ligatures w14:val="standardContextual"/>
             </w:rPr>
           </w:pPr>
-          <w:hyperlink w:anchor="_Toc243650962" w:history="1">
+          <w:hyperlink w:anchor="_Toc243654266" w:history="1">
             <w:r>
               <w:rPr>
                 <w:rStyle w:val="Hyperlink"/>
@@ -6573,7 +6573,7 @@
               <w:rPr>
                 <w:noProof/>
               </w:rPr>
-              <w:instrText xml:space="preserve"> PAGEREF _Toc243650962 \h </w:instrText>
+              <w:instrText xml:space="preserve"> PAGEREF _Toc243654266 \h </w:instrText>
             </w:r>
             <w:r>
               <w:rPr>
@@ -6619,7 +6619,7 @@
     <w:sdt>
       <w:sdtPr>
         <w:alias w:val="Tables"/>
-        <w:id w:val="90057810"/>
+        <w:id w:val="-1086687308"/>
       </w:sdtPr>
       <w:sdtEndPr/>
       <w:sdtContent>
@@ -6648,7 +6648,7 @@
           <w:r>
             <w:fldChar w:fldCharType="separate"/>
           </w:r>
-          <w:hyperlink w:anchor="_Toc243650963" w:history="1">
+          <w:hyperlink w:anchor="_Toc243654267" w:history="1">
             <w:r>
               <w:rPr>
                 <w:rStyle w:val="Hyperlink"/>
@@ -6672,7 +6672,7 @@
               <w:rPr>
                 <w:noProof/>
               </w:rPr>
-              <w:instrText xml:space="preserve"> PAGEREF _Toc243650963 \h </w:instrText>
+              <w:instrText xml:space="preserve"> PAGEREF _Toc243654267 \h </w:instrText>
             </w:r>
             <w:r>
               <w:rPr>
@@ -6715,7 +6715,7 @@
               <w14:ligatures w14:val="standardContextual"/>
             </w:rPr>
           </w:pPr>
-          <w:hyperlink w:anchor="_Toc243650964" w:history="1">
+          <w:hyperlink w:anchor="_Toc243654268" w:history="1">
             <w:r>
               <w:rPr>
                 <w:rStyle w:val="Hyperlink"/>
@@ -6739,7 +6739,7 @@
               <w:rPr>
                 <w:noProof/>
               </w:rPr>
-              <w:instrText xml:space="preserve"> PAGEREF _Toc243650964 \h </w:instrText>
+              <w:instrText xml:space="preserve"> PAGEREF _Toc243654268 \h </w:instrText>
             </w:r>
             <w:r>
               <w:rPr>
@@ -6782,7 +6782,7 @@
               <w14:ligatures w14:val="standardContextual"/>
             </w:rPr>
           </w:pPr>
-          <w:hyperlink w:anchor="_Toc243650965" w:history="1">
+          <w:hyperlink w:anchor="_Toc243654269" w:history="1">
             <w:r>
               <w:rPr>
                 <w:rStyle w:val="Hyperlink"/>
@@ -6806,7 +6806,7 @@
               <w:rPr>
                 <w:noProof/>
               </w:rPr>
-              <w:instrText xml:space="preserve"> PAGEREF _Toc243650965 \h </w:instrText>
+              <w:instrText xml:space="preserve"> PAGEREF _Toc243654269 \h </w:instrText>
             </w:r>
             <w:r>
               <w:rPr>
@@ -6849,7 +6849,7 @@
               <w14:ligatures w14:val="standardContextual"/>
             </w:rPr>
           </w:pPr>
-          <w:hyperlink w:anchor="_Toc243650966" w:history="1">
+          <w:hyperlink w:anchor="_Toc243654270" w:history="1">
             <w:r>
               <w:rPr>
                 <w:rStyle w:val="Hyperlink"/>
@@ -6873,7 +6873,7 @@
               <w:rPr>
                 <w:noProof/>
               </w:rPr>
-              <w:instrText xml:space="preserve"> PAGEREF _Toc243650966 \h </w:instrText>
+              <w:instrText xml:space="preserve"> PAGEREF _Toc243654270 \h </w:instrText>
             </w:r>
             <w:r>
               <w:rPr>
@@ -6916,7 +6916,7 @@
               <w14:ligatures w14:val="standardContextual"/>
             </w:rPr>
           </w:pPr>
-          <w:hyperlink w:anchor="_Toc243650967" w:history="1">
+          <w:hyperlink w:anchor="_Toc243654271" w:history="1">
             <w:r>
               <w:rPr>
                 <w:rStyle w:val="Hyperlink"/>
@@ -6940,7 +6940,7 @@
               <w:rPr>
                 <w:noProof/>
               </w:rPr>
-              <w:instrText xml:space="preserve"> PAGEREF _Toc243650967 \h </w:instrText>
+              <w:instrText xml:space="preserve"> PAGEREF _Toc243654271 \h </w:instrText>
             </w:r>
             <w:r>
               <w:rPr>
@@ -6983,7 +6983,7 @@
               <w14:ligatures w14:val="standardContextual"/>
             </w:rPr>
           </w:pPr>
-          <w:hyperlink w:anchor="_Toc243650968" w:history="1">
+          <w:hyperlink w:anchor="_Toc243654272" w:history="1">
             <w:r>
               <w:rPr>
                 <w:rStyle w:val="Hyperlink"/>
@@ -7007,7 +7007,7 @@
               <w:rPr>
                 <w:noProof/>
               </w:rPr>
-              <w:instrText xml:space="preserve"> PAGEREF _Toc243650968 \h </w:instrText>
+              <w:instrText xml:space="preserve"> PAGEREF _Toc243654272 \h </w:instrText>
             </w:r>
             <w:r>
               <w:rPr>
@@ -7050,7 +7050,7 @@
               <w14:ligatures w14:val="standardContextual"/>
             </w:rPr>
           </w:pPr>
-          <w:hyperlink w:anchor="_Toc243650969" w:history="1">
+          <w:hyperlink w:anchor="_Toc243654273" w:history="1">
             <w:r>
               <w:rPr>
                 <w:rStyle w:val="Hyperlink"/>
@@ -7074,7 +7074,7 @@
               <w:rPr>
                 <w:noProof/>
               </w:rPr>
-              <w:instrText xml:space="preserve"> PAGEREF _Toc243650969 \h </w:instrText>
+              <w:instrText xml:space="preserve"> PAGEREF _Toc243654273 \h </w:instrText>
             </w:r>
             <w:r>
               <w:rPr>
@@ -7117,7 +7117,7 @@
               <w14:ligatures w14:val="standardContextual"/>
             </w:rPr>
           </w:pPr>
-          <w:hyperlink w:anchor="_Toc243650970" w:history="1">
+          <w:hyperlink w:anchor="_Toc243654274" w:history="1">
             <w:r>
               <w:rPr>
                 <w:rStyle w:val="Hyperlink"/>
@@ -7141,7 +7141,7 @@
               <w:rPr>
                 <w:noProof/>
               </w:rPr>
-              <w:instrText xml:space="preserve"> PAGEREF _Toc243650970 \h </w:instrText>
+              <w:instrText xml:space="preserve"> PAGEREF _Toc243654274 \h </w:instrText>
             </w:r>
             <w:r>
               <w:rPr>
@@ -7184,7 +7184,7 @@
               <w14:ligatures w14:val="standardContextual"/>
             </w:rPr>
           </w:pPr>
-          <w:hyperlink w:anchor="_Toc243650971" w:history="1">
+          <w:hyperlink w:anchor="_Toc243654275" w:history="1">
             <w:r>
               <w:rPr>
                 <w:rStyle w:val="Hyperlink"/>
@@ -7208,7 +7208,7 @@
               <w:rPr>
                 <w:noProof/>
               </w:rPr>
-              <w:instrText xml:space="preserve"> PAGEREF _Toc243650971 \h </w:instrText>
+              <w:instrText xml:space="preserve"> PAGEREF _Toc243654275 \h </w:instrText>
             </w:r>
             <w:r>
               <w:rPr>
@@ -7251,7 +7251,7 @@
               <w14:ligatures w14:val="standardContextual"/>
             </w:rPr>
           </w:pPr>
-          <w:hyperlink w:anchor="_Toc243650972" w:history="1">
+          <w:hyperlink w:anchor="_Toc243654276" w:history="1">
             <w:r>
               <w:rPr>
                 <w:rStyle w:val="Hyperlink"/>
@@ -7275,7 +7275,7 @@
               <w:rPr>
                 <w:noProof/>
               </w:rPr>
-              <w:instrText xml:space="preserve"> PAGEREF _Toc243650972 \h </w:instrText>
+              <w:instrText xml:space="preserve"> PAGEREF _Toc243654276 \h </w:instrText>
             </w:r>
             <w:r>
               <w:rPr>
@@ -7318,7 +7318,7 @@
               <w14:ligatures w14:val="standardContextual"/>
             </w:rPr>
           </w:pPr>
-          <w:hyperlink w:anchor="_Toc243650973" w:history="1">
+          <w:hyperlink w:anchor="_Toc243654277" w:history="1">
             <w:r>
               <w:rPr>
                 <w:rStyle w:val="Hyperlink"/>
@@ -7342,7 +7342,7 @@
               <w:rPr>
                 <w:noProof/>
               </w:rPr>
-              <w:instrText xml:space="preserve"> PAGEREF _Toc243650973 \h </w:instrText>
+              <w:instrText xml:space="preserve"> PAGEREF _Toc243654277 \h </w:instrText>
             </w:r>
             <w:r>
               <w:rPr>
@@ -7385,7 +7385,7 @@
               <w14:ligatures w14:val="standardContextual"/>
             </w:rPr>
           </w:pPr>
-          <w:hyperlink w:anchor="_Toc243650974" w:history="1">
+          <w:hyperlink w:anchor="_Toc243654278" w:history="1">
             <w:r>
               <w:rPr>
                 <w:rStyle w:val="Hyperlink"/>
@@ -7409,7 +7409,7 @@
               <w:rPr>
                 <w:noProof/>
               </w:rPr>
-              <w:instrText xml:space="preserve"> PAGEREF _Toc243650974 \h </w:instrText>
+              <w:instrText xml:space="preserve"> PAGEREF _Toc243654278 \h </w:instrText>
             </w:r>
             <w:r>
               <w:rPr>
@@ -7452,7 +7452,7 @@
               <w14:ligatures w14:val="standardContextual"/>
             </w:rPr>
           </w:pPr>
-          <w:hyperlink w:anchor="_Toc243650975" w:history="1">
+          <w:hyperlink w:anchor="_Toc243654279" w:history="1">
             <w:r>
               <w:rPr>
                 <w:rStyle w:val="Hyperlink"/>
@@ -7476,7 +7476,7 @@
               <w:rPr>
                 <w:noProof/>
               </w:rPr>
-              <w:instrText xml:space="preserve"> PAGEREF _Toc243650975 \h </w:instrText>
+              <w:instrText xml:space="preserve"> PAGEREF _Toc243654279 \h </w:instrText>
             </w:r>
             <w:r>
               <w:rPr>
@@ -7519,7 +7519,7 @@
               <w14:ligatures w14:val="standardContextual"/>
             </w:rPr>
           </w:pPr>
-          <w:hyperlink w:anchor="_Toc243650976" w:history="1">
+          <w:hyperlink w:anchor="_Toc243654280" w:history="1">
             <w:r>
               <w:rPr>
                 <w:rStyle w:val="Hyperlink"/>
@@ -7543,7 +7543,7 @@
               <w:rPr>
                 <w:noProof/>
               </w:rPr>
-              <w:instrText xml:space="preserve"> PAGEREF _Toc243650976 \h </w:instrText>
+              <w:instrText xml:space="preserve"> PAGEREF _Toc243654280 \h </w:instrText>
             </w:r>
             <w:r>
               <w:rPr>
@@ -7586,7 +7586,7 @@
               <w14:ligatures w14:val="standardContextual"/>
             </w:rPr>
           </w:pPr>
-          <w:hyperlink w:anchor="_Toc243650977" w:history="1">
+          <w:hyperlink w:anchor="_Toc243654281" w:history="1">
             <w:r>
               <w:rPr>
                 <w:rStyle w:val="Hyperlink"/>
@@ -7610,7 +7610,7 @@
               <w:rPr>
                 <w:noProof/>
               </w:rPr>
-              <w:instrText xml:space="preserve"> PAGEREF _Toc243650977 \h </w:instrText>
+              <w:instrText xml:space="preserve"> PAGEREF _Toc243654281 \h </w:instrText>
             </w:r>
             <w:r>
               <w:rPr>
@@ -7653,7 +7653,7 @@
               <w14:ligatures w14:val="standardContextual"/>
             </w:rPr>
           </w:pPr>
-          <w:hyperlink w:anchor="_Toc243650978" w:history="1">
+          <w:hyperlink w:anchor="_Toc243654282" w:history="1">
             <w:r>
               <w:rPr>
                 <w:rStyle w:val="Hyperlink"/>
@@ -7677,7 +7677,7 @@
               <w:rPr>
                 <w:noProof/>
               </w:rPr>
-              <w:instrText xml:space="preserve"> PAGEREF _Toc243650978 \h </w:instrText>
+              <w:instrText xml:space="preserve"> PAGEREF _Toc243654282 \h </w:instrText>
             </w:r>
             <w:r>
               <w:rPr>
@@ -7718,7 +7718,7 @@
         <w:keepLines/>
         <w:pageBreakBefore/>
       </w:pPr>
-      <w:bookmarkStart w:id="0" w:name="_Toc243650910"/>
+      <w:bookmarkStart w:id="0" w:name="_Toc243654214"/>
       <w:r>
         <w:lastRenderedPageBreak/>
         <w:t>1 Introduction</w:t>
@@ -7731,7 +7731,7 @@
         <w:keepNext/>
         <w:keepLines/>
       </w:pPr>
-      <w:bookmarkStart w:id="1" w:name="_Toc243650911"/>
+      <w:bookmarkStart w:id="1" w:name="_Toc243654215"/>
       <w:r>
         <w:t>1.1 Purpose</w:t>
       </w:r>
@@ -7781,7 +7781,7 @@
         <w:keepNext/>
         <w:keepLines/>
       </w:pPr>
-      <w:bookmarkStart w:id="2" w:name="_Toc243650912"/>
+      <w:bookmarkStart w:id="2" w:name="_Toc243654216"/>
       <w:r>
         <w:t>1.2 Scope</w:t>
       </w:r>
@@ -7811,7 +7811,7 @@
         <w:keepNext/>
         <w:keepLines/>
       </w:pPr>
-      <w:bookmarkStart w:id="3" w:name="_Toc243650913"/>
+      <w:bookmarkStart w:id="3" w:name="_Toc243654217"/>
       <w:r>
         <w:t>1.3 Intended audience</w:t>
       </w:r>
@@ -7831,7 +7831,7 @@
         <w:keepNext/>
         <w:keepLines/>
       </w:pPr>
-      <w:bookmarkStart w:id="4" w:name="_Toc243650914"/>
+      <w:bookmarkStart w:id="4" w:name="_Toc243654218"/>
       <w:r>
         <w:t>1.4 Relationship to other documents</w:t>
       </w:r>
@@ -7842,7 +7842,7 @@
         <w:pStyle w:val="Caption"/>
         <w:keepNext/>
       </w:pPr>
-      <w:bookmarkStart w:id="5" w:name="_Toc243650963"/>
+      <w:bookmarkStart w:id="5" w:name="_Toc243654267"/>
       <w:r>
         <w:t xml:space="preserve">Table </w:t>
       </w:r>
@@ -8361,7 +8361,7 @@
         <w:keepNext/>
         <w:keepLines/>
       </w:pPr>
-      <w:bookmarkStart w:id="6" w:name="_Toc243650915"/>
+      <w:bookmarkStart w:id="6" w:name="_Toc243654219"/>
       <w:r>
         <w:t>1.5 Notation</w:t>
       </w:r>
@@ -8492,7 +8492,7 @@
         <w:keepLines/>
         <w:pageBreakBefore/>
       </w:pPr>
-      <w:bookmarkStart w:id="7" w:name="_Toc243650916"/>
+      <w:bookmarkStart w:id="7" w:name="_Toc243654220"/>
       <w:r>
         <w:lastRenderedPageBreak/>
         <w:t>2 Conceptual model (EER)</w:t>
@@ -8505,7 +8505,7 @@
         <w:keepNext/>
         <w:keepLines/>
       </w:pPr>
-      <w:bookmarkStart w:id="8" w:name="_Toc243650917"/>
+      <w:bookmarkStart w:id="8" w:name="_Toc243654221"/>
       <w:r>
         <w:t>2.1 Offerings and cut-offs</w:t>
       </w:r>
@@ -8581,7 +8581,7 @@
         </w:rPr>
         <w:lastRenderedPageBreak/>
         <w:drawing>
-          <wp:inline distT="0" distB="0" distL="0" distR="0" wp14:anchorId="6313E8D1" wp14:editId="6313E8D2">
+          <wp:inline distT="0" distB="0" distL="0" distR="0" wp14:anchorId="68588CF2" wp14:editId="68588CF3">
             <wp:extent cx="6124575" cy="7553325"/>
             <wp:effectExtent l="0" t="0" r="0" b="0"/>
             <wp:docPr id="1" name="eer-offerings.png" descr="EER model of institutions, courses, offerings, intake years, selection groups and cut-offs" title="EER model of institutions, courses, offerings, intake years, selection groups and cut-offs"/>
@@ -8624,7 +8624,7 @@
       <w:pPr>
         <w:pStyle w:val="Caption"/>
       </w:pPr>
-      <w:bookmarkStart w:id="9" w:name="_Toc243650955"/>
+      <w:bookmarkStart w:id="9" w:name="_Toc243654259"/>
       <w:r>
         <w:t xml:space="preserve">Figure </w:t>
       </w:r>
@@ -8657,7 +8657,7 @@
         <w:keepNext/>
         <w:keepLines/>
       </w:pPr>
-      <w:bookmarkStart w:id="10" w:name="_Toc243650918"/>
+      <w:bookmarkStart w:id="10" w:name="_Toc243654222"/>
       <w:r>
         <w:t>2.2 Subjects and requirement rules</w:t>
       </w:r>
@@ -8693,7 +8693,7 @@
         </w:rPr>
         <w:lastRenderedPageBreak/>
         <w:drawing>
-          <wp:inline distT="0" distB="0" distL="0" distR="0" wp14:anchorId="6313E8D3" wp14:editId="6313E8D4">
+          <wp:inline distT="0" distB="0" distL="0" distR="0" wp14:anchorId="68588CF4" wp14:editId="68588CF5">
             <wp:extent cx="6124575" cy="6067425"/>
             <wp:effectExtent l="0" t="0" r="0" b="0"/>
             <wp:docPr id="2" name="eer-rules.png" descr="EER model of streams, subjects and the recursive requirement-rule tree" title="EER model of streams, subjects and the recursive requirement-rule tree"/>
@@ -8736,7 +8736,7 @@
       <w:pPr>
         <w:pStyle w:val="Caption"/>
       </w:pPr>
-      <w:bookmarkStart w:id="11" w:name="_Toc243650956"/>
+      <w:bookmarkStart w:id="11" w:name="_Toc243654260"/>
       <w:r>
         <w:t xml:space="preserve">Figure </w:t>
       </w:r>
@@ -8769,7 +8769,7 @@
         <w:keepNext/>
         <w:keepLines/>
       </w:pPr>
-      <w:bookmarkStart w:id="12" w:name="_Toc243650919"/>
+      <w:bookmarkStart w:id="12" w:name="_Toc243654223"/>
       <w:r>
         <w:t>2.3 Provenance and trust</w:t>
       </w:r>
@@ -8805,7 +8805,7 @@
         </w:rPr>
         <w:lastRenderedPageBreak/>
         <w:drawing>
-          <wp:inline distT="0" distB="0" distL="0" distR="0" wp14:anchorId="6313E8D5" wp14:editId="6313E8D6">
+          <wp:inline distT="0" distB="0" distL="0" distR="0" wp14:anchorId="68588CF6" wp14:editId="68588CF7">
             <wp:extent cx="6124575" cy="4829175"/>
             <wp:effectExtent l="0" t="0" r="0" b="0"/>
             <wp:docPr id="3" name="eer-provenance.png" descr="EER model of cited facts, sources, revisions, AI extraction, review and mistake reports" title="EER model of cited facts, sources, revisions, AI extraction, review and mistake reports"/>
@@ -8848,7 +8848,7 @@
       <w:pPr>
         <w:pStyle w:val="Caption"/>
       </w:pPr>
-      <w:bookmarkStart w:id="13" w:name="_Toc243650957"/>
+      <w:bookmarkStart w:id="13" w:name="_Toc243654261"/>
       <w:r>
         <w:t xml:space="preserve">Figure </w:t>
       </w:r>
@@ -8881,7 +8881,7 @@
         <w:keepNext/>
         <w:keepLines/>
       </w:pPr>
-      <w:bookmarkStart w:id="14" w:name="_Toc243650920"/>
+      <w:bookmarkStart w:id="14" w:name="_Toc243654224"/>
       <w:r>
         <w:t>2.4 Journey and other routes</w:t>
       </w:r>
@@ -8898,7 +8898,7 @@
           <w:noProof/>
         </w:rPr>
         <w:drawing>
-          <wp:inline distT="0" distB="0" distL="0" distR="0" wp14:anchorId="6313E8D7" wp14:editId="6313E8D8">
+          <wp:inline distT="0" distB="0" distL="0" distR="0" wp14:anchorId="68588CF8" wp14:editId="68588CF9">
             <wp:extent cx="6124575" cy="2895600"/>
             <wp:effectExtent l="0" t="0" r="0" b="0"/>
             <wp:docPr id="4" name="eer-journey.png" descr="EER model of deadlines, push reminders and the specialisation of other routes" title="EER model of deadlines, push reminders and the specialisation of other routes"/>
@@ -8941,7 +8941,7 @@
       <w:pPr>
         <w:pStyle w:val="Caption"/>
       </w:pPr>
-      <w:bookmarkStart w:id="15" w:name="_Toc243650958"/>
+      <w:bookmarkStart w:id="15" w:name="_Toc243654262"/>
       <w:r>
         <w:t xml:space="preserve">Figure </w:t>
       </w:r>
@@ -8974,7 +8974,7 @@
         <w:keepNext/>
         <w:keepLines/>
       </w:pPr>
-      <w:bookmarkStart w:id="16" w:name="_Toc243650921"/>
+      <w:bookmarkStart w:id="16" w:name="_Toc243654225"/>
       <w:r>
         <w:lastRenderedPageBreak/>
         <w:t>2.5 Student accounts (CR-001)</w:t>
@@ -9013,7 +9013,7 @@
           <w:noProof/>
         </w:rPr>
         <w:drawing>
-          <wp:inline distT="0" distB="0" distL="0" distR="0" wp14:anchorId="6313E8D9" wp14:editId="6313E8DA">
+          <wp:inline distT="0" distB="0" distL="0" distR="0" wp14:anchorId="68588CFA" wp14:editId="68588CFB">
             <wp:extent cx="6124575" cy="2857500"/>
             <wp:effectExtent l="0" t="0" r="0" b="0"/>
             <wp:docPr id="5" name="eer-accounts.png" descr="EER model of optional student accounts: sign-in, sessions, recovery and the student's results" title="EER model of optional student accounts: sign-in, sessions, recovery and the student's results"/>
@@ -9056,7 +9056,7 @@
       <w:pPr>
         <w:pStyle w:val="Caption"/>
       </w:pPr>
-      <w:bookmarkStart w:id="17" w:name="_Toc243650959"/>
+      <w:bookmarkStart w:id="17" w:name="_Toc243654263"/>
       <w:r>
         <w:t xml:space="preserve">Figure </w:t>
       </w:r>
@@ -9089,7 +9089,7 @@
         <w:keepNext/>
         <w:keepLines/>
       </w:pPr>
-      <w:bookmarkStart w:id="18" w:name="_Toc243650922"/>
+      <w:bookmarkStart w:id="18" w:name="_Toc243654226"/>
       <w:r>
         <w:t>2.6 Journey, Alerts and Groups (CR-002)</w:t>
       </w:r>
@@ -9457,7 +9457,7 @@
                 <w:sz w:val="19"/>
                 <w:szCs w:val="19"/>
               </w:rPr>
-              <w:t xml:space="preserve"> the UGC application co-pilot's answers and ticks (address, parents' names, school, </w:t>
+              <w:t xml:space="preserve"> the UGC application guide's two answers (school or private candidate; name changed) and ticks (</w:t>
             </w:r>
             <w:r>
               <w:rPr>
@@ -9473,7 +9473,7 @@
                 <w:sz w:val="19"/>
                 <w:szCs w:val="19"/>
               </w:rPr>
-              <w:t>)</w:t>
+              <w:t>; no address, NIC or names: those fields are guides, and anything typed under the first version is deleted on the next load)</w:t>
             </w:r>
           </w:p>
         </w:tc>
@@ -9576,6 +9576,7 @@
                 <w:sz w:val="19"/>
                 <w:szCs w:val="19"/>
               </w:rPr>
+              <w:lastRenderedPageBreak/>
               <w:t>Course groups, members, senior invites, reports, blocks</w:t>
             </w:r>
           </w:p>
@@ -9678,7 +9679,6 @@
                 <w:sz w:val="19"/>
                 <w:szCs w:val="19"/>
               </w:rPr>
-              <w:lastRenderedPageBreak/>
               <w:t>Group messages</w:t>
             </w:r>
           </w:p>
@@ -9779,7 +9779,10 @@
         <w:t>rule</w:t>
       </w:r>
       <w:r>
-        <w:t xml:space="preserve"> (for example, "within two weeks of the closing date", p.116) and dated items come from cited notices. No date is invented.</w:t>
+        <w:t xml:space="preserve"> (for example, </w:t>
+      </w:r>
+      <w:r>
+        <w:t>"within two weeks of the closing date", p.116) and dated items come from cited notices. No date is invented.</w:t>
       </w:r>
     </w:p>
     <w:p>
@@ -9806,7 +9809,10 @@
         <w:t>account.verified_for_letter</w:t>
       </w:r>
       <w:r>
-        <w:t>), and the 0003 triggers already keep student data off non-student accounts. A SENIOR_INVITE (one-time code, stored only as its SHA-256) names the course, institution and study year the product owner checked; redeeming it at sign-up creates the SENIOR account and marks the invite in one atomic batch. A trigger allows redemption only by a SENIOR account of the invite's institution, and only once.</w:t>
+        <w:t xml:space="preserve">), and the 0003 triggers already keep student data off non-student accounts. A SENIOR_INVITE (one-time code, stored only as its SHA-256) names the course, institution and study year </w:t>
+      </w:r>
+      <w:r>
+        <w:t>the product owner checked; redeeming it at sign-up creates the SENIOR account and marks the invite in one atomic batch. A trigger allows redemption only by a SENIOR account of the invite's institution, and only once.</w:t>
       </w:r>
     </w:p>
     <w:p>
@@ -10681,7 +10687,10 @@
         <w:spacing w:after="120"/>
       </w:pPr>
       <w:r>
-        <w:t>Messages are outside D1's cascade, so deleting an account also tells every group it was in to delete that account's messages (tested). All tables are in BCNF: every determinant is a candidate key; derived values (member counts, the senior badge text) are computed, never stored.</w:t>
+        <w:t xml:space="preserve">Messages are outside D1's cascade, so deleting an account also tells every group it was in to delete that account's </w:t>
+      </w:r>
+      <w:r>
+        <w:t>messages (tested). All tables are in BCNF: every determinant is a candidate key; derived values (member counts, the senior badge text) are computed, never stored.</w:t>
       </w:r>
     </w:p>
     <w:p>
@@ -10690,12 +10699,9 @@
         <w:keepNext/>
         <w:keepLines/>
       </w:pPr>
-      <w:bookmarkStart w:id="19" w:name="_Toc243650923"/>
-      <w:r>
-        <w:t>2.7 </w:t>
-      </w:r>
-      <w:r>
-        <w:t>Contact details (CR-003)</w:t>
+      <w:bookmarkStart w:id="19" w:name="_Toc243654227"/>
+      <w:r>
+        <w:t>2.7 Contact details (CR-003)</w:t>
       </w:r>
       <w:bookmarkEnd w:id="19"/>
     </w:p>
@@ -10711,7 +10717,14 @@
         <w:t>Decision.</w:t>
       </w:r>
       <w:r>
-        <w:t xml:space="preserve"> On 11 October 2026 the product owner made an account compulsory at the start, with full name, email, mobile number and date of birth (the birthday moves here from the Alerts screen, where it stayed on the phone). This reverses the CR-001 promise "a username only". The README, the business case and the app's privacy text now say exactly what is collected and why.</w:t>
+        <w:t xml:space="preserve"> On 11 October 2026 the product owner made an account compulsory at the start, with full name, email, mobile number and date of birth (the birthday moves here from the Alerts screen, where it stayed on the </w:t>
+      </w:r>
+      <w:r>
+        <w:lastRenderedPageBreak/>
+        <w:t xml:space="preserve">phone). This </w:t>
+      </w:r>
+      <w:r>
+        <w:t>reverses the CR-001 promise "a username only". The README, the business case and the app's privacy text now say exactly what is collected and why.</w:t>
       </w:r>
     </w:p>
     <w:p>
@@ -10723,7 +10736,6 @@
           <w:b/>
           <w:bCs/>
         </w:rPr>
-        <w:lastRenderedPageBreak/>
         <w:t>Where it lives.</w:t>
       </w:r>
       <w:r>
@@ -11399,7 +11411,10 @@
         <w:t>PUT /api/me/contact</w:t>
       </w:r>
       <w:r>
-        <w:t>). Safe default: no existing row is invented or guessed. Students under 18 confirm that a parent or guardian agrees (Personal Data Protection Act, No. 9 of 2022). The table is in BCNF: the only determinant is the key.</w:t>
+        <w:t xml:space="preserve">). Safe default: no existing row is invented or guessed. Students under 18 confirm that a </w:t>
+      </w:r>
+      <w:r>
+        <w:t>parent or guardian agrees (Personal Data Protection Act, No. 9 of 2022). The table is in BCNF: the only determinant is the key.</w:t>
       </w:r>
     </w:p>
     <w:p>
@@ -11408,7 +11423,7 @@
         <w:keepNext/>
         <w:keepLines/>
       </w:pPr>
-      <w:bookmarkStart w:id="20" w:name="_Toc243650924"/>
+      <w:bookmarkStart w:id="20" w:name="_Toc243654228"/>
       <w:r>
         <w:t>2.8 Answer feedback (CR-004)</w:t>
       </w:r>
@@ -11467,10 +11482,10 @@
         <w:t>json_valid</w:t>
       </w:r>
       <w:r>
-        <w:t xml:space="preserve">), an optional note, the app language and a review state. It holds nothing that identifies the student: no account, device </w:t>
-      </w:r>
-      <w:r>
-        <w:t>or IP. The screen says the question and answer are sent before the student sends a report.</w:t>
+        <w:t xml:space="preserve">), an </w:t>
+      </w:r>
+      <w:r>
+        <w:t>optional note, the app language and a review state. It holds nothing that identifies the student: no account, device or IP. The screen says the question and answer are sent before the student sends a report.</w:t>
       </w:r>
     </w:p>
     <w:p>
@@ -11479,7 +11494,7 @@
         <w:keepNext/>
         <w:keepLines/>
       </w:pPr>
-      <w:bookmarkStart w:id="21" w:name="_Toc243650925"/>
+      <w:bookmarkStart w:id="21" w:name="_Toc243654229"/>
       <w:r>
         <w:t>2.9 Group rules and sample conversations (CR-005)</w:t>
       </w:r>
@@ -11514,7 +11529,10 @@
         <w:t>rules_version</w:t>
       </w:r>
       <w:r>
-        <w:t>, migration 0009) rather than a new table: one value per (group, member), fully dependent on the key, so the table stays in BCNF. A CHECK lists the versions that exist (</w:t>
+        <w:t xml:space="preserve">, migration 0009) rather than a new table: one value per (group, member), fully </w:t>
+      </w:r>
+      <w:r>
+        <w:t>dependent on the key, so the table stays in BCNF. A CHECK lists the versions that exist (</w:t>
       </w:r>
       <w:r>
         <w:rPr>
@@ -11526,10 +11544,7 @@
         <w:t>'2026-10-11'</w:t>
       </w:r>
       <w:r>
-        <w:t xml:space="preserve">); a new version </w:t>
-      </w:r>
-      <w:r>
-        <w:t>of the rules adds a value and asks members again. NULL means joined before the rules existed. Server enforcement: the Worker refuses a join without the current version and keeps the live room closed for a member whose row is not on it (</w:t>
+        <w:t>); a new version of the rules adds a value and asks members again. NULL means joined before the rules existed. Server enforcement: the Worker refuses a join without the current version and keeps the live room closed for a member whose row is not on it (</w:t>
       </w:r>
       <w:r>
         <w:rPr>
@@ -11605,10 +11620,7 @@
         <w:t>sample</w:t>
       </w:r>
       <w:r>
-        <w:t xml:space="preserve">, its author starts with "Sample", no badge says "verified", and its id is not a message id, so </w:t>
-      </w:r>
-      <w:r>
-        <w:t>it cannot be reported, blocked or mistaken for a member (trust rule: sample data is labelled as sample; pinned by tests).</w:t>
+        <w:t>, its author starts with "Sample", no badge says "verified", and its id is not a message id, so it cannot be reported, blocked or mistaken for a member (trust rule: sample data is labelled as sample; pinned by tests).</w:t>
       </w:r>
     </w:p>
     <w:p>
@@ -11617,7 +11629,7 @@
         <w:keepNext/>
         <w:keepLines/>
       </w:pPr>
-      <w:bookmarkStart w:id="22" w:name="_Toc243650926"/>
+      <w:bookmarkStart w:id="22" w:name="_Toc243654230"/>
       <w:r>
         <w:lastRenderedPageBreak/>
         <w:t>2.10 Journey, avatars and group rules on the account (CR-006)</w:t>
@@ -11666,7 +11678,14 @@
           <w:b/>
           <w:bCs/>
         </w:rPr>
-        <w:t>only once its window is open</w:t>
+        <w:t xml:space="preserve">only once </w:t>
+      </w:r>
+      <w:r>
+        <w:rPr>
+          <w:b/>
+          <w:bCs/>
+        </w:rPr>
+        <w:t>its window is open</w:t>
       </w:r>
       <w:r>
         <w:t>, which the server checks. Migration 0010 implements the design below.</w:t>
@@ -11677,7 +11696,7 @@
         <w:pStyle w:val="Caption"/>
         <w:keepNext/>
       </w:pPr>
-      <w:bookmarkStart w:id="23" w:name="_Toc243650964"/>
+      <w:bookmarkStart w:id="23" w:name="_Toc243654268"/>
       <w:r>
         <w:t xml:space="preserve">Table </w:t>
       </w:r>
@@ -12935,7 +12954,7 @@
         <w:keepNext/>
         <w:keepLines/>
       </w:pPr>
-      <w:bookmarkStart w:id="24" w:name="_Toc243650927"/>
+      <w:bookmarkStart w:id="24" w:name="_Toc243654231"/>
       <w:r>
         <w:t>2.11 Demo accounts (CR-007)</w:t>
       </w:r>
@@ -12991,7 +13010,7 @@
         <w:pStyle w:val="Caption"/>
         <w:keepNext/>
       </w:pPr>
-      <w:bookmarkStart w:id="25" w:name="_Toc243650965"/>
+      <w:bookmarkStart w:id="25" w:name="_Toc243654269"/>
       <w:r>
         <w:t xml:space="preserve">Table </w:t>
       </w:r>
@@ -13446,7 +13465,7 @@
         <w:keepNext/>
         <w:keepLines/>
       </w:pPr>
-      <w:bookmarkStart w:id="26" w:name="_Toc243650928"/>
+      <w:bookmarkStart w:id="26" w:name="_Toc243654232"/>
       <w:r>
         <w:t>2.12 University facts from UGC statistics (read model)</w:t>
       </w:r>
@@ -13518,7 +13537,7 @@
         <w:keepNext/>
         <w:keepLines/>
       </w:pPr>
-      <w:bookmarkStart w:id="27" w:name="_Toc243650929"/>
+      <w:bookmarkStart w:id="27" w:name="_Toc243654233"/>
       <w:r>
         <w:lastRenderedPageBreak/>
         <w:t>2.13 Rooms an account opened (security audit, lead 3)</w:t>
@@ -13577,7 +13596,7 @@
         <w:keepNext/>
         <w:keepLines/>
       </w:pPr>
-      <w:bookmarkStart w:id="28" w:name="_Toc243650930"/>
+      <w:bookmarkStart w:id="28" w:name="_Toc243654234"/>
       <w:r>
         <w:t>2.14 Entity catalogue</w:t>
       </w:r>
@@ -13588,7 +13607,7 @@
         <w:pStyle w:val="Caption"/>
         <w:keepNext/>
       </w:pPr>
-      <w:bookmarkStart w:id="29" w:name="_Toc243650966"/>
+      <w:bookmarkStart w:id="29" w:name="_Toc243654270"/>
       <w:r>
         <w:t xml:space="preserve">Table </w:t>
       </w:r>
@@ -16857,7 +16876,7 @@
         <w:keepLines/>
         <w:pageBreakBefore/>
       </w:pPr>
-      <w:bookmarkStart w:id="30" w:name="_Toc243650931"/>
+      <w:bookmarkStart w:id="30" w:name="_Toc243654235"/>
       <w:r>
         <w:lastRenderedPageBreak/>
         <w:t>3 Rule grammar</w:t>
@@ -16899,7 +16918,7 @@
         <w:pStyle w:val="Caption"/>
         <w:keepNext/>
       </w:pPr>
-      <w:bookmarkStart w:id="31" w:name="_Toc243650967"/>
+      <w:bookmarkStart w:id="31" w:name="_Toc243654271"/>
       <w:r>
         <w:t xml:space="preserve">Table </w:t>
       </w:r>
@@ -18270,7 +18289,7 @@
         <w:keepLines/>
         <w:pageBreakBefore/>
       </w:pPr>
-      <w:bookmarkStart w:id="32" w:name="_Toc243650932"/>
+      <w:bookmarkStart w:id="32" w:name="_Toc243654236"/>
       <w:r>
         <w:lastRenderedPageBreak/>
         <w:t>4 Mapping the EER model to relations</w:t>
@@ -18290,7 +18309,7 @@
         <w:pStyle w:val="Caption"/>
         <w:keepNext/>
       </w:pPr>
-      <w:bookmarkStart w:id="33" w:name="_Toc243650968"/>
+      <w:bookmarkStart w:id="33" w:name="_Toc243654272"/>
       <w:r>
         <w:t xml:space="preserve">Table </w:t>
       </w:r>
@@ -20081,7 +20100,7 @@
         <w:pStyle w:val="Caption"/>
         <w:keepNext/>
       </w:pPr>
-      <w:bookmarkStart w:id="34" w:name="_Toc243650969"/>
+      <w:bookmarkStart w:id="34" w:name="_Toc243654273"/>
       <w:r>
         <w:lastRenderedPageBreak/>
         <w:t xml:space="preserve">Table </w:t>
@@ -21193,7 +21212,7 @@
         </w:rPr>
         <w:lastRenderedPageBreak/>
         <w:drawing>
-          <wp:inline distT="0" distB="0" distL="0" distR="0" wp14:anchorId="6313E8DB" wp14:editId="6313E8DC">
+          <wp:inline distT="0" distB="0" distL="0" distR="0" wp14:anchorId="68588CFC" wp14:editId="68588CFD">
             <wp:extent cx="6124575" cy="6562725"/>
             <wp:effectExtent l="0" t="0" r="0" b="0"/>
             <wp:docPr id="6" name="relational-admission.png" descr="Logical schema, admission data (generated from the migration file)" title="Logical schema, admission data (generated from the migration file)"/>
@@ -21236,7 +21255,7 @@
       <w:pPr>
         <w:pStyle w:val="Caption"/>
       </w:pPr>
-      <w:bookmarkStart w:id="35" w:name="_Toc243650960"/>
+      <w:bookmarkStart w:id="35" w:name="_Toc243654264"/>
       <w:r>
         <w:t xml:space="preserve">Figure </w:t>
       </w:r>
@@ -21275,7 +21294,7 @@
         </w:rPr>
         <w:lastRenderedPageBreak/>
         <w:drawing>
-          <wp:inline distT="0" distB="0" distL="0" distR="0" wp14:anchorId="6313E8DD" wp14:editId="6313E8DE">
+          <wp:inline distT="0" distB="0" distL="0" distR="0" wp14:anchorId="68588CFE" wp14:editId="68588CFF">
             <wp:extent cx="6124575" cy="5562600"/>
             <wp:effectExtent l="0" t="0" r="0" b="0"/>
             <wp:docPr id="7" name="relational-trust-journey.png" descr="Logical schema, trust, routes and journey data (generated from the migration file)" title="Logical schema, trust, routes and journey data (generated from the migration file)"/>
@@ -21318,7 +21337,7 @@
       <w:pPr>
         <w:pStyle w:val="Caption"/>
       </w:pPr>
-      <w:bookmarkStart w:id="36" w:name="_Toc243650961"/>
+      <w:bookmarkStart w:id="36" w:name="_Toc243654265"/>
       <w:r>
         <w:t xml:space="preserve">Figure </w:t>
       </w:r>
@@ -21356,7 +21375,7 @@
           <w:noProof/>
         </w:rPr>
         <w:drawing>
-          <wp:inline distT="0" distB="0" distL="0" distR="0" wp14:anchorId="6313E8DF" wp14:editId="6313E8E0">
+          <wp:inline distT="0" distB="0" distL="0" distR="0" wp14:anchorId="68588D00" wp14:editId="68588D01">
             <wp:extent cx="6124575" cy="2305050"/>
             <wp:effectExtent l="0" t="0" r="0" b="0"/>
             <wp:docPr id="8" name="relational-accounts.png" descr="Logical schema, optional student accounts (generated from the migration files)" title="Logical schema, optional student accounts (generated from the migration files)"/>
@@ -21399,7 +21418,7 @@
       <w:pPr>
         <w:pStyle w:val="Caption"/>
       </w:pPr>
-      <w:bookmarkStart w:id="37" w:name="_Toc243650962"/>
+      <w:bookmarkStart w:id="37" w:name="_Toc243654266"/>
       <w:r>
         <w:t xml:space="preserve">Figure </w:t>
       </w:r>
@@ -21433,7 +21452,7 @@
         <w:keepLines/>
         <w:pageBreakBefore/>
       </w:pPr>
-      <w:bookmarkStart w:id="38" w:name="_Toc243650933"/>
+      <w:bookmarkStart w:id="38" w:name="_Toc243654237"/>
       <w:r>
         <w:lastRenderedPageBreak/>
         <w:t>5 Normalisation</w:t>
@@ -21446,7 +21465,7 @@
         <w:keepNext/>
         <w:keepLines/>
       </w:pPr>
-      <w:bookmarkStart w:id="39" w:name="_Toc243650934"/>
+      <w:bookmarkStart w:id="39" w:name="_Toc243654238"/>
       <w:r>
         <w:t>5.1 From the source form to 1NF</w:t>
       </w:r>
@@ -21502,7 +21521,7 @@
         <w:keepNext/>
         <w:keepLines/>
       </w:pPr>
-      <w:bookmarkStart w:id="40" w:name="_Toc243650935"/>
+      <w:bookmarkStart w:id="40" w:name="_Toc243654239"/>
       <w:r>
         <w:t>5.2 Functional and multi-valued dependencies</w:t>
       </w:r>
@@ -21513,7 +21532,7 @@
         <w:pStyle w:val="Caption"/>
         <w:keepNext/>
       </w:pPr>
-      <w:bookmarkStart w:id="41" w:name="_Toc243650970"/>
+      <w:bookmarkStart w:id="41" w:name="_Toc243654274"/>
       <w:r>
         <w:t xml:space="preserve">Table </w:t>
       </w:r>
@@ -22412,7 +22431,7 @@
         <w:keepNext/>
         <w:keepLines/>
       </w:pPr>
-      <w:bookmarkStart w:id="42" w:name="_Toc243650936"/>
+      <w:bookmarkStart w:id="42" w:name="_Toc243654240"/>
       <w:r>
         <w:t>5.3 2NF, 3NF and BCNF</w:t>
       </w:r>
@@ -22655,7 +22674,7 @@
         <w:keepNext/>
         <w:keepLines/>
       </w:pPr>
-      <w:bookmarkStart w:id="43" w:name="_Toc243650937"/>
+      <w:bookmarkStart w:id="43" w:name="_Toc243654241"/>
       <w:r>
         <w:lastRenderedPageBreak/>
         <w:t>5.4 Deliberate departures</w:t>
@@ -22667,7 +22686,7 @@
         <w:pStyle w:val="Caption"/>
         <w:keepNext/>
       </w:pPr>
-      <w:bookmarkStart w:id="44" w:name="_Toc243650971"/>
+      <w:bookmarkStart w:id="44" w:name="_Toc243654275"/>
       <w:r>
         <w:t xml:space="preserve">Table </w:t>
       </w:r>
@@ -23438,7 +23457,7 @@
         <w:keepLines/>
         <w:pageBreakBefore/>
       </w:pPr>
-      <w:bookmarkStart w:id="45" w:name="_Toc243650938"/>
+      <w:bookmarkStart w:id="45" w:name="_Toc243654242"/>
       <w:r>
         <w:lastRenderedPageBreak/>
         <w:t>6 Physical design for Cloudflare D1</w:t>
@@ -23451,7 +23470,7 @@
         <w:keepNext/>
         <w:keepLines/>
       </w:pPr>
-      <w:bookmarkStart w:id="46" w:name="_Toc243650939"/>
+      <w:bookmarkStart w:id="46" w:name="_Toc243654243"/>
       <w:r>
         <w:t>6.1 Conventions</w:t>
       </w:r>
@@ -23690,7 +23709,7 @@
         <w:keepNext/>
         <w:keepLines/>
       </w:pPr>
-      <w:bookmarkStart w:id="47" w:name="_Toc243650940"/>
+      <w:bookmarkStart w:id="47" w:name="_Toc243654244"/>
       <w:r>
         <w:t>6.2 Indexes</w:t>
       </w:r>
@@ -23701,7 +23720,7 @@
         <w:pStyle w:val="Caption"/>
         <w:keepNext/>
       </w:pPr>
-      <w:bookmarkStart w:id="48" w:name="_Toc243650972"/>
+      <w:bookmarkStart w:id="48" w:name="_Toc243654276"/>
       <w:r>
         <w:t xml:space="preserve">Table </w:t>
       </w:r>
@@ -24782,7 +24801,7 @@
         <w:keepNext/>
         <w:keepLines/>
       </w:pPr>
-      <w:bookmarkStart w:id="49" w:name="_Toc243650941"/>
+      <w:bookmarkStart w:id="49" w:name="_Toc243654245"/>
       <w:r>
         <w:lastRenderedPageBreak/>
         <w:t>6.3 Capacity against the free plan</w:t>
@@ -24794,7 +24813,7 @@
         <w:pStyle w:val="Caption"/>
         <w:keepNext/>
       </w:pPr>
-      <w:bookmarkStart w:id="50" w:name="_Toc243650973"/>
+      <w:bookmarkStart w:id="50" w:name="_Toc243654277"/>
       <w:r>
         <w:t xml:space="preserve">Table </w:t>
       </w:r>
@@ -25481,7 +25500,7 @@
         <w:keepLines/>
         <w:pageBreakBefore/>
       </w:pPr>
-      <w:bookmarkStart w:id="51" w:name="_Toc243650942"/>
+      <w:bookmarkStart w:id="51" w:name="_Toc243654246"/>
       <w:r>
         <w:lastRenderedPageBreak/>
         <w:t>7 Validation against real data</w:t>
@@ -25513,7 +25532,7 @@
         <w:pStyle w:val="Caption"/>
         <w:keepNext/>
       </w:pPr>
-      <w:bookmarkStart w:id="52" w:name="_Toc243650974"/>
+      <w:bookmarkStart w:id="52" w:name="_Toc243654278"/>
       <w:r>
         <w:t xml:space="preserve">Table </w:t>
       </w:r>
@@ -26963,7 +26982,7 @@
         <w:pStyle w:val="Caption"/>
         <w:keepNext/>
       </w:pPr>
-      <w:bookmarkStart w:id="53" w:name="_Toc243650975"/>
+      <w:bookmarkStart w:id="53" w:name="_Toc243654279"/>
       <w:r>
         <w:t xml:space="preserve">Table </w:t>
       </w:r>
@@ -27705,7 +27724,7 @@
         <w:keepLines/>
         <w:pageBreakBefore/>
       </w:pPr>
-      <w:bookmarkStart w:id="54" w:name="_Toc243650943"/>
+      <w:bookmarkStart w:id="54" w:name="_Toc243654247"/>
       <w:r>
         <w:lastRenderedPageBreak/>
         <w:t>Appendix A: Traceability: requirements to tables</w:t>
@@ -27717,7 +27736,7 @@
         <w:pStyle w:val="Caption"/>
         <w:keepNext/>
       </w:pPr>
-      <w:bookmarkStart w:id="55" w:name="_Toc243650976"/>
+      <w:bookmarkStart w:id="55" w:name="_Toc243654280"/>
       <w:r>
         <w:t xml:space="preserve">Table </w:t>
       </w:r>
@@ -29952,7 +29971,7 @@
         <w:keepLines/>
         <w:pageBreakBefore/>
       </w:pPr>
-      <w:bookmarkStart w:id="56" w:name="_Toc243650944"/>
+      <w:bookmarkStart w:id="56" w:name="_Toc243654248"/>
       <w:r>
         <w:lastRenderedPageBreak/>
         <w:t>Appendix B: Physical schema (migration 0001)</w:t>
@@ -35165,7 +35184,7 @@
         <w:keepLines/>
         <w:pageBreakBefore/>
       </w:pPr>
-      <w:bookmarkStart w:id="57" w:name="_Toc243650945"/>
+      <w:bookmarkStart w:id="57" w:name="_Toc243654249"/>
       <w:r>
         <w:lastRenderedPageBreak/>
         <w:t>Appendix C: Student accounts (migration 0003)</w:t>
@@ -36898,7 +36917,7 @@
         <w:keepLines/>
         <w:pageBreakBefore/>
       </w:pPr>
-      <w:bookmarkStart w:id="58" w:name="_Toc243650946"/>
+      <w:bookmarkStart w:id="58" w:name="_Toc243654250"/>
       <w:r>
         <w:lastRenderedPageBreak/>
         <w:t>Appendix D: Contact details (migration 0007)</w:t>
@@ -37294,7 +37313,7 @@
         <w:keepLines/>
         <w:pageBreakBefore/>
       </w:pPr>
-      <w:bookmarkStart w:id="59" w:name="_Toc243650947"/>
+      <w:bookmarkStart w:id="59" w:name="_Toc243654251"/>
       <w:r>
         <w:lastRenderedPageBreak/>
         <w:t>Appendix E: Answer feedback (migration 0008)</w:t>
@@ -37605,7 +37624,7 @@
         <w:keepLines/>
         <w:pageBreakBefore/>
       </w:pPr>
-      <w:bookmarkStart w:id="60" w:name="_Toc243650948"/>
+      <w:bookmarkStart w:id="60" w:name="_Toc243654252"/>
       <w:r>
         <w:lastRenderedPageBreak/>
         <w:t>Appendix F: Journey, avatars and group rules on the account (migration 0010)</w:t>
@@ -42621,7 +42640,7 @@
         <w:keepLines/>
         <w:pageBreakBefore/>
       </w:pPr>
-      <w:bookmarkStart w:id="61" w:name="_Toc243650949"/>
+      <w:bookmarkStart w:id="61" w:name="_Toc243654253"/>
       <w:r>
         <w:lastRenderedPageBreak/>
         <w:t>Appendix G: Rooms an account opened (migration 0012)</w:t>
@@ -42898,7 +42917,7 @@
         <w:keepLines/>
         <w:pageBreakBefore/>
       </w:pPr>
-      <w:bookmarkStart w:id="62" w:name="_Toc243650950"/>
+      <w:bookmarkStart w:id="62" w:name="_Toc243654254"/>
       <w:r>
         <w:lastRenderedPageBreak/>
         <w:t>Appendix H: Demo accounts (migration 0011)</w:t>
@@ -43090,7 +43109,7 @@
         <w:keepLines/>
         <w:pageBreakBefore/>
       </w:pPr>
-      <w:bookmarkStart w:id="63" w:name="_Toc243650951"/>
+      <w:bookmarkStart w:id="63" w:name="_Toc243654255"/>
       <w:r>
         <w:lastRenderedPageBreak/>
         <w:t>Appendix I: Group rules (migration 0009)</w:t>
@@ -43231,7 +43250,7 @@
         <w:keepLines/>
         <w:pageBreakBefore/>
       </w:pPr>
-      <w:bookmarkStart w:id="64" w:name="_Toc243650952"/>
+      <w:bookmarkStart w:id="64" w:name="_Toc243654256"/>
       <w:r>
         <w:lastRenderedPageBreak/>
         <w:t>Appendix J: Groups (migration 0006)</w:t>
@@ -44484,7 +44503,7 @@
         <w:keepLines/>
         <w:pageBreakBefore/>
       </w:pPr>
-      <w:bookmarkStart w:id="65" w:name="_Toc243650953"/>
+      <w:bookmarkStart w:id="65" w:name="_Toc243654257"/>
       <w:r>
         <w:lastRenderedPageBreak/>
         <w:t>Appendix K: Glossary</w:t>
@@ -44496,7 +44515,7 @@
         <w:pStyle w:val="Caption"/>
         <w:keepNext/>
       </w:pPr>
-      <w:bookmarkStart w:id="66" w:name="_Toc243650977"/>
+      <w:bookmarkStart w:id="66" w:name="_Toc243654281"/>
       <w:r>
         <w:t xml:space="preserve">Table </w:t>
       </w:r>
@@ -45213,7 +45232,7 @@
         <w:keepLines/>
         <w:pageBreakBefore/>
       </w:pPr>
-      <w:bookmarkStart w:id="67" w:name="_Toc243650954"/>
+      <w:bookmarkStart w:id="67" w:name="_Toc243654258"/>
       <w:r>
         <w:lastRenderedPageBreak/>
         <w:t>Appendix L: References</w:t>
@@ -45225,7 +45244,7 @@
         <w:pStyle w:val="Caption"/>
         <w:keepNext/>
       </w:pPr>
-      <w:bookmarkStart w:id="68" w:name="_Toc243650978"/>
+      <w:bookmarkStart w:id="68" w:name="_Toc243654282"/>
       <w:r>
         <w:t xml:space="preserve">Table </w:t>
       </w:r>
@@ -46156,96 +46175,10 @@
 <file path=word/numbering.xml><?xml version="1.0" encoding="utf-8"?>
 <w:numbering xmlns:wpc="http://schemas.microsoft.com/office/word/2010/wordprocessingCanvas" xmlns:cx="http://schemas.microsoft.com/office/drawing/2014/chartex" xmlns:cx1="http://schemas.microsoft.com/office/drawing/2015/9/8/chartex" xmlns:cx2="http://schemas.microsoft.com/office/drawing/2015/10/21/chartex" xmlns:cx3="http://schemas.microsoft.com/office/drawing/2016/5/9/chartex" xmlns:cx4="http://schemas.microsoft.com/office/drawing/2016/5/10/chartex" xmlns:cx5="http://schemas.microsoft.com/office/drawing/2016/5/11/chartex" xmlns:cx6="http://schemas.microsoft.com/office/drawing/2016/5/12/chartex" xmlns:cx7="http://schemas.microsoft.com/office/drawing/2016/5/13/chartex" xmlns:cx8="http://schemas.microsoft.com/office/drawing/2016/5/14/chartex" xmlns:mc="http://schemas.openxmlformats.org/markup-compatibility/2006" xmlns:aink="http://schemas.microsoft.com/office/drawing/2016/ink" xmlns:am3d="http://schemas.microsoft.com/office/drawing/2017/model3d" xmlns:o="urn:schemas-microsoft-com:office:office" xmlns:oel="http://schemas.microsoft.com/office/2019/extlst" xmlns:r="http://schemas.openxmlformats.org/officeDocument/2006/relationships" xmlns:m="http://schemas.openxmlformats.org/officeDocument/2006/math" xmlns:v="urn:schemas-microsoft-com:vml" xmlns:wp14="http://schemas.microsoft.com/office/word/2010/wordprocessingDrawing" xmlns:wp="http://schemas.openxmlformats.org/drawingml/2006/wordprocessingDrawing" xmlns:w10="urn:schemas-microsoft-com:office:word" xmlns:w="http://schemas.openxmlformats.org/wordprocessingml/2006/main" xmlns:w14="http://schemas.microsoft.com/office/word/2010/wordml" xmlns:w15="http://schemas.microsoft.com/office/word/2012/wordml" xmlns:w16cex="http://schemas.microsoft.com/office/word/2018/wordml/cex" xmlns:w16cid="http://schemas.microsoft.com/office/word/2016/wordml/cid" xmlns:w16="http://schemas.microsoft.com/office/word/2018/wordml" xmlns:w16du="http://schemas.microsoft.com/office/word/2023/wordml/word16du" xmlns:w16sdtdh="http://schemas.microsoft.com/office/word/2020/wordml/sdtdatahash" xmlns:w16sdtfl="http://schemas.microsoft.com/office/word/2024/wordml/sdtformatlock" xmlns:w16se="http://schemas.microsoft.com/office/word/2015/wordml/symex" xmlns:wpg="http://schemas.microsoft.com/office/word/2010/wordprocessingGroup" xmlns:wpi="http://schemas.microsoft.com/office/word/2010/wordprocessingInk" xmlns:wne="http://schemas.microsoft.com/office/word/2006/wordml" xmlns:wps="http://schemas.microsoft.com/office/word/2010/wordprocessingShape" mc:Ignorable="w14 w15 w16se w16cid w16 w16cex w16sdtdh w16sdtfl w16du wp14">
   <w:abstractNum w:abstractNumId="0" w15:restartNumberingAfterBreak="0">
-    <w:nsid w:val="0CBF2D9C"/>
+    <w:nsid w:val="0B347789"/>
     <w:multiLevelType w:val="hybridMultilevel"/>
-    <w:tmpl w:val="FE104B44"/>
-    <w:lvl w:ilvl="0" w:tplc="C2223FB0" w:tentative="1">
-      <w:start w:val="1"/>
-      <w:numFmt w:val="bullet"/>
-      <w:lvlText w:val="●"/>
-      <w:lvlJc w:val="left"/>
-      <w:pPr>
-        <w:ind w:left="720" w:hanging="360"/>
-      </w:pPr>
-    </w:lvl>
-    <w:lvl w:ilvl="1" w:tplc="C39234C6" w:tentative="1">
-      <w:start w:val="1"/>
-      <w:numFmt w:val="bullet"/>
-      <w:lvlText w:val="○"/>
-      <w:lvlJc w:val="left"/>
-      <w:pPr>
-        <w:ind w:left="1440" w:hanging="360"/>
-      </w:pPr>
-    </w:lvl>
-    <w:lvl w:ilvl="2" w:tplc="DB66709E" w:tentative="1">
-      <w:start w:val="1"/>
-      <w:numFmt w:val="bullet"/>
-      <w:lvlText w:val="■"/>
-      <w:lvlJc w:val="left"/>
-      <w:pPr>
-        <w:ind w:left="2160" w:hanging="360"/>
-      </w:pPr>
-    </w:lvl>
-    <w:lvl w:ilvl="3" w:tplc="D0EC7B1C" w:tentative="1">
-      <w:start w:val="1"/>
-      <w:numFmt w:val="bullet"/>
-      <w:lvlText w:val="●"/>
-      <w:lvlJc w:val="left"/>
-      <w:pPr>
-        <w:ind w:left="2880" w:hanging="360"/>
-      </w:pPr>
-    </w:lvl>
-    <w:lvl w:ilvl="4" w:tplc="80B4111C" w:tentative="1">
-      <w:start w:val="1"/>
-      <w:numFmt w:val="bullet"/>
-      <w:lvlText w:val="○"/>
-      <w:lvlJc w:val="left"/>
-      <w:pPr>
-        <w:ind w:left="3600" w:hanging="360"/>
-      </w:pPr>
-    </w:lvl>
-    <w:lvl w:ilvl="5" w:tplc="B0E4C838" w:tentative="1">
-      <w:start w:val="1"/>
-      <w:numFmt w:val="bullet"/>
-      <w:lvlText w:val="■"/>
-      <w:lvlJc w:val="left"/>
-      <w:pPr>
-        <w:ind w:left="4320" w:hanging="360"/>
-      </w:pPr>
-    </w:lvl>
-    <w:lvl w:ilvl="6" w:tplc="B844A782" w:tentative="1">
-      <w:start w:val="1"/>
-      <w:numFmt w:val="bullet"/>
-      <w:lvlText w:val="●"/>
-      <w:lvlJc w:val="left"/>
-      <w:pPr>
-        <w:ind w:left="5040" w:hanging="360"/>
-      </w:pPr>
-    </w:lvl>
-    <w:lvl w:ilvl="7" w:tplc="BDEA3D14" w:tentative="1">
-      <w:start w:val="1"/>
-      <w:numFmt w:val="bullet"/>
-      <w:lvlText w:val="●"/>
-      <w:lvlJc w:val="left"/>
-      <w:pPr>
-        <w:ind w:left="5760" w:hanging="360"/>
-      </w:pPr>
-    </w:lvl>
-    <w:lvl w:ilvl="8" w:tplc="A912C4A8" w:tentative="1">
-      <w:start w:val="1"/>
-      <w:numFmt w:val="bullet"/>
-      <w:lvlText w:val="●"/>
-      <w:lvlJc w:val="left"/>
-      <w:pPr>
-        <w:ind w:left="6480" w:hanging="360"/>
-      </w:pPr>
-    </w:lvl>
-  </w:abstractNum>
-  <w:abstractNum w:abstractNumId="1" w15:restartNumberingAfterBreak="0">
-    <w:nsid w:val="5E582310"/>
-    <w:multiLevelType w:val="hybridMultilevel"/>
-    <w:tmpl w:val="CC9279F8"/>
-    <w:lvl w:ilvl="0" w:tplc="7EB6766A">
+    <w:tmpl w:val="0854D34C"/>
+    <w:lvl w:ilvl="0" w:tplc="AE3A7696">
       <w:start w:val="1"/>
       <w:numFmt w:val="bullet"/>
       <w:lvlText w:val="•"/>
@@ -46254,7 +46187,7 @@
         <w:ind w:left="720" w:hanging="280"/>
       </w:pPr>
     </w:lvl>
-    <w:lvl w:ilvl="1" w:tplc="1CEE595C" w:tentative="1">
+    <w:lvl w:ilvl="1" w:tplc="EC7E328C" w:tentative="1">
       <w:start w:val="1"/>
       <w:numFmt w:val="bullet"/>
       <w:lvlText w:val="–"/>
@@ -46263,7 +46196,7 @@
         <w:ind w:left="1080" w:hanging="280"/>
       </w:pPr>
     </w:lvl>
-    <w:lvl w:ilvl="2" w:tplc="84B6D94C" w:tentative="1">
+    <w:lvl w:ilvl="2" w:tplc="B0E862B4" w:tentative="1">
       <w:start w:val="1"/>
       <w:numFmt w:val="bullet"/>
       <w:lvlText w:val="▪"/>
@@ -46272,113 +46205,199 @@
         <w:ind w:left="1440" w:hanging="280"/>
       </w:pPr>
     </w:lvl>
-    <w:lvl w:ilvl="3" w:tplc="F98E3DAC">
+    <w:lvl w:ilvl="3" w:tplc="27FA2920">
       <w:numFmt w:val="decimal"/>
       <w:lvlText w:val=""/>
       <w:lvlJc w:val="left"/>
     </w:lvl>
-    <w:lvl w:ilvl="4" w:tplc="6200153A">
+    <w:lvl w:ilvl="4" w:tplc="017C461C">
       <w:numFmt w:val="decimal"/>
       <w:lvlText w:val=""/>
       <w:lvlJc w:val="left"/>
     </w:lvl>
-    <w:lvl w:ilvl="5" w:tplc="9670F47C">
+    <w:lvl w:ilvl="5" w:tplc="1BB0B08C">
       <w:numFmt w:val="decimal"/>
       <w:lvlText w:val=""/>
       <w:lvlJc w:val="left"/>
     </w:lvl>
-    <w:lvl w:ilvl="6" w:tplc="CF4054DE">
+    <w:lvl w:ilvl="6" w:tplc="59CA0C1C">
       <w:numFmt w:val="decimal"/>
       <w:lvlText w:val=""/>
       <w:lvlJc w:val="left"/>
     </w:lvl>
-    <w:lvl w:ilvl="7" w:tplc="4AF85B94">
+    <w:lvl w:ilvl="7" w:tplc="E65A87C0">
       <w:numFmt w:val="decimal"/>
       <w:lvlText w:val=""/>
       <w:lvlJc w:val="left"/>
     </w:lvl>
-    <w:lvl w:ilvl="8" w:tplc="C7C08F50">
+    <w:lvl w:ilvl="8" w:tplc="64D6CC88">
+      <w:numFmt w:val="decimal"/>
+      <w:lvlText w:val=""/>
+      <w:lvlJc w:val="left"/>
+    </w:lvl>
+  </w:abstractNum>
+  <w:abstractNum w:abstractNumId="1" w15:restartNumberingAfterBreak="0">
+    <w:nsid w:val="13CF2291"/>
+    <w:multiLevelType w:val="hybridMultilevel"/>
+    <w:tmpl w:val="BD6A1710"/>
+    <w:lvl w:ilvl="0" w:tplc="0B9E05D0" w:tentative="1">
+      <w:start w:val="1"/>
+      <w:numFmt w:val="decimal"/>
+      <w:lvlText w:val="%1."/>
+      <w:lvlJc w:val="left"/>
+      <w:pPr>
+        <w:ind w:left="720" w:hanging="360"/>
+      </w:pPr>
+    </w:lvl>
+    <w:lvl w:ilvl="1" w:tplc="707CB2A2" w:tentative="1">
+      <w:start w:val="1"/>
+      <w:numFmt w:val="lowerLetter"/>
+      <w:lvlText w:val="%2."/>
+      <w:lvlJc w:val="left"/>
+      <w:pPr>
+        <w:ind w:left="1080" w:hanging="360"/>
+      </w:pPr>
+    </w:lvl>
+    <w:lvl w:ilvl="2" w:tplc="82243F40" w:tentative="1">
+      <w:start w:val="1"/>
+      <w:numFmt w:val="lowerRoman"/>
+      <w:lvlText w:val="%3."/>
+      <w:lvlJc w:val="left"/>
+      <w:pPr>
+        <w:ind w:left="1440" w:hanging="360"/>
+      </w:pPr>
+    </w:lvl>
+    <w:lvl w:ilvl="3" w:tplc="CFC0B0BA">
+      <w:numFmt w:val="decimal"/>
+      <w:lvlText w:val=""/>
+      <w:lvlJc w:val="left"/>
+    </w:lvl>
+    <w:lvl w:ilvl="4" w:tplc="857A28EC">
+      <w:numFmt w:val="decimal"/>
+      <w:lvlText w:val=""/>
+      <w:lvlJc w:val="left"/>
+    </w:lvl>
+    <w:lvl w:ilvl="5" w:tplc="456CB3B4">
+      <w:numFmt w:val="decimal"/>
+      <w:lvlText w:val=""/>
+      <w:lvlJc w:val="left"/>
+    </w:lvl>
+    <w:lvl w:ilvl="6" w:tplc="83EA2EE2">
+      <w:numFmt w:val="decimal"/>
+      <w:lvlText w:val=""/>
+      <w:lvlJc w:val="left"/>
+    </w:lvl>
+    <w:lvl w:ilvl="7" w:tplc="24E4CBC8">
+      <w:numFmt w:val="decimal"/>
+      <w:lvlText w:val=""/>
+      <w:lvlJc w:val="left"/>
+    </w:lvl>
+    <w:lvl w:ilvl="8" w:tplc="3EBAB0E0">
       <w:numFmt w:val="decimal"/>
       <w:lvlText w:val=""/>
       <w:lvlJc w:val="left"/>
     </w:lvl>
   </w:abstractNum>
   <w:abstractNum w:abstractNumId="2" w15:restartNumberingAfterBreak="0">
-    <w:nsid w:val="73D21D27"/>
+    <w:nsid w:val="270B14A9"/>
     <w:multiLevelType w:val="hybridMultilevel"/>
-    <w:tmpl w:val="4A46C36C"/>
-    <w:lvl w:ilvl="0" w:tplc="B1AC8AEE" w:tentative="1">
+    <w:tmpl w:val="16FC0818"/>
+    <w:lvl w:ilvl="0" w:tplc="E77E8332" w:tentative="1">
       <w:start w:val="1"/>
-      <w:numFmt w:val="decimal"/>
-      <w:lvlText w:val="%1."/>
+      <w:numFmt w:val="bullet"/>
+      <w:lvlText w:val="●"/>
       <w:lvlJc w:val="left"/>
       <w:pPr>
         <w:ind w:left="720" w:hanging="360"/>
       </w:pPr>
     </w:lvl>
-    <w:lvl w:ilvl="1" w:tplc="49140176" w:tentative="1">
+    <w:lvl w:ilvl="1" w:tplc="AD1A4634" w:tentative="1">
       <w:start w:val="1"/>
-      <w:numFmt w:val="lowerLetter"/>
-      <w:lvlText w:val="%2."/>
+      <w:numFmt w:val="bullet"/>
+      <w:lvlText w:val="○"/>
       <w:lvlJc w:val="left"/>
       <w:pPr>
-        <w:ind w:left="1080" w:hanging="360"/>
+        <w:ind w:left="1440" w:hanging="360"/>
       </w:pPr>
     </w:lvl>
-    <w:lvl w:ilvl="2" w:tplc="62F0227C" w:tentative="1">
+    <w:lvl w:ilvl="2" w:tplc="C62E62D4" w:tentative="1">
       <w:start w:val="1"/>
-      <w:numFmt w:val="lowerRoman"/>
-      <w:lvlText w:val="%3."/>
+      <w:numFmt w:val="bullet"/>
+      <w:lvlText w:val="■"/>
       <w:lvlJc w:val="left"/>
       <w:pPr>
-        <w:ind w:left="1440" w:hanging="360"/>
+        <w:ind w:left="2160" w:hanging="360"/>
       </w:pPr>
     </w:lvl>
-    <w:lvl w:ilvl="3" w:tplc="6734CC26">
-      <w:numFmt w:val="decimal"/>
-      <w:lvlText w:val=""/>
+    <w:lvl w:ilvl="3" w:tplc="F37A5ACA" w:tentative="1">
+      <w:start w:val="1"/>
+      <w:numFmt w:val="bullet"/>
+      <w:lvlText w:val="●"/>
       <w:lvlJc w:val="left"/>
+      <w:pPr>
+        <w:ind w:left="2880" w:hanging="360"/>
+      </w:pPr>
     </w:lvl>
-    <w:lvl w:ilvl="4" w:tplc="61A424B4">
-      <w:numFmt w:val="decimal"/>
-      <w:lvlText w:val=""/>
+    <w:lvl w:ilvl="4" w:tplc="881AEE98" w:tentative="1">
+      <w:start w:val="1"/>
+      <w:numFmt w:val="bullet"/>
+      <w:lvlText w:val="○"/>
       <w:lvlJc w:val="left"/>
+      <w:pPr>
+        <w:ind w:left="3600" w:hanging="360"/>
+      </w:pPr>
     </w:lvl>
-    <w:lvl w:ilvl="5" w:tplc="7DA839CA">
-      <w:numFmt w:val="decimal"/>
-      <w:lvlText w:val=""/>
+    <w:lvl w:ilvl="5" w:tplc="DD92C0C8" w:tentative="1">
+      <w:start w:val="1"/>
+      <w:numFmt w:val="bullet"/>
+      <w:lvlText w:val="■"/>
       <w:lvlJc w:val="left"/>
+      <w:pPr>
+        <w:ind w:left="4320" w:hanging="360"/>
+      </w:pPr>
     </w:lvl>
-    <w:lvl w:ilvl="6" w:tplc="4C2CA70C">
-      <w:numFmt w:val="decimal"/>
-      <w:lvlText w:val=""/>
+    <w:lvl w:ilvl="6" w:tplc="6D8E391C" w:tentative="1">
+      <w:start w:val="1"/>
+      <w:numFmt w:val="bullet"/>
+      <w:lvlText w:val="●"/>
       <w:lvlJc w:val="left"/>
+      <w:pPr>
+        <w:ind w:left="5040" w:hanging="360"/>
+      </w:pPr>
     </w:lvl>
-    <w:lvl w:ilvl="7" w:tplc="12443FB8">
-      <w:numFmt w:val="decimal"/>
-      <w:lvlText w:val=""/>
+    <w:lvl w:ilvl="7" w:tplc="51C8EDEE" w:tentative="1">
+      <w:start w:val="1"/>
+      <w:numFmt w:val="bullet"/>
+      <w:lvlText w:val="●"/>
       <w:lvlJc w:val="left"/>
+      <w:pPr>
+        <w:ind w:left="5760" w:hanging="360"/>
+      </w:pPr>
     </w:lvl>
-    <w:lvl w:ilvl="8" w:tplc="FE06F12C">
-      <w:numFmt w:val="decimal"/>
-      <w:lvlText w:val=""/>
+    <w:lvl w:ilvl="8" w:tplc="8776651C" w:tentative="1">
+      <w:start w:val="1"/>
+      <w:numFmt w:val="bullet"/>
+      <w:lvlText w:val="●"/>
       <w:lvlJc w:val="left"/>
+      <w:pPr>
+        <w:ind w:left="6480" w:hanging="360"/>
+      </w:pPr>
     </w:lvl>
   </w:abstractNum>
-  <w:num w:numId="1" w16cid:durableId="355277613">
+  <w:num w:numId="1" w16cid:durableId="266010720">
+    <w:abstractNumId w:val="2"/>
+    <w:lvlOverride w:ilvl="0">
+      <w:startOverride w:val="1"/>
+    </w:lvlOverride>
+  </w:num>
+  <w:num w:numId="2" w16cid:durableId="1020666790">
     <w:abstractNumId w:val="0"/>
     <w:lvlOverride w:ilvl="0">
       <w:startOverride w:val="1"/>
     </w:lvlOverride>
   </w:num>
-  <w:num w:numId="2" w16cid:durableId="1963078074">
-    <w:abstractNumId w:val="1"/>
-    <w:lvlOverride w:ilvl="0">
-      <w:startOverride w:val="1"/>
-    </w:lvlOverride>
-  </w:num>
-  <w:num w:numId="3" w16cid:durableId="1678999342">
-    <w:abstractNumId w:val="1"/>
+  <w:num w:numId="3" w16cid:durableId="528418721">
+    <w:abstractNumId w:val="0"/>
     <w:lvlOverride w:ilvl="0">
       <w:startOverride w:val="1"/>
     </w:lvlOverride>
@@ -47082,7 +47101,7 @@
     <w:autoRedefine/>
     <w:uiPriority w:val="39"/>
     <w:unhideWhenUsed/>
-    <w:rsid w:val="00E527B3"/>
+    <w:rsid w:val="00FD05BD"/>
     <w:pPr>
       <w:spacing w:after="100"/>
     </w:pPr>
@@ -47094,7 +47113,7 @@
     <w:autoRedefine/>
     <w:uiPriority w:val="39"/>
     <w:unhideWhenUsed/>
-    <w:rsid w:val="00E527B3"/>
+    <w:rsid w:val="00FD05BD"/>
     <w:pPr>
       <w:spacing w:after="100"/>
       <w:ind w:left="210"/>
@@ -47106,7 +47125,7 @@
     <w:next w:val="Normal"/>
     <w:uiPriority w:val="99"/>
     <w:unhideWhenUsed/>
-    <w:rsid w:val="00E527B3"/>
+    <w:rsid w:val="00FD05BD"/>
   </w:style>
 </w:styles>
 </file>

</xml_diff>

<commit_message>
Other paths expanded to 102 routes (Praveen: "more private degrees and professional bodies", "put all")
- All 31 Ministry-recognised private institutes (Section 25A register, 23 Oct 2026), each with its
  programmes exactly as the register lists them; 11 foreign degrees taught in Sri Lanka, always labelled
  "foreign degree, not on the Ministry list"; KDU fee-paying; ACCA, ACCA FIA, SLIM PGDip and PCM, IBSL DBF
  and CBF, CIMA Cert BA. Every field spot-checked on its official page; unchecked fields stay null.
- Route page: collapsible "Programmes (n)"; unpublished entry rules say so (en/si/ta), never a guess.
  Group subtitles updated. Ask's corpus includes the programme titles.
- Left out with reasons (ROUTES_REPORT): AOD, ANC, ESOFT foreign degrees (upload form; Praveen to decide), CIPM.
- TC-144 (6 tests); 560 passed. ZP-DOC-05/07/08, README (My list row corrected), ROUTES_REPORT updated.

Co-Authored-By: Claude Opus 5.5 (1M context) <noreply@anthropic.com>
</commit_message>
<xml_diff>
--- a/docs/05-data-design/ZP-DOC-05_Data-Design.docx
+++ b/docs/05-data-design/ZP-DOC-05_Data-Design.docx
@@ -2600,6 +2600,122 @@
                 <w:sz w:val="19"/>
                 <w:szCs w:val="19"/>
               </w:rPr>
+              <w:t>Route catalogue 23 Oct: 102 routes; optional `programmes`; `entry_requirements_text` and `source_url` may be null (rules below); no D1 change</w:t>
+            </w:r>
+          </w:p>
+        </w:tc>
+      </w:tr>
+      <w:tr>
+        <w:tblPrEx>
+          <w:tblCellMar>
+            <w:top w:w="0" w:type="dxa"/>
+            <w:bottom w:w="0" w:type="dxa"/>
+          </w:tblCellMar>
+        </w:tblPrEx>
+        <w:trPr>
+          <w:cantSplit/>
+          <w:trHeight w:val="420"/>
+        </w:trPr>
+        <w:tc>
+          <w:tcPr>
+            <w:tcW w:w="964" w:type="dxa"/>
+            <w:tcBorders>
+              <w:top w:val="single" w:sz="4" w:space="0" w:color="C9D3D0"/>
+              <w:left w:val="single" w:sz="4" w:space="0" w:color="C9D3D0"/>
+              <w:bottom w:val="single" w:sz="4" w:space="0" w:color="C9D3D0"/>
+              <w:right w:val="single" w:sz="4" w:space="0" w:color="C9D3D0"/>
+            </w:tcBorders>
+            <w:tcMar>
+              <w:top w:w="50" w:type="dxa"/>
+              <w:left w:w="100" w:type="dxa"/>
+              <w:bottom w:w="50" w:type="dxa"/>
+              <w:right w:w="100" w:type="dxa"/>
+            </w:tcMar>
+          </w:tcPr>
+          <w:p>
+            <w:r>
+              <w:rPr>
+                <w:sz w:val="19"/>
+                <w:szCs w:val="19"/>
+              </w:rPr>
+              <w:t>0.9</w:t>
+            </w:r>
+          </w:p>
+        </w:tc>
+        <w:tc>
+          <w:tcPr>
+            <w:tcW w:w="1542" w:type="dxa"/>
+            <w:tcBorders>
+              <w:top w:val="single" w:sz="4" w:space="0" w:color="C9D3D0"/>
+              <w:left w:val="single" w:sz="4" w:space="0" w:color="C9D3D0"/>
+              <w:bottom w:val="single" w:sz="4" w:space="0" w:color="C9D3D0"/>
+              <w:right w:val="single" w:sz="4" w:space="0" w:color="C9D3D0"/>
+            </w:tcBorders>
+            <w:tcMar>
+              <w:top w:w="50" w:type="dxa"/>
+              <w:left w:w="100" w:type="dxa"/>
+              <w:bottom w:w="50" w:type="dxa"/>
+              <w:right w:w="100" w:type="dxa"/>
+            </w:tcMar>
+          </w:tcPr>
+          <w:p>
+            <w:r>
+              <w:rPr>
+                <w:sz w:val="19"/>
+                <w:szCs w:val="19"/>
+              </w:rPr>
+              <w:t>23 Oct 2026</w:t>
+            </w:r>
+          </w:p>
+        </w:tc>
+        <w:tc>
+          <w:tcPr>
+            <w:tcW w:w="1928" w:type="dxa"/>
+            <w:tcBorders>
+              <w:top w:val="single" w:sz="4" w:space="0" w:color="C9D3D0"/>
+              <w:left w:val="single" w:sz="4" w:space="0" w:color="C9D3D0"/>
+              <w:bottom w:val="single" w:sz="4" w:space="0" w:color="C9D3D0"/>
+              <w:right w:val="single" w:sz="4" w:space="0" w:color="C9D3D0"/>
+            </w:tcBorders>
+            <w:tcMar>
+              <w:top w:w="50" w:type="dxa"/>
+              <w:left w:w="100" w:type="dxa"/>
+              <w:bottom w:w="50" w:type="dxa"/>
+              <w:right w:w="100" w:type="dxa"/>
+            </w:tcMar>
+          </w:tcPr>
+          <w:p>
+            <w:r>
+              <w:rPr>
+                <w:sz w:val="19"/>
+                <w:szCs w:val="19"/>
+              </w:rPr>
+              <w:t>Team Kestrel</w:t>
+            </w:r>
+          </w:p>
+        </w:tc>
+        <w:tc>
+          <w:tcPr>
+            <w:tcW w:w="5204" w:type="dxa"/>
+            <w:tcBorders>
+              <w:top w:val="single" w:sz="4" w:space="0" w:color="C9D3D0"/>
+              <w:left w:val="single" w:sz="4" w:space="0" w:color="C9D3D0"/>
+              <w:bottom w:val="single" w:sz="4" w:space="0" w:color="C9D3D0"/>
+              <w:right w:val="single" w:sz="4" w:space="0" w:color="C9D3D0"/>
+            </w:tcBorders>
+            <w:tcMar>
+              <w:top w:w="50" w:type="dxa"/>
+              <w:left w:w="100" w:type="dxa"/>
+              <w:bottom w:w="50" w:type="dxa"/>
+              <w:right w:w="100" w:type="dxa"/>
+            </w:tcMar>
+          </w:tcPr>
+          <w:p>
+            <w:r>
+              <w:rPr>
+                <w:sz w:val="19"/>
+                <w:szCs w:val="19"/>
+              </w:rPr>
               <w:t>CR-012: the UGC application co-pilot's answers (address, parents' names, school, ticks) are phone-only (local key zedpath.apply.v1), cleared with the student's data; no new tables</w:t>
             </w:r>
           </w:p>
@@ -3004,7 +3120,7 @@
     <w:sdt>
       <w:sdtPr>
         <w:alias w:val="Contents"/>
-        <w:id w:val="-1676876437"/>
+        <w:id w:val="-749267567"/>
       </w:sdtPr>
       <w:sdtEndPr/>
       <w:sdtContent>
@@ -3033,7 +3149,7 @@
           <w:r>
             <w:fldChar w:fldCharType="separate"/>
           </w:r>
-          <w:hyperlink w:anchor="_Toc243654214" w:history="1">
+          <w:hyperlink w:anchor="_Toc243660076" w:history="1">
             <w:r>
               <w:rPr>
                 <w:rStyle w:val="Hyperlink"/>
@@ -3057,7 +3173,7 @@
               <w:rPr>
                 <w:noProof/>
               </w:rPr>
-              <w:instrText xml:space="preserve"> PAGEREF _Toc243654214 \h </w:instrText>
+              <w:instrText xml:space="preserve"> PAGEREF _Toc243660076 \h </w:instrText>
             </w:r>
             <w:r>
               <w:rPr>
@@ -3100,7 +3216,7 @@
               <w14:ligatures w14:val="standardContextual"/>
             </w:rPr>
           </w:pPr>
-          <w:hyperlink w:anchor="_Toc243654215" w:history="1">
+          <w:hyperlink w:anchor="_Toc243660077" w:history="1">
             <w:r>
               <w:rPr>
                 <w:rStyle w:val="Hyperlink"/>
@@ -3124,7 +3240,7 @@
               <w:rPr>
                 <w:noProof/>
               </w:rPr>
-              <w:instrText xml:space="preserve"> PAGEREF _Toc243654215 \h </w:instrText>
+              <w:instrText xml:space="preserve"> PAGEREF _Toc243660077 \h </w:instrText>
             </w:r>
             <w:r>
               <w:rPr>
@@ -3167,7 +3283,7 @@
               <w14:ligatures w14:val="standardContextual"/>
             </w:rPr>
           </w:pPr>
-          <w:hyperlink w:anchor="_Toc243654216" w:history="1">
+          <w:hyperlink w:anchor="_Toc243660078" w:history="1">
             <w:r>
               <w:rPr>
                 <w:rStyle w:val="Hyperlink"/>
@@ -3191,7 +3307,7 @@
               <w:rPr>
                 <w:noProof/>
               </w:rPr>
-              <w:instrText xml:space="preserve"> PAGEREF _Toc243654216 \h </w:instrText>
+              <w:instrText xml:space="preserve"> PAGEREF _Toc243660078 \h </w:instrText>
             </w:r>
             <w:r>
               <w:rPr>
@@ -3234,7 +3350,7 @@
               <w14:ligatures w14:val="standardContextual"/>
             </w:rPr>
           </w:pPr>
-          <w:hyperlink w:anchor="_Toc243654217" w:history="1">
+          <w:hyperlink w:anchor="_Toc243660079" w:history="1">
             <w:r>
               <w:rPr>
                 <w:rStyle w:val="Hyperlink"/>
@@ -3258,7 +3374,7 @@
               <w:rPr>
                 <w:noProof/>
               </w:rPr>
-              <w:instrText xml:space="preserve"> PAGEREF _Toc243654217 \h </w:instrText>
+              <w:instrText xml:space="preserve"> PAGEREF _Toc243660079 \h </w:instrText>
             </w:r>
             <w:r>
               <w:rPr>
@@ -3301,7 +3417,7 @@
               <w14:ligatures w14:val="standardContextual"/>
             </w:rPr>
           </w:pPr>
-          <w:hyperlink w:anchor="_Toc243654218" w:history="1">
+          <w:hyperlink w:anchor="_Toc243660080" w:history="1">
             <w:r>
               <w:rPr>
                 <w:rStyle w:val="Hyperlink"/>
@@ -3325,7 +3441,7 @@
               <w:rPr>
                 <w:noProof/>
               </w:rPr>
-              <w:instrText xml:space="preserve"> PAGEREF _Toc243654218 \h </w:instrText>
+              <w:instrText xml:space="preserve"> PAGEREF _Toc243660080 \h </w:instrText>
             </w:r>
             <w:r>
               <w:rPr>
@@ -3368,7 +3484,7 @@
               <w14:ligatures w14:val="standardContextual"/>
             </w:rPr>
           </w:pPr>
-          <w:hyperlink w:anchor="_Toc243654219" w:history="1">
+          <w:hyperlink w:anchor="_Toc243660081" w:history="1">
             <w:r>
               <w:rPr>
                 <w:rStyle w:val="Hyperlink"/>
@@ -3392,7 +3508,7 @@
               <w:rPr>
                 <w:noProof/>
               </w:rPr>
-              <w:instrText xml:space="preserve"> PAGEREF _Toc243654219 \h </w:instrText>
+              <w:instrText xml:space="preserve"> PAGEREF _Toc243660081 \h </w:instrText>
             </w:r>
             <w:r>
               <w:rPr>
@@ -3435,7 +3551,7 @@
               <w14:ligatures w14:val="standardContextual"/>
             </w:rPr>
           </w:pPr>
-          <w:hyperlink w:anchor="_Toc243654220" w:history="1">
+          <w:hyperlink w:anchor="_Toc243660082" w:history="1">
             <w:r>
               <w:rPr>
                 <w:rStyle w:val="Hyperlink"/>
@@ -3459,7 +3575,7 @@
               <w:rPr>
                 <w:noProof/>
               </w:rPr>
-              <w:instrText xml:space="preserve"> PAGEREF _Toc243654220 \h </w:instrText>
+              <w:instrText xml:space="preserve"> PAGEREF _Toc243660082 \h </w:instrText>
             </w:r>
             <w:r>
               <w:rPr>
@@ -3502,7 +3618,7 @@
               <w14:ligatures w14:val="standardContextual"/>
             </w:rPr>
           </w:pPr>
-          <w:hyperlink w:anchor="_Toc243654221" w:history="1">
+          <w:hyperlink w:anchor="_Toc243660083" w:history="1">
             <w:r>
               <w:rPr>
                 <w:rStyle w:val="Hyperlink"/>
@@ -3526,7 +3642,7 @@
               <w:rPr>
                 <w:noProof/>
               </w:rPr>
-              <w:instrText xml:space="preserve"> PAGEREF _Toc243654221 \h </w:instrText>
+              <w:instrText xml:space="preserve"> PAGEREF _Toc243660083 \h </w:instrText>
             </w:r>
             <w:r>
               <w:rPr>
@@ -3569,7 +3685,7 @@
               <w14:ligatures w14:val="standardContextual"/>
             </w:rPr>
           </w:pPr>
-          <w:hyperlink w:anchor="_Toc243654222" w:history="1">
+          <w:hyperlink w:anchor="_Toc243660084" w:history="1">
             <w:r>
               <w:rPr>
                 <w:rStyle w:val="Hyperlink"/>
@@ -3593,7 +3709,7 @@
               <w:rPr>
                 <w:noProof/>
               </w:rPr>
-              <w:instrText xml:space="preserve"> PAGEREF _Toc243654222 \h </w:instrText>
+              <w:instrText xml:space="preserve"> PAGEREF _Toc243660084 \h </w:instrText>
             </w:r>
             <w:r>
               <w:rPr>
@@ -3636,7 +3752,7 @@
               <w14:ligatures w14:val="standardContextual"/>
             </w:rPr>
           </w:pPr>
-          <w:hyperlink w:anchor="_Toc243654223" w:history="1">
+          <w:hyperlink w:anchor="_Toc243660085" w:history="1">
             <w:r>
               <w:rPr>
                 <w:rStyle w:val="Hyperlink"/>
@@ -3660,7 +3776,7 @@
               <w:rPr>
                 <w:noProof/>
               </w:rPr>
-              <w:instrText xml:space="preserve"> PAGEREF _Toc243654223 \h </w:instrText>
+              <w:instrText xml:space="preserve"> PAGEREF _Toc243660085 \h </w:instrText>
             </w:r>
             <w:r>
               <w:rPr>
@@ -3703,7 +3819,7 @@
               <w14:ligatures w14:val="standardContextual"/>
             </w:rPr>
           </w:pPr>
-          <w:hyperlink w:anchor="_Toc243654224" w:history="1">
+          <w:hyperlink w:anchor="_Toc243660086" w:history="1">
             <w:r>
               <w:rPr>
                 <w:rStyle w:val="Hyperlink"/>
@@ -3727,7 +3843,7 @@
               <w:rPr>
                 <w:noProof/>
               </w:rPr>
-              <w:instrText xml:space="preserve"> PAGEREF _Toc243654224 \h </w:instrText>
+              <w:instrText xml:space="preserve"> PAGEREF _Toc243660086 \h </w:instrText>
             </w:r>
             <w:r>
               <w:rPr>
@@ -3770,7 +3886,7 @@
               <w14:ligatures w14:val="standardContextual"/>
             </w:rPr>
           </w:pPr>
-          <w:hyperlink w:anchor="_Toc243654225" w:history="1">
+          <w:hyperlink w:anchor="_Toc243660087" w:history="1">
             <w:r>
               <w:rPr>
                 <w:rStyle w:val="Hyperlink"/>
@@ -3794,7 +3910,7 @@
               <w:rPr>
                 <w:noProof/>
               </w:rPr>
-              <w:instrText xml:space="preserve"> PAGEREF _Toc243654225 \h </w:instrText>
+              <w:instrText xml:space="preserve"> PAGEREF _Toc243660087 \h </w:instrText>
             </w:r>
             <w:r>
               <w:rPr>
@@ -3837,7 +3953,7 @@
               <w14:ligatures w14:val="standardContextual"/>
             </w:rPr>
           </w:pPr>
-          <w:hyperlink w:anchor="_Toc243654226" w:history="1">
+          <w:hyperlink w:anchor="_Toc243660088" w:history="1">
             <w:r>
               <w:rPr>
                 <w:rStyle w:val="Hyperlink"/>
@@ -3861,7 +3977,7 @@
               <w:rPr>
                 <w:noProof/>
               </w:rPr>
-              <w:instrText xml:space="preserve"> PAGEREF _Toc243654226 \h </w:instrText>
+              <w:instrText xml:space="preserve"> PAGEREF _Toc243660088 \h </w:instrText>
             </w:r>
             <w:r>
               <w:rPr>
@@ -3904,7 +4020,7 @@
               <w14:ligatures w14:val="standardContextual"/>
             </w:rPr>
           </w:pPr>
-          <w:hyperlink w:anchor="_Toc243654227" w:history="1">
+          <w:hyperlink w:anchor="_Toc243660089" w:history="1">
             <w:r>
               <w:rPr>
                 <w:rStyle w:val="Hyperlink"/>
@@ -3928,7 +4044,7 @@
               <w:rPr>
                 <w:noProof/>
               </w:rPr>
-              <w:instrText xml:space="preserve"> PAGEREF _Toc243654227 \h </w:instrText>
+              <w:instrText xml:space="preserve"> PAGEREF _Toc243660089 \h </w:instrText>
             </w:r>
             <w:r>
               <w:rPr>
@@ -3971,7 +4087,7 @@
               <w14:ligatures w14:val="standardContextual"/>
             </w:rPr>
           </w:pPr>
-          <w:hyperlink w:anchor="_Toc243654228" w:history="1">
+          <w:hyperlink w:anchor="_Toc243660090" w:history="1">
             <w:r>
               <w:rPr>
                 <w:rStyle w:val="Hyperlink"/>
@@ -3995,7 +4111,7 @@
               <w:rPr>
                 <w:noProof/>
               </w:rPr>
-              <w:instrText xml:space="preserve"> PAGEREF _Toc243654228 \h </w:instrText>
+              <w:instrText xml:space="preserve"> PAGEREF _Toc243660090 \h </w:instrText>
             </w:r>
             <w:r>
               <w:rPr>
@@ -4038,7 +4154,7 @@
               <w14:ligatures w14:val="standardContextual"/>
             </w:rPr>
           </w:pPr>
-          <w:hyperlink w:anchor="_Toc243654229" w:history="1">
+          <w:hyperlink w:anchor="_Toc243660091" w:history="1">
             <w:r>
               <w:rPr>
                 <w:rStyle w:val="Hyperlink"/>
@@ -4062,7 +4178,7 @@
               <w:rPr>
                 <w:noProof/>
               </w:rPr>
-              <w:instrText xml:space="preserve"> PAGEREF _Toc243654229 \h </w:instrText>
+              <w:instrText xml:space="preserve"> PAGEREF _Toc243660091 \h </w:instrText>
             </w:r>
             <w:r>
               <w:rPr>
@@ -4105,7 +4221,7 @@
               <w14:ligatures w14:val="standardContextual"/>
             </w:rPr>
           </w:pPr>
-          <w:hyperlink w:anchor="_Toc243654230" w:history="1">
+          <w:hyperlink w:anchor="_Toc243660092" w:history="1">
             <w:r>
               <w:rPr>
                 <w:rStyle w:val="Hyperlink"/>
@@ -4129,7 +4245,7 @@
               <w:rPr>
                 <w:noProof/>
               </w:rPr>
-              <w:instrText xml:space="preserve"> PAGEREF _Toc243654230 \h </w:instrText>
+              <w:instrText xml:space="preserve"> PAGEREF _Toc243660092 \h </w:instrText>
             </w:r>
             <w:r>
               <w:rPr>
@@ -4172,7 +4288,7 @@
               <w14:ligatures w14:val="standardContextual"/>
             </w:rPr>
           </w:pPr>
-          <w:hyperlink w:anchor="_Toc243654231" w:history="1">
+          <w:hyperlink w:anchor="_Toc243660093" w:history="1">
             <w:r>
               <w:rPr>
                 <w:rStyle w:val="Hyperlink"/>
@@ -4196,7 +4312,7 @@
               <w:rPr>
                 <w:noProof/>
               </w:rPr>
-              <w:instrText xml:space="preserve"> PAGEREF _Toc243654231 \h </w:instrText>
+              <w:instrText xml:space="preserve"> PAGEREF _Toc243660093 \h </w:instrText>
             </w:r>
             <w:r>
               <w:rPr>
@@ -4239,7 +4355,7 @@
               <w14:ligatures w14:val="standardContextual"/>
             </w:rPr>
           </w:pPr>
-          <w:hyperlink w:anchor="_Toc243654232" w:history="1">
+          <w:hyperlink w:anchor="_Toc243660094" w:history="1">
             <w:r>
               <w:rPr>
                 <w:rStyle w:val="Hyperlink"/>
@@ -4263,7 +4379,7 @@
               <w:rPr>
                 <w:noProof/>
               </w:rPr>
-              <w:instrText xml:space="preserve"> PAGEREF _Toc243654232 \h </w:instrText>
+              <w:instrText xml:space="preserve"> PAGEREF _Toc243660094 \h </w:instrText>
             </w:r>
             <w:r>
               <w:rPr>
@@ -4306,7 +4422,7 @@
               <w14:ligatures w14:val="standardContextual"/>
             </w:rPr>
           </w:pPr>
-          <w:hyperlink w:anchor="_Toc243654233" w:history="1">
+          <w:hyperlink w:anchor="_Toc243660095" w:history="1">
             <w:r>
               <w:rPr>
                 <w:rStyle w:val="Hyperlink"/>
@@ -4330,7 +4446,7 @@
               <w:rPr>
                 <w:noProof/>
               </w:rPr>
-              <w:instrText xml:space="preserve"> PAGEREF _Toc243654233 \h </w:instrText>
+              <w:instrText xml:space="preserve"> PAGEREF _Toc243660095 \h </w:instrText>
             </w:r>
             <w:r>
               <w:rPr>
@@ -4373,7 +4489,7 @@
               <w14:ligatures w14:val="standardContextual"/>
             </w:rPr>
           </w:pPr>
-          <w:hyperlink w:anchor="_Toc243654234" w:history="1">
+          <w:hyperlink w:anchor="_Toc243660096" w:history="1">
             <w:r>
               <w:rPr>
                 <w:rStyle w:val="Hyperlink"/>
@@ -4397,7 +4513,7 @@
               <w:rPr>
                 <w:noProof/>
               </w:rPr>
-              <w:instrText xml:space="preserve"> PAGEREF _Toc243654234 \h </w:instrText>
+              <w:instrText xml:space="preserve"> PAGEREF _Toc243660096 \h </w:instrText>
             </w:r>
             <w:r>
               <w:rPr>
@@ -4440,7 +4556,7 @@
               <w14:ligatures w14:val="standardContextual"/>
             </w:rPr>
           </w:pPr>
-          <w:hyperlink w:anchor="_Toc243654235" w:history="1">
+          <w:hyperlink w:anchor="_Toc243660097" w:history="1">
             <w:r>
               <w:rPr>
                 <w:rStyle w:val="Hyperlink"/>
@@ -4464,7 +4580,7 @@
               <w:rPr>
                 <w:noProof/>
               </w:rPr>
-              <w:instrText xml:space="preserve"> PAGEREF _Toc243654235 \h </w:instrText>
+              <w:instrText xml:space="preserve"> PAGEREF _Toc243660097 \h </w:instrText>
             </w:r>
             <w:r>
               <w:rPr>
@@ -4507,7 +4623,7 @@
               <w14:ligatures w14:val="standardContextual"/>
             </w:rPr>
           </w:pPr>
-          <w:hyperlink w:anchor="_Toc243654236" w:history="1">
+          <w:hyperlink w:anchor="_Toc243660098" w:history="1">
             <w:r>
               <w:rPr>
                 <w:rStyle w:val="Hyperlink"/>
@@ -4531,7 +4647,7 @@
               <w:rPr>
                 <w:noProof/>
               </w:rPr>
-              <w:instrText xml:space="preserve"> PAGEREF _Toc243654236 \h </w:instrText>
+              <w:instrText xml:space="preserve"> PAGEREF _Toc243660098 \h </w:instrText>
             </w:r>
             <w:r>
               <w:rPr>
@@ -4574,7 +4690,7 @@
               <w14:ligatures w14:val="standardContextual"/>
             </w:rPr>
           </w:pPr>
-          <w:hyperlink w:anchor="_Toc243654237" w:history="1">
+          <w:hyperlink w:anchor="_Toc243660099" w:history="1">
             <w:r>
               <w:rPr>
                 <w:rStyle w:val="Hyperlink"/>
@@ -4598,7 +4714,7 @@
               <w:rPr>
                 <w:noProof/>
               </w:rPr>
-              <w:instrText xml:space="preserve"> PAGEREF _Toc243654237 \h </w:instrText>
+              <w:instrText xml:space="preserve"> PAGEREF _Toc243660099 \h </w:instrText>
             </w:r>
             <w:r>
               <w:rPr>
@@ -4641,7 +4757,7 @@
               <w14:ligatures w14:val="standardContextual"/>
             </w:rPr>
           </w:pPr>
-          <w:hyperlink w:anchor="_Toc243654238" w:history="1">
+          <w:hyperlink w:anchor="_Toc243660100" w:history="1">
             <w:r>
               <w:rPr>
                 <w:rStyle w:val="Hyperlink"/>
@@ -4665,7 +4781,7 @@
               <w:rPr>
                 <w:noProof/>
               </w:rPr>
-              <w:instrText xml:space="preserve"> PAGEREF _Toc243654238 \h </w:instrText>
+              <w:instrText xml:space="preserve"> PAGEREF _Toc243660100 \h </w:instrText>
             </w:r>
             <w:r>
               <w:rPr>
@@ -4708,7 +4824,7 @@
               <w14:ligatures w14:val="standardContextual"/>
             </w:rPr>
           </w:pPr>
-          <w:hyperlink w:anchor="_Toc243654239" w:history="1">
+          <w:hyperlink w:anchor="_Toc243660101" w:history="1">
             <w:r>
               <w:rPr>
                 <w:rStyle w:val="Hyperlink"/>
@@ -4732,7 +4848,7 @@
               <w:rPr>
                 <w:noProof/>
               </w:rPr>
-              <w:instrText xml:space="preserve"> PAGEREF _Toc243654239 \h </w:instrText>
+              <w:instrText xml:space="preserve"> PAGEREF _Toc243660101 \h </w:instrText>
             </w:r>
             <w:r>
               <w:rPr>
@@ -4775,7 +4891,7 @@
               <w14:ligatures w14:val="standardContextual"/>
             </w:rPr>
           </w:pPr>
-          <w:hyperlink w:anchor="_Toc243654240" w:history="1">
+          <w:hyperlink w:anchor="_Toc243660102" w:history="1">
             <w:r>
               <w:rPr>
                 <w:rStyle w:val="Hyperlink"/>
@@ -4799,7 +4915,7 @@
               <w:rPr>
                 <w:noProof/>
               </w:rPr>
-              <w:instrText xml:space="preserve"> PAGEREF _Toc243654240 \h </w:instrText>
+              <w:instrText xml:space="preserve"> PAGEREF _Toc243660102 \h </w:instrText>
             </w:r>
             <w:r>
               <w:rPr>
@@ -4842,7 +4958,7 @@
               <w14:ligatures w14:val="standardContextual"/>
             </w:rPr>
           </w:pPr>
-          <w:hyperlink w:anchor="_Toc243654241" w:history="1">
+          <w:hyperlink w:anchor="_Toc243660103" w:history="1">
             <w:r>
               <w:rPr>
                 <w:rStyle w:val="Hyperlink"/>
@@ -4866,7 +4982,7 @@
               <w:rPr>
                 <w:noProof/>
               </w:rPr>
-              <w:instrText xml:space="preserve"> PAGEREF _Toc243654241 \h </w:instrText>
+              <w:instrText xml:space="preserve"> PAGEREF _Toc243660103 \h </w:instrText>
             </w:r>
             <w:r>
               <w:rPr>
@@ -4909,7 +5025,7 @@
               <w14:ligatures w14:val="standardContextual"/>
             </w:rPr>
           </w:pPr>
-          <w:hyperlink w:anchor="_Toc243654242" w:history="1">
+          <w:hyperlink w:anchor="_Toc243660104" w:history="1">
             <w:r>
               <w:rPr>
                 <w:rStyle w:val="Hyperlink"/>
@@ -4933,7 +5049,7 @@
               <w:rPr>
                 <w:noProof/>
               </w:rPr>
-              <w:instrText xml:space="preserve"> PAGEREF _Toc243654242 \h </w:instrText>
+              <w:instrText xml:space="preserve"> PAGEREF _Toc243660104 \h </w:instrText>
             </w:r>
             <w:r>
               <w:rPr>
@@ -4976,7 +5092,7 @@
               <w14:ligatures w14:val="standardContextual"/>
             </w:rPr>
           </w:pPr>
-          <w:hyperlink w:anchor="_Toc243654243" w:history="1">
+          <w:hyperlink w:anchor="_Toc243660105" w:history="1">
             <w:r>
               <w:rPr>
                 <w:rStyle w:val="Hyperlink"/>
@@ -5000,7 +5116,7 @@
               <w:rPr>
                 <w:noProof/>
               </w:rPr>
-              <w:instrText xml:space="preserve"> PAGEREF _Toc243654243 \h </w:instrText>
+              <w:instrText xml:space="preserve"> PAGEREF _Toc243660105 \h </w:instrText>
             </w:r>
             <w:r>
               <w:rPr>
@@ -5043,7 +5159,7 @@
               <w14:ligatures w14:val="standardContextual"/>
             </w:rPr>
           </w:pPr>
-          <w:hyperlink w:anchor="_Toc243654244" w:history="1">
+          <w:hyperlink w:anchor="_Toc243660106" w:history="1">
             <w:r>
               <w:rPr>
                 <w:rStyle w:val="Hyperlink"/>
@@ -5067,7 +5183,7 @@
               <w:rPr>
                 <w:noProof/>
               </w:rPr>
-              <w:instrText xml:space="preserve"> PAGEREF _Toc243654244 \h </w:instrText>
+              <w:instrText xml:space="preserve"> PAGEREF _Toc243660106 \h </w:instrText>
             </w:r>
             <w:r>
               <w:rPr>
@@ -5110,7 +5226,7 @@
               <w14:ligatures w14:val="standardContextual"/>
             </w:rPr>
           </w:pPr>
-          <w:hyperlink w:anchor="_Toc243654245" w:history="1">
+          <w:hyperlink w:anchor="_Toc243660107" w:history="1">
             <w:r>
               <w:rPr>
                 <w:rStyle w:val="Hyperlink"/>
@@ -5134,7 +5250,7 @@
               <w:rPr>
                 <w:noProof/>
               </w:rPr>
-              <w:instrText xml:space="preserve"> PAGEREF _Toc243654245 \h </w:instrText>
+              <w:instrText xml:space="preserve"> PAGEREF _Toc243660107 \h </w:instrText>
             </w:r>
             <w:r>
               <w:rPr>
@@ -5177,7 +5293,7 @@
               <w14:ligatures w14:val="standardContextual"/>
             </w:rPr>
           </w:pPr>
-          <w:hyperlink w:anchor="_Toc243654246" w:history="1">
+          <w:hyperlink w:anchor="_Toc243660108" w:history="1">
             <w:r>
               <w:rPr>
                 <w:rStyle w:val="Hyperlink"/>
@@ -5201,7 +5317,7 @@
               <w:rPr>
                 <w:noProof/>
               </w:rPr>
-              <w:instrText xml:space="preserve"> PAGEREF _Toc243654246 \h </w:instrText>
+              <w:instrText xml:space="preserve"> PAGEREF _Toc243660108 \h </w:instrText>
             </w:r>
             <w:r>
               <w:rPr>
@@ -5244,7 +5360,7 @@
               <w14:ligatures w14:val="standardContextual"/>
             </w:rPr>
           </w:pPr>
-          <w:hyperlink w:anchor="_Toc243654247" w:history="1">
+          <w:hyperlink w:anchor="_Toc243660109" w:history="1">
             <w:r>
               <w:rPr>
                 <w:rStyle w:val="Hyperlink"/>
@@ -5268,7 +5384,7 @@
               <w:rPr>
                 <w:noProof/>
               </w:rPr>
-              <w:instrText xml:space="preserve"> PAGEREF _Toc243654247 \h </w:instrText>
+              <w:instrText xml:space="preserve"> PAGEREF _Toc243660109 \h </w:instrText>
             </w:r>
             <w:r>
               <w:rPr>
@@ -5311,7 +5427,7 @@
               <w14:ligatures w14:val="standardContextual"/>
             </w:rPr>
           </w:pPr>
-          <w:hyperlink w:anchor="_Toc243654248" w:history="1">
+          <w:hyperlink w:anchor="_Toc243660110" w:history="1">
             <w:r>
               <w:rPr>
                 <w:rStyle w:val="Hyperlink"/>
@@ -5335,7 +5451,7 @@
               <w:rPr>
                 <w:noProof/>
               </w:rPr>
-              <w:instrText xml:space="preserve"> PAGEREF _Toc243654248 \h </w:instrText>
+              <w:instrText xml:space="preserve"> PAGEREF _Toc243660110 \h </w:instrText>
             </w:r>
             <w:r>
               <w:rPr>
@@ -5378,7 +5494,7 @@
               <w14:ligatures w14:val="standardContextual"/>
             </w:rPr>
           </w:pPr>
-          <w:hyperlink w:anchor="_Toc243654249" w:history="1">
+          <w:hyperlink w:anchor="_Toc243660111" w:history="1">
             <w:r>
               <w:rPr>
                 <w:rStyle w:val="Hyperlink"/>
@@ -5402,7 +5518,7 @@
               <w:rPr>
                 <w:noProof/>
               </w:rPr>
-              <w:instrText xml:space="preserve"> PAGEREF _Toc243654249 \h </w:instrText>
+              <w:instrText xml:space="preserve"> PAGEREF _Toc243660111 \h </w:instrText>
             </w:r>
             <w:r>
               <w:rPr>
@@ -5445,7 +5561,7 @@
               <w14:ligatures w14:val="standardContextual"/>
             </w:rPr>
           </w:pPr>
-          <w:hyperlink w:anchor="_Toc243654250" w:history="1">
+          <w:hyperlink w:anchor="_Toc243660112" w:history="1">
             <w:r>
               <w:rPr>
                 <w:rStyle w:val="Hyperlink"/>
@@ -5469,7 +5585,7 @@
               <w:rPr>
                 <w:noProof/>
               </w:rPr>
-              <w:instrText xml:space="preserve"> PAGEREF _Toc243654250 \h </w:instrText>
+              <w:instrText xml:space="preserve"> PAGEREF _Toc243660112 \h </w:instrText>
             </w:r>
             <w:r>
               <w:rPr>
@@ -5512,7 +5628,7 @@
               <w14:ligatures w14:val="standardContextual"/>
             </w:rPr>
           </w:pPr>
-          <w:hyperlink w:anchor="_Toc243654251" w:history="1">
+          <w:hyperlink w:anchor="_Toc243660113" w:history="1">
             <w:r>
               <w:rPr>
                 <w:rStyle w:val="Hyperlink"/>
@@ -5536,7 +5652,7 @@
               <w:rPr>
                 <w:noProof/>
               </w:rPr>
-              <w:instrText xml:space="preserve"> PAGEREF _Toc243654251 \h </w:instrText>
+              <w:instrText xml:space="preserve"> PAGEREF _Toc243660113 \h </w:instrText>
             </w:r>
             <w:r>
               <w:rPr>
@@ -5579,7 +5695,7 @@
               <w14:ligatures w14:val="standardContextual"/>
             </w:rPr>
           </w:pPr>
-          <w:hyperlink w:anchor="_Toc243654252" w:history="1">
+          <w:hyperlink w:anchor="_Toc243660114" w:history="1">
             <w:r>
               <w:rPr>
                 <w:rStyle w:val="Hyperlink"/>
@@ -5603,7 +5719,7 @@
               <w:rPr>
                 <w:noProof/>
               </w:rPr>
-              <w:instrText xml:space="preserve"> PAGEREF _Toc243654252 \h </w:instrText>
+              <w:instrText xml:space="preserve"> PAGEREF _Toc243660114 \h </w:instrText>
             </w:r>
             <w:r>
               <w:rPr>
@@ -5646,7 +5762,7 @@
               <w14:ligatures w14:val="standardContextual"/>
             </w:rPr>
           </w:pPr>
-          <w:hyperlink w:anchor="_Toc243654253" w:history="1">
+          <w:hyperlink w:anchor="_Toc243660115" w:history="1">
             <w:r>
               <w:rPr>
                 <w:rStyle w:val="Hyperlink"/>
@@ -5670,7 +5786,7 @@
               <w:rPr>
                 <w:noProof/>
               </w:rPr>
-              <w:instrText xml:space="preserve"> PAGEREF _Toc243654253 \h </w:instrText>
+              <w:instrText xml:space="preserve"> PAGEREF _Toc243660115 \h </w:instrText>
             </w:r>
             <w:r>
               <w:rPr>
@@ -5713,7 +5829,7 @@
               <w14:ligatures w14:val="standardContextual"/>
             </w:rPr>
           </w:pPr>
-          <w:hyperlink w:anchor="_Toc243654254" w:history="1">
+          <w:hyperlink w:anchor="_Toc243660116" w:history="1">
             <w:r>
               <w:rPr>
                 <w:rStyle w:val="Hyperlink"/>
@@ -5737,7 +5853,7 @@
               <w:rPr>
                 <w:noProof/>
               </w:rPr>
-              <w:instrText xml:space="preserve"> PAGEREF _Toc243654254 \h </w:instrText>
+              <w:instrText xml:space="preserve"> PAGEREF _Toc243660116 \h </w:instrText>
             </w:r>
             <w:r>
               <w:rPr>
@@ -5780,7 +5896,7 @@
               <w14:ligatures w14:val="standardContextual"/>
             </w:rPr>
           </w:pPr>
-          <w:hyperlink w:anchor="_Toc243654255" w:history="1">
+          <w:hyperlink w:anchor="_Toc243660117" w:history="1">
             <w:r>
               <w:rPr>
                 <w:rStyle w:val="Hyperlink"/>
@@ -5804,7 +5920,7 @@
               <w:rPr>
                 <w:noProof/>
               </w:rPr>
-              <w:instrText xml:space="preserve"> PAGEREF _Toc243654255 \h </w:instrText>
+              <w:instrText xml:space="preserve"> PAGEREF _Toc243660117 \h </w:instrText>
             </w:r>
             <w:r>
               <w:rPr>
@@ -5847,7 +5963,7 @@
               <w14:ligatures w14:val="standardContextual"/>
             </w:rPr>
           </w:pPr>
-          <w:hyperlink w:anchor="_Toc243654256" w:history="1">
+          <w:hyperlink w:anchor="_Toc243660118" w:history="1">
             <w:r>
               <w:rPr>
                 <w:rStyle w:val="Hyperlink"/>
@@ -5871,7 +5987,7 @@
               <w:rPr>
                 <w:noProof/>
               </w:rPr>
-              <w:instrText xml:space="preserve"> PAGEREF _Toc243654256 \h </w:instrText>
+              <w:instrText xml:space="preserve"> PAGEREF _Toc243660118 \h </w:instrText>
             </w:r>
             <w:r>
               <w:rPr>
@@ -5914,7 +6030,7 @@
               <w14:ligatures w14:val="standardContextual"/>
             </w:rPr>
           </w:pPr>
-          <w:hyperlink w:anchor="_Toc243654257" w:history="1">
+          <w:hyperlink w:anchor="_Toc243660119" w:history="1">
             <w:r>
               <w:rPr>
                 <w:rStyle w:val="Hyperlink"/>
@@ -5938,7 +6054,7 @@
               <w:rPr>
                 <w:noProof/>
               </w:rPr>
-              <w:instrText xml:space="preserve"> PAGEREF _Toc243654257 \h </w:instrText>
+              <w:instrText xml:space="preserve"> PAGEREF _Toc243660119 \h </w:instrText>
             </w:r>
             <w:r>
               <w:rPr>
@@ -5981,7 +6097,7 @@
               <w14:ligatures w14:val="standardContextual"/>
             </w:rPr>
           </w:pPr>
-          <w:hyperlink w:anchor="_Toc243654258" w:history="1">
+          <w:hyperlink w:anchor="_Toc243660120" w:history="1">
             <w:r>
               <w:rPr>
                 <w:rStyle w:val="Hyperlink"/>
@@ -6005,7 +6121,7 @@
               <w:rPr>
                 <w:noProof/>
               </w:rPr>
-              <w:instrText xml:space="preserve"> PAGEREF _Toc243654258 \h </w:instrText>
+              <w:instrText xml:space="preserve"> PAGEREF _Toc243660120 \h </w:instrText>
             </w:r>
             <w:r>
               <w:rPr>
@@ -6051,7 +6167,7 @@
     <w:sdt>
       <w:sdtPr>
         <w:alias w:val="Figures"/>
-        <w:id w:val="-1307777784"/>
+        <w:id w:val="-1490318530"/>
       </w:sdtPr>
       <w:sdtEndPr/>
       <w:sdtContent>
@@ -6080,7 +6196,7 @@
           <w:r>
             <w:fldChar w:fldCharType="separate"/>
           </w:r>
-          <w:hyperlink w:anchor="_Toc243654259" w:history="1">
+          <w:hyperlink w:anchor="_Toc243660121" w:history="1">
             <w:r>
               <w:rPr>
                 <w:rStyle w:val="Hyperlink"/>
@@ -6104,7 +6220,7 @@
               <w:rPr>
                 <w:noProof/>
               </w:rPr>
-              <w:instrText xml:space="preserve"> PAGEREF _Toc243654259 \h </w:instrText>
+              <w:instrText xml:space="preserve"> PAGEREF _Toc243660121 \h </w:instrText>
             </w:r>
             <w:r>
               <w:rPr>
@@ -6147,7 +6263,7 @@
               <w14:ligatures w14:val="standardContextual"/>
             </w:rPr>
           </w:pPr>
-          <w:hyperlink w:anchor="_Toc243654260" w:history="1">
+          <w:hyperlink w:anchor="_Toc243660122" w:history="1">
             <w:r>
               <w:rPr>
                 <w:rStyle w:val="Hyperlink"/>
@@ -6171,7 +6287,7 @@
               <w:rPr>
                 <w:noProof/>
               </w:rPr>
-              <w:instrText xml:space="preserve"> PAGEREF _Toc243654260 \h </w:instrText>
+              <w:instrText xml:space="preserve"> PAGEREF _Toc243660122 \h </w:instrText>
             </w:r>
             <w:r>
               <w:rPr>
@@ -6214,7 +6330,7 @@
               <w14:ligatures w14:val="standardContextual"/>
             </w:rPr>
           </w:pPr>
-          <w:hyperlink w:anchor="_Toc243654261" w:history="1">
+          <w:hyperlink w:anchor="_Toc243660123" w:history="1">
             <w:r>
               <w:rPr>
                 <w:rStyle w:val="Hyperlink"/>
@@ -6238,7 +6354,7 @@
               <w:rPr>
                 <w:noProof/>
               </w:rPr>
-              <w:instrText xml:space="preserve"> PAGEREF _Toc243654261 \h </w:instrText>
+              <w:instrText xml:space="preserve"> PAGEREF _Toc243660123 \h </w:instrText>
             </w:r>
             <w:r>
               <w:rPr>
@@ -6281,7 +6397,7 @@
               <w14:ligatures w14:val="standardContextual"/>
             </w:rPr>
           </w:pPr>
-          <w:hyperlink w:anchor="_Toc243654262" w:history="1">
+          <w:hyperlink w:anchor="_Toc243660124" w:history="1">
             <w:r>
               <w:rPr>
                 <w:rStyle w:val="Hyperlink"/>
@@ -6305,7 +6421,7 @@
               <w:rPr>
                 <w:noProof/>
               </w:rPr>
-              <w:instrText xml:space="preserve"> PAGEREF _Toc243654262 \h </w:instrText>
+              <w:instrText xml:space="preserve"> PAGEREF _Toc243660124 \h </w:instrText>
             </w:r>
             <w:r>
               <w:rPr>
@@ -6348,7 +6464,7 @@
               <w14:ligatures w14:val="standardContextual"/>
             </w:rPr>
           </w:pPr>
-          <w:hyperlink w:anchor="_Toc243654263" w:history="1">
+          <w:hyperlink w:anchor="_Toc243660125" w:history="1">
             <w:r>
               <w:rPr>
                 <w:rStyle w:val="Hyperlink"/>
@@ -6372,7 +6488,7 @@
               <w:rPr>
                 <w:noProof/>
               </w:rPr>
-              <w:instrText xml:space="preserve"> PAGEREF _Toc243654263 \h </w:instrText>
+              <w:instrText xml:space="preserve"> PAGEREF _Toc243660125 \h </w:instrText>
             </w:r>
             <w:r>
               <w:rPr>
@@ -6415,7 +6531,7 @@
               <w14:ligatures w14:val="standardContextual"/>
             </w:rPr>
           </w:pPr>
-          <w:hyperlink w:anchor="_Toc243654264" w:history="1">
+          <w:hyperlink w:anchor="_Toc243660126" w:history="1">
             <w:r>
               <w:rPr>
                 <w:rStyle w:val="Hyperlink"/>
@@ -6439,7 +6555,7 @@
               <w:rPr>
                 <w:noProof/>
               </w:rPr>
-              <w:instrText xml:space="preserve"> PAGEREF _Toc243654264 \h </w:instrText>
+              <w:instrText xml:space="preserve"> PAGEREF _Toc243660126 \h </w:instrText>
             </w:r>
             <w:r>
               <w:rPr>
@@ -6482,7 +6598,7 @@
               <w14:ligatures w14:val="standardContextual"/>
             </w:rPr>
           </w:pPr>
-          <w:hyperlink w:anchor="_Toc243654265" w:history="1">
+          <w:hyperlink w:anchor="_Toc243660127" w:history="1">
             <w:r>
               <w:rPr>
                 <w:rStyle w:val="Hyperlink"/>
@@ -6506,7 +6622,7 @@
               <w:rPr>
                 <w:noProof/>
               </w:rPr>
-              <w:instrText xml:space="preserve"> PAGEREF _Toc243654265 \h </w:instrText>
+              <w:instrText xml:space="preserve"> PAGEREF _Toc243660127 \h </w:instrText>
             </w:r>
             <w:r>
               <w:rPr>
@@ -6549,7 +6665,7 @@
               <w14:ligatures w14:val="standardContextual"/>
             </w:rPr>
           </w:pPr>
-          <w:hyperlink w:anchor="_Toc243654266" w:history="1">
+          <w:hyperlink w:anchor="_Toc243660128" w:history="1">
             <w:r>
               <w:rPr>
                 <w:rStyle w:val="Hyperlink"/>
@@ -6573,7 +6689,7 @@
               <w:rPr>
                 <w:noProof/>
               </w:rPr>
-              <w:instrText xml:space="preserve"> PAGEREF _Toc243654266 \h </w:instrText>
+              <w:instrText xml:space="preserve"> PAGEREF _Toc243660128 \h </w:instrText>
             </w:r>
             <w:r>
               <w:rPr>
@@ -6619,7 +6735,7 @@
     <w:sdt>
       <w:sdtPr>
         <w:alias w:val="Tables"/>
-        <w:id w:val="-1086687308"/>
+        <w:id w:val="400795425"/>
       </w:sdtPr>
       <w:sdtEndPr/>
       <w:sdtContent>
@@ -6648,7 +6764,7 @@
           <w:r>
             <w:fldChar w:fldCharType="separate"/>
           </w:r>
-          <w:hyperlink w:anchor="_Toc243654267" w:history="1">
+          <w:hyperlink w:anchor="_Toc243660129" w:history="1">
             <w:r>
               <w:rPr>
                 <w:rStyle w:val="Hyperlink"/>
@@ -6672,7 +6788,7 @@
               <w:rPr>
                 <w:noProof/>
               </w:rPr>
-              <w:instrText xml:space="preserve"> PAGEREF _Toc243654267 \h </w:instrText>
+              <w:instrText xml:space="preserve"> PAGEREF _Toc243660129 \h </w:instrText>
             </w:r>
             <w:r>
               <w:rPr>
@@ -6715,7 +6831,7 @@
               <w14:ligatures w14:val="standardContextual"/>
             </w:rPr>
           </w:pPr>
-          <w:hyperlink w:anchor="_Toc243654268" w:history="1">
+          <w:hyperlink w:anchor="_Toc243660130" w:history="1">
             <w:r>
               <w:rPr>
                 <w:rStyle w:val="Hyperlink"/>
@@ -6739,7 +6855,7 @@
               <w:rPr>
                 <w:noProof/>
               </w:rPr>
-              <w:instrText xml:space="preserve"> PAGEREF _Toc243654268 \h </w:instrText>
+              <w:instrText xml:space="preserve"> PAGEREF _Toc243660130 \h </w:instrText>
             </w:r>
             <w:r>
               <w:rPr>
@@ -6782,7 +6898,7 @@
               <w14:ligatures w14:val="standardContextual"/>
             </w:rPr>
           </w:pPr>
-          <w:hyperlink w:anchor="_Toc243654269" w:history="1">
+          <w:hyperlink w:anchor="_Toc243660131" w:history="1">
             <w:r>
               <w:rPr>
                 <w:rStyle w:val="Hyperlink"/>
@@ -6806,7 +6922,7 @@
               <w:rPr>
                 <w:noProof/>
               </w:rPr>
-              <w:instrText xml:space="preserve"> PAGEREF _Toc243654269 \h </w:instrText>
+              <w:instrText xml:space="preserve"> PAGEREF _Toc243660131 \h </w:instrText>
             </w:r>
             <w:r>
               <w:rPr>
@@ -6849,7 +6965,7 @@
               <w14:ligatures w14:val="standardContextual"/>
             </w:rPr>
           </w:pPr>
-          <w:hyperlink w:anchor="_Toc243654270" w:history="1">
+          <w:hyperlink w:anchor="_Toc243660132" w:history="1">
             <w:r>
               <w:rPr>
                 <w:rStyle w:val="Hyperlink"/>
@@ -6873,7 +6989,7 @@
               <w:rPr>
                 <w:noProof/>
               </w:rPr>
-              <w:instrText xml:space="preserve"> PAGEREF _Toc243654270 \h </w:instrText>
+              <w:instrText xml:space="preserve"> PAGEREF _Toc243660132 \h </w:instrText>
             </w:r>
             <w:r>
               <w:rPr>
@@ -6916,7 +7032,7 @@
               <w14:ligatures w14:val="standardContextual"/>
             </w:rPr>
           </w:pPr>
-          <w:hyperlink w:anchor="_Toc243654271" w:history="1">
+          <w:hyperlink w:anchor="_Toc243660133" w:history="1">
             <w:r>
               <w:rPr>
                 <w:rStyle w:val="Hyperlink"/>
@@ -6940,7 +7056,7 @@
               <w:rPr>
                 <w:noProof/>
               </w:rPr>
-              <w:instrText xml:space="preserve"> PAGEREF _Toc243654271 \h </w:instrText>
+              <w:instrText xml:space="preserve"> PAGEREF _Toc243660133 \h </w:instrText>
             </w:r>
             <w:r>
               <w:rPr>
@@ -6983,7 +7099,7 @@
               <w14:ligatures w14:val="standardContextual"/>
             </w:rPr>
           </w:pPr>
-          <w:hyperlink w:anchor="_Toc243654272" w:history="1">
+          <w:hyperlink w:anchor="_Toc243660134" w:history="1">
             <w:r>
               <w:rPr>
                 <w:rStyle w:val="Hyperlink"/>
@@ -7007,7 +7123,7 @@
               <w:rPr>
                 <w:noProof/>
               </w:rPr>
-              <w:instrText xml:space="preserve"> PAGEREF _Toc243654272 \h </w:instrText>
+              <w:instrText xml:space="preserve"> PAGEREF _Toc243660134 \h </w:instrText>
             </w:r>
             <w:r>
               <w:rPr>
@@ -7050,7 +7166,7 @@
               <w14:ligatures w14:val="standardContextual"/>
             </w:rPr>
           </w:pPr>
-          <w:hyperlink w:anchor="_Toc243654273" w:history="1">
+          <w:hyperlink w:anchor="_Toc243660135" w:history="1">
             <w:r>
               <w:rPr>
                 <w:rStyle w:val="Hyperlink"/>
@@ -7074,7 +7190,7 @@
               <w:rPr>
                 <w:noProof/>
               </w:rPr>
-              <w:instrText xml:space="preserve"> PAGEREF _Toc243654273 \h </w:instrText>
+              <w:instrText xml:space="preserve"> PAGEREF _Toc243660135 \h </w:instrText>
             </w:r>
             <w:r>
               <w:rPr>
@@ -7117,7 +7233,7 @@
               <w14:ligatures w14:val="standardContextual"/>
             </w:rPr>
           </w:pPr>
-          <w:hyperlink w:anchor="_Toc243654274" w:history="1">
+          <w:hyperlink w:anchor="_Toc243660136" w:history="1">
             <w:r>
               <w:rPr>
                 <w:rStyle w:val="Hyperlink"/>
@@ -7141,7 +7257,7 @@
               <w:rPr>
                 <w:noProof/>
               </w:rPr>
-              <w:instrText xml:space="preserve"> PAGEREF _Toc243654274 \h </w:instrText>
+              <w:instrText xml:space="preserve"> PAGEREF _Toc243660136 \h </w:instrText>
             </w:r>
             <w:r>
               <w:rPr>
@@ -7184,7 +7300,7 @@
               <w14:ligatures w14:val="standardContextual"/>
             </w:rPr>
           </w:pPr>
-          <w:hyperlink w:anchor="_Toc243654275" w:history="1">
+          <w:hyperlink w:anchor="_Toc243660137" w:history="1">
             <w:r>
               <w:rPr>
                 <w:rStyle w:val="Hyperlink"/>
@@ -7208,7 +7324,7 @@
               <w:rPr>
                 <w:noProof/>
               </w:rPr>
-              <w:instrText xml:space="preserve"> PAGEREF _Toc243654275 \h </w:instrText>
+              <w:instrText xml:space="preserve"> PAGEREF _Toc243660137 \h </w:instrText>
             </w:r>
             <w:r>
               <w:rPr>
@@ -7251,7 +7367,7 @@
               <w14:ligatures w14:val="standardContextual"/>
             </w:rPr>
           </w:pPr>
-          <w:hyperlink w:anchor="_Toc243654276" w:history="1">
+          <w:hyperlink w:anchor="_Toc243660138" w:history="1">
             <w:r>
               <w:rPr>
                 <w:rStyle w:val="Hyperlink"/>
@@ -7275,7 +7391,7 @@
               <w:rPr>
                 <w:noProof/>
               </w:rPr>
-              <w:instrText xml:space="preserve"> PAGEREF _Toc243654276 \h </w:instrText>
+              <w:instrText xml:space="preserve"> PAGEREF _Toc243660138 \h </w:instrText>
             </w:r>
             <w:r>
               <w:rPr>
@@ -7318,7 +7434,7 @@
               <w14:ligatures w14:val="standardContextual"/>
             </w:rPr>
           </w:pPr>
-          <w:hyperlink w:anchor="_Toc243654277" w:history="1">
+          <w:hyperlink w:anchor="_Toc243660139" w:history="1">
             <w:r>
               <w:rPr>
                 <w:rStyle w:val="Hyperlink"/>
@@ -7342,7 +7458,7 @@
               <w:rPr>
                 <w:noProof/>
               </w:rPr>
-              <w:instrText xml:space="preserve"> PAGEREF _Toc243654277 \h </w:instrText>
+              <w:instrText xml:space="preserve"> PAGEREF _Toc243660139 \h </w:instrText>
             </w:r>
             <w:r>
               <w:rPr>
@@ -7385,7 +7501,7 @@
               <w14:ligatures w14:val="standardContextual"/>
             </w:rPr>
           </w:pPr>
-          <w:hyperlink w:anchor="_Toc243654278" w:history="1">
+          <w:hyperlink w:anchor="_Toc243660140" w:history="1">
             <w:r>
               <w:rPr>
                 <w:rStyle w:val="Hyperlink"/>
@@ -7409,7 +7525,7 @@
               <w:rPr>
                 <w:noProof/>
               </w:rPr>
-              <w:instrText xml:space="preserve"> PAGEREF _Toc243654278 \h </w:instrText>
+              <w:instrText xml:space="preserve"> PAGEREF _Toc243660140 \h </w:instrText>
             </w:r>
             <w:r>
               <w:rPr>
@@ -7452,7 +7568,7 @@
               <w14:ligatures w14:val="standardContextual"/>
             </w:rPr>
           </w:pPr>
-          <w:hyperlink w:anchor="_Toc243654279" w:history="1">
+          <w:hyperlink w:anchor="_Toc243660141" w:history="1">
             <w:r>
               <w:rPr>
                 <w:rStyle w:val="Hyperlink"/>
@@ -7476,7 +7592,7 @@
               <w:rPr>
                 <w:noProof/>
               </w:rPr>
-              <w:instrText xml:space="preserve"> PAGEREF _Toc243654279 \h </w:instrText>
+              <w:instrText xml:space="preserve"> PAGEREF _Toc243660141 \h </w:instrText>
             </w:r>
             <w:r>
               <w:rPr>
@@ -7519,7 +7635,7 @@
               <w14:ligatures w14:val="standardContextual"/>
             </w:rPr>
           </w:pPr>
-          <w:hyperlink w:anchor="_Toc243654280" w:history="1">
+          <w:hyperlink w:anchor="_Toc243660142" w:history="1">
             <w:r>
               <w:rPr>
                 <w:rStyle w:val="Hyperlink"/>
@@ -7543,7 +7659,7 @@
               <w:rPr>
                 <w:noProof/>
               </w:rPr>
-              <w:instrText xml:space="preserve"> PAGEREF _Toc243654280 \h </w:instrText>
+              <w:instrText xml:space="preserve"> PAGEREF _Toc243660142 \h </w:instrText>
             </w:r>
             <w:r>
               <w:rPr>
@@ -7586,7 +7702,7 @@
               <w14:ligatures w14:val="standardContextual"/>
             </w:rPr>
           </w:pPr>
-          <w:hyperlink w:anchor="_Toc243654281" w:history="1">
+          <w:hyperlink w:anchor="_Toc243660143" w:history="1">
             <w:r>
               <w:rPr>
                 <w:rStyle w:val="Hyperlink"/>
@@ -7610,7 +7726,7 @@
               <w:rPr>
                 <w:noProof/>
               </w:rPr>
-              <w:instrText xml:space="preserve"> PAGEREF _Toc243654281 \h </w:instrText>
+              <w:instrText xml:space="preserve"> PAGEREF _Toc243660143 \h </w:instrText>
             </w:r>
             <w:r>
               <w:rPr>
@@ -7653,7 +7769,7 @@
               <w14:ligatures w14:val="standardContextual"/>
             </w:rPr>
           </w:pPr>
-          <w:hyperlink w:anchor="_Toc243654282" w:history="1">
+          <w:hyperlink w:anchor="_Toc243660144" w:history="1">
             <w:r>
               <w:rPr>
                 <w:rStyle w:val="Hyperlink"/>
@@ -7677,7 +7793,7 @@
               <w:rPr>
                 <w:noProof/>
               </w:rPr>
-              <w:instrText xml:space="preserve"> PAGEREF _Toc243654282 \h </w:instrText>
+              <w:instrText xml:space="preserve"> PAGEREF _Toc243660144 \h </w:instrText>
             </w:r>
             <w:r>
               <w:rPr>
@@ -7718,7 +7834,7 @@
         <w:keepLines/>
         <w:pageBreakBefore/>
       </w:pPr>
-      <w:bookmarkStart w:id="0" w:name="_Toc243654214"/>
+      <w:bookmarkStart w:id="0" w:name="_Toc243660076"/>
       <w:r>
         <w:lastRenderedPageBreak/>
         <w:t>1 Introduction</w:t>
@@ -7731,7 +7847,7 @@
         <w:keepNext/>
         <w:keepLines/>
       </w:pPr>
-      <w:bookmarkStart w:id="1" w:name="_Toc243654215"/>
+      <w:bookmarkStart w:id="1" w:name="_Toc243660077"/>
       <w:r>
         <w:t>1.1 Purpose</w:t>
       </w:r>
@@ -7772,7 +7888,10 @@
         <w:t>physical</w:t>
       </w:r>
       <w:r>
-        <w:t xml:space="preserve"> schema for Cloudflare D1. The physical schema is the real migration file the application uses, and it has been proved by loading the real UGC data into it.</w:t>
+        <w:t xml:space="preserve"> schema for Cloudflare D1. The physical schema is the real </w:t>
+      </w:r>
+      <w:r>
+        <w:t>migration file the application uses, and it has been proved by loading the real UGC data into it.</w:t>
       </w:r>
     </w:p>
     <w:p>
@@ -7781,7 +7900,7 @@
         <w:keepNext/>
         <w:keepLines/>
       </w:pPr>
-      <w:bookmarkStart w:id="2" w:name="_Toc243654216"/>
+      <w:bookmarkStart w:id="2" w:name="_Toc243660078"/>
       <w:r>
         <w:t>1.2 Scope</w:t>
       </w:r>
@@ -7802,7 +7921,10 @@
         <w:t>optional</w:t>
       </w:r>
       <w:r>
-        <w:t xml:space="preserve"> student account: a student who chooses to create one keeps the same profile on the server, under a username only, so it follows them between devices and can drive reminders. Section 2.5 models it. The preference list stays on the device.</w:t>
+        <w:t xml:space="preserve"> student account: a student who chooses to create one keeps the same profile on the server, under a username only, so it follows them between </w:t>
+      </w:r>
+      <w:r>
+        <w:t>devices and can drive reminders. Section 2.5 models it. The preference list stays on the device.</w:t>
       </w:r>
     </w:p>
     <w:p>
@@ -7811,7 +7933,7 @@
         <w:keepNext/>
         <w:keepLines/>
       </w:pPr>
-      <w:bookmarkStart w:id="3" w:name="_Toc243654217"/>
+      <w:bookmarkStart w:id="3" w:name="_Toc243660079"/>
       <w:r>
         <w:t>1.3 Intended audience</w:t>
       </w:r>
@@ -7831,7 +7953,7 @@
         <w:keepNext/>
         <w:keepLines/>
       </w:pPr>
-      <w:bookmarkStart w:id="4" w:name="_Toc243654218"/>
+      <w:bookmarkStart w:id="4" w:name="_Toc243660080"/>
       <w:r>
         <w:t>1.4 Relationship to other documents</w:t>
       </w:r>
@@ -7842,7 +7964,7 @@
         <w:pStyle w:val="Caption"/>
         <w:keepNext/>
       </w:pPr>
-      <w:bookmarkStart w:id="5" w:name="_Toc243654267"/>
+      <w:bookmarkStart w:id="5" w:name="_Toc243660129"/>
       <w:r>
         <w:t xml:space="preserve">Table </w:t>
       </w:r>
@@ -8361,7 +8483,7 @@
         <w:keepNext/>
         <w:keepLines/>
       </w:pPr>
-      <w:bookmarkStart w:id="6" w:name="_Toc243654219"/>
+      <w:bookmarkStart w:id="6" w:name="_Toc243660081"/>
       <w:r>
         <w:t>1.5 Notation</w:t>
       </w:r>
@@ -8482,7 +8604,10 @@
         <w:t>union category</w:t>
       </w:r>
       <w:r>
-        <w:t>. Partial keys of weak entities are named in the entity catalogue. Logical diagrams use crow's-foot (Information Engineering) notation.</w:t>
+        <w:t xml:space="preserve">. Partial keys of weak entities are </w:t>
+      </w:r>
+      <w:r>
+        <w:t>named in the entity catalogue. Logical diagrams use crow's-foot (Information Engineering) notation.</w:t>
       </w:r>
     </w:p>
     <w:p>
@@ -8492,7 +8617,7 @@
         <w:keepLines/>
         <w:pageBreakBefore/>
       </w:pPr>
-      <w:bookmarkStart w:id="7" w:name="_Toc243654220"/>
+      <w:bookmarkStart w:id="7" w:name="_Toc243660082"/>
       <w:r>
         <w:lastRenderedPageBreak/>
         <w:t>2 Conceptual model (EER)</w:t>
@@ -8505,7 +8630,7 @@
         <w:keepNext/>
         <w:keepLines/>
       </w:pPr>
-      <w:bookmarkStart w:id="8" w:name="_Toc243654221"/>
+      <w:bookmarkStart w:id="8" w:name="_Toc243660083"/>
       <w:r>
         <w:t>2.1 Offerings and cut-offs</w:t>
       </w:r>
@@ -8581,7 +8706,7 @@
         </w:rPr>
         <w:lastRenderedPageBreak/>
         <w:drawing>
-          <wp:inline distT="0" distB="0" distL="0" distR="0" wp14:anchorId="68588CF2" wp14:editId="68588CF3">
+          <wp:inline distT="0" distB="0" distL="0" distR="0" wp14:anchorId="5DD071A1" wp14:editId="5DD071A2">
             <wp:extent cx="6124575" cy="7553325"/>
             <wp:effectExtent l="0" t="0" r="0" b="0"/>
             <wp:docPr id="1" name="eer-offerings.png" descr="EER model of institutions, courses, offerings, intake years, selection groups and cut-offs" title="EER model of institutions, courses, offerings, intake years, selection groups and cut-offs"/>
@@ -8624,7 +8749,7 @@
       <w:pPr>
         <w:pStyle w:val="Caption"/>
       </w:pPr>
-      <w:bookmarkStart w:id="9" w:name="_Toc243654259"/>
+      <w:bookmarkStart w:id="9" w:name="_Toc243660121"/>
       <w:r>
         <w:t xml:space="preserve">Figure </w:t>
       </w:r>
@@ -8657,7 +8782,7 @@
         <w:keepNext/>
         <w:keepLines/>
       </w:pPr>
-      <w:bookmarkStart w:id="10" w:name="_Toc243654222"/>
+      <w:bookmarkStart w:id="10" w:name="_Toc243660084"/>
       <w:r>
         <w:t>2.2 Subjects and requirement rules</w:t>
       </w:r>
@@ -8693,7 +8818,7 @@
         </w:rPr>
         <w:lastRenderedPageBreak/>
         <w:drawing>
-          <wp:inline distT="0" distB="0" distL="0" distR="0" wp14:anchorId="68588CF4" wp14:editId="68588CF5">
+          <wp:inline distT="0" distB="0" distL="0" distR="0" wp14:anchorId="5DD071A3" wp14:editId="5DD071A4">
             <wp:extent cx="6124575" cy="6067425"/>
             <wp:effectExtent l="0" t="0" r="0" b="0"/>
             <wp:docPr id="2" name="eer-rules.png" descr="EER model of streams, subjects and the recursive requirement-rule tree" title="EER model of streams, subjects and the recursive requirement-rule tree"/>
@@ -8736,7 +8861,7 @@
       <w:pPr>
         <w:pStyle w:val="Caption"/>
       </w:pPr>
-      <w:bookmarkStart w:id="11" w:name="_Toc243654260"/>
+      <w:bookmarkStart w:id="11" w:name="_Toc243660122"/>
       <w:r>
         <w:t xml:space="preserve">Figure </w:t>
       </w:r>
@@ -8769,7 +8894,7 @@
         <w:keepNext/>
         <w:keepLines/>
       </w:pPr>
-      <w:bookmarkStart w:id="12" w:name="_Toc243654223"/>
+      <w:bookmarkStart w:id="12" w:name="_Toc243660085"/>
       <w:r>
         <w:t>2.3 Provenance and trust</w:t>
       </w:r>
@@ -8805,7 +8930,7 @@
         </w:rPr>
         <w:lastRenderedPageBreak/>
         <w:drawing>
-          <wp:inline distT="0" distB="0" distL="0" distR="0" wp14:anchorId="68588CF6" wp14:editId="68588CF7">
+          <wp:inline distT="0" distB="0" distL="0" distR="0" wp14:anchorId="5DD071A5" wp14:editId="5DD071A6">
             <wp:extent cx="6124575" cy="4829175"/>
             <wp:effectExtent l="0" t="0" r="0" b="0"/>
             <wp:docPr id="3" name="eer-provenance.png" descr="EER model of cited facts, sources, revisions, AI extraction, review and mistake reports" title="EER model of cited facts, sources, revisions, AI extraction, review and mistake reports"/>
@@ -8848,7 +8973,7 @@
       <w:pPr>
         <w:pStyle w:val="Caption"/>
       </w:pPr>
-      <w:bookmarkStart w:id="13" w:name="_Toc243654261"/>
+      <w:bookmarkStart w:id="13" w:name="_Toc243660123"/>
       <w:r>
         <w:t xml:space="preserve">Figure </w:t>
       </w:r>
@@ -8881,7 +9006,7 @@
         <w:keepNext/>
         <w:keepLines/>
       </w:pPr>
-      <w:bookmarkStart w:id="14" w:name="_Toc243654224"/>
+      <w:bookmarkStart w:id="14" w:name="_Toc243660086"/>
       <w:r>
         <w:t>2.4 Journey and other routes</w:t>
       </w:r>
@@ -8898,7 +9023,7 @@
           <w:noProof/>
         </w:rPr>
         <w:drawing>
-          <wp:inline distT="0" distB="0" distL="0" distR="0" wp14:anchorId="68588CF8" wp14:editId="68588CF9">
+          <wp:inline distT="0" distB="0" distL="0" distR="0" wp14:anchorId="5DD071A7" wp14:editId="5DD071A8">
             <wp:extent cx="6124575" cy="2895600"/>
             <wp:effectExtent l="0" t="0" r="0" b="0"/>
             <wp:docPr id="4" name="eer-journey.png" descr="EER model of deadlines, push reminders and the specialisation of other routes" title="EER model of deadlines, push reminders and the specialisation of other routes"/>
@@ -8941,7 +9066,7 @@
       <w:pPr>
         <w:pStyle w:val="Caption"/>
       </w:pPr>
-      <w:bookmarkStart w:id="15" w:name="_Toc243654262"/>
+      <w:bookmarkStart w:id="15" w:name="_Toc243660124"/>
       <w:r>
         <w:t xml:space="preserve">Figure </w:t>
       </w:r>
@@ -8974,7 +9099,7 @@
         <w:keepNext/>
         <w:keepLines/>
       </w:pPr>
-      <w:bookmarkStart w:id="16" w:name="_Toc243654225"/>
+      <w:bookmarkStart w:id="16" w:name="_Toc243660087"/>
       <w:r>
         <w:lastRenderedPageBreak/>
         <w:t>2.5 Student accounts (CR-001)</w:t>
@@ -8986,7 +9111,10 @@
         <w:spacing w:after="120"/>
       </w:pPr>
       <w:r>
-        <w:t xml:space="preserve">A student account is optional. ACCOUNT, already the superclass of the staff roles, gains a fourth subclass, STUDENT. Each way of signing in is its own weak entity of ACCOUNT, so a later identity provider (for example Google sign-in) adds an entity without touching the others. A password is never stored: PASSWORD_LOGIN holds a salt and a </w:t>
+        <w:t xml:space="preserve">A student account is optional. ACCOUNT, already the superclass of the staff roles, gains a fourth subclass, </w:t>
+      </w:r>
+      <w:r>
+        <w:t xml:space="preserve">STUDENT. Each way of signing in is its own weak entity of ACCOUNT, so a later identity provider (for example Google sign-in) adds an entity without touching the others. A password is never stored: PASSWORD_LOGIN holds a salt and a </w:t>
       </w:r>
       <w:r>
         <w:rPr>
@@ -8996,10 +9124,10 @@
         <w:t>verifier</w:t>
       </w:r>
       <w:r>
-        <w:t xml:space="preserve">, a hash of a key the student's device derives from the password. A STUDENT's results are the attributes the device already keeps: a Z-score, the stream sat (SAT_IN), the district sat from (SAT_FROM), and three subjects with grades (TOOK, whose attributes are Grade and Position). Achievements are a weak entity with partial key Position; interests are a multi-valued attribute. CR-001 stored no name, email address or telephone </w:t>
-      </w:r>
-      <w:r>
-        <w:t>number; CR-003 (below) withdraws that and adds them, with consent, in a table of their own.</w:t>
+        <w:t xml:space="preserve">, a hash of a key the student's device derives from the password. A STUDENT's results are the attributes the device already keeps: a Z-score, the stream sat (SAT_IN), the district sat from (SAT_FROM), and </w:t>
+      </w:r>
+      <w:r>
+        <w:t>three subjects with grades (TOOK, whose attributes are Grade and Position). Achievements are a weak entity with partial key Position; interests are a multi-valued attribute. CR-001 stored no name, email address or telephone number; CR-003 (below) withdraws that and adds them, with consent, in a table of their own.</w:t>
       </w:r>
     </w:p>
     <w:p>
@@ -9013,7 +9141,7 @@
           <w:noProof/>
         </w:rPr>
         <w:drawing>
-          <wp:inline distT="0" distB="0" distL="0" distR="0" wp14:anchorId="68588CFA" wp14:editId="68588CFB">
+          <wp:inline distT="0" distB="0" distL="0" distR="0" wp14:anchorId="5DD071A9" wp14:editId="5DD071AA">
             <wp:extent cx="6124575" cy="2857500"/>
             <wp:effectExtent l="0" t="0" r="0" b="0"/>
             <wp:docPr id="5" name="eer-accounts.png" descr="EER model of optional student accounts: sign-in, sessions, recovery and the student's results" title="EER model of optional student accounts: sign-in, sessions, recovery and the student's results"/>
@@ -9056,7 +9184,7 @@
       <w:pPr>
         <w:pStyle w:val="Caption"/>
       </w:pPr>
-      <w:bookmarkStart w:id="17" w:name="_Toc243654263"/>
+      <w:bookmarkStart w:id="17" w:name="_Toc243660125"/>
       <w:r>
         <w:t xml:space="preserve">Figure </w:t>
       </w:r>
@@ -9089,7 +9217,7 @@
         <w:keepNext/>
         <w:keepLines/>
       </w:pPr>
-      <w:bookmarkStart w:id="18" w:name="_Toc243654226"/>
+      <w:bookmarkStart w:id="18" w:name="_Toc243660088"/>
       <w:r>
         <w:t>2.6 Journey, Alerts and Groups (CR-002)</w:t>
       </w:r>
@@ -9779,10 +9907,7 @@
         <w:t>rule</w:t>
       </w:r>
       <w:r>
-        <w:t xml:space="preserve"> (for example, </w:t>
-      </w:r>
-      <w:r>
-        <w:t>"within two weeks of the closing date", p.116) and dated items come from cited notices. No date is invented.</w:t>
+        <w:t xml:space="preserve"> (for example, "within two weeks of the closing date", p.116) and dated items come from cited notices. No date is invented.</w:t>
       </w:r>
     </w:p>
     <w:p>
@@ -9809,10 +9934,7 @@
         <w:t>account.verified_for_letter</w:t>
       </w:r>
       <w:r>
-        <w:t xml:space="preserve">), and the 0003 triggers already keep student data off non-student accounts. A SENIOR_INVITE (one-time code, stored only as its SHA-256) names the course, institution and study year </w:t>
-      </w:r>
-      <w:r>
-        <w:t>the product owner checked; redeeming it at sign-up creates the SENIOR account and marks the invite in one atomic batch. A trigger allows redemption only by a SENIOR account of the invite's institution, and only once.</w:t>
+        <w:t>), and the 0003 triggers already keep student data off non-student accounts. A SENIOR_INVITE (one-time code, stored only as its SHA-256) names the course, institution and study year the product owner checked; redeeming it at sign-up creates the SENIOR account and marks the invite in one atomic batch. A trigger allows redemption only by a SENIOR account of the invite's institution, and only once.</w:t>
       </w:r>
     </w:p>
     <w:p>
@@ -9827,7 +9949,10 @@
         <w:t>Reference rows for foreign keys.</w:t>
       </w:r>
       <w:r>
-        <w:t xml:space="preserve"> Migration 0005 loads the 121 courses and 20 institutions of 2025/26 (generated by </w:t>
+        <w:t xml:space="preserve"> Migration 0005 loads the 121 courses and 20 institutions of 2025/26 (generated </w:t>
+      </w:r>
+      <w:r>
+        <w:t xml:space="preserve">by </w:t>
       </w:r>
       <w:r>
         <w:rPr>
@@ -10687,10 +10812,7 @@
         <w:spacing w:after="120"/>
       </w:pPr>
       <w:r>
-        <w:t xml:space="preserve">Messages are outside D1's cascade, so deleting an account also tells every group it was in to delete that account's </w:t>
-      </w:r>
-      <w:r>
-        <w:t>messages (tested). All tables are in BCNF: every determinant is a candidate key; derived values (member counts, the senior badge text) are computed, never stored.</w:t>
+        <w:t>Messages are outside D1's cascade, so deleting an account also tells every group it was in to delete that account's messages (tested). All tables are in BCNF: every determinant is a candidate key; derived values (member counts, the senior badge text) are computed, never stored.</w:t>
       </w:r>
     </w:p>
     <w:p>
@@ -10699,7 +10821,7 @@
         <w:keepNext/>
         <w:keepLines/>
       </w:pPr>
-      <w:bookmarkStart w:id="19" w:name="_Toc243654227"/>
+      <w:bookmarkStart w:id="19" w:name="_Toc243660089"/>
       <w:r>
         <w:t>2.7 Contact details (CR-003)</w:t>
       </w:r>
@@ -10717,14 +10839,14 @@
         <w:t>Decision.</w:t>
       </w:r>
       <w:r>
-        <w:t xml:space="preserve"> On 11 October 2026 the product owner made an account compulsory at the start, with full name, email, mobile number and date of birth (the birthday moves here from the Alerts screen, where it stayed on the </w:t>
+        <w:t xml:space="preserve"> On 11 October 2026 the product owner made an account compulsory at the start, with full name, email, </w:t>
+      </w:r>
+      <w:r>
+        <w:t xml:space="preserve">mobile number and date of birth (the birthday moves here from the Alerts screen, where it stayed on the </w:t>
       </w:r>
       <w:r>
         <w:lastRenderedPageBreak/>
-        <w:t xml:space="preserve">phone). This </w:t>
-      </w:r>
-      <w:r>
-        <w:t>reverses the CR-001 promise "a username only". The README, the business case and the app's privacy text now say exactly what is collected and why.</w:t>
+        <w:t>phone). This reverses the CR-001 promise "a username only". The README, the business case and the app's privacy text now say exactly what is collected and why.</w:t>
       </w:r>
     </w:p>
     <w:p>
@@ -10775,7 +10897,10 @@
         <w:t>account</w:t>
       </w:r>
       <w:r>
-        <w:t xml:space="preserve"> is the identity table shared by every role, and personal contact data kept apart can be audited, exported or deleted on its own. It cascades with the account.</w:t>
+        <w:t xml:space="preserve"> is the identity table shared by every role, </w:t>
+      </w:r>
+      <w:r>
+        <w:t>and personal contact data kept apart can be audited, exported or deleted on its own. It cascades with the account.</w:t>
       </w:r>
     </w:p>
     <w:tbl>
@@ -11411,10 +11536,7 @@
         <w:t>PUT /api/me/contact</w:t>
       </w:r>
       <w:r>
-        <w:t xml:space="preserve">). Safe default: no existing row is invented or guessed. Students under 18 confirm that a </w:t>
-      </w:r>
-      <w:r>
-        <w:t>parent or guardian agrees (Personal Data Protection Act, No. 9 of 2022). The table is in BCNF: the only determinant is the key.</w:t>
+        <w:t>). Safe default: no existing row is invented or guessed. Students under 18 confirm that a parent or guardian agrees (Personal Data Protection Act, No. 9 of 2022). The table is in BCNF: the only determinant is the key.</w:t>
       </w:r>
     </w:p>
     <w:p>
@@ -11423,7 +11545,7 @@
         <w:keepNext/>
         <w:keepLines/>
       </w:pPr>
-      <w:bookmarkStart w:id="20" w:name="_Toc243654228"/>
+      <w:bookmarkStart w:id="20" w:name="_Toc243660090"/>
       <w:r>
         <w:t>2.8 Answer feedback (CR-004)</w:t>
       </w:r>
@@ -11470,7 +11592,10 @@
         <w:t>fact_id</w:t>
       </w:r>
       <w:r>
-        <w:t xml:space="preserve"> is required), and an AI answer is not one. A row holds the rating, the question, the answer, the handbook pages it cited (JSON, checked by </w:t>
+        <w:t xml:space="preserve"> is required), and an AI answer is not one. </w:t>
+      </w:r>
+      <w:r>
+        <w:t xml:space="preserve">A row holds the rating, the question, the answer, the handbook pages it cited (JSON, checked by </w:t>
       </w:r>
       <w:r>
         <w:rPr>
@@ -11482,10 +11607,7 @@
         <w:t>json_valid</w:t>
       </w:r>
       <w:r>
-        <w:t xml:space="preserve">), an </w:t>
-      </w:r>
-      <w:r>
-        <w:t>optional note, the app language and a review state. It holds nothing that identifies the student: no account, device or IP. The screen says the question and answer are sent before the student sends a report.</w:t>
+        <w:t>), an optional note, the app language and a review state. It holds nothing that identifies the student: no account, device or IP. The screen says the question and answer are sent before the student sends a report.</w:t>
       </w:r>
     </w:p>
     <w:p>
@@ -11494,7 +11616,7 @@
         <w:keepNext/>
         <w:keepLines/>
       </w:pPr>
-      <w:bookmarkStart w:id="21" w:name="_Toc243654229"/>
+      <w:bookmarkStart w:id="21" w:name="_Toc243660091"/>
       <w:r>
         <w:t>2.9 Group rules and sample conversations (CR-005)</w:t>
       </w:r>
@@ -11529,10 +11651,7 @@
         <w:t>rules_version</w:t>
       </w:r>
       <w:r>
-        <w:t xml:space="preserve">, migration 0009) rather than a new table: one value per (group, member), fully </w:t>
-      </w:r>
-      <w:r>
-        <w:t>dependent on the key, so the table stays in BCNF. A CHECK lists the versions that exist (</w:t>
+        <w:t>, migration 0009) rather than a new table: one value per (group, member), fully dependent on the key, so the table stays in BCNF. A CHECK lists the versions that exist (</w:t>
       </w:r>
       <w:r>
         <w:rPr>
@@ -11629,7 +11748,7 @@
         <w:keepNext/>
         <w:keepLines/>
       </w:pPr>
-      <w:bookmarkStart w:id="22" w:name="_Toc243654230"/>
+      <w:bookmarkStart w:id="22" w:name="_Toc243660092"/>
       <w:r>
         <w:lastRenderedPageBreak/>
         <w:t>2.10 Journey, avatars and group rules on the account (CR-006)</w:t>
@@ -11678,14 +11797,7 @@
           <w:b/>
           <w:bCs/>
         </w:rPr>
-        <w:t xml:space="preserve">only once </w:t>
-      </w:r>
-      <w:r>
-        <w:rPr>
-          <w:b/>
-          <w:bCs/>
-        </w:rPr>
-        <w:t>its window is open</w:t>
+        <w:t>only once its window is open</w:t>
       </w:r>
       <w:r>
         <w:t>, which the server checks. Migration 0010 implements the design below.</w:t>
@@ -11696,7 +11808,7 @@
         <w:pStyle w:val="Caption"/>
         <w:keepNext/>
       </w:pPr>
-      <w:bookmarkStart w:id="23" w:name="_Toc243654268"/>
+      <w:bookmarkStart w:id="23" w:name="_Toc243660130"/>
       <w:r>
         <w:t xml:space="preserve">Table </w:t>
       </w:r>
@@ -12653,10 +12765,7 @@
         <w:t>Mapping.</w:t>
       </w:r>
       <w:r>
-        <w:t xml:space="preserve"> Every new relationship is many-to-many with its own attributes, so each maps to its own relation whose key </w:t>
-      </w:r>
-      <w:r>
-        <w:t>is the pair of participating keys (mapping step 5). The avatar is a single-valued attribute of ACCOUNT and stays on it (step 1). The acceptance is no longer a column of GROUP_MEMBER because it does not depend on the group: under CR-005 the same fact was repeated once per group the student joined, a partial-dependency redundancy that CR-006 removes.</w:t>
+        <w:t xml:space="preserve"> Every new relationship is many-to-many with its own attributes, so each maps to its own relation whose key is the pair of participating keys (mapping step 5). The avatar is a single-valued attribute of ACCOUNT and stays on it (step 1). The acceptance is no longer a column of GROUP_MEMBER because it does not depend on the group: under CR-005 the same fact was repeated once per group the student joined, a partial-dependency redundancy that CR-006 removes.</w:t>
       </w:r>
     </w:p>
     <w:p>
@@ -12770,7 +12879,10 @@
         <w:t>offering</w:t>
       </w:r>
       <w:r>
-        <w:t xml:space="preserve"> was defined in 0001 but left empty because the read model serves the course data. 0010 fills it with the 255 Uni-Codes of 2025/26 (handbook pages 142 to 148, generated by </w:t>
+        <w:t xml:space="preserve"> was defined in 0001 but left empty because the read model serves the </w:t>
+      </w:r>
+      <w:r>
+        <w:t xml:space="preserve">course data. 0010 fills it with the 255 Uni-Codes of 2025/26 (handbook pages 142 to 148, generated by </w:t>
       </w:r>
       <w:r>
         <w:rPr>
@@ -12818,10 +12930,10 @@
           <w:b/>
           <w:bCs/>
         </w:rPr>
-        <w:t>Business rules on the server.</w:t>
-      </w:r>
-      <w:r>
-        <w:t xml:space="preserve"> The step list (three preparation steps, open at any time, and the five UGC steps) is fixed in </w:t>
+        <w:t>Route catalogue fields (23 October 2026).</w:t>
+      </w:r>
+      <w:r>
+        <w:t xml:space="preserve"> </w:t>
       </w:r>
       <w:r>
         <w:rPr>
@@ -12830,10 +12942,10 @@
           <w:szCs w:val="19"/>
           <w:shd w:val="clear" w:color="auto" w:fill="F2F4F3"/>
         </w:rPr>
-        <w:t>shared/journey.ts</w:t>
-      </w:r>
-      <w:r>
-        <w:t xml:space="preserve"> and mirrored by the CHECK on </w:t>
+        <w:t>data/routes/routes-2026-10-23.json</w:t>
+      </w:r>
+      <w:r>
+        <w:t xml:space="preserve"> holds 102 routes. Three rules keep it honest, each pinned by tests: (1) </w:t>
       </w:r>
       <w:r>
         <w:rPr>
@@ -12842,10 +12954,14 @@
           <w:szCs w:val="19"/>
           <w:shd w:val="clear" w:color="auto" w:fill="F2F4F3"/>
         </w:rPr>
-        <w:t>journey_step.step_id</w:t>
-      </w:r>
-      <w:r>
-        <w:t>; a test inserts every step id the code knows, so the two cannot drift. A UGC step opens on the date of the UGC press notice (</w:t>
+        <w:t>programmes</w:t>
+      </w:r>
+      <w:r>
+        <w:t xml:space="preserve"> (optional list) holds the degree titles exactly as the source lists them, for example the Ministry's Section 25A register (typos kept), and the screen shows them as a </w:t>
+      </w:r>
+      <w:r>
+        <w:lastRenderedPageBreak/>
+        <w:t xml:space="preserve">list; the register is reused as the source instead of a new table. (2) </w:t>
       </w:r>
       <w:r>
         <w:rPr>
@@ -12854,14 +12970,13 @@
           <w:szCs w:val="19"/>
           <w:shd w:val="clear" w:color="auto" w:fill="F2F4F3"/>
         </w:rPr>
-        <w:t>opensOn</w:t>
-      </w:r>
-      <w:r>
-        <w:t xml:space="preserve"> in the </w:t>
-      </w:r>
-      <w:r>
-        <w:lastRenderedPageBreak/>
-        <w:t>journey read model); while no date is announced it cannot be ticked, because ZedPath never invents a date. "I applied" on a followed notice can be set only once the notice has opened. The Worker checks both against the read model, using the Sri Lanka date (UTC+05:30), before writing (</w:t>
+        <w:t>entry_requirements_text</w:t>
+      </w:r>
+      <w:r>
+        <w:t xml:space="preserve"> is null when no page ZedPath could check publishes it; the screen says </w:t>
+      </w:r>
+      <w:r>
+        <w:t xml:space="preserve">so in three languages and never shows a guess (TC-144). (3) </w:t>
       </w:r>
       <w:r>
         <w:rPr>
@@ -12870,25 +12985,10 @@
           <w:szCs w:val="19"/>
           <w:shd w:val="clear" w:color="auto" w:fill="F2F4F3"/>
         </w:rPr>
-        <w:t>worker/my-journey.ts</w:t>
-      </w:r>
-      <w:r>
-        <w:t>); the phone shows the same rule.</w:t>
-      </w:r>
-    </w:p>
-    <w:p>
-      <w:pPr>
-        <w:spacing w:after="120"/>
-      </w:pPr>
-      <w:r>
-        <w:rPr>
-          <w:b/>
-          <w:bCs/>
-        </w:rPr>
-        <w:t>Data migration and safe defaults.</w:t>
-      </w:r>
-      <w:r>
-        <w:t xml:space="preserve"> Rules accepted under 0009 are carried into </w:t>
+        <w:t>source_url</w:t>
+      </w:r>
+      <w:r>
+        <w:t xml:space="preserve"> is null only for routes whose only official site returned unsafe content: their facts keep the date they were checked on and the site is never linked (DAT-030, </w:t>
       </w:r>
       <w:r>
         <w:rPr>
@@ -12897,10 +12997,25 @@
           <w:szCs w:val="19"/>
           <w:shd w:val="clear" w:color="auto" w:fill="F2F4F3"/>
         </w:rPr>
-        <w:t>group_rules_acceptance</w:t>
-      </w:r>
-      <w:r>
-        <w:t xml:space="preserve"> with the time of the account's first join (tested on a copy of the database as it was before 0010). </w:t>
+        <w:t>KNOWN.sourceNotLinked</w:t>
+      </w:r>
+      <w:r>
+        <w:t>). A cost is "Free" only when a cost of 0 is published; an unknown cost (null) is never free (TC-143).</w:t>
+      </w:r>
+    </w:p>
+    <w:p>
+      <w:pPr>
+        <w:spacing w:after="120"/>
+      </w:pPr>
+      <w:r>
+        <w:rPr>
+          <w:b/>
+          <w:bCs/>
+        </w:rPr>
+        <w:t>Business rules on the server.</w:t>
+      </w:r>
+      <w:r>
+        <w:t xml:space="preserve"> The step list (three preparation steps, open at any time, and the five UGC steps) is fixed in </w:t>
       </w:r>
       <w:r>
         <w:rPr>
@@ -12909,28 +13024,10 @@
           <w:szCs w:val="19"/>
           <w:shd w:val="clear" w:color="auto" w:fill="F2F4F3"/>
         </w:rPr>
-        <w:t>group_member.rules_version</w:t>
-      </w:r>
-      <w:r>
-        <w:t xml:space="preserve"> is no longer read or written but is kept for now (expand, then contract): the previous release still writes it, so a </w:t>
-      </w:r>
-      <w:r>
-        <w:t>rollback stays safe; a later migration drops it once this release is stable. No avatar means initials, as before. A new account's Journey is empty: nothing is ticked for the student. Journey items kept on a phone before CR-006 are copied to the account by the app on first use.</w:t>
-      </w:r>
-    </w:p>
-    <w:p>
-      <w:pPr>
-        <w:spacing w:after="120"/>
-      </w:pPr>
-      <w:r>
-        <w:rPr>
-          <w:b/>
-          <w:bCs/>
-        </w:rPr>
-        <w:t>Privacy.</w:t>
-      </w:r>
-      <w:r>
-        <w:t xml:space="preserve"> The members list of a group (members only) returns usernames, avatars and senior badges, never the name, email or mobile in </w:t>
+        <w:t>shared/journey.ts</w:t>
+      </w:r>
+      <w:r>
+        <w:t xml:space="preserve"> and mirrored by the CHECK on </w:t>
       </w:r>
       <w:r>
         <w:rPr>
@@ -12939,58 +13036,10 @@
           <w:szCs w:val="19"/>
           <w:shd w:val="clear" w:color="auto" w:fill="F2F4F3"/>
         </w:rPr>
-        <w:t>student_contact</w:t>
-      </w:r>
-      <w:r>
-        <w:t xml:space="preserve">. Every new relation cascades on account deletion. In each group's room, a message </w:t>
-      </w:r>
-      <w:r>
-        <w:t>keeps the author's avatar as it was when posted, a snapshot like the author name (a deliberate departure).</w:t>
-      </w:r>
-    </w:p>
-    <w:p>
-      <w:pPr>
-        <w:pStyle w:val="Heading2"/>
-        <w:keepNext/>
-        <w:keepLines/>
-      </w:pPr>
-      <w:bookmarkStart w:id="24" w:name="_Toc243654231"/>
-      <w:r>
-        <w:t>2.11 Demo accounts (CR-007)</w:t>
-      </w:r>
-      <w:bookmarkEnd w:id="24"/>
-    </w:p>
-    <w:p>
-      <w:pPr>
-        <w:spacing w:after="120"/>
-      </w:pPr>
-      <w:r>
-        <w:t xml:space="preserve">The product owner asked for a one-tap demo on the Welcome screen (15 October 2026), choosing a </w:t>
-      </w:r>
-      <w:r>
-        <w:rPr>
-          <w:b/>
-          <w:bCs/>
-        </w:rPr>
-        <w:t>private copy per visitor</w:t>
-      </w:r>
-      <w:r>
-        <w:t xml:space="preserve"> over one shared account. Each tap creates a throwaway account holding the sample student; it expires 24 hours later and is deleted on a later demo tap (the free plan has no scheduled job).</w:t>
-      </w:r>
-    </w:p>
-    <w:p>
-      <w:pPr>
-        <w:spacing w:after="120"/>
-      </w:pPr>
-      <w:r>
-        <w:rPr>
-          <w:b/>
-          <w:bCs/>
-        </w:rPr>
-        <w:t>Where the fact lives.</w:t>
-      </w:r>
-      <w:r>
-        <w:t xml:space="preserve"> "This account is a demo, until T" is a single-valued fact about the account, so it is an attribute of ACCOUNT (</w:t>
+        <w:t>journey_step.step_id</w:t>
+      </w:r>
+      <w:r>
+        <w:t>; a test inserts every step id the code knows, so the two cannot drift. A UGC step opens on the date of the UGC press notice (</w:t>
       </w:r>
       <w:r>
         <w:rPr>
@@ -12999,6 +13048,147 @@
           <w:szCs w:val="19"/>
           <w:shd w:val="clear" w:color="auto" w:fill="F2F4F3"/>
         </w:rPr>
+        <w:t>opensOn</w:t>
+      </w:r>
+      <w:r>
+        <w:t xml:space="preserve"> in the journey read model); while no date is announced it cannot be ticked, because ZedPath never invents a date. "I applied" on a followed notice can be set only once the notice has opened. The Worker checks both against the read model, using the Sri Lanka date (UTC+05:30), before writing (</w:t>
+      </w:r>
+      <w:r>
+        <w:rPr>
+          <w:rFonts w:ascii="Consolas" w:eastAsia="Consolas" w:hAnsi="Consolas" w:cs="Consolas"/>
+          <w:sz w:val="19"/>
+          <w:szCs w:val="19"/>
+          <w:shd w:val="clear" w:color="auto" w:fill="F2F4F3"/>
+        </w:rPr>
+        <w:t>worker/my-journey.ts</w:t>
+      </w:r>
+      <w:r>
+        <w:t>); the phone shows the same rule.</w:t>
+      </w:r>
+    </w:p>
+    <w:p>
+      <w:pPr>
+        <w:spacing w:after="120"/>
+      </w:pPr>
+      <w:r>
+        <w:rPr>
+          <w:b/>
+          <w:bCs/>
+        </w:rPr>
+        <w:t>Data migration and safe defaults.</w:t>
+      </w:r>
+      <w:r>
+        <w:t xml:space="preserve"> Rules accepted under 0009 are carried into </w:t>
+      </w:r>
+      <w:r>
+        <w:rPr>
+          <w:rFonts w:ascii="Consolas" w:eastAsia="Consolas" w:hAnsi="Consolas" w:cs="Consolas"/>
+          <w:sz w:val="19"/>
+          <w:szCs w:val="19"/>
+          <w:shd w:val="clear" w:color="auto" w:fill="F2F4F3"/>
+        </w:rPr>
+        <w:t>group_rules_acceptance</w:t>
+      </w:r>
+      <w:r>
+        <w:t xml:space="preserve"> with the time of the account's first join (tested on a copy of the database as it was before 0010). </w:t>
+      </w:r>
+      <w:r>
+        <w:rPr>
+          <w:rFonts w:ascii="Consolas" w:eastAsia="Consolas" w:hAnsi="Consolas" w:cs="Consolas"/>
+          <w:sz w:val="19"/>
+          <w:szCs w:val="19"/>
+          <w:shd w:val="clear" w:color="auto" w:fill="F2F4F3"/>
+        </w:rPr>
+        <w:t>group_member.rules_version</w:t>
+      </w:r>
+      <w:r>
+        <w:t xml:space="preserve"> is no longer read or written but is kept for now (expand, then contract): the previous release still writes it, so a </w:t>
+      </w:r>
+      <w:r>
+        <w:t>rollback stays safe; a later migration drops it once this release is stable. No avatar means initials, as before. A new account's Journey is empty: nothing is ticked for the student. Journey items kept on a phone before CR-006 are copied to the account by the app on first use.</w:t>
+      </w:r>
+    </w:p>
+    <w:p>
+      <w:pPr>
+        <w:spacing w:after="120"/>
+      </w:pPr>
+      <w:r>
+        <w:rPr>
+          <w:b/>
+          <w:bCs/>
+        </w:rPr>
+        <w:t>Privacy.</w:t>
+      </w:r>
+      <w:r>
+        <w:t xml:space="preserve"> The members list of a group (members only) returns usernames, avatars and senior badges, never the name, email or mobile in </w:t>
+      </w:r>
+      <w:r>
+        <w:rPr>
+          <w:rFonts w:ascii="Consolas" w:eastAsia="Consolas" w:hAnsi="Consolas" w:cs="Consolas"/>
+          <w:sz w:val="19"/>
+          <w:szCs w:val="19"/>
+          <w:shd w:val="clear" w:color="auto" w:fill="F2F4F3"/>
+        </w:rPr>
+        <w:t>student_contact</w:t>
+      </w:r>
+      <w:r>
+        <w:t xml:space="preserve">. Every new relation cascades on account deletion. In each group's room, a message </w:t>
+      </w:r>
+      <w:r>
+        <w:t>keeps the author's avatar as it was when posted, a snapshot like the author name (a deliberate departure).</w:t>
+      </w:r>
+    </w:p>
+    <w:p>
+      <w:pPr>
+        <w:pStyle w:val="Heading2"/>
+        <w:keepNext/>
+        <w:keepLines/>
+      </w:pPr>
+      <w:bookmarkStart w:id="24" w:name="_Toc243660093"/>
+      <w:r>
+        <w:t>2.11 Demo accounts (CR-007)</w:t>
+      </w:r>
+      <w:bookmarkEnd w:id="24"/>
+    </w:p>
+    <w:p>
+      <w:pPr>
+        <w:spacing w:after="120"/>
+      </w:pPr>
+      <w:r>
+        <w:t xml:space="preserve">The product owner asked for a one-tap demo on the Welcome screen (15 October 2026), choosing a </w:t>
+      </w:r>
+      <w:r>
+        <w:rPr>
+          <w:b/>
+          <w:bCs/>
+        </w:rPr>
+        <w:t>private copy per visitor</w:t>
+      </w:r>
+      <w:r>
+        <w:t xml:space="preserve"> over one shared account. Each tap creates a throwaway account holding the sample student; it expires 24 hours later and is deleted on a later demo tap (the free plan has no scheduled job).</w:t>
+      </w:r>
+    </w:p>
+    <w:p>
+      <w:pPr>
+        <w:spacing w:after="120"/>
+      </w:pPr>
+      <w:r>
+        <w:rPr>
+          <w:b/>
+          <w:bCs/>
+        </w:rPr>
+        <w:t>Where the fact lives.</w:t>
+      </w:r>
+      <w:r>
+        <w:t xml:space="preserve"> "This account is a demo, until T" is a single-valued fact about the account, so it is an attribute of ACCOUNT (</w:t>
+      </w:r>
+      <w:r>
+        <w:rPr>
+          <w:rFonts w:ascii="Consolas" w:eastAsia="Consolas" w:hAnsi="Consolas" w:cs="Consolas"/>
+          <w:sz w:val="19"/>
+          <w:szCs w:val="19"/>
+          <w:shd w:val="clear" w:color="auto" w:fill="F2F4F3"/>
+        </w:rPr>
         <w:t>demo_expires_at</w:t>
       </w:r>
       <w:r>
@@ -13010,7 +13200,7 @@
         <w:pStyle w:val="Caption"/>
         <w:keepNext/>
       </w:pPr>
-      <w:bookmarkStart w:id="25" w:name="_Toc243654269"/>
+      <w:bookmarkStart w:id="25" w:name="_Toc243660131"/>
       <w:r>
         <w:t xml:space="preserve">Table </w:t>
       </w:r>
@@ -13465,7 +13655,7 @@
         <w:keepNext/>
         <w:keepLines/>
       </w:pPr>
-      <w:bookmarkStart w:id="26" w:name="_Toc243654232"/>
+      <w:bookmarkStart w:id="26" w:name="_Toc243660094"/>
       <w:r>
         <w:t>2.12 University facts from UGC statistics (read model)</w:t>
       </w:r>
@@ -13476,7 +13666,11 @@
         <w:spacing w:after="120"/>
       </w:pPr>
       <w:r>
-        <w:t xml:space="preserve">Four facts per institution (students admitted 2023/24, undergraduates 2024, permanent hostel places, graduates 2024; Mahapola and Bursary recipients are extracted but not shown, product owner 15 Oct) come from the UGC report </w:t>
+        <w:t xml:space="preserve">Four facts per institution (students admitted 2023/24, undergraduates 2024, permanent hostel places, graduates 2024; Mahapola and Bursary recipients are extracted but not shown, product owner 15 Oct) come </w:t>
+      </w:r>
+      <w:r>
+        <w:lastRenderedPageBreak/>
+        <w:t xml:space="preserve">from the UGC report </w:t>
       </w:r>
       <w:r>
         <w:rPr>
@@ -13537,9 +13731,8 @@
         <w:keepNext/>
         <w:keepLines/>
       </w:pPr>
-      <w:bookmarkStart w:id="27" w:name="_Toc243654233"/>
-      <w:r>
-        <w:lastRenderedPageBreak/>
+      <w:bookmarkStart w:id="27" w:name="_Toc243660095"/>
+      <w:r>
         <w:t>2.13 Rooms an account opened (security audit, lead 3)</w:t>
       </w:r>
       <w:bookmarkEnd w:id="27"/>
@@ -13596,7 +13789,7 @@
         <w:keepNext/>
         <w:keepLines/>
       </w:pPr>
-      <w:bookmarkStart w:id="28" w:name="_Toc243654234"/>
+      <w:bookmarkStart w:id="28" w:name="_Toc243660096"/>
       <w:r>
         <w:t>2.14 Entity catalogue</w:t>
       </w:r>
@@ -13607,7 +13800,7 @@
         <w:pStyle w:val="Caption"/>
         <w:keepNext/>
       </w:pPr>
-      <w:bookmarkStart w:id="29" w:name="_Toc243654270"/>
+      <w:bookmarkStart w:id="29" w:name="_Toc243660132"/>
       <w:r>
         <w:t xml:space="preserve">Table </w:t>
       </w:r>
@@ -15569,6 +15762,7 @@
                 <w:sz w:val="19"/>
                 <w:szCs w:val="19"/>
               </w:rPr>
+              <w:lastRenderedPageBreak/>
               <w:t>EXTRACTION_RUN, CANDIDATE_FACT</w:t>
             </w:r>
           </w:p>
@@ -16101,7 +16295,6 @@
                 <w:sz w:val="19"/>
                 <w:szCs w:val="19"/>
               </w:rPr>
-              <w:lastRenderedPageBreak/>
               <w:t>SESSION</w:t>
             </w:r>
           </w:p>
@@ -16876,7 +17069,7 @@
         <w:keepLines/>
         <w:pageBreakBefore/>
       </w:pPr>
-      <w:bookmarkStart w:id="30" w:name="_Toc243654235"/>
+      <w:bookmarkStart w:id="30" w:name="_Toc243660097"/>
       <w:r>
         <w:lastRenderedPageBreak/>
         <w:t>3 Rule grammar</w:t>
@@ -16918,7 +17111,7 @@
         <w:pStyle w:val="Caption"/>
         <w:keepNext/>
       </w:pPr>
-      <w:bookmarkStart w:id="31" w:name="_Toc243654271"/>
+      <w:bookmarkStart w:id="31" w:name="_Toc243660133"/>
       <w:r>
         <w:t xml:space="preserve">Table </w:t>
       </w:r>
@@ -18289,7 +18482,7 @@
         <w:keepLines/>
         <w:pageBreakBefore/>
       </w:pPr>
-      <w:bookmarkStart w:id="32" w:name="_Toc243654236"/>
+      <w:bookmarkStart w:id="32" w:name="_Toc243660098"/>
       <w:r>
         <w:lastRenderedPageBreak/>
         <w:t>4 Mapping the EER model to relations</w:t>
@@ -18309,7 +18502,7 @@
         <w:pStyle w:val="Caption"/>
         <w:keepNext/>
       </w:pPr>
-      <w:bookmarkStart w:id="33" w:name="_Toc243654272"/>
+      <w:bookmarkStart w:id="33" w:name="_Toc243660134"/>
       <w:r>
         <w:t xml:space="preserve">Table </w:t>
       </w:r>
@@ -20100,7 +20293,7 @@
         <w:pStyle w:val="Caption"/>
         <w:keepNext/>
       </w:pPr>
-      <w:bookmarkStart w:id="34" w:name="_Toc243654273"/>
+      <w:bookmarkStart w:id="34" w:name="_Toc243660135"/>
       <w:r>
         <w:lastRenderedPageBreak/>
         <w:t xml:space="preserve">Table </w:t>
@@ -21212,7 +21405,7 @@
         </w:rPr>
         <w:lastRenderedPageBreak/>
         <w:drawing>
-          <wp:inline distT="0" distB="0" distL="0" distR="0" wp14:anchorId="68588CFC" wp14:editId="68588CFD">
+          <wp:inline distT="0" distB="0" distL="0" distR="0" wp14:anchorId="5DD071AB" wp14:editId="5DD071AC">
             <wp:extent cx="6124575" cy="6562725"/>
             <wp:effectExtent l="0" t="0" r="0" b="0"/>
             <wp:docPr id="6" name="relational-admission.png" descr="Logical schema, admission data (generated from the migration file)" title="Logical schema, admission data (generated from the migration file)"/>
@@ -21255,7 +21448,7 @@
       <w:pPr>
         <w:pStyle w:val="Caption"/>
       </w:pPr>
-      <w:bookmarkStart w:id="35" w:name="_Toc243654264"/>
+      <w:bookmarkStart w:id="35" w:name="_Toc243660126"/>
       <w:r>
         <w:t xml:space="preserve">Figure </w:t>
       </w:r>
@@ -21294,7 +21487,7 @@
         </w:rPr>
         <w:lastRenderedPageBreak/>
         <w:drawing>
-          <wp:inline distT="0" distB="0" distL="0" distR="0" wp14:anchorId="68588CFE" wp14:editId="68588CFF">
+          <wp:inline distT="0" distB="0" distL="0" distR="0" wp14:anchorId="5DD071AD" wp14:editId="5DD071AE">
             <wp:extent cx="6124575" cy="5562600"/>
             <wp:effectExtent l="0" t="0" r="0" b="0"/>
             <wp:docPr id="7" name="relational-trust-journey.png" descr="Logical schema, trust, routes and journey data (generated from the migration file)" title="Logical schema, trust, routes and journey data (generated from the migration file)"/>
@@ -21337,7 +21530,7 @@
       <w:pPr>
         <w:pStyle w:val="Caption"/>
       </w:pPr>
-      <w:bookmarkStart w:id="36" w:name="_Toc243654265"/>
+      <w:bookmarkStart w:id="36" w:name="_Toc243660127"/>
       <w:r>
         <w:t xml:space="preserve">Figure </w:t>
       </w:r>
@@ -21375,7 +21568,7 @@
           <w:noProof/>
         </w:rPr>
         <w:drawing>
-          <wp:inline distT="0" distB="0" distL="0" distR="0" wp14:anchorId="68588D00" wp14:editId="68588D01">
+          <wp:inline distT="0" distB="0" distL="0" distR="0" wp14:anchorId="5DD071AF" wp14:editId="5DD071B0">
             <wp:extent cx="6124575" cy="2305050"/>
             <wp:effectExtent l="0" t="0" r="0" b="0"/>
             <wp:docPr id="8" name="relational-accounts.png" descr="Logical schema, optional student accounts (generated from the migration files)" title="Logical schema, optional student accounts (generated from the migration files)"/>
@@ -21418,7 +21611,7 @@
       <w:pPr>
         <w:pStyle w:val="Caption"/>
       </w:pPr>
-      <w:bookmarkStart w:id="37" w:name="_Toc243654266"/>
+      <w:bookmarkStart w:id="37" w:name="_Toc243660128"/>
       <w:r>
         <w:t xml:space="preserve">Figure </w:t>
       </w:r>
@@ -21452,7 +21645,7 @@
         <w:keepLines/>
         <w:pageBreakBefore/>
       </w:pPr>
-      <w:bookmarkStart w:id="38" w:name="_Toc243654237"/>
+      <w:bookmarkStart w:id="38" w:name="_Toc243660099"/>
       <w:r>
         <w:lastRenderedPageBreak/>
         <w:t>5 Normalisation</w:t>
@@ -21465,7 +21658,7 @@
         <w:keepNext/>
         <w:keepLines/>
       </w:pPr>
-      <w:bookmarkStart w:id="39" w:name="_Toc243654238"/>
+      <w:bookmarkStart w:id="39" w:name="_Toc243660100"/>
       <w:r>
         <w:t>5.1 From the source form to 1NF</w:t>
       </w:r>
@@ -21521,7 +21714,7 @@
         <w:keepNext/>
         <w:keepLines/>
       </w:pPr>
-      <w:bookmarkStart w:id="40" w:name="_Toc243654239"/>
+      <w:bookmarkStart w:id="40" w:name="_Toc243660101"/>
       <w:r>
         <w:t>5.2 Functional and multi-valued dependencies</w:t>
       </w:r>
@@ -21532,7 +21725,7 @@
         <w:pStyle w:val="Caption"/>
         <w:keepNext/>
       </w:pPr>
-      <w:bookmarkStart w:id="41" w:name="_Toc243654274"/>
+      <w:bookmarkStart w:id="41" w:name="_Toc243660136"/>
       <w:r>
         <w:t xml:space="preserve">Table </w:t>
       </w:r>
@@ -22431,7 +22624,7 @@
         <w:keepNext/>
         <w:keepLines/>
       </w:pPr>
-      <w:bookmarkStart w:id="42" w:name="_Toc243654240"/>
+      <w:bookmarkStart w:id="42" w:name="_Toc243660102"/>
       <w:r>
         <w:t>5.3 2NF, 3NF and BCNF</w:t>
       </w:r>
@@ -22674,7 +22867,7 @@
         <w:keepNext/>
         <w:keepLines/>
       </w:pPr>
-      <w:bookmarkStart w:id="43" w:name="_Toc243654241"/>
+      <w:bookmarkStart w:id="43" w:name="_Toc243660103"/>
       <w:r>
         <w:lastRenderedPageBreak/>
         <w:t>5.4 Deliberate departures</w:t>
@@ -22686,7 +22879,7 @@
         <w:pStyle w:val="Caption"/>
         <w:keepNext/>
       </w:pPr>
-      <w:bookmarkStart w:id="44" w:name="_Toc243654275"/>
+      <w:bookmarkStart w:id="44" w:name="_Toc243660137"/>
       <w:r>
         <w:t xml:space="preserve">Table </w:t>
       </w:r>
@@ -23457,7 +23650,7 @@
         <w:keepLines/>
         <w:pageBreakBefore/>
       </w:pPr>
-      <w:bookmarkStart w:id="45" w:name="_Toc243654242"/>
+      <w:bookmarkStart w:id="45" w:name="_Toc243660104"/>
       <w:r>
         <w:lastRenderedPageBreak/>
         <w:t>6 Physical design for Cloudflare D1</w:t>
@@ -23470,7 +23663,7 @@
         <w:keepNext/>
         <w:keepLines/>
       </w:pPr>
-      <w:bookmarkStart w:id="46" w:name="_Toc243654243"/>
+      <w:bookmarkStart w:id="46" w:name="_Toc243660105"/>
       <w:r>
         <w:t>6.1 Conventions</w:t>
       </w:r>
@@ -23709,7 +23902,7 @@
         <w:keepNext/>
         <w:keepLines/>
       </w:pPr>
-      <w:bookmarkStart w:id="47" w:name="_Toc243654244"/>
+      <w:bookmarkStart w:id="47" w:name="_Toc243660106"/>
       <w:r>
         <w:t>6.2 Indexes</w:t>
       </w:r>
@@ -23720,7 +23913,7 @@
         <w:pStyle w:val="Caption"/>
         <w:keepNext/>
       </w:pPr>
-      <w:bookmarkStart w:id="48" w:name="_Toc243654276"/>
+      <w:bookmarkStart w:id="48" w:name="_Toc243660138"/>
       <w:r>
         <w:t xml:space="preserve">Table </w:t>
       </w:r>
@@ -24801,7 +24994,7 @@
         <w:keepNext/>
         <w:keepLines/>
       </w:pPr>
-      <w:bookmarkStart w:id="49" w:name="_Toc243654245"/>
+      <w:bookmarkStart w:id="49" w:name="_Toc243660107"/>
       <w:r>
         <w:lastRenderedPageBreak/>
         <w:t>6.3 Capacity against the free plan</w:t>
@@ -24813,7 +25006,7 @@
         <w:pStyle w:val="Caption"/>
         <w:keepNext/>
       </w:pPr>
-      <w:bookmarkStart w:id="50" w:name="_Toc243654277"/>
+      <w:bookmarkStart w:id="50" w:name="_Toc243660139"/>
       <w:r>
         <w:t xml:space="preserve">Table </w:t>
       </w:r>
@@ -25500,7 +25693,7 @@
         <w:keepLines/>
         <w:pageBreakBefore/>
       </w:pPr>
-      <w:bookmarkStart w:id="51" w:name="_Toc243654246"/>
+      <w:bookmarkStart w:id="51" w:name="_Toc243660108"/>
       <w:r>
         <w:lastRenderedPageBreak/>
         <w:t>7 Validation against real data</w:t>
@@ -25532,7 +25725,7 @@
         <w:pStyle w:val="Caption"/>
         <w:keepNext/>
       </w:pPr>
-      <w:bookmarkStart w:id="52" w:name="_Toc243654278"/>
+      <w:bookmarkStart w:id="52" w:name="_Toc243660140"/>
       <w:r>
         <w:t xml:space="preserve">Table </w:t>
       </w:r>
@@ -26982,7 +27175,7 @@
         <w:pStyle w:val="Caption"/>
         <w:keepNext/>
       </w:pPr>
-      <w:bookmarkStart w:id="53" w:name="_Toc243654279"/>
+      <w:bookmarkStart w:id="53" w:name="_Toc243660141"/>
       <w:r>
         <w:t xml:space="preserve">Table </w:t>
       </w:r>
@@ -27724,7 +27917,7 @@
         <w:keepLines/>
         <w:pageBreakBefore/>
       </w:pPr>
-      <w:bookmarkStart w:id="54" w:name="_Toc243654247"/>
+      <w:bookmarkStart w:id="54" w:name="_Toc243660109"/>
       <w:r>
         <w:lastRenderedPageBreak/>
         <w:t>Appendix A: Traceability: requirements to tables</w:t>
@@ -27736,7 +27929,7 @@
         <w:pStyle w:val="Caption"/>
         <w:keepNext/>
       </w:pPr>
-      <w:bookmarkStart w:id="55" w:name="_Toc243654280"/>
+      <w:bookmarkStart w:id="55" w:name="_Toc243660142"/>
       <w:r>
         <w:t xml:space="preserve">Table </w:t>
       </w:r>
@@ -29971,7 +30164,7 @@
         <w:keepLines/>
         <w:pageBreakBefore/>
       </w:pPr>
-      <w:bookmarkStart w:id="56" w:name="_Toc243654248"/>
+      <w:bookmarkStart w:id="56" w:name="_Toc243660110"/>
       <w:r>
         <w:lastRenderedPageBreak/>
         <w:t>Appendix B: Physical schema (migration 0001)</w:t>
@@ -35184,7 +35377,7 @@
         <w:keepLines/>
         <w:pageBreakBefore/>
       </w:pPr>
-      <w:bookmarkStart w:id="57" w:name="_Toc243654249"/>
+      <w:bookmarkStart w:id="57" w:name="_Toc243660111"/>
       <w:r>
         <w:lastRenderedPageBreak/>
         <w:t>Appendix C: Student accounts (migration 0003)</w:t>
@@ -36917,7 +37110,7 @@
         <w:keepLines/>
         <w:pageBreakBefore/>
       </w:pPr>
-      <w:bookmarkStart w:id="58" w:name="_Toc243654250"/>
+      <w:bookmarkStart w:id="58" w:name="_Toc243660112"/>
       <w:r>
         <w:lastRenderedPageBreak/>
         <w:t>Appendix D: Contact details (migration 0007)</w:t>
@@ -37313,7 +37506,7 @@
         <w:keepLines/>
         <w:pageBreakBefore/>
       </w:pPr>
-      <w:bookmarkStart w:id="59" w:name="_Toc243654251"/>
+      <w:bookmarkStart w:id="59" w:name="_Toc243660113"/>
       <w:r>
         <w:lastRenderedPageBreak/>
         <w:t>Appendix E: Answer feedback (migration 0008)</w:t>
@@ -37624,7 +37817,7 @@
         <w:keepLines/>
         <w:pageBreakBefore/>
       </w:pPr>
-      <w:bookmarkStart w:id="60" w:name="_Toc243654252"/>
+      <w:bookmarkStart w:id="60" w:name="_Toc243660114"/>
       <w:r>
         <w:lastRenderedPageBreak/>
         <w:t>Appendix F: Journey, avatars and group rules on the account (migration 0010)</w:t>
@@ -42640,7 +42833,7 @@
         <w:keepLines/>
         <w:pageBreakBefore/>
       </w:pPr>
-      <w:bookmarkStart w:id="61" w:name="_Toc243654253"/>
+      <w:bookmarkStart w:id="61" w:name="_Toc243660115"/>
       <w:r>
         <w:lastRenderedPageBreak/>
         <w:t>Appendix G: Rooms an account opened (migration 0012)</w:t>
@@ -42917,7 +43110,7 @@
         <w:keepLines/>
         <w:pageBreakBefore/>
       </w:pPr>
-      <w:bookmarkStart w:id="62" w:name="_Toc243654254"/>
+      <w:bookmarkStart w:id="62" w:name="_Toc243660116"/>
       <w:r>
         <w:lastRenderedPageBreak/>
         <w:t>Appendix H: Demo accounts (migration 0011)</w:t>
@@ -43109,7 +43302,7 @@
         <w:keepLines/>
         <w:pageBreakBefore/>
       </w:pPr>
-      <w:bookmarkStart w:id="63" w:name="_Toc243654255"/>
+      <w:bookmarkStart w:id="63" w:name="_Toc243660117"/>
       <w:r>
         <w:lastRenderedPageBreak/>
         <w:t>Appendix I: Group rules (migration 0009)</w:t>
@@ -43250,7 +43443,7 @@
         <w:keepLines/>
         <w:pageBreakBefore/>
       </w:pPr>
-      <w:bookmarkStart w:id="64" w:name="_Toc243654256"/>
+      <w:bookmarkStart w:id="64" w:name="_Toc243660118"/>
       <w:r>
         <w:lastRenderedPageBreak/>
         <w:t>Appendix J: Groups (migration 0006)</w:t>
@@ -44503,7 +44696,7 @@
         <w:keepLines/>
         <w:pageBreakBefore/>
       </w:pPr>
-      <w:bookmarkStart w:id="65" w:name="_Toc243654257"/>
+      <w:bookmarkStart w:id="65" w:name="_Toc243660119"/>
       <w:r>
         <w:lastRenderedPageBreak/>
         <w:t>Appendix K: Glossary</w:t>
@@ -44515,7 +44708,7 @@
         <w:pStyle w:val="Caption"/>
         <w:keepNext/>
       </w:pPr>
-      <w:bookmarkStart w:id="66" w:name="_Toc243654281"/>
+      <w:bookmarkStart w:id="66" w:name="_Toc243660143"/>
       <w:r>
         <w:t xml:space="preserve">Table </w:t>
       </w:r>
@@ -45232,7 +45425,7 @@
         <w:keepLines/>
         <w:pageBreakBefore/>
       </w:pPr>
-      <w:bookmarkStart w:id="67" w:name="_Toc243654258"/>
+      <w:bookmarkStart w:id="67" w:name="_Toc243660120"/>
       <w:r>
         <w:lastRenderedPageBreak/>
         <w:t>Appendix L: References</w:t>
@@ -45244,7 +45437,7 @@
         <w:pStyle w:val="Caption"/>
         <w:keepNext/>
       </w:pPr>
-      <w:bookmarkStart w:id="68" w:name="_Toc243654282"/>
+      <w:bookmarkStart w:id="68" w:name="_Toc243660144"/>
       <w:r>
         <w:t xml:space="preserve">Table </w:t>
       </w:r>
@@ -46175,10 +46368,96 @@
 <file path=word/numbering.xml><?xml version="1.0" encoding="utf-8"?>
 <w:numbering xmlns:wpc="http://schemas.microsoft.com/office/word/2010/wordprocessingCanvas" xmlns:cx="http://schemas.microsoft.com/office/drawing/2014/chartex" xmlns:cx1="http://schemas.microsoft.com/office/drawing/2015/9/8/chartex" xmlns:cx2="http://schemas.microsoft.com/office/drawing/2015/10/21/chartex" xmlns:cx3="http://schemas.microsoft.com/office/drawing/2016/5/9/chartex" xmlns:cx4="http://schemas.microsoft.com/office/drawing/2016/5/10/chartex" xmlns:cx5="http://schemas.microsoft.com/office/drawing/2016/5/11/chartex" xmlns:cx6="http://schemas.microsoft.com/office/drawing/2016/5/12/chartex" xmlns:cx7="http://schemas.microsoft.com/office/drawing/2016/5/13/chartex" xmlns:cx8="http://schemas.microsoft.com/office/drawing/2016/5/14/chartex" xmlns:mc="http://schemas.openxmlformats.org/markup-compatibility/2006" xmlns:aink="http://schemas.microsoft.com/office/drawing/2016/ink" xmlns:am3d="http://schemas.microsoft.com/office/drawing/2017/model3d" xmlns:o="urn:schemas-microsoft-com:office:office" xmlns:oel="http://schemas.microsoft.com/office/2019/extlst" xmlns:r="http://schemas.openxmlformats.org/officeDocument/2006/relationships" xmlns:m="http://schemas.openxmlformats.org/officeDocument/2006/math" xmlns:v="urn:schemas-microsoft-com:vml" xmlns:wp14="http://schemas.microsoft.com/office/word/2010/wordprocessingDrawing" xmlns:wp="http://schemas.openxmlformats.org/drawingml/2006/wordprocessingDrawing" xmlns:w10="urn:schemas-microsoft-com:office:word" xmlns:w="http://schemas.openxmlformats.org/wordprocessingml/2006/main" xmlns:w14="http://schemas.microsoft.com/office/word/2010/wordml" xmlns:w15="http://schemas.microsoft.com/office/word/2012/wordml" xmlns:w16cex="http://schemas.microsoft.com/office/word/2018/wordml/cex" xmlns:w16cid="http://schemas.microsoft.com/office/word/2016/wordml/cid" xmlns:w16="http://schemas.microsoft.com/office/word/2018/wordml" xmlns:w16du="http://schemas.microsoft.com/office/word/2023/wordml/word16du" xmlns:w16sdtdh="http://schemas.microsoft.com/office/word/2020/wordml/sdtdatahash" xmlns:w16sdtfl="http://schemas.microsoft.com/office/word/2024/wordml/sdtformatlock" xmlns:w16se="http://schemas.microsoft.com/office/word/2015/wordml/symex" xmlns:wpg="http://schemas.microsoft.com/office/word/2010/wordprocessingGroup" xmlns:wpi="http://schemas.microsoft.com/office/word/2010/wordprocessingInk" xmlns:wne="http://schemas.microsoft.com/office/word/2006/wordml" xmlns:wps="http://schemas.microsoft.com/office/word/2010/wordprocessingShape" mc:Ignorable="w14 w15 w16se w16cid w16 w16cex w16sdtdh w16sdtfl w16du wp14">
   <w:abstractNum w:abstractNumId="0" w15:restartNumberingAfterBreak="0">
-    <w:nsid w:val="0B347789"/>
+    <w:nsid w:val="1F8B3E45"/>
     <w:multiLevelType w:val="hybridMultilevel"/>
-    <w:tmpl w:val="0854D34C"/>
-    <w:lvl w:ilvl="0" w:tplc="AE3A7696">
+    <w:tmpl w:val="EE528136"/>
+    <w:lvl w:ilvl="0" w:tplc="6AEEB870" w:tentative="1">
+      <w:start w:val="1"/>
+      <w:numFmt w:val="bullet"/>
+      <w:lvlText w:val="●"/>
+      <w:lvlJc w:val="left"/>
+      <w:pPr>
+        <w:ind w:left="720" w:hanging="360"/>
+      </w:pPr>
+    </w:lvl>
+    <w:lvl w:ilvl="1" w:tplc="34CE1DF2" w:tentative="1">
+      <w:start w:val="1"/>
+      <w:numFmt w:val="bullet"/>
+      <w:lvlText w:val="○"/>
+      <w:lvlJc w:val="left"/>
+      <w:pPr>
+        <w:ind w:left="1440" w:hanging="360"/>
+      </w:pPr>
+    </w:lvl>
+    <w:lvl w:ilvl="2" w:tplc="21E83128" w:tentative="1">
+      <w:start w:val="1"/>
+      <w:numFmt w:val="bullet"/>
+      <w:lvlText w:val="■"/>
+      <w:lvlJc w:val="left"/>
+      <w:pPr>
+        <w:ind w:left="2160" w:hanging="360"/>
+      </w:pPr>
+    </w:lvl>
+    <w:lvl w:ilvl="3" w:tplc="3976ACE2" w:tentative="1">
+      <w:start w:val="1"/>
+      <w:numFmt w:val="bullet"/>
+      <w:lvlText w:val="●"/>
+      <w:lvlJc w:val="left"/>
+      <w:pPr>
+        <w:ind w:left="2880" w:hanging="360"/>
+      </w:pPr>
+    </w:lvl>
+    <w:lvl w:ilvl="4" w:tplc="DAFA5F1E" w:tentative="1">
+      <w:start w:val="1"/>
+      <w:numFmt w:val="bullet"/>
+      <w:lvlText w:val="○"/>
+      <w:lvlJc w:val="left"/>
+      <w:pPr>
+        <w:ind w:left="3600" w:hanging="360"/>
+      </w:pPr>
+    </w:lvl>
+    <w:lvl w:ilvl="5" w:tplc="6FD6CACE" w:tentative="1">
+      <w:start w:val="1"/>
+      <w:numFmt w:val="bullet"/>
+      <w:lvlText w:val="■"/>
+      <w:lvlJc w:val="left"/>
+      <w:pPr>
+        <w:ind w:left="4320" w:hanging="360"/>
+      </w:pPr>
+    </w:lvl>
+    <w:lvl w:ilvl="6" w:tplc="B7CA3B0C" w:tentative="1">
+      <w:start w:val="1"/>
+      <w:numFmt w:val="bullet"/>
+      <w:lvlText w:val="●"/>
+      <w:lvlJc w:val="left"/>
+      <w:pPr>
+        <w:ind w:left="5040" w:hanging="360"/>
+      </w:pPr>
+    </w:lvl>
+    <w:lvl w:ilvl="7" w:tplc="8B083AAE" w:tentative="1">
+      <w:start w:val="1"/>
+      <w:numFmt w:val="bullet"/>
+      <w:lvlText w:val="●"/>
+      <w:lvlJc w:val="left"/>
+      <w:pPr>
+        <w:ind w:left="5760" w:hanging="360"/>
+      </w:pPr>
+    </w:lvl>
+    <w:lvl w:ilvl="8" w:tplc="AD6CAA5E" w:tentative="1">
+      <w:start w:val="1"/>
+      <w:numFmt w:val="bullet"/>
+      <w:lvlText w:val="●"/>
+      <w:lvlJc w:val="left"/>
+      <w:pPr>
+        <w:ind w:left="6480" w:hanging="360"/>
+      </w:pPr>
+    </w:lvl>
+  </w:abstractNum>
+  <w:abstractNum w:abstractNumId="1" w15:restartNumberingAfterBreak="0">
+    <w:nsid w:val="5E8B4E5A"/>
+    <w:multiLevelType w:val="hybridMultilevel"/>
+    <w:tmpl w:val="4D2C0AB8"/>
+    <w:lvl w:ilvl="0" w:tplc="B8505294">
       <w:start w:val="1"/>
       <w:numFmt w:val="bullet"/>
       <w:lvlText w:val="•"/>
@@ -46187,7 +46466,7 @@
         <w:ind w:left="720" w:hanging="280"/>
       </w:pPr>
     </w:lvl>
-    <w:lvl w:ilvl="1" w:tplc="EC7E328C" w:tentative="1">
+    <w:lvl w:ilvl="1" w:tplc="823A78C6" w:tentative="1">
       <w:start w:val="1"/>
       <w:numFmt w:val="bullet"/>
       <w:lvlText w:val="–"/>
@@ -46196,7 +46475,7 @@
         <w:ind w:left="1080" w:hanging="280"/>
       </w:pPr>
     </w:lvl>
-    <w:lvl w:ilvl="2" w:tplc="B0E862B4" w:tentative="1">
+    <w:lvl w:ilvl="2" w:tplc="B13E303A" w:tentative="1">
       <w:start w:val="1"/>
       <w:numFmt w:val="bullet"/>
       <w:lvlText w:val="▪"/>
@@ -46205,199 +46484,113 @@
         <w:ind w:left="1440" w:hanging="280"/>
       </w:pPr>
     </w:lvl>
-    <w:lvl w:ilvl="3" w:tplc="27FA2920">
+    <w:lvl w:ilvl="3" w:tplc="9D0A3222">
       <w:numFmt w:val="decimal"/>
       <w:lvlText w:val=""/>
       <w:lvlJc w:val="left"/>
     </w:lvl>
-    <w:lvl w:ilvl="4" w:tplc="017C461C">
+    <w:lvl w:ilvl="4" w:tplc="90ACB74E">
       <w:numFmt w:val="decimal"/>
       <w:lvlText w:val=""/>
       <w:lvlJc w:val="left"/>
     </w:lvl>
-    <w:lvl w:ilvl="5" w:tplc="1BB0B08C">
+    <w:lvl w:ilvl="5" w:tplc="C1740A28">
       <w:numFmt w:val="decimal"/>
       <w:lvlText w:val=""/>
       <w:lvlJc w:val="left"/>
     </w:lvl>
-    <w:lvl w:ilvl="6" w:tplc="59CA0C1C">
+    <w:lvl w:ilvl="6" w:tplc="044C2050">
       <w:numFmt w:val="decimal"/>
       <w:lvlText w:val=""/>
       <w:lvlJc w:val="left"/>
     </w:lvl>
-    <w:lvl w:ilvl="7" w:tplc="E65A87C0">
+    <w:lvl w:ilvl="7" w:tplc="166C9D40">
       <w:numFmt w:val="decimal"/>
       <w:lvlText w:val=""/>
       <w:lvlJc w:val="left"/>
     </w:lvl>
-    <w:lvl w:ilvl="8" w:tplc="64D6CC88">
-      <w:numFmt w:val="decimal"/>
-      <w:lvlText w:val=""/>
-      <w:lvlJc w:val="left"/>
-    </w:lvl>
-  </w:abstractNum>
-  <w:abstractNum w:abstractNumId="1" w15:restartNumberingAfterBreak="0">
-    <w:nsid w:val="13CF2291"/>
-    <w:multiLevelType w:val="hybridMultilevel"/>
-    <w:tmpl w:val="BD6A1710"/>
-    <w:lvl w:ilvl="0" w:tplc="0B9E05D0" w:tentative="1">
-      <w:start w:val="1"/>
-      <w:numFmt w:val="decimal"/>
-      <w:lvlText w:val="%1."/>
-      <w:lvlJc w:val="left"/>
-      <w:pPr>
-        <w:ind w:left="720" w:hanging="360"/>
-      </w:pPr>
-    </w:lvl>
-    <w:lvl w:ilvl="1" w:tplc="707CB2A2" w:tentative="1">
-      <w:start w:val="1"/>
-      <w:numFmt w:val="lowerLetter"/>
-      <w:lvlText w:val="%2."/>
-      <w:lvlJc w:val="left"/>
-      <w:pPr>
-        <w:ind w:left="1080" w:hanging="360"/>
-      </w:pPr>
-    </w:lvl>
-    <w:lvl w:ilvl="2" w:tplc="82243F40" w:tentative="1">
-      <w:start w:val="1"/>
-      <w:numFmt w:val="lowerRoman"/>
-      <w:lvlText w:val="%3."/>
-      <w:lvlJc w:val="left"/>
-      <w:pPr>
-        <w:ind w:left="1440" w:hanging="360"/>
-      </w:pPr>
-    </w:lvl>
-    <w:lvl w:ilvl="3" w:tplc="CFC0B0BA">
-      <w:numFmt w:val="decimal"/>
-      <w:lvlText w:val=""/>
-      <w:lvlJc w:val="left"/>
-    </w:lvl>
-    <w:lvl w:ilvl="4" w:tplc="857A28EC">
-      <w:numFmt w:val="decimal"/>
-      <w:lvlText w:val=""/>
-      <w:lvlJc w:val="left"/>
-    </w:lvl>
-    <w:lvl w:ilvl="5" w:tplc="456CB3B4">
-      <w:numFmt w:val="decimal"/>
-      <w:lvlText w:val=""/>
-      <w:lvlJc w:val="left"/>
-    </w:lvl>
-    <w:lvl w:ilvl="6" w:tplc="83EA2EE2">
-      <w:numFmt w:val="decimal"/>
-      <w:lvlText w:val=""/>
-      <w:lvlJc w:val="left"/>
-    </w:lvl>
-    <w:lvl w:ilvl="7" w:tplc="24E4CBC8">
-      <w:numFmt w:val="decimal"/>
-      <w:lvlText w:val=""/>
-      <w:lvlJc w:val="left"/>
-    </w:lvl>
-    <w:lvl w:ilvl="8" w:tplc="3EBAB0E0">
+    <w:lvl w:ilvl="8" w:tplc="30F8EE92">
       <w:numFmt w:val="decimal"/>
       <w:lvlText w:val=""/>
       <w:lvlJc w:val="left"/>
     </w:lvl>
   </w:abstractNum>
   <w:abstractNum w:abstractNumId="2" w15:restartNumberingAfterBreak="0">
-    <w:nsid w:val="270B14A9"/>
+    <w:nsid w:val="696D478D"/>
     <w:multiLevelType w:val="hybridMultilevel"/>
-    <w:tmpl w:val="16FC0818"/>
-    <w:lvl w:ilvl="0" w:tplc="E77E8332" w:tentative="1">
+    <w:tmpl w:val="85743D76"/>
+    <w:lvl w:ilvl="0" w:tplc="3012AE44" w:tentative="1">
       <w:start w:val="1"/>
-      <w:numFmt w:val="bullet"/>
-      <w:lvlText w:val="●"/>
+      <w:numFmt w:val="decimal"/>
+      <w:lvlText w:val="%1."/>
       <w:lvlJc w:val="left"/>
       <w:pPr>
         <w:ind w:left="720" w:hanging="360"/>
       </w:pPr>
     </w:lvl>
-    <w:lvl w:ilvl="1" w:tplc="AD1A4634" w:tentative="1">
+    <w:lvl w:ilvl="1" w:tplc="DD663B50" w:tentative="1">
       <w:start w:val="1"/>
-      <w:numFmt w:val="bullet"/>
-      <w:lvlText w:val="○"/>
+      <w:numFmt w:val="lowerLetter"/>
+      <w:lvlText w:val="%2."/>
       <w:lvlJc w:val="left"/>
       <w:pPr>
+        <w:ind w:left="1080" w:hanging="360"/>
+      </w:pPr>
+    </w:lvl>
+    <w:lvl w:ilvl="2" w:tplc="BE66C310" w:tentative="1">
+      <w:start w:val="1"/>
+      <w:numFmt w:val="lowerRoman"/>
+      <w:lvlText w:val="%3."/>
+      <w:lvlJc w:val="left"/>
+      <w:pPr>
         <w:ind w:left="1440" w:hanging="360"/>
       </w:pPr>
     </w:lvl>
-    <w:lvl w:ilvl="2" w:tplc="C62E62D4" w:tentative="1">
-      <w:start w:val="1"/>
-      <w:numFmt w:val="bullet"/>
-      <w:lvlText w:val="■"/>
+    <w:lvl w:ilvl="3" w:tplc="BD90D4F6">
+      <w:numFmt w:val="decimal"/>
+      <w:lvlText w:val=""/>
       <w:lvlJc w:val="left"/>
-      <w:pPr>
-        <w:ind w:left="2160" w:hanging="360"/>
-      </w:pPr>
     </w:lvl>
-    <w:lvl w:ilvl="3" w:tplc="F37A5ACA" w:tentative="1">
-      <w:start w:val="1"/>
-      <w:numFmt w:val="bullet"/>
-      <w:lvlText w:val="●"/>
+    <w:lvl w:ilvl="4" w:tplc="A044B75C">
+      <w:numFmt w:val="decimal"/>
+      <w:lvlText w:val=""/>
       <w:lvlJc w:val="left"/>
-      <w:pPr>
-        <w:ind w:left="2880" w:hanging="360"/>
-      </w:pPr>
     </w:lvl>
-    <w:lvl w:ilvl="4" w:tplc="881AEE98" w:tentative="1">
-      <w:start w:val="1"/>
-      <w:numFmt w:val="bullet"/>
-      <w:lvlText w:val="○"/>
+    <w:lvl w:ilvl="5" w:tplc="E182FD08">
+      <w:numFmt w:val="decimal"/>
+      <w:lvlText w:val=""/>
       <w:lvlJc w:val="left"/>
-      <w:pPr>
-        <w:ind w:left="3600" w:hanging="360"/>
-      </w:pPr>
     </w:lvl>
-    <w:lvl w:ilvl="5" w:tplc="DD92C0C8" w:tentative="1">
-      <w:start w:val="1"/>
-      <w:numFmt w:val="bullet"/>
-      <w:lvlText w:val="■"/>
+    <w:lvl w:ilvl="6" w:tplc="A50AFA50">
+      <w:numFmt w:val="decimal"/>
+      <w:lvlText w:val=""/>
       <w:lvlJc w:val="left"/>
-      <w:pPr>
-        <w:ind w:left="4320" w:hanging="360"/>
-      </w:pPr>
     </w:lvl>
-    <w:lvl w:ilvl="6" w:tplc="6D8E391C" w:tentative="1">
-      <w:start w:val="1"/>
-      <w:numFmt w:val="bullet"/>
-      <w:lvlText w:val="●"/>
+    <w:lvl w:ilvl="7" w:tplc="6D189414">
+      <w:numFmt w:val="decimal"/>
+      <w:lvlText w:val=""/>
       <w:lvlJc w:val="left"/>
-      <w:pPr>
-        <w:ind w:left="5040" w:hanging="360"/>
-      </w:pPr>
     </w:lvl>
-    <w:lvl w:ilvl="7" w:tplc="51C8EDEE" w:tentative="1">
-      <w:start w:val="1"/>
-      <w:numFmt w:val="bullet"/>
-      <w:lvlText w:val="●"/>
+    <w:lvl w:ilvl="8" w:tplc="5F2CA256">
+      <w:numFmt w:val="decimal"/>
+      <w:lvlText w:val=""/>
       <w:lvlJc w:val="left"/>
-      <w:pPr>
-        <w:ind w:left="5760" w:hanging="360"/>
-      </w:pPr>
-    </w:lvl>
-    <w:lvl w:ilvl="8" w:tplc="8776651C" w:tentative="1">
-      <w:start w:val="1"/>
-      <w:numFmt w:val="bullet"/>
-      <w:lvlText w:val="●"/>
-      <w:lvlJc w:val="left"/>
-      <w:pPr>
-        <w:ind w:left="6480" w:hanging="360"/>
-      </w:pPr>
     </w:lvl>
   </w:abstractNum>
-  <w:num w:numId="1" w16cid:durableId="266010720">
-    <w:abstractNumId w:val="2"/>
-    <w:lvlOverride w:ilvl="0">
-      <w:startOverride w:val="1"/>
-    </w:lvlOverride>
-  </w:num>
-  <w:num w:numId="2" w16cid:durableId="1020666790">
+  <w:num w:numId="1" w16cid:durableId="1601061489">
     <w:abstractNumId w:val="0"/>
     <w:lvlOverride w:ilvl="0">
       <w:startOverride w:val="1"/>
     </w:lvlOverride>
   </w:num>
-  <w:num w:numId="3" w16cid:durableId="528418721">
-    <w:abstractNumId w:val="0"/>
+  <w:num w:numId="2" w16cid:durableId="1876964285">
+    <w:abstractNumId w:val="1"/>
+    <w:lvlOverride w:ilvl="0">
+      <w:startOverride w:val="1"/>
+    </w:lvlOverride>
+  </w:num>
+  <w:num w:numId="3" w16cid:durableId="1718165558">
+    <w:abstractNumId w:val="1"/>
     <w:lvlOverride w:ilvl="0">
       <w:startOverride w:val="1"/>
     </w:lvlOverride>
@@ -47101,7 +47294,7 @@
     <w:autoRedefine/>
     <w:uiPriority w:val="39"/>
     <w:unhideWhenUsed/>
-    <w:rsid w:val="00FD05BD"/>
+    <w:rsid w:val="00353CBA"/>
     <w:pPr>
       <w:spacing w:after="100"/>
     </w:pPr>
@@ -47113,7 +47306,7 @@
     <w:autoRedefine/>
     <w:uiPriority w:val="39"/>
     <w:unhideWhenUsed/>
-    <w:rsid w:val="00FD05BD"/>
+    <w:rsid w:val="00353CBA"/>
     <w:pPr>
       <w:spacing w:after="100"/>
       <w:ind w:left="210"/>
@@ -47125,7 +47318,7 @@
     <w:next w:val="Normal"/>
     <w:uiPriority w:val="99"/>
     <w:unhideWhenUsed/>
-    <w:rsid w:val="00FD05BD"/>
+    <w:rsid w:val="00353CBA"/>
   </w:style>
 </w:styles>
 </file>

</xml_diff>

<commit_message>
Real costs with what they cover (Praveen: "With real costs for each")
- 51 of 102 routes now show a published cost, every number spot-checked on the official page: SLIIT
  Rs 345,000-460,000 a semester; NSBM Rs 2.8M-3.2M total; Horizon (past intakes); Lyceum; SLIIT-LJMU per
  semester; NIBM-Coventry per year; CA Rs 6,100 and AAT Rs 4,000-4,500 to register; IBSL. ACCA in GBP (notes).
- cost_basis (TOTAL, PER_SEMESTER, PER_YEAR, PER_SUBJECT, TO_REGISTER): shown with every amount on the page,
  in the list and in Ask's corpus (en/si/ta), so a semester fee never reads as a degree's cost.
- ICBT's hidden placeholder prices are not used. TC-145 (4); 564 passed. ZP-DOC-05/07/08, ROUTES_REPORT, README.

Co-Authored-By: Claude Opus 5.5 (1M context) <noreply@anthropic.com>
</commit_message>
<xml_diff>
--- a/docs/05-data-design/ZP-DOC-05_Data-Design.docx
+++ b/docs/05-data-design/ZP-DOC-05_Data-Design.docx
@@ -90,7 +90,7 @@
           <w:left w:w="10" w:type="dxa"/>
           <w:right w:w="10" w:type="dxa"/>
         </w:tblCellMar>
-        <w:tblLook w:val="04A0" w:firstRow="1" w:lastRow="0" w:firstColumn="1" w:lastColumn="0" w:noHBand="0" w:noVBand="1"/>
+        <w:tblLook w:val="0000" w:firstRow="0" w:lastRow="0" w:firstColumn="0" w:lastColumn="0" w:noHBand="0" w:noVBand="0"/>
       </w:tblPr>
       <w:tblGrid>
         <w:gridCol w:w="2600"/>
@@ -494,7 +494,7 @@
           <w:left w:w="10" w:type="dxa"/>
           <w:right w:w="10" w:type="dxa"/>
         </w:tblCellMar>
-        <w:tblLook w:val="04A0" w:firstRow="1" w:lastRow="0" w:firstColumn="1" w:lastColumn="0" w:noHBand="0" w:noVBand="1"/>
+        <w:tblLook w:val="0000" w:firstRow="0" w:lastRow="0" w:firstColumn="0" w:lastColumn="0" w:noHBand="0" w:noVBand="0"/>
       </w:tblPr>
       <w:tblGrid>
         <w:gridCol w:w="2600"/>
@@ -1189,7 +1189,7 @@
           <w:left w:w="10" w:type="dxa"/>
           <w:right w:w="10" w:type="dxa"/>
         </w:tblCellMar>
-        <w:tblLook w:val="04A0" w:firstRow="1" w:lastRow="0" w:firstColumn="1" w:lastColumn="0" w:noHBand="0" w:noVBand="1"/>
+        <w:tblLook w:val="0000" w:firstRow="0" w:lastRow="0" w:firstColumn="0" w:lastColumn="0" w:noHBand="0" w:noVBand="0"/>
       </w:tblPr>
       <w:tblGrid>
         <w:gridCol w:w="964"/>
@@ -2600,6 +2600,122 @@
                 <w:sz w:val="19"/>
                 <w:szCs w:val="19"/>
               </w:rPr>
+              <w:t>Route catalogue: `cost_basis` (what a published fee covers); no D1 change</w:t>
+            </w:r>
+          </w:p>
+        </w:tc>
+      </w:tr>
+      <w:tr>
+        <w:tblPrEx>
+          <w:tblCellMar>
+            <w:top w:w="0" w:type="dxa"/>
+            <w:bottom w:w="0" w:type="dxa"/>
+          </w:tblCellMar>
+        </w:tblPrEx>
+        <w:trPr>
+          <w:cantSplit/>
+          <w:trHeight w:val="420"/>
+        </w:trPr>
+        <w:tc>
+          <w:tcPr>
+            <w:tcW w:w="964" w:type="dxa"/>
+            <w:tcBorders>
+              <w:top w:val="single" w:sz="4" w:space="0" w:color="C9D3D0"/>
+              <w:left w:val="single" w:sz="4" w:space="0" w:color="C9D3D0"/>
+              <w:bottom w:val="single" w:sz="4" w:space="0" w:color="C9D3D0"/>
+              <w:right w:val="single" w:sz="4" w:space="0" w:color="C9D3D0"/>
+            </w:tcBorders>
+            <w:tcMar>
+              <w:top w:w="50" w:type="dxa"/>
+              <w:left w:w="100" w:type="dxa"/>
+              <w:bottom w:w="50" w:type="dxa"/>
+              <w:right w:w="100" w:type="dxa"/>
+            </w:tcMar>
+          </w:tcPr>
+          <w:p>
+            <w:r>
+              <w:rPr>
+                <w:sz w:val="19"/>
+                <w:szCs w:val="19"/>
+              </w:rPr>
+              <w:t>0.9</w:t>
+            </w:r>
+          </w:p>
+        </w:tc>
+        <w:tc>
+          <w:tcPr>
+            <w:tcW w:w="1542" w:type="dxa"/>
+            <w:tcBorders>
+              <w:top w:val="single" w:sz="4" w:space="0" w:color="C9D3D0"/>
+              <w:left w:val="single" w:sz="4" w:space="0" w:color="C9D3D0"/>
+              <w:bottom w:val="single" w:sz="4" w:space="0" w:color="C9D3D0"/>
+              <w:right w:val="single" w:sz="4" w:space="0" w:color="C9D3D0"/>
+            </w:tcBorders>
+            <w:tcMar>
+              <w:top w:w="50" w:type="dxa"/>
+              <w:left w:w="100" w:type="dxa"/>
+              <w:bottom w:w="50" w:type="dxa"/>
+              <w:right w:w="100" w:type="dxa"/>
+            </w:tcMar>
+          </w:tcPr>
+          <w:p>
+            <w:r>
+              <w:rPr>
+                <w:sz w:val="19"/>
+                <w:szCs w:val="19"/>
+              </w:rPr>
+              <w:t>23 Oct 2026</w:t>
+            </w:r>
+          </w:p>
+        </w:tc>
+        <w:tc>
+          <w:tcPr>
+            <w:tcW w:w="1928" w:type="dxa"/>
+            <w:tcBorders>
+              <w:top w:val="single" w:sz="4" w:space="0" w:color="C9D3D0"/>
+              <w:left w:val="single" w:sz="4" w:space="0" w:color="C9D3D0"/>
+              <w:bottom w:val="single" w:sz="4" w:space="0" w:color="C9D3D0"/>
+              <w:right w:val="single" w:sz="4" w:space="0" w:color="C9D3D0"/>
+            </w:tcBorders>
+            <w:tcMar>
+              <w:top w:w="50" w:type="dxa"/>
+              <w:left w:w="100" w:type="dxa"/>
+              <w:bottom w:w="50" w:type="dxa"/>
+              <w:right w:w="100" w:type="dxa"/>
+            </w:tcMar>
+          </w:tcPr>
+          <w:p>
+            <w:r>
+              <w:rPr>
+                <w:sz w:val="19"/>
+                <w:szCs w:val="19"/>
+              </w:rPr>
+              <w:t>Team Kestrel</w:t>
+            </w:r>
+          </w:p>
+        </w:tc>
+        <w:tc>
+          <w:tcPr>
+            <w:tcW w:w="5204" w:type="dxa"/>
+            <w:tcBorders>
+              <w:top w:val="single" w:sz="4" w:space="0" w:color="C9D3D0"/>
+              <w:left w:val="single" w:sz="4" w:space="0" w:color="C9D3D0"/>
+              <w:bottom w:val="single" w:sz="4" w:space="0" w:color="C9D3D0"/>
+              <w:right w:val="single" w:sz="4" w:space="0" w:color="C9D3D0"/>
+            </w:tcBorders>
+            <w:tcMar>
+              <w:top w:w="50" w:type="dxa"/>
+              <w:left w:w="100" w:type="dxa"/>
+              <w:bottom w:w="50" w:type="dxa"/>
+              <w:right w:w="100" w:type="dxa"/>
+            </w:tcMar>
+          </w:tcPr>
+          <w:p>
+            <w:r>
+              <w:rPr>
+                <w:sz w:val="19"/>
+                <w:szCs w:val="19"/>
+              </w:rPr>
               <w:t>Route catalogue 23 Oct: 102 routes; optional `programmes`; `entry_requirements_text` and `source_url` may be null (rules below); no D1 change</w:t>
             </w:r>
           </w:p>
@@ -2763,7 +2879,7 @@
           <w:left w:w="10" w:type="dxa"/>
           <w:right w:w="10" w:type="dxa"/>
         </w:tblCellMar>
-        <w:tblLook w:val="04A0" w:firstRow="1" w:lastRow="0" w:firstColumn="1" w:lastColumn="0" w:noHBand="0" w:noVBand="1"/>
+        <w:tblLook w:val="0000" w:firstRow="0" w:lastRow="0" w:firstColumn="0" w:lastColumn="0" w:noHBand="0" w:noVBand="0"/>
       </w:tblPr>
       <w:tblGrid>
         <w:gridCol w:w="2120"/>
@@ -3120,7 +3236,7 @@
     <w:sdt>
       <w:sdtPr>
         <w:alias w:val="Contents"/>
-        <w:id w:val="-749267567"/>
+        <w:id w:val="-140115118"/>
       </w:sdtPr>
       <w:sdtEndPr/>
       <w:sdtContent>
@@ -3149,7 +3265,7 @@
           <w:r>
             <w:fldChar w:fldCharType="separate"/>
           </w:r>
-          <w:hyperlink w:anchor="_Toc243660076" w:history="1">
+          <w:hyperlink w:anchor="_Toc243662342" w:history="1">
             <w:r>
               <w:rPr>
                 <w:rStyle w:val="Hyperlink"/>
@@ -3173,7 +3289,7 @@
               <w:rPr>
                 <w:noProof/>
               </w:rPr>
-              <w:instrText xml:space="preserve"> PAGEREF _Toc243660076 \h </w:instrText>
+              <w:instrText xml:space="preserve"> PAGEREF _Toc243662342 \h </w:instrText>
             </w:r>
             <w:r>
               <w:rPr>
@@ -3216,7 +3332,7 @@
               <w14:ligatures w14:val="standardContextual"/>
             </w:rPr>
           </w:pPr>
-          <w:hyperlink w:anchor="_Toc243660077" w:history="1">
+          <w:hyperlink w:anchor="_Toc243662343" w:history="1">
             <w:r>
               <w:rPr>
                 <w:rStyle w:val="Hyperlink"/>
@@ -3240,7 +3356,7 @@
               <w:rPr>
                 <w:noProof/>
               </w:rPr>
-              <w:instrText xml:space="preserve"> PAGEREF _Toc243660077 \h </w:instrText>
+              <w:instrText xml:space="preserve"> PAGEREF _Toc243662343 \h </w:instrText>
             </w:r>
             <w:r>
               <w:rPr>
@@ -3283,7 +3399,7 @@
               <w14:ligatures w14:val="standardContextual"/>
             </w:rPr>
           </w:pPr>
-          <w:hyperlink w:anchor="_Toc243660078" w:history="1">
+          <w:hyperlink w:anchor="_Toc243662344" w:history="1">
             <w:r>
               <w:rPr>
                 <w:rStyle w:val="Hyperlink"/>
@@ -3307,7 +3423,7 @@
               <w:rPr>
                 <w:noProof/>
               </w:rPr>
-              <w:instrText xml:space="preserve"> PAGEREF _Toc243660078 \h </w:instrText>
+              <w:instrText xml:space="preserve"> PAGEREF _Toc243662344 \h </w:instrText>
             </w:r>
             <w:r>
               <w:rPr>
@@ -3350,7 +3466,7 @@
               <w14:ligatures w14:val="standardContextual"/>
             </w:rPr>
           </w:pPr>
-          <w:hyperlink w:anchor="_Toc243660079" w:history="1">
+          <w:hyperlink w:anchor="_Toc243662345" w:history="1">
             <w:r>
               <w:rPr>
                 <w:rStyle w:val="Hyperlink"/>
@@ -3374,7 +3490,7 @@
               <w:rPr>
                 <w:noProof/>
               </w:rPr>
-              <w:instrText xml:space="preserve"> PAGEREF _Toc243660079 \h </w:instrText>
+              <w:instrText xml:space="preserve"> PAGEREF _Toc243662345 \h </w:instrText>
             </w:r>
             <w:r>
               <w:rPr>
@@ -3417,7 +3533,7 @@
               <w14:ligatures w14:val="standardContextual"/>
             </w:rPr>
           </w:pPr>
-          <w:hyperlink w:anchor="_Toc243660080" w:history="1">
+          <w:hyperlink w:anchor="_Toc243662346" w:history="1">
             <w:r>
               <w:rPr>
                 <w:rStyle w:val="Hyperlink"/>
@@ -3441,7 +3557,7 @@
               <w:rPr>
                 <w:noProof/>
               </w:rPr>
-              <w:instrText xml:space="preserve"> PAGEREF _Toc243660080 \h </w:instrText>
+              <w:instrText xml:space="preserve"> PAGEREF _Toc243662346 \h </w:instrText>
             </w:r>
             <w:r>
               <w:rPr>
@@ -3484,7 +3600,7 @@
               <w14:ligatures w14:val="standardContextual"/>
             </w:rPr>
           </w:pPr>
-          <w:hyperlink w:anchor="_Toc243660081" w:history="1">
+          <w:hyperlink w:anchor="_Toc243662347" w:history="1">
             <w:r>
               <w:rPr>
                 <w:rStyle w:val="Hyperlink"/>
@@ -3508,7 +3624,7 @@
               <w:rPr>
                 <w:noProof/>
               </w:rPr>
-              <w:instrText xml:space="preserve"> PAGEREF _Toc243660081 \h </w:instrText>
+              <w:instrText xml:space="preserve"> PAGEREF _Toc243662347 \h </w:instrText>
             </w:r>
             <w:r>
               <w:rPr>
@@ -3551,7 +3667,7 @@
               <w14:ligatures w14:val="standardContextual"/>
             </w:rPr>
           </w:pPr>
-          <w:hyperlink w:anchor="_Toc243660082" w:history="1">
+          <w:hyperlink w:anchor="_Toc243662348" w:history="1">
             <w:r>
               <w:rPr>
                 <w:rStyle w:val="Hyperlink"/>
@@ -3575,7 +3691,7 @@
               <w:rPr>
                 <w:noProof/>
               </w:rPr>
-              <w:instrText xml:space="preserve"> PAGEREF _Toc243660082 \h </w:instrText>
+              <w:instrText xml:space="preserve"> PAGEREF _Toc243662348 \h </w:instrText>
             </w:r>
             <w:r>
               <w:rPr>
@@ -3618,7 +3734,7 @@
               <w14:ligatures w14:val="standardContextual"/>
             </w:rPr>
           </w:pPr>
-          <w:hyperlink w:anchor="_Toc243660083" w:history="1">
+          <w:hyperlink w:anchor="_Toc243662349" w:history="1">
             <w:r>
               <w:rPr>
                 <w:rStyle w:val="Hyperlink"/>
@@ -3642,7 +3758,7 @@
               <w:rPr>
                 <w:noProof/>
               </w:rPr>
-              <w:instrText xml:space="preserve"> PAGEREF _Toc243660083 \h </w:instrText>
+              <w:instrText xml:space="preserve"> PAGEREF _Toc243662349 \h </w:instrText>
             </w:r>
             <w:r>
               <w:rPr>
@@ -3685,7 +3801,7 @@
               <w14:ligatures w14:val="standardContextual"/>
             </w:rPr>
           </w:pPr>
-          <w:hyperlink w:anchor="_Toc243660084" w:history="1">
+          <w:hyperlink w:anchor="_Toc243662350" w:history="1">
             <w:r>
               <w:rPr>
                 <w:rStyle w:val="Hyperlink"/>
@@ -3709,7 +3825,7 @@
               <w:rPr>
                 <w:noProof/>
               </w:rPr>
-              <w:instrText xml:space="preserve"> PAGEREF _Toc243660084 \h </w:instrText>
+              <w:instrText xml:space="preserve"> PAGEREF _Toc243662350 \h </w:instrText>
             </w:r>
             <w:r>
               <w:rPr>
@@ -3752,7 +3868,7 @@
               <w14:ligatures w14:val="standardContextual"/>
             </w:rPr>
           </w:pPr>
-          <w:hyperlink w:anchor="_Toc243660085" w:history="1">
+          <w:hyperlink w:anchor="_Toc243662351" w:history="1">
             <w:r>
               <w:rPr>
                 <w:rStyle w:val="Hyperlink"/>
@@ -3776,7 +3892,7 @@
               <w:rPr>
                 <w:noProof/>
               </w:rPr>
-              <w:instrText xml:space="preserve"> PAGEREF _Toc243660085 \h </w:instrText>
+              <w:instrText xml:space="preserve"> PAGEREF _Toc243662351 \h </w:instrText>
             </w:r>
             <w:r>
               <w:rPr>
@@ -3819,7 +3935,7 @@
               <w14:ligatures w14:val="standardContextual"/>
             </w:rPr>
           </w:pPr>
-          <w:hyperlink w:anchor="_Toc243660086" w:history="1">
+          <w:hyperlink w:anchor="_Toc243662352" w:history="1">
             <w:r>
               <w:rPr>
                 <w:rStyle w:val="Hyperlink"/>
@@ -3843,7 +3959,7 @@
               <w:rPr>
                 <w:noProof/>
               </w:rPr>
-              <w:instrText xml:space="preserve"> PAGEREF _Toc243660086 \h </w:instrText>
+              <w:instrText xml:space="preserve"> PAGEREF _Toc243662352 \h </w:instrText>
             </w:r>
             <w:r>
               <w:rPr>
@@ -3886,7 +4002,7 @@
               <w14:ligatures w14:val="standardContextual"/>
             </w:rPr>
           </w:pPr>
-          <w:hyperlink w:anchor="_Toc243660087" w:history="1">
+          <w:hyperlink w:anchor="_Toc243662353" w:history="1">
             <w:r>
               <w:rPr>
                 <w:rStyle w:val="Hyperlink"/>
@@ -3910,7 +4026,7 @@
               <w:rPr>
                 <w:noProof/>
               </w:rPr>
-              <w:instrText xml:space="preserve"> PAGEREF _Toc243660087 \h </w:instrText>
+              <w:instrText xml:space="preserve"> PAGEREF _Toc243662353 \h </w:instrText>
             </w:r>
             <w:r>
               <w:rPr>
@@ -3953,7 +4069,7 @@
               <w14:ligatures w14:val="standardContextual"/>
             </w:rPr>
           </w:pPr>
-          <w:hyperlink w:anchor="_Toc243660088" w:history="1">
+          <w:hyperlink w:anchor="_Toc243662354" w:history="1">
             <w:r>
               <w:rPr>
                 <w:rStyle w:val="Hyperlink"/>
@@ -3977,7 +4093,7 @@
               <w:rPr>
                 <w:noProof/>
               </w:rPr>
-              <w:instrText xml:space="preserve"> PAGEREF _Toc243660088 \h </w:instrText>
+              <w:instrText xml:space="preserve"> PAGEREF _Toc243662354 \h </w:instrText>
             </w:r>
             <w:r>
               <w:rPr>
@@ -4020,7 +4136,7 @@
               <w14:ligatures w14:val="standardContextual"/>
             </w:rPr>
           </w:pPr>
-          <w:hyperlink w:anchor="_Toc243660089" w:history="1">
+          <w:hyperlink w:anchor="_Toc243662355" w:history="1">
             <w:r>
               <w:rPr>
                 <w:rStyle w:val="Hyperlink"/>
@@ -4044,7 +4160,7 @@
               <w:rPr>
                 <w:noProof/>
               </w:rPr>
-              <w:instrText xml:space="preserve"> PAGEREF _Toc243660089 \h </w:instrText>
+              <w:instrText xml:space="preserve"> PAGEREF _Toc243662355 \h </w:instrText>
             </w:r>
             <w:r>
               <w:rPr>
@@ -4087,7 +4203,7 @@
               <w14:ligatures w14:val="standardContextual"/>
             </w:rPr>
           </w:pPr>
-          <w:hyperlink w:anchor="_Toc243660090" w:history="1">
+          <w:hyperlink w:anchor="_Toc243662356" w:history="1">
             <w:r>
               <w:rPr>
                 <w:rStyle w:val="Hyperlink"/>
@@ -4111,7 +4227,7 @@
               <w:rPr>
                 <w:noProof/>
               </w:rPr>
-              <w:instrText xml:space="preserve"> PAGEREF _Toc243660090 \h </w:instrText>
+              <w:instrText xml:space="preserve"> PAGEREF _Toc243662356 \h </w:instrText>
             </w:r>
             <w:r>
               <w:rPr>
@@ -4154,7 +4270,7 @@
               <w14:ligatures w14:val="standardContextual"/>
             </w:rPr>
           </w:pPr>
-          <w:hyperlink w:anchor="_Toc243660091" w:history="1">
+          <w:hyperlink w:anchor="_Toc243662357" w:history="1">
             <w:r>
               <w:rPr>
                 <w:rStyle w:val="Hyperlink"/>
@@ -4178,7 +4294,7 @@
               <w:rPr>
                 <w:noProof/>
               </w:rPr>
-              <w:instrText xml:space="preserve"> PAGEREF _Toc243660091 \h </w:instrText>
+              <w:instrText xml:space="preserve"> PAGEREF _Toc243662357 \h </w:instrText>
             </w:r>
             <w:r>
               <w:rPr>
@@ -4221,7 +4337,7 @@
               <w14:ligatures w14:val="standardContextual"/>
             </w:rPr>
           </w:pPr>
-          <w:hyperlink w:anchor="_Toc243660092" w:history="1">
+          <w:hyperlink w:anchor="_Toc243662358" w:history="1">
             <w:r>
               <w:rPr>
                 <w:rStyle w:val="Hyperlink"/>
@@ -4245,7 +4361,7 @@
               <w:rPr>
                 <w:noProof/>
               </w:rPr>
-              <w:instrText xml:space="preserve"> PAGEREF _Toc243660092 \h </w:instrText>
+              <w:instrText xml:space="preserve"> PAGEREF _Toc243662358 \h </w:instrText>
             </w:r>
             <w:r>
               <w:rPr>
@@ -4288,7 +4404,7 @@
               <w14:ligatures w14:val="standardContextual"/>
             </w:rPr>
           </w:pPr>
-          <w:hyperlink w:anchor="_Toc243660093" w:history="1">
+          <w:hyperlink w:anchor="_Toc243662359" w:history="1">
             <w:r>
               <w:rPr>
                 <w:rStyle w:val="Hyperlink"/>
@@ -4312,7 +4428,7 @@
               <w:rPr>
                 <w:noProof/>
               </w:rPr>
-              <w:instrText xml:space="preserve"> PAGEREF _Toc243660093 \h </w:instrText>
+              <w:instrText xml:space="preserve"> PAGEREF _Toc243662359 \h </w:instrText>
             </w:r>
             <w:r>
               <w:rPr>
@@ -4355,7 +4471,7 @@
               <w14:ligatures w14:val="standardContextual"/>
             </w:rPr>
           </w:pPr>
-          <w:hyperlink w:anchor="_Toc243660094" w:history="1">
+          <w:hyperlink w:anchor="_Toc243662360" w:history="1">
             <w:r>
               <w:rPr>
                 <w:rStyle w:val="Hyperlink"/>
@@ -4379,7 +4495,7 @@
               <w:rPr>
                 <w:noProof/>
               </w:rPr>
-              <w:instrText xml:space="preserve"> PAGEREF _Toc243660094 \h </w:instrText>
+              <w:instrText xml:space="preserve"> PAGEREF _Toc243662360 \h </w:instrText>
             </w:r>
             <w:r>
               <w:rPr>
@@ -4396,7 +4512,7 @@
               <w:rPr>
                 <w:noProof/>
               </w:rPr>
-              <w:t>15</w:t>
+              <w:t>16</w:t>
             </w:r>
             <w:r>
               <w:rPr>
@@ -4422,7 +4538,7 @@
               <w14:ligatures w14:val="standardContextual"/>
             </w:rPr>
           </w:pPr>
-          <w:hyperlink w:anchor="_Toc243660095" w:history="1">
+          <w:hyperlink w:anchor="_Toc243662361" w:history="1">
             <w:r>
               <w:rPr>
                 <w:rStyle w:val="Hyperlink"/>
@@ -4446,7 +4562,7 @@
               <w:rPr>
                 <w:noProof/>
               </w:rPr>
-              <w:instrText xml:space="preserve"> PAGEREF _Toc243660095 \h </w:instrText>
+              <w:instrText xml:space="preserve"> PAGEREF _Toc243662361 \h </w:instrText>
             </w:r>
             <w:r>
               <w:rPr>
@@ -4489,7 +4605,7 @@
               <w14:ligatures w14:val="standardContextual"/>
             </w:rPr>
           </w:pPr>
-          <w:hyperlink w:anchor="_Toc243660096" w:history="1">
+          <w:hyperlink w:anchor="_Toc243662362" w:history="1">
             <w:r>
               <w:rPr>
                 <w:rStyle w:val="Hyperlink"/>
@@ -4513,7 +4629,7 @@
               <w:rPr>
                 <w:noProof/>
               </w:rPr>
-              <w:instrText xml:space="preserve"> PAGEREF _Toc243660096 \h </w:instrText>
+              <w:instrText xml:space="preserve"> PAGEREF _Toc243662362 \h </w:instrText>
             </w:r>
             <w:r>
               <w:rPr>
@@ -4556,7 +4672,7 @@
               <w14:ligatures w14:val="standardContextual"/>
             </w:rPr>
           </w:pPr>
-          <w:hyperlink w:anchor="_Toc243660097" w:history="1">
+          <w:hyperlink w:anchor="_Toc243662363" w:history="1">
             <w:r>
               <w:rPr>
                 <w:rStyle w:val="Hyperlink"/>
@@ -4580,7 +4696,7 @@
               <w:rPr>
                 <w:noProof/>
               </w:rPr>
-              <w:instrText xml:space="preserve"> PAGEREF _Toc243660097 \h </w:instrText>
+              <w:instrText xml:space="preserve"> PAGEREF _Toc243662363 \h </w:instrText>
             </w:r>
             <w:r>
               <w:rPr>
@@ -4623,7 +4739,7 @@
               <w14:ligatures w14:val="standardContextual"/>
             </w:rPr>
           </w:pPr>
-          <w:hyperlink w:anchor="_Toc243660098" w:history="1">
+          <w:hyperlink w:anchor="_Toc243662364" w:history="1">
             <w:r>
               <w:rPr>
                 <w:rStyle w:val="Hyperlink"/>
@@ -4647,7 +4763,7 @@
               <w:rPr>
                 <w:noProof/>
               </w:rPr>
-              <w:instrText xml:space="preserve"> PAGEREF _Toc243660098 \h </w:instrText>
+              <w:instrText xml:space="preserve"> PAGEREF _Toc243662364 \h </w:instrText>
             </w:r>
             <w:r>
               <w:rPr>
@@ -4690,7 +4806,7 @@
               <w14:ligatures w14:val="standardContextual"/>
             </w:rPr>
           </w:pPr>
-          <w:hyperlink w:anchor="_Toc243660099" w:history="1">
+          <w:hyperlink w:anchor="_Toc243662365" w:history="1">
             <w:r>
               <w:rPr>
                 <w:rStyle w:val="Hyperlink"/>
@@ -4714,7 +4830,7 @@
               <w:rPr>
                 <w:noProof/>
               </w:rPr>
-              <w:instrText xml:space="preserve"> PAGEREF _Toc243660099 \h </w:instrText>
+              <w:instrText xml:space="preserve"> PAGEREF _Toc243662365 \h </w:instrText>
             </w:r>
             <w:r>
               <w:rPr>
@@ -4757,7 +4873,7 @@
               <w14:ligatures w14:val="standardContextual"/>
             </w:rPr>
           </w:pPr>
-          <w:hyperlink w:anchor="_Toc243660100" w:history="1">
+          <w:hyperlink w:anchor="_Toc243662366" w:history="1">
             <w:r>
               <w:rPr>
                 <w:rStyle w:val="Hyperlink"/>
@@ -4781,7 +4897,7 @@
               <w:rPr>
                 <w:noProof/>
               </w:rPr>
-              <w:instrText xml:space="preserve"> PAGEREF _Toc243660100 \h </w:instrText>
+              <w:instrText xml:space="preserve"> PAGEREF _Toc243662366 \h </w:instrText>
             </w:r>
             <w:r>
               <w:rPr>
@@ -4824,7 +4940,7 @@
               <w14:ligatures w14:val="standardContextual"/>
             </w:rPr>
           </w:pPr>
-          <w:hyperlink w:anchor="_Toc243660101" w:history="1">
+          <w:hyperlink w:anchor="_Toc243662367" w:history="1">
             <w:r>
               <w:rPr>
                 <w:rStyle w:val="Hyperlink"/>
@@ -4848,7 +4964,7 @@
               <w:rPr>
                 <w:noProof/>
               </w:rPr>
-              <w:instrText xml:space="preserve"> PAGEREF _Toc243660101 \h </w:instrText>
+              <w:instrText xml:space="preserve"> PAGEREF _Toc243662367 \h </w:instrText>
             </w:r>
             <w:r>
               <w:rPr>
@@ -4891,7 +5007,7 @@
               <w14:ligatures w14:val="standardContextual"/>
             </w:rPr>
           </w:pPr>
-          <w:hyperlink w:anchor="_Toc243660102" w:history="1">
+          <w:hyperlink w:anchor="_Toc243662368" w:history="1">
             <w:r>
               <w:rPr>
                 <w:rStyle w:val="Hyperlink"/>
@@ -4915,7 +5031,7 @@
               <w:rPr>
                 <w:noProof/>
               </w:rPr>
-              <w:instrText xml:space="preserve"> PAGEREF _Toc243660102 \h </w:instrText>
+              <w:instrText xml:space="preserve"> PAGEREF _Toc243662368 \h </w:instrText>
             </w:r>
             <w:r>
               <w:rPr>
@@ -4958,7 +5074,7 @@
               <w14:ligatures w14:val="standardContextual"/>
             </w:rPr>
           </w:pPr>
-          <w:hyperlink w:anchor="_Toc243660103" w:history="1">
+          <w:hyperlink w:anchor="_Toc243662369" w:history="1">
             <w:r>
               <w:rPr>
                 <w:rStyle w:val="Hyperlink"/>
@@ -4982,7 +5098,7 @@
               <w:rPr>
                 <w:noProof/>
               </w:rPr>
-              <w:instrText xml:space="preserve"> PAGEREF _Toc243660103 \h </w:instrText>
+              <w:instrText xml:space="preserve"> PAGEREF _Toc243662369 \h </w:instrText>
             </w:r>
             <w:r>
               <w:rPr>
@@ -5025,7 +5141,7 @@
               <w14:ligatures w14:val="standardContextual"/>
             </w:rPr>
           </w:pPr>
-          <w:hyperlink w:anchor="_Toc243660104" w:history="1">
+          <w:hyperlink w:anchor="_Toc243662370" w:history="1">
             <w:r>
               <w:rPr>
                 <w:rStyle w:val="Hyperlink"/>
@@ -5049,7 +5165,7 @@
               <w:rPr>
                 <w:noProof/>
               </w:rPr>
-              <w:instrText xml:space="preserve"> PAGEREF _Toc243660104 \h </w:instrText>
+              <w:instrText xml:space="preserve"> PAGEREF _Toc243662370 \h </w:instrText>
             </w:r>
             <w:r>
               <w:rPr>
@@ -5092,7 +5208,7 @@
               <w14:ligatures w14:val="standardContextual"/>
             </w:rPr>
           </w:pPr>
-          <w:hyperlink w:anchor="_Toc243660105" w:history="1">
+          <w:hyperlink w:anchor="_Toc243662371" w:history="1">
             <w:r>
               <w:rPr>
                 <w:rStyle w:val="Hyperlink"/>
@@ -5116,7 +5232,7 @@
               <w:rPr>
                 <w:noProof/>
               </w:rPr>
-              <w:instrText xml:space="preserve"> PAGEREF _Toc243660105 \h </w:instrText>
+              <w:instrText xml:space="preserve"> PAGEREF _Toc243662371 \h </w:instrText>
             </w:r>
             <w:r>
               <w:rPr>
@@ -5159,7 +5275,7 @@
               <w14:ligatures w14:val="standardContextual"/>
             </w:rPr>
           </w:pPr>
-          <w:hyperlink w:anchor="_Toc243660106" w:history="1">
+          <w:hyperlink w:anchor="_Toc243662372" w:history="1">
             <w:r>
               <w:rPr>
                 <w:rStyle w:val="Hyperlink"/>
@@ -5183,7 +5299,7 @@
               <w:rPr>
                 <w:noProof/>
               </w:rPr>
-              <w:instrText xml:space="preserve"> PAGEREF _Toc243660106 \h </w:instrText>
+              <w:instrText xml:space="preserve"> PAGEREF _Toc243662372 \h </w:instrText>
             </w:r>
             <w:r>
               <w:rPr>
@@ -5226,7 +5342,7 @@
               <w14:ligatures w14:val="standardContextual"/>
             </w:rPr>
           </w:pPr>
-          <w:hyperlink w:anchor="_Toc243660107" w:history="1">
+          <w:hyperlink w:anchor="_Toc243662373" w:history="1">
             <w:r>
               <w:rPr>
                 <w:rStyle w:val="Hyperlink"/>
@@ -5250,7 +5366,7 @@
               <w:rPr>
                 <w:noProof/>
               </w:rPr>
-              <w:instrText xml:space="preserve"> PAGEREF _Toc243660107 \h </w:instrText>
+              <w:instrText xml:space="preserve"> PAGEREF _Toc243662373 \h </w:instrText>
             </w:r>
             <w:r>
               <w:rPr>
@@ -5293,7 +5409,7 @@
               <w14:ligatures w14:val="standardContextual"/>
             </w:rPr>
           </w:pPr>
-          <w:hyperlink w:anchor="_Toc243660108" w:history="1">
+          <w:hyperlink w:anchor="_Toc243662374" w:history="1">
             <w:r>
               <w:rPr>
                 <w:rStyle w:val="Hyperlink"/>
@@ -5317,7 +5433,7 @@
               <w:rPr>
                 <w:noProof/>
               </w:rPr>
-              <w:instrText xml:space="preserve"> PAGEREF _Toc243660108 \h </w:instrText>
+              <w:instrText xml:space="preserve"> PAGEREF _Toc243662374 \h </w:instrText>
             </w:r>
             <w:r>
               <w:rPr>
@@ -5360,7 +5476,7 @@
               <w14:ligatures w14:val="standardContextual"/>
             </w:rPr>
           </w:pPr>
-          <w:hyperlink w:anchor="_Toc243660109" w:history="1">
+          <w:hyperlink w:anchor="_Toc243662375" w:history="1">
             <w:r>
               <w:rPr>
                 <w:rStyle w:val="Hyperlink"/>
@@ -5384,7 +5500,7 @@
               <w:rPr>
                 <w:noProof/>
               </w:rPr>
-              <w:instrText xml:space="preserve"> PAGEREF _Toc243660109 \h </w:instrText>
+              <w:instrText xml:space="preserve"> PAGEREF _Toc243662375 \h </w:instrText>
             </w:r>
             <w:r>
               <w:rPr>
@@ -5427,7 +5543,7 @@
               <w14:ligatures w14:val="standardContextual"/>
             </w:rPr>
           </w:pPr>
-          <w:hyperlink w:anchor="_Toc243660110" w:history="1">
+          <w:hyperlink w:anchor="_Toc243662376" w:history="1">
             <w:r>
               <w:rPr>
                 <w:rStyle w:val="Hyperlink"/>
@@ -5451,7 +5567,7 @@
               <w:rPr>
                 <w:noProof/>
               </w:rPr>
-              <w:instrText xml:space="preserve"> PAGEREF _Toc243660110 \h </w:instrText>
+              <w:instrText xml:space="preserve"> PAGEREF _Toc243662376 \h </w:instrText>
             </w:r>
             <w:r>
               <w:rPr>
@@ -5494,7 +5610,7 @@
               <w14:ligatures w14:val="standardContextual"/>
             </w:rPr>
           </w:pPr>
-          <w:hyperlink w:anchor="_Toc243660111" w:history="1">
+          <w:hyperlink w:anchor="_Toc243662377" w:history="1">
             <w:r>
               <w:rPr>
                 <w:rStyle w:val="Hyperlink"/>
@@ -5518,7 +5634,7 @@
               <w:rPr>
                 <w:noProof/>
               </w:rPr>
-              <w:instrText xml:space="preserve"> PAGEREF _Toc243660111 \h </w:instrText>
+              <w:instrText xml:space="preserve"> PAGEREF _Toc243662377 \h </w:instrText>
             </w:r>
             <w:r>
               <w:rPr>
@@ -5561,7 +5677,7 @@
               <w14:ligatures w14:val="standardContextual"/>
             </w:rPr>
           </w:pPr>
-          <w:hyperlink w:anchor="_Toc243660112" w:history="1">
+          <w:hyperlink w:anchor="_Toc243662378" w:history="1">
             <w:r>
               <w:rPr>
                 <w:rStyle w:val="Hyperlink"/>
@@ -5585,7 +5701,7 @@
               <w:rPr>
                 <w:noProof/>
               </w:rPr>
-              <w:instrText xml:space="preserve"> PAGEREF _Toc243660112 \h </w:instrText>
+              <w:instrText xml:space="preserve"> PAGEREF _Toc243662378 \h </w:instrText>
             </w:r>
             <w:r>
               <w:rPr>
@@ -5628,7 +5744,7 @@
               <w14:ligatures w14:val="standardContextual"/>
             </w:rPr>
           </w:pPr>
-          <w:hyperlink w:anchor="_Toc243660113" w:history="1">
+          <w:hyperlink w:anchor="_Toc243662379" w:history="1">
             <w:r>
               <w:rPr>
                 <w:rStyle w:val="Hyperlink"/>
@@ -5652,7 +5768,7 @@
               <w:rPr>
                 <w:noProof/>
               </w:rPr>
-              <w:instrText xml:space="preserve"> PAGEREF _Toc243660113 \h </w:instrText>
+              <w:instrText xml:space="preserve"> PAGEREF _Toc243662379 \h </w:instrText>
             </w:r>
             <w:r>
               <w:rPr>
@@ -5695,7 +5811,7 @@
               <w14:ligatures w14:val="standardContextual"/>
             </w:rPr>
           </w:pPr>
-          <w:hyperlink w:anchor="_Toc243660114" w:history="1">
+          <w:hyperlink w:anchor="_Toc243662380" w:history="1">
             <w:r>
               <w:rPr>
                 <w:rStyle w:val="Hyperlink"/>
@@ -5719,7 +5835,7 @@
               <w:rPr>
                 <w:noProof/>
               </w:rPr>
-              <w:instrText xml:space="preserve"> PAGEREF _Toc243660114 \h </w:instrText>
+              <w:instrText xml:space="preserve"> PAGEREF _Toc243662380 \h </w:instrText>
             </w:r>
             <w:r>
               <w:rPr>
@@ -5762,7 +5878,7 @@
               <w14:ligatures w14:val="standardContextual"/>
             </w:rPr>
           </w:pPr>
-          <w:hyperlink w:anchor="_Toc243660115" w:history="1">
+          <w:hyperlink w:anchor="_Toc243662381" w:history="1">
             <w:r>
               <w:rPr>
                 <w:rStyle w:val="Hyperlink"/>
@@ -5786,7 +5902,7 @@
               <w:rPr>
                 <w:noProof/>
               </w:rPr>
-              <w:instrText xml:space="preserve"> PAGEREF _Toc243660115 \h </w:instrText>
+              <w:instrText xml:space="preserve"> PAGEREF _Toc243662381 \h </w:instrText>
             </w:r>
             <w:r>
               <w:rPr>
@@ -5829,7 +5945,7 @@
               <w14:ligatures w14:val="standardContextual"/>
             </w:rPr>
           </w:pPr>
-          <w:hyperlink w:anchor="_Toc243660116" w:history="1">
+          <w:hyperlink w:anchor="_Toc243662382" w:history="1">
             <w:r>
               <w:rPr>
                 <w:rStyle w:val="Hyperlink"/>
@@ -5853,7 +5969,7 @@
               <w:rPr>
                 <w:noProof/>
               </w:rPr>
-              <w:instrText xml:space="preserve"> PAGEREF _Toc243660116 \h </w:instrText>
+              <w:instrText xml:space="preserve"> PAGEREF _Toc243662382 \h </w:instrText>
             </w:r>
             <w:r>
               <w:rPr>
@@ -5896,7 +6012,7 @@
               <w14:ligatures w14:val="standardContextual"/>
             </w:rPr>
           </w:pPr>
-          <w:hyperlink w:anchor="_Toc243660117" w:history="1">
+          <w:hyperlink w:anchor="_Toc243662383" w:history="1">
             <w:r>
               <w:rPr>
                 <w:rStyle w:val="Hyperlink"/>
@@ -5920,7 +6036,7 @@
               <w:rPr>
                 <w:noProof/>
               </w:rPr>
-              <w:instrText xml:space="preserve"> PAGEREF _Toc243660117 \h </w:instrText>
+              <w:instrText xml:space="preserve"> PAGEREF _Toc243662383 \h </w:instrText>
             </w:r>
             <w:r>
               <w:rPr>
@@ -5963,7 +6079,7 @@
               <w14:ligatures w14:val="standardContextual"/>
             </w:rPr>
           </w:pPr>
-          <w:hyperlink w:anchor="_Toc243660118" w:history="1">
+          <w:hyperlink w:anchor="_Toc243662384" w:history="1">
             <w:r>
               <w:rPr>
                 <w:rStyle w:val="Hyperlink"/>
@@ -5987,7 +6103,7 @@
               <w:rPr>
                 <w:noProof/>
               </w:rPr>
-              <w:instrText xml:space="preserve"> PAGEREF _Toc243660118 \h </w:instrText>
+              <w:instrText xml:space="preserve"> PAGEREF _Toc243662384 \h </w:instrText>
             </w:r>
             <w:r>
               <w:rPr>
@@ -6030,7 +6146,7 @@
               <w14:ligatures w14:val="standardContextual"/>
             </w:rPr>
           </w:pPr>
-          <w:hyperlink w:anchor="_Toc243660119" w:history="1">
+          <w:hyperlink w:anchor="_Toc243662385" w:history="1">
             <w:r>
               <w:rPr>
                 <w:rStyle w:val="Hyperlink"/>
@@ -6054,7 +6170,7 @@
               <w:rPr>
                 <w:noProof/>
               </w:rPr>
-              <w:instrText xml:space="preserve"> PAGEREF _Toc243660119 \h </w:instrText>
+              <w:instrText xml:space="preserve"> PAGEREF _Toc243662385 \h </w:instrText>
             </w:r>
             <w:r>
               <w:rPr>
@@ -6097,7 +6213,7 @@
               <w14:ligatures w14:val="standardContextual"/>
             </w:rPr>
           </w:pPr>
-          <w:hyperlink w:anchor="_Toc243660120" w:history="1">
+          <w:hyperlink w:anchor="_Toc243662386" w:history="1">
             <w:r>
               <w:rPr>
                 <w:rStyle w:val="Hyperlink"/>
@@ -6121,7 +6237,7 @@
               <w:rPr>
                 <w:noProof/>
               </w:rPr>
-              <w:instrText xml:space="preserve"> PAGEREF _Toc243660120 \h </w:instrText>
+              <w:instrText xml:space="preserve"> PAGEREF _Toc243662386 \h </w:instrText>
             </w:r>
             <w:r>
               <w:rPr>
@@ -6167,7 +6283,7 @@
     <w:sdt>
       <w:sdtPr>
         <w:alias w:val="Figures"/>
-        <w:id w:val="-1490318530"/>
+        <w:id w:val="-1628613664"/>
       </w:sdtPr>
       <w:sdtEndPr/>
       <w:sdtContent>
@@ -6196,7 +6312,7 @@
           <w:r>
             <w:fldChar w:fldCharType="separate"/>
           </w:r>
-          <w:hyperlink w:anchor="_Toc243660121" w:history="1">
+          <w:hyperlink w:anchor="_Toc243662387" w:history="1">
             <w:r>
               <w:rPr>
                 <w:rStyle w:val="Hyperlink"/>
@@ -6220,7 +6336,7 @@
               <w:rPr>
                 <w:noProof/>
               </w:rPr>
-              <w:instrText xml:space="preserve"> PAGEREF _Toc243660121 \h </w:instrText>
+              <w:instrText xml:space="preserve"> PAGEREF _Toc243662387 \h </w:instrText>
             </w:r>
             <w:r>
               <w:rPr>
@@ -6263,7 +6379,7 @@
               <w14:ligatures w14:val="standardContextual"/>
             </w:rPr>
           </w:pPr>
-          <w:hyperlink w:anchor="_Toc243660122" w:history="1">
+          <w:hyperlink w:anchor="_Toc243662388" w:history="1">
             <w:r>
               <w:rPr>
                 <w:rStyle w:val="Hyperlink"/>
@@ -6287,7 +6403,7 @@
               <w:rPr>
                 <w:noProof/>
               </w:rPr>
-              <w:instrText xml:space="preserve"> PAGEREF _Toc243660122 \h </w:instrText>
+              <w:instrText xml:space="preserve"> PAGEREF _Toc243662388 \h </w:instrText>
             </w:r>
             <w:r>
               <w:rPr>
@@ -6330,7 +6446,7 @@
               <w14:ligatures w14:val="standardContextual"/>
             </w:rPr>
           </w:pPr>
-          <w:hyperlink w:anchor="_Toc243660123" w:history="1">
+          <w:hyperlink w:anchor="_Toc243662389" w:history="1">
             <w:r>
               <w:rPr>
                 <w:rStyle w:val="Hyperlink"/>
@@ -6354,7 +6470,7 @@
               <w:rPr>
                 <w:noProof/>
               </w:rPr>
-              <w:instrText xml:space="preserve"> PAGEREF _Toc243660123 \h </w:instrText>
+              <w:instrText xml:space="preserve"> PAGEREF _Toc243662389 \h </w:instrText>
             </w:r>
             <w:r>
               <w:rPr>
@@ -6397,7 +6513,7 @@
               <w14:ligatures w14:val="standardContextual"/>
             </w:rPr>
           </w:pPr>
-          <w:hyperlink w:anchor="_Toc243660124" w:history="1">
+          <w:hyperlink w:anchor="_Toc243662390" w:history="1">
             <w:r>
               <w:rPr>
                 <w:rStyle w:val="Hyperlink"/>
@@ -6421,7 +6537,7 @@
               <w:rPr>
                 <w:noProof/>
               </w:rPr>
-              <w:instrText xml:space="preserve"> PAGEREF _Toc243660124 \h </w:instrText>
+              <w:instrText xml:space="preserve"> PAGEREF _Toc243662390 \h </w:instrText>
             </w:r>
             <w:r>
               <w:rPr>
@@ -6464,7 +6580,7 @@
               <w14:ligatures w14:val="standardContextual"/>
             </w:rPr>
           </w:pPr>
-          <w:hyperlink w:anchor="_Toc243660125" w:history="1">
+          <w:hyperlink w:anchor="_Toc243662391" w:history="1">
             <w:r>
               <w:rPr>
                 <w:rStyle w:val="Hyperlink"/>
@@ -6488,7 +6604,7 @@
               <w:rPr>
                 <w:noProof/>
               </w:rPr>
-              <w:instrText xml:space="preserve"> PAGEREF _Toc243660125 \h </w:instrText>
+              <w:instrText xml:space="preserve"> PAGEREF _Toc243662391 \h </w:instrText>
             </w:r>
             <w:r>
               <w:rPr>
@@ -6531,7 +6647,7 @@
               <w14:ligatures w14:val="standardContextual"/>
             </w:rPr>
           </w:pPr>
-          <w:hyperlink w:anchor="_Toc243660126" w:history="1">
+          <w:hyperlink w:anchor="_Toc243662392" w:history="1">
             <w:r>
               <w:rPr>
                 <w:rStyle w:val="Hyperlink"/>
@@ -6555,7 +6671,7 @@
               <w:rPr>
                 <w:noProof/>
               </w:rPr>
-              <w:instrText xml:space="preserve"> PAGEREF _Toc243660126 \h </w:instrText>
+              <w:instrText xml:space="preserve"> PAGEREF _Toc243662392 \h </w:instrText>
             </w:r>
             <w:r>
               <w:rPr>
@@ -6598,7 +6714,7 @@
               <w14:ligatures w14:val="standardContextual"/>
             </w:rPr>
           </w:pPr>
-          <w:hyperlink w:anchor="_Toc243660127" w:history="1">
+          <w:hyperlink w:anchor="_Toc243662393" w:history="1">
             <w:r>
               <w:rPr>
                 <w:rStyle w:val="Hyperlink"/>
@@ -6622,7 +6738,7 @@
               <w:rPr>
                 <w:noProof/>
               </w:rPr>
-              <w:instrText xml:space="preserve"> PAGEREF _Toc243660127 \h </w:instrText>
+              <w:instrText xml:space="preserve"> PAGEREF _Toc243662393 \h </w:instrText>
             </w:r>
             <w:r>
               <w:rPr>
@@ -6665,7 +6781,7 @@
               <w14:ligatures w14:val="standardContextual"/>
             </w:rPr>
           </w:pPr>
-          <w:hyperlink w:anchor="_Toc243660128" w:history="1">
+          <w:hyperlink w:anchor="_Toc243662394" w:history="1">
             <w:r>
               <w:rPr>
                 <w:rStyle w:val="Hyperlink"/>
@@ -6689,7 +6805,7 @@
               <w:rPr>
                 <w:noProof/>
               </w:rPr>
-              <w:instrText xml:space="preserve"> PAGEREF _Toc243660128 \h </w:instrText>
+              <w:instrText xml:space="preserve"> PAGEREF _Toc243662394 \h </w:instrText>
             </w:r>
             <w:r>
               <w:rPr>
@@ -6735,7 +6851,7 @@
     <w:sdt>
       <w:sdtPr>
         <w:alias w:val="Tables"/>
-        <w:id w:val="400795425"/>
+        <w:id w:val="46113070"/>
       </w:sdtPr>
       <w:sdtEndPr/>
       <w:sdtContent>
@@ -6764,7 +6880,7 @@
           <w:r>
             <w:fldChar w:fldCharType="separate"/>
           </w:r>
-          <w:hyperlink w:anchor="_Toc243660129" w:history="1">
+          <w:hyperlink w:anchor="_Toc243662395" w:history="1">
             <w:r>
               <w:rPr>
                 <w:rStyle w:val="Hyperlink"/>
@@ -6788,7 +6904,7 @@
               <w:rPr>
                 <w:noProof/>
               </w:rPr>
-              <w:instrText xml:space="preserve"> PAGEREF _Toc243660129 \h </w:instrText>
+              <w:instrText xml:space="preserve"> PAGEREF _Toc243662395 \h </w:instrText>
             </w:r>
             <w:r>
               <w:rPr>
@@ -6831,7 +6947,7 @@
               <w14:ligatures w14:val="standardContextual"/>
             </w:rPr>
           </w:pPr>
-          <w:hyperlink w:anchor="_Toc243660130" w:history="1">
+          <w:hyperlink w:anchor="_Toc243662396" w:history="1">
             <w:r>
               <w:rPr>
                 <w:rStyle w:val="Hyperlink"/>
@@ -6855,7 +6971,7 @@
               <w:rPr>
                 <w:noProof/>
               </w:rPr>
-              <w:instrText xml:space="preserve"> PAGEREF _Toc243660130 \h </w:instrText>
+              <w:instrText xml:space="preserve"> PAGEREF _Toc243662396 \h </w:instrText>
             </w:r>
             <w:r>
               <w:rPr>
@@ -6898,7 +7014,7 @@
               <w14:ligatures w14:val="standardContextual"/>
             </w:rPr>
           </w:pPr>
-          <w:hyperlink w:anchor="_Toc243660131" w:history="1">
+          <w:hyperlink w:anchor="_Toc243662397" w:history="1">
             <w:r>
               <w:rPr>
                 <w:rStyle w:val="Hyperlink"/>
@@ -6922,7 +7038,7 @@
               <w:rPr>
                 <w:noProof/>
               </w:rPr>
-              <w:instrText xml:space="preserve"> PAGEREF _Toc243660131 \h </w:instrText>
+              <w:instrText xml:space="preserve"> PAGEREF _Toc243662397 \h </w:instrText>
             </w:r>
             <w:r>
               <w:rPr>
@@ -6965,7 +7081,7 @@
               <w14:ligatures w14:val="standardContextual"/>
             </w:rPr>
           </w:pPr>
-          <w:hyperlink w:anchor="_Toc243660132" w:history="1">
+          <w:hyperlink w:anchor="_Toc243662398" w:history="1">
             <w:r>
               <w:rPr>
                 <w:rStyle w:val="Hyperlink"/>
@@ -6989,7 +7105,7 @@
               <w:rPr>
                 <w:noProof/>
               </w:rPr>
-              <w:instrText xml:space="preserve"> PAGEREF _Toc243660132 \h </w:instrText>
+              <w:instrText xml:space="preserve"> PAGEREF _Toc243662398 \h </w:instrText>
             </w:r>
             <w:r>
               <w:rPr>
@@ -7032,7 +7148,7 @@
               <w14:ligatures w14:val="standardContextual"/>
             </w:rPr>
           </w:pPr>
-          <w:hyperlink w:anchor="_Toc243660133" w:history="1">
+          <w:hyperlink w:anchor="_Toc243662399" w:history="1">
             <w:r>
               <w:rPr>
                 <w:rStyle w:val="Hyperlink"/>
@@ -7056,7 +7172,7 @@
               <w:rPr>
                 <w:noProof/>
               </w:rPr>
-              <w:instrText xml:space="preserve"> PAGEREF _Toc243660133 \h </w:instrText>
+              <w:instrText xml:space="preserve"> PAGEREF _Toc243662399 \h </w:instrText>
             </w:r>
             <w:r>
               <w:rPr>
@@ -7099,7 +7215,7 @@
               <w14:ligatures w14:val="standardContextual"/>
             </w:rPr>
           </w:pPr>
-          <w:hyperlink w:anchor="_Toc243660134" w:history="1">
+          <w:hyperlink w:anchor="_Toc243662400" w:history="1">
             <w:r>
               <w:rPr>
                 <w:rStyle w:val="Hyperlink"/>
@@ -7123,7 +7239,7 @@
               <w:rPr>
                 <w:noProof/>
               </w:rPr>
-              <w:instrText xml:space="preserve"> PAGEREF _Toc243660134 \h </w:instrText>
+              <w:instrText xml:space="preserve"> PAGEREF _Toc243662400 \h </w:instrText>
             </w:r>
             <w:r>
               <w:rPr>
@@ -7166,7 +7282,7 @@
               <w14:ligatures w14:val="standardContextual"/>
             </w:rPr>
           </w:pPr>
-          <w:hyperlink w:anchor="_Toc243660135" w:history="1">
+          <w:hyperlink w:anchor="_Toc243662401" w:history="1">
             <w:r>
               <w:rPr>
                 <w:rStyle w:val="Hyperlink"/>
@@ -7190,7 +7306,7 @@
               <w:rPr>
                 <w:noProof/>
               </w:rPr>
-              <w:instrText xml:space="preserve"> PAGEREF _Toc243660135 \h </w:instrText>
+              <w:instrText xml:space="preserve"> PAGEREF _Toc243662401 \h </w:instrText>
             </w:r>
             <w:r>
               <w:rPr>
@@ -7233,7 +7349,7 @@
               <w14:ligatures w14:val="standardContextual"/>
             </w:rPr>
           </w:pPr>
-          <w:hyperlink w:anchor="_Toc243660136" w:history="1">
+          <w:hyperlink w:anchor="_Toc243662402" w:history="1">
             <w:r>
               <w:rPr>
                 <w:rStyle w:val="Hyperlink"/>
@@ -7257,7 +7373,7 @@
               <w:rPr>
                 <w:noProof/>
               </w:rPr>
-              <w:instrText xml:space="preserve"> PAGEREF _Toc243660136 \h </w:instrText>
+              <w:instrText xml:space="preserve"> PAGEREF _Toc243662402 \h </w:instrText>
             </w:r>
             <w:r>
               <w:rPr>
@@ -7300,7 +7416,7 @@
               <w14:ligatures w14:val="standardContextual"/>
             </w:rPr>
           </w:pPr>
-          <w:hyperlink w:anchor="_Toc243660137" w:history="1">
+          <w:hyperlink w:anchor="_Toc243662403" w:history="1">
             <w:r>
               <w:rPr>
                 <w:rStyle w:val="Hyperlink"/>
@@ -7324,7 +7440,7 @@
               <w:rPr>
                 <w:noProof/>
               </w:rPr>
-              <w:instrText xml:space="preserve"> PAGEREF _Toc243660137 \h </w:instrText>
+              <w:instrText xml:space="preserve"> PAGEREF _Toc243662403 \h </w:instrText>
             </w:r>
             <w:r>
               <w:rPr>
@@ -7367,7 +7483,7 @@
               <w14:ligatures w14:val="standardContextual"/>
             </w:rPr>
           </w:pPr>
-          <w:hyperlink w:anchor="_Toc243660138" w:history="1">
+          <w:hyperlink w:anchor="_Toc243662404" w:history="1">
             <w:r>
               <w:rPr>
                 <w:rStyle w:val="Hyperlink"/>
@@ -7391,7 +7507,7 @@
               <w:rPr>
                 <w:noProof/>
               </w:rPr>
-              <w:instrText xml:space="preserve"> PAGEREF _Toc243660138 \h </w:instrText>
+              <w:instrText xml:space="preserve"> PAGEREF _Toc243662404 \h </w:instrText>
             </w:r>
             <w:r>
               <w:rPr>
@@ -7434,7 +7550,7 @@
               <w14:ligatures w14:val="standardContextual"/>
             </w:rPr>
           </w:pPr>
-          <w:hyperlink w:anchor="_Toc243660139" w:history="1">
+          <w:hyperlink w:anchor="_Toc243662405" w:history="1">
             <w:r>
               <w:rPr>
                 <w:rStyle w:val="Hyperlink"/>
@@ -7458,7 +7574,7 @@
               <w:rPr>
                 <w:noProof/>
               </w:rPr>
-              <w:instrText xml:space="preserve"> PAGEREF _Toc243660139 \h </w:instrText>
+              <w:instrText xml:space="preserve"> PAGEREF _Toc243662405 \h </w:instrText>
             </w:r>
             <w:r>
               <w:rPr>
@@ -7501,7 +7617,7 @@
               <w14:ligatures w14:val="standardContextual"/>
             </w:rPr>
           </w:pPr>
-          <w:hyperlink w:anchor="_Toc243660140" w:history="1">
+          <w:hyperlink w:anchor="_Toc243662406" w:history="1">
             <w:r>
               <w:rPr>
                 <w:rStyle w:val="Hyperlink"/>
@@ -7525,7 +7641,7 @@
               <w:rPr>
                 <w:noProof/>
               </w:rPr>
-              <w:instrText xml:space="preserve"> PAGEREF _Toc243660140 \h </w:instrText>
+              <w:instrText xml:space="preserve"> PAGEREF _Toc243662406 \h </w:instrText>
             </w:r>
             <w:r>
               <w:rPr>
@@ -7568,7 +7684,7 @@
               <w14:ligatures w14:val="standardContextual"/>
             </w:rPr>
           </w:pPr>
-          <w:hyperlink w:anchor="_Toc243660141" w:history="1">
+          <w:hyperlink w:anchor="_Toc243662407" w:history="1">
             <w:r>
               <w:rPr>
                 <w:rStyle w:val="Hyperlink"/>
@@ -7592,7 +7708,7 @@
               <w:rPr>
                 <w:noProof/>
               </w:rPr>
-              <w:instrText xml:space="preserve"> PAGEREF _Toc243660141 \h </w:instrText>
+              <w:instrText xml:space="preserve"> PAGEREF _Toc243662407 \h </w:instrText>
             </w:r>
             <w:r>
               <w:rPr>
@@ -7635,7 +7751,7 @@
               <w14:ligatures w14:val="standardContextual"/>
             </w:rPr>
           </w:pPr>
-          <w:hyperlink w:anchor="_Toc243660142" w:history="1">
+          <w:hyperlink w:anchor="_Toc243662408" w:history="1">
             <w:r>
               <w:rPr>
                 <w:rStyle w:val="Hyperlink"/>
@@ -7659,7 +7775,7 @@
               <w:rPr>
                 <w:noProof/>
               </w:rPr>
-              <w:instrText xml:space="preserve"> PAGEREF _Toc243660142 \h </w:instrText>
+              <w:instrText xml:space="preserve"> PAGEREF _Toc243662408 \h </w:instrText>
             </w:r>
             <w:r>
               <w:rPr>
@@ -7702,7 +7818,7 @@
               <w14:ligatures w14:val="standardContextual"/>
             </w:rPr>
           </w:pPr>
-          <w:hyperlink w:anchor="_Toc243660143" w:history="1">
+          <w:hyperlink w:anchor="_Toc243662409" w:history="1">
             <w:r>
               <w:rPr>
                 <w:rStyle w:val="Hyperlink"/>
@@ -7726,7 +7842,7 @@
               <w:rPr>
                 <w:noProof/>
               </w:rPr>
-              <w:instrText xml:space="preserve"> PAGEREF _Toc243660143 \h </w:instrText>
+              <w:instrText xml:space="preserve"> PAGEREF _Toc243662409 \h </w:instrText>
             </w:r>
             <w:r>
               <w:rPr>
@@ -7769,7 +7885,7 @@
               <w14:ligatures w14:val="standardContextual"/>
             </w:rPr>
           </w:pPr>
-          <w:hyperlink w:anchor="_Toc243660144" w:history="1">
+          <w:hyperlink w:anchor="_Toc243662410" w:history="1">
             <w:r>
               <w:rPr>
                 <w:rStyle w:val="Hyperlink"/>
@@ -7793,7 +7909,7 @@
               <w:rPr>
                 <w:noProof/>
               </w:rPr>
-              <w:instrText xml:space="preserve"> PAGEREF _Toc243660144 \h </w:instrText>
+              <w:instrText xml:space="preserve"> PAGEREF _Toc243662410 \h </w:instrText>
             </w:r>
             <w:r>
               <w:rPr>
@@ -7834,7 +7950,7 @@
         <w:keepLines/>
         <w:pageBreakBefore/>
       </w:pPr>
-      <w:bookmarkStart w:id="0" w:name="_Toc243660076"/>
+      <w:bookmarkStart w:id="0" w:name="_Toc243662342"/>
       <w:r>
         <w:lastRenderedPageBreak/>
         <w:t>1 Introduction</w:t>
@@ -7847,7 +7963,7 @@
         <w:keepNext/>
         <w:keepLines/>
       </w:pPr>
-      <w:bookmarkStart w:id="1" w:name="_Toc243660077"/>
+      <w:bookmarkStart w:id="1" w:name="_Toc243662343"/>
       <w:r>
         <w:t>1.1 Purpose</w:t>
       </w:r>
@@ -7878,7 +7994,10 @@
         <w:t>logical</w:t>
       </w:r>
       <w:r>
-        <w:t xml:space="preserve"> relational schema derived with the standard mapping algorithm and normalised, and the </w:t>
+        <w:t xml:space="preserve"> relational schema derived with the standard </w:t>
+      </w:r>
+      <w:r>
+        <w:t xml:space="preserve">mapping algorithm and normalised, and the </w:t>
       </w:r>
       <w:r>
         <w:rPr>
@@ -7888,10 +8007,7 @@
         <w:t>physical</w:t>
       </w:r>
       <w:r>
-        <w:t xml:space="preserve"> schema for Cloudflare D1. The physical schema is the real </w:t>
-      </w:r>
-      <w:r>
-        <w:t>migration file the application uses, and it has been proved by loading the real UGC data into it.</w:t>
+        <w:t xml:space="preserve"> schema for Cloudflare D1. The physical schema is the real migration file the application uses, and it has been proved by loading the real UGC data into it.</w:t>
       </w:r>
     </w:p>
     <w:p>
@@ -7900,7 +8016,7 @@
         <w:keepNext/>
         <w:keepLines/>
       </w:pPr>
-      <w:bookmarkStart w:id="2" w:name="_Toc243660078"/>
+      <w:bookmarkStart w:id="2" w:name="_Toc243662344"/>
       <w:r>
         <w:t>1.2 Scope</w:t>
       </w:r>
@@ -7921,10 +8037,10 @@
         <w:t>optional</w:t>
       </w:r>
       <w:r>
-        <w:t xml:space="preserve"> student account: a student who chooses to create one keeps the same profile on the server, under a username only, so it follows them between </w:t>
-      </w:r>
-      <w:r>
-        <w:t>devices and can drive reminders. Section 2.5 models it. The preference list stays on the device.</w:t>
+        <w:t xml:space="preserve"> student account: a student who </w:t>
+      </w:r>
+      <w:r>
+        <w:t>chooses to create one keeps the same profile on the server, under a username only, so it follows them between devices and can drive reminders. Section 2.5 models it. The preference list stays on the device.</w:t>
       </w:r>
     </w:p>
     <w:p>
@@ -7933,7 +8049,7 @@
         <w:keepNext/>
         <w:keepLines/>
       </w:pPr>
-      <w:bookmarkStart w:id="3" w:name="_Toc243660079"/>
+      <w:bookmarkStart w:id="3" w:name="_Toc243662345"/>
       <w:r>
         <w:t>1.3 Intended audience</w:t>
       </w:r>
@@ -7953,7 +8069,7 @@
         <w:keepNext/>
         <w:keepLines/>
       </w:pPr>
-      <w:bookmarkStart w:id="4" w:name="_Toc243660080"/>
+      <w:bookmarkStart w:id="4" w:name="_Toc243662346"/>
       <w:r>
         <w:t>1.4 Relationship to other documents</w:t>
       </w:r>
@@ -7964,7 +8080,7 @@
         <w:pStyle w:val="Caption"/>
         <w:keepNext/>
       </w:pPr>
-      <w:bookmarkStart w:id="5" w:name="_Toc243660129"/>
+      <w:bookmarkStart w:id="5" w:name="_Toc243662395"/>
       <w:r>
         <w:t xml:space="preserve">Table </w:t>
       </w:r>
@@ -8006,7 +8122,7 @@
           <w:left w:w="10" w:type="dxa"/>
           <w:right w:w="10" w:type="dxa"/>
         </w:tblCellMar>
-        <w:tblLook w:val="04A0" w:firstRow="1" w:lastRow="0" w:firstColumn="1" w:lastColumn="0" w:noHBand="0" w:noVBand="1"/>
+        <w:tblLook w:val="0000" w:firstRow="0" w:lastRow="0" w:firstColumn="0" w:lastColumn="0" w:noHBand="0" w:noVBand="0"/>
       </w:tblPr>
       <w:tblGrid>
         <w:gridCol w:w="4819"/>
@@ -8483,7 +8599,7 @@
         <w:keepNext/>
         <w:keepLines/>
       </w:pPr>
-      <w:bookmarkStart w:id="6" w:name="_Toc243660081"/>
+      <w:bookmarkStart w:id="6" w:name="_Toc243662347"/>
       <w:r>
         <w:t>1.5 Notation</w:t>
       </w:r>
@@ -8604,10 +8720,7 @@
         <w:t>union category</w:t>
       </w:r>
       <w:r>
-        <w:t xml:space="preserve">. Partial keys of weak entities are </w:t>
-      </w:r>
-      <w:r>
-        <w:t>named in the entity catalogue. Logical diagrams use crow's-foot (Information Engineering) notation.</w:t>
+        <w:t>. Partial keys of weak entities are named in the entity catalogue. Logical diagrams use crow's-foot (Information Engineering) notation.</w:t>
       </w:r>
     </w:p>
     <w:p>
@@ -8617,7 +8730,7 @@
         <w:keepLines/>
         <w:pageBreakBefore/>
       </w:pPr>
-      <w:bookmarkStart w:id="7" w:name="_Toc243660082"/>
+      <w:bookmarkStart w:id="7" w:name="_Toc243662348"/>
       <w:r>
         <w:lastRenderedPageBreak/>
         <w:t>2 Conceptual model (EER)</w:t>
@@ -8630,7 +8743,7 @@
         <w:keepNext/>
         <w:keepLines/>
       </w:pPr>
-      <w:bookmarkStart w:id="8" w:name="_Toc243660083"/>
+      <w:bookmarkStart w:id="8" w:name="_Toc243662349"/>
       <w:r>
         <w:t>2.1 Offerings and cut-offs</w:t>
       </w:r>
@@ -8706,7 +8819,7 @@
         </w:rPr>
         <w:lastRenderedPageBreak/>
         <w:drawing>
-          <wp:inline distT="0" distB="0" distL="0" distR="0" wp14:anchorId="5DD071A1" wp14:editId="5DD071A2">
+          <wp:inline distT="0" distB="0" distL="0" distR="0" wp14:anchorId="0A8A0197" wp14:editId="0A8A0198">
             <wp:extent cx="6124575" cy="7553325"/>
             <wp:effectExtent l="0" t="0" r="0" b="0"/>
             <wp:docPr id="1" name="eer-offerings.png" descr="EER model of institutions, courses, offerings, intake years, selection groups and cut-offs" title="EER model of institutions, courses, offerings, intake years, selection groups and cut-offs"/>
@@ -8749,7 +8862,7 @@
       <w:pPr>
         <w:pStyle w:val="Caption"/>
       </w:pPr>
-      <w:bookmarkStart w:id="9" w:name="_Toc243660121"/>
+      <w:bookmarkStart w:id="9" w:name="_Toc243662387"/>
       <w:r>
         <w:t xml:space="preserve">Figure </w:t>
       </w:r>
@@ -8782,7 +8895,7 @@
         <w:keepNext/>
         <w:keepLines/>
       </w:pPr>
-      <w:bookmarkStart w:id="10" w:name="_Toc243660084"/>
+      <w:bookmarkStart w:id="10" w:name="_Toc243662350"/>
       <w:r>
         <w:t>2.2 Subjects and requirement rules</w:t>
       </w:r>
@@ -8818,7 +8931,7 @@
         </w:rPr>
         <w:lastRenderedPageBreak/>
         <w:drawing>
-          <wp:inline distT="0" distB="0" distL="0" distR="0" wp14:anchorId="5DD071A3" wp14:editId="5DD071A4">
+          <wp:inline distT="0" distB="0" distL="0" distR="0" wp14:anchorId="0A8A0199" wp14:editId="0A8A019A">
             <wp:extent cx="6124575" cy="6067425"/>
             <wp:effectExtent l="0" t="0" r="0" b="0"/>
             <wp:docPr id="2" name="eer-rules.png" descr="EER model of streams, subjects and the recursive requirement-rule tree" title="EER model of streams, subjects and the recursive requirement-rule tree"/>
@@ -8861,7 +8974,7 @@
       <w:pPr>
         <w:pStyle w:val="Caption"/>
       </w:pPr>
-      <w:bookmarkStart w:id="11" w:name="_Toc243660122"/>
+      <w:bookmarkStart w:id="11" w:name="_Toc243662388"/>
       <w:r>
         <w:t xml:space="preserve">Figure </w:t>
       </w:r>
@@ -8894,7 +9007,7 @@
         <w:keepNext/>
         <w:keepLines/>
       </w:pPr>
-      <w:bookmarkStart w:id="12" w:name="_Toc243660085"/>
+      <w:bookmarkStart w:id="12" w:name="_Toc243662351"/>
       <w:r>
         <w:t>2.3 Provenance and trust</w:t>
       </w:r>
@@ -8930,7 +9043,7 @@
         </w:rPr>
         <w:lastRenderedPageBreak/>
         <w:drawing>
-          <wp:inline distT="0" distB="0" distL="0" distR="0" wp14:anchorId="5DD071A5" wp14:editId="5DD071A6">
+          <wp:inline distT="0" distB="0" distL="0" distR="0" wp14:anchorId="0A8A019B" wp14:editId="0A8A019C">
             <wp:extent cx="6124575" cy="4829175"/>
             <wp:effectExtent l="0" t="0" r="0" b="0"/>
             <wp:docPr id="3" name="eer-provenance.png" descr="EER model of cited facts, sources, revisions, AI extraction, review and mistake reports" title="EER model of cited facts, sources, revisions, AI extraction, review and mistake reports"/>
@@ -8973,7 +9086,7 @@
       <w:pPr>
         <w:pStyle w:val="Caption"/>
       </w:pPr>
-      <w:bookmarkStart w:id="13" w:name="_Toc243660123"/>
+      <w:bookmarkStart w:id="13" w:name="_Toc243662389"/>
       <w:r>
         <w:t xml:space="preserve">Figure </w:t>
       </w:r>
@@ -9006,7 +9119,7 @@
         <w:keepNext/>
         <w:keepLines/>
       </w:pPr>
-      <w:bookmarkStart w:id="14" w:name="_Toc243660086"/>
+      <w:bookmarkStart w:id="14" w:name="_Toc243662352"/>
       <w:r>
         <w:t>2.4 Journey and other routes</w:t>
       </w:r>
@@ -9023,7 +9136,7 @@
           <w:noProof/>
         </w:rPr>
         <w:drawing>
-          <wp:inline distT="0" distB="0" distL="0" distR="0" wp14:anchorId="5DD071A7" wp14:editId="5DD071A8">
+          <wp:inline distT="0" distB="0" distL="0" distR="0" wp14:anchorId="0A8A019D" wp14:editId="0A8A019E">
             <wp:extent cx="6124575" cy="2895600"/>
             <wp:effectExtent l="0" t="0" r="0" b="0"/>
             <wp:docPr id="4" name="eer-journey.png" descr="EER model of deadlines, push reminders and the specialisation of other routes" title="EER model of deadlines, push reminders and the specialisation of other routes"/>
@@ -9066,7 +9179,7 @@
       <w:pPr>
         <w:pStyle w:val="Caption"/>
       </w:pPr>
-      <w:bookmarkStart w:id="15" w:name="_Toc243660124"/>
+      <w:bookmarkStart w:id="15" w:name="_Toc243662390"/>
       <w:r>
         <w:t xml:space="preserve">Figure </w:t>
       </w:r>
@@ -9099,7 +9212,7 @@
         <w:keepNext/>
         <w:keepLines/>
       </w:pPr>
-      <w:bookmarkStart w:id="16" w:name="_Toc243660087"/>
+      <w:bookmarkStart w:id="16" w:name="_Toc243662353"/>
       <w:r>
         <w:lastRenderedPageBreak/>
         <w:t>2.5 Student accounts (CR-001)</w:t>
@@ -9111,10 +9224,7 @@
         <w:spacing w:after="120"/>
       </w:pPr>
       <w:r>
-        <w:t xml:space="preserve">A student account is optional. ACCOUNT, already the superclass of the staff roles, gains a fourth subclass, </w:t>
-      </w:r>
-      <w:r>
-        <w:t xml:space="preserve">STUDENT. Each way of signing in is its own weak entity of ACCOUNT, so a later identity provider (for example Google sign-in) adds an entity without touching the others. A password is never stored: PASSWORD_LOGIN holds a salt and a </w:t>
+        <w:t xml:space="preserve">A student account is optional. ACCOUNT, already the superclass of the staff roles, gains a fourth subclass, STUDENT. Each way of signing in is its own weak entity of ACCOUNT, so a later identity provider (for example Google sign-in) adds an entity without touching the others. A password is never stored: PASSWORD_LOGIN holds a salt and a </w:t>
       </w:r>
       <w:r>
         <w:rPr>
@@ -9124,10 +9234,10 @@
         <w:t>verifier</w:t>
       </w:r>
       <w:r>
-        <w:t xml:space="preserve">, a hash of a key the student's device derives from the password. A STUDENT's results are the attributes the device already keeps: a Z-score, the stream sat (SAT_IN), the district sat from (SAT_FROM), and </w:t>
-      </w:r>
-      <w:r>
-        <w:t>three subjects with grades (TOOK, whose attributes are Grade and Position). Achievements are a weak entity with partial key Position; interests are a multi-valued attribute. CR-001 stored no name, email address or telephone number; CR-003 (below) withdraws that and adds them, with consent, in a table of their own.</w:t>
+        <w:t xml:space="preserve">, a hash of a key the student's device derives from the password. A STUDENT's results are the attributes the device already keeps: a Z-score, the stream sat (SAT_IN), the district sat from (SAT_FROM), and three subjects with grades (TOOK, whose attributes are Grade and Position). Achievements are a weak entity with partial key Position; interests are a multi-valued attribute. CR-001 stored no name, email address or telephone </w:t>
+      </w:r>
+      <w:r>
+        <w:t>number; CR-003 (below) withdraws that and adds them, with consent, in a table of their own.</w:t>
       </w:r>
     </w:p>
     <w:p>
@@ -9141,7 +9251,7 @@
           <w:noProof/>
         </w:rPr>
         <w:drawing>
-          <wp:inline distT="0" distB="0" distL="0" distR="0" wp14:anchorId="5DD071A9" wp14:editId="5DD071AA">
+          <wp:inline distT="0" distB="0" distL="0" distR="0" wp14:anchorId="0A8A019F" wp14:editId="0A8A01A0">
             <wp:extent cx="6124575" cy="2857500"/>
             <wp:effectExtent l="0" t="0" r="0" b="0"/>
             <wp:docPr id="5" name="eer-accounts.png" descr="EER model of optional student accounts: sign-in, sessions, recovery and the student's results" title="EER model of optional student accounts: sign-in, sessions, recovery and the student's results"/>
@@ -9184,7 +9294,7 @@
       <w:pPr>
         <w:pStyle w:val="Caption"/>
       </w:pPr>
-      <w:bookmarkStart w:id="17" w:name="_Toc243660125"/>
+      <w:bookmarkStart w:id="17" w:name="_Toc243662391"/>
       <w:r>
         <w:t xml:space="preserve">Figure </w:t>
       </w:r>
@@ -9217,7 +9327,7 @@
         <w:keepNext/>
         <w:keepLines/>
       </w:pPr>
-      <w:bookmarkStart w:id="18" w:name="_Toc243660088"/>
+      <w:bookmarkStart w:id="18" w:name="_Toc243662354"/>
       <w:r>
         <w:t>2.6 Journey, Alerts and Groups (CR-002)</w:t>
       </w:r>
@@ -9253,7 +9363,7 @@
           <w:left w:w="10" w:type="dxa"/>
           <w:right w:w="10" w:type="dxa"/>
         </w:tblCellMar>
-        <w:tblLook w:val="04A0" w:firstRow="1" w:lastRow="0" w:firstColumn="1" w:lastColumn="0" w:noHBand="0" w:noVBand="1"/>
+        <w:tblLook w:val="0000" w:firstRow="0" w:lastRow="0" w:firstColumn="0" w:lastColumn="0" w:noHBand="0" w:noVBand="0"/>
       </w:tblPr>
       <w:tblGrid>
         <w:gridCol w:w="2877"/>
@@ -9907,7 +10017,10 @@
         <w:t>rule</w:t>
       </w:r>
       <w:r>
-        <w:t xml:space="preserve"> (for example, "within two weeks of the closing date", p.116) and dated items come from cited notices. No date is invented.</w:t>
+        <w:t xml:space="preserve"> (for example, </w:t>
+      </w:r>
+      <w:r>
+        <w:t>"within two weeks of the closing date", p.116) and dated items come from cited notices. No date is invented.</w:t>
       </w:r>
     </w:p>
     <w:p>
@@ -9934,7 +10047,10 @@
         <w:t>account.verified_for_letter</w:t>
       </w:r>
       <w:r>
-        <w:t>), and the 0003 triggers already keep student data off non-student accounts. A SENIOR_INVITE (one-time code, stored only as its SHA-256) names the course, institution and study year the product owner checked; redeeming it at sign-up creates the SENIOR account and marks the invite in one atomic batch. A trigger allows redemption only by a SENIOR account of the invite's institution, and only once.</w:t>
+        <w:t xml:space="preserve">), and the 0003 triggers already keep student data off non-student accounts. A SENIOR_INVITE (one-time code, stored only as its SHA-256) names the course, institution and study year </w:t>
+      </w:r>
+      <w:r>
+        <w:t>the product owner checked; redeeming it at sign-up creates the SENIOR account and marks the invite in one atomic batch. A trigger allows redemption only by a SENIOR account of the invite's institution, and only once.</w:t>
       </w:r>
     </w:p>
     <w:p>
@@ -9949,10 +10065,7 @@
         <w:t>Reference rows for foreign keys.</w:t>
       </w:r>
       <w:r>
-        <w:t xml:space="preserve"> Migration 0005 loads the 121 courses and 20 institutions of 2025/26 (generated </w:t>
-      </w:r>
-      <w:r>
-        <w:t xml:space="preserve">by </w:t>
+        <w:t xml:space="preserve"> Migration 0005 loads the 121 courses and 20 institutions of 2025/26 (generated by </w:t>
       </w:r>
       <w:r>
         <w:rPr>
@@ -9982,7 +10095,7 @@
           <w:left w:w="10" w:type="dxa"/>
           <w:right w:w="10" w:type="dxa"/>
         </w:tblCellMar>
-        <w:tblLook w:val="04A0" w:firstRow="1" w:lastRow="0" w:firstColumn="1" w:lastColumn="0" w:noHBand="0" w:noVBand="1"/>
+        <w:tblLook w:val="0000" w:firstRow="0" w:lastRow="0" w:firstColumn="0" w:lastColumn="0" w:noHBand="0" w:noVBand="0"/>
       </w:tblPr>
       <w:tblGrid>
         <w:gridCol w:w="1588"/>
@@ -10812,7 +10925,10 @@
         <w:spacing w:after="120"/>
       </w:pPr>
       <w:r>
-        <w:t>Messages are outside D1's cascade, so deleting an account also tells every group it was in to delete that account's messages (tested). All tables are in BCNF: every determinant is a candidate key; derived values (member counts, the senior badge text) are computed, never stored.</w:t>
+        <w:t xml:space="preserve">Messages are outside D1's cascade, so deleting an account also tells every group it was in to delete that account's </w:t>
+      </w:r>
+      <w:r>
+        <w:t>messages (tested). All tables are in BCNF: every determinant is a candidate key; derived values (member counts, the senior badge text) are computed, never stored.</w:t>
       </w:r>
     </w:p>
     <w:p>
@@ -10821,7 +10937,7 @@
         <w:keepNext/>
         <w:keepLines/>
       </w:pPr>
-      <w:bookmarkStart w:id="19" w:name="_Toc243660089"/>
+      <w:bookmarkStart w:id="19" w:name="_Toc243662355"/>
       <w:r>
         <w:t>2.7 Contact details (CR-003)</w:t>
       </w:r>
@@ -10839,14 +10955,14 @@
         <w:t>Decision.</w:t>
       </w:r>
       <w:r>
-        <w:t xml:space="preserve"> On 11 October 2026 the product owner made an account compulsory at the start, with full name, email, </w:t>
-      </w:r>
-      <w:r>
-        <w:t xml:space="preserve">mobile number and date of birth (the birthday moves here from the Alerts screen, where it stayed on the </w:t>
+        <w:t xml:space="preserve"> On 11 October 2026 the product owner made an account compulsory at the start, with full name, email, mobile number and date of birth (the birthday moves here from the Alerts screen, where it stayed on the </w:t>
       </w:r>
       <w:r>
         <w:lastRenderedPageBreak/>
-        <w:t>phone). This reverses the CR-001 promise "a username only". The README, the business case and the app's privacy text now say exactly what is collected and why.</w:t>
+        <w:t xml:space="preserve">phone). This </w:t>
+      </w:r>
+      <w:r>
+        <w:t>reverses the CR-001 promise "a username only". The README, the business case and the app's privacy text now say exactly what is collected and why.</w:t>
       </w:r>
     </w:p>
     <w:p>
@@ -10897,10 +11013,7 @@
         <w:t>account</w:t>
       </w:r>
       <w:r>
-        <w:t xml:space="preserve"> is the identity table shared by every role, </w:t>
-      </w:r>
-      <w:r>
-        <w:t>and personal contact data kept apart can be audited, exported or deleted on its own. It cascades with the account.</w:t>
+        <w:t xml:space="preserve"> is the identity table shared by every role, and personal contact data kept apart can be audited, exported or deleted on its own. It cascades with the account.</w:t>
       </w:r>
     </w:p>
     <w:tbl>
@@ -10918,7 +11031,7 @@
           <w:left w:w="10" w:type="dxa"/>
           <w:right w:w="10" w:type="dxa"/>
         </w:tblCellMar>
-        <w:tblLook w:val="04A0" w:firstRow="1" w:lastRow="0" w:firstColumn="1" w:lastColumn="0" w:noHBand="0" w:noVBand="1"/>
+        <w:tblLook w:val="0000" w:firstRow="0" w:lastRow="0" w:firstColumn="0" w:lastColumn="0" w:noHBand="0" w:noVBand="0"/>
       </w:tblPr>
       <w:tblGrid>
         <w:gridCol w:w="3876"/>
@@ -11536,7 +11649,10 @@
         <w:t>PUT /api/me/contact</w:t>
       </w:r>
       <w:r>
-        <w:t>). Safe default: no existing row is invented or guessed. Students under 18 confirm that a parent or guardian agrees (Personal Data Protection Act, No. 9 of 2022). The table is in BCNF: the only determinant is the key.</w:t>
+        <w:t xml:space="preserve">). Safe default: no existing row is invented or guessed. Students under 18 confirm that a </w:t>
+      </w:r>
+      <w:r>
+        <w:t>parent or guardian agrees (Personal Data Protection Act, No. 9 of 2022). The table is in BCNF: the only determinant is the key.</w:t>
       </w:r>
     </w:p>
     <w:p>
@@ -11545,7 +11661,7 @@
         <w:keepNext/>
         <w:keepLines/>
       </w:pPr>
-      <w:bookmarkStart w:id="20" w:name="_Toc243660090"/>
+      <w:bookmarkStart w:id="20" w:name="_Toc243662356"/>
       <w:r>
         <w:t>2.8 Answer feedback (CR-004)</w:t>
       </w:r>
@@ -11592,10 +11708,7 @@
         <w:t>fact_id</w:t>
       </w:r>
       <w:r>
-        <w:t xml:space="preserve"> is required), and an AI answer is not one. </w:t>
-      </w:r>
-      <w:r>
-        <w:t xml:space="preserve">A row holds the rating, the question, the answer, the handbook pages it cited (JSON, checked by </w:t>
+        <w:t xml:space="preserve"> is required), and an AI answer is not one. A row holds the rating, the question, the answer, the handbook pages it cited (JSON, checked by </w:t>
       </w:r>
       <w:r>
         <w:rPr>
@@ -11607,7 +11720,10 @@
         <w:t>json_valid</w:t>
       </w:r>
       <w:r>
-        <w:t>), an optional note, the app language and a review state. It holds nothing that identifies the student: no account, device or IP. The screen says the question and answer are sent before the student sends a report.</w:t>
+        <w:t xml:space="preserve">), an </w:t>
+      </w:r>
+      <w:r>
+        <w:t>optional note, the app language and a review state. It holds nothing that identifies the student: no account, device or IP. The screen says the question and answer are sent before the student sends a report.</w:t>
       </w:r>
     </w:p>
     <w:p>
@@ -11616,7 +11732,7 @@
         <w:keepNext/>
         <w:keepLines/>
       </w:pPr>
-      <w:bookmarkStart w:id="21" w:name="_Toc243660091"/>
+      <w:bookmarkStart w:id="21" w:name="_Toc243662357"/>
       <w:r>
         <w:t>2.9 Group rules and sample conversations (CR-005)</w:t>
       </w:r>
@@ -11651,7 +11767,10 @@
         <w:t>rules_version</w:t>
       </w:r>
       <w:r>
-        <w:t>, migration 0009) rather than a new table: one value per (group, member), fully dependent on the key, so the table stays in BCNF. A CHECK lists the versions that exist (</w:t>
+        <w:t xml:space="preserve">, migration 0009) rather than a new table: one value per (group, member), fully </w:t>
+      </w:r>
+      <w:r>
+        <w:t>dependent on the key, so the table stays in BCNF. A CHECK lists the versions that exist (</w:t>
       </w:r>
       <w:r>
         <w:rPr>
@@ -11748,7 +11867,7 @@
         <w:keepNext/>
         <w:keepLines/>
       </w:pPr>
-      <w:bookmarkStart w:id="22" w:name="_Toc243660092"/>
+      <w:bookmarkStart w:id="22" w:name="_Toc243662358"/>
       <w:r>
         <w:lastRenderedPageBreak/>
         <w:t>2.10 Journey, avatars and group rules on the account (CR-006)</w:t>
@@ -11797,7 +11916,14 @@
           <w:b/>
           <w:bCs/>
         </w:rPr>
-        <w:t>only once its window is open</w:t>
+        <w:t xml:space="preserve">only once </w:t>
+      </w:r>
+      <w:r>
+        <w:rPr>
+          <w:b/>
+          <w:bCs/>
+        </w:rPr>
+        <w:t>its window is open</w:t>
       </w:r>
       <w:r>
         <w:t>, which the server checks. Migration 0010 implements the design below.</w:t>
@@ -11808,7 +11934,7 @@
         <w:pStyle w:val="Caption"/>
         <w:keepNext/>
       </w:pPr>
-      <w:bookmarkStart w:id="23" w:name="_Toc243660130"/>
+      <w:bookmarkStart w:id="23" w:name="_Toc243662396"/>
       <w:r>
         <w:t xml:space="preserve">Table </w:t>
       </w:r>
@@ -11850,7 +11976,7 @@
           <w:left w:w="10" w:type="dxa"/>
           <w:right w:w="10" w:type="dxa"/>
         </w:tblCellMar>
-        <w:tblLook w:val="04A0" w:firstRow="1" w:lastRow="0" w:firstColumn="1" w:lastColumn="0" w:noHBand="0" w:noVBand="1"/>
+        <w:tblLook w:val="0000" w:firstRow="0" w:lastRow="0" w:firstColumn="0" w:lastColumn="0" w:noHBand="0" w:noVBand="0"/>
       </w:tblPr>
       <w:tblGrid>
         <w:gridCol w:w="2458"/>
@@ -12765,7 +12891,10 @@
         <w:t>Mapping.</w:t>
       </w:r>
       <w:r>
-        <w:t xml:space="preserve"> Every new relationship is many-to-many with its own attributes, so each maps to its own relation whose key is the pair of participating keys (mapping step 5). The avatar is a single-valued attribute of ACCOUNT and stays on it (step 1). The acceptance is no longer a column of GROUP_MEMBER because it does not depend on the group: under CR-005 the same fact was repeated once per group the student joined, a partial-dependency redundancy that CR-006 removes.</w:t>
+        <w:t xml:space="preserve"> Every new relationship is many-to-many with its own attributes, so each maps to its own relation whose key </w:t>
+      </w:r>
+      <w:r>
+        <w:t>is the pair of participating keys (mapping step 5). The avatar is a single-valued attribute of ACCOUNT and stays on it (step 1). The acceptance is no longer a column of GROUP_MEMBER because it does not depend on the group: under CR-005 the same fact was repeated once per group the student joined, a partial-dependency redundancy that CR-006 removes.</w:t>
       </w:r>
     </w:p>
     <w:p>
@@ -12879,10 +13008,7 @@
         <w:t>offering</w:t>
       </w:r>
       <w:r>
-        <w:t xml:space="preserve"> was defined in 0001 but left empty because the read model serves the </w:t>
-      </w:r>
-      <w:r>
-        <w:t xml:space="preserve">course data. 0010 fills it with the 255 Uni-Codes of 2025/26 (handbook pages 142 to 148, generated by </w:t>
+        <w:t xml:space="preserve"> was defined in 0001 but left empty because the read model serves the course data. 0010 fills it with the 255 Uni-Codes of 2025/26 (handbook pages 142 to 148, generated by </w:t>
       </w:r>
       <w:r>
         <w:rPr>
@@ -12945,7 +13071,10 @@
         <w:t>data/routes/routes-2026-10-23.json</w:t>
       </w:r>
       <w:r>
-        <w:t xml:space="preserve"> holds 102 routes. Three rules keep it honest, each pinned by tests: (1) </w:t>
+        <w:t xml:space="preserve"> holds 102 routes. Three rules keep it honest, </w:t>
+      </w:r>
+      <w:r>
+        <w:t xml:space="preserve">each pinned by tests: (1) </w:t>
       </w:r>
       <w:r>
         <w:rPr>
@@ -12973,10 +13102,7 @@
         <w:t>entry_requirements_text</w:t>
       </w:r>
       <w:r>
-        <w:t xml:space="preserve"> is null when no page ZedPath could check publishes it; the screen says </w:t>
-      </w:r>
-      <w:r>
-        <w:t xml:space="preserve">so in three languages and never shows a guess (TC-144). (3) </w:t>
+        <w:t xml:space="preserve"> is null when no page ZedPath could check publishes it; the screen says so in three languages and never shows a guess (TC-144). (3) </w:t>
       </w:r>
       <w:r>
         <w:rPr>
@@ -12988,7 +13114,10 @@
         <w:t>source_url</w:t>
       </w:r>
       <w:r>
-        <w:t xml:space="preserve"> is null only for routes whose only official site returned unsafe content: their facts keep the date they were checked on and the site is never linked (DAT-030, </w:t>
+        <w:t xml:space="preserve"> is null only for routes whose only official site </w:t>
+      </w:r>
+      <w:r>
+        <w:t xml:space="preserve">returned unsafe content: their facts keep the date they were checked on and the site is never linked (DAT-030, </w:t>
       </w:r>
       <w:r>
         <w:rPr>
@@ -13000,22 +13129,7 @@
         <w:t>KNOWN.sourceNotLinked</w:t>
       </w:r>
       <w:r>
-        <w:t>). A cost is "Free" only when a cost of 0 is published; an unknown cost (null) is never free (TC-143).</w:t>
-      </w:r>
-    </w:p>
-    <w:p>
-      <w:pPr>
-        <w:spacing w:after="120"/>
-      </w:pPr>
-      <w:r>
-        <w:rPr>
-          <w:b/>
-          <w:bCs/>
-        </w:rPr>
-        <w:t>Business rules on the server.</w:t>
-      </w:r>
-      <w:r>
-        <w:t xml:space="preserve"> The step list (three preparation steps, open at any time, and the five UGC steps) is fixed in </w:t>
+        <w:t xml:space="preserve">). A cost is "Free" only when a cost of 0 is published; an unknown cost (null) is never free (TC-143). (4) </w:t>
       </w:r>
       <w:r>
         <w:rPr>
@@ -13024,10 +13138,10 @@
           <w:szCs w:val="19"/>
           <w:shd w:val="clear" w:color="auto" w:fill="F2F4F3"/>
         </w:rPr>
-        <w:t>shared/journey.ts</w:t>
-      </w:r>
-      <w:r>
-        <w:t xml:space="preserve"> and mirrored by the CHECK on </w:t>
+        <w:t>cost_basis</w:t>
+      </w:r>
+      <w:r>
+        <w:t xml:space="preserve"> says what a published fee covers: TOTAL (the default, the whole programme), PER_SEMESTER, PER_YEAR, PER_SUBJECT or TO_REGISTER (the enum </w:t>
       </w:r>
       <w:r>
         <w:rPr>
@@ -13036,10 +13150,10 @@
           <w:szCs w:val="19"/>
           <w:shd w:val="clear" w:color="auto" w:fill="F2F4F3"/>
         </w:rPr>
-        <w:t>journey_step.step_id</w:t>
-      </w:r>
-      <w:r>
-        <w:t>; a test inserts every step id the code knows, so the two cannot drift. A UGC step opens on the date of the UGC press notice (</w:t>
+        <w:t>COST_BASES</w:t>
+      </w:r>
+      <w:r>
+        <w:t xml:space="preserve"> in </w:t>
       </w:r>
       <w:r>
         <w:rPr>
@@ -13048,10 +13162,28 @@
           <w:szCs w:val="19"/>
           <w:shd w:val="clear" w:color="auto" w:fill="F2F4F3"/>
         </w:rPr>
-        <w:t>opensOn</w:t>
-      </w:r>
-      <w:r>
-        <w:t xml:space="preserve"> in the journey read model); while no date is announced it cannot be ticked, because ZedPath never invents a date. "I applied" on a followed notice can be set only once the notice has opened. The Worker checks both against the read model, using the Sri Lanka date (UTC+05:30), before writing (</w:t>
+        <w:t>shared/api.ts</w:t>
+      </w:r>
+      <w:r>
+        <w:t xml:space="preserve">); the screen and Ask always show the amount with its basis, so a semester or registration fee is </w:t>
+      </w:r>
+      <w:r>
+        <w:t>never read as the cost of a degree; a basis other than TOTAL requires a published amount (TC-145).</w:t>
+      </w:r>
+    </w:p>
+    <w:p>
+      <w:pPr>
+        <w:spacing w:after="120"/>
+      </w:pPr>
+      <w:r>
+        <w:rPr>
+          <w:b/>
+          <w:bCs/>
+        </w:rPr>
+        <w:t>Business rules on the server.</w:t>
+      </w:r>
+      <w:r>
+        <w:t xml:space="preserve"> The step list (three preparation steps, open at any time, and the five UGC steps) is fixed in </w:t>
       </w:r>
       <w:r>
         <w:rPr>
@@ -13060,25 +13192,10 @@
           <w:szCs w:val="19"/>
           <w:shd w:val="clear" w:color="auto" w:fill="F2F4F3"/>
         </w:rPr>
-        <w:t>worker/my-journey.ts</w:t>
-      </w:r>
-      <w:r>
-        <w:t>); the phone shows the same rule.</w:t>
-      </w:r>
-    </w:p>
-    <w:p>
-      <w:pPr>
-        <w:spacing w:after="120"/>
-      </w:pPr>
-      <w:r>
-        <w:rPr>
-          <w:b/>
-          <w:bCs/>
-        </w:rPr>
-        <w:t>Data migration and safe defaults.</w:t>
-      </w:r>
-      <w:r>
-        <w:t xml:space="preserve"> Rules accepted under 0009 are carried into </w:t>
+        <w:t>shared/journey.ts</w:t>
+      </w:r>
+      <w:r>
+        <w:t xml:space="preserve"> and mirrored by the CHECK on </w:t>
       </w:r>
       <w:r>
         <w:rPr>
@@ -13087,10 +13204,10 @@
           <w:szCs w:val="19"/>
           <w:shd w:val="clear" w:color="auto" w:fill="F2F4F3"/>
         </w:rPr>
-        <w:t>group_rules_acceptance</w:t>
-      </w:r>
-      <w:r>
-        <w:t xml:space="preserve"> with the time of the account's first join (tested on a copy of the database as it was before 0010). </w:t>
+        <w:t>journey_step.step_id</w:t>
+      </w:r>
+      <w:r>
+        <w:t>; a test inserts every step id the code knows, so the two cannot drift. A UGC step opens on the date of the UGC press notice (</w:t>
       </w:r>
       <w:r>
         <w:rPr>
@@ -13099,28 +13216,13 @@
           <w:szCs w:val="19"/>
           <w:shd w:val="clear" w:color="auto" w:fill="F2F4F3"/>
         </w:rPr>
-        <w:t>group_member.rules_version</w:t>
-      </w:r>
-      <w:r>
-        <w:t xml:space="preserve"> is no longer read or written but is kept for now (expand, then contract): the previous release still writes it, so a </w:t>
-      </w:r>
-      <w:r>
-        <w:t>rollback stays safe; a later migration drops it once this release is stable. No avatar means initials, as before. A new account's Journey is empty: nothing is ticked for the student. Journey items kept on a phone before CR-006 are copied to the account by the app on first use.</w:t>
-      </w:r>
-    </w:p>
-    <w:p>
-      <w:pPr>
-        <w:spacing w:after="120"/>
-      </w:pPr>
-      <w:r>
-        <w:rPr>
-          <w:b/>
-          <w:bCs/>
-        </w:rPr>
-        <w:t>Privacy.</w:t>
-      </w:r>
-      <w:r>
-        <w:t xml:space="preserve"> The members list of a group (members only) returns usernames, avatars and senior badges, never the name, email or mobile in </w:t>
+        <w:t>opensOn</w:t>
+      </w:r>
+      <w:r>
+        <w:t xml:space="preserve"> in the journey read </w:t>
+      </w:r>
+      <w:r>
+        <w:t>model); while no date is announced it cannot be ticked, because ZedPath never invents a date. "I applied" on a followed notice can be set only once the notice has opened. The Worker checks both against the read model, using the Sri Lanka date (UTC+05:30), before writing (</w:t>
       </w:r>
       <w:r>
         <w:rPr>
@@ -13129,58 +13231,25 @@
           <w:szCs w:val="19"/>
           <w:shd w:val="clear" w:color="auto" w:fill="F2F4F3"/>
         </w:rPr>
-        <w:t>student_contact</w:t>
-      </w:r>
-      <w:r>
-        <w:t xml:space="preserve">. Every new relation cascades on account deletion. In each group's room, a message </w:t>
-      </w:r>
-      <w:r>
-        <w:t>keeps the author's avatar as it was when posted, a snapshot like the author name (a deliberate departure).</w:t>
-      </w:r>
-    </w:p>
-    <w:p>
-      <w:pPr>
-        <w:pStyle w:val="Heading2"/>
-        <w:keepNext/>
-        <w:keepLines/>
-      </w:pPr>
-      <w:bookmarkStart w:id="24" w:name="_Toc243660093"/>
-      <w:r>
-        <w:t>2.11 Demo accounts (CR-007)</w:t>
-      </w:r>
-      <w:bookmarkEnd w:id="24"/>
+        <w:t>worker/my-journey.ts</w:t>
+      </w:r>
+      <w:r>
+        <w:t>); the phone shows the same rule.</w:t>
+      </w:r>
     </w:p>
     <w:p>
       <w:pPr>
         <w:spacing w:after="120"/>
       </w:pPr>
-      <w:r>
-        <w:t xml:space="preserve">The product owner asked for a one-tap demo on the Welcome screen (15 October 2026), choosing a </w:t>
-      </w:r>
       <w:r>
         <w:rPr>
           <w:b/>
           <w:bCs/>
         </w:rPr>
-        <w:t>private copy per visitor</w:t>
-      </w:r>
-      <w:r>
-        <w:t xml:space="preserve"> over one shared account. Each tap creates a throwaway account holding the sample student; it expires 24 hours later and is deleted on a later demo tap (the free plan has no scheduled job).</w:t>
-      </w:r>
-    </w:p>
-    <w:p>
-      <w:pPr>
-        <w:spacing w:after="120"/>
-      </w:pPr>
-      <w:r>
-        <w:rPr>
-          <w:b/>
-          <w:bCs/>
-        </w:rPr>
-        <w:t>Where the fact lives.</w:t>
-      </w:r>
-      <w:r>
-        <w:t xml:space="preserve"> "This account is a demo, until T" is a single-valued fact about the account, so it is an attribute of ACCOUNT (</w:t>
+        <w:t>Data migration and safe defaults.</w:t>
+      </w:r>
+      <w:r>
+        <w:t xml:space="preserve"> Rules accepted under 0009 are carried into </w:t>
       </w:r>
       <w:r>
         <w:rPr>
@@ -13189,10 +13258,112 @@
           <w:szCs w:val="19"/>
           <w:shd w:val="clear" w:color="auto" w:fill="F2F4F3"/>
         </w:rPr>
+        <w:t>group_rules_acceptance</w:t>
+      </w:r>
+      <w:r>
+        <w:t xml:space="preserve"> with the time </w:t>
+      </w:r>
+      <w:r>
+        <w:t xml:space="preserve">of the account's first join (tested on a copy of the database as it was before 0010). </w:t>
+      </w:r>
+      <w:r>
+        <w:rPr>
+          <w:rFonts w:ascii="Consolas" w:eastAsia="Consolas" w:hAnsi="Consolas" w:cs="Consolas"/>
+          <w:sz w:val="19"/>
+          <w:szCs w:val="19"/>
+          <w:shd w:val="clear" w:color="auto" w:fill="F2F4F3"/>
+        </w:rPr>
+        <w:t>group_member.rules_version</w:t>
+      </w:r>
+      <w:r>
+        <w:t xml:space="preserve"> is no longer read or written but is kept for now (expand, then contract): the previous release still writes it, so a rollback stays safe; a later migration drops it once this release is stable. No avatar means initials, as before. A new account's Journey is empty: nothing is ticked for the student. Journey items kept on a phone before CR-006 are copied to the account by the app on first use.</w:t>
+      </w:r>
+    </w:p>
+    <w:p>
+      <w:pPr>
+        <w:spacing w:after="120"/>
+      </w:pPr>
+      <w:r>
+        <w:rPr>
+          <w:b/>
+          <w:bCs/>
+        </w:rPr>
+        <w:t>Privacy.</w:t>
+      </w:r>
+      <w:r>
+        <w:t xml:space="preserve"> The members list of a group (members only) returns usernames, avatars and senior badges, never the name, email or mobile in </w:t>
+      </w:r>
+      <w:r>
+        <w:rPr>
+          <w:rFonts w:ascii="Consolas" w:eastAsia="Consolas" w:hAnsi="Consolas" w:cs="Consolas"/>
+          <w:sz w:val="19"/>
+          <w:szCs w:val="19"/>
+          <w:shd w:val="clear" w:color="auto" w:fill="F2F4F3"/>
+        </w:rPr>
+        <w:t>student_contact</w:t>
+      </w:r>
+      <w:r>
+        <w:t>. Every new relation cascades on account deletion. In each group's room, a message keeps the author's avatar as it was when posted, a snapshot like the author name (a deliberate departure).</w:t>
+      </w:r>
+    </w:p>
+    <w:p>
+      <w:pPr>
+        <w:pStyle w:val="Heading2"/>
+        <w:keepNext/>
+        <w:keepLines/>
+      </w:pPr>
+      <w:bookmarkStart w:id="24" w:name="_Toc243662359"/>
+      <w:r>
+        <w:t>2.11 Demo accounts (CR-007)</w:t>
+      </w:r>
+      <w:bookmarkEnd w:id="24"/>
+    </w:p>
+    <w:p>
+      <w:pPr>
+        <w:spacing w:after="120"/>
+      </w:pPr>
+      <w:r>
+        <w:t xml:space="preserve">The product owner asked for a one-tap demo on the Welcome screen (15 October 2026), choosing a </w:t>
+      </w:r>
+      <w:r>
+        <w:rPr>
+          <w:b/>
+          <w:bCs/>
+        </w:rPr>
+        <w:t>private copy per visitor</w:t>
+      </w:r>
+      <w:r>
+        <w:t xml:space="preserve"> over one shared account. Each tap creates a throwaway account holding the sample student; it expires 24 hours later and is deleted on a later demo tap (the free plan has no scheduled job).</w:t>
+      </w:r>
+    </w:p>
+    <w:p>
+      <w:pPr>
+        <w:spacing w:after="120"/>
+      </w:pPr>
+      <w:r>
+        <w:rPr>
+          <w:b/>
+          <w:bCs/>
+        </w:rPr>
+        <w:t>Where the fact lives.</w:t>
+      </w:r>
+      <w:r>
+        <w:t xml:space="preserve"> "This account is a demo, until T" is a single-valued fact about the account, so it is an attribute of ACCOUNT (</w:t>
+      </w:r>
+      <w:r>
+        <w:rPr>
+          <w:rFonts w:ascii="Consolas" w:eastAsia="Consolas" w:hAnsi="Consolas" w:cs="Consolas"/>
+          <w:sz w:val="19"/>
+          <w:szCs w:val="19"/>
+          <w:shd w:val="clear" w:color="auto" w:fill="F2F4F3"/>
+        </w:rPr>
         <w:t>demo_expires_at</w:t>
       </w:r>
       <w:r>
-        <w:t>, NULL for every real account), not a new entity. Reusing ACCOUNT means every row a demo creates (profile, contact, list, Journey, sessions, memberships, rules acceptance) is already removed by the existing ON DELETE CASCADE foreign keys: no second deletion path to keep in step.</w:t>
+        <w:t xml:space="preserve">, NULL for every real account), not a new entity. Reusing ACCOUNT means every row </w:t>
+      </w:r>
+      <w:r>
+        <w:t>a demo creates (profile, contact, list, Journey, sessions, memberships, rules acceptance) is already removed by the existing ON DELETE CASCADE foreign keys: no second deletion path to keep in step.</w:t>
       </w:r>
     </w:p>
     <w:p>
@@ -13200,7 +13371,7 @@
         <w:pStyle w:val="Caption"/>
         <w:keepNext/>
       </w:pPr>
-      <w:bookmarkStart w:id="25" w:name="_Toc243660131"/>
+      <w:bookmarkStart w:id="25" w:name="_Toc243662397"/>
       <w:r>
         <w:t xml:space="preserve">Table </w:t>
       </w:r>
@@ -13242,7 +13413,7 @@
           <w:left w:w="10" w:type="dxa"/>
           <w:right w:w="10" w:type="dxa"/>
         </w:tblCellMar>
-        <w:tblLook w:val="04A0" w:firstRow="1" w:lastRow="0" w:firstColumn="1" w:lastColumn="0" w:noHBand="0" w:noVBand="1"/>
+        <w:tblLook w:val="0000" w:firstRow="0" w:lastRow="0" w:firstColumn="0" w:lastColumn="0" w:noHBand="0" w:noVBand="0"/>
       </w:tblPr>
       <w:tblGrid>
         <w:gridCol w:w="2547"/>
@@ -13643,10 +13814,7 @@
         <w:t>worker/demo-login.test.ts</w:t>
       </w:r>
       <w:r>
-        <w:t xml:space="preserve">): a demo account has a random username and an unusable random verifier (no password log-in); it reads groups but cannot create a group, report a message or post </w:t>
-      </w:r>
-      <w:r>
-        <w:t>(the group room refuses its posts); visitors never see each other's data. Real accounts are unchanged (safe default).</w:t>
+        <w:t>): a demo account has a random username and an unusable random verifier (no password log-in); it reads groups but cannot create a group, report a message or post (the group room refuses its posts); visitors never see each other's data. Real accounts are unchanged (safe default).</w:t>
       </w:r>
     </w:p>
     <w:p>
@@ -13655,8 +13823,9 @@
         <w:keepNext/>
         <w:keepLines/>
       </w:pPr>
-      <w:bookmarkStart w:id="26" w:name="_Toc243660094"/>
-      <w:r>
+      <w:bookmarkStart w:id="26" w:name="_Toc243662360"/>
+      <w:r>
+        <w:lastRenderedPageBreak/>
         <w:t>2.12 University facts from UGC statistics (read model)</w:t>
       </w:r>
       <w:bookmarkEnd w:id="26"/>
@@ -13666,11 +13835,10 @@
         <w:spacing w:after="120"/>
       </w:pPr>
       <w:r>
-        <w:t xml:space="preserve">Four facts per institution (students admitted 2023/24, undergraduates 2024, permanent hostel places, graduates 2024; Mahapola and Bursary recipients are extracted but not shown, product owner 15 Oct) come </w:t>
-      </w:r>
-      <w:r>
-        <w:lastRenderedPageBreak/>
-        <w:t xml:space="preserve">from the UGC report </w:t>
+        <w:t xml:space="preserve">Four facts per institution (students admitted 2023/24, undergraduates 2024, permanent hostel places, graduates 2024; </w:t>
+      </w:r>
+      <w:r>
+        <w:t xml:space="preserve">Mahapola and Bursary recipients are extracted but not shown, product owner 15 Oct) come from the UGC report </w:t>
       </w:r>
       <w:r>
         <w:rPr>
@@ -13680,10 +13848,7 @@
         <w:t>Sri Lanka University Statistics 2024</w:t>
       </w:r>
       <w:r>
-        <w:t xml:space="preserve">, Chapters 2, 3, 4 </w:t>
-      </w:r>
-      <w:r>
-        <w:t>and 7. They follow the read-model decision used for routes and dates: the extracts (</w:t>
+        <w:t>, Chapters 2, 3, 4 and 7. They follow the read-model decision used for routes and dates: the extracts (</w:t>
       </w:r>
       <w:r>
         <w:rPr>
@@ -13719,10 +13884,10 @@
         <w:t>worker/generated/statistics-2024.json</w:t>
       </w:r>
       <w:r>
-        <w:t xml:space="preserve">, keyed by institution letter. They are published, versioned reference data that students only read, so they are not stored in D1. Each fact keeps its </w:t>
-      </w:r>
-      <w:r>
-        <w:t>table, PDF page and URL, and the report's own caveats as flags (2024 provisional; "Information not submitted" shown as no number, never as zero; university totals that include campuses).</w:t>
+        <w:t xml:space="preserve">, keyed by institution letter. They </w:t>
+      </w:r>
+      <w:r>
+        <w:t>are published, versioned reference data that students only read, so they are not stored in D1. Each fact keeps its table, PDF page and URL, and the report's own caveats as flags (2024 provisional; "Information not submitted" shown as no number, never as zero; university totals that include campuses).</w:t>
       </w:r>
     </w:p>
     <w:p>
@@ -13731,7 +13896,7 @@
         <w:keepNext/>
         <w:keepLines/>
       </w:pPr>
-      <w:bookmarkStart w:id="27" w:name="_Toc243660095"/>
+      <w:bookmarkStart w:id="27" w:name="_Toc243662361"/>
       <w:r>
         <w:t>2.13 Rooms an account opened (security audit, lead 3)</w:t>
       </w:r>
@@ -13742,7 +13907,10 @@
         <w:spacing w:after="120"/>
       </w:pPr>
       <w:r>
-        <w:t xml:space="preserve">Group messages live in each room's Durable Object, outside D1's ON DELETE CASCADE. Deleting an account therefore has to tell each room to purge that account's messages, and before 0012 the Worker only knew the groups the account was </w:t>
+        <w:t xml:space="preserve">Group messages live in each room's Durable Object, outside D1's ON DELETE CASCADE. Deleting an account therefore has to </w:t>
+      </w:r>
+      <w:r>
+        <w:t xml:space="preserve">tell each room to purge that account's messages, and before 0012 the Worker only knew the groups the account was </w:t>
       </w:r>
       <w:r>
         <w:rPr>
@@ -13752,10 +13920,7 @@
         <w:t>still</w:t>
       </w:r>
       <w:r>
-        <w:t xml:space="preserve"> </w:t>
-      </w:r>
-      <w:r>
-        <w:t>in, so messages in groups it had left survived the deletion.</w:t>
+        <w:t xml:space="preserve"> in, so messages in groups it had left survived the deletion.</w:t>
       </w:r>
     </w:p>
     <w:p>
@@ -13770,7 +13935,10 @@
         <w:t>Where the fact lives.</w:t>
       </w:r>
       <w:r>
-        <w:t xml:space="preserve"> "Account A opened room G" is a fact about the pair, with no other attributes than when it was first seen, so it is its own relation GROUP_ROOM_SEEN (account_id, group_id, first_at), primary key (account_id, group_id), both foreign keys ON DELETE CASCADE. It is written when the live chat connects (posting is only possible over that socket). Account deletion reads it, unioned with current memberships, </w:t>
+        <w:t xml:space="preserve"> "Account A opened room G" is a fact about the pair, with no other attributes than when it was first seen, so it is its own relation GROUP_ROOM_SEEN (account_id, group_id, first_at), primary key (account_id, group_id), </w:t>
+      </w:r>
+      <w:r>
+        <w:t xml:space="preserve">both foreign keys ON DELETE CASCADE. It is written when the live chat connects (posting is only possible over that socket). Account deletion reads it, unioned with current memberships, </w:t>
       </w:r>
       <w:r>
         <w:rPr>
@@ -13789,7 +13957,7 @@
         <w:keepNext/>
         <w:keepLines/>
       </w:pPr>
-      <w:bookmarkStart w:id="28" w:name="_Toc243660096"/>
+      <w:bookmarkStart w:id="28" w:name="_Toc243662362"/>
       <w:r>
         <w:t>2.14 Entity catalogue</w:t>
       </w:r>
@@ -13800,7 +13968,7 @@
         <w:pStyle w:val="Caption"/>
         <w:keepNext/>
       </w:pPr>
-      <w:bookmarkStart w:id="29" w:name="_Toc243660132"/>
+      <w:bookmarkStart w:id="29" w:name="_Toc243662398"/>
       <w:r>
         <w:t xml:space="preserve">Table </w:t>
       </w:r>
@@ -13842,7 +14010,7 @@
           <w:left w:w="10" w:type="dxa"/>
           <w:right w:w="10" w:type="dxa"/>
         </w:tblCellMar>
-        <w:tblLook w:val="04A0" w:firstRow="1" w:lastRow="0" w:firstColumn="1" w:lastColumn="0" w:noHBand="0" w:noVBand="1"/>
+        <w:tblLook w:val="0000" w:firstRow="0" w:lastRow="0" w:firstColumn="0" w:lastColumn="0" w:noHBand="0" w:noVBand="0"/>
       </w:tblPr>
       <w:tblGrid>
         <w:gridCol w:w="1965"/>
@@ -15496,6 +15664,7 @@
                 <w:sz w:val="19"/>
                 <w:szCs w:val="19"/>
               </w:rPr>
+              <w:lastRenderedPageBreak/>
               <w:t>SOURCE_DOCUMENT</w:t>
             </w:r>
           </w:p>
@@ -15762,7 +15931,6 @@
                 <w:sz w:val="19"/>
                 <w:szCs w:val="19"/>
               </w:rPr>
-              <w:lastRenderedPageBreak/>
               <w:t>EXTRACTION_RUN, CANDIDATE_FACT</w:t>
             </w:r>
           </w:p>
@@ -17069,7 +17237,7 @@
         <w:keepLines/>
         <w:pageBreakBefore/>
       </w:pPr>
-      <w:bookmarkStart w:id="30" w:name="_Toc243660097"/>
+      <w:bookmarkStart w:id="30" w:name="_Toc243662363"/>
       <w:r>
         <w:lastRenderedPageBreak/>
         <w:t>3 Rule grammar</w:t>
@@ -17111,7 +17279,7 @@
         <w:pStyle w:val="Caption"/>
         <w:keepNext/>
       </w:pPr>
-      <w:bookmarkStart w:id="31" w:name="_Toc243660133"/>
+      <w:bookmarkStart w:id="31" w:name="_Toc243662399"/>
       <w:r>
         <w:t xml:space="preserve">Table </w:t>
       </w:r>
@@ -17153,7 +17321,7 @@
           <w:left w:w="10" w:type="dxa"/>
           <w:right w:w="10" w:type="dxa"/>
         </w:tblCellMar>
-        <w:tblLook w:val="04A0" w:firstRow="1" w:lastRow="0" w:firstColumn="1" w:lastColumn="0" w:noHBand="0" w:noVBand="1"/>
+        <w:tblLook w:val="0000" w:firstRow="0" w:lastRow="0" w:firstColumn="0" w:lastColumn="0" w:noHBand="0" w:noVBand="0"/>
       </w:tblPr>
       <w:tblGrid>
         <w:gridCol w:w="1606"/>
@@ -18482,7 +18650,7 @@
         <w:keepLines/>
         <w:pageBreakBefore/>
       </w:pPr>
-      <w:bookmarkStart w:id="32" w:name="_Toc243660098"/>
+      <w:bookmarkStart w:id="32" w:name="_Toc243662364"/>
       <w:r>
         <w:lastRenderedPageBreak/>
         <w:t>4 Mapping the EER model to relations</w:t>
@@ -18502,7 +18670,7 @@
         <w:pStyle w:val="Caption"/>
         <w:keepNext/>
       </w:pPr>
-      <w:bookmarkStart w:id="33" w:name="_Toc243660134"/>
+      <w:bookmarkStart w:id="33" w:name="_Toc243662400"/>
       <w:r>
         <w:t xml:space="preserve">Table </w:t>
       </w:r>
@@ -18544,7 +18712,7 @@
           <w:left w:w="10" w:type="dxa"/>
           <w:right w:w="10" w:type="dxa"/>
         </w:tblCellMar>
-        <w:tblLook w:val="04A0" w:firstRow="1" w:lastRow="0" w:firstColumn="1" w:lastColumn="0" w:noHBand="0" w:noVBand="1"/>
+        <w:tblLook w:val="0000" w:firstRow="0" w:lastRow="0" w:firstColumn="0" w:lastColumn="0" w:noHBand="0" w:noVBand="0"/>
       </w:tblPr>
       <w:tblGrid>
         <w:gridCol w:w="649"/>
@@ -20293,7 +20461,7 @@
         <w:pStyle w:val="Caption"/>
         <w:keepNext/>
       </w:pPr>
-      <w:bookmarkStart w:id="34" w:name="_Toc243660135"/>
+      <w:bookmarkStart w:id="34" w:name="_Toc243662401"/>
       <w:r>
         <w:lastRenderedPageBreak/>
         <w:t xml:space="preserve">Table </w:t>
@@ -20336,7 +20504,7 @@
           <w:left w:w="10" w:type="dxa"/>
           <w:right w:w="10" w:type="dxa"/>
         </w:tblCellMar>
-        <w:tblLook w:val="04A0" w:firstRow="1" w:lastRow="0" w:firstColumn="1" w:lastColumn="0" w:noHBand="0" w:noVBand="1"/>
+        <w:tblLook w:val="0000" w:firstRow="0" w:lastRow="0" w:firstColumn="0" w:lastColumn="0" w:noHBand="0" w:noVBand="0"/>
       </w:tblPr>
       <w:tblGrid>
         <w:gridCol w:w="662"/>
@@ -21405,7 +21573,7 @@
         </w:rPr>
         <w:lastRenderedPageBreak/>
         <w:drawing>
-          <wp:inline distT="0" distB="0" distL="0" distR="0" wp14:anchorId="5DD071AB" wp14:editId="5DD071AC">
+          <wp:inline distT="0" distB="0" distL="0" distR="0" wp14:anchorId="0A8A01A1" wp14:editId="0A8A01A2">
             <wp:extent cx="6124575" cy="6562725"/>
             <wp:effectExtent l="0" t="0" r="0" b="0"/>
             <wp:docPr id="6" name="relational-admission.png" descr="Logical schema, admission data (generated from the migration file)" title="Logical schema, admission data (generated from the migration file)"/>
@@ -21448,7 +21616,7 @@
       <w:pPr>
         <w:pStyle w:val="Caption"/>
       </w:pPr>
-      <w:bookmarkStart w:id="35" w:name="_Toc243660126"/>
+      <w:bookmarkStart w:id="35" w:name="_Toc243662392"/>
       <w:r>
         <w:t xml:space="preserve">Figure </w:t>
       </w:r>
@@ -21487,7 +21655,7 @@
         </w:rPr>
         <w:lastRenderedPageBreak/>
         <w:drawing>
-          <wp:inline distT="0" distB="0" distL="0" distR="0" wp14:anchorId="5DD071AD" wp14:editId="5DD071AE">
+          <wp:inline distT="0" distB="0" distL="0" distR="0" wp14:anchorId="0A8A01A3" wp14:editId="0A8A01A4">
             <wp:extent cx="6124575" cy="5562600"/>
             <wp:effectExtent l="0" t="0" r="0" b="0"/>
             <wp:docPr id="7" name="relational-trust-journey.png" descr="Logical schema, trust, routes and journey data (generated from the migration file)" title="Logical schema, trust, routes and journey data (generated from the migration file)"/>
@@ -21530,7 +21698,7 @@
       <w:pPr>
         <w:pStyle w:val="Caption"/>
       </w:pPr>
-      <w:bookmarkStart w:id="36" w:name="_Toc243660127"/>
+      <w:bookmarkStart w:id="36" w:name="_Toc243662393"/>
       <w:r>
         <w:t xml:space="preserve">Figure </w:t>
       </w:r>
@@ -21568,7 +21736,7 @@
           <w:noProof/>
         </w:rPr>
         <w:drawing>
-          <wp:inline distT="0" distB="0" distL="0" distR="0" wp14:anchorId="5DD071AF" wp14:editId="5DD071B0">
+          <wp:inline distT="0" distB="0" distL="0" distR="0" wp14:anchorId="0A8A01A5" wp14:editId="0A8A01A6">
             <wp:extent cx="6124575" cy="2305050"/>
             <wp:effectExtent l="0" t="0" r="0" b="0"/>
             <wp:docPr id="8" name="relational-accounts.png" descr="Logical schema, optional student accounts (generated from the migration files)" title="Logical schema, optional student accounts (generated from the migration files)"/>
@@ -21611,7 +21779,7 @@
       <w:pPr>
         <w:pStyle w:val="Caption"/>
       </w:pPr>
-      <w:bookmarkStart w:id="37" w:name="_Toc243660128"/>
+      <w:bookmarkStart w:id="37" w:name="_Toc243662394"/>
       <w:r>
         <w:t xml:space="preserve">Figure </w:t>
       </w:r>
@@ -21645,10 +21813,13 @@
         <w:keepLines/>
         <w:pageBreakBefore/>
       </w:pPr>
-      <w:bookmarkStart w:id="38" w:name="_Toc243660099"/>
+      <w:bookmarkStart w:id="38" w:name="_Toc243662365"/>
       <w:r>
         <w:lastRenderedPageBreak/>
-        <w:t>5 Normalisation</w:t>
+        <w:t>5 </w:t>
+      </w:r>
+      <w:r>
+        <w:t>Normalisation</w:t>
       </w:r>
       <w:bookmarkEnd w:id="38"/>
     </w:p>
@@ -21658,7 +21829,7 @@
         <w:keepNext/>
         <w:keepLines/>
       </w:pPr>
-      <w:bookmarkStart w:id="39" w:name="_Toc243660100"/>
+      <w:bookmarkStart w:id="39" w:name="_Toc243662366"/>
       <w:r>
         <w:t>5.1 From the source form to 1NF</w:t>
       </w:r>
@@ -21714,7 +21885,7 @@
         <w:keepNext/>
         <w:keepLines/>
       </w:pPr>
-      <w:bookmarkStart w:id="40" w:name="_Toc243660101"/>
+      <w:bookmarkStart w:id="40" w:name="_Toc243662367"/>
       <w:r>
         <w:t>5.2 Functional and multi-valued dependencies</w:t>
       </w:r>
@@ -21725,7 +21896,7 @@
         <w:pStyle w:val="Caption"/>
         <w:keepNext/>
       </w:pPr>
-      <w:bookmarkStart w:id="41" w:name="_Toc243660136"/>
+      <w:bookmarkStart w:id="41" w:name="_Toc243662402"/>
       <w:r>
         <w:t xml:space="preserve">Table </w:t>
       </w:r>
@@ -21767,7 +21938,7 @@
           <w:left w:w="10" w:type="dxa"/>
           <w:right w:w="10" w:type="dxa"/>
         </w:tblCellMar>
-        <w:tblLook w:val="04A0" w:firstRow="1" w:lastRow="0" w:firstColumn="1" w:lastColumn="0" w:noHBand="0" w:noVBand="1"/>
+        <w:tblLook w:val="0000" w:firstRow="0" w:lastRow="0" w:firstColumn="0" w:lastColumn="0" w:noHBand="0" w:noVBand="0"/>
       </w:tblPr>
       <w:tblGrid>
         <w:gridCol w:w="684"/>
@@ -22624,7 +22795,7 @@
         <w:keepNext/>
         <w:keepLines/>
       </w:pPr>
-      <w:bookmarkStart w:id="42" w:name="_Toc243660102"/>
+      <w:bookmarkStart w:id="42" w:name="_Toc243662368"/>
       <w:r>
         <w:t>5.3 2NF, 3NF and BCNF</w:t>
       </w:r>
@@ -22867,7 +23038,7 @@
         <w:keepNext/>
         <w:keepLines/>
       </w:pPr>
-      <w:bookmarkStart w:id="43" w:name="_Toc243660103"/>
+      <w:bookmarkStart w:id="43" w:name="_Toc243662369"/>
       <w:r>
         <w:lastRenderedPageBreak/>
         <w:t>5.4 Deliberate departures</w:t>
@@ -22879,7 +23050,7 @@
         <w:pStyle w:val="Caption"/>
         <w:keepNext/>
       </w:pPr>
-      <w:bookmarkStart w:id="44" w:name="_Toc243660137"/>
+      <w:bookmarkStart w:id="44" w:name="_Toc243662403"/>
       <w:r>
         <w:t xml:space="preserve">Table </w:t>
       </w:r>
@@ -22921,7 +23092,7 @@
           <w:left w:w="10" w:type="dxa"/>
           <w:right w:w="10" w:type="dxa"/>
         </w:tblCellMar>
-        <w:tblLook w:val="04A0" w:firstRow="1" w:lastRow="0" w:firstColumn="1" w:lastColumn="0" w:noHBand="0" w:noVBand="1"/>
+        <w:tblLook w:val="0000" w:firstRow="0" w:lastRow="0" w:firstColumn="0" w:lastColumn="0" w:noHBand="0" w:noVBand="0"/>
       </w:tblPr>
       <w:tblGrid>
         <w:gridCol w:w="3213"/>
@@ -23650,7 +23821,7 @@
         <w:keepLines/>
         <w:pageBreakBefore/>
       </w:pPr>
-      <w:bookmarkStart w:id="45" w:name="_Toc243660104"/>
+      <w:bookmarkStart w:id="45" w:name="_Toc243662370"/>
       <w:r>
         <w:lastRenderedPageBreak/>
         <w:t>6 Physical design for Cloudflare D1</w:t>
@@ -23663,7 +23834,7 @@
         <w:keepNext/>
         <w:keepLines/>
       </w:pPr>
-      <w:bookmarkStart w:id="46" w:name="_Toc243660105"/>
+      <w:bookmarkStart w:id="46" w:name="_Toc243662371"/>
       <w:r>
         <w:t>6.1 Conventions</w:t>
       </w:r>
@@ -23902,7 +24073,7 @@
         <w:keepNext/>
         <w:keepLines/>
       </w:pPr>
-      <w:bookmarkStart w:id="47" w:name="_Toc243660106"/>
+      <w:bookmarkStart w:id="47" w:name="_Toc243662372"/>
       <w:r>
         <w:t>6.2 Indexes</w:t>
       </w:r>
@@ -23913,7 +24084,7 @@
         <w:pStyle w:val="Caption"/>
         <w:keepNext/>
       </w:pPr>
-      <w:bookmarkStart w:id="48" w:name="_Toc243660138"/>
+      <w:bookmarkStart w:id="48" w:name="_Toc243662404"/>
       <w:r>
         <w:t xml:space="preserve">Table </w:t>
       </w:r>
@@ -23955,7 +24126,7 @@
           <w:left w:w="10" w:type="dxa"/>
           <w:right w:w="10" w:type="dxa"/>
         </w:tblCellMar>
-        <w:tblLook w:val="04A0" w:firstRow="1" w:lastRow="0" w:firstColumn="1" w:lastColumn="0" w:noHBand="0" w:noVBand="1"/>
+        <w:tblLook w:val="0000" w:firstRow="0" w:lastRow="0" w:firstColumn="0" w:lastColumn="0" w:noHBand="0" w:noVBand="0"/>
       </w:tblPr>
       <w:tblGrid>
         <w:gridCol w:w="4819"/>
@@ -24994,7 +25165,7 @@
         <w:keepNext/>
         <w:keepLines/>
       </w:pPr>
-      <w:bookmarkStart w:id="49" w:name="_Toc243660107"/>
+      <w:bookmarkStart w:id="49" w:name="_Toc243662373"/>
       <w:r>
         <w:lastRenderedPageBreak/>
         <w:t>6.3 Capacity against the free plan</w:t>
@@ -25006,7 +25177,7 @@
         <w:pStyle w:val="Caption"/>
         <w:keepNext/>
       </w:pPr>
-      <w:bookmarkStart w:id="50" w:name="_Toc243660139"/>
+      <w:bookmarkStart w:id="50" w:name="_Toc243662405"/>
       <w:r>
         <w:t xml:space="preserve">Table </w:t>
       </w:r>
@@ -25048,7 +25219,7 @@
           <w:left w:w="10" w:type="dxa"/>
           <w:right w:w="10" w:type="dxa"/>
         </w:tblCellMar>
-        <w:tblLook w:val="04A0" w:firstRow="1" w:lastRow="0" w:firstColumn="1" w:lastColumn="0" w:noHBand="0" w:noVBand="1"/>
+        <w:tblLook w:val="0000" w:firstRow="0" w:lastRow="0" w:firstColumn="0" w:lastColumn="0" w:noHBand="0" w:noVBand="0"/>
       </w:tblPr>
       <w:tblGrid>
         <w:gridCol w:w="4211"/>
@@ -25693,7 +25864,7 @@
         <w:keepLines/>
         <w:pageBreakBefore/>
       </w:pPr>
-      <w:bookmarkStart w:id="51" w:name="_Toc243660108"/>
+      <w:bookmarkStart w:id="51" w:name="_Toc243662374"/>
       <w:r>
         <w:lastRenderedPageBreak/>
         <w:t>7 Validation against real data</w:t>
@@ -25725,7 +25896,7 @@
         <w:pStyle w:val="Caption"/>
         <w:keepNext/>
       </w:pPr>
-      <w:bookmarkStart w:id="52" w:name="_Toc243660140"/>
+      <w:bookmarkStart w:id="52" w:name="_Toc243662406"/>
       <w:r>
         <w:t xml:space="preserve">Table </w:t>
       </w:r>
@@ -25767,7 +25938,7 @@
           <w:left w:w="10" w:type="dxa"/>
           <w:right w:w="10" w:type="dxa"/>
         </w:tblCellMar>
-        <w:tblLook w:val="04A0" w:firstRow="1" w:lastRow="0" w:firstColumn="1" w:lastColumn="0" w:noHBand="0" w:noVBand="1"/>
+        <w:tblLook w:val="0000" w:firstRow="0" w:lastRow="0" w:firstColumn="0" w:lastColumn="0" w:noHBand="0" w:noVBand="0"/>
       </w:tblPr>
       <w:tblGrid>
         <w:gridCol w:w="6544"/>
@@ -27175,7 +27346,7 @@
         <w:pStyle w:val="Caption"/>
         <w:keepNext/>
       </w:pPr>
-      <w:bookmarkStart w:id="53" w:name="_Toc243660141"/>
+      <w:bookmarkStart w:id="53" w:name="_Toc243662407"/>
       <w:r>
         <w:t xml:space="preserve">Table </w:t>
       </w:r>
@@ -27217,7 +27388,7 @@
           <w:left w:w="10" w:type="dxa"/>
           <w:right w:w="10" w:type="dxa"/>
         </w:tblCellMar>
-        <w:tblLook w:val="04A0" w:firstRow="1" w:lastRow="0" w:firstColumn="1" w:lastColumn="0" w:noHBand="0" w:noVBand="1"/>
+        <w:tblLook w:val="0000" w:firstRow="0" w:lastRow="0" w:firstColumn="0" w:lastColumn="0" w:noHBand="0" w:noVBand="0"/>
       </w:tblPr>
       <w:tblGrid>
         <w:gridCol w:w="4819"/>
@@ -27917,7 +28088,7 @@
         <w:keepLines/>
         <w:pageBreakBefore/>
       </w:pPr>
-      <w:bookmarkStart w:id="54" w:name="_Toc243660109"/>
+      <w:bookmarkStart w:id="54" w:name="_Toc243662375"/>
       <w:r>
         <w:lastRenderedPageBreak/>
         <w:t>Appendix A: Traceability: requirements to tables</w:t>
@@ -27929,7 +28100,7 @@
         <w:pStyle w:val="Caption"/>
         <w:keepNext/>
       </w:pPr>
-      <w:bookmarkStart w:id="55" w:name="_Toc243660142"/>
+      <w:bookmarkStart w:id="55" w:name="_Toc243662408"/>
       <w:r>
         <w:t xml:space="preserve">Table </w:t>
       </w:r>
@@ -27971,7 +28142,7 @@
           <w:left w:w="10" w:type="dxa"/>
           <w:right w:w="10" w:type="dxa"/>
         </w:tblCellMar>
-        <w:tblLook w:val="04A0" w:firstRow="1" w:lastRow="0" w:firstColumn="1" w:lastColumn="0" w:noHBand="0" w:noVBand="1"/>
+        <w:tblLook w:val="0000" w:firstRow="0" w:lastRow="0" w:firstColumn="0" w:lastColumn="0" w:noHBand="0" w:noVBand="0"/>
       </w:tblPr>
       <w:tblGrid>
         <w:gridCol w:w="4819"/>
@@ -30164,7 +30335,7 @@
         <w:keepLines/>
         <w:pageBreakBefore/>
       </w:pPr>
-      <w:bookmarkStart w:id="56" w:name="_Toc243660110"/>
+      <w:bookmarkStart w:id="56" w:name="_Toc243662376"/>
       <w:r>
         <w:lastRenderedPageBreak/>
         <w:t>Appendix B: Physical schema (migration 0001)</w:t>
@@ -35377,7 +35548,7 @@
         <w:keepLines/>
         <w:pageBreakBefore/>
       </w:pPr>
-      <w:bookmarkStart w:id="57" w:name="_Toc243660111"/>
+      <w:bookmarkStart w:id="57" w:name="_Toc243662377"/>
       <w:r>
         <w:lastRenderedPageBreak/>
         <w:t>Appendix C: Student accounts (migration 0003)</w:t>
@@ -37110,7 +37281,7 @@
         <w:keepLines/>
         <w:pageBreakBefore/>
       </w:pPr>
-      <w:bookmarkStart w:id="58" w:name="_Toc243660112"/>
+      <w:bookmarkStart w:id="58" w:name="_Toc243662378"/>
       <w:r>
         <w:lastRenderedPageBreak/>
         <w:t>Appendix D: Contact details (migration 0007)</w:t>
@@ -37506,7 +37677,7 @@
         <w:keepLines/>
         <w:pageBreakBefore/>
       </w:pPr>
-      <w:bookmarkStart w:id="59" w:name="_Toc243660113"/>
+      <w:bookmarkStart w:id="59" w:name="_Toc243662379"/>
       <w:r>
         <w:lastRenderedPageBreak/>
         <w:t>Appendix E: Answer feedback (migration 0008)</w:t>
@@ -37817,7 +37988,7 @@
         <w:keepLines/>
         <w:pageBreakBefore/>
       </w:pPr>
-      <w:bookmarkStart w:id="60" w:name="_Toc243660114"/>
+      <w:bookmarkStart w:id="60" w:name="_Toc243662380"/>
       <w:r>
         <w:lastRenderedPageBreak/>
         <w:t>Appendix F: Journey, avatars and group rules on the account (migration 0010)</w:t>
@@ -42833,7 +43004,7 @@
         <w:keepLines/>
         <w:pageBreakBefore/>
       </w:pPr>
-      <w:bookmarkStart w:id="61" w:name="_Toc243660115"/>
+      <w:bookmarkStart w:id="61" w:name="_Toc243662381"/>
       <w:r>
         <w:lastRenderedPageBreak/>
         <w:t>Appendix G: Rooms an account opened (migration 0012)</w:t>
@@ -43110,7 +43281,7 @@
         <w:keepLines/>
         <w:pageBreakBefore/>
       </w:pPr>
-      <w:bookmarkStart w:id="62" w:name="_Toc243660116"/>
+      <w:bookmarkStart w:id="62" w:name="_Toc243662382"/>
       <w:r>
         <w:lastRenderedPageBreak/>
         <w:t>Appendix H: Demo accounts (migration 0011)</w:t>
@@ -43302,7 +43473,7 @@
         <w:keepLines/>
         <w:pageBreakBefore/>
       </w:pPr>
-      <w:bookmarkStart w:id="63" w:name="_Toc243660117"/>
+      <w:bookmarkStart w:id="63" w:name="_Toc243662383"/>
       <w:r>
         <w:lastRenderedPageBreak/>
         <w:t>Appendix I: Group rules (migration 0009)</w:t>
@@ -43443,7 +43614,7 @@
         <w:keepLines/>
         <w:pageBreakBefore/>
       </w:pPr>
-      <w:bookmarkStart w:id="64" w:name="_Toc243660118"/>
+      <w:bookmarkStart w:id="64" w:name="_Toc243662384"/>
       <w:r>
         <w:lastRenderedPageBreak/>
         <w:t>Appendix J: Groups (migration 0006)</w:t>
@@ -44696,7 +44867,7 @@
         <w:keepLines/>
         <w:pageBreakBefore/>
       </w:pPr>
-      <w:bookmarkStart w:id="65" w:name="_Toc243660119"/>
+      <w:bookmarkStart w:id="65" w:name="_Toc243662385"/>
       <w:r>
         <w:lastRenderedPageBreak/>
         <w:t>Appendix K: Glossary</w:t>
@@ -44708,7 +44879,7 @@
         <w:pStyle w:val="Caption"/>
         <w:keepNext/>
       </w:pPr>
-      <w:bookmarkStart w:id="66" w:name="_Toc243660143"/>
+      <w:bookmarkStart w:id="66" w:name="_Toc243662409"/>
       <w:r>
         <w:t xml:space="preserve">Table </w:t>
       </w:r>
@@ -44750,7 +44921,7 @@
           <w:left w:w="10" w:type="dxa"/>
           <w:right w:w="10" w:type="dxa"/>
         </w:tblCellMar>
-        <w:tblLook w:val="04A0" w:firstRow="1" w:lastRow="0" w:firstColumn="1" w:lastColumn="0" w:noHBand="0" w:noVBand="1"/>
+        <w:tblLook w:val="0000" w:firstRow="0" w:lastRow="0" w:firstColumn="0" w:lastColumn="0" w:noHBand="0" w:noVBand="0"/>
       </w:tblPr>
       <w:tblGrid>
         <w:gridCol w:w="2928"/>
@@ -45425,7 +45596,7 @@
         <w:keepLines/>
         <w:pageBreakBefore/>
       </w:pPr>
-      <w:bookmarkStart w:id="67" w:name="_Toc243660120"/>
+      <w:bookmarkStart w:id="67" w:name="_Toc243662386"/>
       <w:r>
         <w:lastRenderedPageBreak/>
         <w:t>Appendix L: References</w:t>
@@ -45437,7 +45608,7 @@
         <w:pStyle w:val="Caption"/>
         <w:keepNext/>
       </w:pPr>
-      <w:bookmarkStart w:id="68" w:name="_Toc243660144"/>
+      <w:bookmarkStart w:id="68" w:name="_Toc243662410"/>
       <w:r>
         <w:t xml:space="preserve">Table </w:t>
       </w:r>
@@ -45479,7 +45650,7 @@
           <w:left w:w="10" w:type="dxa"/>
           <w:right w:w="10" w:type="dxa"/>
         </w:tblCellMar>
-        <w:tblLook w:val="04A0" w:firstRow="1" w:lastRow="0" w:firstColumn="1" w:lastColumn="0" w:noHBand="0" w:noVBand="1"/>
+        <w:tblLook w:val="0000" w:firstRow="0" w:lastRow="0" w:firstColumn="0" w:lastColumn="0" w:noHBand="0" w:noVBand="0"/>
       </w:tblPr>
       <w:tblGrid>
         <w:gridCol w:w="803"/>
@@ -46368,96 +46539,10 @@
 <file path=word/numbering.xml><?xml version="1.0" encoding="utf-8"?>
 <w:numbering xmlns:wpc="http://schemas.microsoft.com/office/word/2010/wordprocessingCanvas" xmlns:cx="http://schemas.microsoft.com/office/drawing/2014/chartex" xmlns:cx1="http://schemas.microsoft.com/office/drawing/2015/9/8/chartex" xmlns:cx2="http://schemas.microsoft.com/office/drawing/2015/10/21/chartex" xmlns:cx3="http://schemas.microsoft.com/office/drawing/2016/5/9/chartex" xmlns:cx4="http://schemas.microsoft.com/office/drawing/2016/5/10/chartex" xmlns:cx5="http://schemas.microsoft.com/office/drawing/2016/5/11/chartex" xmlns:cx6="http://schemas.microsoft.com/office/drawing/2016/5/12/chartex" xmlns:cx7="http://schemas.microsoft.com/office/drawing/2016/5/13/chartex" xmlns:cx8="http://schemas.microsoft.com/office/drawing/2016/5/14/chartex" xmlns:mc="http://schemas.openxmlformats.org/markup-compatibility/2006" xmlns:aink="http://schemas.microsoft.com/office/drawing/2016/ink" xmlns:am3d="http://schemas.microsoft.com/office/drawing/2017/model3d" xmlns:o="urn:schemas-microsoft-com:office:office" xmlns:oel="http://schemas.microsoft.com/office/2019/extlst" xmlns:r="http://schemas.openxmlformats.org/officeDocument/2006/relationships" xmlns:m="http://schemas.openxmlformats.org/officeDocument/2006/math" xmlns:v="urn:schemas-microsoft-com:vml" xmlns:wp14="http://schemas.microsoft.com/office/word/2010/wordprocessingDrawing" xmlns:wp="http://schemas.openxmlformats.org/drawingml/2006/wordprocessingDrawing" xmlns:w10="urn:schemas-microsoft-com:office:word" xmlns:w="http://schemas.openxmlformats.org/wordprocessingml/2006/main" xmlns:w14="http://schemas.microsoft.com/office/word/2010/wordml" xmlns:w15="http://schemas.microsoft.com/office/word/2012/wordml" xmlns:w16cex="http://schemas.microsoft.com/office/word/2018/wordml/cex" xmlns:w16cid="http://schemas.microsoft.com/office/word/2016/wordml/cid" xmlns:w16="http://schemas.microsoft.com/office/word/2018/wordml" xmlns:w16du="http://schemas.microsoft.com/office/word/2023/wordml/word16du" xmlns:w16sdtdh="http://schemas.microsoft.com/office/word/2020/wordml/sdtdatahash" xmlns:w16sdtfl="http://schemas.microsoft.com/office/word/2024/wordml/sdtformatlock" xmlns:w16se="http://schemas.microsoft.com/office/word/2015/wordml/symex" xmlns:wpg="http://schemas.microsoft.com/office/word/2010/wordprocessingGroup" xmlns:wpi="http://schemas.microsoft.com/office/word/2010/wordprocessingInk" xmlns:wne="http://schemas.microsoft.com/office/word/2006/wordml" xmlns:wps="http://schemas.microsoft.com/office/word/2010/wordprocessingShape" mc:Ignorable="w14 w15 w16se w16cid w16 w16cex w16sdtdh w16sdtfl w16du wp14">
   <w:abstractNum w:abstractNumId="0" w15:restartNumberingAfterBreak="0">
-    <w:nsid w:val="1F8B3E45"/>
+    <w:nsid w:val="24743E7C"/>
     <w:multiLevelType w:val="hybridMultilevel"/>
-    <w:tmpl w:val="EE528136"/>
-    <w:lvl w:ilvl="0" w:tplc="6AEEB870" w:tentative="1">
-      <w:start w:val="1"/>
-      <w:numFmt w:val="bullet"/>
-      <w:lvlText w:val="●"/>
-      <w:lvlJc w:val="left"/>
-      <w:pPr>
-        <w:ind w:left="720" w:hanging="360"/>
-      </w:pPr>
-    </w:lvl>
-    <w:lvl w:ilvl="1" w:tplc="34CE1DF2" w:tentative="1">
-      <w:start w:val="1"/>
-      <w:numFmt w:val="bullet"/>
-      <w:lvlText w:val="○"/>
-      <w:lvlJc w:val="left"/>
-      <w:pPr>
-        <w:ind w:left="1440" w:hanging="360"/>
-      </w:pPr>
-    </w:lvl>
-    <w:lvl w:ilvl="2" w:tplc="21E83128" w:tentative="1">
-      <w:start w:val="1"/>
-      <w:numFmt w:val="bullet"/>
-      <w:lvlText w:val="■"/>
-      <w:lvlJc w:val="left"/>
-      <w:pPr>
-        <w:ind w:left="2160" w:hanging="360"/>
-      </w:pPr>
-    </w:lvl>
-    <w:lvl w:ilvl="3" w:tplc="3976ACE2" w:tentative="1">
-      <w:start w:val="1"/>
-      <w:numFmt w:val="bullet"/>
-      <w:lvlText w:val="●"/>
-      <w:lvlJc w:val="left"/>
-      <w:pPr>
-        <w:ind w:left="2880" w:hanging="360"/>
-      </w:pPr>
-    </w:lvl>
-    <w:lvl w:ilvl="4" w:tplc="DAFA5F1E" w:tentative="1">
-      <w:start w:val="1"/>
-      <w:numFmt w:val="bullet"/>
-      <w:lvlText w:val="○"/>
-      <w:lvlJc w:val="left"/>
-      <w:pPr>
-        <w:ind w:left="3600" w:hanging="360"/>
-      </w:pPr>
-    </w:lvl>
-    <w:lvl w:ilvl="5" w:tplc="6FD6CACE" w:tentative="1">
-      <w:start w:val="1"/>
-      <w:numFmt w:val="bullet"/>
-      <w:lvlText w:val="■"/>
-      <w:lvlJc w:val="left"/>
-      <w:pPr>
-        <w:ind w:left="4320" w:hanging="360"/>
-      </w:pPr>
-    </w:lvl>
-    <w:lvl w:ilvl="6" w:tplc="B7CA3B0C" w:tentative="1">
-      <w:start w:val="1"/>
-      <w:numFmt w:val="bullet"/>
-      <w:lvlText w:val="●"/>
-      <w:lvlJc w:val="left"/>
-      <w:pPr>
-        <w:ind w:left="5040" w:hanging="360"/>
-      </w:pPr>
-    </w:lvl>
-    <w:lvl w:ilvl="7" w:tplc="8B083AAE" w:tentative="1">
-      <w:start w:val="1"/>
-      <w:numFmt w:val="bullet"/>
-      <w:lvlText w:val="●"/>
-      <w:lvlJc w:val="left"/>
-      <w:pPr>
-        <w:ind w:left="5760" w:hanging="360"/>
-      </w:pPr>
-    </w:lvl>
-    <w:lvl w:ilvl="8" w:tplc="AD6CAA5E" w:tentative="1">
-      <w:start w:val="1"/>
-      <w:numFmt w:val="bullet"/>
-      <w:lvlText w:val="●"/>
-      <w:lvlJc w:val="left"/>
-      <w:pPr>
-        <w:ind w:left="6480" w:hanging="360"/>
-      </w:pPr>
-    </w:lvl>
-  </w:abstractNum>
-  <w:abstractNum w:abstractNumId="1" w15:restartNumberingAfterBreak="0">
-    <w:nsid w:val="5E8B4E5A"/>
-    <w:multiLevelType w:val="hybridMultilevel"/>
-    <w:tmpl w:val="4D2C0AB8"/>
-    <w:lvl w:ilvl="0" w:tplc="B8505294">
+    <w:tmpl w:val="A71089E0"/>
+    <w:lvl w:ilvl="0" w:tplc="CE341A62">
       <w:start w:val="1"/>
       <w:numFmt w:val="bullet"/>
       <w:lvlText w:val="•"/>
@@ -46466,7 +46551,7 @@
         <w:ind w:left="720" w:hanging="280"/>
       </w:pPr>
     </w:lvl>
-    <w:lvl w:ilvl="1" w:tplc="823A78C6" w:tentative="1">
+    <w:lvl w:ilvl="1" w:tplc="64FEDDBE" w:tentative="1">
       <w:start w:val="1"/>
       <w:numFmt w:val="bullet"/>
       <w:lvlText w:val="–"/>
@@ -46475,7 +46560,7 @@
         <w:ind w:left="1080" w:hanging="280"/>
       </w:pPr>
     </w:lvl>
-    <w:lvl w:ilvl="2" w:tplc="B13E303A" w:tentative="1">
+    <w:lvl w:ilvl="2" w:tplc="828A6A4C" w:tentative="1">
       <w:start w:val="1"/>
       <w:numFmt w:val="bullet"/>
       <w:lvlText w:val="▪"/>
@@ -46484,113 +46569,199 @@
         <w:ind w:left="1440" w:hanging="280"/>
       </w:pPr>
     </w:lvl>
-    <w:lvl w:ilvl="3" w:tplc="9D0A3222">
+    <w:lvl w:ilvl="3" w:tplc="5A721D10">
       <w:numFmt w:val="decimal"/>
       <w:lvlText w:val=""/>
       <w:lvlJc w:val="left"/>
     </w:lvl>
-    <w:lvl w:ilvl="4" w:tplc="90ACB74E">
+    <w:lvl w:ilvl="4" w:tplc="3AD69742">
       <w:numFmt w:val="decimal"/>
       <w:lvlText w:val=""/>
       <w:lvlJc w:val="left"/>
     </w:lvl>
-    <w:lvl w:ilvl="5" w:tplc="C1740A28">
+    <w:lvl w:ilvl="5" w:tplc="3EFCC4C4">
       <w:numFmt w:val="decimal"/>
       <w:lvlText w:val=""/>
       <w:lvlJc w:val="left"/>
     </w:lvl>
-    <w:lvl w:ilvl="6" w:tplc="044C2050">
+    <w:lvl w:ilvl="6" w:tplc="50E24560">
       <w:numFmt w:val="decimal"/>
       <w:lvlText w:val=""/>
       <w:lvlJc w:val="left"/>
     </w:lvl>
-    <w:lvl w:ilvl="7" w:tplc="166C9D40">
+    <w:lvl w:ilvl="7" w:tplc="C270C476">
       <w:numFmt w:val="decimal"/>
       <w:lvlText w:val=""/>
       <w:lvlJc w:val="left"/>
     </w:lvl>
-    <w:lvl w:ilvl="8" w:tplc="30F8EE92">
+    <w:lvl w:ilvl="8" w:tplc="61661B80">
+      <w:numFmt w:val="decimal"/>
+      <w:lvlText w:val=""/>
+      <w:lvlJc w:val="left"/>
+    </w:lvl>
+  </w:abstractNum>
+  <w:abstractNum w:abstractNumId="1" w15:restartNumberingAfterBreak="0">
+    <w:nsid w:val="5B4F205D"/>
+    <w:multiLevelType w:val="hybridMultilevel"/>
+    <w:tmpl w:val="78CA5422"/>
+    <w:lvl w:ilvl="0" w:tplc="1A268AE8" w:tentative="1">
+      <w:start w:val="1"/>
+      <w:numFmt w:val="decimal"/>
+      <w:lvlText w:val="%1."/>
+      <w:lvlJc w:val="left"/>
+      <w:pPr>
+        <w:ind w:left="720" w:hanging="360"/>
+      </w:pPr>
+    </w:lvl>
+    <w:lvl w:ilvl="1" w:tplc="637607CC" w:tentative="1">
+      <w:start w:val="1"/>
+      <w:numFmt w:val="lowerLetter"/>
+      <w:lvlText w:val="%2."/>
+      <w:lvlJc w:val="left"/>
+      <w:pPr>
+        <w:ind w:left="1080" w:hanging="360"/>
+      </w:pPr>
+    </w:lvl>
+    <w:lvl w:ilvl="2" w:tplc="5E72D36C" w:tentative="1">
+      <w:start w:val="1"/>
+      <w:numFmt w:val="lowerRoman"/>
+      <w:lvlText w:val="%3."/>
+      <w:lvlJc w:val="left"/>
+      <w:pPr>
+        <w:ind w:left="1440" w:hanging="360"/>
+      </w:pPr>
+    </w:lvl>
+    <w:lvl w:ilvl="3" w:tplc="96BC1FC8">
+      <w:numFmt w:val="decimal"/>
+      <w:lvlText w:val=""/>
+      <w:lvlJc w:val="left"/>
+    </w:lvl>
+    <w:lvl w:ilvl="4" w:tplc="89261372">
+      <w:numFmt w:val="decimal"/>
+      <w:lvlText w:val=""/>
+      <w:lvlJc w:val="left"/>
+    </w:lvl>
+    <w:lvl w:ilvl="5" w:tplc="5CCC7EDC">
+      <w:numFmt w:val="decimal"/>
+      <w:lvlText w:val=""/>
+      <w:lvlJc w:val="left"/>
+    </w:lvl>
+    <w:lvl w:ilvl="6" w:tplc="64F0C934">
+      <w:numFmt w:val="decimal"/>
+      <w:lvlText w:val=""/>
+      <w:lvlJc w:val="left"/>
+    </w:lvl>
+    <w:lvl w:ilvl="7" w:tplc="7DA6B00E">
+      <w:numFmt w:val="decimal"/>
+      <w:lvlText w:val=""/>
+      <w:lvlJc w:val="left"/>
+    </w:lvl>
+    <w:lvl w:ilvl="8" w:tplc="A2DAFC58">
       <w:numFmt w:val="decimal"/>
       <w:lvlText w:val=""/>
       <w:lvlJc w:val="left"/>
     </w:lvl>
   </w:abstractNum>
   <w:abstractNum w:abstractNumId="2" w15:restartNumberingAfterBreak="0">
-    <w:nsid w:val="696D478D"/>
+    <w:nsid w:val="6A516A10"/>
     <w:multiLevelType w:val="hybridMultilevel"/>
-    <w:tmpl w:val="85743D76"/>
-    <w:lvl w:ilvl="0" w:tplc="3012AE44" w:tentative="1">
+    <w:tmpl w:val="8410D550"/>
+    <w:lvl w:ilvl="0" w:tplc="E77C30AA" w:tentative="1">
       <w:start w:val="1"/>
-      <w:numFmt w:val="decimal"/>
-      <w:lvlText w:val="%1."/>
+      <w:numFmt w:val="bullet"/>
+      <w:lvlText w:val="●"/>
       <w:lvlJc w:val="left"/>
       <w:pPr>
         <w:ind w:left="720" w:hanging="360"/>
       </w:pPr>
     </w:lvl>
-    <w:lvl w:ilvl="1" w:tplc="DD663B50" w:tentative="1">
+    <w:lvl w:ilvl="1" w:tplc="75862BE4" w:tentative="1">
       <w:start w:val="1"/>
-      <w:numFmt w:val="lowerLetter"/>
-      <w:lvlText w:val="%2."/>
+      <w:numFmt w:val="bullet"/>
+      <w:lvlText w:val="○"/>
       <w:lvlJc w:val="left"/>
       <w:pPr>
-        <w:ind w:left="1080" w:hanging="360"/>
+        <w:ind w:left="1440" w:hanging="360"/>
       </w:pPr>
     </w:lvl>
-    <w:lvl w:ilvl="2" w:tplc="BE66C310" w:tentative="1">
+    <w:lvl w:ilvl="2" w:tplc="1F8CB3CC" w:tentative="1">
       <w:start w:val="1"/>
-      <w:numFmt w:val="lowerRoman"/>
-      <w:lvlText w:val="%3."/>
+      <w:numFmt w:val="bullet"/>
+      <w:lvlText w:val="■"/>
       <w:lvlJc w:val="left"/>
       <w:pPr>
-        <w:ind w:left="1440" w:hanging="360"/>
+        <w:ind w:left="2160" w:hanging="360"/>
       </w:pPr>
     </w:lvl>
-    <w:lvl w:ilvl="3" w:tplc="BD90D4F6">
-      <w:numFmt w:val="decimal"/>
-      <w:lvlText w:val=""/>
+    <w:lvl w:ilvl="3" w:tplc="34C280A2" w:tentative="1">
+      <w:start w:val="1"/>
+      <w:numFmt w:val="bullet"/>
+      <w:lvlText w:val="●"/>
       <w:lvlJc w:val="left"/>
+      <w:pPr>
+        <w:ind w:left="2880" w:hanging="360"/>
+      </w:pPr>
     </w:lvl>
-    <w:lvl w:ilvl="4" w:tplc="A044B75C">
-      <w:numFmt w:val="decimal"/>
-      <w:lvlText w:val=""/>
+    <w:lvl w:ilvl="4" w:tplc="5BAEAE7C" w:tentative="1">
+      <w:start w:val="1"/>
+      <w:numFmt w:val="bullet"/>
+      <w:lvlText w:val="○"/>
       <w:lvlJc w:val="left"/>
+      <w:pPr>
+        <w:ind w:left="3600" w:hanging="360"/>
+      </w:pPr>
     </w:lvl>
-    <w:lvl w:ilvl="5" w:tplc="E182FD08">
-      <w:numFmt w:val="decimal"/>
-      <w:lvlText w:val=""/>
+    <w:lvl w:ilvl="5" w:tplc="393C3572" w:tentative="1">
+      <w:start w:val="1"/>
+      <w:numFmt w:val="bullet"/>
+      <w:lvlText w:val="■"/>
       <w:lvlJc w:val="left"/>
+      <w:pPr>
+        <w:ind w:left="4320" w:hanging="360"/>
+      </w:pPr>
     </w:lvl>
-    <w:lvl w:ilvl="6" w:tplc="A50AFA50">
-      <w:numFmt w:val="decimal"/>
-      <w:lvlText w:val=""/>
+    <w:lvl w:ilvl="6" w:tplc="B09AB69E" w:tentative="1">
+      <w:start w:val="1"/>
+      <w:numFmt w:val="bullet"/>
+      <w:lvlText w:val="●"/>
       <w:lvlJc w:val="left"/>
+      <w:pPr>
+        <w:ind w:left="5040" w:hanging="360"/>
+      </w:pPr>
     </w:lvl>
-    <w:lvl w:ilvl="7" w:tplc="6D189414">
-      <w:numFmt w:val="decimal"/>
-      <w:lvlText w:val=""/>
+    <w:lvl w:ilvl="7" w:tplc="83024642" w:tentative="1">
+      <w:start w:val="1"/>
+      <w:numFmt w:val="bullet"/>
+      <w:lvlText w:val="●"/>
       <w:lvlJc w:val="left"/>
+      <w:pPr>
+        <w:ind w:left="5760" w:hanging="360"/>
+      </w:pPr>
     </w:lvl>
-    <w:lvl w:ilvl="8" w:tplc="5F2CA256">
-      <w:numFmt w:val="decimal"/>
-      <w:lvlText w:val=""/>
+    <w:lvl w:ilvl="8" w:tplc="C49AD592" w:tentative="1">
+      <w:start w:val="1"/>
+      <w:numFmt w:val="bullet"/>
+      <w:lvlText w:val="●"/>
       <w:lvlJc w:val="left"/>
+      <w:pPr>
+        <w:ind w:left="6480" w:hanging="360"/>
+      </w:pPr>
     </w:lvl>
   </w:abstractNum>
-  <w:num w:numId="1" w16cid:durableId="1601061489">
+  <w:num w:numId="1" w16cid:durableId="1813937176">
+    <w:abstractNumId w:val="2"/>
+    <w:lvlOverride w:ilvl="0">
+      <w:startOverride w:val="1"/>
+    </w:lvlOverride>
+  </w:num>
+  <w:num w:numId="2" w16cid:durableId="1724132140">
     <w:abstractNumId w:val="0"/>
     <w:lvlOverride w:ilvl="0">
       <w:startOverride w:val="1"/>
     </w:lvlOverride>
   </w:num>
-  <w:num w:numId="2" w16cid:durableId="1876964285">
-    <w:abstractNumId w:val="1"/>
-    <w:lvlOverride w:ilvl="0">
-      <w:startOverride w:val="1"/>
-    </w:lvlOverride>
-  </w:num>
-  <w:num w:numId="3" w16cid:durableId="1718165558">
-    <w:abstractNumId w:val="1"/>
+  <w:num w:numId="3" w16cid:durableId="427774021">
+    <w:abstractNumId w:val="0"/>
     <w:lvlOverride w:ilvl="0">
       <w:startOverride w:val="1"/>
     </w:lvlOverride>
@@ -47294,7 +47465,7 @@
     <w:autoRedefine/>
     <w:uiPriority w:val="39"/>
     <w:unhideWhenUsed/>
-    <w:rsid w:val="00353CBA"/>
+    <w:rsid w:val="00C125C7"/>
     <w:pPr>
       <w:spacing w:after="100"/>
     </w:pPr>
@@ -47306,7 +47477,7 @@
     <w:autoRedefine/>
     <w:uiPriority w:val="39"/>
     <w:unhideWhenUsed/>
-    <w:rsid w:val="00353CBA"/>
+    <w:rsid w:val="00C125C7"/>
     <w:pPr>
       <w:spacing w:after="100"/>
       <w:ind w:left="210"/>
@@ -47318,7 +47489,7 @@
     <w:next w:val="Normal"/>
     <w:uiPriority w:val="99"/>
     <w:unhideWhenUsed/>
-    <w:rsid w:val="00353CBA"/>
+    <w:rsid w:val="00C125C7"/>
   </w:style>
 </w:styles>
 </file>

</xml_diff>

<commit_message>
CR-013 Career-first mode: "Who do you want to become?" below My list (Praveen: "outcome driven mode")
- Twelve curated careers (en/si/ta) mapped to UGC courses by course code, other paths by id or by words in
  their programme titles, and a licence step only with a checked official source (SLMC for doctors and
  dentists). A career shows the student's banded courses (best chance first), the courses their subjects
  close, the other ways in with costs and matched programmes; unmapped careers fall back to search.
- One more host blocked (unsafe content, not linked); no licence step shown for lawyers until a safe source exists.
- shared/careers.ts (pure) + TC-147 (7); 577 passed. ZP-DOC-02/03 (US-509, FR-317 to FR-319, 2.2 draft),
  05, 07, 08, README.

Co-Authored-By: Claude Opus 5.5 (1M context) <noreply@anthropic.com>
</commit_message>
<xml_diff>
--- a/docs/05-data-design/ZP-DOC-05_Data-Design.docx
+++ b/docs/05-data-design/ZP-DOC-05_Data-Design.docx
@@ -90,7 +90,7 @@
           <w:left w:w="10" w:type="dxa"/>
           <w:right w:w="10" w:type="dxa"/>
         </w:tblCellMar>
-        <w:tblLook w:val="0000" w:firstRow="0" w:lastRow="0" w:firstColumn="0" w:lastColumn="0" w:noHBand="0" w:noVBand="0"/>
+        <w:tblLook w:val="04A0" w:firstRow="1" w:lastRow="0" w:firstColumn="1" w:lastColumn="0" w:noHBand="0" w:noVBand="1"/>
       </w:tblPr>
       <w:tblGrid>
         <w:gridCol w:w="2600"/>
@@ -494,7 +494,7 @@
           <w:left w:w="10" w:type="dxa"/>
           <w:right w:w="10" w:type="dxa"/>
         </w:tblCellMar>
-        <w:tblLook w:val="0000" w:firstRow="0" w:lastRow="0" w:firstColumn="0" w:lastColumn="0" w:noHBand="0" w:noVBand="0"/>
+        <w:tblLook w:val="04A0" w:firstRow="1" w:lastRow="0" w:firstColumn="1" w:lastColumn="0" w:noHBand="0" w:noVBand="1"/>
       </w:tblPr>
       <w:tblGrid>
         <w:gridCol w:w="2600"/>
@@ -1189,7 +1189,7 @@
           <w:left w:w="10" w:type="dxa"/>
           <w:right w:w="10" w:type="dxa"/>
         </w:tblCellMar>
-        <w:tblLook w:val="0000" w:firstRow="0" w:lastRow="0" w:firstColumn="0" w:lastColumn="0" w:noHBand="0" w:noVBand="0"/>
+        <w:tblLook w:val="04A0" w:firstRow="1" w:lastRow="0" w:firstColumn="1" w:lastColumn="0" w:noHBand="0" w:noVBand="1"/>
       </w:tblPr>
       <w:tblGrid>
         <w:gridCol w:w="964"/>
@@ -2600,6 +2600,122 @@
                 <w:sz w:val="19"/>
                 <w:szCs w:val="19"/>
               </w:rPr>
+              <w:t>CR-013: curated career map in `shared/careers.ts` (reference data, no D1 change)</w:t>
+            </w:r>
+          </w:p>
+        </w:tc>
+      </w:tr>
+      <w:tr>
+        <w:tblPrEx>
+          <w:tblCellMar>
+            <w:top w:w="0" w:type="dxa"/>
+            <w:bottom w:w="0" w:type="dxa"/>
+          </w:tblCellMar>
+        </w:tblPrEx>
+        <w:trPr>
+          <w:cantSplit/>
+          <w:trHeight w:val="420"/>
+        </w:trPr>
+        <w:tc>
+          <w:tcPr>
+            <w:tcW w:w="964" w:type="dxa"/>
+            <w:tcBorders>
+              <w:top w:val="single" w:sz="4" w:space="0" w:color="C9D3D0"/>
+              <w:left w:val="single" w:sz="4" w:space="0" w:color="C9D3D0"/>
+              <w:bottom w:val="single" w:sz="4" w:space="0" w:color="C9D3D0"/>
+              <w:right w:val="single" w:sz="4" w:space="0" w:color="C9D3D0"/>
+            </w:tcBorders>
+            <w:tcMar>
+              <w:top w:w="50" w:type="dxa"/>
+              <w:left w:w="100" w:type="dxa"/>
+              <w:bottom w:w="50" w:type="dxa"/>
+              <w:right w:w="100" w:type="dxa"/>
+            </w:tcMar>
+          </w:tcPr>
+          <w:p>
+            <w:r>
+              <w:rPr>
+                <w:sz w:val="19"/>
+                <w:szCs w:val="19"/>
+              </w:rPr>
+              <w:t>0.9</w:t>
+            </w:r>
+          </w:p>
+        </w:tc>
+        <w:tc>
+          <w:tcPr>
+            <w:tcW w:w="1542" w:type="dxa"/>
+            <w:tcBorders>
+              <w:top w:val="single" w:sz="4" w:space="0" w:color="C9D3D0"/>
+              <w:left w:val="single" w:sz="4" w:space="0" w:color="C9D3D0"/>
+              <w:bottom w:val="single" w:sz="4" w:space="0" w:color="C9D3D0"/>
+              <w:right w:val="single" w:sz="4" w:space="0" w:color="C9D3D0"/>
+            </w:tcBorders>
+            <w:tcMar>
+              <w:top w:w="50" w:type="dxa"/>
+              <w:left w:w="100" w:type="dxa"/>
+              <w:bottom w:w="50" w:type="dxa"/>
+              <w:right w:w="100" w:type="dxa"/>
+            </w:tcMar>
+          </w:tcPr>
+          <w:p>
+            <w:r>
+              <w:rPr>
+                <w:sz w:val="19"/>
+                <w:szCs w:val="19"/>
+              </w:rPr>
+              <w:t>23 Oct 2026</w:t>
+            </w:r>
+          </w:p>
+        </w:tc>
+        <w:tc>
+          <w:tcPr>
+            <w:tcW w:w="1928" w:type="dxa"/>
+            <w:tcBorders>
+              <w:top w:val="single" w:sz="4" w:space="0" w:color="C9D3D0"/>
+              <w:left w:val="single" w:sz="4" w:space="0" w:color="C9D3D0"/>
+              <w:bottom w:val="single" w:sz="4" w:space="0" w:color="C9D3D0"/>
+              <w:right w:val="single" w:sz="4" w:space="0" w:color="C9D3D0"/>
+            </w:tcBorders>
+            <w:tcMar>
+              <w:top w:w="50" w:type="dxa"/>
+              <w:left w:w="100" w:type="dxa"/>
+              <w:bottom w:w="50" w:type="dxa"/>
+              <w:right w:w="100" w:type="dxa"/>
+            </w:tcMar>
+          </w:tcPr>
+          <w:p>
+            <w:r>
+              <w:rPr>
+                <w:sz w:val="19"/>
+                <w:szCs w:val="19"/>
+              </w:rPr>
+              <w:t>Team Kestrel</w:t>
+            </w:r>
+          </w:p>
+        </w:tc>
+        <w:tc>
+          <w:tcPr>
+            <w:tcW w:w="5204" w:type="dxa"/>
+            <w:tcBorders>
+              <w:top w:val="single" w:sz="4" w:space="0" w:color="C9D3D0"/>
+              <w:left w:val="single" w:sz="4" w:space="0" w:color="C9D3D0"/>
+              <w:bottom w:val="single" w:sz="4" w:space="0" w:color="C9D3D0"/>
+              <w:right w:val="single" w:sz="4" w:space="0" w:color="C9D3D0"/>
+            </w:tcBorders>
+            <w:tcMar>
+              <w:top w:w="50" w:type="dxa"/>
+              <w:left w:w="100" w:type="dxa"/>
+              <w:bottom w:w="50" w:type="dxa"/>
+              <w:right w:w="100" w:type="dxa"/>
+            </w:tcMar>
+          </w:tcPr>
+          <w:p>
+            <w:r>
+              <w:rPr>
+                <w:sz w:val="19"/>
+                <w:szCs w:val="19"/>
+              </w:rPr>
               <w:t>Route catalogue: `cost_basis` (what a published fee covers); no D1 change</w:t>
             </w:r>
           </w:p>
@@ -2879,7 +2995,7 @@
           <w:left w:w="10" w:type="dxa"/>
           <w:right w:w="10" w:type="dxa"/>
         </w:tblCellMar>
-        <w:tblLook w:val="0000" w:firstRow="0" w:lastRow="0" w:firstColumn="0" w:lastColumn="0" w:noHBand="0" w:noVBand="0"/>
+        <w:tblLook w:val="04A0" w:firstRow="1" w:lastRow="0" w:firstColumn="1" w:lastColumn="0" w:noHBand="0" w:noVBand="1"/>
       </w:tblPr>
       <w:tblGrid>
         <w:gridCol w:w="2120"/>
@@ -3236,7 +3352,7 @@
     <w:sdt>
       <w:sdtPr>
         <w:alias w:val="Contents"/>
-        <w:id w:val="-140115118"/>
+        <w:id w:val="1931465538"/>
       </w:sdtPr>
       <w:sdtEndPr/>
       <w:sdtContent>
@@ -3265,7 +3381,7 @@
           <w:r>
             <w:fldChar w:fldCharType="separate"/>
           </w:r>
-          <w:hyperlink w:anchor="_Toc243662342" w:history="1">
+          <w:hyperlink w:anchor="_Toc243668282" w:history="1">
             <w:r>
               <w:rPr>
                 <w:rStyle w:val="Hyperlink"/>
@@ -3289,7 +3405,7 @@
               <w:rPr>
                 <w:noProof/>
               </w:rPr>
-              <w:instrText xml:space="preserve"> PAGEREF _Toc243662342 \h </w:instrText>
+              <w:instrText xml:space="preserve"> PAGEREF _Toc243668282 \h </w:instrText>
             </w:r>
             <w:r>
               <w:rPr>
@@ -3332,7 +3448,7 @@
               <w14:ligatures w14:val="standardContextual"/>
             </w:rPr>
           </w:pPr>
-          <w:hyperlink w:anchor="_Toc243662343" w:history="1">
+          <w:hyperlink w:anchor="_Toc243668283" w:history="1">
             <w:r>
               <w:rPr>
                 <w:rStyle w:val="Hyperlink"/>
@@ -3356,7 +3472,7 @@
               <w:rPr>
                 <w:noProof/>
               </w:rPr>
-              <w:instrText xml:space="preserve"> PAGEREF _Toc243662343 \h </w:instrText>
+              <w:instrText xml:space="preserve"> PAGEREF _Toc243668283 \h </w:instrText>
             </w:r>
             <w:r>
               <w:rPr>
@@ -3399,7 +3515,7 @@
               <w14:ligatures w14:val="standardContextual"/>
             </w:rPr>
           </w:pPr>
-          <w:hyperlink w:anchor="_Toc243662344" w:history="1">
+          <w:hyperlink w:anchor="_Toc243668284" w:history="1">
             <w:r>
               <w:rPr>
                 <w:rStyle w:val="Hyperlink"/>
@@ -3423,7 +3539,7 @@
               <w:rPr>
                 <w:noProof/>
               </w:rPr>
-              <w:instrText xml:space="preserve"> PAGEREF _Toc243662344 \h </w:instrText>
+              <w:instrText xml:space="preserve"> PAGEREF _Toc243668284 \h </w:instrText>
             </w:r>
             <w:r>
               <w:rPr>
@@ -3466,7 +3582,7 @@
               <w14:ligatures w14:val="standardContextual"/>
             </w:rPr>
           </w:pPr>
-          <w:hyperlink w:anchor="_Toc243662345" w:history="1">
+          <w:hyperlink w:anchor="_Toc243668285" w:history="1">
             <w:r>
               <w:rPr>
                 <w:rStyle w:val="Hyperlink"/>
@@ -3490,7 +3606,7 @@
               <w:rPr>
                 <w:noProof/>
               </w:rPr>
-              <w:instrText xml:space="preserve"> PAGEREF _Toc243662345 \h </w:instrText>
+              <w:instrText xml:space="preserve"> PAGEREF _Toc243668285 \h </w:instrText>
             </w:r>
             <w:r>
               <w:rPr>
@@ -3533,7 +3649,7 @@
               <w14:ligatures w14:val="standardContextual"/>
             </w:rPr>
           </w:pPr>
-          <w:hyperlink w:anchor="_Toc243662346" w:history="1">
+          <w:hyperlink w:anchor="_Toc243668286" w:history="1">
             <w:r>
               <w:rPr>
                 <w:rStyle w:val="Hyperlink"/>
@@ -3557,7 +3673,7 @@
               <w:rPr>
                 <w:noProof/>
               </w:rPr>
-              <w:instrText xml:space="preserve"> PAGEREF _Toc243662346 \h </w:instrText>
+              <w:instrText xml:space="preserve"> PAGEREF _Toc243668286 \h </w:instrText>
             </w:r>
             <w:r>
               <w:rPr>
@@ -3600,7 +3716,7 @@
               <w14:ligatures w14:val="standardContextual"/>
             </w:rPr>
           </w:pPr>
-          <w:hyperlink w:anchor="_Toc243662347" w:history="1">
+          <w:hyperlink w:anchor="_Toc243668287" w:history="1">
             <w:r>
               <w:rPr>
                 <w:rStyle w:val="Hyperlink"/>
@@ -3624,7 +3740,7 @@
               <w:rPr>
                 <w:noProof/>
               </w:rPr>
-              <w:instrText xml:space="preserve"> PAGEREF _Toc243662347 \h </w:instrText>
+              <w:instrText xml:space="preserve"> PAGEREF _Toc243668287 \h </w:instrText>
             </w:r>
             <w:r>
               <w:rPr>
@@ -3667,7 +3783,7 @@
               <w14:ligatures w14:val="standardContextual"/>
             </w:rPr>
           </w:pPr>
-          <w:hyperlink w:anchor="_Toc243662348" w:history="1">
+          <w:hyperlink w:anchor="_Toc243668288" w:history="1">
             <w:r>
               <w:rPr>
                 <w:rStyle w:val="Hyperlink"/>
@@ -3691,7 +3807,7 @@
               <w:rPr>
                 <w:noProof/>
               </w:rPr>
-              <w:instrText xml:space="preserve"> PAGEREF _Toc243662348 \h </w:instrText>
+              <w:instrText xml:space="preserve"> PAGEREF _Toc243668288 \h </w:instrText>
             </w:r>
             <w:r>
               <w:rPr>
@@ -3734,7 +3850,7 @@
               <w14:ligatures w14:val="standardContextual"/>
             </w:rPr>
           </w:pPr>
-          <w:hyperlink w:anchor="_Toc243662349" w:history="1">
+          <w:hyperlink w:anchor="_Toc243668289" w:history="1">
             <w:r>
               <w:rPr>
                 <w:rStyle w:val="Hyperlink"/>
@@ -3758,7 +3874,7 @@
               <w:rPr>
                 <w:noProof/>
               </w:rPr>
-              <w:instrText xml:space="preserve"> PAGEREF _Toc243662349 \h </w:instrText>
+              <w:instrText xml:space="preserve"> PAGEREF _Toc243668289 \h </w:instrText>
             </w:r>
             <w:r>
               <w:rPr>
@@ -3801,7 +3917,7 @@
               <w14:ligatures w14:val="standardContextual"/>
             </w:rPr>
           </w:pPr>
-          <w:hyperlink w:anchor="_Toc243662350" w:history="1">
+          <w:hyperlink w:anchor="_Toc243668290" w:history="1">
             <w:r>
               <w:rPr>
                 <w:rStyle w:val="Hyperlink"/>
@@ -3825,7 +3941,7 @@
               <w:rPr>
                 <w:noProof/>
               </w:rPr>
-              <w:instrText xml:space="preserve"> PAGEREF _Toc243662350 \h </w:instrText>
+              <w:instrText xml:space="preserve"> PAGEREF _Toc243668290 \h </w:instrText>
             </w:r>
             <w:r>
               <w:rPr>
@@ -3868,7 +3984,7 @@
               <w14:ligatures w14:val="standardContextual"/>
             </w:rPr>
           </w:pPr>
-          <w:hyperlink w:anchor="_Toc243662351" w:history="1">
+          <w:hyperlink w:anchor="_Toc243668291" w:history="1">
             <w:r>
               <w:rPr>
                 <w:rStyle w:val="Hyperlink"/>
@@ -3892,7 +4008,7 @@
               <w:rPr>
                 <w:noProof/>
               </w:rPr>
-              <w:instrText xml:space="preserve"> PAGEREF _Toc243662351 \h </w:instrText>
+              <w:instrText xml:space="preserve"> PAGEREF _Toc243668291 \h </w:instrText>
             </w:r>
             <w:r>
               <w:rPr>
@@ -3935,7 +4051,7 @@
               <w14:ligatures w14:val="standardContextual"/>
             </w:rPr>
           </w:pPr>
-          <w:hyperlink w:anchor="_Toc243662352" w:history="1">
+          <w:hyperlink w:anchor="_Toc243668292" w:history="1">
             <w:r>
               <w:rPr>
                 <w:rStyle w:val="Hyperlink"/>
@@ -3959,7 +4075,7 @@
               <w:rPr>
                 <w:noProof/>
               </w:rPr>
-              <w:instrText xml:space="preserve"> PAGEREF _Toc243662352 \h </w:instrText>
+              <w:instrText xml:space="preserve"> PAGEREF _Toc243668292 \h </w:instrText>
             </w:r>
             <w:r>
               <w:rPr>
@@ -4002,7 +4118,7 @@
               <w14:ligatures w14:val="standardContextual"/>
             </w:rPr>
           </w:pPr>
-          <w:hyperlink w:anchor="_Toc243662353" w:history="1">
+          <w:hyperlink w:anchor="_Toc243668293" w:history="1">
             <w:r>
               <w:rPr>
                 <w:rStyle w:val="Hyperlink"/>
@@ -4026,7 +4142,7 @@
               <w:rPr>
                 <w:noProof/>
               </w:rPr>
-              <w:instrText xml:space="preserve"> PAGEREF _Toc243662353 \h </w:instrText>
+              <w:instrText xml:space="preserve"> PAGEREF _Toc243668293 \h </w:instrText>
             </w:r>
             <w:r>
               <w:rPr>
@@ -4069,7 +4185,7 @@
               <w14:ligatures w14:val="standardContextual"/>
             </w:rPr>
           </w:pPr>
-          <w:hyperlink w:anchor="_Toc243662354" w:history="1">
+          <w:hyperlink w:anchor="_Toc243668294" w:history="1">
             <w:r>
               <w:rPr>
                 <w:rStyle w:val="Hyperlink"/>
@@ -4093,7 +4209,7 @@
               <w:rPr>
                 <w:noProof/>
               </w:rPr>
-              <w:instrText xml:space="preserve"> PAGEREF _Toc243662354 \h </w:instrText>
+              <w:instrText xml:space="preserve"> PAGEREF _Toc243668294 \h </w:instrText>
             </w:r>
             <w:r>
               <w:rPr>
@@ -4136,7 +4252,7 @@
               <w14:ligatures w14:val="standardContextual"/>
             </w:rPr>
           </w:pPr>
-          <w:hyperlink w:anchor="_Toc243662355" w:history="1">
+          <w:hyperlink w:anchor="_Toc243668295" w:history="1">
             <w:r>
               <w:rPr>
                 <w:rStyle w:val="Hyperlink"/>
@@ -4160,7 +4276,7 @@
               <w:rPr>
                 <w:noProof/>
               </w:rPr>
-              <w:instrText xml:space="preserve"> PAGEREF _Toc243662355 \h </w:instrText>
+              <w:instrText xml:space="preserve"> PAGEREF _Toc243668295 \h </w:instrText>
             </w:r>
             <w:r>
               <w:rPr>
@@ -4203,7 +4319,7 @@
               <w14:ligatures w14:val="standardContextual"/>
             </w:rPr>
           </w:pPr>
-          <w:hyperlink w:anchor="_Toc243662356" w:history="1">
+          <w:hyperlink w:anchor="_Toc243668296" w:history="1">
             <w:r>
               <w:rPr>
                 <w:rStyle w:val="Hyperlink"/>
@@ -4227,7 +4343,7 @@
               <w:rPr>
                 <w:noProof/>
               </w:rPr>
-              <w:instrText xml:space="preserve"> PAGEREF _Toc243662356 \h </w:instrText>
+              <w:instrText xml:space="preserve"> PAGEREF _Toc243668296 \h </w:instrText>
             </w:r>
             <w:r>
               <w:rPr>
@@ -4270,7 +4386,7 @@
               <w14:ligatures w14:val="standardContextual"/>
             </w:rPr>
           </w:pPr>
-          <w:hyperlink w:anchor="_Toc243662357" w:history="1">
+          <w:hyperlink w:anchor="_Toc243668297" w:history="1">
             <w:r>
               <w:rPr>
                 <w:rStyle w:val="Hyperlink"/>
@@ -4294,7 +4410,7 @@
               <w:rPr>
                 <w:noProof/>
               </w:rPr>
-              <w:instrText xml:space="preserve"> PAGEREF _Toc243662357 \h </w:instrText>
+              <w:instrText xml:space="preserve"> PAGEREF _Toc243668297 \h </w:instrText>
             </w:r>
             <w:r>
               <w:rPr>
@@ -4337,7 +4453,7 @@
               <w14:ligatures w14:val="standardContextual"/>
             </w:rPr>
           </w:pPr>
-          <w:hyperlink w:anchor="_Toc243662358" w:history="1">
+          <w:hyperlink w:anchor="_Toc243668298" w:history="1">
             <w:r>
               <w:rPr>
                 <w:rStyle w:val="Hyperlink"/>
@@ -4361,7 +4477,7 @@
               <w:rPr>
                 <w:noProof/>
               </w:rPr>
-              <w:instrText xml:space="preserve"> PAGEREF _Toc243662358 \h </w:instrText>
+              <w:instrText xml:space="preserve"> PAGEREF _Toc243668298 \h </w:instrText>
             </w:r>
             <w:r>
               <w:rPr>
@@ -4404,7 +4520,7 @@
               <w14:ligatures w14:val="standardContextual"/>
             </w:rPr>
           </w:pPr>
-          <w:hyperlink w:anchor="_Toc243662359" w:history="1">
+          <w:hyperlink w:anchor="_Toc243668299" w:history="1">
             <w:r>
               <w:rPr>
                 <w:rStyle w:val="Hyperlink"/>
@@ -4428,7 +4544,7 @@
               <w:rPr>
                 <w:noProof/>
               </w:rPr>
-              <w:instrText xml:space="preserve"> PAGEREF _Toc243662359 \h </w:instrText>
+              <w:instrText xml:space="preserve"> PAGEREF _Toc243668299 \h </w:instrText>
             </w:r>
             <w:r>
               <w:rPr>
@@ -4471,7 +4587,7 @@
               <w14:ligatures w14:val="standardContextual"/>
             </w:rPr>
           </w:pPr>
-          <w:hyperlink w:anchor="_Toc243662360" w:history="1">
+          <w:hyperlink w:anchor="_Toc243668300" w:history="1">
             <w:r>
               <w:rPr>
                 <w:rStyle w:val="Hyperlink"/>
@@ -4495,7 +4611,7 @@
               <w:rPr>
                 <w:noProof/>
               </w:rPr>
-              <w:instrText xml:space="preserve"> PAGEREF _Toc243662360 \h </w:instrText>
+              <w:instrText xml:space="preserve"> PAGEREF _Toc243668300 \h </w:instrText>
             </w:r>
             <w:r>
               <w:rPr>
@@ -4538,7 +4654,7 @@
               <w14:ligatures w14:val="standardContextual"/>
             </w:rPr>
           </w:pPr>
-          <w:hyperlink w:anchor="_Toc243662361" w:history="1">
+          <w:hyperlink w:anchor="_Toc243668301" w:history="1">
             <w:r>
               <w:rPr>
                 <w:rStyle w:val="Hyperlink"/>
@@ -4562,7 +4678,7 @@
               <w:rPr>
                 <w:noProof/>
               </w:rPr>
-              <w:instrText xml:space="preserve"> PAGEREF _Toc243662361 \h </w:instrText>
+              <w:instrText xml:space="preserve"> PAGEREF _Toc243668301 \h </w:instrText>
             </w:r>
             <w:r>
               <w:rPr>
@@ -4605,7 +4721,7 @@
               <w14:ligatures w14:val="standardContextual"/>
             </w:rPr>
           </w:pPr>
-          <w:hyperlink w:anchor="_Toc243662362" w:history="1">
+          <w:hyperlink w:anchor="_Toc243668302" w:history="1">
             <w:r>
               <w:rPr>
                 <w:rStyle w:val="Hyperlink"/>
@@ -4629,7 +4745,7 @@
               <w:rPr>
                 <w:noProof/>
               </w:rPr>
-              <w:instrText xml:space="preserve"> PAGEREF _Toc243662362 \h </w:instrText>
+              <w:instrText xml:space="preserve"> PAGEREF _Toc243668302 \h </w:instrText>
             </w:r>
             <w:r>
               <w:rPr>
@@ -4672,7 +4788,7 @@
               <w14:ligatures w14:val="standardContextual"/>
             </w:rPr>
           </w:pPr>
-          <w:hyperlink w:anchor="_Toc243662363" w:history="1">
+          <w:hyperlink w:anchor="_Toc243668303" w:history="1">
             <w:r>
               <w:rPr>
                 <w:rStyle w:val="Hyperlink"/>
@@ -4696,7 +4812,7 @@
               <w:rPr>
                 <w:noProof/>
               </w:rPr>
-              <w:instrText xml:space="preserve"> PAGEREF _Toc243662363 \h </w:instrText>
+              <w:instrText xml:space="preserve"> PAGEREF _Toc243668303 \h </w:instrText>
             </w:r>
             <w:r>
               <w:rPr>
@@ -4739,7 +4855,7 @@
               <w14:ligatures w14:val="standardContextual"/>
             </w:rPr>
           </w:pPr>
-          <w:hyperlink w:anchor="_Toc243662364" w:history="1">
+          <w:hyperlink w:anchor="_Toc243668304" w:history="1">
             <w:r>
               <w:rPr>
                 <w:rStyle w:val="Hyperlink"/>
@@ -4763,7 +4879,7 @@
               <w:rPr>
                 <w:noProof/>
               </w:rPr>
-              <w:instrText xml:space="preserve"> PAGEREF _Toc243662364 \h </w:instrText>
+              <w:instrText xml:space="preserve"> PAGEREF _Toc243668304 \h </w:instrText>
             </w:r>
             <w:r>
               <w:rPr>
@@ -4806,7 +4922,7 @@
               <w14:ligatures w14:val="standardContextual"/>
             </w:rPr>
           </w:pPr>
-          <w:hyperlink w:anchor="_Toc243662365" w:history="1">
+          <w:hyperlink w:anchor="_Toc243668305" w:history="1">
             <w:r>
               <w:rPr>
                 <w:rStyle w:val="Hyperlink"/>
@@ -4830,7 +4946,7 @@
               <w:rPr>
                 <w:noProof/>
               </w:rPr>
-              <w:instrText xml:space="preserve"> PAGEREF _Toc243662365 \h </w:instrText>
+              <w:instrText xml:space="preserve"> PAGEREF _Toc243668305 \h </w:instrText>
             </w:r>
             <w:r>
               <w:rPr>
@@ -4873,7 +4989,7 @@
               <w14:ligatures w14:val="standardContextual"/>
             </w:rPr>
           </w:pPr>
-          <w:hyperlink w:anchor="_Toc243662366" w:history="1">
+          <w:hyperlink w:anchor="_Toc243668306" w:history="1">
             <w:r>
               <w:rPr>
                 <w:rStyle w:val="Hyperlink"/>
@@ -4897,7 +5013,7 @@
               <w:rPr>
                 <w:noProof/>
               </w:rPr>
-              <w:instrText xml:space="preserve"> PAGEREF _Toc243662366 \h </w:instrText>
+              <w:instrText xml:space="preserve"> PAGEREF _Toc243668306 \h </w:instrText>
             </w:r>
             <w:r>
               <w:rPr>
@@ -4940,7 +5056,7 @@
               <w14:ligatures w14:val="standardContextual"/>
             </w:rPr>
           </w:pPr>
-          <w:hyperlink w:anchor="_Toc243662367" w:history="1">
+          <w:hyperlink w:anchor="_Toc243668307" w:history="1">
             <w:r>
               <w:rPr>
                 <w:rStyle w:val="Hyperlink"/>
@@ -4964,7 +5080,7 @@
               <w:rPr>
                 <w:noProof/>
               </w:rPr>
-              <w:instrText xml:space="preserve"> PAGEREF _Toc243662367 \h </w:instrText>
+              <w:instrText xml:space="preserve"> PAGEREF _Toc243668307 \h </w:instrText>
             </w:r>
             <w:r>
               <w:rPr>
@@ -5007,7 +5123,7 @@
               <w14:ligatures w14:val="standardContextual"/>
             </w:rPr>
           </w:pPr>
-          <w:hyperlink w:anchor="_Toc243662368" w:history="1">
+          <w:hyperlink w:anchor="_Toc243668308" w:history="1">
             <w:r>
               <w:rPr>
                 <w:rStyle w:val="Hyperlink"/>
@@ -5031,7 +5147,7 @@
               <w:rPr>
                 <w:noProof/>
               </w:rPr>
-              <w:instrText xml:space="preserve"> PAGEREF _Toc243662368 \h </w:instrText>
+              <w:instrText xml:space="preserve"> PAGEREF _Toc243668308 \h </w:instrText>
             </w:r>
             <w:r>
               <w:rPr>
@@ -5074,7 +5190,7 @@
               <w14:ligatures w14:val="standardContextual"/>
             </w:rPr>
           </w:pPr>
-          <w:hyperlink w:anchor="_Toc243662369" w:history="1">
+          <w:hyperlink w:anchor="_Toc243668309" w:history="1">
             <w:r>
               <w:rPr>
                 <w:rStyle w:val="Hyperlink"/>
@@ -5098,7 +5214,7 @@
               <w:rPr>
                 <w:noProof/>
               </w:rPr>
-              <w:instrText xml:space="preserve"> PAGEREF _Toc243662369 \h </w:instrText>
+              <w:instrText xml:space="preserve"> PAGEREF _Toc243668309 \h </w:instrText>
             </w:r>
             <w:r>
               <w:rPr>
@@ -5141,7 +5257,7 @@
               <w14:ligatures w14:val="standardContextual"/>
             </w:rPr>
           </w:pPr>
-          <w:hyperlink w:anchor="_Toc243662370" w:history="1">
+          <w:hyperlink w:anchor="_Toc243668310" w:history="1">
             <w:r>
               <w:rPr>
                 <w:rStyle w:val="Hyperlink"/>
@@ -5165,7 +5281,7 @@
               <w:rPr>
                 <w:noProof/>
               </w:rPr>
-              <w:instrText xml:space="preserve"> PAGEREF _Toc243662370 \h </w:instrText>
+              <w:instrText xml:space="preserve"> PAGEREF _Toc243668310 \h </w:instrText>
             </w:r>
             <w:r>
               <w:rPr>
@@ -5208,7 +5324,7 @@
               <w14:ligatures w14:val="standardContextual"/>
             </w:rPr>
           </w:pPr>
-          <w:hyperlink w:anchor="_Toc243662371" w:history="1">
+          <w:hyperlink w:anchor="_Toc243668311" w:history="1">
             <w:r>
               <w:rPr>
                 <w:rStyle w:val="Hyperlink"/>
@@ -5232,7 +5348,7 @@
               <w:rPr>
                 <w:noProof/>
               </w:rPr>
-              <w:instrText xml:space="preserve"> PAGEREF _Toc243662371 \h </w:instrText>
+              <w:instrText xml:space="preserve"> PAGEREF _Toc243668311 \h </w:instrText>
             </w:r>
             <w:r>
               <w:rPr>
@@ -5275,7 +5391,7 @@
               <w14:ligatures w14:val="standardContextual"/>
             </w:rPr>
           </w:pPr>
-          <w:hyperlink w:anchor="_Toc243662372" w:history="1">
+          <w:hyperlink w:anchor="_Toc243668312" w:history="1">
             <w:r>
               <w:rPr>
                 <w:rStyle w:val="Hyperlink"/>
@@ -5299,7 +5415,7 @@
               <w:rPr>
                 <w:noProof/>
               </w:rPr>
-              <w:instrText xml:space="preserve"> PAGEREF _Toc243662372 \h </w:instrText>
+              <w:instrText xml:space="preserve"> PAGEREF _Toc243668312 \h </w:instrText>
             </w:r>
             <w:r>
               <w:rPr>
@@ -5342,7 +5458,7 @@
               <w14:ligatures w14:val="standardContextual"/>
             </w:rPr>
           </w:pPr>
-          <w:hyperlink w:anchor="_Toc243662373" w:history="1">
+          <w:hyperlink w:anchor="_Toc243668313" w:history="1">
             <w:r>
               <w:rPr>
                 <w:rStyle w:val="Hyperlink"/>
@@ -5366,7 +5482,7 @@
               <w:rPr>
                 <w:noProof/>
               </w:rPr>
-              <w:instrText xml:space="preserve"> PAGEREF _Toc243662373 \h </w:instrText>
+              <w:instrText xml:space="preserve"> PAGEREF _Toc243668313 \h </w:instrText>
             </w:r>
             <w:r>
               <w:rPr>
@@ -5409,7 +5525,7 @@
               <w14:ligatures w14:val="standardContextual"/>
             </w:rPr>
           </w:pPr>
-          <w:hyperlink w:anchor="_Toc243662374" w:history="1">
+          <w:hyperlink w:anchor="_Toc243668314" w:history="1">
             <w:r>
               <w:rPr>
                 <w:rStyle w:val="Hyperlink"/>
@@ -5433,7 +5549,7 @@
               <w:rPr>
                 <w:noProof/>
               </w:rPr>
-              <w:instrText xml:space="preserve"> PAGEREF _Toc243662374 \h </w:instrText>
+              <w:instrText xml:space="preserve"> PAGEREF _Toc243668314 \h </w:instrText>
             </w:r>
             <w:r>
               <w:rPr>
@@ -5476,7 +5592,7 @@
               <w14:ligatures w14:val="standardContextual"/>
             </w:rPr>
           </w:pPr>
-          <w:hyperlink w:anchor="_Toc243662375" w:history="1">
+          <w:hyperlink w:anchor="_Toc243668315" w:history="1">
             <w:r>
               <w:rPr>
                 <w:rStyle w:val="Hyperlink"/>
@@ -5500,7 +5616,7 @@
               <w:rPr>
                 <w:noProof/>
               </w:rPr>
-              <w:instrText xml:space="preserve"> PAGEREF _Toc243662375 \h </w:instrText>
+              <w:instrText xml:space="preserve"> PAGEREF _Toc243668315 \h </w:instrText>
             </w:r>
             <w:r>
               <w:rPr>
@@ -5543,7 +5659,7 @@
               <w14:ligatures w14:val="standardContextual"/>
             </w:rPr>
           </w:pPr>
-          <w:hyperlink w:anchor="_Toc243662376" w:history="1">
+          <w:hyperlink w:anchor="_Toc243668316" w:history="1">
             <w:r>
               <w:rPr>
                 <w:rStyle w:val="Hyperlink"/>
@@ -5567,7 +5683,7 @@
               <w:rPr>
                 <w:noProof/>
               </w:rPr>
-              <w:instrText xml:space="preserve"> PAGEREF _Toc243662376 \h </w:instrText>
+              <w:instrText xml:space="preserve"> PAGEREF _Toc243668316 \h </w:instrText>
             </w:r>
             <w:r>
               <w:rPr>
@@ -5610,7 +5726,7 @@
               <w14:ligatures w14:val="standardContextual"/>
             </w:rPr>
           </w:pPr>
-          <w:hyperlink w:anchor="_Toc243662377" w:history="1">
+          <w:hyperlink w:anchor="_Toc243668317" w:history="1">
             <w:r>
               <w:rPr>
                 <w:rStyle w:val="Hyperlink"/>
@@ -5634,7 +5750,7 @@
               <w:rPr>
                 <w:noProof/>
               </w:rPr>
-              <w:instrText xml:space="preserve"> PAGEREF _Toc243662377 \h </w:instrText>
+              <w:instrText xml:space="preserve"> PAGEREF _Toc243668317 \h </w:instrText>
             </w:r>
             <w:r>
               <w:rPr>
@@ -5677,7 +5793,7 @@
               <w14:ligatures w14:val="standardContextual"/>
             </w:rPr>
           </w:pPr>
-          <w:hyperlink w:anchor="_Toc243662378" w:history="1">
+          <w:hyperlink w:anchor="_Toc243668318" w:history="1">
             <w:r>
               <w:rPr>
                 <w:rStyle w:val="Hyperlink"/>
@@ -5701,7 +5817,7 @@
               <w:rPr>
                 <w:noProof/>
               </w:rPr>
-              <w:instrText xml:space="preserve"> PAGEREF _Toc243662378 \h </w:instrText>
+              <w:instrText xml:space="preserve"> PAGEREF _Toc243668318 \h </w:instrText>
             </w:r>
             <w:r>
               <w:rPr>
@@ -5744,7 +5860,7 @@
               <w14:ligatures w14:val="standardContextual"/>
             </w:rPr>
           </w:pPr>
-          <w:hyperlink w:anchor="_Toc243662379" w:history="1">
+          <w:hyperlink w:anchor="_Toc243668319" w:history="1">
             <w:r>
               <w:rPr>
                 <w:rStyle w:val="Hyperlink"/>
@@ -5768,7 +5884,7 @@
               <w:rPr>
                 <w:noProof/>
               </w:rPr>
-              <w:instrText xml:space="preserve"> PAGEREF _Toc243662379 \h </w:instrText>
+              <w:instrText xml:space="preserve"> PAGEREF _Toc243668319 \h </w:instrText>
             </w:r>
             <w:r>
               <w:rPr>
@@ -5811,7 +5927,7 @@
               <w14:ligatures w14:val="standardContextual"/>
             </w:rPr>
           </w:pPr>
-          <w:hyperlink w:anchor="_Toc243662380" w:history="1">
+          <w:hyperlink w:anchor="_Toc243668320" w:history="1">
             <w:r>
               <w:rPr>
                 <w:rStyle w:val="Hyperlink"/>
@@ -5835,7 +5951,7 @@
               <w:rPr>
                 <w:noProof/>
               </w:rPr>
-              <w:instrText xml:space="preserve"> PAGEREF _Toc243662380 \h </w:instrText>
+              <w:instrText xml:space="preserve"> PAGEREF _Toc243668320 \h </w:instrText>
             </w:r>
             <w:r>
               <w:rPr>
@@ -5878,7 +5994,7 @@
               <w14:ligatures w14:val="standardContextual"/>
             </w:rPr>
           </w:pPr>
-          <w:hyperlink w:anchor="_Toc243662381" w:history="1">
+          <w:hyperlink w:anchor="_Toc243668321" w:history="1">
             <w:r>
               <w:rPr>
                 <w:rStyle w:val="Hyperlink"/>
@@ -5902,7 +6018,7 @@
               <w:rPr>
                 <w:noProof/>
               </w:rPr>
-              <w:instrText xml:space="preserve"> PAGEREF _Toc243662381 \h </w:instrText>
+              <w:instrText xml:space="preserve"> PAGEREF _Toc243668321 \h </w:instrText>
             </w:r>
             <w:r>
               <w:rPr>
@@ -5945,7 +6061,7 @@
               <w14:ligatures w14:val="standardContextual"/>
             </w:rPr>
           </w:pPr>
-          <w:hyperlink w:anchor="_Toc243662382" w:history="1">
+          <w:hyperlink w:anchor="_Toc243668322" w:history="1">
             <w:r>
               <w:rPr>
                 <w:rStyle w:val="Hyperlink"/>
@@ -5969,7 +6085,7 @@
               <w:rPr>
                 <w:noProof/>
               </w:rPr>
-              <w:instrText xml:space="preserve"> PAGEREF _Toc243662382 \h </w:instrText>
+              <w:instrText xml:space="preserve"> PAGEREF _Toc243668322 \h </w:instrText>
             </w:r>
             <w:r>
               <w:rPr>
@@ -6012,7 +6128,7 @@
               <w14:ligatures w14:val="standardContextual"/>
             </w:rPr>
           </w:pPr>
-          <w:hyperlink w:anchor="_Toc243662383" w:history="1">
+          <w:hyperlink w:anchor="_Toc243668323" w:history="1">
             <w:r>
               <w:rPr>
                 <w:rStyle w:val="Hyperlink"/>
@@ -6036,7 +6152,7 @@
               <w:rPr>
                 <w:noProof/>
               </w:rPr>
-              <w:instrText xml:space="preserve"> PAGEREF _Toc243662383 \h </w:instrText>
+              <w:instrText xml:space="preserve"> PAGEREF _Toc243668323 \h </w:instrText>
             </w:r>
             <w:r>
               <w:rPr>
@@ -6079,7 +6195,7 @@
               <w14:ligatures w14:val="standardContextual"/>
             </w:rPr>
           </w:pPr>
-          <w:hyperlink w:anchor="_Toc243662384" w:history="1">
+          <w:hyperlink w:anchor="_Toc243668324" w:history="1">
             <w:r>
               <w:rPr>
                 <w:rStyle w:val="Hyperlink"/>
@@ -6103,7 +6219,7 @@
               <w:rPr>
                 <w:noProof/>
               </w:rPr>
-              <w:instrText xml:space="preserve"> PAGEREF _Toc243662384 \h </w:instrText>
+              <w:instrText xml:space="preserve"> PAGEREF _Toc243668324 \h </w:instrText>
             </w:r>
             <w:r>
               <w:rPr>
@@ -6146,7 +6262,7 @@
               <w14:ligatures w14:val="standardContextual"/>
             </w:rPr>
           </w:pPr>
-          <w:hyperlink w:anchor="_Toc243662385" w:history="1">
+          <w:hyperlink w:anchor="_Toc243668325" w:history="1">
             <w:r>
               <w:rPr>
                 <w:rStyle w:val="Hyperlink"/>
@@ -6170,7 +6286,7 @@
               <w:rPr>
                 <w:noProof/>
               </w:rPr>
-              <w:instrText xml:space="preserve"> PAGEREF _Toc243662385 \h </w:instrText>
+              <w:instrText xml:space="preserve"> PAGEREF _Toc243668325 \h </w:instrText>
             </w:r>
             <w:r>
               <w:rPr>
@@ -6213,7 +6329,7 @@
               <w14:ligatures w14:val="standardContextual"/>
             </w:rPr>
           </w:pPr>
-          <w:hyperlink w:anchor="_Toc243662386" w:history="1">
+          <w:hyperlink w:anchor="_Toc243668326" w:history="1">
             <w:r>
               <w:rPr>
                 <w:rStyle w:val="Hyperlink"/>
@@ -6237,7 +6353,7 @@
               <w:rPr>
                 <w:noProof/>
               </w:rPr>
-              <w:instrText xml:space="preserve"> PAGEREF _Toc243662386 \h </w:instrText>
+              <w:instrText xml:space="preserve"> PAGEREF _Toc243668326 \h </w:instrText>
             </w:r>
             <w:r>
               <w:rPr>
@@ -6283,7 +6399,7 @@
     <w:sdt>
       <w:sdtPr>
         <w:alias w:val="Figures"/>
-        <w:id w:val="-1628613664"/>
+        <w:id w:val="11884777"/>
       </w:sdtPr>
       <w:sdtEndPr/>
       <w:sdtContent>
@@ -6312,7 +6428,7 @@
           <w:r>
             <w:fldChar w:fldCharType="separate"/>
           </w:r>
-          <w:hyperlink w:anchor="_Toc243662387" w:history="1">
+          <w:hyperlink w:anchor="_Toc243668327" w:history="1">
             <w:r>
               <w:rPr>
                 <w:rStyle w:val="Hyperlink"/>
@@ -6336,7 +6452,7 @@
               <w:rPr>
                 <w:noProof/>
               </w:rPr>
-              <w:instrText xml:space="preserve"> PAGEREF _Toc243662387 \h </w:instrText>
+              <w:instrText xml:space="preserve"> PAGEREF _Toc243668327 \h </w:instrText>
             </w:r>
             <w:r>
               <w:rPr>
@@ -6379,7 +6495,7 @@
               <w14:ligatures w14:val="standardContextual"/>
             </w:rPr>
           </w:pPr>
-          <w:hyperlink w:anchor="_Toc243662388" w:history="1">
+          <w:hyperlink w:anchor="_Toc243668328" w:history="1">
             <w:r>
               <w:rPr>
                 <w:rStyle w:val="Hyperlink"/>
@@ -6403,7 +6519,7 @@
               <w:rPr>
                 <w:noProof/>
               </w:rPr>
-              <w:instrText xml:space="preserve"> PAGEREF _Toc243662388 \h </w:instrText>
+              <w:instrText xml:space="preserve"> PAGEREF _Toc243668328 \h </w:instrText>
             </w:r>
             <w:r>
               <w:rPr>
@@ -6446,7 +6562,7 @@
               <w14:ligatures w14:val="standardContextual"/>
             </w:rPr>
           </w:pPr>
-          <w:hyperlink w:anchor="_Toc243662389" w:history="1">
+          <w:hyperlink w:anchor="_Toc243668329" w:history="1">
             <w:r>
               <w:rPr>
                 <w:rStyle w:val="Hyperlink"/>
@@ -6470,7 +6586,7 @@
               <w:rPr>
                 <w:noProof/>
               </w:rPr>
-              <w:instrText xml:space="preserve"> PAGEREF _Toc243662389 \h </w:instrText>
+              <w:instrText xml:space="preserve"> PAGEREF _Toc243668329 \h </w:instrText>
             </w:r>
             <w:r>
               <w:rPr>
@@ -6513,7 +6629,7 @@
               <w14:ligatures w14:val="standardContextual"/>
             </w:rPr>
           </w:pPr>
-          <w:hyperlink w:anchor="_Toc243662390" w:history="1">
+          <w:hyperlink w:anchor="_Toc243668330" w:history="1">
             <w:r>
               <w:rPr>
                 <w:rStyle w:val="Hyperlink"/>
@@ -6537,7 +6653,7 @@
               <w:rPr>
                 <w:noProof/>
               </w:rPr>
-              <w:instrText xml:space="preserve"> PAGEREF _Toc243662390 \h </w:instrText>
+              <w:instrText xml:space="preserve"> PAGEREF _Toc243668330 \h </w:instrText>
             </w:r>
             <w:r>
               <w:rPr>
@@ -6580,7 +6696,7 @@
               <w14:ligatures w14:val="standardContextual"/>
             </w:rPr>
           </w:pPr>
-          <w:hyperlink w:anchor="_Toc243662391" w:history="1">
+          <w:hyperlink w:anchor="_Toc243668331" w:history="1">
             <w:r>
               <w:rPr>
                 <w:rStyle w:val="Hyperlink"/>
@@ -6604,7 +6720,7 @@
               <w:rPr>
                 <w:noProof/>
               </w:rPr>
-              <w:instrText xml:space="preserve"> PAGEREF _Toc243662391 \h </w:instrText>
+              <w:instrText xml:space="preserve"> PAGEREF _Toc243668331 \h </w:instrText>
             </w:r>
             <w:r>
               <w:rPr>
@@ -6647,7 +6763,7 @@
               <w14:ligatures w14:val="standardContextual"/>
             </w:rPr>
           </w:pPr>
-          <w:hyperlink w:anchor="_Toc243662392" w:history="1">
+          <w:hyperlink w:anchor="_Toc243668332" w:history="1">
             <w:r>
               <w:rPr>
                 <w:rStyle w:val="Hyperlink"/>
@@ -6671,7 +6787,7 @@
               <w:rPr>
                 <w:noProof/>
               </w:rPr>
-              <w:instrText xml:space="preserve"> PAGEREF _Toc243662392 \h </w:instrText>
+              <w:instrText xml:space="preserve"> PAGEREF _Toc243668332 \h </w:instrText>
             </w:r>
             <w:r>
               <w:rPr>
@@ -6714,7 +6830,7 @@
               <w14:ligatures w14:val="standardContextual"/>
             </w:rPr>
           </w:pPr>
-          <w:hyperlink w:anchor="_Toc243662393" w:history="1">
+          <w:hyperlink w:anchor="_Toc243668333" w:history="1">
             <w:r>
               <w:rPr>
                 <w:rStyle w:val="Hyperlink"/>
@@ -6738,7 +6854,7 @@
               <w:rPr>
                 <w:noProof/>
               </w:rPr>
-              <w:instrText xml:space="preserve"> PAGEREF _Toc243662393 \h </w:instrText>
+              <w:instrText xml:space="preserve"> PAGEREF _Toc243668333 \h </w:instrText>
             </w:r>
             <w:r>
               <w:rPr>
@@ -6781,7 +6897,7 @@
               <w14:ligatures w14:val="standardContextual"/>
             </w:rPr>
           </w:pPr>
-          <w:hyperlink w:anchor="_Toc243662394" w:history="1">
+          <w:hyperlink w:anchor="_Toc243668334" w:history="1">
             <w:r>
               <w:rPr>
                 <w:rStyle w:val="Hyperlink"/>
@@ -6805,7 +6921,7 @@
               <w:rPr>
                 <w:noProof/>
               </w:rPr>
-              <w:instrText xml:space="preserve"> PAGEREF _Toc243662394 \h </w:instrText>
+              <w:instrText xml:space="preserve"> PAGEREF _Toc243668334 \h </w:instrText>
             </w:r>
             <w:r>
               <w:rPr>
@@ -6851,7 +6967,7 @@
     <w:sdt>
       <w:sdtPr>
         <w:alias w:val="Tables"/>
-        <w:id w:val="46113070"/>
+        <w:id w:val="801662622"/>
       </w:sdtPr>
       <w:sdtEndPr/>
       <w:sdtContent>
@@ -6880,7 +6996,7 @@
           <w:r>
             <w:fldChar w:fldCharType="separate"/>
           </w:r>
-          <w:hyperlink w:anchor="_Toc243662395" w:history="1">
+          <w:hyperlink w:anchor="_Toc243668335" w:history="1">
             <w:r>
               <w:rPr>
                 <w:rStyle w:val="Hyperlink"/>
@@ -6904,7 +7020,7 @@
               <w:rPr>
                 <w:noProof/>
               </w:rPr>
-              <w:instrText xml:space="preserve"> PAGEREF _Toc243662395 \h </w:instrText>
+              <w:instrText xml:space="preserve"> PAGEREF _Toc243668335 \h </w:instrText>
             </w:r>
             <w:r>
               <w:rPr>
@@ -6947,7 +7063,7 @@
               <w14:ligatures w14:val="standardContextual"/>
             </w:rPr>
           </w:pPr>
-          <w:hyperlink w:anchor="_Toc243662396" w:history="1">
+          <w:hyperlink w:anchor="_Toc243668336" w:history="1">
             <w:r>
               <w:rPr>
                 <w:rStyle w:val="Hyperlink"/>
@@ -6971,7 +7087,7 @@
               <w:rPr>
                 <w:noProof/>
               </w:rPr>
-              <w:instrText xml:space="preserve"> PAGEREF _Toc243662396 \h </w:instrText>
+              <w:instrText xml:space="preserve"> PAGEREF _Toc243668336 \h </w:instrText>
             </w:r>
             <w:r>
               <w:rPr>
@@ -7014,7 +7130,7 @@
               <w14:ligatures w14:val="standardContextual"/>
             </w:rPr>
           </w:pPr>
-          <w:hyperlink w:anchor="_Toc243662397" w:history="1">
+          <w:hyperlink w:anchor="_Toc243668337" w:history="1">
             <w:r>
               <w:rPr>
                 <w:rStyle w:val="Hyperlink"/>
@@ -7038,7 +7154,7 @@
               <w:rPr>
                 <w:noProof/>
               </w:rPr>
-              <w:instrText xml:space="preserve"> PAGEREF _Toc243662397 \h </w:instrText>
+              <w:instrText xml:space="preserve"> PAGEREF _Toc243668337 \h </w:instrText>
             </w:r>
             <w:r>
               <w:rPr>
@@ -7081,7 +7197,7 @@
               <w14:ligatures w14:val="standardContextual"/>
             </w:rPr>
           </w:pPr>
-          <w:hyperlink w:anchor="_Toc243662398" w:history="1">
+          <w:hyperlink w:anchor="_Toc243668338" w:history="1">
             <w:r>
               <w:rPr>
                 <w:rStyle w:val="Hyperlink"/>
@@ -7105,7 +7221,7 @@
               <w:rPr>
                 <w:noProof/>
               </w:rPr>
-              <w:instrText xml:space="preserve"> PAGEREF _Toc243662398 \h </w:instrText>
+              <w:instrText xml:space="preserve"> PAGEREF _Toc243668338 \h </w:instrText>
             </w:r>
             <w:r>
               <w:rPr>
@@ -7148,7 +7264,7 @@
               <w14:ligatures w14:val="standardContextual"/>
             </w:rPr>
           </w:pPr>
-          <w:hyperlink w:anchor="_Toc243662399" w:history="1">
+          <w:hyperlink w:anchor="_Toc243668339" w:history="1">
             <w:r>
               <w:rPr>
                 <w:rStyle w:val="Hyperlink"/>
@@ -7172,7 +7288,7 @@
               <w:rPr>
                 <w:noProof/>
               </w:rPr>
-              <w:instrText xml:space="preserve"> PAGEREF _Toc243662399 \h </w:instrText>
+              <w:instrText xml:space="preserve"> PAGEREF _Toc243668339 \h </w:instrText>
             </w:r>
             <w:r>
               <w:rPr>
@@ -7215,7 +7331,7 @@
               <w14:ligatures w14:val="standardContextual"/>
             </w:rPr>
           </w:pPr>
-          <w:hyperlink w:anchor="_Toc243662400" w:history="1">
+          <w:hyperlink w:anchor="_Toc243668340" w:history="1">
             <w:r>
               <w:rPr>
                 <w:rStyle w:val="Hyperlink"/>
@@ -7239,7 +7355,7 @@
               <w:rPr>
                 <w:noProof/>
               </w:rPr>
-              <w:instrText xml:space="preserve"> PAGEREF _Toc243662400 \h </w:instrText>
+              <w:instrText xml:space="preserve"> PAGEREF _Toc243668340 \h </w:instrText>
             </w:r>
             <w:r>
               <w:rPr>
@@ -7282,7 +7398,7 @@
               <w14:ligatures w14:val="standardContextual"/>
             </w:rPr>
           </w:pPr>
-          <w:hyperlink w:anchor="_Toc243662401" w:history="1">
+          <w:hyperlink w:anchor="_Toc243668341" w:history="1">
             <w:r>
               <w:rPr>
                 <w:rStyle w:val="Hyperlink"/>
@@ -7306,7 +7422,7 @@
               <w:rPr>
                 <w:noProof/>
               </w:rPr>
-              <w:instrText xml:space="preserve"> PAGEREF _Toc243662401 \h </w:instrText>
+              <w:instrText xml:space="preserve"> PAGEREF _Toc243668341 \h </w:instrText>
             </w:r>
             <w:r>
               <w:rPr>
@@ -7349,7 +7465,7 @@
               <w14:ligatures w14:val="standardContextual"/>
             </w:rPr>
           </w:pPr>
-          <w:hyperlink w:anchor="_Toc243662402" w:history="1">
+          <w:hyperlink w:anchor="_Toc243668342" w:history="1">
             <w:r>
               <w:rPr>
                 <w:rStyle w:val="Hyperlink"/>
@@ -7373,7 +7489,7 @@
               <w:rPr>
                 <w:noProof/>
               </w:rPr>
-              <w:instrText xml:space="preserve"> PAGEREF _Toc243662402 \h </w:instrText>
+              <w:instrText xml:space="preserve"> PAGEREF _Toc243668342 \h </w:instrText>
             </w:r>
             <w:r>
               <w:rPr>
@@ -7416,7 +7532,7 @@
               <w14:ligatures w14:val="standardContextual"/>
             </w:rPr>
           </w:pPr>
-          <w:hyperlink w:anchor="_Toc243662403" w:history="1">
+          <w:hyperlink w:anchor="_Toc243668343" w:history="1">
             <w:r>
               <w:rPr>
                 <w:rStyle w:val="Hyperlink"/>
@@ -7440,7 +7556,7 @@
               <w:rPr>
                 <w:noProof/>
               </w:rPr>
-              <w:instrText xml:space="preserve"> PAGEREF _Toc243662403 \h </w:instrText>
+              <w:instrText xml:space="preserve"> PAGEREF _Toc243668343 \h </w:instrText>
             </w:r>
             <w:r>
               <w:rPr>
@@ -7483,7 +7599,7 @@
               <w14:ligatures w14:val="standardContextual"/>
             </w:rPr>
           </w:pPr>
-          <w:hyperlink w:anchor="_Toc243662404" w:history="1">
+          <w:hyperlink w:anchor="_Toc243668344" w:history="1">
             <w:r>
               <w:rPr>
                 <w:rStyle w:val="Hyperlink"/>
@@ -7507,7 +7623,7 @@
               <w:rPr>
                 <w:noProof/>
               </w:rPr>
-              <w:instrText xml:space="preserve"> PAGEREF _Toc243662404 \h </w:instrText>
+              <w:instrText xml:space="preserve"> PAGEREF _Toc243668344 \h </w:instrText>
             </w:r>
             <w:r>
               <w:rPr>
@@ -7550,7 +7666,7 @@
               <w14:ligatures w14:val="standardContextual"/>
             </w:rPr>
           </w:pPr>
-          <w:hyperlink w:anchor="_Toc243662405" w:history="1">
+          <w:hyperlink w:anchor="_Toc243668345" w:history="1">
             <w:r>
               <w:rPr>
                 <w:rStyle w:val="Hyperlink"/>
@@ -7574,7 +7690,7 @@
               <w:rPr>
                 <w:noProof/>
               </w:rPr>
-              <w:instrText xml:space="preserve"> PAGEREF _Toc243662405 \h </w:instrText>
+              <w:instrText xml:space="preserve"> PAGEREF _Toc243668345 \h </w:instrText>
             </w:r>
             <w:r>
               <w:rPr>
@@ -7617,7 +7733,7 @@
               <w14:ligatures w14:val="standardContextual"/>
             </w:rPr>
           </w:pPr>
-          <w:hyperlink w:anchor="_Toc243662406" w:history="1">
+          <w:hyperlink w:anchor="_Toc243668346" w:history="1">
             <w:r>
               <w:rPr>
                 <w:rStyle w:val="Hyperlink"/>
@@ -7641,7 +7757,7 @@
               <w:rPr>
                 <w:noProof/>
               </w:rPr>
-              <w:instrText xml:space="preserve"> PAGEREF _Toc243662406 \h </w:instrText>
+              <w:instrText xml:space="preserve"> PAGEREF _Toc243668346 \h </w:instrText>
             </w:r>
             <w:r>
               <w:rPr>
@@ -7684,7 +7800,7 @@
               <w14:ligatures w14:val="standardContextual"/>
             </w:rPr>
           </w:pPr>
-          <w:hyperlink w:anchor="_Toc243662407" w:history="1">
+          <w:hyperlink w:anchor="_Toc243668347" w:history="1">
             <w:r>
               <w:rPr>
                 <w:rStyle w:val="Hyperlink"/>
@@ -7708,7 +7824,7 @@
               <w:rPr>
                 <w:noProof/>
               </w:rPr>
-              <w:instrText xml:space="preserve"> PAGEREF _Toc243662407 \h </w:instrText>
+              <w:instrText xml:space="preserve"> PAGEREF _Toc243668347 \h </w:instrText>
             </w:r>
             <w:r>
               <w:rPr>
@@ -7751,7 +7867,7 @@
               <w14:ligatures w14:val="standardContextual"/>
             </w:rPr>
           </w:pPr>
-          <w:hyperlink w:anchor="_Toc243662408" w:history="1">
+          <w:hyperlink w:anchor="_Toc243668348" w:history="1">
             <w:r>
               <w:rPr>
                 <w:rStyle w:val="Hyperlink"/>
@@ -7775,7 +7891,7 @@
               <w:rPr>
                 <w:noProof/>
               </w:rPr>
-              <w:instrText xml:space="preserve"> PAGEREF _Toc243662408 \h </w:instrText>
+              <w:instrText xml:space="preserve"> PAGEREF _Toc243668348 \h </w:instrText>
             </w:r>
             <w:r>
               <w:rPr>
@@ -7818,7 +7934,7 @@
               <w14:ligatures w14:val="standardContextual"/>
             </w:rPr>
           </w:pPr>
-          <w:hyperlink w:anchor="_Toc243662409" w:history="1">
+          <w:hyperlink w:anchor="_Toc243668349" w:history="1">
             <w:r>
               <w:rPr>
                 <w:rStyle w:val="Hyperlink"/>
@@ -7842,7 +7958,7 @@
               <w:rPr>
                 <w:noProof/>
               </w:rPr>
-              <w:instrText xml:space="preserve"> PAGEREF _Toc243662409 \h </w:instrText>
+              <w:instrText xml:space="preserve"> PAGEREF _Toc243668349 \h </w:instrText>
             </w:r>
             <w:r>
               <w:rPr>
@@ -7885,7 +8001,7 @@
               <w14:ligatures w14:val="standardContextual"/>
             </w:rPr>
           </w:pPr>
-          <w:hyperlink w:anchor="_Toc243662410" w:history="1">
+          <w:hyperlink w:anchor="_Toc243668350" w:history="1">
             <w:r>
               <w:rPr>
                 <w:rStyle w:val="Hyperlink"/>
@@ -7909,7 +8025,7 @@
               <w:rPr>
                 <w:noProof/>
               </w:rPr>
-              <w:instrText xml:space="preserve"> PAGEREF _Toc243662410 \h </w:instrText>
+              <w:instrText xml:space="preserve"> PAGEREF _Toc243668350 \h </w:instrText>
             </w:r>
             <w:r>
               <w:rPr>
@@ -7950,7 +8066,7 @@
         <w:keepLines/>
         <w:pageBreakBefore/>
       </w:pPr>
-      <w:bookmarkStart w:id="0" w:name="_Toc243662342"/>
+      <w:bookmarkStart w:id="0" w:name="_Toc243668282"/>
       <w:r>
         <w:lastRenderedPageBreak/>
         <w:t>1 Introduction</w:t>
@@ -7963,7 +8079,7 @@
         <w:keepNext/>
         <w:keepLines/>
       </w:pPr>
-      <w:bookmarkStart w:id="1" w:name="_Toc243662343"/>
+      <w:bookmarkStart w:id="1" w:name="_Toc243668283"/>
       <w:r>
         <w:t>1.1 Purpose</w:t>
       </w:r>
@@ -7984,7 +8100,10 @@
         <w:t>conceptual</w:t>
       </w:r>
       <w:r>
-        <w:t xml:space="preserve"> model in Enhanced Entity-Relationship (EER) notation, its </w:t>
+        <w:t xml:space="preserve"> model in </w:t>
+      </w:r>
+      <w:r>
+        <w:t xml:space="preserve">Enhanced Entity-Relationship (EER) notation, its </w:t>
       </w:r>
       <w:r>
         <w:rPr>
@@ -7994,10 +8113,7 @@
         <w:t>logical</w:t>
       </w:r>
       <w:r>
-        <w:t xml:space="preserve"> relational schema derived with the standard </w:t>
-      </w:r>
-      <w:r>
-        <w:t xml:space="preserve">mapping algorithm and normalised, and the </w:t>
+        <w:t xml:space="preserve"> relational schema derived with the standard mapping algorithm and normalised, and the </w:t>
       </w:r>
       <w:r>
         <w:rPr>
@@ -8016,7 +8132,7 @@
         <w:keepNext/>
         <w:keepLines/>
       </w:pPr>
-      <w:bookmarkStart w:id="2" w:name="_Toc243662344"/>
+      <w:bookmarkStart w:id="2" w:name="_Toc243668284"/>
       <w:r>
         <w:t>1.2 Scope</w:t>
       </w:r>
@@ -8037,10 +8153,7 @@
         <w:t>optional</w:t>
       </w:r>
       <w:r>
-        <w:t xml:space="preserve"> student account: a student who </w:t>
-      </w:r>
-      <w:r>
-        <w:t>chooses to create one keeps the same profile on the server, under a username only, so it follows them between devices and can drive reminders. Section 2.5 models it. The preference list stays on the device.</w:t>
+        <w:t xml:space="preserve"> student account: a student who chooses to create one keeps the same profile on the server, under a username only, so it follows them between devices and can drive reminders. Section 2.5 models it. The preference list stays on the device.</w:t>
       </w:r>
     </w:p>
     <w:p>
@@ -8049,7 +8162,7 @@
         <w:keepNext/>
         <w:keepLines/>
       </w:pPr>
-      <w:bookmarkStart w:id="3" w:name="_Toc243662345"/>
+      <w:bookmarkStart w:id="3" w:name="_Toc243668285"/>
       <w:r>
         <w:t>1.3 Intended audience</w:t>
       </w:r>
@@ -8069,7 +8182,7 @@
         <w:keepNext/>
         <w:keepLines/>
       </w:pPr>
-      <w:bookmarkStart w:id="4" w:name="_Toc243662346"/>
+      <w:bookmarkStart w:id="4" w:name="_Toc243668286"/>
       <w:r>
         <w:t>1.4 Relationship to other documents</w:t>
       </w:r>
@@ -8080,7 +8193,7 @@
         <w:pStyle w:val="Caption"/>
         <w:keepNext/>
       </w:pPr>
-      <w:bookmarkStart w:id="5" w:name="_Toc243662395"/>
+      <w:bookmarkStart w:id="5" w:name="_Toc243668335"/>
       <w:r>
         <w:t xml:space="preserve">Table </w:t>
       </w:r>
@@ -8122,7 +8235,7 @@
           <w:left w:w="10" w:type="dxa"/>
           <w:right w:w="10" w:type="dxa"/>
         </w:tblCellMar>
-        <w:tblLook w:val="0000" w:firstRow="0" w:lastRow="0" w:firstColumn="0" w:lastColumn="0" w:noHBand="0" w:noVBand="0"/>
+        <w:tblLook w:val="04A0" w:firstRow="1" w:lastRow="0" w:firstColumn="1" w:lastColumn="0" w:noHBand="0" w:noVBand="1"/>
       </w:tblPr>
       <w:tblGrid>
         <w:gridCol w:w="4819"/>
@@ -8599,7 +8712,7 @@
         <w:keepNext/>
         <w:keepLines/>
       </w:pPr>
-      <w:bookmarkStart w:id="6" w:name="_Toc243662347"/>
+      <w:bookmarkStart w:id="6" w:name="_Toc243668287"/>
       <w:r>
         <w:t>1.5 Notation</w:t>
       </w:r>
@@ -8730,7 +8843,7 @@
         <w:keepLines/>
         <w:pageBreakBefore/>
       </w:pPr>
-      <w:bookmarkStart w:id="7" w:name="_Toc243662348"/>
+      <w:bookmarkStart w:id="7" w:name="_Toc243668288"/>
       <w:r>
         <w:lastRenderedPageBreak/>
         <w:t>2 Conceptual model (EER)</w:t>
@@ -8743,7 +8856,7 @@
         <w:keepNext/>
         <w:keepLines/>
       </w:pPr>
-      <w:bookmarkStart w:id="8" w:name="_Toc243662349"/>
+      <w:bookmarkStart w:id="8" w:name="_Toc243668289"/>
       <w:r>
         <w:t>2.1 Offerings and cut-offs</w:t>
       </w:r>
@@ -8819,7 +8932,7 @@
         </w:rPr>
         <w:lastRenderedPageBreak/>
         <w:drawing>
-          <wp:inline distT="0" distB="0" distL="0" distR="0" wp14:anchorId="0A8A0197" wp14:editId="0A8A0198">
+          <wp:inline distT="0" distB="0" distL="0" distR="0" wp14:anchorId="7C7B6625" wp14:editId="7C7B6626">
             <wp:extent cx="6124575" cy="7553325"/>
             <wp:effectExtent l="0" t="0" r="0" b="0"/>
             <wp:docPr id="1" name="eer-offerings.png" descr="EER model of institutions, courses, offerings, intake years, selection groups and cut-offs" title="EER model of institutions, courses, offerings, intake years, selection groups and cut-offs"/>
@@ -8862,7 +8975,7 @@
       <w:pPr>
         <w:pStyle w:val="Caption"/>
       </w:pPr>
-      <w:bookmarkStart w:id="9" w:name="_Toc243662387"/>
+      <w:bookmarkStart w:id="9" w:name="_Toc243668327"/>
       <w:r>
         <w:t xml:space="preserve">Figure </w:t>
       </w:r>
@@ -8895,7 +9008,7 @@
         <w:keepNext/>
         <w:keepLines/>
       </w:pPr>
-      <w:bookmarkStart w:id="10" w:name="_Toc243662350"/>
+      <w:bookmarkStart w:id="10" w:name="_Toc243668290"/>
       <w:r>
         <w:t>2.2 Subjects and requirement rules</w:t>
       </w:r>
@@ -8931,7 +9044,7 @@
         </w:rPr>
         <w:lastRenderedPageBreak/>
         <w:drawing>
-          <wp:inline distT="0" distB="0" distL="0" distR="0" wp14:anchorId="0A8A0199" wp14:editId="0A8A019A">
+          <wp:inline distT="0" distB="0" distL="0" distR="0" wp14:anchorId="7C7B6627" wp14:editId="7C7B6628">
             <wp:extent cx="6124575" cy="6067425"/>
             <wp:effectExtent l="0" t="0" r="0" b="0"/>
             <wp:docPr id="2" name="eer-rules.png" descr="EER model of streams, subjects and the recursive requirement-rule tree" title="EER model of streams, subjects and the recursive requirement-rule tree"/>
@@ -8974,7 +9087,7 @@
       <w:pPr>
         <w:pStyle w:val="Caption"/>
       </w:pPr>
-      <w:bookmarkStart w:id="11" w:name="_Toc243662388"/>
+      <w:bookmarkStart w:id="11" w:name="_Toc243668328"/>
       <w:r>
         <w:t xml:space="preserve">Figure </w:t>
       </w:r>
@@ -9007,7 +9120,7 @@
         <w:keepNext/>
         <w:keepLines/>
       </w:pPr>
-      <w:bookmarkStart w:id="12" w:name="_Toc243662351"/>
+      <w:bookmarkStart w:id="12" w:name="_Toc243668291"/>
       <w:r>
         <w:t>2.3 Provenance and trust</w:t>
       </w:r>
@@ -9043,7 +9156,7 @@
         </w:rPr>
         <w:lastRenderedPageBreak/>
         <w:drawing>
-          <wp:inline distT="0" distB="0" distL="0" distR="0" wp14:anchorId="0A8A019B" wp14:editId="0A8A019C">
+          <wp:inline distT="0" distB="0" distL="0" distR="0" wp14:anchorId="7C7B6629" wp14:editId="7C7B662A">
             <wp:extent cx="6124575" cy="4829175"/>
             <wp:effectExtent l="0" t="0" r="0" b="0"/>
             <wp:docPr id="3" name="eer-provenance.png" descr="EER model of cited facts, sources, revisions, AI extraction, review and mistake reports" title="EER model of cited facts, sources, revisions, AI extraction, review and mistake reports"/>
@@ -9086,7 +9199,7 @@
       <w:pPr>
         <w:pStyle w:val="Caption"/>
       </w:pPr>
-      <w:bookmarkStart w:id="13" w:name="_Toc243662389"/>
+      <w:bookmarkStart w:id="13" w:name="_Toc243668329"/>
       <w:r>
         <w:t xml:space="preserve">Figure </w:t>
       </w:r>
@@ -9119,7 +9232,7 @@
         <w:keepNext/>
         <w:keepLines/>
       </w:pPr>
-      <w:bookmarkStart w:id="14" w:name="_Toc243662352"/>
+      <w:bookmarkStart w:id="14" w:name="_Toc243668292"/>
       <w:r>
         <w:t>2.4 Journey and other routes</w:t>
       </w:r>
@@ -9136,7 +9249,7 @@
           <w:noProof/>
         </w:rPr>
         <w:drawing>
-          <wp:inline distT="0" distB="0" distL="0" distR="0" wp14:anchorId="0A8A019D" wp14:editId="0A8A019E">
+          <wp:inline distT="0" distB="0" distL="0" distR="0" wp14:anchorId="7C7B662B" wp14:editId="7C7B662C">
             <wp:extent cx="6124575" cy="2895600"/>
             <wp:effectExtent l="0" t="0" r="0" b="0"/>
             <wp:docPr id="4" name="eer-journey.png" descr="EER model of deadlines, push reminders and the specialisation of other routes" title="EER model of deadlines, push reminders and the specialisation of other routes"/>
@@ -9179,7 +9292,7 @@
       <w:pPr>
         <w:pStyle w:val="Caption"/>
       </w:pPr>
-      <w:bookmarkStart w:id="15" w:name="_Toc243662390"/>
+      <w:bookmarkStart w:id="15" w:name="_Toc243668330"/>
       <w:r>
         <w:t xml:space="preserve">Figure </w:t>
       </w:r>
@@ -9212,7 +9325,7 @@
         <w:keepNext/>
         <w:keepLines/>
       </w:pPr>
-      <w:bookmarkStart w:id="16" w:name="_Toc243662353"/>
+      <w:bookmarkStart w:id="16" w:name="_Toc243668293"/>
       <w:r>
         <w:lastRenderedPageBreak/>
         <w:t>2.5 Student accounts (CR-001)</w:t>
@@ -9251,7 +9364,7 @@
           <w:noProof/>
         </w:rPr>
         <w:drawing>
-          <wp:inline distT="0" distB="0" distL="0" distR="0" wp14:anchorId="0A8A019F" wp14:editId="0A8A01A0">
+          <wp:inline distT="0" distB="0" distL="0" distR="0" wp14:anchorId="7C7B662D" wp14:editId="7C7B662E">
             <wp:extent cx="6124575" cy="2857500"/>
             <wp:effectExtent l="0" t="0" r="0" b="0"/>
             <wp:docPr id="5" name="eer-accounts.png" descr="EER model of optional student accounts: sign-in, sessions, recovery and the student's results" title="EER model of optional student accounts: sign-in, sessions, recovery and the student's results"/>
@@ -9294,7 +9407,7 @@
       <w:pPr>
         <w:pStyle w:val="Caption"/>
       </w:pPr>
-      <w:bookmarkStart w:id="17" w:name="_Toc243662391"/>
+      <w:bookmarkStart w:id="17" w:name="_Toc243668331"/>
       <w:r>
         <w:t xml:space="preserve">Figure </w:t>
       </w:r>
@@ -9327,7 +9440,7 @@
         <w:keepNext/>
         <w:keepLines/>
       </w:pPr>
-      <w:bookmarkStart w:id="18" w:name="_Toc243662354"/>
+      <w:bookmarkStart w:id="18" w:name="_Toc243668294"/>
       <w:r>
         <w:t>2.6 Journey, Alerts and Groups (CR-002)</w:t>
       </w:r>
@@ -9363,7 +9476,7 @@
           <w:left w:w="10" w:type="dxa"/>
           <w:right w:w="10" w:type="dxa"/>
         </w:tblCellMar>
-        <w:tblLook w:val="0000" w:firstRow="0" w:lastRow="0" w:firstColumn="0" w:lastColumn="0" w:noHBand="0" w:noVBand="0"/>
+        <w:tblLook w:val="04A0" w:firstRow="1" w:lastRow="0" w:firstColumn="1" w:lastColumn="0" w:noHBand="0" w:noVBand="1"/>
       </w:tblPr>
       <w:tblGrid>
         <w:gridCol w:w="2877"/>
@@ -10095,7 +10208,7 @@
           <w:left w:w="10" w:type="dxa"/>
           <w:right w:w="10" w:type="dxa"/>
         </w:tblCellMar>
-        <w:tblLook w:val="0000" w:firstRow="0" w:lastRow="0" w:firstColumn="0" w:lastColumn="0" w:noHBand="0" w:noVBand="0"/>
+        <w:tblLook w:val="04A0" w:firstRow="1" w:lastRow="0" w:firstColumn="1" w:lastColumn="0" w:noHBand="0" w:noVBand="1"/>
       </w:tblPr>
       <w:tblGrid>
         <w:gridCol w:w="1588"/>
@@ -10937,7 +11050,7 @@
         <w:keepNext/>
         <w:keepLines/>
       </w:pPr>
-      <w:bookmarkStart w:id="19" w:name="_Toc243662355"/>
+      <w:bookmarkStart w:id="19" w:name="_Toc243668295"/>
       <w:r>
         <w:t>2.7 Contact details (CR-003)</w:t>
       </w:r>
@@ -11031,7 +11144,7 @@
           <w:left w:w="10" w:type="dxa"/>
           <w:right w:w="10" w:type="dxa"/>
         </w:tblCellMar>
-        <w:tblLook w:val="0000" w:firstRow="0" w:lastRow="0" w:firstColumn="0" w:lastColumn="0" w:noHBand="0" w:noVBand="0"/>
+        <w:tblLook w:val="04A0" w:firstRow="1" w:lastRow="0" w:firstColumn="1" w:lastColumn="0" w:noHBand="0" w:noVBand="1"/>
       </w:tblPr>
       <w:tblGrid>
         <w:gridCol w:w="3876"/>
@@ -11661,7 +11774,7 @@
         <w:keepNext/>
         <w:keepLines/>
       </w:pPr>
-      <w:bookmarkStart w:id="20" w:name="_Toc243662356"/>
+      <w:bookmarkStart w:id="20" w:name="_Toc243668296"/>
       <w:r>
         <w:t>2.8 Answer feedback (CR-004)</w:t>
       </w:r>
@@ -11732,7 +11845,7 @@
         <w:keepNext/>
         <w:keepLines/>
       </w:pPr>
-      <w:bookmarkStart w:id="21" w:name="_Toc243662357"/>
+      <w:bookmarkStart w:id="21" w:name="_Toc243668297"/>
       <w:r>
         <w:t>2.9 Group rules and sample conversations (CR-005)</w:t>
       </w:r>
@@ -11867,7 +11980,7 @@
         <w:keepNext/>
         <w:keepLines/>
       </w:pPr>
-      <w:bookmarkStart w:id="22" w:name="_Toc243662358"/>
+      <w:bookmarkStart w:id="22" w:name="_Toc243668298"/>
       <w:r>
         <w:lastRenderedPageBreak/>
         <w:t>2.10 Journey, avatars and group rules on the account (CR-006)</w:t>
@@ -11934,7 +12047,7 @@
         <w:pStyle w:val="Caption"/>
         <w:keepNext/>
       </w:pPr>
-      <w:bookmarkStart w:id="23" w:name="_Toc243662396"/>
+      <w:bookmarkStart w:id="23" w:name="_Toc243668336"/>
       <w:r>
         <w:t xml:space="preserve">Table </w:t>
       </w:r>
@@ -11976,7 +12089,7 @@
           <w:left w:w="10" w:type="dxa"/>
           <w:right w:w="10" w:type="dxa"/>
         </w:tblCellMar>
-        <w:tblLook w:val="0000" w:firstRow="0" w:lastRow="0" w:firstColumn="0" w:lastColumn="0" w:noHBand="0" w:noVBand="0"/>
+        <w:tblLook w:val="04A0" w:firstRow="1" w:lastRow="0" w:firstColumn="1" w:lastColumn="0" w:noHBand="0" w:noVBand="1"/>
       </w:tblPr>
       <w:tblGrid>
         <w:gridCol w:w="2458"/>
@@ -13180,10 +13293,10 @@
           <w:b/>
           <w:bCs/>
         </w:rPr>
-        <w:t>Business rules on the server.</w:t>
-      </w:r>
-      <w:r>
-        <w:t xml:space="preserve"> The step list (three preparation steps, open at any time, and the five UGC steps) is fixed in </w:t>
+        <w:t>Career map (CR-013).</w:t>
+      </w:r>
+      <w:r>
+        <w:t xml:space="preserve"> </w:t>
       </w:r>
       <w:r>
         <w:rPr>
@@ -13192,10 +13305,28 @@
           <w:szCs w:val="19"/>
           <w:shd w:val="clear" w:color="auto" w:fill="F2F4F3"/>
         </w:rPr>
-        <w:t>shared/journey.ts</w:t>
-      </w:r>
-      <w:r>
-        <w:t xml:space="preserve"> and mirrored by the CHECK on </w:t>
+        <w:t>shared/careers.ts</w:t>
+      </w:r>
+      <w:r>
+        <w:t xml:space="preserve"> holds twelve curated careers as reference data bundled with the app, like the route catalogue: each refers to UGC courses by the handbook's course code (with the rulebook's name, pinned by a test), to routes by id or by words in their programme titles, and to a licence step only with a checked official source. It reuses </w:t>
+      </w:r>
+      <w:r>
+        <w:t>the rulebook's courses, the student's computed bands and the route catalogue instead of a new table, and stores nothing about the student (TC-147).</w:t>
+      </w:r>
+    </w:p>
+    <w:p>
+      <w:pPr>
+        <w:spacing w:after="120"/>
+      </w:pPr>
+      <w:r>
+        <w:rPr>
+          <w:b/>
+          <w:bCs/>
+        </w:rPr>
+        <w:t>Business rules on the server.</w:t>
+      </w:r>
+      <w:r>
+        <w:t xml:space="preserve"> The step list (three preparation steps, open at any time, and the five UGC steps) is fixed in </w:t>
       </w:r>
       <w:r>
         <w:rPr>
@@ -13204,10 +13335,10 @@
           <w:szCs w:val="19"/>
           <w:shd w:val="clear" w:color="auto" w:fill="F2F4F3"/>
         </w:rPr>
-        <w:t>journey_step.step_id</w:t>
-      </w:r>
-      <w:r>
-        <w:t>; a test inserts every step id the code knows, so the two cannot drift. A UGC step opens on the date of the UGC press notice (</w:t>
+        <w:t>shared/journey.ts</w:t>
+      </w:r>
+      <w:r>
+        <w:t xml:space="preserve"> and mirrored by the CHECK on </w:t>
       </w:r>
       <w:r>
         <w:rPr>
@@ -13216,13 +13347,10 @@
           <w:szCs w:val="19"/>
           <w:shd w:val="clear" w:color="auto" w:fill="F2F4F3"/>
         </w:rPr>
-        <w:t>opensOn</w:t>
-      </w:r>
-      <w:r>
-        <w:t xml:space="preserve"> in the journey read </w:t>
-      </w:r>
-      <w:r>
-        <w:t>model); while no date is announced it cannot be ticked, because ZedPath never invents a date. "I applied" on a followed notice can be set only once the notice has opened. The Worker checks both against the read model, using the Sri Lanka date (UTC+05:30), before writing (</w:t>
+        <w:t>journey_step.step_id</w:t>
+      </w:r>
+      <w:r>
+        <w:t>; a test inserts every step id the code knows, so the two cannot drift. A UGC step opens on the date of the UGC press notice (</w:t>
       </w:r>
       <w:r>
         <w:rPr>
@@ -13231,25 +13359,13 @@
           <w:szCs w:val="19"/>
           <w:shd w:val="clear" w:color="auto" w:fill="F2F4F3"/>
         </w:rPr>
-        <w:t>worker/my-journey.ts</w:t>
-      </w:r>
-      <w:r>
-        <w:t>); the phone shows the same rule.</w:t>
-      </w:r>
-    </w:p>
-    <w:p>
-      <w:pPr>
-        <w:spacing w:after="120"/>
-      </w:pPr>
-      <w:r>
-        <w:rPr>
-          <w:b/>
-          <w:bCs/>
-        </w:rPr>
-        <w:t>Data migration and safe defaults.</w:t>
-      </w:r>
-      <w:r>
-        <w:t xml:space="preserve"> Rules accepted under 0009 are carried into </w:t>
+        <w:t>opensOn</w:t>
+      </w:r>
+      <w:r>
+        <w:t xml:space="preserve"> in the journey read </w:t>
+      </w:r>
+      <w:r>
+        <w:t>model); while no date is announced it cannot be ticked, because ZedPath never invents a date. "I applied" on a followed notice can be set only once the notice has opened. The Worker checks both against the read model, using the Sri Lanka date (UTC+05:30), before writing (</w:t>
       </w:r>
       <w:r>
         <w:rPr>
@@ -13258,13 +13374,25 @@
           <w:szCs w:val="19"/>
           <w:shd w:val="clear" w:color="auto" w:fill="F2F4F3"/>
         </w:rPr>
-        <w:t>group_rules_acceptance</w:t>
-      </w:r>
-      <w:r>
-        <w:t xml:space="preserve"> with the time </w:t>
-      </w:r>
-      <w:r>
-        <w:t xml:space="preserve">of the account's first join (tested on a copy of the database as it was before 0010). </w:t>
+        <w:t>worker/my-journey.ts</w:t>
+      </w:r>
+      <w:r>
+        <w:t>); the phone shows the same rule.</w:t>
+      </w:r>
+    </w:p>
+    <w:p>
+      <w:pPr>
+        <w:spacing w:after="120"/>
+      </w:pPr>
+      <w:r>
+        <w:rPr>
+          <w:b/>
+          <w:bCs/>
+        </w:rPr>
+        <w:t>Data migration and safe defaults.</w:t>
+      </w:r>
+      <w:r>
+        <w:t xml:space="preserve"> Rules accepted under 0009 are carried into </w:t>
       </w:r>
       <w:r>
         <w:rPr>
@@ -13273,25 +13401,13 @@
           <w:szCs w:val="19"/>
           <w:shd w:val="clear" w:color="auto" w:fill="F2F4F3"/>
         </w:rPr>
-        <w:t>group_member.rules_version</w:t>
-      </w:r>
-      <w:r>
-        <w:t xml:space="preserve"> is no longer read or written but is kept for now (expand, then contract): the previous release still writes it, so a rollback stays safe; a later migration drops it once this release is stable. No avatar means initials, as before. A new account's Journey is empty: nothing is ticked for the student. Journey items kept on a phone before CR-006 are copied to the account by the app on first use.</w:t>
-      </w:r>
-    </w:p>
-    <w:p>
-      <w:pPr>
-        <w:spacing w:after="120"/>
-      </w:pPr>
-      <w:r>
-        <w:rPr>
-          <w:b/>
-          <w:bCs/>
-        </w:rPr>
-        <w:t>Privacy.</w:t>
-      </w:r>
-      <w:r>
-        <w:t xml:space="preserve"> The members list of a group (members only) returns usernames, avatars and senior badges, never the name, email or mobile in </w:t>
+        <w:t>group_rules_acceptance</w:t>
+      </w:r>
+      <w:r>
+        <w:t xml:space="preserve"> with the time </w:t>
+      </w:r>
+      <w:r>
+        <w:t xml:space="preserve">of the account's first join (tested on a copy of the database as it was before 0010). </w:t>
       </w:r>
       <w:r>
         <w:rPr>
@@ -13300,55 +13416,25 @@
           <w:szCs w:val="19"/>
           <w:shd w:val="clear" w:color="auto" w:fill="F2F4F3"/>
         </w:rPr>
-        <w:t>student_contact</w:t>
-      </w:r>
-      <w:r>
-        <w:t>. Every new relation cascades on account deletion. In each group's room, a message keeps the author's avatar as it was when posted, a snapshot like the author name (a deliberate departure).</w:t>
-      </w:r>
-    </w:p>
-    <w:p>
-      <w:pPr>
-        <w:pStyle w:val="Heading2"/>
-        <w:keepNext/>
-        <w:keepLines/>
-      </w:pPr>
-      <w:bookmarkStart w:id="24" w:name="_Toc243662359"/>
-      <w:r>
-        <w:t>2.11 Demo accounts (CR-007)</w:t>
-      </w:r>
-      <w:bookmarkEnd w:id="24"/>
+        <w:t>group_member.rules_version</w:t>
+      </w:r>
+      <w:r>
+        <w:t xml:space="preserve"> is no longer read or written but is kept for now (expand, then contract): the previous release still writes it, so a rollback stays safe; a later migration drops it once this release is stable. No avatar means initials, as before. A new account's Journey is empty: nothing is ticked for the student. Journey items kept on a phone before CR-006 are copied to the account by the app on first use.</w:t>
+      </w:r>
     </w:p>
     <w:p>
       <w:pPr>
         <w:spacing w:after="120"/>
       </w:pPr>
-      <w:r>
-        <w:t xml:space="preserve">The product owner asked for a one-tap demo on the Welcome screen (15 October 2026), choosing a </w:t>
-      </w:r>
       <w:r>
         <w:rPr>
           <w:b/>
           <w:bCs/>
         </w:rPr>
-        <w:t>private copy per visitor</w:t>
-      </w:r>
-      <w:r>
-        <w:t xml:space="preserve"> over one shared account. Each tap creates a throwaway account holding the sample student; it expires 24 hours later and is deleted on a later demo tap (the free plan has no scheduled job).</w:t>
-      </w:r>
-    </w:p>
-    <w:p>
-      <w:pPr>
-        <w:spacing w:after="120"/>
-      </w:pPr>
-      <w:r>
-        <w:rPr>
-          <w:b/>
-          <w:bCs/>
-        </w:rPr>
-        <w:t>Where the fact lives.</w:t>
-      </w:r>
-      <w:r>
-        <w:t xml:space="preserve"> "This account is a demo, until T" is a single-valued fact about the account, so it is an attribute of ACCOUNT (</w:t>
+        <w:t>Privacy.</w:t>
+      </w:r>
+      <w:r>
+        <w:t xml:space="preserve"> The members list of a group (members only) returns usernames, avatars and senior badges, never the name, email or mobile in </w:t>
       </w:r>
       <w:r>
         <w:rPr>
@@ -13357,6 +13443,63 @@
           <w:szCs w:val="19"/>
           <w:shd w:val="clear" w:color="auto" w:fill="F2F4F3"/>
         </w:rPr>
+        <w:t>student_contact</w:t>
+      </w:r>
+      <w:r>
+        <w:t>. Every new relation cascades on account deletion. In each group's room, a message keeps the author's avatar as it was when posted, a snapshot like the author name (a deliberate departure).</w:t>
+      </w:r>
+    </w:p>
+    <w:p>
+      <w:pPr>
+        <w:pStyle w:val="Heading2"/>
+        <w:keepNext/>
+        <w:keepLines/>
+      </w:pPr>
+      <w:bookmarkStart w:id="24" w:name="_Toc243668299"/>
+      <w:r>
+        <w:t>2.11 Demo accounts (CR-007)</w:t>
+      </w:r>
+      <w:bookmarkEnd w:id="24"/>
+    </w:p>
+    <w:p>
+      <w:pPr>
+        <w:spacing w:after="120"/>
+      </w:pPr>
+      <w:r>
+        <w:t xml:space="preserve">The product owner asked for a one-tap demo on the Welcome screen (15 October 2026), choosing a </w:t>
+      </w:r>
+      <w:r>
+        <w:rPr>
+          <w:b/>
+          <w:bCs/>
+        </w:rPr>
+        <w:t>private copy per visitor</w:t>
+      </w:r>
+      <w:r>
+        <w:t xml:space="preserve"> over one shared account. Each tap creates a throwaway account holding the sample student; it expires 24 hours later and is deleted on a later demo tap (the free plan has no scheduled job).</w:t>
+      </w:r>
+    </w:p>
+    <w:p>
+      <w:pPr>
+        <w:spacing w:after="120"/>
+      </w:pPr>
+      <w:r>
+        <w:rPr>
+          <w:b/>
+          <w:bCs/>
+        </w:rPr>
+        <w:t>Where the fact lives.</w:t>
+      </w:r>
+      <w:r>
+        <w:t xml:space="preserve"> "This account is a demo, until T" is a single-valued fact about the account, so it is an attribute of ACCOUNT (</w:t>
+      </w:r>
+      <w:r>
+        <w:rPr>
+          <w:rFonts w:ascii="Consolas" w:eastAsia="Consolas" w:hAnsi="Consolas" w:cs="Consolas"/>
+          <w:sz w:val="19"/>
+          <w:szCs w:val="19"/>
+          <w:shd w:val="clear" w:color="auto" w:fill="F2F4F3"/>
+        </w:rPr>
         <w:t>demo_expires_at</w:t>
       </w:r>
       <w:r>
@@ -13371,7 +13514,7 @@
         <w:pStyle w:val="Caption"/>
         <w:keepNext/>
       </w:pPr>
-      <w:bookmarkStart w:id="25" w:name="_Toc243662397"/>
+      <w:bookmarkStart w:id="25" w:name="_Toc243668337"/>
       <w:r>
         <w:t xml:space="preserve">Table </w:t>
       </w:r>
@@ -13413,7 +13556,7 @@
           <w:left w:w="10" w:type="dxa"/>
           <w:right w:w="10" w:type="dxa"/>
         </w:tblCellMar>
-        <w:tblLook w:val="0000" w:firstRow="0" w:lastRow="0" w:firstColumn="0" w:lastColumn="0" w:noHBand="0" w:noVBand="0"/>
+        <w:tblLook w:val="04A0" w:firstRow="1" w:lastRow="0" w:firstColumn="1" w:lastColumn="0" w:noHBand="0" w:noVBand="1"/>
       </w:tblPr>
       <w:tblGrid>
         <w:gridCol w:w="2547"/>
@@ -13823,9 +13966,8 @@
         <w:keepNext/>
         <w:keepLines/>
       </w:pPr>
-      <w:bookmarkStart w:id="26" w:name="_Toc243662360"/>
-      <w:r>
-        <w:lastRenderedPageBreak/>
+      <w:bookmarkStart w:id="26" w:name="_Toc243668300"/>
+      <w:r>
         <w:t>2.12 University facts from UGC statistics (read model)</w:t>
       </w:r>
       <w:bookmarkEnd w:id="26"/>
@@ -13896,7 +14038,7 @@
         <w:keepNext/>
         <w:keepLines/>
       </w:pPr>
-      <w:bookmarkStart w:id="27" w:name="_Toc243662361"/>
+      <w:bookmarkStart w:id="27" w:name="_Toc243668301"/>
       <w:r>
         <w:t>2.13 Rooms an account opened (security audit, lead 3)</w:t>
       </w:r>
@@ -13957,7 +14099,7 @@
         <w:keepNext/>
         <w:keepLines/>
       </w:pPr>
-      <w:bookmarkStart w:id="28" w:name="_Toc243662362"/>
+      <w:bookmarkStart w:id="28" w:name="_Toc243668302"/>
       <w:r>
         <w:t>2.14 Entity catalogue</w:t>
       </w:r>
@@ -13968,7 +14110,7 @@
         <w:pStyle w:val="Caption"/>
         <w:keepNext/>
       </w:pPr>
-      <w:bookmarkStart w:id="29" w:name="_Toc243662398"/>
+      <w:bookmarkStart w:id="29" w:name="_Toc243668338"/>
       <w:r>
         <w:t xml:space="preserve">Table </w:t>
       </w:r>
@@ -14010,7 +14152,7 @@
           <w:left w:w="10" w:type="dxa"/>
           <w:right w:w="10" w:type="dxa"/>
         </w:tblCellMar>
-        <w:tblLook w:val="0000" w:firstRow="0" w:lastRow="0" w:firstColumn="0" w:lastColumn="0" w:noHBand="0" w:noVBand="0"/>
+        <w:tblLook w:val="04A0" w:firstRow="1" w:lastRow="0" w:firstColumn="1" w:lastColumn="0" w:noHBand="0" w:noVBand="1"/>
       </w:tblPr>
       <w:tblGrid>
         <w:gridCol w:w="1965"/>
@@ -15266,6 +15408,7 @@
                 <w:sz w:val="19"/>
                 <w:szCs w:val="19"/>
               </w:rPr>
+              <w:lastRenderedPageBreak/>
               <w:t>CUTOFF</w:t>
             </w:r>
           </w:p>
@@ -15664,7 +15807,6 @@
                 <w:sz w:val="19"/>
                 <w:szCs w:val="19"/>
               </w:rPr>
-              <w:lastRenderedPageBreak/>
               <w:t>SOURCE_DOCUMENT</w:t>
             </w:r>
           </w:p>
@@ -17237,7 +17379,7 @@
         <w:keepLines/>
         <w:pageBreakBefore/>
       </w:pPr>
-      <w:bookmarkStart w:id="30" w:name="_Toc243662363"/>
+      <w:bookmarkStart w:id="30" w:name="_Toc243668303"/>
       <w:r>
         <w:lastRenderedPageBreak/>
         <w:t>3 Rule grammar</w:t>
@@ -17279,7 +17421,7 @@
         <w:pStyle w:val="Caption"/>
         <w:keepNext/>
       </w:pPr>
-      <w:bookmarkStart w:id="31" w:name="_Toc243662399"/>
+      <w:bookmarkStart w:id="31" w:name="_Toc243668339"/>
       <w:r>
         <w:t xml:space="preserve">Table </w:t>
       </w:r>
@@ -17321,7 +17463,7 @@
           <w:left w:w="10" w:type="dxa"/>
           <w:right w:w="10" w:type="dxa"/>
         </w:tblCellMar>
-        <w:tblLook w:val="0000" w:firstRow="0" w:lastRow="0" w:firstColumn="0" w:lastColumn="0" w:noHBand="0" w:noVBand="0"/>
+        <w:tblLook w:val="04A0" w:firstRow="1" w:lastRow="0" w:firstColumn="1" w:lastColumn="0" w:noHBand="0" w:noVBand="1"/>
       </w:tblPr>
       <w:tblGrid>
         <w:gridCol w:w="1606"/>
@@ -18650,7 +18792,7 @@
         <w:keepLines/>
         <w:pageBreakBefore/>
       </w:pPr>
-      <w:bookmarkStart w:id="32" w:name="_Toc243662364"/>
+      <w:bookmarkStart w:id="32" w:name="_Toc243668304"/>
       <w:r>
         <w:lastRenderedPageBreak/>
         <w:t>4 Mapping the EER model to relations</w:t>
@@ -18670,7 +18812,7 @@
         <w:pStyle w:val="Caption"/>
         <w:keepNext/>
       </w:pPr>
-      <w:bookmarkStart w:id="33" w:name="_Toc243662400"/>
+      <w:bookmarkStart w:id="33" w:name="_Toc243668340"/>
       <w:r>
         <w:t xml:space="preserve">Table </w:t>
       </w:r>
@@ -18712,7 +18854,7 @@
           <w:left w:w="10" w:type="dxa"/>
           <w:right w:w="10" w:type="dxa"/>
         </w:tblCellMar>
-        <w:tblLook w:val="0000" w:firstRow="0" w:lastRow="0" w:firstColumn="0" w:lastColumn="0" w:noHBand="0" w:noVBand="0"/>
+        <w:tblLook w:val="04A0" w:firstRow="1" w:lastRow="0" w:firstColumn="1" w:lastColumn="0" w:noHBand="0" w:noVBand="1"/>
       </w:tblPr>
       <w:tblGrid>
         <w:gridCol w:w="649"/>
@@ -20461,7 +20603,7 @@
         <w:pStyle w:val="Caption"/>
         <w:keepNext/>
       </w:pPr>
-      <w:bookmarkStart w:id="34" w:name="_Toc243662401"/>
+      <w:bookmarkStart w:id="34" w:name="_Toc243668341"/>
       <w:r>
         <w:lastRenderedPageBreak/>
         <w:t xml:space="preserve">Table </w:t>
@@ -20504,7 +20646,7 @@
           <w:left w:w="10" w:type="dxa"/>
           <w:right w:w="10" w:type="dxa"/>
         </w:tblCellMar>
-        <w:tblLook w:val="0000" w:firstRow="0" w:lastRow="0" w:firstColumn="0" w:lastColumn="0" w:noHBand="0" w:noVBand="0"/>
+        <w:tblLook w:val="04A0" w:firstRow="1" w:lastRow="0" w:firstColumn="1" w:lastColumn="0" w:noHBand="0" w:noVBand="1"/>
       </w:tblPr>
       <w:tblGrid>
         <w:gridCol w:w="662"/>
@@ -21573,7 +21715,7 @@
         </w:rPr>
         <w:lastRenderedPageBreak/>
         <w:drawing>
-          <wp:inline distT="0" distB="0" distL="0" distR="0" wp14:anchorId="0A8A01A1" wp14:editId="0A8A01A2">
+          <wp:inline distT="0" distB="0" distL="0" distR="0" wp14:anchorId="7C7B662F" wp14:editId="7C7B6630">
             <wp:extent cx="6124575" cy="6562725"/>
             <wp:effectExtent l="0" t="0" r="0" b="0"/>
             <wp:docPr id="6" name="relational-admission.png" descr="Logical schema, admission data (generated from the migration file)" title="Logical schema, admission data (generated from the migration file)"/>
@@ -21616,7 +21758,7 @@
       <w:pPr>
         <w:pStyle w:val="Caption"/>
       </w:pPr>
-      <w:bookmarkStart w:id="35" w:name="_Toc243662392"/>
+      <w:bookmarkStart w:id="35" w:name="_Toc243668332"/>
       <w:r>
         <w:t xml:space="preserve">Figure </w:t>
       </w:r>
@@ -21655,7 +21797,7 @@
         </w:rPr>
         <w:lastRenderedPageBreak/>
         <w:drawing>
-          <wp:inline distT="0" distB="0" distL="0" distR="0" wp14:anchorId="0A8A01A3" wp14:editId="0A8A01A4">
+          <wp:inline distT="0" distB="0" distL="0" distR="0" wp14:anchorId="7C7B6631" wp14:editId="7C7B6632">
             <wp:extent cx="6124575" cy="5562600"/>
             <wp:effectExtent l="0" t="0" r="0" b="0"/>
             <wp:docPr id="7" name="relational-trust-journey.png" descr="Logical schema, trust, routes and journey data (generated from the migration file)" title="Logical schema, trust, routes and journey data (generated from the migration file)"/>
@@ -21698,7 +21840,7 @@
       <w:pPr>
         <w:pStyle w:val="Caption"/>
       </w:pPr>
-      <w:bookmarkStart w:id="36" w:name="_Toc243662393"/>
+      <w:bookmarkStart w:id="36" w:name="_Toc243668333"/>
       <w:r>
         <w:t xml:space="preserve">Figure </w:t>
       </w:r>
@@ -21736,7 +21878,7 @@
           <w:noProof/>
         </w:rPr>
         <w:drawing>
-          <wp:inline distT="0" distB="0" distL="0" distR="0" wp14:anchorId="0A8A01A5" wp14:editId="0A8A01A6">
+          <wp:inline distT="0" distB="0" distL="0" distR="0" wp14:anchorId="7C7B6633" wp14:editId="7C7B6634">
             <wp:extent cx="6124575" cy="2305050"/>
             <wp:effectExtent l="0" t="0" r="0" b="0"/>
             <wp:docPr id="8" name="relational-accounts.png" descr="Logical schema, optional student accounts (generated from the migration files)" title="Logical schema, optional student accounts (generated from the migration files)"/>
@@ -21779,7 +21921,7 @@
       <w:pPr>
         <w:pStyle w:val="Caption"/>
       </w:pPr>
-      <w:bookmarkStart w:id="37" w:name="_Toc243662394"/>
+      <w:bookmarkStart w:id="37" w:name="_Toc243668334"/>
       <w:r>
         <w:t xml:space="preserve">Figure </w:t>
       </w:r>
@@ -21813,7 +21955,7 @@
         <w:keepLines/>
         <w:pageBreakBefore/>
       </w:pPr>
-      <w:bookmarkStart w:id="38" w:name="_Toc243662365"/>
+      <w:bookmarkStart w:id="38" w:name="_Toc243668305"/>
       <w:r>
         <w:lastRenderedPageBreak/>
         <w:t>5 </w:t>
@@ -21829,7 +21971,7 @@
         <w:keepNext/>
         <w:keepLines/>
       </w:pPr>
-      <w:bookmarkStart w:id="39" w:name="_Toc243662366"/>
+      <w:bookmarkStart w:id="39" w:name="_Toc243668306"/>
       <w:r>
         <w:t>5.1 From the source form to 1NF</w:t>
       </w:r>
@@ -21885,7 +22027,7 @@
         <w:keepNext/>
         <w:keepLines/>
       </w:pPr>
-      <w:bookmarkStart w:id="40" w:name="_Toc243662367"/>
+      <w:bookmarkStart w:id="40" w:name="_Toc243668307"/>
       <w:r>
         <w:t>5.2 Functional and multi-valued dependencies</w:t>
       </w:r>
@@ -21896,7 +22038,7 @@
         <w:pStyle w:val="Caption"/>
         <w:keepNext/>
       </w:pPr>
-      <w:bookmarkStart w:id="41" w:name="_Toc243662402"/>
+      <w:bookmarkStart w:id="41" w:name="_Toc243668342"/>
       <w:r>
         <w:t xml:space="preserve">Table </w:t>
       </w:r>
@@ -21938,7 +22080,7 @@
           <w:left w:w="10" w:type="dxa"/>
           <w:right w:w="10" w:type="dxa"/>
         </w:tblCellMar>
-        <w:tblLook w:val="0000" w:firstRow="0" w:lastRow="0" w:firstColumn="0" w:lastColumn="0" w:noHBand="0" w:noVBand="0"/>
+        <w:tblLook w:val="04A0" w:firstRow="1" w:lastRow="0" w:firstColumn="1" w:lastColumn="0" w:noHBand="0" w:noVBand="1"/>
       </w:tblPr>
       <w:tblGrid>
         <w:gridCol w:w="684"/>
@@ -22795,7 +22937,7 @@
         <w:keepNext/>
         <w:keepLines/>
       </w:pPr>
-      <w:bookmarkStart w:id="42" w:name="_Toc243662368"/>
+      <w:bookmarkStart w:id="42" w:name="_Toc243668308"/>
       <w:r>
         <w:t>5.3 2NF, 3NF and BCNF</w:t>
       </w:r>
@@ -23038,7 +23180,7 @@
         <w:keepNext/>
         <w:keepLines/>
       </w:pPr>
-      <w:bookmarkStart w:id="43" w:name="_Toc243662369"/>
+      <w:bookmarkStart w:id="43" w:name="_Toc243668309"/>
       <w:r>
         <w:lastRenderedPageBreak/>
         <w:t>5.4 Deliberate departures</w:t>
@@ -23050,7 +23192,7 @@
         <w:pStyle w:val="Caption"/>
         <w:keepNext/>
       </w:pPr>
-      <w:bookmarkStart w:id="44" w:name="_Toc243662403"/>
+      <w:bookmarkStart w:id="44" w:name="_Toc243668343"/>
       <w:r>
         <w:t xml:space="preserve">Table </w:t>
       </w:r>
@@ -23092,7 +23234,7 @@
           <w:left w:w="10" w:type="dxa"/>
           <w:right w:w="10" w:type="dxa"/>
         </w:tblCellMar>
-        <w:tblLook w:val="0000" w:firstRow="0" w:lastRow="0" w:firstColumn="0" w:lastColumn="0" w:noHBand="0" w:noVBand="0"/>
+        <w:tblLook w:val="04A0" w:firstRow="1" w:lastRow="0" w:firstColumn="1" w:lastColumn="0" w:noHBand="0" w:noVBand="1"/>
       </w:tblPr>
       <w:tblGrid>
         <w:gridCol w:w="3213"/>
@@ -23821,7 +23963,7 @@
         <w:keepLines/>
         <w:pageBreakBefore/>
       </w:pPr>
-      <w:bookmarkStart w:id="45" w:name="_Toc243662370"/>
+      <w:bookmarkStart w:id="45" w:name="_Toc243668310"/>
       <w:r>
         <w:lastRenderedPageBreak/>
         <w:t>6 Physical design for Cloudflare D1</w:t>
@@ -23834,7 +23976,7 @@
         <w:keepNext/>
         <w:keepLines/>
       </w:pPr>
-      <w:bookmarkStart w:id="46" w:name="_Toc243662371"/>
+      <w:bookmarkStart w:id="46" w:name="_Toc243668311"/>
       <w:r>
         <w:t>6.1 Conventions</w:t>
       </w:r>
@@ -24073,7 +24215,7 @@
         <w:keepNext/>
         <w:keepLines/>
       </w:pPr>
-      <w:bookmarkStart w:id="47" w:name="_Toc243662372"/>
+      <w:bookmarkStart w:id="47" w:name="_Toc243668312"/>
       <w:r>
         <w:t>6.2 Indexes</w:t>
       </w:r>
@@ -24084,7 +24226,7 @@
         <w:pStyle w:val="Caption"/>
         <w:keepNext/>
       </w:pPr>
-      <w:bookmarkStart w:id="48" w:name="_Toc243662404"/>
+      <w:bookmarkStart w:id="48" w:name="_Toc243668344"/>
       <w:r>
         <w:t xml:space="preserve">Table </w:t>
       </w:r>
@@ -24126,7 +24268,7 @@
           <w:left w:w="10" w:type="dxa"/>
           <w:right w:w="10" w:type="dxa"/>
         </w:tblCellMar>
-        <w:tblLook w:val="0000" w:firstRow="0" w:lastRow="0" w:firstColumn="0" w:lastColumn="0" w:noHBand="0" w:noVBand="0"/>
+        <w:tblLook w:val="04A0" w:firstRow="1" w:lastRow="0" w:firstColumn="1" w:lastColumn="0" w:noHBand="0" w:noVBand="1"/>
       </w:tblPr>
       <w:tblGrid>
         <w:gridCol w:w="4819"/>
@@ -25165,7 +25307,7 @@
         <w:keepNext/>
         <w:keepLines/>
       </w:pPr>
-      <w:bookmarkStart w:id="49" w:name="_Toc243662373"/>
+      <w:bookmarkStart w:id="49" w:name="_Toc243668313"/>
       <w:r>
         <w:lastRenderedPageBreak/>
         <w:t>6.3 Capacity against the free plan</w:t>
@@ -25177,7 +25319,7 @@
         <w:pStyle w:val="Caption"/>
         <w:keepNext/>
       </w:pPr>
-      <w:bookmarkStart w:id="50" w:name="_Toc243662405"/>
+      <w:bookmarkStart w:id="50" w:name="_Toc243668345"/>
       <w:r>
         <w:t xml:space="preserve">Table </w:t>
       </w:r>
@@ -25219,7 +25361,7 @@
           <w:left w:w="10" w:type="dxa"/>
           <w:right w:w="10" w:type="dxa"/>
         </w:tblCellMar>
-        <w:tblLook w:val="0000" w:firstRow="0" w:lastRow="0" w:firstColumn="0" w:lastColumn="0" w:noHBand="0" w:noVBand="0"/>
+        <w:tblLook w:val="04A0" w:firstRow="1" w:lastRow="0" w:firstColumn="1" w:lastColumn="0" w:noHBand="0" w:noVBand="1"/>
       </w:tblPr>
       <w:tblGrid>
         <w:gridCol w:w="4211"/>
@@ -25864,7 +26006,7 @@
         <w:keepLines/>
         <w:pageBreakBefore/>
       </w:pPr>
-      <w:bookmarkStart w:id="51" w:name="_Toc243662374"/>
+      <w:bookmarkStart w:id="51" w:name="_Toc243668314"/>
       <w:r>
         <w:lastRenderedPageBreak/>
         <w:t>7 Validation against real data</w:t>
@@ -25896,7 +26038,7 @@
         <w:pStyle w:val="Caption"/>
         <w:keepNext/>
       </w:pPr>
-      <w:bookmarkStart w:id="52" w:name="_Toc243662406"/>
+      <w:bookmarkStart w:id="52" w:name="_Toc243668346"/>
       <w:r>
         <w:t xml:space="preserve">Table </w:t>
       </w:r>
@@ -25938,7 +26080,7 @@
           <w:left w:w="10" w:type="dxa"/>
           <w:right w:w="10" w:type="dxa"/>
         </w:tblCellMar>
-        <w:tblLook w:val="0000" w:firstRow="0" w:lastRow="0" w:firstColumn="0" w:lastColumn="0" w:noHBand="0" w:noVBand="0"/>
+        <w:tblLook w:val="04A0" w:firstRow="1" w:lastRow="0" w:firstColumn="1" w:lastColumn="0" w:noHBand="0" w:noVBand="1"/>
       </w:tblPr>
       <w:tblGrid>
         <w:gridCol w:w="6544"/>
@@ -27346,7 +27488,7 @@
         <w:pStyle w:val="Caption"/>
         <w:keepNext/>
       </w:pPr>
-      <w:bookmarkStart w:id="53" w:name="_Toc243662407"/>
+      <w:bookmarkStart w:id="53" w:name="_Toc243668347"/>
       <w:r>
         <w:t xml:space="preserve">Table </w:t>
       </w:r>
@@ -27388,7 +27530,7 @@
           <w:left w:w="10" w:type="dxa"/>
           <w:right w:w="10" w:type="dxa"/>
         </w:tblCellMar>
-        <w:tblLook w:val="0000" w:firstRow="0" w:lastRow="0" w:firstColumn="0" w:lastColumn="0" w:noHBand="0" w:noVBand="0"/>
+        <w:tblLook w:val="04A0" w:firstRow="1" w:lastRow="0" w:firstColumn="1" w:lastColumn="0" w:noHBand="0" w:noVBand="1"/>
       </w:tblPr>
       <w:tblGrid>
         <w:gridCol w:w="4819"/>
@@ -28088,7 +28230,7 @@
         <w:keepLines/>
         <w:pageBreakBefore/>
       </w:pPr>
-      <w:bookmarkStart w:id="54" w:name="_Toc243662375"/>
+      <w:bookmarkStart w:id="54" w:name="_Toc243668315"/>
       <w:r>
         <w:lastRenderedPageBreak/>
         <w:t>Appendix A: Traceability: requirements to tables</w:t>
@@ -28100,7 +28242,7 @@
         <w:pStyle w:val="Caption"/>
         <w:keepNext/>
       </w:pPr>
-      <w:bookmarkStart w:id="55" w:name="_Toc243662408"/>
+      <w:bookmarkStart w:id="55" w:name="_Toc243668348"/>
       <w:r>
         <w:t xml:space="preserve">Table </w:t>
       </w:r>
@@ -28142,7 +28284,7 @@
           <w:left w:w="10" w:type="dxa"/>
           <w:right w:w="10" w:type="dxa"/>
         </w:tblCellMar>
-        <w:tblLook w:val="0000" w:firstRow="0" w:lastRow="0" w:firstColumn="0" w:lastColumn="0" w:noHBand="0" w:noVBand="0"/>
+        <w:tblLook w:val="04A0" w:firstRow="1" w:lastRow="0" w:firstColumn="1" w:lastColumn="0" w:noHBand="0" w:noVBand="1"/>
       </w:tblPr>
       <w:tblGrid>
         <w:gridCol w:w="4819"/>
@@ -30335,7 +30477,7 @@
         <w:keepLines/>
         <w:pageBreakBefore/>
       </w:pPr>
-      <w:bookmarkStart w:id="56" w:name="_Toc243662376"/>
+      <w:bookmarkStart w:id="56" w:name="_Toc243668316"/>
       <w:r>
         <w:lastRenderedPageBreak/>
         <w:t>Appendix B: Physical schema (migration 0001)</w:t>
@@ -35548,7 +35690,7 @@
         <w:keepLines/>
         <w:pageBreakBefore/>
       </w:pPr>
-      <w:bookmarkStart w:id="57" w:name="_Toc243662377"/>
+      <w:bookmarkStart w:id="57" w:name="_Toc243668317"/>
       <w:r>
         <w:lastRenderedPageBreak/>
         <w:t>Appendix C: Student accounts (migration 0003)</w:t>
@@ -37281,7 +37423,7 @@
         <w:keepLines/>
         <w:pageBreakBefore/>
       </w:pPr>
-      <w:bookmarkStart w:id="58" w:name="_Toc243662378"/>
+      <w:bookmarkStart w:id="58" w:name="_Toc243668318"/>
       <w:r>
         <w:lastRenderedPageBreak/>
         <w:t>Appendix D: Contact details (migration 0007)</w:t>
@@ -37677,7 +37819,7 @@
         <w:keepLines/>
         <w:pageBreakBefore/>
       </w:pPr>
-      <w:bookmarkStart w:id="59" w:name="_Toc243662379"/>
+      <w:bookmarkStart w:id="59" w:name="_Toc243668319"/>
       <w:r>
         <w:lastRenderedPageBreak/>
         <w:t>Appendix E: Answer feedback (migration 0008)</w:t>
@@ -37988,7 +38130,7 @@
         <w:keepLines/>
         <w:pageBreakBefore/>
       </w:pPr>
-      <w:bookmarkStart w:id="60" w:name="_Toc243662380"/>
+      <w:bookmarkStart w:id="60" w:name="_Toc243668320"/>
       <w:r>
         <w:lastRenderedPageBreak/>
         <w:t>Appendix F: Journey, avatars and group rules on the account (migration 0010)</w:t>
@@ -43004,7 +43146,7 @@
         <w:keepLines/>
         <w:pageBreakBefore/>
       </w:pPr>
-      <w:bookmarkStart w:id="61" w:name="_Toc243662381"/>
+      <w:bookmarkStart w:id="61" w:name="_Toc243668321"/>
       <w:r>
         <w:lastRenderedPageBreak/>
         <w:t>Appendix G: Rooms an account opened (migration 0012)</w:t>
@@ -43281,7 +43423,7 @@
         <w:keepLines/>
         <w:pageBreakBefore/>
       </w:pPr>
-      <w:bookmarkStart w:id="62" w:name="_Toc243662382"/>
+      <w:bookmarkStart w:id="62" w:name="_Toc243668322"/>
       <w:r>
         <w:lastRenderedPageBreak/>
         <w:t>Appendix H: Demo accounts (migration 0011)</w:t>
@@ -43473,7 +43615,7 @@
         <w:keepLines/>
         <w:pageBreakBefore/>
       </w:pPr>
-      <w:bookmarkStart w:id="63" w:name="_Toc243662383"/>
+      <w:bookmarkStart w:id="63" w:name="_Toc243668323"/>
       <w:r>
         <w:lastRenderedPageBreak/>
         <w:t>Appendix I: Group rules (migration 0009)</w:t>
@@ -43614,7 +43756,7 @@
         <w:keepLines/>
         <w:pageBreakBefore/>
       </w:pPr>
-      <w:bookmarkStart w:id="64" w:name="_Toc243662384"/>
+      <w:bookmarkStart w:id="64" w:name="_Toc243668324"/>
       <w:r>
         <w:lastRenderedPageBreak/>
         <w:t>Appendix J: Groups (migration 0006)</w:t>
@@ -44867,7 +45009,7 @@
         <w:keepLines/>
         <w:pageBreakBefore/>
       </w:pPr>
-      <w:bookmarkStart w:id="65" w:name="_Toc243662385"/>
+      <w:bookmarkStart w:id="65" w:name="_Toc243668325"/>
       <w:r>
         <w:lastRenderedPageBreak/>
         <w:t>Appendix K: Glossary</w:t>
@@ -44879,7 +45021,7 @@
         <w:pStyle w:val="Caption"/>
         <w:keepNext/>
       </w:pPr>
-      <w:bookmarkStart w:id="66" w:name="_Toc243662409"/>
+      <w:bookmarkStart w:id="66" w:name="_Toc243668349"/>
       <w:r>
         <w:t xml:space="preserve">Table </w:t>
       </w:r>
@@ -44921,7 +45063,7 @@
           <w:left w:w="10" w:type="dxa"/>
           <w:right w:w="10" w:type="dxa"/>
         </w:tblCellMar>
-        <w:tblLook w:val="0000" w:firstRow="0" w:lastRow="0" w:firstColumn="0" w:lastColumn="0" w:noHBand="0" w:noVBand="0"/>
+        <w:tblLook w:val="04A0" w:firstRow="1" w:lastRow="0" w:firstColumn="1" w:lastColumn="0" w:noHBand="0" w:noVBand="1"/>
       </w:tblPr>
       <w:tblGrid>
         <w:gridCol w:w="2928"/>
@@ -45596,7 +45738,7 @@
         <w:keepLines/>
         <w:pageBreakBefore/>
       </w:pPr>
-      <w:bookmarkStart w:id="67" w:name="_Toc243662386"/>
+      <w:bookmarkStart w:id="67" w:name="_Toc243668326"/>
       <w:r>
         <w:lastRenderedPageBreak/>
         <w:t>Appendix L: References</w:t>
@@ -45608,7 +45750,7 @@
         <w:pStyle w:val="Caption"/>
         <w:keepNext/>
       </w:pPr>
-      <w:bookmarkStart w:id="68" w:name="_Toc243662410"/>
+      <w:bookmarkStart w:id="68" w:name="_Toc243668350"/>
       <w:r>
         <w:t xml:space="preserve">Table </w:t>
       </w:r>
@@ -45650,7 +45792,7 @@
           <w:left w:w="10" w:type="dxa"/>
           <w:right w:w="10" w:type="dxa"/>
         </w:tblCellMar>
-        <w:tblLook w:val="0000" w:firstRow="0" w:lastRow="0" w:firstColumn="0" w:lastColumn="0" w:noHBand="0" w:noVBand="0"/>
+        <w:tblLook w:val="04A0" w:firstRow="1" w:lastRow="0" w:firstColumn="1" w:lastColumn="0" w:noHBand="0" w:noVBand="1"/>
       </w:tblPr>
       <w:tblGrid>
         <w:gridCol w:w="803"/>
@@ -46539,10 +46681,96 @@
 <file path=word/numbering.xml><?xml version="1.0" encoding="utf-8"?>
 <w:numbering xmlns:wpc="http://schemas.microsoft.com/office/word/2010/wordprocessingCanvas" xmlns:cx="http://schemas.microsoft.com/office/drawing/2014/chartex" xmlns:cx1="http://schemas.microsoft.com/office/drawing/2015/9/8/chartex" xmlns:cx2="http://schemas.microsoft.com/office/drawing/2015/10/21/chartex" xmlns:cx3="http://schemas.microsoft.com/office/drawing/2016/5/9/chartex" xmlns:cx4="http://schemas.microsoft.com/office/drawing/2016/5/10/chartex" xmlns:cx5="http://schemas.microsoft.com/office/drawing/2016/5/11/chartex" xmlns:cx6="http://schemas.microsoft.com/office/drawing/2016/5/12/chartex" xmlns:cx7="http://schemas.microsoft.com/office/drawing/2016/5/13/chartex" xmlns:cx8="http://schemas.microsoft.com/office/drawing/2016/5/14/chartex" xmlns:mc="http://schemas.openxmlformats.org/markup-compatibility/2006" xmlns:aink="http://schemas.microsoft.com/office/drawing/2016/ink" xmlns:am3d="http://schemas.microsoft.com/office/drawing/2017/model3d" xmlns:o="urn:schemas-microsoft-com:office:office" xmlns:oel="http://schemas.microsoft.com/office/2019/extlst" xmlns:r="http://schemas.openxmlformats.org/officeDocument/2006/relationships" xmlns:m="http://schemas.openxmlformats.org/officeDocument/2006/math" xmlns:v="urn:schemas-microsoft-com:vml" xmlns:wp14="http://schemas.microsoft.com/office/word/2010/wordprocessingDrawing" xmlns:wp="http://schemas.openxmlformats.org/drawingml/2006/wordprocessingDrawing" xmlns:w10="urn:schemas-microsoft-com:office:word" xmlns:w="http://schemas.openxmlformats.org/wordprocessingml/2006/main" xmlns:w14="http://schemas.microsoft.com/office/word/2010/wordml" xmlns:w15="http://schemas.microsoft.com/office/word/2012/wordml" xmlns:w16cex="http://schemas.microsoft.com/office/word/2018/wordml/cex" xmlns:w16cid="http://schemas.microsoft.com/office/word/2016/wordml/cid" xmlns:w16="http://schemas.microsoft.com/office/word/2018/wordml" xmlns:w16du="http://schemas.microsoft.com/office/word/2023/wordml/word16du" xmlns:w16sdtdh="http://schemas.microsoft.com/office/word/2020/wordml/sdtdatahash" xmlns:w16sdtfl="http://schemas.microsoft.com/office/word/2024/wordml/sdtformatlock" xmlns:w16se="http://schemas.microsoft.com/office/word/2015/wordml/symex" xmlns:wpg="http://schemas.microsoft.com/office/word/2010/wordprocessingGroup" xmlns:wpi="http://schemas.microsoft.com/office/word/2010/wordprocessingInk" xmlns:wne="http://schemas.microsoft.com/office/word/2006/wordml" xmlns:wps="http://schemas.microsoft.com/office/word/2010/wordprocessingShape" mc:Ignorable="w14 w15 w16se w16cid w16 w16cex w16sdtdh w16sdtfl w16du wp14">
   <w:abstractNum w:abstractNumId="0" w15:restartNumberingAfterBreak="0">
-    <w:nsid w:val="24743E7C"/>
+    <w:nsid w:val="23EF4D0A"/>
     <w:multiLevelType w:val="hybridMultilevel"/>
-    <w:tmpl w:val="A71089E0"/>
-    <w:lvl w:ilvl="0" w:tplc="CE341A62">
+    <w:tmpl w:val="2F0C3DB2"/>
+    <w:lvl w:ilvl="0" w:tplc="486A7060" w:tentative="1">
+      <w:start w:val="1"/>
+      <w:numFmt w:val="bullet"/>
+      <w:lvlText w:val="●"/>
+      <w:lvlJc w:val="left"/>
+      <w:pPr>
+        <w:ind w:left="720" w:hanging="360"/>
+      </w:pPr>
+    </w:lvl>
+    <w:lvl w:ilvl="1" w:tplc="703AE376" w:tentative="1">
+      <w:start w:val="1"/>
+      <w:numFmt w:val="bullet"/>
+      <w:lvlText w:val="○"/>
+      <w:lvlJc w:val="left"/>
+      <w:pPr>
+        <w:ind w:left="1440" w:hanging="360"/>
+      </w:pPr>
+    </w:lvl>
+    <w:lvl w:ilvl="2" w:tplc="B1FA4D10" w:tentative="1">
+      <w:start w:val="1"/>
+      <w:numFmt w:val="bullet"/>
+      <w:lvlText w:val="■"/>
+      <w:lvlJc w:val="left"/>
+      <w:pPr>
+        <w:ind w:left="2160" w:hanging="360"/>
+      </w:pPr>
+    </w:lvl>
+    <w:lvl w:ilvl="3" w:tplc="C5A258BA" w:tentative="1">
+      <w:start w:val="1"/>
+      <w:numFmt w:val="bullet"/>
+      <w:lvlText w:val="●"/>
+      <w:lvlJc w:val="left"/>
+      <w:pPr>
+        <w:ind w:left="2880" w:hanging="360"/>
+      </w:pPr>
+    </w:lvl>
+    <w:lvl w:ilvl="4" w:tplc="47201EC0" w:tentative="1">
+      <w:start w:val="1"/>
+      <w:numFmt w:val="bullet"/>
+      <w:lvlText w:val="○"/>
+      <w:lvlJc w:val="left"/>
+      <w:pPr>
+        <w:ind w:left="3600" w:hanging="360"/>
+      </w:pPr>
+    </w:lvl>
+    <w:lvl w:ilvl="5" w:tplc="157ECA3C" w:tentative="1">
+      <w:start w:val="1"/>
+      <w:numFmt w:val="bullet"/>
+      <w:lvlText w:val="■"/>
+      <w:lvlJc w:val="left"/>
+      <w:pPr>
+        <w:ind w:left="4320" w:hanging="360"/>
+      </w:pPr>
+    </w:lvl>
+    <w:lvl w:ilvl="6" w:tplc="E402C59C" w:tentative="1">
+      <w:start w:val="1"/>
+      <w:numFmt w:val="bullet"/>
+      <w:lvlText w:val="●"/>
+      <w:lvlJc w:val="left"/>
+      <w:pPr>
+        <w:ind w:left="5040" w:hanging="360"/>
+      </w:pPr>
+    </w:lvl>
+    <w:lvl w:ilvl="7" w:tplc="741248B8" w:tentative="1">
+      <w:start w:val="1"/>
+      <w:numFmt w:val="bullet"/>
+      <w:lvlText w:val="●"/>
+      <w:lvlJc w:val="left"/>
+      <w:pPr>
+        <w:ind w:left="5760" w:hanging="360"/>
+      </w:pPr>
+    </w:lvl>
+    <w:lvl w:ilvl="8" w:tplc="4C50313E" w:tentative="1">
+      <w:start w:val="1"/>
+      <w:numFmt w:val="bullet"/>
+      <w:lvlText w:val="●"/>
+      <w:lvlJc w:val="left"/>
+      <w:pPr>
+        <w:ind w:left="6480" w:hanging="360"/>
+      </w:pPr>
+    </w:lvl>
+  </w:abstractNum>
+  <w:abstractNum w:abstractNumId="1" w15:restartNumberingAfterBreak="0">
+    <w:nsid w:val="383F7891"/>
+    <w:multiLevelType w:val="hybridMultilevel"/>
+    <w:tmpl w:val="34C49F76"/>
+    <w:lvl w:ilvl="0" w:tplc="02362066">
       <w:start w:val="1"/>
       <w:numFmt w:val="bullet"/>
       <w:lvlText w:val="•"/>
@@ -46551,7 +46779,7 @@
         <w:ind w:left="720" w:hanging="280"/>
       </w:pPr>
     </w:lvl>
-    <w:lvl w:ilvl="1" w:tplc="64FEDDBE" w:tentative="1">
+    <w:lvl w:ilvl="1" w:tplc="2F52E5BC" w:tentative="1">
       <w:start w:val="1"/>
       <w:numFmt w:val="bullet"/>
       <w:lvlText w:val="–"/>
@@ -46560,7 +46788,7 @@
         <w:ind w:left="1080" w:hanging="280"/>
       </w:pPr>
     </w:lvl>
-    <w:lvl w:ilvl="2" w:tplc="828A6A4C" w:tentative="1">
+    <w:lvl w:ilvl="2" w:tplc="0CFA4162" w:tentative="1">
       <w:start w:val="1"/>
       <w:numFmt w:val="bullet"/>
       <w:lvlText w:val="▪"/>
@@ -46569,199 +46797,113 @@
         <w:ind w:left="1440" w:hanging="280"/>
       </w:pPr>
     </w:lvl>
-    <w:lvl w:ilvl="3" w:tplc="5A721D10">
+    <w:lvl w:ilvl="3" w:tplc="D66A2060">
       <w:numFmt w:val="decimal"/>
       <w:lvlText w:val=""/>
       <w:lvlJc w:val="left"/>
     </w:lvl>
-    <w:lvl w:ilvl="4" w:tplc="3AD69742">
+    <w:lvl w:ilvl="4" w:tplc="624C60A6">
       <w:numFmt w:val="decimal"/>
       <w:lvlText w:val=""/>
       <w:lvlJc w:val="left"/>
     </w:lvl>
-    <w:lvl w:ilvl="5" w:tplc="3EFCC4C4">
+    <w:lvl w:ilvl="5" w:tplc="47EEE378">
       <w:numFmt w:val="decimal"/>
       <w:lvlText w:val=""/>
       <w:lvlJc w:val="left"/>
     </w:lvl>
-    <w:lvl w:ilvl="6" w:tplc="50E24560">
+    <w:lvl w:ilvl="6" w:tplc="22FC67EE">
       <w:numFmt w:val="decimal"/>
       <w:lvlText w:val=""/>
       <w:lvlJc w:val="left"/>
     </w:lvl>
-    <w:lvl w:ilvl="7" w:tplc="C270C476">
+    <w:lvl w:ilvl="7" w:tplc="90C661C0">
       <w:numFmt w:val="decimal"/>
       <w:lvlText w:val=""/>
       <w:lvlJc w:val="left"/>
     </w:lvl>
-    <w:lvl w:ilvl="8" w:tplc="61661B80">
-      <w:numFmt w:val="decimal"/>
-      <w:lvlText w:val=""/>
-      <w:lvlJc w:val="left"/>
-    </w:lvl>
-  </w:abstractNum>
-  <w:abstractNum w:abstractNumId="1" w15:restartNumberingAfterBreak="0">
-    <w:nsid w:val="5B4F205D"/>
-    <w:multiLevelType w:val="hybridMultilevel"/>
-    <w:tmpl w:val="78CA5422"/>
-    <w:lvl w:ilvl="0" w:tplc="1A268AE8" w:tentative="1">
-      <w:start w:val="1"/>
-      <w:numFmt w:val="decimal"/>
-      <w:lvlText w:val="%1."/>
-      <w:lvlJc w:val="left"/>
-      <w:pPr>
-        <w:ind w:left="720" w:hanging="360"/>
-      </w:pPr>
-    </w:lvl>
-    <w:lvl w:ilvl="1" w:tplc="637607CC" w:tentative="1">
-      <w:start w:val="1"/>
-      <w:numFmt w:val="lowerLetter"/>
-      <w:lvlText w:val="%2."/>
-      <w:lvlJc w:val="left"/>
-      <w:pPr>
-        <w:ind w:left="1080" w:hanging="360"/>
-      </w:pPr>
-    </w:lvl>
-    <w:lvl w:ilvl="2" w:tplc="5E72D36C" w:tentative="1">
-      <w:start w:val="1"/>
-      <w:numFmt w:val="lowerRoman"/>
-      <w:lvlText w:val="%3."/>
-      <w:lvlJc w:val="left"/>
-      <w:pPr>
-        <w:ind w:left="1440" w:hanging="360"/>
-      </w:pPr>
-    </w:lvl>
-    <w:lvl w:ilvl="3" w:tplc="96BC1FC8">
-      <w:numFmt w:val="decimal"/>
-      <w:lvlText w:val=""/>
-      <w:lvlJc w:val="left"/>
-    </w:lvl>
-    <w:lvl w:ilvl="4" w:tplc="89261372">
-      <w:numFmt w:val="decimal"/>
-      <w:lvlText w:val=""/>
-      <w:lvlJc w:val="left"/>
-    </w:lvl>
-    <w:lvl w:ilvl="5" w:tplc="5CCC7EDC">
-      <w:numFmt w:val="decimal"/>
-      <w:lvlText w:val=""/>
-      <w:lvlJc w:val="left"/>
-    </w:lvl>
-    <w:lvl w:ilvl="6" w:tplc="64F0C934">
-      <w:numFmt w:val="decimal"/>
-      <w:lvlText w:val=""/>
-      <w:lvlJc w:val="left"/>
-    </w:lvl>
-    <w:lvl w:ilvl="7" w:tplc="7DA6B00E">
-      <w:numFmt w:val="decimal"/>
-      <w:lvlText w:val=""/>
-      <w:lvlJc w:val="left"/>
-    </w:lvl>
-    <w:lvl w:ilvl="8" w:tplc="A2DAFC58">
+    <w:lvl w:ilvl="8" w:tplc="77E62730">
       <w:numFmt w:val="decimal"/>
       <w:lvlText w:val=""/>
       <w:lvlJc w:val="left"/>
     </w:lvl>
   </w:abstractNum>
   <w:abstractNum w:abstractNumId="2" w15:restartNumberingAfterBreak="0">
-    <w:nsid w:val="6A516A10"/>
+    <w:nsid w:val="75D65E66"/>
     <w:multiLevelType w:val="hybridMultilevel"/>
-    <w:tmpl w:val="8410D550"/>
-    <w:lvl w:ilvl="0" w:tplc="E77C30AA" w:tentative="1">
+    <w:tmpl w:val="58D2FD7A"/>
+    <w:lvl w:ilvl="0" w:tplc="D7A45B18" w:tentative="1">
       <w:start w:val="1"/>
-      <w:numFmt w:val="bullet"/>
-      <w:lvlText w:val="●"/>
+      <w:numFmt w:val="decimal"/>
+      <w:lvlText w:val="%1."/>
       <w:lvlJc w:val="left"/>
       <w:pPr>
         <w:ind w:left="720" w:hanging="360"/>
       </w:pPr>
     </w:lvl>
-    <w:lvl w:ilvl="1" w:tplc="75862BE4" w:tentative="1">
+    <w:lvl w:ilvl="1" w:tplc="2ABCDBC6" w:tentative="1">
       <w:start w:val="1"/>
-      <w:numFmt w:val="bullet"/>
-      <w:lvlText w:val="○"/>
+      <w:numFmt w:val="lowerLetter"/>
+      <w:lvlText w:val="%2."/>
       <w:lvlJc w:val="left"/>
       <w:pPr>
+        <w:ind w:left="1080" w:hanging="360"/>
+      </w:pPr>
+    </w:lvl>
+    <w:lvl w:ilvl="2" w:tplc="CC905F28" w:tentative="1">
+      <w:start w:val="1"/>
+      <w:numFmt w:val="lowerRoman"/>
+      <w:lvlText w:val="%3."/>
+      <w:lvlJc w:val="left"/>
+      <w:pPr>
         <w:ind w:left="1440" w:hanging="360"/>
       </w:pPr>
     </w:lvl>
-    <w:lvl w:ilvl="2" w:tplc="1F8CB3CC" w:tentative="1">
-      <w:start w:val="1"/>
-      <w:numFmt w:val="bullet"/>
-      <w:lvlText w:val="■"/>
+    <w:lvl w:ilvl="3" w:tplc="0EC4EFF8">
+      <w:numFmt w:val="decimal"/>
+      <w:lvlText w:val=""/>
       <w:lvlJc w:val="left"/>
-      <w:pPr>
-        <w:ind w:left="2160" w:hanging="360"/>
-      </w:pPr>
     </w:lvl>
-    <w:lvl w:ilvl="3" w:tplc="34C280A2" w:tentative="1">
-      <w:start w:val="1"/>
-      <w:numFmt w:val="bullet"/>
-      <w:lvlText w:val="●"/>
+    <w:lvl w:ilvl="4" w:tplc="8CC02A5A">
+      <w:numFmt w:val="decimal"/>
+      <w:lvlText w:val=""/>
       <w:lvlJc w:val="left"/>
-      <w:pPr>
-        <w:ind w:left="2880" w:hanging="360"/>
-      </w:pPr>
     </w:lvl>
-    <w:lvl w:ilvl="4" w:tplc="5BAEAE7C" w:tentative="1">
-      <w:start w:val="1"/>
-      <w:numFmt w:val="bullet"/>
-      <w:lvlText w:val="○"/>
+    <w:lvl w:ilvl="5" w:tplc="1ED053B8">
+      <w:numFmt w:val="decimal"/>
+      <w:lvlText w:val=""/>
       <w:lvlJc w:val="left"/>
-      <w:pPr>
-        <w:ind w:left="3600" w:hanging="360"/>
-      </w:pPr>
     </w:lvl>
-    <w:lvl w:ilvl="5" w:tplc="393C3572" w:tentative="1">
-      <w:start w:val="1"/>
-      <w:numFmt w:val="bullet"/>
-      <w:lvlText w:val="■"/>
+    <w:lvl w:ilvl="6" w:tplc="1B34DDB6">
+      <w:numFmt w:val="decimal"/>
+      <w:lvlText w:val=""/>
       <w:lvlJc w:val="left"/>
-      <w:pPr>
-        <w:ind w:left="4320" w:hanging="360"/>
-      </w:pPr>
     </w:lvl>
-    <w:lvl w:ilvl="6" w:tplc="B09AB69E" w:tentative="1">
-      <w:start w:val="1"/>
-      <w:numFmt w:val="bullet"/>
-      <w:lvlText w:val="●"/>
+    <w:lvl w:ilvl="7" w:tplc="529CB3F6">
+      <w:numFmt w:val="decimal"/>
+      <w:lvlText w:val=""/>
       <w:lvlJc w:val="left"/>
-      <w:pPr>
-        <w:ind w:left="5040" w:hanging="360"/>
-      </w:pPr>
     </w:lvl>
-    <w:lvl w:ilvl="7" w:tplc="83024642" w:tentative="1">
-      <w:start w:val="1"/>
-      <w:numFmt w:val="bullet"/>
-      <w:lvlText w:val="●"/>
+    <w:lvl w:ilvl="8" w:tplc="582285F0">
+      <w:numFmt w:val="decimal"/>
+      <w:lvlText w:val=""/>
       <w:lvlJc w:val="left"/>
-      <w:pPr>
-        <w:ind w:left="5760" w:hanging="360"/>
-      </w:pPr>
-    </w:lvl>
-    <w:lvl w:ilvl="8" w:tplc="C49AD592" w:tentative="1">
-      <w:start w:val="1"/>
-      <w:numFmt w:val="bullet"/>
-      <w:lvlText w:val="●"/>
-      <w:lvlJc w:val="left"/>
-      <w:pPr>
-        <w:ind w:left="6480" w:hanging="360"/>
-      </w:pPr>
     </w:lvl>
   </w:abstractNum>
-  <w:num w:numId="1" w16cid:durableId="1813937176">
-    <w:abstractNumId w:val="2"/>
-    <w:lvlOverride w:ilvl="0">
-      <w:startOverride w:val="1"/>
-    </w:lvlOverride>
-  </w:num>
-  <w:num w:numId="2" w16cid:durableId="1724132140">
+  <w:num w:numId="1" w16cid:durableId="899941151">
     <w:abstractNumId w:val="0"/>
     <w:lvlOverride w:ilvl="0">
       <w:startOverride w:val="1"/>
     </w:lvlOverride>
   </w:num>
-  <w:num w:numId="3" w16cid:durableId="427774021">
-    <w:abstractNumId w:val="0"/>
+  <w:num w:numId="2" w16cid:durableId="970982877">
+    <w:abstractNumId w:val="1"/>
+    <w:lvlOverride w:ilvl="0">
+      <w:startOverride w:val="1"/>
+    </w:lvlOverride>
+  </w:num>
+  <w:num w:numId="3" w16cid:durableId="1830052169">
+    <w:abstractNumId w:val="1"/>
     <w:lvlOverride w:ilvl="0">
       <w:startOverride w:val="1"/>
     </w:lvlOverride>
@@ -47465,7 +47607,7 @@
     <w:autoRedefine/>
     <w:uiPriority w:val="39"/>
     <w:unhideWhenUsed/>
-    <w:rsid w:val="00C125C7"/>
+    <w:rsid w:val="001D777D"/>
     <w:pPr>
       <w:spacing w:after="100"/>
     </w:pPr>
@@ -47477,7 +47619,7 @@
     <w:autoRedefine/>
     <w:uiPriority w:val="39"/>
     <w:unhideWhenUsed/>
-    <w:rsid w:val="00C125C7"/>
+    <w:rsid w:val="001D777D"/>
     <w:pPr>
       <w:spacing w:after="100"/>
       <w:ind w:left="210"/>
@@ -47489,7 +47631,7 @@
     <w:next w:val="Normal"/>
     <w:uiPriority w:val="99"/>
     <w:unhideWhenUsed/>
-    <w:rsid w:val="00C125C7"/>
+    <w:rsid w:val="001D777D"/>
   </w:style>
 </w:styles>
 </file>

</xml_diff>